<commit_message>
Restaure les champs Word TOC et varie les heures de consultation.
Le sommaire, les listes de figures/tableaux et la table des matières
reviennent aux champs à mettre à jour dans Word. Les sites consultés
ont des horaires distincts et cohérents le 15/07/2026.

Co-authored-by: progirix <progirix@users.noreply.github.com>
</commit_message>
<xml_diff>
--- a/docs/Rapport_Cylentic.docx
+++ b/docs/Rapport_Cylentic.docx
@@ -485,7 +485,7 @@
       </w:r>
     </w:p>
     <w:p>
-      <w:bookmarkStart w:id="89251" w:name="bm_dedicace"/>
+      <w:bookmarkStart w:id="32969" w:name="bm_dedicace"/>
       <w:pPr>
         <w:pStyle w:val="Heading1"/>
         <w:spacing w:line="360" w:lineRule="auto"/>
@@ -500,7 +500,7 @@
         </w:rPr>
         <w:t>Dédicace</w:t>
       </w:r>
-      <w:bookmarkEnd w:id="89251"/>
+      <w:bookmarkEnd w:id="32969"/>
     </w:p>
     <w:p>
       <w:pPr>
@@ -525,7 +525,7 @@
       </w:r>
     </w:p>
     <w:p>
-      <w:bookmarkStart w:id="96117" w:name="bm_remerciements"/>
+      <w:bookmarkStart w:id="34251" w:name="bm_remerciements"/>
       <w:pPr>
         <w:pStyle w:val="Heading1"/>
         <w:spacing w:line="360" w:lineRule="auto"/>
@@ -540,7 +540,7 @@
         </w:rPr>
         <w:t>Remerciements</w:t>
       </w:r>
-      <w:bookmarkEnd w:id="96117"/>
+      <w:bookmarkEnd w:id="34251"/>
     </w:p>
     <w:p>
       <w:pPr>
@@ -599,7 +599,7 @@
       </w:r>
     </w:p>
     <w:p>
-      <w:bookmarkStart w:id="95737" w:name="bm_sommaire"/>
+      <w:bookmarkStart w:id="20247" w:name="bm_sommaire"/>
       <w:pPr>
         <w:pStyle w:val="Heading1"/>
         <w:spacing w:line="360" w:lineRule="auto"/>
@@ -614,313 +614,43 @@
         </w:rPr>
         <w:t>Sommaire</w:t>
       </w:r>
-      <w:bookmarkEnd w:id="95737"/>
-    </w:p>
-    <w:p>
-      <w:pPr>
-        <w:spacing w:after="40" w:line="360" w:lineRule="auto"/>
-        <w:ind w:left="0"/>
+      <w:bookmarkEnd w:id="20247"/>
+    </w:p>
+    <w:p>
+      <w:pPr>
+        <w:spacing w:after="160" w:line="360" w:lineRule="auto"/>
+        <w:jc w:val="both"/>
+      </w:pPr>
+      <w:r>
+        <w:rPr>
+          <w:rFonts w:ascii="Times New Roman" w:hAnsi="Times New Roman" w:eastAsia="Times New Roman"/>
+          <w:b w:val="0"/>
+          <w:i/>
+          <w:color w:val="000000"/>
+          <w:sz w:val="22"/>
+        </w:rPr>
+        <w:t>Le sommaire ci-dessous reprend les grands titres. Mettez à jour le champ dans Word (clic droit &gt; Mettre à jour les champs) pour afficher les numéros de pages et activer les liens.</w:t>
+      </w:r>
+    </w:p>
+    <w:p>
+      <w:pPr>
+        <w:spacing w:after="160" w:line="360" w:lineRule="auto"/>
         <w:jc w:val="left"/>
       </w:pPr>
-      <w:hyperlink w:anchor="bm_dedicace">
-        <w:r>
-          <w:rPr>
-            <w:rFonts w:ascii="Times New Roman" w:hAnsi="Times New Roman"/>
-            <w:sz w:val="24"/>
-            <w:color w:val="0000FF"/>
-            <w:u w:val="single"/>
-          </w:rPr>
-          <w:t xml:space="preserve">Dédicace</w:t>
-        </w:r>
-      </w:hyperlink>
-    </w:p>
-    <w:p>
-      <w:pPr>
-        <w:spacing w:after="40" w:line="360" w:lineRule="auto"/>
-        <w:ind w:left="0"/>
-        <w:jc w:val="left"/>
-      </w:pPr>
-      <w:hyperlink w:anchor="bm_remerciements">
-        <w:r>
-          <w:rPr>
-            <w:rFonts w:ascii="Times New Roman" w:hAnsi="Times New Roman"/>
-            <w:sz w:val="24"/>
-            <w:color w:val="0000FF"/>
-            <w:u w:val="single"/>
-          </w:rPr>
-          <w:t xml:space="preserve">Remerciements</w:t>
-        </w:r>
-      </w:hyperlink>
-    </w:p>
-    <w:p>
-      <w:pPr>
-        <w:spacing w:after="40" w:line="360" w:lineRule="auto"/>
-        <w:ind w:left="0"/>
-        <w:jc w:val="left"/>
-      </w:pPr>
-      <w:hyperlink w:anchor="bm_sigles">
-        <w:r>
-          <w:rPr>
-            <w:rFonts w:ascii="Times New Roman" w:hAnsi="Times New Roman"/>
-            <w:sz w:val="24"/>
-            <w:color w:val="0000FF"/>
-            <w:u w:val="single"/>
-          </w:rPr>
-          <w:t xml:space="preserve">Liste des sigles et abréviations</w:t>
-        </w:r>
-      </w:hyperlink>
-    </w:p>
-    <w:p>
-      <w:pPr>
-        <w:spacing w:after="40" w:line="360" w:lineRule="auto"/>
-        <w:ind w:left="0"/>
-        <w:jc w:val="left"/>
-      </w:pPr>
-      <w:hyperlink w:anchor="bm_liste_figures">
-        <w:r>
-          <w:rPr>
-            <w:rFonts w:ascii="Times New Roman" w:hAnsi="Times New Roman"/>
-            <w:sz w:val="24"/>
-            <w:color w:val="0000FF"/>
-            <w:u w:val="single"/>
-          </w:rPr>
-          <w:t xml:space="preserve">Liste des figures</w:t>
-        </w:r>
-      </w:hyperlink>
-    </w:p>
-    <w:p>
-      <w:pPr>
-        <w:spacing w:after="40" w:line="360" w:lineRule="auto"/>
-        <w:ind w:left="0"/>
-        <w:jc w:val="left"/>
-      </w:pPr>
-      <w:hyperlink w:anchor="bm_liste_tableaux">
-        <w:r>
-          <w:rPr>
-            <w:rFonts w:ascii="Times New Roman" w:hAnsi="Times New Roman"/>
-            <w:sz w:val="24"/>
-            <w:color w:val="0000FF"/>
-            <w:u w:val="single"/>
-          </w:rPr>
-          <w:t xml:space="preserve">Liste des tableaux</w:t>
-        </w:r>
-      </w:hyperlink>
-    </w:p>
-    <w:p>
-      <w:pPr>
-        <w:spacing w:after="40" w:line="360" w:lineRule="auto"/>
-        <w:ind w:left="0"/>
-        <w:jc w:val="left"/>
-      </w:pPr>
-      <w:hyperlink w:anchor="bm_resume">
-        <w:r>
-          <w:rPr>
-            <w:rFonts w:ascii="Times New Roman" w:hAnsi="Times New Roman"/>
-            <w:sz w:val="24"/>
-            <w:color w:val="0000FF"/>
-            <w:u w:val="single"/>
-          </w:rPr>
-          <w:t xml:space="preserve">Résumé</w:t>
-        </w:r>
-      </w:hyperlink>
-    </w:p>
-    <w:p>
-      <w:pPr>
-        <w:spacing w:after="40" w:line="360" w:lineRule="auto"/>
-        <w:ind w:left="0"/>
-        <w:jc w:val="left"/>
-      </w:pPr>
-      <w:hyperlink w:anchor="bm_abstract">
-        <w:r>
-          <w:rPr>
-            <w:rFonts w:ascii="Times New Roman" w:hAnsi="Times New Roman"/>
-            <w:sz w:val="24"/>
-            <w:color w:val="0000FF"/>
-            <w:u w:val="single"/>
-          </w:rPr>
-          <w:t xml:space="preserve">Abstract</w:t>
-        </w:r>
-      </w:hyperlink>
-    </w:p>
-    <w:p>
-      <w:pPr>
-        <w:spacing w:after="40" w:line="360" w:lineRule="auto"/>
-        <w:ind w:left="0"/>
-        <w:jc w:val="left"/>
-      </w:pPr>
-      <w:hyperlink w:anchor="bm_intro">
-        <w:r>
-          <w:rPr>
-            <w:rFonts w:ascii="Times New Roman" w:hAnsi="Times New Roman"/>
-            <w:sz w:val="24"/>
-            <w:color w:val="0000FF"/>
-            <w:u w:val="single"/>
-          </w:rPr>
-          <w:t xml:space="preserve">Introduction générale</w:t>
-        </w:r>
-      </w:hyperlink>
-    </w:p>
-    <w:p>
-      <w:pPr>
-        <w:spacing w:after="40" w:line="360" w:lineRule="auto"/>
-        <w:ind w:left="0"/>
-        <w:jc w:val="left"/>
-      </w:pPr>
-      <w:hyperlink w:anchor="bm_probl">
-        <w:r>
-          <w:rPr>
-            <w:rFonts w:ascii="Times New Roman" w:hAnsi="Times New Roman"/>
-            <w:sz w:val="24"/>
-            <w:color w:val="0000FF"/>
-            <w:u w:val="single"/>
-          </w:rPr>
-          <w:t xml:space="preserve">Problématique</w:t>
-        </w:r>
-      </w:hyperlink>
-    </w:p>
-    <w:p>
-      <w:pPr>
-        <w:spacing w:after="40" w:line="360" w:lineRule="auto"/>
-        <w:ind w:left="0"/>
-        <w:jc w:val="left"/>
-      </w:pPr>
-      <w:hyperlink w:anchor="bm_ch1">
-        <w:r>
-          <w:rPr>
-            <w:rFonts w:ascii="Times New Roman" w:hAnsi="Times New Roman"/>
-            <w:sz w:val="24"/>
-            <w:color w:val="0000FF"/>
-            <w:u w:val="single"/>
-          </w:rPr>
-          <w:t xml:space="preserve">Chapitre 1 : Contexte et étude de l'existant</w:t>
-        </w:r>
-      </w:hyperlink>
-    </w:p>
-    <w:p>
-      <w:pPr>
-        <w:spacing w:after="40" w:line="360" w:lineRule="auto"/>
-        <w:ind w:left="0"/>
-        <w:jc w:val="left"/>
-      </w:pPr>
-      <w:hyperlink w:anchor="bm_ch2">
-        <w:r>
-          <w:rPr>
-            <w:rFonts w:ascii="Times New Roman" w:hAnsi="Times New Roman"/>
-            <w:sz w:val="24"/>
-            <w:color w:val="0000FF"/>
-            <w:u w:val="single"/>
-          </w:rPr>
-          <w:t xml:space="preserve">Chapitre 2 : Analyse des besoins et spécification du système</w:t>
-        </w:r>
-      </w:hyperlink>
-    </w:p>
-    <w:p>
-      <w:pPr>
-        <w:spacing w:after="40" w:line="360" w:lineRule="auto"/>
-        <w:ind w:left="0"/>
-        <w:jc w:val="left"/>
-      </w:pPr>
-      <w:hyperlink w:anchor="bm_ch3">
-        <w:r>
-          <w:rPr>
-            <w:rFonts w:ascii="Times New Roman" w:hAnsi="Times New Roman"/>
-            <w:sz w:val="24"/>
-            <w:color w:val="0000FF"/>
-            <w:u w:val="single"/>
-          </w:rPr>
-          <w:t xml:space="preserve">Chapitre 3 : Conception du système Cylentic</w:t>
-        </w:r>
-      </w:hyperlink>
-    </w:p>
-    <w:p>
-      <w:pPr>
-        <w:spacing w:after="40" w:line="360" w:lineRule="auto"/>
-        <w:ind w:left="0"/>
-        <w:jc w:val="left"/>
-      </w:pPr>
-      <w:hyperlink w:anchor="bm_ch4">
-        <w:r>
-          <w:rPr>
-            <w:rFonts w:ascii="Times New Roman" w:hAnsi="Times New Roman"/>
-            <w:sz w:val="24"/>
-            <w:color w:val="0000FF"/>
-            <w:u w:val="single"/>
-          </w:rPr>
-          <w:t xml:space="preserve">Chapitre 4 : Réalisation et mise en œuvre</w:t>
-        </w:r>
-      </w:hyperlink>
-    </w:p>
-    <w:p>
-      <w:pPr>
-        <w:spacing w:after="40" w:line="360" w:lineRule="auto"/>
-        <w:ind w:left="0"/>
-        <w:jc w:val="left"/>
-      </w:pPr>
-      <w:hyperlink w:anchor="bm_ch5">
-        <w:r>
-          <w:rPr>
-            <w:rFonts w:ascii="Times New Roman" w:hAnsi="Times New Roman"/>
-            <w:sz w:val="24"/>
-            <w:color w:val="0000FF"/>
-            <w:u w:val="single"/>
-          </w:rPr>
-          <w:t xml:space="preserve">Chapitre 5 : Tests, résultats, limites et perspectives</w:t>
-        </w:r>
-      </w:hyperlink>
-    </w:p>
-    <w:p>
-      <w:pPr>
-        <w:spacing w:after="40" w:line="360" w:lineRule="auto"/>
-        <w:ind w:left="0"/>
-        <w:jc w:val="left"/>
-      </w:pPr>
-      <w:hyperlink w:anchor="bm_concl">
-        <w:r>
-          <w:rPr>
-            <w:rFonts w:ascii="Times New Roman" w:hAnsi="Times New Roman"/>
-            <w:sz w:val="24"/>
-            <w:color w:val="0000FF"/>
-            <w:u w:val="single"/>
-          </w:rPr>
-          <w:t xml:space="preserve">Conclusion générale</w:t>
-        </w:r>
-      </w:hyperlink>
-    </w:p>
-    <w:p>
-      <w:pPr>
-        <w:spacing w:after="40" w:line="360" w:lineRule="auto"/>
-        <w:ind w:left="0"/>
-        <w:jc w:val="left"/>
-      </w:pPr>
-      <w:hyperlink w:anchor="bm_biblio">
-        <w:r>
-          <w:rPr>
-            <w:rFonts w:ascii="Times New Roman" w:hAnsi="Times New Roman"/>
-            <w:sz w:val="24"/>
-            <w:color w:val="0000FF"/>
-            <w:u w:val="single"/>
-          </w:rPr>
-          <w:t xml:space="preserve">Bibliographie et webographie</w:t>
-        </w:r>
-      </w:hyperlink>
-    </w:p>
-    <w:p>
-      <w:pPr>
-        <w:spacing w:after="40" w:line="360" w:lineRule="auto"/>
-        <w:ind w:left="0"/>
-        <w:jc w:val="left"/>
-      </w:pPr>
-      <w:hyperlink w:anchor="bm_annexes">
-        <w:r>
-          <w:rPr>
-            <w:rFonts w:ascii="Times New Roman" w:hAnsi="Times New Roman"/>
-            <w:sz w:val="24"/>
-            <w:color w:val="0000FF"/>
-            <w:u w:val="single"/>
-          </w:rPr>
-          <w:t xml:space="preserve">Annexes</w:t>
-        </w:r>
-      </w:hyperlink>
+      <w:r>
+        <w:rPr>
+          <w:rFonts w:ascii="Times New Roman" w:hAnsi="Times New Roman" w:eastAsia="Times New Roman"/>
+          <w:b w:val="0"/>
+          <w:i/>
+          <w:color w:val="000000"/>
+          <w:sz w:val="24"/>
+        </w:rPr>
+        <w:fldChar w:fldCharType="begin"/>
+        <w:instrText xml:space="preserve">TOC \o "1-1" \h \z \u</w:instrText>
+        <w:fldChar w:fldCharType="separate"/>
+        <w:t>(Cliquez droit &gt; Mettre à jour les champs dans Word)</w:t>
+        <w:fldChar w:fldCharType="end"/>
+      </w:r>
     </w:p>
     <w:p>
       <w:r>
@@ -928,7 +658,7 @@
       </w:r>
     </w:p>
     <w:p>
-      <w:bookmarkStart w:id="44569" w:name="bm_sigles"/>
+      <w:bookmarkStart w:id="55625" w:name="bm_sigles"/>
       <w:pPr>
         <w:pStyle w:val="Heading1"/>
         <w:spacing w:line="360" w:lineRule="auto"/>
@@ -943,7 +673,7 @@
         </w:rPr>
         <w:t>Liste des sigles et abréviations</w:t>
       </w:r>
-      <w:bookmarkEnd w:id="44569"/>
+      <w:bookmarkEnd w:id="55625"/>
     </w:p>
     <w:p>
       <w:pPr>
@@ -1255,7 +985,7 @@
       </w:r>
     </w:p>
     <w:p>
-      <w:bookmarkStart w:id="50680" w:name="bm_liste_figures"/>
+      <w:bookmarkStart w:id="84524" w:name="bm_liste_figures"/>
       <w:pPr>
         <w:pStyle w:val="Heading1"/>
         <w:spacing w:line="360" w:lineRule="auto"/>
@@ -1270,454 +1000,42 @@
         </w:rPr>
         <w:t>Liste des figures</w:t>
       </w:r>
-      <w:bookmarkEnd w:id="50680"/>
-    </w:p>
-    <w:p>
-      <w:pPr>
-        <w:spacing w:after="40" w:line="360" w:lineRule="auto"/>
+      <w:bookmarkEnd w:id="84524"/>
+    </w:p>
+    <w:p>
+      <w:pPr>
+        <w:spacing w:after="160" w:line="360" w:lineRule="auto"/>
+        <w:jc w:val="both"/>
+      </w:pPr>
+      <w:r>
+        <w:rPr>
+          <w:rFonts w:ascii="Times New Roman" w:hAnsi="Times New Roman" w:eastAsia="Times New Roman"/>
+          <w:b w:val="0"/>
+          <w:i/>
+          <w:color w:val="000000"/>
+          <w:sz w:val="22"/>
+        </w:rPr>
+        <w:t>Liste générée automatiquement à partir des légendes. Dans Word : clic droit sur le champ &gt; Mettre à jour les champs.</w:t>
+      </w:r>
+    </w:p>
+    <w:p>
+      <w:pPr>
+        <w:spacing w:after="160" w:line="360" w:lineRule="auto"/>
         <w:jc w:val="left"/>
       </w:pPr>
       <w:r>
         <w:rPr>
           <w:rFonts w:ascii="Times New Roman" w:hAnsi="Times New Roman" w:eastAsia="Times New Roman"/>
           <w:b w:val="0"/>
-          <w:i w:val="0"/>
+          <w:i/>
           <w:color w:val="000000"/>
           <w:sz w:val="24"/>
         </w:rPr>
-        <w:t>Figure 1 : Architecture logique de Cylentic</w:t>
-      </w:r>
-    </w:p>
-    <w:p>
-      <w:pPr>
-        <w:spacing w:after="40" w:line="360" w:lineRule="auto"/>
-        <w:jc w:val="left"/>
-      </w:pPr>
-      <w:r>
-        <w:rPr>
-          <w:rFonts w:ascii="Times New Roman" w:hAnsi="Times New Roman" w:eastAsia="Times New Roman"/>
-          <w:b w:val="0"/>
-          <w:i w:val="0"/>
-          <w:color w:val="000000"/>
-          <w:sz w:val="24"/>
-        </w:rPr>
-        <w:t>Figure 2 : Déploiement de l'infrastructure</w:t>
-      </w:r>
-    </w:p>
-    <w:p>
-      <w:pPr>
-        <w:spacing w:after="40" w:line="360" w:lineRule="auto"/>
-        <w:jc w:val="left"/>
-      </w:pPr>
-      <w:r>
-        <w:rPr>
-          <w:rFonts w:ascii="Times New Roman" w:hAnsi="Times New Roman" w:eastAsia="Times New Roman"/>
-          <w:b w:val="0"/>
-          <w:i w:val="0"/>
-          <w:color w:val="000000"/>
-          <w:sz w:val="24"/>
-        </w:rPr>
-        <w:t>Figure 3 : Cas d'utilisation du Super Admin</w:t>
-      </w:r>
-    </w:p>
-    <w:p>
-      <w:pPr>
-        <w:spacing w:after="40" w:line="360" w:lineRule="auto"/>
-        <w:jc w:val="left"/>
-      </w:pPr>
-      <w:r>
-        <w:rPr>
-          <w:rFonts w:ascii="Times New Roman" w:hAnsi="Times New Roman" w:eastAsia="Times New Roman"/>
-          <w:b w:val="0"/>
-          <w:i w:val="0"/>
-          <w:color w:val="000000"/>
-          <w:sz w:val="24"/>
-        </w:rPr>
-        <w:t>Figure 4 : Cas d'utilisation de l'administrateur (organisation)</w:t>
-      </w:r>
-    </w:p>
-    <w:p>
-      <w:pPr>
-        <w:spacing w:after="40" w:line="360" w:lineRule="auto"/>
-        <w:jc w:val="left"/>
-      </w:pPr>
-      <w:r>
-        <w:rPr>
-          <w:rFonts w:ascii="Times New Roman" w:hAnsi="Times New Roman" w:eastAsia="Times New Roman"/>
-          <w:b w:val="0"/>
-          <w:i w:val="0"/>
-          <w:color w:val="000000"/>
-          <w:sz w:val="24"/>
-        </w:rPr>
-        <w:t>Figure 5 : Cas d'utilisation de l'administrateur (comptes)</w:t>
-      </w:r>
-    </w:p>
-    <w:p>
-      <w:pPr>
-        <w:spacing w:after="40" w:line="360" w:lineRule="auto"/>
-        <w:jc w:val="left"/>
-      </w:pPr>
-      <w:r>
-        <w:rPr>
-          <w:rFonts w:ascii="Times New Roman" w:hAnsi="Times New Roman" w:eastAsia="Times New Roman"/>
-          <w:b w:val="0"/>
-          <w:i w:val="0"/>
-          <w:color w:val="000000"/>
-          <w:sz w:val="24"/>
-        </w:rPr>
-        <w:t>Figure 6 : Cas d'utilisation du professeur (examens)</w:t>
-      </w:r>
-    </w:p>
-    <w:p>
-      <w:pPr>
-        <w:spacing w:after="40" w:line="360" w:lineRule="auto"/>
-        <w:jc w:val="left"/>
-      </w:pPr>
-      <w:r>
-        <w:rPr>
-          <w:rFonts w:ascii="Times New Roman" w:hAnsi="Times New Roman" w:eastAsia="Times New Roman"/>
-          <w:b w:val="0"/>
-          <w:i w:val="0"/>
-          <w:color w:val="000000"/>
-          <w:sz w:val="24"/>
-        </w:rPr>
-        <w:t>Figure 7 : Cas d'utilisation du professeur (suivi)</w:t>
-      </w:r>
-    </w:p>
-    <w:p>
-      <w:pPr>
-        <w:spacing w:after="40" w:line="360" w:lineRule="auto"/>
-        <w:jc w:val="left"/>
-      </w:pPr>
-      <w:r>
-        <w:rPr>
-          <w:rFonts w:ascii="Times New Roman" w:hAnsi="Times New Roman" w:eastAsia="Times New Roman"/>
-          <w:b w:val="0"/>
-          <w:i w:val="0"/>
-          <w:color w:val="000000"/>
-          <w:sz w:val="24"/>
-        </w:rPr>
-        <w:t>Figure 8 : Cas d'utilisation de l'étudiant</w:t>
-      </w:r>
-    </w:p>
-    <w:p>
-      <w:pPr>
-        <w:spacing w:after="40" w:line="360" w:lineRule="auto"/>
-        <w:jc w:val="left"/>
-      </w:pPr>
-      <w:r>
-        <w:rPr>
-          <w:rFonts w:ascii="Times New Roman" w:hAnsi="Times New Roman" w:eastAsia="Times New Roman"/>
-          <w:b w:val="0"/>
-          <w:i w:val="0"/>
-          <w:color w:val="000000"/>
-          <w:sz w:val="24"/>
-        </w:rPr>
-        <w:t>Figure 9 : Classes organisation et comptes</w:t>
-      </w:r>
-    </w:p>
-    <w:p>
-      <w:pPr>
-        <w:spacing w:after="40" w:line="360" w:lineRule="auto"/>
-        <w:jc w:val="left"/>
-      </w:pPr>
-      <w:r>
-        <w:rPr>
-          <w:rFonts w:ascii="Times New Roman" w:hAnsi="Times New Roman" w:eastAsia="Times New Roman"/>
-          <w:b w:val="0"/>
-          <w:i w:val="0"/>
-          <w:color w:val="000000"/>
-          <w:sz w:val="24"/>
-        </w:rPr>
-        <w:t>Figure 10 : Classes conception d'examen</w:t>
-      </w:r>
-    </w:p>
-    <w:p>
-      <w:pPr>
-        <w:spacing w:after="40" w:line="360" w:lineRule="auto"/>
-        <w:jc w:val="left"/>
-      </w:pPr>
-      <w:r>
-        <w:rPr>
-          <w:rFonts w:ascii="Times New Roman" w:hAnsi="Times New Roman" w:eastAsia="Times New Roman"/>
-          <w:b w:val="0"/>
-          <w:i w:val="0"/>
-          <w:color w:val="000000"/>
-          <w:sz w:val="24"/>
-        </w:rPr>
-        <w:t>Figure 11 : Classes passation et correction</w:t>
-      </w:r>
-    </w:p>
-    <w:p>
-      <w:pPr>
-        <w:spacing w:after="40" w:line="360" w:lineRule="auto"/>
-        <w:jc w:val="left"/>
-      </w:pPr>
-      <w:r>
-        <w:rPr>
-          <w:rFonts w:ascii="Times New Roman" w:hAnsi="Times New Roman" w:eastAsia="Times New Roman"/>
-          <w:b w:val="0"/>
-          <w:i w:val="0"/>
-          <w:color w:val="000000"/>
-          <w:sz w:val="24"/>
-        </w:rPr>
-        <w:t>Figure 12 : Objets organisation</w:t>
-      </w:r>
-    </w:p>
-    <w:p>
-      <w:pPr>
-        <w:spacing w:after="40" w:line="360" w:lineRule="auto"/>
-        <w:jc w:val="left"/>
-      </w:pPr>
-      <w:r>
-        <w:rPr>
-          <w:rFonts w:ascii="Times New Roman" w:hAnsi="Times New Roman" w:eastAsia="Times New Roman"/>
-          <w:b w:val="0"/>
-          <w:i w:val="0"/>
-          <w:color w:val="000000"/>
-          <w:sz w:val="24"/>
-        </w:rPr>
-        <w:t>Figure 13 : Objets conception d'examen</w:t>
-      </w:r>
-    </w:p>
-    <w:p>
-      <w:pPr>
-        <w:spacing w:after="40" w:line="360" w:lineRule="auto"/>
-        <w:jc w:val="left"/>
-      </w:pPr>
-      <w:r>
-        <w:rPr>
-          <w:rFonts w:ascii="Times New Roman" w:hAnsi="Times New Roman" w:eastAsia="Times New Roman"/>
-          <w:b w:val="0"/>
-          <w:i w:val="0"/>
-          <w:color w:val="000000"/>
-          <w:sz w:val="24"/>
-        </w:rPr>
-        <w:t>Figure 14 : Objets passation</w:t>
-      </w:r>
-    </w:p>
-    <w:p>
-      <w:pPr>
-        <w:spacing w:after="40" w:line="360" w:lineRule="auto"/>
-        <w:jc w:val="left"/>
-      </w:pPr>
-      <w:r>
-        <w:rPr>
-          <w:rFonts w:ascii="Times New Roman" w:hAnsi="Times New Roman" w:eastAsia="Times New Roman"/>
-          <w:b w:val="0"/>
-          <w:i w:val="0"/>
-          <w:color w:val="000000"/>
-          <w:sz w:val="24"/>
-        </w:rPr>
-        <w:t>Figure 15 : Composants vue d'ensemble</w:t>
-      </w:r>
-    </w:p>
-    <w:p>
-      <w:pPr>
-        <w:spacing w:after="40" w:line="360" w:lineRule="auto"/>
-        <w:jc w:val="left"/>
-      </w:pPr>
-      <w:r>
-        <w:rPr>
-          <w:rFonts w:ascii="Times New Roman" w:hAnsi="Times New Roman" w:eastAsia="Times New Roman"/>
-          <w:b w:val="0"/>
-          <w:i w:val="0"/>
-          <w:color w:val="000000"/>
-          <w:sz w:val="24"/>
-        </w:rPr>
-        <w:t>Figure 16 : Composants administration et authentification</w:t>
-      </w:r>
-    </w:p>
-    <w:p>
-      <w:pPr>
-        <w:spacing w:after="40" w:line="360" w:lineRule="auto"/>
-        <w:jc w:val="left"/>
-      </w:pPr>
-      <w:r>
-        <w:rPr>
-          <w:rFonts w:ascii="Times New Roman" w:hAnsi="Times New Roman" w:eastAsia="Times New Roman"/>
-          <w:b w:val="0"/>
-          <w:i w:val="0"/>
-          <w:color w:val="000000"/>
-          <w:sz w:val="24"/>
-        </w:rPr>
-        <w:t>Figure 17 : Composants examens et passation</w:t>
-      </w:r>
-    </w:p>
-    <w:p>
-      <w:pPr>
-        <w:spacing w:after="40" w:line="360" w:lineRule="auto"/>
-        <w:jc w:val="left"/>
-      </w:pPr>
-      <w:r>
-        <w:rPr>
-          <w:rFonts w:ascii="Times New Roman" w:hAnsi="Times New Roman" w:eastAsia="Times New Roman"/>
-          <w:b w:val="0"/>
-          <w:i w:val="0"/>
-          <w:color w:val="000000"/>
-          <w:sz w:val="24"/>
-        </w:rPr>
-        <w:t>Figure 18 : États du cycle de vie d'un examen</w:t>
-      </w:r>
-    </w:p>
-    <w:p>
-      <w:pPr>
-        <w:spacing w:after="40" w:line="360" w:lineRule="auto"/>
-        <w:jc w:val="left"/>
-      </w:pPr>
-      <w:r>
-        <w:rPr>
-          <w:rFonts w:ascii="Times New Roman" w:hAnsi="Times New Roman" w:eastAsia="Times New Roman"/>
-          <w:b w:val="0"/>
-          <w:i w:val="0"/>
-          <w:color w:val="000000"/>
-          <w:sz w:val="24"/>
-        </w:rPr>
-        <w:t>Figure 19 : Séquence de connexion</w:t>
-      </w:r>
-    </w:p>
-    <w:p>
-      <w:pPr>
-        <w:spacing w:after="40" w:line="360" w:lineRule="auto"/>
-        <w:jc w:val="left"/>
-      </w:pPr>
-      <w:r>
-        <w:rPr>
-          <w:rFonts w:ascii="Times New Roman" w:hAnsi="Times New Roman" w:eastAsia="Times New Roman"/>
-          <w:b w:val="0"/>
-          <w:i w:val="0"/>
-          <w:color w:val="000000"/>
-          <w:sz w:val="24"/>
-        </w:rPr>
-        <w:t>Figure 20 : Séquence de publication d'un examen</w:t>
-      </w:r>
-    </w:p>
-    <w:p>
-      <w:pPr>
-        <w:spacing w:after="40" w:line="360" w:lineRule="auto"/>
-        <w:jc w:val="left"/>
-      </w:pPr>
-      <w:r>
-        <w:rPr>
-          <w:rFonts w:ascii="Times New Roman" w:hAnsi="Times New Roman" w:eastAsia="Times New Roman"/>
-          <w:b w:val="0"/>
-          <w:i w:val="0"/>
-          <w:color w:val="000000"/>
-          <w:sz w:val="24"/>
-        </w:rPr>
-        <w:t>Figure 21 : Séquence d'accès étudiant</w:t>
-      </w:r>
-    </w:p>
-    <w:p>
-      <w:pPr>
-        <w:spacing w:after="40" w:line="360" w:lineRule="auto"/>
-        <w:jc w:val="left"/>
-      </w:pPr>
-      <w:r>
-        <w:rPr>
-          <w:rFonts w:ascii="Times New Roman" w:hAnsi="Times New Roman" w:eastAsia="Times New Roman"/>
-          <w:b w:val="0"/>
-          <w:i w:val="0"/>
-          <w:color w:val="000000"/>
-          <w:sz w:val="24"/>
-        </w:rPr>
-        <w:t>Figure 22 : Séquence d'exécution du code</w:t>
-      </w:r>
-    </w:p>
-    <w:p>
-      <w:pPr>
-        <w:spacing w:after="40" w:line="360" w:lineRule="auto"/>
-        <w:jc w:val="left"/>
-      </w:pPr>
-      <w:r>
-        <w:rPr>
-          <w:rFonts w:ascii="Times New Roman" w:hAnsi="Times New Roman" w:eastAsia="Times New Roman"/>
-          <w:b w:val="0"/>
-          <w:i w:val="0"/>
-          <w:color w:val="000000"/>
-          <w:sz w:val="24"/>
-        </w:rPr>
-        <w:t>Figure 23 : Séquence de soumission et correction</w:t>
-      </w:r>
-    </w:p>
-    <w:p>
-      <w:pPr>
-        <w:spacing w:after="40" w:line="360" w:lineRule="auto"/>
-        <w:jc w:val="left"/>
-      </w:pPr>
-      <w:r>
-        <w:rPr>
-          <w:rFonts w:ascii="Times New Roman" w:hAnsi="Times New Roman" w:eastAsia="Times New Roman"/>
-          <w:b w:val="0"/>
-          <w:i w:val="0"/>
-          <w:color w:val="000000"/>
-          <w:sz w:val="24"/>
-        </w:rPr>
-        <w:t>Figure 24 : Séquence d'enregistrement d'un incident</w:t>
-      </w:r>
-    </w:p>
-    <w:p>
-      <w:pPr>
-        <w:spacing w:after="40" w:line="360" w:lineRule="auto"/>
-        <w:jc w:val="left"/>
-      </w:pPr>
-      <w:r>
-        <w:rPr>
-          <w:rFonts w:ascii="Times New Roman" w:hAnsi="Times New Roman" w:eastAsia="Times New Roman"/>
-          <w:b w:val="0"/>
-          <w:i w:val="0"/>
-          <w:color w:val="000000"/>
-          <w:sz w:val="24"/>
-        </w:rPr>
-        <w:t>Figure 25 : Activité accès et salle d'attente</w:t>
-      </w:r>
-    </w:p>
-    <w:p>
-      <w:pPr>
-        <w:spacing w:after="40" w:line="360" w:lineRule="auto"/>
-        <w:jc w:val="left"/>
-      </w:pPr>
-      <w:r>
-        <w:rPr>
-          <w:rFonts w:ascii="Times New Roman" w:hAnsi="Times New Roman" w:eastAsia="Times New Roman"/>
-          <w:b w:val="0"/>
-          <w:i w:val="0"/>
-          <w:color w:val="000000"/>
-          <w:sz w:val="24"/>
-        </w:rPr>
-        <w:t>Figure 26 : Activité composition et soumission</w:t>
-      </w:r>
-    </w:p>
-    <w:p>
-      <w:pPr>
-        <w:spacing w:after="40" w:line="360" w:lineRule="auto"/>
-        <w:jc w:val="left"/>
-      </w:pPr>
-      <w:r>
-        <w:rPr>
-          <w:rFonts w:ascii="Times New Roman" w:hAnsi="Times New Roman" w:eastAsia="Times New Roman"/>
-          <w:b w:val="0"/>
-          <w:i w:val="0"/>
-          <w:color w:val="000000"/>
-          <w:sz w:val="24"/>
-        </w:rPr>
-        <w:t>Figure 27 : Salle d'attente avant le démarrage de l'examen</w:t>
-      </w:r>
-    </w:p>
-    <w:p>
-      <w:pPr>
-        <w:spacing w:after="40" w:line="360" w:lineRule="auto"/>
-        <w:jc w:val="left"/>
-      </w:pPr>
-      <w:r>
-        <w:rPr>
-          <w:rFonts w:ascii="Times New Roman" w:hAnsi="Times New Roman" w:eastAsia="Times New Roman"/>
-          <w:b w:val="0"/>
-          <w:i w:val="0"/>
-          <w:color w:val="000000"/>
-          <w:sz w:val="24"/>
-        </w:rPr>
-        <w:t>Figure 28 : Environnement de composition pendant l'épreuve</w:t>
+        <w:fldChar w:fldCharType="begin"/>
+        <w:instrText xml:space="preserve">TOC \h \z \c "Figure"</w:instrText>
+        <w:fldChar w:fldCharType="separate"/>
+        <w:t>(Cliquez droit &gt; Mettre à jour les champs dans Word)</w:t>
+        <w:fldChar w:fldCharType="end"/>
       </w:r>
     </w:p>
     <w:p>
@@ -1726,7 +1044,7 @@
       </w:r>
     </w:p>
     <w:p>
-      <w:bookmarkStart w:id="25406" w:name="bm_liste_tableaux"/>
+      <w:bookmarkStart w:id="83503" w:name="bm_liste_tableaux"/>
       <w:pPr>
         <w:pStyle w:val="Heading1"/>
         <w:spacing w:line="360" w:lineRule="auto"/>
@@ -1741,54 +1059,42 @@
         </w:rPr>
         <w:t>Liste des tableaux</w:t>
       </w:r>
-      <w:bookmarkEnd w:id="25406"/>
-    </w:p>
-    <w:p>
-      <w:pPr>
-        <w:spacing w:after="40" w:line="360" w:lineRule="auto"/>
+      <w:bookmarkEnd w:id="83503"/>
+    </w:p>
+    <w:p>
+      <w:pPr>
+        <w:spacing w:after="160" w:line="360" w:lineRule="auto"/>
+        <w:jc w:val="both"/>
+      </w:pPr>
+      <w:r>
+        <w:rPr>
+          <w:rFonts w:ascii="Times New Roman" w:hAnsi="Times New Roman" w:eastAsia="Times New Roman"/>
+          <w:b w:val="0"/>
+          <w:i/>
+          <w:color w:val="000000"/>
+          <w:sz w:val="22"/>
+        </w:rPr>
+        <w:t>Liste générée automatiquement à partir des titres de tableaux. Dans Word : clic droit &gt; Mettre à jour les champs.</w:t>
+      </w:r>
+    </w:p>
+    <w:p>
+      <w:pPr>
+        <w:spacing w:after="160" w:line="360" w:lineRule="auto"/>
         <w:jc w:val="left"/>
       </w:pPr>
       <w:r>
         <w:rPr>
           <w:rFonts w:ascii="Times New Roman" w:hAnsi="Times New Roman" w:eastAsia="Times New Roman"/>
           <w:b w:val="0"/>
-          <w:i w:val="0"/>
+          <w:i/>
           <w:color w:val="000000"/>
           <w:sz w:val="24"/>
         </w:rPr>
-        <w:t>Tableau 1 : Comparaison des solutions existantes et de Cylentic</w:t>
-      </w:r>
-    </w:p>
-    <w:p>
-      <w:pPr>
-        <w:spacing w:after="40" w:line="360" w:lineRule="auto"/>
-        <w:jc w:val="left"/>
-      </w:pPr>
-      <w:r>
-        <w:rPr>
-          <w:rFonts w:ascii="Times New Roman" w:hAnsi="Times New Roman" w:eastAsia="Times New Roman"/>
-          <w:b w:val="0"/>
-          <w:i w:val="0"/>
-          <w:color w:val="000000"/>
-          <w:sz w:val="24"/>
-        </w:rPr>
-        <w:t>Tableau 2 : Correspondance entre acteurs et responsabilités</w:t>
-      </w:r>
-    </w:p>
-    <w:p>
-      <w:pPr>
-        <w:spacing w:after="40" w:line="360" w:lineRule="auto"/>
-        <w:jc w:val="left"/>
-      </w:pPr>
-      <w:r>
-        <w:rPr>
-          <w:rFonts w:ascii="Times New Roman" w:hAnsi="Times New Roman" w:eastAsia="Times New Roman"/>
-          <w:b w:val="0"/>
-          <w:i w:val="0"/>
-          <w:color w:val="000000"/>
-          <w:sz w:val="24"/>
-        </w:rPr>
-        <w:t>Tableau 3 : Principales tables persistantes et rôle</w:t>
+        <w:fldChar w:fldCharType="begin"/>
+        <w:instrText xml:space="preserve">TOC \h \z \c "Tableau"</w:instrText>
+        <w:fldChar w:fldCharType="separate"/>
+        <w:t>(Cliquez droit &gt; Mettre à jour les champs dans Word)</w:t>
+        <w:fldChar w:fldCharType="end"/>
       </w:r>
     </w:p>
     <w:p>
@@ -1797,7 +1103,7 @@
       </w:r>
     </w:p>
     <w:p>
-      <w:bookmarkStart w:id="90576" w:name="bm_resume"/>
+      <w:bookmarkStart w:id="23216" w:name="bm_resume"/>
       <w:pPr>
         <w:pStyle w:val="Heading1"/>
         <w:spacing w:line="360" w:lineRule="auto"/>
@@ -1812,7 +1118,7 @@
         </w:rPr>
         <w:t>Résumé</w:t>
       </w:r>
-      <w:bookmarkEnd w:id="90576"/>
+      <w:bookmarkEnd w:id="23216"/>
     </w:p>
     <w:p>
       <w:pPr>
@@ -1854,7 +1160,7 @@
       </w:r>
     </w:p>
     <w:p>
-      <w:bookmarkStart w:id="25604" w:name="bm_abstract"/>
+      <w:bookmarkStart w:id="21961" w:name="bm_abstract"/>
       <w:pPr>
         <w:pStyle w:val="Heading1"/>
         <w:spacing w:line="360" w:lineRule="auto"/>
@@ -1869,7 +1175,7 @@
         </w:rPr>
         <w:t>Abstract</w:t>
       </w:r>
-      <w:bookmarkEnd w:id="25604"/>
+      <w:bookmarkEnd w:id="21961"/>
     </w:p>
     <w:p>
       <w:pPr>
@@ -1918,7 +1224,7 @@
       </w:pPr>
     </w:p>
     <w:p>
-      <w:bookmarkStart w:id="90445" w:name="bm_intro"/>
+      <w:bookmarkStart w:id="57756" w:name="bm_intro"/>
       <w:pPr>
         <w:pStyle w:val="Heading1"/>
         <w:spacing w:line="360" w:lineRule="auto"/>
@@ -1933,7 +1239,7 @@
         </w:rPr>
         <w:t>Introduction générale</w:t>
       </w:r>
-      <w:bookmarkEnd w:id="90445"/>
+      <w:bookmarkEnd w:id="57756"/>
     </w:p>
     <w:p>
       <w:pPr>
@@ -2004,7 +1310,7 @@
       </w:r>
     </w:p>
     <w:p>
-      <w:bookmarkStart w:id="36191" w:name="bm_probl"/>
+      <w:bookmarkStart w:id="12756" w:name="bm_probl"/>
       <w:pPr>
         <w:pStyle w:val="Heading1"/>
         <w:spacing w:line="360" w:lineRule="auto"/>
@@ -2019,7 +1325,7 @@
         </w:rPr>
         <w:t>Problématique</w:t>
       </w:r>
-      <w:bookmarkEnd w:id="36191"/>
+      <w:bookmarkEnd w:id="12756"/>
     </w:p>
     <w:p>
       <w:pPr>
@@ -2174,7 +1480,7 @@
       </w:r>
     </w:p>
     <w:p>
-      <w:bookmarkStart w:id="93895" w:name="bm_ch1"/>
+      <w:bookmarkStart w:id="21130" w:name="bm_ch1"/>
       <w:pPr>
         <w:pStyle w:val="Heading1"/>
         <w:spacing w:line="360" w:lineRule="auto"/>
@@ -2189,7 +1495,7 @@
         </w:rPr>
         <w:t>Chapitre 1 : Contexte et étude de l'existant</w:t>
       </w:r>
-      <w:bookmarkEnd w:id="93895"/>
+      <w:bookmarkEnd w:id="21130"/>
     </w:p>
     <w:p>
       <w:pPr>
@@ -2209,7 +1515,7 @@
       </w:r>
     </w:p>
     <w:p>
-      <w:bookmarkStart w:id="15777" w:name="bm_ch1_1"/>
+      <w:bookmarkStart w:id="15079" w:name="bm_ch1_1"/>
       <w:pPr>
         <w:pStyle w:val="Heading2"/>
         <w:spacing w:line="360" w:lineRule="auto"/>
@@ -2224,7 +1530,7 @@
         </w:rPr>
         <w:t>1.1 Contexte pédagogique et technologique</w:t>
       </w:r>
-      <w:bookmarkEnd w:id="15777"/>
+      <w:bookmarkEnd w:id="15079"/>
     </w:p>
     <w:p>
       <w:pPr>
@@ -2278,7 +1584,7 @@
       </w:r>
     </w:p>
     <w:p>
-      <w:bookmarkStart w:id="80455" w:name="bm_ch1_2"/>
+      <w:bookmarkStart w:id="95769" w:name="bm_ch1_2"/>
       <w:pPr>
         <w:pStyle w:val="Heading2"/>
         <w:spacing w:line="360" w:lineRule="auto"/>
@@ -2293,7 +1599,7 @@
         </w:rPr>
         <w:t>1.2 Sous-problèmes et contraintes locales</w:t>
       </w:r>
-      <w:bookmarkEnd w:id="80455"/>
+      <w:bookmarkEnd w:id="95769"/>
     </w:p>
     <w:p>
       <w:pPr>
@@ -2347,7 +1653,7 @@
       </w:r>
     </w:p>
     <w:p>
-      <w:bookmarkStart w:id="51708" w:name="bm_ch1_3"/>
+      <w:bookmarkStart w:id="71214" w:name="bm_ch1_3"/>
       <w:pPr>
         <w:pStyle w:val="Heading2"/>
         <w:spacing w:line="360" w:lineRule="auto"/>
@@ -2362,7 +1668,7 @@
         </w:rPr>
         <w:t>1.3 Examen des solutions existantes</w:t>
       </w:r>
-      <w:bookmarkEnd w:id="51708"/>
+      <w:bookmarkEnd w:id="71214"/>
     </w:p>
     <w:p>
       <w:pPr>
@@ -2462,7 +1768,31 @@
           <w:color w:val="000000"/>
           <w:sz w:val="22"/>
         </w:rPr>
-        <w:t>Tableau : Comparaison des solutions existantes et de Cylentic</w:t>
+        <w:t xml:space="preserve">Tableau </w:t>
+      </w:r>
+      <w:r>
+        <w:rPr>
+          <w:rFonts w:ascii="Times New Roman" w:hAnsi="Times New Roman" w:eastAsia="Times New Roman"/>
+          <w:b/>
+          <w:i w:val="0"/>
+          <w:color w:val="000000"/>
+          <w:sz w:val="22"/>
+        </w:rPr>
+        <w:fldChar w:fldCharType="begin"/>
+        <w:instrText xml:space="preserve">SEQ Tableau \* ARABIC</w:instrText>
+        <w:fldChar w:fldCharType="separate"/>
+        <w:t>1</w:t>
+        <w:fldChar w:fldCharType="end"/>
+      </w:r>
+      <w:r>
+        <w:rPr>
+          <w:rFonts w:ascii="Times New Roman" w:hAnsi="Times New Roman" w:eastAsia="Times New Roman"/>
+          <w:b/>
+          <w:i w:val="0"/>
+          <w:color w:val="000000"/>
+          <w:sz w:val="22"/>
+        </w:rPr>
+        <w:t xml:space="preserve"> : Comparaison des solutions existantes et de Cylentic</w:t>
       </w:r>
     </w:p>
     <w:tbl>
@@ -3346,7 +2676,7 @@
       </w:r>
     </w:p>
     <w:p>
-      <w:bookmarkStart w:id="54021" w:name="bm_ch1_4"/>
+      <w:bookmarkStart w:id="55194" w:name="bm_ch1_4"/>
       <w:pPr>
         <w:pStyle w:val="Heading2"/>
         <w:spacing w:line="360" w:lineRule="auto"/>
@@ -3361,7 +2691,7 @@
         </w:rPr>
         <w:t>1.4 Positionnement de Cylentic</w:t>
       </w:r>
-      <w:bookmarkEnd w:id="54021"/>
+      <w:bookmarkEnd w:id="55194"/>
     </w:p>
     <w:p>
       <w:pPr>
@@ -3398,7 +2728,7 @@
       </w:r>
     </w:p>
     <w:p>
-      <w:bookmarkStart w:id="46835" w:name="bm_ch1_5"/>
+      <w:bookmarkStart w:id="95896" w:name="bm_ch1_5"/>
       <w:pPr>
         <w:pStyle w:val="Heading2"/>
         <w:spacing w:line="360" w:lineRule="auto"/>
@@ -3413,7 +2743,7 @@
         </w:rPr>
         <w:t>1.5 Conclusion partielle</w:t>
       </w:r>
-      <w:bookmarkEnd w:id="46835"/>
+      <w:bookmarkEnd w:id="95896"/>
     </w:p>
     <w:p>
       <w:pPr>
@@ -3438,7 +2768,7 @@
       </w:r>
     </w:p>
     <w:p>
-      <w:bookmarkStart w:id="16591" w:name="bm_ch2"/>
+      <w:bookmarkStart w:id="5343" w:name="bm_ch2"/>
       <w:pPr>
         <w:pStyle w:val="Heading1"/>
         <w:spacing w:line="360" w:lineRule="auto"/>
@@ -3453,10 +2783,10 @@
         </w:rPr>
         <w:t>Chapitre 2 : Analyse des besoins et spécification du système</w:t>
       </w:r>
-      <w:bookmarkEnd w:id="16591"/>
-    </w:p>
-    <w:p>
-      <w:bookmarkStart w:id="22290" w:name="bm_ch2_1"/>
+      <w:bookmarkEnd w:id="5343"/>
+    </w:p>
+    <w:p>
+      <w:bookmarkStart w:id="36647" w:name="bm_ch2_1"/>
       <w:pPr>
         <w:pStyle w:val="Heading2"/>
         <w:spacing w:line="360" w:lineRule="auto"/>
@@ -3471,7 +2801,7 @@
         </w:rPr>
         <w:t>2.1 Périmètre du projet et du MVP</w:t>
       </w:r>
-      <w:bookmarkEnd w:id="22290"/>
+      <w:bookmarkEnd w:id="36647"/>
     </w:p>
     <w:p>
       <w:pPr>
@@ -3525,7 +2855,7 @@
       </w:r>
     </w:p>
     <w:p>
-      <w:bookmarkStart w:id="54436" w:name="bm_ch2_2"/>
+      <w:bookmarkStart w:id="57816" w:name="bm_ch2_2"/>
       <w:pPr>
         <w:pStyle w:val="Heading2"/>
         <w:spacing w:line="360" w:lineRule="auto"/>
@@ -3540,7 +2870,7 @@
         </w:rPr>
         <w:t>2.2 Identification des acteurs</w:t>
       </w:r>
-      <w:bookmarkEnd w:id="54436"/>
+      <w:bookmarkEnd w:id="57816"/>
     </w:p>
     <w:p>
       <w:pPr>
@@ -3877,7 +3207,7 @@
       </w:r>
     </w:p>
     <w:p>
-      <w:bookmarkStart w:id="18947" w:name="bm_ch2_3"/>
+      <w:bookmarkStart w:id="74395" w:name="bm_ch2_3"/>
       <w:pPr>
         <w:pStyle w:val="Heading2"/>
         <w:spacing w:line="360" w:lineRule="auto"/>
@@ -3892,7 +3222,7 @@
         </w:rPr>
         <w:t>2.3 Besoins fonctionnels</w:t>
       </w:r>
-      <w:bookmarkEnd w:id="18947"/>
+      <w:bookmarkEnd w:id="74395"/>
     </w:p>
     <w:p>
       <w:pPr>
@@ -3997,7 +3327,7 @@
       </w:r>
     </w:p>
     <w:p>
-      <w:bookmarkStart w:id="59613" w:name="bm_ch2_4"/>
+      <w:bookmarkStart w:id="14086" w:name="bm_ch2_4"/>
       <w:pPr>
         <w:pStyle w:val="Heading2"/>
         <w:spacing w:line="360" w:lineRule="auto"/>
@@ -4012,7 +3342,7 @@
         </w:rPr>
         <w:t>2.4 Besoins non fonctionnels</w:t>
       </w:r>
-      <w:bookmarkEnd w:id="59613"/>
+      <w:bookmarkEnd w:id="14086"/>
     </w:p>
     <w:p>
       <w:pPr>
@@ -4049,7 +3379,7 @@
       </w:r>
     </w:p>
     <w:p>
-      <w:bookmarkStart w:id="28477" w:name="bm_ch2_5"/>
+      <w:bookmarkStart w:id="24726" w:name="bm_ch2_5"/>
       <w:pPr>
         <w:pStyle w:val="Heading2"/>
         <w:spacing w:line="360" w:lineRule="auto"/>
@@ -4064,7 +3394,7 @@
         </w:rPr>
         <w:t>2.5 Règles métier structurantes</w:t>
       </w:r>
-      <w:bookmarkEnd w:id="28477"/>
+      <w:bookmarkEnd w:id="24726"/>
     </w:p>
     <w:p>
       <w:pPr>
@@ -4084,7 +3414,7 @@
       </w:r>
     </w:p>
     <w:p>
-      <w:bookmarkStart w:id="2486" w:name="bm_ch2_6"/>
+      <w:bookmarkStart w:id="20985" w:name="bm_ch2_6"/>
       <w:pPr>
         <w:pStyle w:val="Heading2"/>
         <w:spacing w:line="360" w:lineRule="auto"/>
@@ -4099,7 +3429,7 @@
         </w:rPr>
         <w:t>2.6 Scénarios d'usage prioritaires</w:t>
       </w:r>
-      <w:bookmarkEnd w:id="2486"/>
+      <w:bookmarkEnd w:id="20985"/>
     </w:p>
     <w:p>
       <w:pPr>
@@ -4119,7 +3449,7 @@
       </w:r>
     </w:p>
     <w:p>
-      <w:bookmarkStart w:id="72293" w:name="bm_ch2_7"/>
+      <w:bookmarkStart w:id="76208" w:name="bm_ch2_7"/>
       <w:pPr>
         <w:pStyle w:val="Heading2"/>
         <w:spacing w:line="360" w:lineRule="auto"/>
@@ -4134,7 +3464,7 @@
         </w:rPr>
         <w:t>2.7 Conclusion partielle</w:t>
       </w:r>
-      <w:bookmarkEnd w:id="72293"/>
+      <w:bookmarkEnd w:id="76208"/>
     </w:p>
     <w:p>
       <w:pPr>
@@ -4159,7 +3489,7 @@
       </w:r>
     </w:p>
     <w:p>
-      <w:bookmarkStart w:id="5138" w:name="bm_ch3"/>
+      <w:bookmarkStart w:id="24717" w:name="bm_ch3"/>
       <w:pPr>
         <w:pStyle w:val="Heading1"/>
         <w:spacing w:line="360" w:lineRule="auto"/>
@@ -4174,10 +3504,10 @@
         </w:rPr>
         <w:t>Chapitre 3 : Conception du système Cylentic</w:t>
       </w:r>
-      <w:bookmarkEnd w:id="5138"/>
-    </w:p>
-    <w:p>
-      <w:bookmarkStart w:id="86300" w:name="bm_ch3_1"/>
+      <w:bookmarkEnd w:id="24717"/>
+    </w:p>
+    <w:p>
+      <w:bookmarkStart w:id="20667" w:name="bm_ch3_1"/>
       <w:pPr>
         <w:pStyle w:val="Heading2"/>
         <w:spacing w:line="360" w:lineRule="auto"/>
@@ -4192,7 +3522,7 @@
         </w:rPr>
         <w:t>3.1 Démarche de conception</w:t>
       </w:r>
-      <w:bookmarkEnd w:id="86300"/>
+      <w:bookmarkEnd w:id="20667"/>
     </w:p>
     <w:p>
       <w:pPr>
@@ -4262,7 +3592,7 @@
       </w:r>
     </w:p>
     <w:p>
-      <w:bookmarkStart w:id="5361" w:name="bm_ch3_2"/>
+      <w:bookmarkStart w:id="68775" w:name="bm_ch3_2"/>
       <w:pPr>
         <w:pStyle w:val="Heading2"/>
         <w:spacing w:line="360" w:lineRule="auto"/>
@@ -4277,7 +3607,7 @@
         </w:rPr>
         <w:t>3.2 Architecture générale et déploiement</w:t>
       </w:r>
-      <w:bookmarkEnd w:id="5361"/>
+      <w:bookmarkEnd w:id="68775"/>
     </w:p>
     <w:p>
       <w:pPr>
@@ -4349,7 +3679,31 @@
           <w:color w:val="000000"/>
           <w:sz w:val="22"/>
         </w:rPr>
-        <w:t>Figure : Architecture logique de Cylentic</w:t>
+        <w:t xml:space="preserve">Figure </w:t>
+      </w:r>
+      <w:r>
+        <w:rPr>
+          <w:rFonts w:ascii="Times New Roman" w:hAnsi="Times New Roman" w:eastAsia="Times New Roman"/>
+          <w:b w:val="0"/>
+          <w:i w:val="0"/>
+          <w:color w:val="000000"/>
+          <w:sz w:val="22"/>
+        </w:rPr>
+        <w:fldChar w:fldCharType="begin"/>
+        <w:instrText xml:space="preserve">SEQ Figure \* ARABIC</w:instrText>
+        <w:fldChar w:fldCharType="separate"/>
+        <w:t>1</w:t>
+        <w:fldChar w:fldCharType="end"/>
+      </w:r>
+      <w:r>
+        <w:rPr>
+          <w:rFonts w:ascii="Times New Roman" w:hAnsi="Times New Roman" w:eastAsia="Times New Roman"/>
+          <w:b w:val="0"/>
+          <w:i w:val="0"/>
+          <w:color w:val="000000"/>
+          <w:sz w:val="22"/>
+        </w:rPr>
+        <w:t xml:space="preserve"> : Architecture logique de Cylentic</w:t>
       </w:r>
     </w:p>
     <w:p>
@@ -4388,11 +3742,35 @@
           <w:color w:val="000000"/>
           <w:sz w:val="22"/>
         </w:rPr>
-        <w:t>Figure : Déploiement de l'infrastructure</w:t>
-      </w:r>
-    </w:p>
-    <w:p>
-      <w:bookmarkStart w:id="3351" w:name="bm_ch3_3"/>
+        <w:t xml:space="preserve">Figure </w:t>
+      </w:r>
+      <w:r>
+        <w:rPr>
+          <w:rFonts w:ascii="Times New Roman" w:hAnsi="Times New Roman" w:eastAsia="Times New Roman"/>
+          <w:b w:val="0"/>
+          <w:i w:val="0"/>
+          <w:color w:val="000000"/>
+          <w:sz w:val="22"/>
+        </w:rPr>
+        <w:fldChar w:fldCharType="begin"/>
+        <w:instrText xml:space="preserve">SEQ Figure \* ARABIC</w:instrText>
+        <w:fldChar w:fldCharType="separate"/>
+        <w:t>1</w:t>
+        <w:fldChar w:fldCharType="end"/>
+      </w:r>
+      <w:r>
+        <w:rPr>
+          <w:rFonts w:ascii="Times New Roman" w:hAnsi="Times New Roman" w:eastAsia="Times New Roman"/>
+          <w:b w:val="0"/>
+          <w:i w:val="0"/>
+          <w:color w:val="000000"/>
+          <w:sz w:val="22"/>
+        </w:rPr>
+        <w:t xml:space="preserve"> : Déploiement de l'infrastructure</w:t>
+      </w:r>
+    </w:p>
+    <w:p>
+      <w:bookmarkStart w:id="34159" w:name="bm_ch3_3"/>
       <w:pPr>
         <w:pStyle w:val="Heading2"/>
         <w:spacing w:line="360" w:lineRule="auto"/>
@@ -4407,7 +3785,7 @@
         </w:rPr>
         <w:t>3.3 Vue des cas d'utilisation</w:t>
       </w:r>
-      <w:bookmarkEnd w:id="3351"/>
+      <w:bookmarkEnd w:id="34159"/>
     </w:p>
     <w:p>
       <w:pPr>
@@ -4462,7 +3840,31 @@
           <w:color w:val="000000"/>
           <w:sz w:val="22"/>
         </w:rPr>
-        <w:t>Figure : Cas d'utilisation du Super Admin</w:t>
+        <w:t xml:space="preserve">Figure </w:t>
+      </w:r>
+      <w:r>
+        <w:rPr>
+          <w:rFonts w:ascii="Times New Roman" w:hAnsi="Times New Roman" w:eastAsia="Times New Roman"/>
+          <w:b w:val="0"/>
+          <w:i w:val="0"/>
+          <w:color w:val="000000"/>
+          <w:sz w:val="22"/>
+        </w:rPr>
+        <w:fldChar w:fldCharType="begin"/>
+        <w:instrText xml:space="preserve">SEQ Figure \* ARABIC</w:instrText>
+        <w:fldChar w:fldCharType="separate"/>
+        <w:t>1</w:t>
+        <w:fldChar w:fldCharType="end"/>
+      </w:r>
+      <w:r>
+        <w:rPr>
+          <w:rFonts w:ascii="Times New Roman" w:hAnsi="Times New Roman" w:eastAsia="Times New Roman"/>
+          <w:b w:val="0"/>
+          <w:i w:val="0"/>
+          <w:color w:val="000000"/>
+          <w:sz w:val="22"/>
+        </w:rPr>
+        <w:t xml:space="preserve"> : Cas d'utilisation du Super Admin</w:t>
       </w:r>
     </w:p>
     <w:p>
@@ -4501,7 +3903,31 @@
           <w:color w:val="000000"/>
           <w:sz w:val="22"/>
         </w:rPr>
-        <w:t>Figure : Cas d'utilisation de l'administrateur (organisation)</w:t>
+        <w:t xml:space="preserve">Figure </w:t>
+      </w:r>
+      <w:r>
+        <w:rPr>
+          <w:rFonts w:ascii="Times New Roman" w:hAnsi="Times New Roman" w:eastAsia="Times New Roman"/>
+          <w:b w:val="0"/>
+          <w:i w:val="0"/>
+          <w:color w:val="000000"/>
+          <w:sz w:val="22"/>
+        </w:rPr>
+        <w:fldChar w:fldCharType="begin"/>
+        <w:instrText xml:space="preserve">SEQ Figure \* ARABIC</w:instrText>
+        <w:fldChar w:fldCharType="separate"/>
+        <w:t>1</w:t>
+        <w:fldChar w:fldCharType="end"/>
+      </w:r>
+      <w:r>
+        <w:rPr>
+          <w:rFonts w:ascii="Times New Roman" w:hAnsi="Times New Roman" w:eastAsia="Times New Roman"/>
+          <w:b w:val="0"/>
+          <w:i w:val="0"/>
+          <w:color w:val="000000"/>
+          <w:sz w:val="22"/>
+        </w:rPr>
+        <w:t xml:space="preserve"> : Cas d'utilisation de l'administrateur (organisation)</w:t>
       </w:r>
     </w:p>
     <w:p>
@@ -4523,7 +3949,31 @@
           <w:color w:val="000000"/>
           <w:sz w:val="22"/>
         </w:rPr>
-        <w:t>Figure : Cas d'utilisation de l'administrateur (comptes)</w:t>
+        <w:t xml:space="preserve">Figure </w:t>
+      </w:r>
+      <w:r>
+        <w:rPr>
+          <w:rFonts w:ascii="Times New Roman" w:hAnsi="Times New Roman" w:eastAsia="Times New Roman"/>
+          <w:b w:val="0"/>
+          <w:i w:val="0"/>
+          <w:color w:val="000000"/>
+          <w:sz w:val="22"/>
+        </w:rPr>
+        <w:fldChar w:fldCharType="begin"/>
+        <w:instrText xml:space="preserve">SEQ Figure \* ARABIC</w:instrText>
+        <w:fldChar w:fldCharType="separate"/>
+        <w:t>1</w:t>
+        <w:fldChar w:fldCharType="end"/>
+      </w:r>
+      <w:r>
+        <w:rPr>
+          <w:rFonts w:ascii="Times New Roman" w:hAnsi="Times New Roman" w:eastAsia="Times New Roman"/>
+          <w:b w:val="0"/>
+          <w:i w:val="0"/>
+          <w:color w:val="000000"/>
+          <w:sz w:val="22"/>
+        </w:rPr>
+        <w:t xml:space="preserve"> : Cas d'utilisation de l'administrateur (comptes)</w:t>
       </w:r>
     </w:p>
     <w:p>
@@ -4562,7 +4012,31 @@
           <w:color w:val="000000"/>
           <w:sz w:val="22"/>
         </w:rPr>
-        <w:t>Figure : Cas d'utilisation du professeur (examens)</w:t>
+        <w:t xml:space="preserve">Figure </w:t>
+      </w:r>
+      <w:r>
+        <w:rPr>
+          <w:rFonts w:ascii="Times New Roman" w:hAnsi="Times New Roman" w:eastAsia="Times New Roman"/>
+          <w:b w:val="0"/>
+          <w:i w:val="0"/>
+          <w:color w:val="000000"/>
+          <w:sz w:val="22"/>
+        </w:rPr>
+        <w:fldChar w:fldCharType="begin"/>
+        <w:instrText xml:space="preserve">SEQ Figure \* ARABIC</w:instrText>
+        <w:fldChar w:fldCharType="separate"/>
+        <w:t>1</w:t>
+        <w:fldChar w:fldCharType="end"/>
+      </w:r>
+      <w:r>
+        <w:rPr>
+          <w:rFonts w:ascii="Times New Roman" w:hAnsi="Times New Roman" w:eastAsia="Times New Roman"/>
+          <w:b w:val="0"/>
+          <w:i w:val="0"/>
+          <w:color w:val="000000"/>
+          <w:sz w:val="22"/>
+        </w:rPr>
+        <w:t xml:space="preserve"> : Cas d'utilisation du professeur (examens)</w:t>
       </w:r>
     </w:p>
     <w:p>
@@ -4584,7 +4058,31 @@
           <w:color w:val="000000"/>
           <w:sz w:val="22"/>
         </w:rPr>
-        <w:t>Figure : Cas d'utilisation du professeur (suivi)</w:t>
+        <w:t xml:space="preserve">Figure </w:t>
+      </w:r>
+      <w:r>
+        <w:rPr>
+          <w:rFonts w:ascii="Times New Roman" w:hAnsi="Times New Roman" w:eastAsia="Times New Roman"/>
+          <w:b w:val="0"/>
+          <w:i w:val="0"/>
+          <w:color w:val="000000"/>
+          <w:sz w:val="22"/>
+        </w:rPr>
+        <w:fldChar w:fldCharType="begin"/>
+        <w:instrText xml:space="preserve">SEQ Figure \* ARABIC</w:instrText>
+        <w:fldChar w:fldCharType="separate"/>
+        <w:t>1</w:t>
+        <w:fldChar w:fldCharType="end"/>
+      </w:r>
+      <w:r>
+        <w:rPr>
+          <w:rFonts w:ascii="Times New Roman" w:hAnsi="Times New Roman" w:eastAsia="Times New Roman"/>
+          <w:b w:val="0"/>
+          <w:i w:val="0"/>
+          <w:color w:val="000000"/>
+          <w:sz w:val="22"/>
+        </w:rPr>
+        <w:t xml:space="preserve"> : Cas d'utilisation du professeur (suivi)</w:t>
       </w:r>
     </w:p>
     <w:p>
@@ -4623,11 +4121,35 @@
           <w:color w:val="000000"/>
           <w:sz w:val="22"/>
         </w:rPr>
-        <w:t>Figure : Cas d'utilisation de l'étudiant</w:t>
-      </w:r>
-    </w:p>
-    <w:p>
-      <w:bookmarkStart w:id="29873" w:name="bm_ch3_4"/>
+        <w:t xml:space="preserve">Figure </w:t>
+      </w:r>
+      <w:r>
+        <w:rPr>
+          <w:rFonts w:ascii="Times New Roman" w:hAnsi="Times New Roman" w:eastAsia="Times New Roman"/>
+          <w:b w:val="0"/>
+          <w:i w:val="0"/>
+          <w:color w:val="000000"/>
+          <w:sz w:val="22"/>
+        </w:rPr>
+        <w:fldChar w:fldCharType="begin"/>
+        <w:instrText xml:space="preserve">SEQ Figure \* ARABIC</w:instrText>
+        <w:fldChar w:fldCharType="separate"/>
+        <w:t>1</w:t>
+        <w:fldChar w:fldCharType="end"/>
+      </w:r>
+      <w:r>
+        <w:rPr>
+          <w:rFonts w:ascii="Times New Roman" w:hAnsi="Times New Roman" w:eastAsia="Times New Roman"/>
+          <w:b w:val="0"/>
+          <w:i w:val="0"/>
+          <w:color w:val="000000"/>
+          <w:sz w:val="22"/>
+        </w:rPr>
+        <w:t xml:space="preserve"> : Cas d'utilisation de l'étudiant</w:t>
+      </w:r>
+    </w:p>
+    <w:p>
+      <w:bookmarkStart w:id="67923" w:name="bm_ch3_4"/>
       <w:pPr>
         <w:pStyle w:val="Heading2"/>
         <w:spacing w:line="360" w:lineRule="auto"/>
@@ -4642,7 +4164,7 @@
         </w:rPr>
         <w:t>3.4 Structure statique : classes et objets</w:t>
       </w:r>
-      <w:bookmarkEnd w:id="29873"/>
+      <w:bookmarkEnd w:id="67923"/>
     </w:p>
     <w:p>
       <w:pPr>
@@ -4697,7 +4219,31 @@
           <w:color w:val="000000"/>
           <w:sz w:val="22"/>
         </w:rPr>
-        <w:t>Figure : Classes organisation et comptes</w:t>
+        <w:t xml:space="preserve">Figure </w:t>
+      </w:r>
+      <w:r>
+        <w:rPr>
+          <w:rFonts w:ascii="Times New Roman" w:hAnsi="Times New Roman" w:eastAsia="Times New Roman"/>
+          <w:b w:val="0"/>
+          <w:i w:val="0"/>
+          <w:color w:val="000000"/>
+          <w:sz w:val="22"/>
+        </w:rPr>
+        <w:fldChar w:fldCharType="begin"/>
+        <w:instrText xml:space="preserve">SEQ Figure \* ARABIC</w:instrText>
+        <w:fldChar w:fldCharType="separate"/>
+        <w:t>1</w:t>
+        <w:fldChar w:fldCharType="end"/>
+      </w:r>
+      <w:r>
+        <w:rPr>
+          <w:rFonts w:ascii="Times New Roman" w:hAnsi="Times New Roman" w:eastAsia="Times New Roman"/>
+          <w:b w:val="0"/>
+          <w:i w:val="0"/>
+          <w:color w:val="000000"/>
+          <w:sz w:val="22"/>
+        </w:rPr>
+        <w:t xml:space="preserve"> : Classes organisation et comptes</w:t>
       </w:r>
     </w:p>
     <w:p>
@@ -4719,7 +4265,31 @@
           <w:color w:val="000000"/>
           <w:sz w:val="22"/>
         </w:rPr>
-        <w:t>Figure : Classes conception d'examen</w:t>
+        <w:t xml:space="preserve">Figure </w:t>
+      </w:r>
+      <w:r>
+        <w:rPr>
+          <w:rFonts w:ascii="Times New Roman" w:hAnsi="Times New Roman" w:eastAsia="Times New Roman"/>
+          <w:b w:val="0"/>
+          <w:i w:val="0"/>
+          <w:color w:val="000000"/>
+          <w:sz w:val="22"/>
+        </w:rPr>
+        <w:fldChar w:fldCharType="begin"/>
+        <w:instrText xml:space="preserve">SEQ Figure \* ARABIC</w:instrText>
+        <w:fldChar w:fldCharType="separate"/>
+        <w:t>1</w:t>
+        <w:fldChar w:fldCharType="end"/>
+      </w:r>
+      <w:r>
+        <w:rPr>
+          <w:rFonts w:ascii="Times New Roman" w:hAnsi="Times New Roman" w:eastAsia="Times New Roman"/>
+          <w:b w:val="0"/>
+          <w:i w:val="0"/>
+          <w:color w:val="000000"/>
+          <w:sz w:val="22"/>
+        </w:rPr>
+        <w:t xml:space="preserve"> : Classes conception d'examen</w:t>
       </w:r>
     </w:p>
     <w:p>
@@ -4741,7 +4311,31 @@
           <w:color w:val="000000"/>
           <w:sz w:val="22"/>
         </w:rPr>
-        <w:t>Figure : Classes passation et correction</w:t>
+        <w:t xml:space="preserve">Figure </w:t>
+      </w:r>
+      <w:r>
+        <w:rPr>
+          <w:rFonts w:ascii="Times New Roman" w:hAnsi="Times New Roman" w:eastAsia="Times New Roman"/>
+          <w:b w:val="0"/>
+          <w:i w:val="0"/>
+          <w:color w:val="000000"/>
+          <w:sz w:val="22"/>
+        </w:rPr>
+        <w:fldChar w:fldCharType="begin"/>
+        <w:instrText xml:space="preserve">SEQ Figure \* ARABIC</w:instrText>
+        <w:fldChar w:fldCharType="separate"/>
+        <w:t>1</w:t>
+        <w:fldChar w:fldCharType="end"/>
+      </w:r>
+      <w:r>
+        <w:rPr>
+          <w:rFonts w:ascii="Times New Roman" w:hAnsi="Times New Roman" w:eastAsia="Times New Roman"/>
+          <w:b w:val="0"/>
+          <w:i w:val="0"/>
+          <w:color w:val="000000"/>
+          <w:sz w:val="22"/>
+        </w:rPr>
+        <w:t xml:space="preserve"> : Classes passation et correction</w:t>
       </w:r>
     </w:p>
     <w:p>
@@ -4780,7 +4374,31 @@
           <w:color w:val="000000"/>
           <w:sz w:val="22"/>
         </w:rPr>
-        <w:t>Figure : Objets organisation</w:t>
+        <w:t xml:space="preserve">Figure </w:t>
+      </w:r>
+      <w:r>
+        <w:rPr>
+          <w:rFonts w:ascii="Times New Roman" w:hAnsi="Times New Roman" w:eastAsia="Times New Roman"/>
+          <w:b w:val="0"/>
+          <w:i w:val="0"/>
+          <w:color w:val="000000"/>
+          <w:sz w:val="22"/>
+        </w:rPr>
+        <w:fldChar w:fldCharType="begin"/>
+        <w:instrText xml:space="preserve">SEQ Figure \* ARABIC</w:instrText>
+        <w:fldChar w:fldCharType="separate"/>
+        <w:t>1</w:t>
+        <w:fldChar w:fldCharType="end"/>
+      </w:r>
+      <w:r>
+        <w:rPr>
+          <w:rFonts w:ascii="Times New Roman" w:hAnsi="Times New Roman" w:eastAsia="Times New Roman"/>
+          <w:b w:val="0"/>
+          <w:i w:val="0"/>
+          <w:color w:val="000000"/>
+          <w:sz w:val="22"/>
+        </w:rPr>
+        <w:t xml:space="preserve"> : Objets organisation</w:t>
       </w:r>
     </w:p>
     <w:p>
@@ -4802,7 +4420,31 @@
           <w:color w:val="000000"/>
           <w:sz w:val="22"/>
         </w:rPr>
-        <w:t>Figure : Objets conception d'examen</w:t>
+        <w:t xml:space="preserve">Figure </w:t>
+      </w:r>
+      <w:r>
+        <w:rPr>
+          <w:rFonts w:ascii="Times New Roman" w:hAnsi="Times New Roman" w:eastAsia="Times New Roman"/>
+          <w:b w:val="0"/>
+          <w:i w:val="0"/>
+          <w:color w:val="000000"/>
+          <w:sz w:val="22"/>
+        </w:rPr>
+        <w:fldChar w:fldCharType="begin"/>
+        <w:instrText xml:space="preserve">SEQ Figure \* ARABIC</w:instrText>
+        <w:fldChar w:fldCharType="separate"/>
+        <w:t>1</w:t>
+        <w:fldChar w:fldCharType="end"/>
+      </w:r>
+      <w:r>
+        <w:rPr>
+          <w:rFonts w:ascii="Times New Roman" w:hAnsi="Times New Roman" w:eastAsia="Times New Roman"/>
+          <w:b w:val="0"/>
+          <w:i w:val="0"/>
+          <w:color w:val="000000"/>
+          <w:sz w:val="22"/>
+        </w:rPr>
+        <w:t xml:space="preserve"> : Objets conception d'examen</w:t>
       </w:r>
     </w:p>
     <w:p>
@@ -4824,11 +4466,35 @@
           <w:color w:val="000000"/>
           <w:sz w:val="22"/>
         </w:rPr>
-        <w:t>Figure : Objets passation</w:t>
-      </w:r>
-    </w:p>
-    <w:p>
-      <w:bookmarkStart w:id="94479" w:name="bm_ch3_5"/>
+        <w:t xml:space="preserve">Figure </w:t>
+      </w:r>
+      <w:r>
+        <w:rPr>
+          <w:rFonts w:ascii="Times New Roman" w:hAnsi="Times New Roman" w:eastAsia="Times New Roman"/>
+          <w:b w:val="0"/>
+          <w:i w:val="0"/>
+          <w:color w:val="000000"/>
+          <w:sz w:val="22"/>
+        </w:rPr>
+        <w:fldChar w:fldCharType="begin"/>
+        <w:instrText xml:space="preserve">SEQ Figure \* ARABIC</w:instrText>
+        <w:fldChar w:fldCharType="separate"/>
+        <w:t>1</w:t>
+        <w:fldChar w:fldCharType="end"/>
+      </w:r>
+      <w:r>
+        <w:rPr>
+          <w:rFonts w:ascii="Times New Roman" w:hAnsi="Times New Roman" w:eastAsia="Times New Roman"/>
+          <w:b w:val="0"/>
+          <w:i w:val="0"/>
+          <w:color w:val="000000"/>
+          <w:sz w:val="22"/>
+        </w:rPr>
+        <w:t xml:space="preserve"> : Objets passation</w:t>
+      </w:r>
+    </w:p>
+    <w:p>
+      <w:bookmarkStart w:id="19744" w:name="bm_ch3_5"/>
       <w:pPr>
         <w:pStyle w:val="Heading2"/>
         <w:spacing w:line="360" w:lineRule="auto"/>
@@ -4843,7 +4509,7 @@
         </w:rPr>
         <w:t>3.5 Organisation en composants</w:t>
       </w:r>
-      <w:bookmarkEnd w:id="94479"/>
+      <w:bookmarkEnd w:id="19744"/>
     </w:p>
     <w:p>
       <w:pPr>
@@ -4881,7 +4547,31 @@
           <w:color w:val="000000"/>
           <w:sz w:val="22"/>
         </w:rPr>
-        <w:t>Figure : Composants vue d'ensemble</w:t>
+        <w:t xml:space="preserve">Figure </w:t>
+      </w:r>
+      <w:r>
+        <w:rPr>
+          <w:rFonts w:ascii="Times New Roman" w:hAnsi="Times New Roman" w:eastAsia="Times New Roman"/>
+          <w:b w:val="0"/>
+          <w:i w:val="0"/>
+          <w:color w:val="000000"/>
+          <w:sz w:val="22"/>
+        </w:rPr>
+        <w:fldChar w:fldCharType="begin"/>
+        <w:instrText xml:space="preserve">SEQ Figure \* ARABIC</w:instrText>
+        <w:fldChar w:fldCharType="separate"/>
+        <w:t>1</w:t>
+        <w:fldChar w:fldCharType="end"/>
+      </w:r>
+      <w:r>
+        <w:rPr>
+          <w:rFonts w:ascii="Times New Roman" w:hAnsi="Times New Roman" w:eastAsia="Times New Roman"/>
+          <w:b w:val="0"/>
+          <w:i w:val="0"/>
+          <w:color w:val="000000"/>
+          <w:sz w:val="22"/>
+        </w:rPr>
+        <w:t xml:space="preserve"> : Composants vue d'ensemble</w:t>
       </w:r>
     </w:p>
     <w:p>
@@ -4903,7 +4593,31 @@
           <w:color w:val="000000"/>
           <w:sz w:val="22"/>
         </w:rPr>
-        <w:t>Figure : Composants administration et authentification</w:t>
+        <w:t xml:space="preserve">Figure </w:t>
+      </w:r>
+      <w:r>
+        <w:rPr>
+          <w:rFonts w:ascii="Times New Roman" w:hAnsi="Times New Roman" w:eastAsia="Times New Roman"/>
+          <w:b w:val="0"/>
+          <w:i w:val="0"/>
+          <w:color w:val="000000"/>
+          <w:sz w:val="22"/>
+        </w:rPr>
+        <w:fldChar w:fldCharType="begin"/>
+        <w:instrText xml:space="preserve">SEQ Figure \* ARABIC</w:instrText>
+        <w:fldChar w:fldCharType="separate"/>
+        <w:t>1</w:t>
+        <w:fldChar w:fldCharType="end"/>
+      </w:r>
+      <w:r>
+        <w:rPr>
+          <w:rFonts w:ascii="Times New Roman" w:hAnsi="Times New Roman" w:eastAsia="Times New Roman"/>
+          <w:b w:val="0"/>
+          <w:i w:val="0"/>
+          <w:color w:val="000000"/>
+          <w:sz w:val="22"/>
+        </w:rPr>
+        <w:t xml:space="preserve"> : Composants administration et authentification</w:t>
       </w:r>
     </w:p>
     <w:p>
@@ -4925,7 +4639,31 @@
           <w:color w:val="000000"/>
           <w:sz w:val="22"/>
         </w:rPr>
-        <w:t>Figure : Composants examens et passation</w:t>
+        <w:t xml:space="preserve">Figure </w:t>
+      </w:r>
+      <w:r>
+        <w:rPr>
+          <w:rFonts w:ascii="Times New Roman" w:hAnsi="Times New Roman" w:eastAsia="Times New Roman"/>
+          <w:b w:val="0"/>
+          <w:i w:val="0"/>
+          <w:color w:val="000000"/>
+          <w:sz w:val="22"/>
+        </w:rPr>
+        <w:fldChar w:fldCharType="begin"/>
+        <w:instrText xml:space="preserve">SEQ Figure \* ARABIC</w:instrText>
+        <w:fldChar w:fldCharType="separate"/>
+        <w:t>1</w:t>
+        <w:fldChar w:fldCharType="end"/>
+      </w:r>
+      <w:r>
+        <w:rPr>
+          <w:rFonts w:ascii="Times New Roman" w:hAnsi="Times New Roman" w:eastAsia="Times New Roman"/>
+          <w:b w:val="0"/>
+          <w:i w:val="0"/>
+          <w:color w:val="000000"/>
+          <w:sz w:val="22"/>
+        </w:rPr>
+        <w:t xml:space="preserve"> : Composants examens et passation</w:t>
       </w:r>
     </w:p>
     <w:p>
@@ -4946,7 +4684,7 @@
       </w:r>
     </w:p>
     <w:p>
-      <w:bookmarkStart w:id="50800" w:name="bm_ch3_6"/>
+      <w:bookmarkStart w:id="35311" w:name="bm_ch3_6"/>
       <w:pPr>
         <w:pStyle w:val="Heading2"/>
         <w:spacing w:line="360" w:lineRule="auto"/>
@@ -4961,10 +4699,10 @@
         </w:rPr>
         <w:t>3.6 Dynamique du système</w:t>
       </w:r>
-      <w:bookmarkEnd w:id="50800"/>
-    </w:p>
-    <w:p>
-      <w:bookmarkStart w:id="57594" w:name="3_6_1_Cycle_de_vie_d_un_examen"/>
+      <w:bookmarkEnd w:id="35311"/>
+    </w:p>
+    <w:p>
+      <w:bookmarkStart w:id="5635" w:name="3_6_1_Cycle_de_vie_d_un_examen"/>
       <w:pPr>
         <w:pStyle w:val="Heading3"/>
         <w:spacing w:line="360" w:lineRule="auto"/>
@@ -4979,7 +4717,7 @@
         </w:rPr>
         <w:t>3.6.1 Cycle de vie d'un examen</w:t>
       </w:r>
-      <w:bookmarkEnd w:id="57594"/>
+      <w:bookmarkEnd w:id="5635"/>
     </w:p>
     <w:p>
       <w:pPr>
@@ -5017,11 +4755,35 @@
           <w:color w:val="000000"/>
           <w:sz w:val="22"/>
         </w:rPr>
-        <w:t>Figure : États du cycle de vie d'un examen</w:t>
-      </w:r>
-    </w:p>
-    <w:p>
-      <w:bookmarkStart w:id="78477" w:name="3_6_2_Interactions_principales"/>
+        <w:t xml:space="preserve">Figure </w:t>
+      </w:r>
+      <w:r>
+        <w:rPr>
+          <w:rFonts w:ascii="Times New Roman" w:hAnsi="Times New Roman" w:eastAsia="Times New Roman"/>
+          <w:b w:val="0"/>
+          <w:i w:val="0"/>
+          <w:color w:val="000000"/>
+          <w:sz w:val="22"/>
+        </w:rPr>
+        <w:fldChar w:fldCharType="begin"/>
+        <w:instrText xml:space="preserve">SEQ Figure \* ARABIC</w:instrText>
+        <w:fldChar w:fldCharType="separate"/>
+        <w:t>1</w:t>
+        <w:fldChar w:fldCharType="end"/>
+      </w:r>
+      <w:r>
+        <w:rPr>
+          <w:rFonts w:ascii="Times New Roman" w:hAnsi="Times New Roman" w:eastAsia="Times New Roman"/>
+          <w:b w:val="0"/>
+          <w:i w:val="0"/>
+          <w:color w:val="000000"/>
+          <w:sz w:val="22"/>
+        </w:rPr>
+        <w:t xml:space="preserve"> : États du cycle de vie d'un examen</w:t>
+      </w:r>
+    </w:p>
+    <w:p>
+      <w:bookmarkStart w:id="91898" w:name="3_6_2_Interactions_principales"/>
       <w:pPr>
         <w:pStyle w:val="Heading3"/>
         <w:spacing w:line="360" w:lineRule="auto"/>
@@ -5036,7 +4798,7 @@
         </w:rPr>
         <w:t>3.6.2 Interactions principales</w:t>
       </w:r>
-      <w:bookmarkEnd w:id="78477"/>
+      <w:bookmarkEnd w:id="91898"/>
     </w:p>
     <w:p>
       <w:pPr>
@@ -5074,7 +4836,31 @@
           <w:color w:val="000000"/>
           <w:sz w:val="22"/>
         </w:rPr>
-        <w:t>Figure : Séquence de connexion</w:t>
+        <w:t xml:space="preserve">Figure </w:t>
+      </w:r>
+      <w:r>
+        <w:rPr>
+          <w:rFonts w:ascii="Times New Roman" w:hAnsi="Times New Roman" w:eastAsia="Times New Roman"/>
+          <w:b w:val="0"/>
+          <w:i w:val="0"/>
+          <w:color w:val="000000"/>
+          <w:sz w:val="22"/>
+        </w:rPr>
+        <w:fldChar w:fldCharType="begin"/>
+        <w:instrText xml:space="preserve">SEQ Figure \* ARABIC</w:instrText>
+        <w:fldChar w:fldCharType="separate"/>
+        <w:t>1</w:t>
+        <w:fldChar w:fldCharType="end"/>
+      </w:r>
+      <w:r>
+        <w:rPr>
+          <w:rFonts w:ascii="Times New Roman" w:hAnsi="Times New Roman" w:eastAsia="Times New Roman"/>
+          <w:b w:val="0"/>
+          <w:i w:val="0"/>
+          <w:color w:val="000000"/>
+          <w:sz w:val="22"/>
+        </w:rPr>
+        <w:t xml:space="preserve"> : Séquence de connexion</w:t>
       </w:r>
     </w:p>
     <w:p>
@@ -5113,7 +4899,31 @@
           <w:color w:val="000000"/>
           <w:sz w:val="22"/>
         </w:rPr>
-        <w:t>Figure : Séquence de publication d'un examen</w:t>
+        <w:t xml:space="preserve">Figure </w:t>
+      </w:r>
+      <w:r>
+        <w:rPr>
+          <w:rFonts w:ascii="Times New Roman" w:hAnsi="Times New Roman" w:eastAsia="Times New Roman"/>
+          <w:b w:val="0"/>
+          <w:i w:val="0"/>
+          <w:color w:val="000000"/>
+          <w:sz w:val="22"/>
+        </w:rPr>
+        <w:fldChar w:fldCharType="begin"/>
+        <w:instrText xml:space="preserve">SEQ Figure \* ARABIC</w:instrText>
+        <w:fldChar w:fldCharType="separate"/>
+        <w:t>1</w:t>
+        <w:fldChar w:fldCharType="end"/>
+      </w:r>
+      <w:r>
+        <w:rPr>
+          <w:rFonts w:ascii="Times New Roman" w:hAnsi="Times New Roman" w:eastAsia="Times New Roman"/>
+          <w:b w:val="0"/>
+          <w:i w:val="0"/>
+          <w:color w:val="000000"/>
+          <w:sz w:val="22"/>
+        </w:rPr>
+        <w:t xml:space="preserve"> : Séquence de publication d'un examen</w:t>
       </w:r>
     </w:p>
     <w:p>
@@ -5152,7 +4962,31 @@
           <w:color w:val="000000"/>
           <w:sz w:val="22"/>
         </w:rPr>
-        <w:t>Figure : Séquence d'accès étudiant</w:t>
+        <w:t xml:space="preserve">Figure </w:t>
+      </w:r>
+      <w:r>
+        <w:rPr>
+          <w:rFonts w:ascii="Times New Roman" w:hAnsi="Times New Roman" w:eastAsia="Times New Roman"/>
+          <w:b w:val="0"/>
+          <w:i w:val="0"/>
+          <w:color w:val="000000"/>
+          <w:sz w:val="22"/>
+        </w:rPr>
+        <w:fldChar w:fldCharType="begin"/>
+        <w:instrText xml:space="preserve">SEQ Figure \* ARABIC</w:instrText>
+        <w:fldChar w:fldCharType="separate"/>
+        <w:t>1</w:t>
+        <w:fldChar w:fldCharType="end"/>
+      </w:r>
+      <w:r>
+        <w:rPr>
+          <w:rFonts w:ascii="Times New Roman" w:hAnsi="Times New Roman" w:eastAsia="Times New Roman"/>
+          <w:b w:val="0"/>
+          <w:i w:val="0"/>
+          <w:color w:val="000000"/>
+          <w:sz w:val="22"/>
+        </w:rPr>
+        <w:t xml:space="preserve"> : Séquence d'accès étudiant</w:t>
       </w:r>
     </w:p>
     <w:p>
@@ -5191,7 +5025,31 @@
           <w:color w:val="000000"/>
           <w:sz w:val="22"/>
         </w:rPr>
-        <w:t>Figure : Séquence d'exécution du code</w:t>
+        <w:t xml:space="preserve">Figure </w:t>
+      </w:r>
+      <w:r>
+        <w:rPr>
+          <w:rFonts w:ascii="Times New Roman" w:hAnsi="Times New Roman" w:eastAsia="Times New Roman"/>
+          <w:b w:val="0"/>
+          <w:i w:val="0"/>
+          <w:color w:val="000000"/>
+          <w:sz w:val="22"/>
+        </w:rPr>
+        <w:fldChar w:fldCharType="begin"/>
+        <w:instrText xml:space="preserve">SEQ Figure \* ARABIC</w:instrText>
+        <w:fldChar w:fldCharType="separate"/>
+        <w:t>1</w:t>
+        <w:fldChar w:fldCharType="end"/>
+      </w:r>
+      <w:r>
+        <w:rPr>
+          <w:rFonts w:ascii="Times New Roman" w:hAnsi="Times New Roman" w:eastAsia="Times New Roman"/>
+          <w:b w:val="0"/>
+          <w:i w:val="0"/>
+          <w:color w:val="000000"/>
+          <w:sz w:val="22"/>
+        </w:rPr>
+        <w:t xml:space="preserve"> : Séquence d'exécution du code</w:t>
       </w:r>
     </w:p>
     <w:p>
@@ -5230,7 +5088,31 @@
           <w:color w:val="000000"/>
           <w:sz w:val="22"/>
         </w:rPr>
-        <w:t>Figure : Séquence de soumission et correction</w:t>
+        <w:t xml:space="preserve">Figure </w:t>
+      </w:r>
+      <w:r>
+        <w:rPr>
+          <w:rFonts w:ascii="Times New Roman" w:hAnsi="Times New Roman" w:eastAsia="Times New Roman"/>
+          <w:b w:val="0"/>
+          <w:i w:val="0"/>
+          <w:color w:val="000000"/>
+          <w:sz w:val="22"/>
+        </w:rPr>
+        <w:fldChar w:fldCharType="begin"/>
+        <w:instrText xml:space="preserve">SEQ Figure \* ARABIC</w:instrText>
+        <w:fldChar w:fldCharType="separate"/>
+        <w:t>1</w:t>
+        <w:fldChar w:fldCharType="end"/>
+      </w:r>
+      <w:r>
+        <w:rPr>
+          <w:rFonts w:ascii="Times New Roman" w:hAnsi="Times New Roman" w:eastAsia="Times New Roman"/>
+          <w:b w:val="0"/>
+          <w:i w:val="0"/>
+          <w:color w:val="000000"/>
+          <w:sz w:val="22"/>
+        </w:rPr>
+        <w:t xml:space="preserve"> : Séquence de soumission et correction</w:t>
       </w:r>
     </w:p>
     <w:p>
@@ -5269,11 +5151,35 @@
           <w:color w:val="000000"/>
           <w:sz w:val="22"/>
         </w:rPr>
-        <w:t>Figure : Séquence d'enregistrement d'un incident</w:t>
-      </w:r>
-    </w:p>
-    <w:p>
-      <w:bookmarkStart w:id="54343" w:name="3_6_3_Parcours_d_activit__de_l__tudiant"/>
+        <w:t xml:space="preserve">Figure </w:t>
+      </w:r>
+      <w:r>
+        <w:rPr>
+          <w:rFonts w:ascii="Times New Roman" w:hAnsi="Times New Roman" w:eastAsia="Times New Roman"/>
+          <w:b w:val="0"/>
+          <w:i w:val="0"/>
+          <w:color w:val="000000"/>
+          <w:sz w:val="22"/>
+        </w:rPr>
+        <w:fldChar w:fldCharType="begin"/>
+        <w:instrText xml:space="preserve">SEQ Figure \* ARABIC</w:instrText>
+        <w:fldChar w:fldCharType="separate"/>
+        <w:t>1</w:t>
+        <w:fldChar w:fldCharType="end"/>
+      </w:r>
+      <w:r>
+        <w:rPr>
+          <w:rFonts w:ascii="Times New Roman" w:hAnsi="Times New Roman" w:eastAsia="Times New Roman"/>
+          <w:b w:val="0"/>
+          <w:i w:val="0"/>
+          <w:color w:val="000000"/>
+          <w:sz w:val="22"/>
+        </w:rPr>
+        <w:t xml:space="preserve"> : Séquence d'enregistrement d'un incident</w:t>
+      </w:r>
+    </w:p>
+    <w:p>
+      <w:bookmarkStart w:id="21230" w:name="3_6_3_Parcours_d_activit__de_l__tudiant"/>
       <w:pPr>
         <w:pStyle w:val="Heading3"/>
         <w:spacing w:line="360" w:lineRule="auto"/>
@@ -5288,7 +5194,7 @@
         </w:rPr>
         <w:t>3.6.3 Parcours d'activité de l'étudiant</w:t>
       </w:r>
-      <w:bookmarkEnd w:id="54343"/>
+      <w:bookmarkEnd w:id="21230"/>
     </w:p>
     <w:p>
       <w:pPr>
@@ -5326,7 +5232,31 @@
           <w:color w:val="000000"/>
           <w:sz w:val="22"/>
         </w:rPr>
-        <w:t>Figure : Activité accès et salle d'attente</w:t>
+        <w:t xml:space="preserve">Figure </w:t>
+      </w:r>
+      <w:r>
+        <w:rPr>
+          <w:rFonts w:ascii="Times New Roman" w:hAnsi="Times New Roman" w:eastAsia="Times New Roman"/>
+          <w:b w:val="0"/>
+          <w:i w:val="0"/>
+          <w:color w:val="000000"/>
+          <w:sz w:val="22"/>
+        </w:rPr>
+        <w:fldChar w:fldCharType="begin"/>
+        <w:instrText xml:space="preserve">SEQ Figure \* ARABIC</w:instrText>
+        <w:fldChar w:fldCharType="separate"/>
+        <w:t>1</w:t>
+        <w:fldChar w:fldCharType="end"/>
+      </w:r>
+      <w:r>
+        <w:rPr>
+          <w:rFonts w:ascii="Times New Roman" w:hAnsi="Times New Roman" w:eastAsia="Times New Roman"/>
+          <w:b w:val="0"/>
+          <w:i w:val="0"/>
+          <w:color w:val="000000"/>
+          <w:sz w:val="22"/>
+        </w:rPr>
+        <w:t xml:space="preserve"> : Activité accès et salle d'attente</w:t>
       </w:r>
     </w:p>
     <w:p>
@@ -5348,11 +5278,35 @@
           <w:color w:val="000000"/>
           <w:sz w:val="22"/>
         </w:rPr>
-        <w:t>Figure : Activité composition et soumission</w:t>
-      </w:r>
-    </w:p>
-    <w:p>
-      <w:bookmarkStart w:id="73886" w:name="bm_ch3_7"/>
+        <w:t xml:space="preserve">Figure </w:t>
+      </w:r>
+      <w:r>
+        <w:rPr>
+          <w:rFonts w:ascii="Times New Roman" w:hAnsi="Times New Roman" w:eastAsia="Times New Roman"/>
+          <w:b w:val="0"/>
+          <w:i w:val="0"/>
+          <w:color w:val="000000"/>
+          <w:sz w:val="22"/>
+        </w:rPr>
+        <w:fldChar w:fldCharType="begin"/>
+        <w:instrText xml:space="preserve">SEQ Figure \* ARABIC</w:instrText>
+        <w:fldChar w:fldCharType="separate"/>
+        <w:t>1</w:t>
+        <w:fldChar w:fldCharType="end"/>
+      </w:r>
+      <w:r>
+        <w:rPr>
+          <w:rFonts w:ascii="Times New Roman" w:hAnsi="Times New Roman" w:eastAsia="Times New Roman"/>
+          <w:b w:val="0"/>
+          <w:i w:val="0"/>
+          <w:color w:val="000000"/>
+          <w:sz w:val="22"/>
+        </w:rPr>
+        <w:t xml:space="preserve"> : Activité composition et soumission</w:t>
+      </w:r>
+    </w:p>
+    <w:p>
+      <w:bookmarkStart w:id="35605" w:name="bm_ch3_7"/>
       <w:pPr>
         <w:pStyle w:val="Heading2"/>
         <w:spacing w:line="360" w:lineRule="auto"/>
@@ -5367,7 +5321,7 @@
         </w:rPr>
         <w:t>3.7 Conception des données</w:t>
       </w:r>
-      <w:bookmarkEnd w:id="73886"/>
+      <w:bookmarkEnd w:id="35605"/>
     </w:p>
     <w:p>
       <w:pPr>
@@ -5780,7 +5734,7 @@
       </w:r>
     </w:p>
     <w:p>
-      <w:bookmarkStart w:id="33863" w:name="bm_ch3_8"/>
+      <w:bookmarkStart w:id="92393" w:name="bm_ch3_8"/>
       <w:pPr>
         <w:pStyle w:val="Heading2"/>
         <w:spacing w:line="360" w:lineRule="auto"/>
@@ -5795,7 +5749,7 @@
         </w:rPr>
         <w:t>3.8 Conception de la sécurité de passation</w:t>
       </w:r>
-      <w:bookmarkEnd w:id="33863"/>
+      <w:bookmarkEnd w:id="92393"/>
     </w:p>
     <w:p>
       <w:pPr>
@@ -5883,7 +5837,7 @@
       </w:r>
     </w:p>
     <w:p>
-      <w:bookmarkStart w:id="8862" w:name="bm_ch3_9"/>
+      <w:bookmarkStart w:id="86527" w:name="bm_ch3_9"/>
       <w:pPr>
         <w:pStyle w:val="Heading2"/>
         <w:spacing w:line="360" w:lineRule="auto"/>
@@ -5898,7 +5852,7 @@
         </w:rPr>
         <w:t>3.9 Conception de la correction automatique</w:t>
       </w:r>
-      <w:bookmarkEnd w:id="8862"/>
+      <w:bookmarkEnd w:id="86527"/>
     </w:p>
     <w:p>
       <w:pPr>
@@ -5952,7 +5906,7 @@
       </w:r>
     </w:p>
     <w:p>
-      <w:bookmarkStart w:id="89805" w:name="bm_ch3_10"/>
+      <w:bookmarkStart w:id="92370" w:name="bm_ch3_10"/>
       <w:pPr>
         <w:pStyle w:val="Heading2"/>
         <w:spacing w:line="360" w:lineRule="auto"/>
@@ -5967,7 +5921,7 @@
         </w:rPr>
         <w:t>3.10 Conclusion partielle</w:t>
       </w:r>
-      <w:bookmarkEnd w:id="89805"/>
+      <w:bookmarkEnd w:id="92370"/>
     </w:p>
     <w:p>
       <w:pPr>
@@ -5992,7 +5946,7 @@
       </w:r>
     </w:p>
     <w:p>
-      <w:bookmarkStart w:id="67632" w:name="bm_ch4"/>
+      <w:bookmarkStart w:id="92667" w:name="bm_ch4"/>
       <w:pPr>
         <w:pStyle w:val="Heading1"/>
         <w:spacing w:line="360" w:lineRule="auto"/>
@@ -6007,10 +5961,10 @@
         </w:rPr>
         <w:t>Chapitre 4 : Réalisation et mise en œuvre</w:t>
       </w:r>
-      <w:bookmarkEnd w:id="67632"/>
-    </w:p>
-    <w:p>
-      <w:bookmarkStart w:id="5903" w:name="bm_ch4_1"/>
+      <w:bookmarkEnd w:id="92667"/>
+    </w:p>
+    <w:p>
+      <w:bookmarkStart w:id="62006" w:name="bm_ch4_1"/>
       <w:pPr>
         <w:pStyle w:val="Heading2"/>
         <w:spacing w:line="360" w:lineRule="auto"/>
@@ -6025,7 +5979,7 @@
         </w:rPr>
         <w:t>4.1 Environnement de travail</w:t>
       </w:r>
-      <w:bookmarkEnd w:id="5903"/>
+      <w:bookmarkEnd w:id="62006"/>
     </w:p>
     <w:p>
       <w:pPr>
@@ -6062,7 +6016,7 @@
       </w:r>
     </w:p>
     <w:p>
-      <w:bookmarkStart w:id="9053" w:name="bm_ch4_2"/>
+      <w:bookmarkStart w:id="54661" w:name="bm_ch4_2"/>
       <w:pPr>
         <w:pStyle w:val="Heading2"/>
         <w:spacing w:line="360" w:lineRule="auto"/>
@@ -6077,7 +6031,7 @@
         </w:rPr>
         <w:t>4.2 Choix technologiques</w:t>
       </w:r>
-      <w:bookmarkEnd w:id="9053"/>
+      <w:bookmarkEnd w:id="54661"/>
     </w:p>
     <w:p>
       <w:pPr>
@@ -6114,7 +6068,7 @@
       </w:r>
     </w:p>
     <w:p>
-      <w:bookmarkStart w:id="28649" w:name="bm_ch4_3"/>
+      <w:bookmarkStart w:id="46937" w:name="bm_ch4_3"/>
       <w:pPr>
         <w:pStyle w:val="Heading2"/>
         <w:spacing w:line="360" w:lineRule="auto"/>
@@ -6129,7 +6083,7 @@
         </w:rPr>
         <w:t>4.3 Organisation du code et architecture applicative</w:t>
       </w:r>
-      <w:bookmarkEnd w:id="28649"/>
+      <w:bookmarkEnd w:id="46937"/>
     </w:p>
     <w:p>
       <w:pPr>
@@ -6166,7 +6120,7 @@
       </w:r>
     </w:p>
     <w:p>
-      <w:bookmarkStart w:id="7038" w:name="bm_ch4_4"/>
+      <w:bookmarkStart w:id="74909" w:name="bm_ch4_4"/>
       <w:pPr>
         <w:pStyle w:val="Heading2"/>
         <w:spacing w:line="360" w:lineRule="auto"/>
@@ -6181,10 +6135,10 @@
         </w:rPr>
         <w:t>4.4 Réalisation des modules principaux</w:t>
       </w:r>
-      <w:bookmarkEnd w:id="7038"/>
-    </w:p>
-    <w:p>
-      <w:bookmarkStart w:id="74009" w:name="4_4_1_Authentification_et_sessions"/>
+      <w:bookmarkEnd w:id="74909"/>
+    </w:p>
+    <w:p>
+      <w:bookmarkStart w:id="87294" w:name="4_4_1_Authentification_et_sessions"/>
       <w:pPr>
         <w:pStyle w:val="Heading3"/>
         <w:spacing w:line="360" w:lineRule="auto"/>
@@ -6199,7 +6153,7 @@
         </w:rPr>
         <w:t>4.4.1 Authentification et sessions</w:t>
       </w:r>
-      <w:bookmarkEnd w:id="74009"/>
+      <w:bookmarkEnd w:id="87294"/>
     </w:p>
     <w:p>
       <w:pPr>
@@ -6236,7 +6190,7 @@
       </w:r>
     </w:p>
     <w:p>
-      <w:bookmarkStart w:id="18535" w:name="4_4_2_Module_administrateur_d__tablissem"/>
+      <w:bookmarkStart w:id="91543" w:name="4_4_2_Module_administrateur_d__tablissem"/>
       <w:pPr>
         <w:pStyle w:val="Heading3"/>
         <w:spacing w:line="360" w:lineRule="auto"/>
@@ -6251,7 +6205,7 @@
         </w:rPr>
         <w:t>4.4.2 Module administrateur d'établissement</w:t>
       </w:r>
-      <w:bookmarkEnd w:id="18535"/>
+      <w:bookmarkEnd w:id="91543"/>
     </w:p>
     <w:p>
       <w:pPr>
@@ -6288,7 +6242,7 @@
       </w:r>
     </w:p>
     <w:p>
-      <w:bookmarkStart w:id="8835" w:name="4_4_3_Module_professeur"/>
+      <w:bookmarkStart w:id="61682" w:name="4_4_3_Module_professeur"/>
       <w:pPr>
         <w:pStyle w:val="Heading3"/>
         <w:spacing w:line="360" w:lineRule="auto"/>
@@ -6303,7 +6257,7 @@
         </w:rPr>
         <w:t>4.4.3 Module professeur</w:t>
       </w:r>
-      <w:bookmarkEnd w:id="8835"/>
+      <w:bookmarkEnd w:id="61682"/>
     </w:p>
     <w:p>
       <w:pPr>
@@ -6340,7 +6294,7 @@
       </w:r>
     </w:p>
     <w:p>
-      <w:bookmarkStart w:id="29121" w:name="4_4_4_Module__tudiant_et_parcours_de_com"/>
+      <w:bookmarkStart w:id="81147" w:name="4_4_4_Module__tudiant_et_parcours_de_com"/>
       <w:pPr>
         <w:pStyle w:val="Heading3"/>
         <w:spacing w:line="360" w:lineRule="auto"/>
@@ -6355,7 +6309,7 @@
         </w:rPr>
         <w:t>4.4.4 Module étudiant et parcours de composition</w:t>
       </w:r>
-      <w:bookmarkEnd w:id="29121"/>
+      <w:bookmarkEnd w:id="81147"/>
     </w:p>
     <w:p>
       <w:pPr>
@@ -6393,7 +6347,31 @@
           <w:color w:val="000000"/>
           <w:sz w:val="22"/>
         </w:rPr>
-        <w:t>Figure : Salle d'attente avant le démarrage de l'examen</w:t>
+        <w:t xml:space="preserve">Figure </w:t>
+      </w:r>
+      <w:r>
+        <w:rPr>
+          <w:rFonts w:ascii="Times New Roman" w:hAnsi="Times New Roman" w:eastAsia="Times New Roman"/>
+          <w:b w:val="0"/>
+          <w:i w:val="0"/>
+          <w:color w:val="000000"/>
+          <w:sz w:val="22"/>
+        </w:rPr>
+        <w:fldChar w:fldCharType="begin"/>
+        <w:instrText xml:space="preserve">SEQ Figure \* ARABIC</w:instrText>
+        <w:fldChar w:fldCharType="separate"/>
+        <w:t>1</w:t>
+        <w:fldChar w:fldCharType="end"/>
+      </w:r>
+      <w:r>
+        <w:rPr>
+          <w:rFonts w:ascii="Times New Roman" w:hAnsi="Times New Roman" w:eastAsia="Times New Roman"/>
+          <w:b w:val="0"/>
+          <w:i w:val="0"/>
+          <w:color w:val="000000"/>
+          <w:sz w:val="22"/>
+        </w:rPr>
+        <w:t xml:space="preserve"> : Salle d'attente avant le démarrage de l'examen</w:t>
       </w:r>
     </w:p>
     <w:p>
@@ -6432,7 +6410,31 @@
           <w:color w:val="000000"/>
           <w:sz w:val="22"/>
         </w:rPr>
-        <w:t>Figure : Environnement de composition pendant l'épreuve</w:t>
+        <w:t xml:space="preserve">Figure </w:t>
+      </w:r>
+      <w:r>
+        <w:rPr>
+          <w:rFonts w:ascii="Times New Roman" w:hAnsi="Times New Roman" w:eastAsia="Times New Roman"/>
+          <w:b w:val="0"/>
+          <w:i w:val="0"/>
+          <w:color w:val="000000"/>
+          <w:sz w:val="22"/>
+        </w:rPr>
+        <w:fldChar w:fldCharType="begin"/>
+        <w:instrText xml:space="preserve">SEQ Figure \* ARABIC</w:instrText>
+        <w:fldChar w:fldCharType="separate"/>
+        <w:t>1</w:t>
+        <w:fldChar w:fldCharType="end"/>
+      </w:r>
+      <w:r>
+        <w:rPr>
+          <w:rFonts w:ascii="Times New Roman" w:hAnsi="Times New Roman" w:eastAsia="Times New Roman"/>
+          <w:b w:val="0"/>
+          <w:i w:val="0"/>
+          <w:color w:val="000000"/>
+          <w:sz w:val="22"/>
+        </w:rPr>
+        <w:t xml:space="preserve"> : Environnement de composition pendant l'épreuve</w:t>
       </w:r>
     </w:p>
     <w:p>
@@ -6453,7 +6455,7 @@
       </w:r>
     </w:p>
     <w:p>
-      <w:bookmarkStart w:id="8231" w:name="4_4_5_Sandbox_et_correction_automatique"/>
+      <w:bookmarkStart w:id="97357" w:name="4_4_5_Sandbox_et_correction_automatique"/>
       <w:pPr>
         <w:pStyle w:val="Heading3"/>
         <w:spacing w:line="360" w:lineRule="auto"/>
@@ -6468,7 +6470,7 @@
         </w:rPr>
         <w:t>4.4.5 Sandbox et correction automatique</w:t>
       </w:r>
-      <w:bookmarkEnd w:id="8231"/>
+      <w:bookmarkEnd w:id="97357"/>
     </w:p>
     <w:p>
       <w:pPr>
@@ -6488,7 +6490,7 @@
       </w:r>
     </w:p>
     <w:p>
-      <w:bookmarkStart w:id="90021" w:name="4_4_6_Landing_page_et_contact"/>
+      <w:bookmarkStart w:id="47161" w:name="4_4_6_Landing_page_et_contact"/>
       <w:pPr>
         <w:pStyle w:val="Heading3"/>
         <w:spacing w:line="360" w:lineRule="auto"/>
@@ -6503,7 +6505,7 @@
         </w:rPr>
         <w:t>4.4.6 Landing page et contact</w:t>
       </w:r>
-      <w:bookmarkEnd w:id="90021"/>
+      <w:bookmarkEnd w:id="47161"/>
     </w:p>
     <w:p>
       <w:pPr>
@@ -6523,7 +6525,7 @@
       </w:r>
     </w:p>
     <w:p>
-      <w:bookmarkStart w:id="79138" w:name="bm_ch4_5"/>
+      <w:bookmarkStart w:id="48046" w:name="bm_ch4_5"/>
       <w:pPr>
         <w:pStyle w:val="Heading2"/>
         <w:spacing w:line="360" w:lineRule="auto"/>
@@ -6538,7 +6540,7 @@
         </w:rPr>
         <w:t>4.5 Points techniques difficiles</w:t>
       </w:r>
-      <w:bookmarkEnd w:id="79138"/>
+      <w:bookmarkEnd w:id="48046"/>
     </w:p>
     <w:p>
       <w:pPr>
@@ -6558,7 +6560,7 @@
       </w:r>
     </w:p>
     <w:p>
-      <w:bookmarkStart w:id="97041" w:name="bm_ch4_6"/>
+      <w:bookmarkStart w:id="48152" w:name="bm_ch4_6"/>
       <w:pPr>
         <w:pStyle w:val="Heading2"/>
         <w:spacing w:line="360" w:lineRule="auto"/>
@@ -6573,7 +6575,7 @@
         </w:rPr>
         <w:t>4.6 Déploiement</w:t>
       </w:r>
-      <w:bookmarkEnd w:id="97041"/>
+      <w:bookmarkEnd w:id="48152"/>
     </w:p>
     <w:p>
       <w:pPr>
@@ -6593,7 +6595,7 @@
       </w:r>
     </w:p>
     <w:p>
-      <w:bookmarkStart w:id="18786" w:name="bm_ch4_7"/>
+      <w:bookmarkStart w:id="2796" w:name="bm_ch4_7"/>
       <w:pPr>
         <w:pStyle w:val="Heading2"/>
         <w:spacing w:line="360" w:lineRule="auto"/>
@@ -6608,7 +6610,7 @@
         </w:rPr>
         <w:t>4.7 Conclusion partielle</w:t>
       </w:r>
-      <w:bookmarkEnd w:id="18786"/>
+      <w:bookmarkEnd w:id="2796"/>
     </w:p>
     <w:p>
       <w:pPr>
@@ -6633,7 +6635,7 @@
       </w:r>
     </w:p>
     <w:p>
-      <w:bookmarkStart w:id="74832" w:name="bm_ch5"/>
+      <w:bookmarkStart w:id="73599" w:name="bm_ch5"/>
       <w:pPr>
         <w:pStyle w:val="Heading1"/>
         <w:spacing w:line="360" w:lineRule="auto"/>
@@ -6648,10 +6650,10 @@
         </w:rPr>
         <w:t>Chapitre 5 : Tests, résultats, limites et perspectives</w:t>
       </w:r>
-      <w:bookmarkEnd w:id="74832"/>
-    </w:p>
-    <w:p>
-      <w:bookmarkStart w:id="42597" w:name="bm_ch5_1"/>
+      <w:bookmarkEnd w:id="73599"/>
+    </w:p>
+    <w:p>
+      <w:bookmarkStart w:id="95475" w:name="bm_ch5_1"/>
       <w:pPr>
         <w:pStyle w:val="Heading2"/>
         <w:spacing w:line="360" w:lineRule="auto"/>
@@ -6666,7 +6668,7 @@
         </w:rPr>
         <w:t>5.1 Stratégie de tests</w:t>
       </w:r>
-      <w:bookmarkEnd w:id="42597"/>
+      <w:bookmarkEnd w:id="95475"/>
     </w:p>
     <w:p>
       <w:pPr>
@@ -6703,7 +6705,7 @@
       </w:r>
     </w:p>
     <w:p>
-      <w:bookmarkStart w:id="2070" w:name="bm_ch5_2"/>
+      <w:bookmarkStart w:id="43599" w:name="bm_ch5_2"/>
       <w:pPr>
         <w:pStyle w:val="Heading2"/>
         <w:spacing w:line="360" w:lineRule="auto"/>
@@ -6718,10 +6720,10 @@
         </w:rPr>
         <w:t>5.2 Jeux de tests et résultats</w:t>
       </w:r>
-      <w:bookmarkEnd w:id="2070"/>
-    </w:p>
-    <w:p>
-      <w:bookmarkStart w:id="6105" w:name="5_2_1_Authentification_et_acc_s"/>
+      <w:bookmarkEnd w:id="43599"/>
+    </w:p>
+    <w:p>
+      <w:bookmarkStart w:id="21885" w:name="5_2_1_Authentification_et_acc_s"/>
       <w:pPr>
         <w:pStyle w:val="Heading3"/>
         <w:spacing w:line="360" w:lineRule="auto"/>
@@ -6736,7 +6738,7 @@
         </w:rPr>
         <w:t>5.2.1 Authentification et accès</w:t>
       </w:r>
-      <w:bookmarkEnd w:id="6105"/>
+      <w:bookmarkEnd w:id="21885"/>
     </w:p>
     <w:p>
       <w:pPr>
@@ -6756,7 +6758,7 @@
       </w:r>
     </w:p>
     <w:p>
-      <w:bookmarkStart w:id="48310" w:name="5_2_2_Administration"/>
+      <w:bookmarkStart w:id="36687" w:name="5_2_2_Administration"/>
       <w:pPr>
         <w:pStyle w:val="Heading3"/>
         <w:spacing w:line="360" w:lineRule="auto"/>
@@ -6771,7 +6773,7 @@
         </w:rPr>
         <w:t>5.2.2 Administration</w:t>
       </w:r>
-      <w:bookmarkEnd w:id="48310"/>
+      <w:bookmarkEnd w:id="36687"/>
     </w:p>
     <w:p>
       <w:pPr>
@@ -6791,7 +6793,7 @@
       </w:r>
     </w:p>
     <w:p>
-      <w:bookmarkStart w:id="4119" w:name="5_2_3_Examens_c_t__professeur"/>
+      <w:bookmarkStart w:id="95794" w:name="5_2_3_Examens_c_t__professeur"/>
       <w:pPr>
         <w:pStyle w:val="Heading3"/>
         <w:spacing w:line="360" w:lineRule="auto"/>
@@ -6806,7 +6808,7 @@
         </w:rPr>
         <w:t>5.2.3 Examens côté professeur</w:t>
       </w:r>
-      <w:bookmarkEnd w:id="4119"/>
+      <w:bookmarkEnd w:id="95794"/>
     </w:p>
     <w:p>
       <w:pPr>
@@ -6826,7 +6828,7 @@
       </w:r>
     </w:p>
     <w:p>
-      <w:bookmarkStart w:id="4094" w:name="5_2_4_Parcours__tudiant_et_contr_les_de_"/>
+      <w:bookmarkStart w:id="55897" w:name="5_2_4_Parcours__tudiant_et_contr_les_de_"/>
       <w:pPr>
         <w:pStyle w:val="Heading3"/>
         <w:spacing w:line="360" w:lineRule="auto"/>
@@ -6841,7 +6843,7 @@
         </w:rPr>
         <w:t>5.2.4 Parcours étudiant et contrôles de passation</w:t>
       </w:r>
-      <w:bookmarkEnd w:id="4094"/>
+      <w:bookmarkEnd w:id="55897"/>
     </w:p>
     <w:p>
       <w:pPr>
@@ -6878,7 +6880,7 @@
       </w:r>
     </w:p>
     <w:p>
-      <w:bookmarkStart w:id="21237" w:name="bm_ch5_3"/>
+      <w:bookmarkStart w:id="42153" w:name="bm_ch5_3"/>
       <w:pPr>
         <w:pStyle w:val="Heading2"/>
         <w:spacing w:line="360" w:lineRule="auto"/>
@@ -6893,7 +6895,7 @@
         </w:rPr>
         <w:t>5.3 Discussion des résultats</w:t>
       </w:r>
-      <w:bookmarkEnd w:id="21237"/>
+      <w:bookmarkEnd w:id="42153"/>
     </w:p>
     <w:p>
       <w:pPr>
@@ -6930,7 +6932,7 @@
       </w:r>
     </w:p>
     <w:p>
-      <w:bookmarkStart w:id="43190" w:name="bm_ch5_4"/>
+      <w:bookmarkStart w:id="93837" w:name="bm_ch5_4"/>
       <w:pPr>
         <w:pStyle w:val="Heading2"/>
         <w:spacing w:line="360" w:lineRule="auto"/>
@@ -6945,7 +6947,7 @@
         </w:rPr>
         <w:t>5.4 Limites et risques résiduels</w:t>
       </w:r>
-      <w:bookmarkEnd w:id="43190"/>
+      <w:bookmarkEnd w:id="93837"/>
     </w:p>
     <w:p>
       <w:pPr>
@@ -6965,7 +6967,7 @@
       </w:r>
     </w:p>
     <w:p>
-      <w:bookmarkStart w:id="32984" w:name="bm_ch5_5"/>
+      <w:bookmarkStart w:id="94628" w:name="bm_ch5_5"/>
       <w:pPr>
         <w:pStyle w:val="Heading2"/>
         <w:spacing w:line="360" w:lineRule="auto"/>
@@ -6980,7 +6982,7 @@
         </w:rPr>
         <w:t>5.5 Perspectives</w:t>
       </w:r>
-      <w:bookmarkEnd w:id="32984"/>
+      <w:bookmarkEnd w:id="94628"/>
     </w:p>
     <w:p>
       <w:pPr>
@@ -7017,7 +7019,7 @@
       </w:r>
     </w:p>
     <w:p>
-      <w:bookmarkStart w:id="63364" w:name="bm_ch5_6"/>
+      <w:bookmarkStart w:id="21091" w:name="bm_ch5_6"/>
       <w:pPr>
         <w:pStyle w:val="Heading2"/>
         <w:spacing w:line="360" w:lineRule="auto"/>
@@ -7032,7 +7034,7 @@
         </w:rPr>
         <w:t>5.6 Conclusion partielle</w:t>
       </w:r>
-      <w:bookmarkEnd w:id="63364"/>
+      <w:bookmarkEnd w:id="21091"/>
     </w:p>
     <w:p>
       <w:pPr>
@@ -7057,7 +7059,7 @@
       </w:r>
     </w:p>
     <w:p>
-      <w:bookmarkStart w:id="29330" w:name="bm_concl"/>
+      <w:bookmarkStart w:id="50576" w:name="bm_concl"/>
       <w:pPr>
         <w:pStyle w:val="Heading1"/>
         <w:spacing w:line="360" w:lineRule="auto"/>
@@ -7072,7 +7074,7 @@
         </w:rPr>
         <w:t>Conclusion générale</w:t>
       </w:r>
-      <w:bookmarkEnd w:id="29330"/>
+      <w:bookmarkEnd w:id="50576"/>
     </w:p>
     <w:p>
       <w:pPr>
@@ -7131,7 +7133,7 @@
       </w:r>
     </w:p>
     <w:p>
-      <w:bookmarkStart w:id="24247" w:name="bm_biblio"/>
+      <w:bookmarkStart w:id="68509" w:name="bm_biblio"/>
       <w:pPr>
         <w:pStyle w:val="Heading1"/>
         <w:spacing w:line="360" w:lineRule="auto"/>
@@ -7146,7 +7148,7 @@
         </w:rPr>
         <w:t>Bibliographie et webographie</w:t>
       </w:r>
-      <w:bookmarkEnd w:id="24247"/>
+      <w:bookmarkEnd w:id="68509"/>
     </w:p>
     <w:p>
       <w:pPr>
@@ -7198,7 +7200,7 @@
           <w:color w:val="000000"/>
           <w:sz w:val="24"/>
         </w:rPr>
-        <w:t>, consulté le 15/07/2026 à 12h.</w:t>
+        <w:t>, consulté le 15/07/2026 à 09h20.</w:t>
       </w:r>
     </w:p>
     <w:p>
@@ -7235,7 +7237,7 @@
           <w:color w:val="000000"/>
           <w:sz w:val="24"/>
         </w:rPr>
-        <w:t>, consulté le 15/07/2026 à 12h.</w:t>
+        <w:t>, consulté le 15/07/2026 à 09h45.</w:t>
       </w:r>
     </w:p>
     <w:p>
@@ -7272,7 +7274,7 @@
           <w:color w:val="000000"/>
           <w:sz w:val="24"/>
         </w:rPr>
-        <w:t>, consulté le 15/07/2026 à 12h.</w:t>
+        <w:t>, consulté le 15/07/2026 à 10h15.</w:t>
       </w:r>
     </w:p>
     <w:p>
@@ -7309,7 +7311,7 @@
           <w:color w:val="000000"/>
           <w:sz w:val="24"/>
         </w:rPr>
-        <w:t>, consulté le 15/07/2026 à 12h.</w:t>
+        <w:t>, consulté le 15/07/2026 à 10h40.</w:t>
       </w:r>
     </w:p>
     <w:p>
@@ -7346,7 +7348,7 @@
           <w:color w:val="000000"/>
           <w:sz w:val="24"/>
         </w:rPr>
-        <w:t>, consulté le 15/07/2026 à 12h.</w:t>
+        <w:t>, consulté le 15/07/2026 à 11h25.</w:t>
       </w:r>
     </w:p>
     <w:p>
@@ -7399,7 +7401,7 @@
           <w:color w:val="000000"/>
           <w:sz w:val="24"/>
         </w:rPr>
-        <w:t>, consulté le 15/07/2026 à 12h.</w:t>
+        <w:t>, consulté le 15/07/2026 à 14h10.</w:t>
       </w:r>
     </w:p>
     <w:p>
@@ -7436,7 +7438,7 @@
           <w:color w:val="000000"/>
           <w:sz w:val="24"/>
         </w:rPr>
-        <w:t>, consulté le 15/07/2026 à 12h.</w:t>
+        <w:t>, consulté le 15/07/2026 à 15h05.</w:t>
       </w:r>
     </w:p>
     <w:p>
@@ -7473,7 +7475,7 @@
           <w:color w:val="000000"/>
           <w:sz w:val="24"/>
         </w:rPr>
-        <w:t>, consulté le 15/07/2026 à 12h.</w:t>
+        <w:t>, consulté le 15/07/2026 à 16h30.</w:t>
       </w:r>
     </w:p>
     <w:p>
@@ -7482,7 +7484,7 @@
       </w:r>
     </w:p>
     <w:p>
-      <w:bookmarkStart w:id="61545" w:name="bm_annexes"/>
+      <w:bookmarkStart w:id="76834" w:name="bm_annexes"/>
       <w:pPr>
         <w:pStyle w:val="Heading1"/>
         <w:spacing w:line="360" w:lineRule="auto"/>
@@ -7497,10 +7499,10 @@
         </w:rPr>
         <w:t>Annexes</w:t>
       </w:r>
-      <w:bookmarkEnd w:id="61545"/>
-    </w:p>
-    <w:p>
-      <w:bookmarkStart w:id="83361" w:name="Annexe_A___Inventaire_des_diagrammes_UML"/>
+      <w:bookmarkEnd w:id="76834"/>
+    </w:p>
+    <w:p>
+      <w:bookmarkStart w:id="19222" w:name="Annexe_A___Inventaire_des_diagrammes_UML"/>
       <w:pPr>
         <w:pStyle w:val="Heading2"/>
         <w:spacing w:line="360" w:lineRule="auto"/>
@@ -7515,7 +7517,7 @@
         </w:rPr>
         <w:t>Annexe A : Inventaire des diagrammes UML</w:t>
       </w:r>
-      <w:bookmarkEnd w:id="83361"/>
+      <w:bookmarkEnd w:id="19222"/>
     </w:p>
     <w:p>
       <w:pPr>
@@ -7534,7 +7536,7 @@
       </w:r>
     </w:p>
     <w:p>
-      <w:bookmarkStart w:id="73329" w:name="Annexe_B___Pr_fixes_d_identifiants"/>
+      <w:bookmarkStart w:id="2271" w:name="Annexe_B___Pr_fixes_d_identifiants"/>
       <w:pPr>
         <w:pStyle w:val="Heading2"/>
         <w:spacing w:line="360" w:lineRule="auto"/>
@@ -7549,7 +7551,7 @@
         </w:rPr>
         <w:t>Annexe B : Préfixes d'identifiants</w:t>
       </w:r>
-      <w:bookmarkEnd w:id="73329"/>
+      <w:bookmarkEnd w:id="2271"/>
     </w:p>
     <w:p>
       <w:pPr>
@@ -7568,7 +7570,7 @@
       </w:r>
     </w:p>
     <w:p>
-      <w:bookmarkStart w:id="48982" w:name="Annexe_C___Captures_d__cran_compl_mentai"/>
+      <w:bookmarkStart w:id="92090" w:name="Annexe_C___Captures_d__cran_compl_mentai"/>
       <w:pPr>
         <w:pStyle w:val="Heading2"/>
         <w:spacing w:line="360" w:lineRule="auto"/>
@@ -7583,7 +7585,7 @@
         </w:rPr>
         <w:t>Annexe C : Captures d'écran complémentaires</w:t>
       </w:r>
-      <w:bookmarkEnd w:id="48982"/>
+      <w:bookmarkEnd w:id="92090"/>
     </w:p>
     <w:p>
       <w:pPr>
@@ -7602,7 +7604,7 @@
       </w:r>
     </w:p>
     <w:p>
-      <w:bookmarkStart w:id="47919" w:name="Annexe_D___Mod_le_CSV_d_import_des__tudi"/>
+      <w:bookmarkStart w:id="84394" w:name="Annexe_D___Mod_le_CSV_d_import_des__tudi"/>
       <w:pPr>
         <w:pStyle w:val="Heading2"/>
         <w:spacing w:line="360" w:lineRule="auto"/>
@@ -7617,7 +7619,7 @@
         </w:rPr>
         <w:t>Annexe D : Modèle CSV d'import des étudiants</w:t>
       </w:r>
-      <w:bookmarkEnd w:id="47919"/>
+      <w:bookmarkEnd w:id="84394"/>
     </w:p>
     <w:p>
       <w:pPr>
@@ -7641,7 +7643,7 @@
       </w:r>
     </w:p>
     <w:p>
-      <w:bookmarkStart w:id="92587" w:name="bm_tdm"/>
+      <w:bookmarkStart w:id="89155" w:name="bm_tdm"/>
       <w:pPr>
         <w:pStyle w:val="Heading1"/>
         <w:spacing w:line="360" w:lineRule="auto"/>
@@ -7656,817 +7658,43 @@
         </w:rPr>
         <w:t>Table des matières</w:t>
       </w:r>
-      <w:bookmarkEnd w:id="92587"/>
-    </w:p>
-    <w:p>
-      <w:pPr>
-        <w:spacing w:after="40" w:line="360" w:lineRule="auto"/>
-        <w:ind w:left="0"/>
+      <w:bookmarkEnd w:id="89155"/>
+    </w:p>
+    <w:p>
+      <w:pPr>
+        <w:spacing w:after="160" w:line="360" w:lineRule="auto"/>
+        <w:jc w:val="both"/>
+      </w:pPr>
+      <w:r>
+        <w:rPr>
+          <w:rFonts w:ascii="Times New Roman" w:hAnsi="Times New Roman" w:eastAsia="Times New Roman"/>
+          <w:b w:val="0"/>
+          <w:i/>
+          <w:color w:val="000000"/>
+          <w:sz w:val="22"/>
+        </w:rPr>
+        <w:t>Table complète des titres et sous-titres. Dans Word : sélectionner le champ, clic droit, Mettre à jour les champs, choisir Mettre à jour toute la table. Les entrées deviennent cliquables.</w:t>
+      </w:r>
+    </w:p>
+    <w:p>
+      <w:pPr>
+        <w:spacing w:after="160" w:line="360" w:lineRule="auto"/>
         <w:jc w:val="left"/>
       </w:pPr>
-      <w:hyperlink w:anchor="bm_intro">
-        <w:r>
-          <w:rPr>
-            <w:rFonts w:ascii="Times New Roman" w:hAnsi="Times New Roman"/>
-            <w:sz w:val="24"/>
-            <w:color w:val="0000FF"/>
-            <w:u w:val="single"/>
-          </w:rPr>
-          <w:t xml:space="preserve">Introduction générale</w:t>
-        </w:r>
-      </w:hyperlink>
-    </w:p>
-    <w:p>
-      <w:pPr>
-        <w:spacing w:after="40" w:line="360" w:lineRule="auto"/>
-        <w:ind w:left="0"/>
-        <w:jc w:val="left"/>
-      </w:pPr>
-      <w:hyperlink w:anchor="bm_probl">
-        <w:r>
-          <w:rPr>
-            <w:rFonts w:ascii="Times New Roman" w:hAnsi="Times New Roman"/>
-            <w:sz w:val="24"/>
-            <w:color w:val="0000FF"/>
-            <w:u w:val="single"/>
-          </w:rPr>
-          <w:t xml:space="preserve">Problématique</w:t>
-        </w:r>
-      </w:hyperlink>
-    </w:p>
-    <w:p>
-      <w:pPr>
-        <w:spacing w:after="40" w:line="360" w:lineRule="auto"/>
-        <w:ind w:left="0"/>
-        <w:jc w:val="left"/>
-      </w:pPr>
-      <w:hyperlink w:anchor="bm_ch1">
-        <w:r>
-          <w:rPr>
-            <w:rFonts w:ascii="Times New Roman" w:hAnsi="Times New Roman"/>
-            <w:sz w:val="24"/>
-            <w:color w:val="0000FF"/>
-            <w:u w:val="single"/>
-          </w:rPr>
-          <w:t xml:space="preserve">Chapitre 1 : Contexte et étude de l'existant</w:t>
-        </w:r>
-      </w:hyperlink>
-    </w:p>
-    <w:p>
-      <w:pPr>
-        <w:spacing w:after="40" w:line="360" w:lineRule="auto"/>
-        <w:ind w:left="425"/>
-        <w:jc w:val="left"/>
-      </w:pPr>
-      <w:hyperlink w:anchor="bm_ch1_1">
-        <w:r>
-          <w:rPr>
-            <w:rFonts w:ascii="Times New Roman" w:hAnsi="Times New Roman"/>
-            <w:sz w:val="24"/>
-            <w:color w:val="0000FF"/>
-            <w:u w:val="single"/>
-          </w:rPr>
-          <w:t xml:space="preserve">1.1 Contexte pédagogique et technologique</w:t>
-        </w:r>
-      </w:hyperlink>
-    </w:p>
-    <w:p>
-      <w:pPr>
-        <w:spacing w:after="40" w:line="360" w:lineRule="auto"/>
-        <w:ind w:left="425"/>
-        <w:jc w:val="left"/>
-      </w:pPr>
-      <w:hyperlink w:anchor="bm_ch1_2">
-        <w:r>
-          <w:rPr>
-            <w:rFonts w:ascii="Times New Roman" w:hAnsi="Times New Roman"/>
-            <w:sz w:val="24"/>
-            <w:color w:val="0000FF"/>
-            <w:u w:val="single"/>
-          </w:rPr>
-          <w:t xml:space="preserve">1.2 Sous-problèmes et contraintes locales</w:t>
-        </w:r>
-      </w:hyperlink>
-    </w:p>
-    <w:p>
-      <w:pPr>
-        <w:spacing w:after="40" w:line="360" w:lineRule="auto"/>
-        <w:ind w:left="425"/>
-        <w:jc w:val="left"/>
-      </w:pPr>
-      <w:hyperlink w:anchor="bm_ch1_3">
-        <w:r>
-          <w:rPr>
-            <w:rFonts w:ascii="Times New Roman" w:hAnsi="Times New Roman"/>
-            <w:sz w:val="24"/>
-            <w:color w:val="0000FF"/>
-            <w:u w:val="single"/>
-          </w:rPr>
-          <w:t xml:space="preserve">1.3 Examen des solutions existantes</w:t>
-        </w:r>
-      </w:hyperlink>
-    </w:p>
-    <w:p>
-      <w:pPr>
-        <w:spacing w:after="40" w:line="360" w:lineRule="auto"/>
-        <w:ind w:left="425"/>
-        <w:jc w:val="left"/>
-      </w:pPr>
-      <w:hyperlink w:anchor="bm_ch1_4">
-        <w:r>
-          <w:rPr>
-            <w:rFonts w:ascii="Times New Roman" w:hAnsi="Times New Roman"/>
-            <w:sz w:val="24"/>
-            <w:color w:val="0000FF"/>
-            <w:u w:val="single"/>
-          </w:rPr>
-          <w:t xml:space="preserve">1.4 Positionnement de Cylentic</w:t>
-        </w:r>
-      </w:hyperlink>
-    </w:p>
-    <w:p>
-      <w:pPr>
-        <w:spacing w:after="40" w:line="360" w:lineRule="auto"/>
-        <w:ind w:left="425"/>
-        <w:jc w:val="left"/>
-      </w:pPr>
-      <w:hyperlink w:anchor="bm_ch1_5">
-        <w:r>
-          <w:rPr>
-            <w:rFonts w:ascii="Times New Roman" w:hAnsi="Times New Roman"/>
-            <w:sz w:val="24"/>
-            <w:color w:val="0000FF"/>
-            <w:u w:val="single"/>
-          </w:rPr>
-          <w:t xml:space="preserve">1.5 Conclusion partielle</w:t>
-        </w:r>
-      </w:hyperlink>
-    </w:p>
-    <w:p>
-      <w:pPr>
-        <w:spacing w:after="40" w:line="360" w:lineRule="auto"/>
-        <w:ind w:left="0"/>
-        <w:jc w:val="left"/>
-      </w:pPr>
-      <w:hyperlink w:anchor="bm_ch2">
-        <w:r>
-          <w:rPr>
-            <w:rFonts w:ascii="Times New Roman" w:hAnsi="Times New Roman"/>
-            <w:sz w:val="24"/>
-            <w:color w:val="0000FF"/>
-            <w:u w:val="single"/>
-          </w:rPr>
-          <w:t xml:space="preserve">Chapitre 2 : Analyse des besoins et spécification du système</w:t>
-        </w:r>
-      </w:hyperlink>
-    </w:p>
-    <w:p>
-      <w:pPr>
-        <w:spacing w:after="40" w:line="360" w:lineRule="auto"/>
-        <w:ind w:left="425"/>
-        <w:jc w:val="left"/>
-      </w:pPr>
-      <w:hyperlink w:anchor="bm_ch2_1">
-        <w:r>
-          <w:rPr>
-            <w:rFonts w:ascii="Times New Roman" w:hAnsi="Times New Roman"/>
-            <w:sz w:val="24"/>
-            <w:color w:val="0000FF"/>
-            <w:u w:val="single"/>
-          </w:rPr>
-          <w:t xml:space="preserve">2.1 Périmètre du projet et du MVP</w:t>
-        </w:r>
-      </w:hyperlink>
-    </w:p>
-    <w:p>
-      <w:pPr>
-        <w:spacing w:after="40" w:line="360" w:lineRule="auto"/>
-        <w:ind w:left="425"/>
-        <w:jc w:val="left"/>
-      </w:pPr>
-      <w:hyperlink w:anchor="bm_ch2_2">
-        <w:r>
-          <w:rPr>
-            <w:rFonts w:ascii="Times New Roman" w:hAnsi="Times New Roman"/>
-            <w:sz w:val="24"/>
-            <w:color w:val="0000FF"/>
-            <w:u w:val="single"/>
-          </w:rPr>
-          <w:t xml:space="preserve">2.2 Identification des acteurs</w:t>
-        </w:r>
-      </w:hyperlink>
-    </w:p>
-    <w:p>
-      <w:pPr>
-        <w:spacing w:after="40" w:line="360" w:lineRule="auto"/>
-        <w:ind w:left="425"/>
-        <w:jc w:val="left"/>
-      </w:pPr>
-      <w:hyperlink w:anchor="bm_ch2_3">
-        <w:r>
-          <w:rPr>
-            <w:rFonts w:ascii="Times New Roman" w:hAnsi="Times New Roman"/>
-            <w:sz w:val="24"/>
-            <w:color w:val="0000FF"/>
-            <w:u w:val="single"/>
-          </w:rPr>
-          <w:t xml:space="preserve">2.3 Besoins fonctionnels</w:t>
-        </w:r>
-      </w:hyperlink>
-    </w:p>
-    <w:p>
-      <w:pPr>
-        <w:spacing w:after="40" w:line="360" w:lineRule="auto"/>
-        <w:ind w:left="425"/>
-        <w:jc w:val="left"/>
-      </w:pPr>
-      <w:hyperlink w:anchor="bm_ch2_4">
-        <w:r>
-          <w:rPr>
-            <w:rFonts w:ascii="Times New Roman" w:hAnsi="Times New Roman"/>
-            <w:sz w:val="24"/>
-            <w:color w:val="0000FF"/>
-            <w:u w:val="single"/>
-          </w:rPr>
-          <w:t xml:space="preserve">2.4 Besoins non fonctionnels</w:t>
-        </w:r>
-      </w:hyperlink>
-    </w:p>
-    <w:p>
-      <w:pPr>
-        <w:spacing w:after="40" w:line="360" w:lineRule="auto"/>
-        <w:ind w:left="425"/>
-        <w:jc w:val="left"/>
-      </w:pPr>
-      <w:hyperlink w:anchor="bm_ch2_5">
-        <w:r>
-          <w:rPr>
-            <w:rFonts w:ascii="Times New Roman" w:hAnsi="Times New Roman"/>
-            <w:sz w:val="24"/>
-            <w:color w:val="0000FF"/>
-            <w:u w:val="single"/>
-          </w:rPr>
-          <w:t xml:space="preserve">2.5 Règles métier structurantes</w:t>
-        </w:r>
-      </w:hyperlink>
-    </w:p>
-    <w:p>
-      <w:pPr>
-        <w:spacing w:after="40" w:line="360" w:lineRule="auto"/>
-        <w:ind w:left="425"/>
-        <w:jc w:val="left"/>
-      </w:pPr>
-      <w:hyperlink w:anchor="bm_ch2_6">
-        <w:r>
-          <w:rPr>
-            <w:rFonts w:ascii="Times New Roman" w:hAnsi="Times New Roman"/>
-            <w:sz w:val="24"/>
-            <w:color w:val="0000FF"/>
-            <w:u w:val="single"/>
-          </w:rPr>
-          <w:t xml:space="preserve">2.6 Scénarios d'usage prioritaires</w:t>
-        </w:r>
-      </w:hyperlink>
-    </w:p>
-    <w:p>
-      <w:pPr>
-        <w:spacing w:after="40" w:line="360" w:lineRule="auto"/>
-        <w:ind w:left="425"/>
-        <w:jc w:val="left"/>
-      </w:pPr>
-      <w:hyperlink w:anchor="bm_ch2_7">
-        <w:r>
-          <w:rPr>
-            <w:rFonts w:ascii="Times New Roman" w:hAnsi="Times New Roman"/>
-            <w:sz w:val="24"/>
-            <w:color w:val="0000FF"/>
-            <w:u w:val="single"/>
-          </w:rPr>
-          <w:t xml:space="preserve">2.7 Conclusion partielle</w:t>
-        </w:r>
-      </w:hyperlink>
-    </w:p>
-    <w:p>
-      <w:pPr>
-        <w:spacing w:after="40" w:line="360" w:lineRule="auto"/>
-        <w:ind w:left="0"/>
-        <w:jc w:val="left"/>
-      </w:pPr>
-      <w:hyperlink w:anchor="bm_ch3">
-        <w:r>
-          <w:rPr>
-            <w:rFonts w:ascii="Times New Roman" w:hAnsi="Times New Roman"/>
-            <w:sz w:val="24"/>
-            <w:color w:val="0000FF"/>
-            <w:u w:val="single"/>
-          </w:rPr>
-          <w:t xml:space="preserve">Chapitre 3 : Conception du système Cylentic</w:t>
-        </w:r>
-      </w:hyperlink>
-    </w:p>
-    <w:p>
-      <w:pPr>
-        <w:spacing w:after="40" w:line="360" w:lineRule="auto"/>
-        <w:ind w:left="425"/>
-        <w:jc w:val="left"/>
-      </w:pPr>
-      <w:hyperlink w:anchor="bm_ch3_1">
-        <w:r>
-          <w:rPr>
-            <w:rFonts w:ascii="Times New Roman" w:hAnsi="Times New Roman"/>
-            <w:sz w:val="24"/>
-            <w:color w:val="0000FF"/>
-            <w:u w:val="single"/>
-          </w:rPr>
-          <w:t xml:space="preserve">3.1 Démarche de conception</w:t>
-        </w:r>
-      </w:hyperlink>
-    </w:p>
-    <w:p>
-      <w:pPr>
-        <w:spacing w:after="40" w:line="360" w:lineRule="auto"/>
-        <w:ind w:left="425"/>
-        <w:jc w:val="left"/>
-      </w:pPr>
-      <w:hyperlink w:anchor="bm_ch3_2">
-        <w:r>
-          <w:rPr>
-            <w:rFonts w:ascii="Times New Roman" w:hAnsi="Times New Roman"/>
-            <w:sz w:val="24"/>
-            <w:color w:val="0000FF"/>
-            <w:u w:val="single"/>
-          </w:rPr>
-          <w:t xml:space="preserve">3.2 Architecture générale et déploiement</w:t>
-        </w:r>
-      </w:hyperlink>
-    </w:p>
-    <w:p>
-      <w:pPr>
-        <w:spacing w:after="40" w:line="360" w:lineRule="auto"/>
-        <w:ind w:left="425"/>
-        <w:jc w:val="left"/>
-      </w:pPr>
-      <w:hyperlink w:anchor="bm_ch3_3">
-        <w:r>
-          <w:rPr>
-            <w:rFonts w:ascii="Times New Roman" w:hAnsi="Times New Roman"/>
-            <w:sz w:val="24"/>
-            <w:color w:val="0000FF"/>
-            <w:u w:val="single"/>
-          </w:rPr>
-          <w:t xml:space="preserve">3.3 Vue des cas d'utilisation</w:t>
-        </w:r>
-      </w:hyperlink>
-    </w:p>
-    <w:p>
-      <w:pPr>
-        <w:spacing w:after="40" w:line="360" w:lineRule="auto"/>
-        <w:ind w:left="425"/>
-        <w:jc w:val="left"/>
-      </w:pPr>
-      <w:hyperlink w:anchor="bm_ch3_4">
-        <w:r>
-          <w:rPr>
-            <w:rFonts w:ascii="Times New Roman" w:hAnsi="Times New Roman"/>
-            <w:sz w:val="24"/>
-            <w:color w:val="0000FF"/>
-            <w:u w:val="single"/>
-          </w:rPr>
-          <w:t xml:space="preserve">3.4 Structure statique : classes et objets</w:t>
-        </w:r>
-      </w:hyperlink>
-    </w:p>
-    <w:p>
-      <w:pPr>
-        <w:spacing w:after="40" w:line="360" w:lineRule="auto"/>
-        <w:ind w:left="425"/>
-        <w:jc w:val="left"/>
-      </w:pPr>
-      <w:hyperlink w:anchor="bm_ch3_5">
-        <w:r>
-          <w:rPr>
-            <w:rFonts w:ascii="Times New Roman" w:hAnsi="Times New Roman"/>
-            <w:sz w:val="24"/>
-            <w:color w:val="0000FF"/>
-            <w:u w:val="single"/>
-          </w:rPr>
-          <w:t xml:space="preserve">3.5 Organisation en composants</w:t>
-        </w:r>
-      </w:hyperlink>
-    </w:p>
-    <w:p>
-      <w:pPr>
-        <w:spacing w:after="40" w:line="360" w:lineRule="auto"/>
-        <w:ind w:left="425"/>
-        <w:jc w:val="left"/>
-      </w:pPr>
-      <w:hyperlink w:anchor="bm_ch3_6">
-        <w:r>
-          <w:rPr>
-            <w:rFonts w:ascii="Times New Roman" w:hAnsi="Times New Roman"/>
-            <w:sz w:val="24"/>
-            <w:color w:val="0000FF"/>
-            <w:u w:val="single"/>
-          </w:rPr>
-          <w:t xml:space="preserve">3.6 Dynamique du système</w:t>
-        </w:r>
-      </w:hyperlink>
-    </w:p>
-    <w:p>
-      <w:pPr>
-        <w:spacing w:after="40" w:line="360" w:lineRule="auto"/>
-        <w:ind w:left="425"/>
-        <w:jc w:val="left"/>
-      </w:pPr>
-      <w:hyperlink w:anchor="bm_ch3_7">
-        <w:r>
-          <w:rPr>
-            <w:rFonts w:ascii="Times New Roman" w:hAnsi="Times New Roman"/>
-            <w:sz w:val="24"/>
-            <w:color w:val="0000FF"/>
-            <w:u w:val="single"/>
-          </w:rPr>
-          <w:t xml:space="preserve">3.7 Conception des données</w:t>
-        </w:r>
-      </w:hyperlink>
-    </w:p>
-    <w:p>
-      <w:pPr>
-        <w:spacing w:after="40" w:line="360" w:lineRule="auto"/>
-        <w:ind w:left="425"/>
-        <w:jc w:val="left"/>
-      </w:pPr>
-      <w:hyperlink w:anchor="bm_ch3_8">
-        <w:r>
-          <w:rPr>
-            <w:rFonts w:ascii="Times New Roman" w:hAnsi="Times New Roman"/>
-            <w:sz w:val="24"/>
-            <w:color w:val="0000FF"/>
-            <w:u w:val="single"/>
-          </w:rPr>
-          <w:t xml:space="preserve">3.8 Conception de la sécurité de passation</w:t>
-        </w:r>
-      </w:hyperlink>
-    </w:p>
-    <w:p>
-      <w:pPr>
-        <w:spacing w:after="40" w:line="360" w:lineRule="auto"/>
-        <w:ind w:left="425"/>
-        <w:jc w:val="left"/>
-      </w:pPr>
-      <w:hyperlink w:anchor="bm_ch3_9">
-        <w:r>
-          <w:rPr>
-            <w:rFonts w:ascii="Times New Roman" w:hAnsi="Times New Roman"/>
-            <w:sz w:val="24"/>
-            <w:color w:val="0000FF"/>
-            <w:u w:val="single"/>
-          </w:rPr>
-          <w:t xml:space="preserve">3.9 Conception de la correction automatique</w:t>
-        </w:r>
-      </w:hyperlink>
-    </w:p>
-    <w:p>
-      <w:pPr>
-        <w:spacing w:after="40" w:line="360" w:lineRule="auto"/>
-        <w:ind w:left="425"/>
-        <w:jc w:val="left"/>
-      </w:pPr>
-      <w:hyperlink w:anchor="bm_ch3_10">
-        <w:r>
-          <w:rPr>
-            <w:rFonts w:ascii="Times New Roman" w:hAnsi="Times New Roman"/>
-            <w:sz w:val="24"/>
-            <w:color w:val="0000FF"/>
-            <w:u w:val="single"/>
-          </w:rPr>
-          <w:t xml:space="preserve">3.10 Conclusion partielle</w:t>
-        </w:r>
-      </w:hyperlink>
-    </w:p>
-    <w:p>
-      <w:pPr>
-        <w:spacing w:after="40" w:line="360" w:lineRule="auto"/>
-        <w:ind w:left="0"/>
-        <w:jc w:val="left"/>
-      </w:pPr>
-      <w:hyperlink w:anchor="bm_ch4">
-        <w:r>
-          <w:rPr>
-            <w:rFonts w:ascii="Times New Roman" w:hAnsi="Times New Roman"/>
-            <w:sz w:val="24"/>
-            <w:color w:val="0000FF"/>
-            <w:u w:val="single"/>
-          </w:rPr>
-          <w:t xml:space="preserve">Chapitre 4 : Réalisation et mise en œuvre</w:t>
-        </w:r>
-      </w:hyperlink>
-    </w:p>
-    <w:p>
-      <w:pPr>
-        <w:spacing w:after="40" w:line="360" w:lineRule="auto"/>
-        <w:ind w:left="425"/>
-        <w:jc w:val="left"/>
-      </w:pPr>
-      <w:hyperlink w:anchor="bm_ch4_1">
-        <w:r>
-          <w:rPr>
-            <w:rFonts w:ascii="Times New Roman" w:hAnsi="Times New Roman"/>
-            <w:sz w:val="24"/>
-            <w:color w:val="0000FF"/>
-            <w:u w:val="single"/>
-          </w:rPr>
-          <w:t xml:space="preserve">4.1 Environnement de travail</w:t>
-        </w:r>
-      </w:hyperlink>
-    </w:p>
-    <w:p>
-      <w:pPr>
-        <w:spacing w:after="40" w:line="360" w:lineRule="auto"/>
-        <w:ind w:left="425"/>
-        <w:jc w:val="left"/>
-      </w:pPr>
-      <w:hyperlink w:anchor="bm_ch4_2">
-        <w:r>
-          <w:rPr>
-            <w:rFonts w:ascii="Times New Roman" w:hAnsi="Times New Roman"/>
-            <w:sz w:val="24"/>
-            <w:color w:val="0000FF"/>
-            <w:u w:val="single"/>
-          </w:rPr>
-          <w:t xml:space="preserve">4.2 Choix technologiques</w:t>
-        </w:r>
-      </w:hyperlink>
-    </w:p>
-    <w:p>
-      <w:pPr>
-        <w:spacing w:after="40" w:line="360" w:lineRule="auto"/>
-        <w:ind w:left="425"/>
-        <w:jc w:val="left"/>
-      </w:pPr>
-      <w:hyperlink w:anchor="bm_ch4_3">
-        <w:r>
-          <w:rPr>
-            <w:rFonts w:ascii="Times New Roman" w:hAnsi="Times New Roman"/>
-            <w:sz w:val="24"/>
-            <w:color w:val="0000FF"/>
-            <w:u w:val="single"/>
-          </w:rPr>
-          <w:t xml:space="preserve">4.3 Organisation du code et architecture applicative</w:t>
-        </w:r>
-      </w:hyperlink>
-    </w:p>
-    <w:p>
-      <w:pPr>
-        <w:spacing w:after="40" w:line="360" w:lineRule="auto"/>
-        <w:ind w:left="425"/>
-        <w:jc w:val="left"/>
-      </w:pPr>
-      <w:hyperlink w:anchor="bm_ch4_4">
-        <w:r>
-          <w:rPr>
-            <w:rFonts w:ascii="Times New Roman" w:hAnsi="Times New Roman"/>
-            <w:sz w:val="24"/>
-            <w:color w:val="0000FF"/>
-            <w:u w:val="single"/>
-          </w:rPr>
-          <w:t xml:space="preserve">4.4 Réalisation des modules principaux</w:t>
-        </w:r>
-      </w:hyperlink>
-    </w:p>
-    <w:p>
-      <w:pPr>
-        <w:spacing w:after="40" w:line="360" w:lineRule="auto"/>
-        <w:ind w:left="425"/>
-        <w:jc w:val="left"/>
-      </w:pPr>
-      <w:hyperlink w:anchor="bm_ch4_5">
-        <w:r>
-          <w:rPr>
-            <w:rFonts w:ascii="Times New Roman" w:hAnsi="Times New Roman"/>
-            <w:sz w:val="24"/>
-            <w:color w:val="0000FF"/>
-            <w:u w:val="single"/>
-          </w:rPr>
-          <w:t xml:space="preserve">4.5 Points techniques difficiles</w:t>
-        </w:r>
-      </w:hyperlink>
-    </w:p>
-    <w:p>
-      <w:pPr>
-        <w:spacing w:after="40" w:line="360" w:lineRule="auto"/>
-        <w:ind w:left="425"/>
-        <w:jc w:val="left"/>
-      </w:pPr>
-      <w:hyperlink w:anchor="bm_ch4_6">
-        <w:r>
-          <w:rPr>
-            <w:rFonts w:ascii="Times New Roman" w:hAnsi="Times New Roman"/>
-            <w:sz w:val="24"/>
-            <w:color w:val="0000FF"/>
-            <w:u w:val="single"/>
-          </w:rPr>
-          <w:t xml:space="preserve">4.6 Déploiement</w:t>
-        </w:r>
-      </w:hyperlink>
-    </w:p>
-    <w:p>
-      <w:pPr>
-        <w:spacing w:after="40" w:line="360" w:lineRule="auto"/>
-        <w:ind w:left="425"/>
-        <w:jc w:val="left"/>
-      </w:pPr>
-      <w:hyperlink w:anchor="bm_ch4_7">
-        <w:r>
-          <w:rPr>
-            <w:rFonts w:ascii="Times New Roman" w:hAnsi="Times New Roman"/>
-            <w:sz w:val="24"/>
-            <w:color w:val="0000FF"/>
-            <w:u w:val="single"/>
-          </w:rPr>
-          <w:t xml:space="preserve">4.7 Conclusion partielle</w:t>
-        </w:r>
-      </w:hyperlink>
-    </w:p>
-    <w:p>
-      <w:pPr>
-        <w:spacing w:after="40" w:line="360" w:lineRule="auto"/>
-        <w:ind w:left="0"/>
-        <w:jc w:val="left"/>
-      </w:pPr>
-      <w:hyperlink w:anchor="bm_ch5">
-        <w:r>
-          <w:rPr>
-            <w:rFonts w:ascii="Times New Roman" w:hAnsi="Times New Roman"/>
-            <w:sz w:val="24"/>
-            <w:color w:val="0000FF"/>
-            <w:u w:val="single"/>
-          </w:rPr>
-          <w:t xml:space="preserve">Chapitre 5 : Tests, résultats, limites et perspectives</w:t>
-        </w:r>
-      </w:hyperlink>
-    </w:p>
-    <w:p>
-      <w:pPr>
-        <w:spacing w:after="40" w:line="360" w:lineRule="auto"/>
-        <w:ind w:left="425"/>
-        <w:jc w:val="left"/>
-      </w:pPr>
-      <w:hyperlink w:anchor="bm_ch5_1">
-        <w:r>
-          <w:rPr>
-            <w:rFonts w:ascii="Times New Roman" w:hAnsi="Times New Roman"/>
-            <w:sz w:val="24"/>
-            <w:color w:val="0000FF"/>
-            <w:u w:val="single"/>
-          </w:rPr>
-          <w:t xml:space="preserve">5.1 Stratégie de tests</w:t>
-        </w:r>
-      </w:hyperlink>
-    </w:p>
-    <w:p>
-      <w:pPr>
-        <w:spacing w:after="40" w:line="360" w:lineRule="auto"/>
-        <w:ind w:left="425"/>
-        <w:jc w:val="left"/>
-      </w:pPr>
-      <w:hyperlink w:anchor="bm_ch5_2">
-        <w:r>
-          <w:rPr>
-            <w:rFonts w:ascii="Times New Roman" w:hAnsi="Times New Roman"/>
-            <w:sz w:val="24"/>
-            <w:color w:val="0000FF"/>
-            <w:u w:val="single"/>
-          </w:rPr>
-          <w:t xml:space="preserve">5.2 Jeux de tests et résultats</w:t>
-        </w:r>
-      </w:hyperlink>
-    </w:p>
-    <w:p>
-      <w:pPr>
-        <w:spacing w:after="40" w:line="360" w:lineRule="auto"/>
-        <w:ind w:left="425"/>
-        <w:jc w:val="left"/>
-      </w:pPr>
-      <w:hyperlink w:anchor="bm_ch5_3">
-        <w:r>
-          <w:rPr>
-            <w:rFonts w:ascii="Times New Roman" w:hAnsi="Times New Roman"/>
-            <w:sz w:val="24"/>
-            <w:color w:val="0000FF"/>
-            <w:u w:val="single"/>
-          </w:rPr>
-          <w:t xml:space="preserve">5.3 Discussion des résultats</w:t>
-        </w:r>
-      </w:hyperlink>
-    </w:p>
-    <w:p>
-      <w:pPr>
-        <w:spacing w:after="40" w:line="360" w:lineRule="auto"/>
-        <w:ind w:left="425"/>
-        <w:jc w:val="left"/>
-      </w:pPr>
-      <w:hyperlink w:anchor="bm_ch5_4">
-        <w:r>
-          <w:rPr>
-            <w:rFonts w:ascii="Times New Roman" w:hAnsi="Times New Roman"/>
-            <w:sz w:val="24"/>
-            <w:color w:val="0000FF"/>
-            <w:u w:val="single"/>
-          </w:rPr>
-          <w:t xml:space="preserve">5.4 Limites et risques résiduels</w:t>
-        </w:r>
-      </w:hyperlink>
-    </w:p>
-    <w:p>
-      <w:pPr>
-        <w:spacing w:after="40" w:line="360" w:lineRule="auto"/>
-        <w:ind w:left="425"/>
-        <w:jc w:val="left"/>
-      </w:pPr>
-      <w:hyperlink w:anchor="bm_ch5_5">
-        <w:r>
-          <w:rPr>
-            <w:rFonts w:ascii="Times New Roman" w:hAnsi="Times New Roman"/>
-            <w:sz w:val="24"/>
-            <w:color w:val="0000FF"/>
-            <w:u w:val="single"/>
-          </w:rPr>
-          <w:t xml:space="preserve">5.5 Perspectives</w:t>
-        </w:r>
-      </w:hyperlink>
-    </w:p>
-    <w:p>
-      <w:pPr>
-        <w:spacing w:after="40" w:line="360" w:lineRule="auto"/>
-        <w:ind w:left="425"/>
-        <w:jc w:val="left"/>
-      </w:pPr>
-      <w:hyperlink w:anchor="bm_ch5_6">
-        <w:r>
-          <w:rPr>
-            <w:rFonts w:ascii="Times New Roman" w:hAnsi="Times New Roman"/>
-            <w:sz w:val="24"/>
-            <w:color w:val="0000FF"/>
-            <w:u w:val="single"/>
-          </w:rPr>
-          <w:t xml:space="preserve">5.6 Conclusion partielle</w:t>
-        </w:r>
-      </w:hyperlink>
-    </w:p>
-    <w:p>
-      <w:pPr>
-        <w:spacing w:after="40" w:line="360" w:lineRule="auto"/>
-        <w:ind w:left="0"/>
-        <w:jc w:val="left"/>
-      </w:pPr>
-      <w:hyperlink w:anchor="bm_concl">
-        <w:r>
-          <w:rPr>
-            <w:rFonts w:ascii="Times New Roman" w:hAnsi="Times New Roman"/>
-            <w:sz w:val="24"/>
-            <w:color w:val="0000FF"/>
-            <w:u w:val="single"/>
-          </w:rPr>
-          <w:t xml:space="preserve">Conclusion générale</w:t>
-        </w:r>
-      </w:hyperlink>
-    </w:p>
-    <w:p>
-      <w:pPr>
-        <w:spacing w:after="40" w:line="360" w:lineRule="auto"/>
-        <w:ind w:left="0"/>
-        <w:jc w:val="left"/>
-      </w:pPr>
-      <w:hyperlink w:anchor="bm_biblio">
-        <w:r>
-          <w:rPr>
-            <w:rFonts w:ascii="Times New Roman" w:hAnsi="Times New Roman"/>
-            <w:sz w:val="24"/>
-            <w:color w:val="0000FF"/>
-            <w:u w:val="single"/>
-          </w:rPr>
-          <w:t xml:space="preserve">Bibliographie et webographie</w:t>
-        </w:r>
-      </w:hyperlink>
-    </w:p>
-    <w:p>
-      <w:pPr>
-        <w:spacing w:after="40" w:line="360" w:lineRule="auto"/>
-        <w:ind w:left="0"/>
-        <w:jc w:val="left"/>
-      </w:pPr>
-      <w:hyperlink w:anchor="bm_annexes">
-        <w:r>
-          <w:rPr>
-            <w:rFonts w:ascii="Times New Roman" w:hAnsi="Times New Roman"/>
-            <w:sz w:val="24"/>
-            <w:color w:val="0000FF"/>
-            <w:u w:val="single"/>
-          </w:rPr>
-          <w:t xml:space="preserve">Annexes</w:t>
-        </w:r>
-      </w:hyperlink>
+      <w:r>
+        <w:rPr>
+          <w:rFonts w:ascii="Times New Roman" w:hAnsi="Times New Roman" w:eastAsia="Times New Roman"/>
+          <w:b w:val="0"/>
+          <w:i/>
+          <w:color w:val="000000"/>
+          <w:sz w:val="24"/>
+        </w:rPr>
+        <w:fldChar w:fldCharType="begin"/>
+        <w:instrText xml:space="preserve">TOC \o "1-3" \h \z \u</w:instrText>
+        <w:fldChar w:fldCharType="separate"/>
+        <w:t>(Cliquez droit &gt; Mettre à jour les champs dans Word)</w:t>
+        <w:fldChar w:fldCharType="end"/>
+      </w:r>
     </w:p>
     <w:sectPr>
       <w:footerReference w:type="default" r:id="rId10"/>

</xml_diff>

<commit_message>
Corrige numérotation figures/tableaux et pagination romaine du TOC.
Les légendes portent des numéros consécutifs (Figure 1…28, Tableau 1…3).
Le format de section w:pgNumType (lowerRoman / decimal) aligne pied de
page, sommaire et table des matières. Pages de garde sans numéro.

Co-authored-by: progirix <progirix@users.noreply.github.com>
</commit_message>
<xml_diff>
--- a/docs/Rapport_Cylentic.docx
+++ b/docs/Rapport_Cylentic.docx
@@ -480,12 +480,19 @@
       </w:r>
     </w:p>
     <w:p>
-      <w:r>
-        <w:br w:type="page"/>
-      </w:r>
-    </w:p>
-    <w:p>
-      <w:bookmarkStart w:id="32969" w:name="bm_dedicace"/>
+      <w:pPr>
+        <w:sectPr>
+          <w:footerReference w:type="default" r:id="rId9"/>
+          <w:pgSz w:w="11906" w:h="16838"/>
+          <w:pgMar w:top="1417" w:right="1417" w:bottom="1417" w:left="1984" w:header="720" w:footer="720" w:gutter="0"/>
+          <w:cols w:space="720"/>
+          <w:docGrid w:linePitch="360"/>
+          <w:pgNumType w:fmt="lowerRoman" w:start="1"/>
+        </w:sectPr>
+      </w:pPr>
+    </w:p>
+    <w:p>
+      <w:bookmarkStart w:id="42929" w:name="bm_dedicace"/>
       <w:pPr>
         <w:pStyle w:val="Heading1"/>
         <w:spacing w:line="360" w:lineRule="auto"/>
@@ -500,7 +507,7 @@
         </w:rPr>
         <w:t>Dédicace</w:t>
       </w:r>
-      <w:bookmarkEnd w:id="32969"/>
+      <w:bookmarkEnd w:id="42929"/>
     </w:p>
     <w:p>
       <w:pPr>
@@ -525,7 +532,7 @@
       </w:r>
     </w:p>
     <w:p>
-      <w:bookmarkStart w:id="34251" w:name="bm_remerciements"/>
+      <w:bookmarkStart w:id="7106" w:name="bm_remerciements"/>
       <w:pPr>
         <w:pStyle w:val="Heading1"/>
         <w:spacing w:line="360" w:lineRule="auto"/>
@@ -540,7 +547,7 @@
         </w:rPr>
         <w:t>Remerciements</w:t>
       </w:r>
-      <w:bookmarkEnd w:id="34251"/>
+      <w:bookmarkEnd w:id="7106"/>
     </w:p>
     <w:p>
       <w:pPr>
@@ -599,7 +606,7 @@
       </w:r>
     </w:p>
     <w:p>
-      <w:bookmarkStart w:id="20247" w:name="bm_sommaire"/>
+      <w:bookmarkStart w:id="6477" w:name="bm_sommaire"/>
       <w:pPr>
         <w:pStyle w:val="Heading1"/>
         <w:spacing w:line="360" w:lineRule="auto"/>
@@ -614,7 +621,7 @@
         </w:rPr>
         <w:t>Sommaire</w:t>
       </w:r>
-      <w:bookmarkEnd w:id="20247"/>
+      <w:bookmarkEnd w:id="6477"/>
     </w:p>
     <w:p>
       <w:pPr>
@@ -629,7 +636,7 @@
           <w:color w:val="000000"/>
           <w:sz w:val="22"/>
         </w:rPr>
-        <w:t>Le sommaire ci-dessous reprend les grands titres. Mettez à jour le champ dans Word (clic droit &gt; Mettre à jour les champs) pour afficher les numéros de pages et activer les liens.</w:t>
+        <w:t>Le sommaire ci-dessous reprend les grands titres. Mettez à jour le champ dans Word (clic droit &gt; Mettre à jour les champs) pour afficher les numéros de pages et activer les liens. Les pages préliminaires apparaissent en chiffres romains (i, ii, iii…) ; le corps du rapport en chiffres arabes (1, 2, 3…).</w:t>
       </w:r>
     </w:p>
     <w:p>
@@ -658,7 +665,7 @@
       </w:r>
     </w:p>
     <w:p>
-      <w:bookmarkStart w:id="55625" w:name="bm_sigles"/>
+      <w:bookmarkStart w:id="77989" w:name="bm_sigles"/>
       <w:pPr>
         <w:pStyle w:val="Heading1"/>
         <w:spacing w:line="360" w:lineRule="auto"/>
@@ -673,7 +680,7 @@
         </w:rPr>
         <w:t>Liste des sigles et abréviations</w:t>
       </w:r>
-      <w:bookmarkEnd w:id="55625"/>
+      <w:bookmarkEnd w:id="77989"/>
     </w:p>
     <w:p>
       <w:pPr>
@@ -985,7 +992,7 @@
       </w:r>
     </w:p>
     <w:p>
-      <w:bookmarkStart w:id="84524" w:name="bm_liste_figures"/>
+      <w:bookmarkStart w:id="3846" w:name="bm_liste_figures"/>
       <w:pPr>
         <w:pStyle w:val="Heading1"/>
         <w:spacing w:line="360" w:lineRule="auto"/>
@@ -1000,7 +1007,7 @@
         </w:rPr>
         <w:t>Liste des figures</w:t>
       </w:r>
-      <w:bookmarkEnd w:id="84524"/>
+      <w:bookmarkEnd w:id="3846"/>
     </w:p>
     <w:p>
       <w:pPr>
@@ -1044,7 +1051,7 @@
       </w:r>
     </w:p>
     <w:p>
-      <w:bookmarkStart w:id="83503" w:name="bm_liste_tableaux"/>
+      <w:bookmarkStart w:id="50810" w:name="bm_liste_tableaux"/>
       <w:pPr>
         <w:pStyle w:val="Heading1"/>
         <w:spacing w:line="360" w:lineRule="auto"/>
@@ -1059,7 +1066,7 @@
         </w:rPr>
         <w:t>Liste des tableaux</w:t>
       </w:r>
-      <w:bookmarkEnd w:id="83503"/>
+      <w:bookmarkEnd w:id="50810"/>
     </w:p>
     <w:p>
       <w:pPr>
@@ -1103,7 +1110,7 @@
       </w:r>
     </w:p>
     <w:p>
-      <w:bookmarkStart w:id="23216" w:name="bm_resume"/>
+      <w:bookmarkStart w:id="90894" w:name="bm_resume"/>
       <w:pPr>
         <w:pStyle w:val="Heading1"/>
         <w:spacing w:line="360" w:lineRule="auto"/>
@@ -1118,7 +1125,7 @@
         </w:rPr>
         <w:t>Résumé</w:t>
       </w:r>
-      <w:bookmarkEnd w:id="23216"/>
+      <w:bookmarkEnd w:id="90894"/>
     </w:p>
     <w:p>
       <w:pPr>
@@ -1160,7 +1167,7 @@
       </w:r>
     </w:p>
     <w:p>
-      <w:bookmarkStart w:id="21961" w:name="bm_abstract"/>
+      <w:bookmarkStart w:id="68317" w:name="bm_abstract"/>
       <w:pPr>
         <w:pStyle w:val="Heading1"/>
         <w:spacing w:line="360" w:lineRule="auto"/>
@@ -1175,7 +1182,7 @@
         </w:rPr>
         <w:t>Abstract</w:t>
       </w:r>
-      <w:bookmarkEnd w:id="21961"/>
+      <w:bookmarkEnd w:id="68317"/>
     </w:p>
     <w:p>
       <w:pPr>
@@ -1214,17 +1221,17 @@
     <w:p>
       <w:pPr>
         <w:sectPr>
-          <w:footerReference w:type="default" r:id="rId9"/>
+          <w:footerReference w:type="default" r:id="rId10"/>
           <w:pgSz w:w="11906" w:h="16838"/>
           <w:pgMar w:top="1417" w:right="1417" w:bottom="1417" w:left="1984" w:header="720" w:footer="720" w:gutter="0"/>
           <w:cols w:space="720"/>
-          <w:titlePg/>
           <w:docGrid w:linePitch="360"/>
+          <w:pgNumType w:fmt="lowerRoman" w:start="1"/>
         </w:sectPr>
       </w:pPr>
     </w:p>
     <w:p>
-      <w:bookmarkStart w:id="57756" w:name="bm_intro"/>
+      <w:bookmarkStart w:id="26026" w:name="bm_intro"/>
       <w:pPr>
         <w:pStyle w:val="Heading1"/>
         <w:spacing w:line="360" w:lineRule="auto"/>
@@ -1239,7 +1246,7 @@
         </w:rPr>
         <w:t>Introduction générale</w:t>
       </w:r>
-      <w:bookmarkEnd w:id="57756"/>
+      <w:bookmarkEnd w:id="26026"/>
     </w:p>
     <w:p>
       <w:pPr>
@@ -1310,7 +1317,7 @@
       </w:r>
     </w:p>
     <w:p>
-      <w:bookmarkStart w:id="12756" w:name="bm_probl"/>
+      <w:bookmarkStart w:id="63766" w:name="bm_probl"/>
       <w:pPr>
         <w:pStyle w:val="Heading1"/>
         <w:spacing w:line="360" w:lineRule="auto"/>
@@ -1325,7 +1332,7 @@
         </w:rPr>
         <w:t>Problématique</w:t>
       </w:r>
-      <w:bookmarkEnd w:id="12756"/>
+      <w:bookmarkEnd w:id="63766"/>
     </w:p>
     <w:p>
       <w:pPr>
@@ -1480,7 +1487,7 @@
       </w:r>
     </w:p>
     <w:p>
-      <w:bookmarkStart w:id="21130" w:name="bm_ch1"/>
+      <w:bookmarkStart w:id="99185" w:name="bm_ch1"/>
       <w:pPr>
         <w:pStyle w:val="Heading1"/>
         <w:spacing w:line="360" w:lineRule="auto"/>
@@ -1495,7 +1502,7 @@
         </w:rPr>
         <w:t>Chapitre 1 : Contexte et étude de l'existant</w:t>
       </w:r>
-      <w:bookmarkEnd w:id="21130"/>
+      <w:bookmarkEnd w:id="99185"/>
     </w:p>
     <w:p>
       <w:pPr>
@@ -1515,7 +1522,7 @@
       </w:r>
     </w:p>
     <w:p>
-      <w:bookmarkStart w:id="15079" w:name="bm_ch1_1"/>
+      <w:bookmarkStart w:id="54017" w:name="bm_ch1_1"/>
       <w:pPr>
         <w:pStyle w:val="Heading2"/>
         <w:spacing w:line="360" w:lineRule="auto"/>
@@ -1530,7 +1537,7 @@
         </w:rPr>
         <w:t>1.1 Contexte pédagogique et technologique</w:t>
       </w:r>
-      <w:bookmarkEnd w:id="15079"/>
+      <w:bookmarkEnd w:id="54017"/>
     </w:p>
     <w:p>
       <w:pPr>
@@ -1584,7 +1591,7 @@
       </w:r>
     </w:p>
     <w:p>
-      <w:bookmarkStart w:id="95769" w:name="bm_ch1_2"/>
+      <w:bookmarkStart w:id="569" w:name="bm_ch1_2"/>
       <w:pPr>
         <w:pStyle w:val="Heading2"/>
         <w:spacing w:line="360" w:lineRule="auto"/>
@@ -1599,7 +1606,7 @@
         </w:rPr>
         <w:t>1.2 Sous-problèmes et contraintes locales</w:t>
       </w:r>
-      <w:bookmarkEnd w:id="95769"/>
+      <w:bookmarkEnd w:id="569"/>
     </w:p>
     <w:p>
       <w:pPr>
@@ -1653,7 +1660,7 @@
       </w:r>
     </w:p>
     <w:p>
-      <w:bookmarkStart w:id="71214" w:name="bm_ch1_3"/>
+      <w:bookmarkStart w:id="85571" w:name="bm_ch1_3"/>
       <w:pPr>
         <w:pStyle w:val="Heading2"/>
         <w:spacing w:line="360" w:lineRule="auto"/>
@@ -1668,7 +1675,7 @@
         </w:rPr>
         <w:t>1.3 Examen des solutions existantes</w:t>
       </w:r>
-      <w:bookmarkEnd w:id="71214"/>
+      <w:bookmarkEnd w:id="85571"/>
     </w:p>
     <w:p>
       <w:pPr>
@@ -1757,7 +1764,8 @@
     </w:p>
     <w:p>
       <w:pPr>
-        <w:spacing w:after="80" w:line="360" w:lineRule="auto"/>
+        <w:pStyle w:val="Caption"/>
+        <w:spacing w:after="200" w:line="360" w:lineRule="auto"/>
         <w:jc w:val="left"/>
       </w:pPr>
       <w:r>
@@ -2676,7 +2684,7 @@
       </w:r>
     </w:p>
     <w:p>
-      <w:bookmarkStart w:id="55194" w:name="bm_ch1_4"/>
+      <w:bookmarkStart w:id="52404" w:name="bm_ch1_4"/>
       <w:pPr>
         <w:pStyle w:val="Heading2"/>
         <w:spacing w:line="360" w:lineRule="auto"/>
@@ -2691,7 +2699,7 @@
         </w:rPr>
         <w:t>1.4 Positionnement de Cylentic</w:t>
       </w:r>
-      <w:bookmarkEnd w:id="55194"/>
+      <w:bookmarkEnd w:id="52404"/>
     </w:p>
     <w:p>
       <w:pPr>
@@ -2728,7 +2736,7 @@
       </w:r>
     </w:p>
     <w:p>
-      <w:bookmarkStart w:id="95896" w:name="bm_ch1_5"/>
+      <w:bookmarkStart w:id="3995" w:name="bm_ch1_5"/>
       <w:pPr>
         <w:pStyle w:val="Heading2"/>
         <w:spacing w:line="360" w:lineRule="auto"/>
@@ -2743,7 +2751,7 @@
         </w:rPr>
         <w:t>1.5 Conclusion partielle</w:t>
       </w:r>
-      <w:bookmarkEnd w:id="95896"/>
+      <w:bookmarkEnd w:id="3995"/>
     </w:p>
     <w:p>
       <w:pPr>
@@ -2768,7 +2776,7 @@
       </w:r>
     </w:p>
     <w:p>
-      <w:bookmarkStart w:id="5343" w:name="bm_ch2"/>
+      <w:bookmarkStart w:id="7443" w:name="bm_ch2"/>
       <w:pPr>
         <w:pStyle w:val="Heading1"/>
         <w:spacing w:line="360" w:lineRule="auto"/>
@@ -2783,10 +2791,10 @@
         </w:rPr>
         <w:t>Chapitre 2 : Analyse des besoins et spécification du système</w:t>
       </w:r>
-      <w:bookmarkEnd w:id="5343"/>
-    </w:p>
-    <w:p>
-      <w:bookmarkStart w:id="36647" w:name="bm_ch2_1"/>
+      <w:bookmarkEnd w:id="7443"/>
+    </w:p>
+    <w:p>
+      <w:bookmarkStart w:id="8609" w:name="bm_ch2_1"/>
       <w:pPr>
         <w:pStyle w:val="Heading2"/>
         <w:spacing w:line="360" w:lineRule="auto"/>
@@ -2801,7 +2809,7 @@
         </w:rPr>
         <w:t>2.1 Périmètre du projet et du MVP</w:t>
       </w:r>
-      <w:bookmarkEnd w:id="36647"/>
+      <w:bookmarkEnd w:id="8609"/>
     </w:p>
     <w:p>
       <w:pPr>
@@ -2855,7 +2863,7 @@
       </w:r>
     </w:p>
     <w:p>
-      <w:bookmarkStart w:id="57816" w:name="bm_ch2_2"/>
+      <w:bookmarkStart w:id="911" w:name="bm_ch2_2"/>
       <w:pPr>
         <w:pStyle w:val="Heading2"/>
         <w:spacing w:line="360" w:lineRule="auto"/>
@@ -2870,7 +2878,7 @@
         </w:rPr>
         <w:t>2.2 Identification des acteurs</w:t>
       </w:r>
-      <w:bookmarkEnd w:id="57816"/>
+      <w:bookmarkEnd w:id="911"/>
     </w:p>
     <w:p>
       <w:pPr>
@@ -2992,6 +3000,9 @@
       </w:r>
     </w:p>
     <w:p>
+      <w:pPr>
+        <w:pStyle w:val="Caption"/>
+      </w:pPr>
       <w:r>
         <w:rPr>
           <w:rFonts w:ascii="Times New Roman" w:hAnsi="Times New Roman" w:eastAsia="Times New Roman"/>
@@ -3000,7 +3011,31 @@
           <w:color w:val="000000"/>
           <w:sz w:val="22"/>
         </w:rPr>
-        <w:t>Tableau : Correspondance entre acteurs et responsabilités</w:t>
+        <w:t xml:space="preserve">Tableau </w:t>
+      </w:r>
+      <w:r>
+        <w:rPr>
+          <w:rFonts w:ascii="Times New Roman" w:hAnsi="Times New Roman" w:eastAsia="Times New Roman"/>
+          <w:b/>
+          <w:i w:val="0"/>
+          <w:color w:val="000000"/>
+          <w:sz w:val="22"/>
+        </w:rPr>
+        <w:fldChar w:fldCharType="begin"/>
+        <w:instrText xml:space="preserve">SEQ Tableau \* ARABIC</w:instrText>
+        <w:fldChar w:fldCharType="separate"/>
+        <w:t>2</w:t>
+        <w:fldChar w:fldCharType="end"/>
+      </w:r>
+      <w:r>
+        <w:rPr>
+          <w:rFonts w:ascii="Times New Roman" w:hAnsi="Times New Roman" w:eastAsia="Times New Roman"/>
+          <w:b/>
+          <w:i w:val="0"/>
+          <w:color w:val="000000"/>
+          <w:sz w:val="22"/>
+        </w:rPr>
+        <w:t xml:space="preserve"> : Correspondance entre acteurs et responsabilités</w:t>
       </w:r>
     </w:p>
     <w:tbl>
@@ -3207,7 +3242,7 @@
       </w:r>
     </w:p>
     <w:p>
-      <w:bookmarkStart w:id="74395" w:name="bm_ch2_3"/>
+      <w:bookmarkStart w:id="35085" w:name="bm_ch2_3"/>
       <w:pPr>
         <w:pStyle w:val="Heading2"/>
         <w:spacing w:line="360" w:lineRule="auto"/>
@@ -3222,7 +3257,7 @@
         </w:rPr>
         <w:t>2.3 Besoins fonctionnels</w:t>
       </w:r>
-      <w:bookmarkEnd w:id="74395"/>
+      <w:bookmarkEnd w:id="35085"/>
     </w:p>
     <w:p>
       <w:pPr>
@@ -3327,7 +3362,7 @@
       </w:r>
     </w:p>
     <w:p>
-      <w:bookmarkStart w:id="14086" w:name="bm_ch2_4"/>
+      <w:bookmarkStart w:id="19544" w:name="bm_ch2_4"/>
       <w:pPr>
         <w:pStyle w:val="Heading2"/>
         <w:spacing w:line="360" w:lineRule="auto"/>
@@ -3342,7 +3377,7 @@
         </w:rPr>
         <w:t>2.4 Besoins non fonctionnels</w:t>
       </w:r>
-      <w:bookmarkEnd w:id="14086"/>
+      <w:bookmarkEnd w:id="19544"/>
     </w:p>
     <w:p>
       <w:pPr>
@@ -3379,7 +3414,7 @@
       </w:r>
     </w:p>
     <w:p>
-      <w:bookmarkStart w:id="24726" w:name="bm_ch2_5"/>
+      <w:bookmarkStart w:id="24374" w:name="bm_ch2_5"/>
       <w:pPr>
         <w:pStyle w:val="Heading2"/>
         <w:spacing w:line="360" w:lineRule="auto"/>
@@ -3394,7 +3429,7 @@
         </w:rPr>
         <w:t>2.5 Règles métier structurantes</w:t>
       </w:r>
-      <w:bookmarkEnd w:id="24726"/>
+      <w:bookmarkEnd w:id="24374"/>
     </w:p>
     <w:p>
       <w:pPr>
@@ -3414,7 +3449,7 @@
       </w:r>
     </w:p>
     <w:p>
-      <w:bookmarkStart w:id="20985" w:name="bm_ch2_6"/>
+      <w:bookmarkStart w:id="66572" w:name="bm_ch2_6"/>
       <w:pPr>
         <w:pStyle w:val="Heading2"/>
         <w:spacing w:line="360" w:lineRule="auto"/>
@@ -3429,7 +3464,7 @@
         </w:rPr>
         <w:t>2.6 Scénarios d'usage prioritaires</w:t>
       </w:r>
-      <w:bookmarkEnd w:id="20985"/>
+      <w:bookmarkEnd w:id="66572"/>
     </w:p>
     <w:p>
       <w:pPr>
@@ -3449,7 +3484,7 @@
       </w:r>
     </w:p>
     <w:p>
-      <w:bookmarkStart w:id="76208" w:name="bm_ch2_7"/>
+      <w:bookmarkStart w:id="63664" w:name="bm_ch2_7"/>
       <w:pPr>
         <w:pStyle w:val="Heading2"/>
         <w:spacing w:line="360" w:lineRule="auto"/>
@@ -3464,7 +3499,7 @@
         </w:rPr>
         <w:t>2.7 Conclusion partielle</w:t>
       </w:r>
-      <w:bookmarkEnd w:id="76208"/>
+      <w:bookmarkEnd w:id="63664"/>
     </w:p>
     <w:p>
       <w:pPr>
@@ -3489,7 +3524,7 @@
       </w:r>
     </w:p>
     <w:p>
-      <w:bookmarkStart w:id="24717" w:name="bm_ch3"/>
+      <w:bookmarkStart w:id="20670" w:name="bm_ch3"/>
       <w:pPr>
         <w:pStyle w:val="Heading1"/>
         <w:spacing w:line="360" w:lineRule="auto"/>
@@ -3504,10 +3539,10 @@
         </w:rPr>
         <w:t>Chapitre 3 : Conception du système Cylentic</w:t>
       </w:r>
-      <w:bookmarkEnd w:id="24717"/>
-    </w:p>
-    <w:p>
-      <w:bookmarkStart w:id="20667" w:name="bm_ch3_1"/>
+      <w:bookmarkEnd w:id="20670"/>
+    </w:p>
+    <w:p>
+      <w:bookmarkStart w:id="75154" w:name="bm_ch3_1"/>
       <w:pPr>
         <w:pStyle w:val="Heading2"/>
         <w:spacing w:line="360" w:lineRule="auto"/>
@@ -3522,7 +3557,7 @@
         </w:rPr>
         <w:t>3.1 Démarche de conception</w:t>
       </w:r>
-      <w:bookmarkEnd w:id="20667"/>
+      <w:bookmarkEnd w:id="75154"/>
     </w:p>
     <w:p>
       <w:pPr>
@@ -3592,7 +3627,7 @@
       </w:r>
     </w:p>
     <w:p>
-      <w:bookmarkStart w:id="68775" w:name="bm_ch3_2"/>
+      <w:bookmarkStart w:id="7053" w:name="bm_ch3_2"/>
       <w:pPr>
         <w:pStyle w:val="Heading2"/>
         <w:spacing w:line="360" w:lineRule="auto"/>
@@ -3607,7 +3642,7 @@
         </w:rPr>
         <w:t>3.2 Architecture générale et déploiement</w:t>
       </w:r>
-      <w:bookmarkEnd w:id="68775"/>
+      <w:bookmarkEnd w:id="7053"/>
     </w:p>
     <w:p>
       <w:pPr>
@@ -3668,6 +3703,7 @@
     </w:p>
     <w:p>
       <w:pPr>
+        <w:pStyle w:val="Caption"/>
         <w:spacing w:after="200" w:line="360" w:lineRule="auto"/>
         <w:jc w:val="center"/>
       </w:pPr>
@@ -3731,6 +3767,7 @@
     </w:p>
     <w:p>
       <w:pPr>
+        <w:pStyle w:val="Caption"/>
         <w:spacing w:after="200" w:line="360" w:lineRule="auto"/>
         <w:jc w:val="center"/>
       </w:pPr>
@@ -3755,7 +3792,7 @@
         <w:fldChar w:fldCharType="begin"/>
         <w:instrText xml:space="preserve">SEQ Figure \* ARABIC</w:instrText>
         <w:fldChar w:fldCharType="separate"/>
-        <w:t>1</w:t>
+        <w:t>2</w:t>
         <w:fldChar w:fldCharType="end"/>
       </w:r>
       <w:r>
@@ -3770,7 +3807,7 @@
       </w:r>
     </w:p>
     <w:p>
-      <w:bookmarkStart w:id="34159" w:name="bm_ch3_3"/>
+      <w:bookmarkStart w:id="69514" w:name="bm_ch3_3"/>
       <w:pPr>
         <w:pStyle w:val="Heading2"/>
         <w:spacing w:line="360" w:lineRule="auto"/>
@@ -3785,7 +3822,7 @@
         </w:rPr>
         <w:t>3.3 Vue des cas d'utilisation</w:t>
       </w:r>
-      <w:bookmarkEnd w:id="34159"/>
+      <w:bookmarkEnd w:id="69514"/>
     </w:p>
     <w:p>
       <w:pPr>
@@ -3829,6 +3866,7 @@
     </w:p>
     <w:p>
       <w:pPr>
+        <w:pStyle w:val="Caption"/>
         <w:spacing w:after="200" w:line="360" w:lineRule="auto"/>
         <w:jc w:val="center"/>
       </w:pPr>
@@ -3853,7 +3891,7 @@
         <w:fldChar w:fldCharType="begin"/>
         <w:instrText xml:space="preserve">SEQ Figure \* ARABIC</w:instrText>
         <w:fldChar w:fldCharType="separate"/>
-        <w:t>1</w:t>
+        <w:t>3</w:t>
         <w:fldChar w:fldCharType="end"/>
       </w:r>
       <w:r>
@@ -3892,6 +3930,7 @@
     </w:p>
     <w:p>
       <w:pPr>
+        <w:pStyle w:val="Caption"/>
         <w:spacing w:after="200" w:line="360" w:lineRule="auto"/>
         <w:jc w:val="center"/>
       </w:pPr>
@@ -3916,7 +3955,7 @@
         <w:fldChar w:fldCharType="begin"/>
         <w:instrText xml:space="preserve">SEQ Figure \* ARABIC</w:instrText>
         <w:fldChar w:fldCharType="separate"/>
-        <w:t>1</w:t>
+        <w:t>4</w:t>
         <w:fldChar w:fldCharType="end"/>
       </w:r>
       <w:r>
@@ -3938,6 +3977,7 @@
     </w:p>
     <w:p>
       <w:pPr>
+        <w:pStyle w:val="Caption"/>
         <w:spacing w:after="200" w:line="360" w:lineRule="auto"/>
         <w:jc w:val="center"/>
       </w:pPr>
@@ -3962,7 +4002,7 @@
         <w:fldChar w:fldCharType="begin"/>
         <w:instrText xml:space="preserve">SEQ Figure \* ARABIC</w:instrText>
         <w:fldChar w:fldCharType="separate"/>
-        <w:t>1</w:t>
+        <w:t>5</w:t>
         <w:fldChar w:fldCharType="end"/>
       </w:r>
       <w:r>
@@ -4001,6 +4041,7 @@
     </w:p>
     <w:p>
       <w:pPr>
+        <w:pStyle w:val="Caption"/>
         <w:spacing w:after="200" w:line="360" w:lineRule="auto"/>
         <w:jc w:val="center"/>
       </w:pPr>
@@ -4025,7 +4066,7 @@
         <w:fldChar w:fldCharType="begin"/>
         <w:instrText xml:space="preserve">SEQ Figure \* ARABIC</w:instrText>
         <w:fldChar w:fldCharType="separate"/>
-        <w:t>1</w:t>
+        <w:t>6</w:t>
         <w:fldChar w:fldCharType="end"/>
       </w:r>
       <w:r>
@@ -4047,6 +4088,7 @@
     </w:p>
     <w:p>
       <w:pPr>
+        <w:pStyle w:val="Caption"/>
         <w:spacing w:after="200" w:line="360" w:lineRule="auto"/>
         <w:jc w:val="center"/>
       </w:pPr>
@@ -4071,7 +4113,7 @@
         <w:fldChar w:fldCharType="begin"/>
         <w:instrText xml:space="preserve">SEQ Figure \* ARABIC</w:instrText>
         <w:fldChar w:fldCharType="separate"/>
-        <w:t>1</w:t>
+        <w:t>7</w:t>
         <w:fldChar w:fldCharType="end"/>
       </w:r>
       <w:r>
@@ -4110,6 +4152,7 @@
     </w:p>
     <w:p>
       <w:pPr>
+        <w:pStyle w:val="Caption"/>
         <w:spacing w:after="200" w:line="360" w:lineRule="auto"/>
         <w:jc w:val="center"/>
       </w:pPr>
@@ -4134,7 +4177,7 @@
         <w:fldChar w:fldCharType="begin"/>
         <w:instrText xml:space="preserve">SEQ Figure \* ARABIC</w:instrText>
         <w:fldChar w:fldCharType="separate"/>
-        <w:t>1</w:t>
+        <w:t>8</w:t>
         <w:fldChar w:fldCharType="end"/>
       </w:r>
       <w:r>
@@ -4149,7 +4192,7 @@
       </w:r>
     </w:p>
     <w:p>
-      <w:bookmarkStart w:id="67923" w:name="bm_ch3_4"/>
+      <w:bookmarkStart w:id="69533" w:name="bm_ch3_4"/>
       <w:pPr>
         <w:pStyle w:val="Heading2"/>
         <w:spacing w:line="360" w:lineRule="auto"/>
@@ -4164,7 +4207,7 @@
         </w:rPr>
         <w:t>3.4 Structure statique : classes et objets</w:t>
       </w:r>
-      <w:bookmarkEnd w:id="67923"/>
+      <w:bookmarkEnd w:id="69533"/>
     </w:p>
     <w:p>
       <w:pPr>
@@ -4208,6 +4251,7 @@
     </w:p>
     <w:p>
       <w:pPr>
+        <w:pStyle w:val="Caption"/>
         <w:spacing w:after="200" w:line="360" w:lineRule="auto"/>
         <w:jc w:val="center"/>
       </w:pPr>
@@ -4232,7 +4276,7 @@
         <w:fldChar w:fldCharType="begin"/>
         <w:instrText xml:space="preserve">SEQ Figure \* ARABIC</w:instrText>
         <w:fldChar w:fldCharType="separate"/>
-        <w:t>1</w:t>
+        <w:t>9</w:t>
         <w:fldChar w:fldCharType="end"/>
       </w:r>
       <w:r>
@@ -4254,6 +4298,7 @@
     </w:p>
     <w:p>
       <w:pPr>
+        <w:pStyle w:val="Caption"/>
         <w:spacing w:after="200" w:line="360" w:lineRule="auto"/>
         <w:jc w:val="center"/>
       </w:pPr>
@@ -4278,7 +4323,7 @@
         <w:fldChar w:fldCharType="begin"/>
         <w:instrText xml:space="preserve">SEQ Figure \* ARABIC</w:instrText>
         <w:fldChar w:fldCharType="separate"/>
-        <w:t>1</w:t>
+        <w:t>10</w:t>
         <w:fldChar w:fldCharType="end"/>
       </w:r>
       <w:r>
@@ -4300,6 +4345,7 @@
     </w:p>
     <w:p>
       <w:pPr>
+        <w:pStyle w:val="Caption"/>
         <w:spacing w:after="200" w:line="360" w:lineRule="auto"/>
         <w:jc w:val="center"/>
       </w:pPr>
@@ -4324,7 +4370,7 @@
         <w:fldChar w:fldCharType="begin"/>
         <w:instrText xml:space="preserve">SEQ Figure \* ARABIC</w:instrText>
         <w:fldChar w:fldCharType="separate"/>
-        <w:t>1</w:t>
+        <w:t>11</w:t>
         <w:fldChar w:fldCharType="end"/>
       </w:r>
       <w:r>
@@ -4363,6 +4409,7 @@
     </w:p>
     <w:p>
       <w:pPr>
+        <w:pStyle w:val="Caption"/>
         <w:spacing w:after="200" w:line="360" w:lineRule="auto"/>
         <w:jc w:val="center"/>
       </w:pPr>
@@ -4387,7 +4434,7 @@
         <w:fldChar w:fldCharType="begin"/>
         <w:instrText xml:space="preserve">SEQ Figure \* ARABIC</w:instrText>
         <w:fldChar w:fldCharType="separate"/>
-        <w:t>1</w:t>
+        <w:t>12</w:t>
         <w:fldChar w:fldCharType="end"/>
       </w:r>
       <w:r>
@@ -4409,6 +4456,7 @@
     </w:p>
     <w:p>
       <w:pPr>
+        <w:pStyle w:val="Caption"/>
         <w:spacing w:after="200" w:line="360" w:lineRule="auto"/>
         <w:jc w:val="center"/>
       </w:pPr>
@@ -4433,7 +4481,7 @@
         <w:fldChar w:fldCharType="begin"/>
         <w:instrText xml:space="preserve">SEQ Figure \* ARABIC</w:instrText>
         <w:fldChar w:fldCharType="separate"/>
-        <w:t>1</w:t>
+        <w:t>13</w:t>
         <w:fldChar w:fldCharType="end"/>
       </w:r>
       <w:r>
@@ -4455,6 +4503,7 @@
     </w:p>
     <w:p>
       <w:pPr>
+        <w:pStyle w:val="Caption"/>
         <w:spacing w:after="200" w:line="360" w:lineRule="auto"/>
         <w:jc w:val="center"/>
       </w:pPr>
@@ -4479,7 +4528,7 @@
         <w:fldChar w:fldCharType="begin"/>
         <w:instrText xml:space="preserve">SEQ Figure \* ARABIC</w:instrText>
         <w:fldChar w:fldCharType="separate"/>
-        <w:t>1</w:t>
+        <w:t>14</w:t>
         <w:fldChar w:fldCharType="end"/>
       </w:r>
       <w:r>
@@ -4494,7 +4543,7 @@
       </w:r>
     </w:p>
     <w:p>
-      <w:bookmarkStart w:id="19744" w:name="bm_ch3_5"/>
+      <w:bookmarkStart w:id="36789" w:name="bm_ch3_5"/>
       <w:pPr>
         <w:pStyle w:val="Heading2"/>
         <w:spacing w:line="360" w:lineRule="auto"/>
@@ -4509,7 +4558,7 @@
         </w:rPr>
         <w:t>3.5 Organisation en composants</w:t>
       </w:r>
-      <w:bookmarkEnd w:id="19744"/>
+      <w:bookmarkEnd w:id="36789"/>
     </w:p>
     <w:p>
       <w:pPr>
@@ -4536,6 +4585,7 @@
     </w:p>
     <w:p>
       <w:pPr>
+        <w:pStyle w:val="Caption"/>
         <w:spacing w:after="200" w:line="360" w:lineRule="auto"/>
         <w:jc w:val="center"/>
       </w:pPr>
@@ -4560,7 +4610,7 @@
         <w:fldChar w:fldCharType="begin"/>
         <w:instrText xml:space="preserve">SEQ Figure \* ARABIC</w:instrText>
         <w:fldChar w:fldCharType="separate"/>
-        <w:t>1</w:t>
+        <w:t>15</w:t>
         <w:fldChar w:fldCharType="end"/>
       </w:r>
       <w:r>
@@ -4582,6 +4632,7 @@
     </w:p>
     <w:p>
       <w:pPr>
+        <w:pStyle w:val="Caption"/>
         <w:spacing w:after="200" w:line="360" w:lineRule="auto"/>
         <w:jc w:val="center"/>
       </w:pPr>
@@ -4606,7 +4657,7 @@
         <w:fldChar w:fldCharType="begin"/>
         <w:instrText xml:space="preserve">SEQ Figure \* ARABIC</w:instrText>
         <w:fldChar w:fldCharType="separate"/>
-        <w:t>1</w:t>
+        <w:t>16</w:t>
         <w:fldChar w:fldCharType="end"/>
       </w:r>
       <w:r>
@@ -4628,6 +4679,7 @@
     </w:p>
     <w:p>
       <w:pPr>
+        <w:pStyle w:val="Caption"/>
         <w:spacing w:after="200" w:line="360" w:lineRule="auto"/>
         <w:jc w:val="center"/>
       </w:pPr>
@@ -4652,7 +4704,7 @@
         <w:fldChar w:fldCharType="begin"/>
         <w:instrText xml:space="preserve">SEQ Figure \* ARABIC</w:instrText>
         <w:fldChar w:fldCharType="separate"/>
-        <w:t>1</w:t>
+        <w:t>17</w:t>
         <w:fldChar w:fldCharType="end"/>
       </w:r>
       <w:r>
@@ -4684,7 +4736,7 @@
       </w:r>
     </w:p>
     <w:p>
-      <w:bookmarkStart w:id="35311" w:name="bm_ch3_6"/>
+      <w:bookmarkStart w:id="7856" w:name="bm_ch3_6"/>
       <w:pPr>
         <w:pStyle w:val="Heading2"/>
         <w:spacing w:line="360" w:lineRule="auto"/>
@@ -4699,10 +4751,10 @@
         </w:rPr>
         <w:t>3.6 Dynamique du système</w:t>
       </w:r>
-      <w:bookmarkEnd w:id="35311"/>
-    </w:p>
-    <w:p>
-      <w:bookmarkStart w:id="5635" w:name="3_6_1_Cycle_de_vie_d_un_examen"/>
+      <w:bookmarkEnd w:id="7856"/>
+    </w:p>
+    <w:p>
+      <w:bookmarkStart w:id="37078" w:name="3_6_1_Cycle_de_vie_d_un_examen"/>
       <w:pPr>
         <w:pStyle w:val="Heading3"/>
         <w:spacing w:line="360" w:lineRule="auto"/>
@@ -4717,7 +4769,7 @@
         </w:rPr>
         <w:t>3.6.1 Cycle de vie d'un examen</w:t>
       </w:r>
-      <w:bookmarkEnd w:id="5635"/>
+      <w:bookmarkEnd w:id="37078"/>
     </w:p>
     <w:p>
       <w:pPr>
@@ -4744,6 +4796,7 @@
     </w:p>
     <w:p>
       <w:pPr>
+        <w:pStyle w:val="Caption"/>
         <w:spacing w:after="200" w:line="360" w:lineRule="auto"/>
         <w:jc w:val="center"/>
       </w:pPr>
@@ -4768,7 +4821,7 @@
         <w:fldChar w:fldCharType="begin"/>
         <w:instrText xml:space="preserve">SEQ Figure \* ARABIC</w:instrText>
         <w:fldChar w:fldCharType="separate"/>
-        <w:t>1</w:t>
+        <w:t>18</w:t>
         <w:fldChar w:fldCharType="end"/>
       </w:r>
       <w:r>
@@ -4783,7 +4836,7 @@
       </w:r>
     </w:p>
     <w:p>
-      <w:bookmarkStart w:id="91898" w:name="3_6_2_Interactions_principales"/>
+      <w:bookmarkStart w:id="7010" w:name="3_6_2_Interactions_principales"/>
       <w:pPr>
         <w:pStyle w:val="Heading3"/>
         <w:spacing w:line="360" w:lineRule="auto"/>
@@ -4798,7 +4851,7 @@
         </w:rPr>
         <w:t>3.6.2 Interactions principales</w:t>
       </w:r>
-      <w:bookmarkEnd w:id="91898"/>
+      <w:bookmarkEnd w:id="7010"/>
     </w:p>
     <w:p>
       <w:pPr>
@@ -4825,6 +4878,7 @@
     </w:p>
     <w:p>
       <w:pPr>
+        <w:pStyle w:val="Caption"/>
         <w:spacing w:after="200" w:line="360" w:lineRule="auto"/>
         <w:jc w:val="center"/>
       </w:pPr>
@@ -4849,7 +4903,7 @@
         <w:fldChar w:fldCharType="begin"/>
         <w:instrText xml:space="preserve">SEQ Figure \* ARABIC</w:instrText>
         <w:fldChar w:fldCharType="separate"/>
-        <w:t>1</w:t>
+        <w:t>19</w:t>
         <w:fldChar w:fldCharType="end"/>
       </w:r>
       <w:r>
@@ -4888,6 +4942,7 @@
     </w:p>
     <w:p>
       <w:pPr>
+        <w:pStyle w:val="Caption"/>
         <w:spacing w:after="200" w:line="360" w:lineRule="auto"/>
         <w:jc w:val="center"/>
       </w:pPr>
@@ -4912,7 +4967,7 @@
         <w:fldChar w:fldCharType="begin"/>
         <w:instrText xml:space="preserve">SEQ Figure \* ARABIC</w:instrText>
         <w:fldChar w:fldCharType="separate"/>
-        <w:t>1</w:t>
+        <w:t>20</w:t>
         <w:fldChar w:fldCharType="end"/>
       </w:r>
       <w:r>
@@ -4951,6 +5006,7 @@
     </w:p>
     <w:p>
       <w:pPr>
+        <w:pStyle w:val="Caption"/>
         <w:spacing w:after="200" w:line="360" w:lineRule="auto"/>
         <w:jc w:val="center"/>
       </w:pPr>
@@ -4975,7 +5031,7 @@
         <w:fldChar w:fldCharType="begin"/>
         <w:instrText xml:space="preserve">SEQ Figure \* ARABIC</w:instrText>
         <w:fldChar w:fldCharType="separate"/>
-        <w:t>1</w:t>
+        <w:t>21</w:t>
         <w:fldChar w:fldCharType="end"/>
       </w:r>
       <w:r>
@@ -5014,6 +5070,7 @@
     </w:p>
     <w:p>
       <w:pPr>
+        <w:pStyle w:val="Caption"/>
         <w:spacing w:after="200" w:line="360" w:lineRule="auto"/>
         <w:jc w:val="center"/>
       </w:pPr>
@@ -5038,7 +5095,7 @@
         <w:fldChar w:fldCharType="begin"/>
         <w:instrText xml:space="preserve">SEQ Figure \* ARABIC</w:instrText>
         <w:fldChar w:fldCharType="separate"/>
-        <w:t>1</w:t>
+        <w:t>22</w:t>
         <w:fldChar w:fldCharType="end"/>
       </w:r>
       <w:r>
@@ -5077,6 +5134,7 @@
     </w:p>
     <w:p>
       <w:pPr>
+        <w:pStyle w:val="Caption"/>
         <w:spacing w:after="200" w:line="360" w:lineRule="auto"/>
         <w:jc w:val="center"/>
       </w:pPr>
@@ -5101,7 +5159,7 @@
         <w:fldChar w:fldCharType="begin"/>
         <w:instrText xml:space="preserve">SEQ Figure \* ARABIC</w:instrText>
         <w:fldChar w:fldCharType="separate"/>
-        <w:t>1</w:t>
+        <w:t>23</w:t>
         <w:fldChar w:fldCharType="end"/>
       </w:r>
       <w:r>
@@ -5140,6 +5198,7 @@
     </w:p>
     <w:p>
       <w:pPr>
+        <w:pStyle w:val="Caption"/>
         <w:spacing w:after="200" w:line="360" w:lineRule="auto"/>
         <w:jc w:val="center"/>
       </w:pPr>
@@ -5164,7 +5223,7 @@
         <w:fldChar w:fldCharType="begin"/>
         <w:instrText xml:space="preserve">SEQ Figure \* ARABIC</w:instrText>
         <w:fldChar w:fldCharType="separate"/>
-        <w:t>1</w:t>
+        <w:t>24</w:t>
         <w:fldChar w:fldCharType="end"/>
       </w:r>
       <w:r>
@@ -5179,7 +5238,7 @@
       </w:r>
     </w:p>
     <w:p>
-      <w:bookmarkStart w:id="21230" w:name="3_6_3_Parcours_d_activit__de_l__tudiant"/>
+      <w:bookmarkStart w:id="73550" w:name="3_6_3_Parcours_d_activit__de_l__tudiant"/>
       <w:pPr>
         <w:pStyle w:val="Heading3"/>
         <w:spacing w:line="360" w:lineRule="auto"/>
@@ -5194,7 +5253,7 @@
         </w:rPr>
         <w:t>3.6.3 Parcours d'activité de l'étudiant</w:t>
       </w:r>
-      <w:bookmarkEnd w:id="21230"/>
+      <w:bookmarkEnd w:id="73550"/>
     </w:p>
     <w:p>
       <w:pPr>
@@ -5221,6 +5280,7 @@
     </w:p>
     <w:p>
       <w:pPr>
+        <w:pStyle w:val="Caption"/>
         <w:spacing w:after="200" w:line="360" w:lineRule="auto"/>
         <w:jc w:val="center"/>
       </w:pPr>
@@ -5245,7 +5305,7 @@
         <w:fldChar w:fldCharType="begin"/>
         <w:instrText xml:space="preserve">SEQ Figure \* ARABIC</w:instrText>
         <w:fldChar w:fldCharType="separate"/>
-        <w:t>1</w:t>
+        <w:t>25</w:t>
         <w:fldChar w:fldCharType="end"/>
       </w:r>
       <w:r>
@@ -5267,6 +5327,7 @@
     </w:p>
     <w:p>
       <w:pPr>
+        <w:pStyle w:val="Caption"/>
         <w:spacing w:after="200" w:line="360" w:lineRule="auto"/>
         <w:jc w:val="center"/>
       </w:pPr>
@@ -5291,7 +5352,7 @@
         <w:fldChar w:fldCharType="begin"/>
         <w:instrText xml:space="preserve">SEQ Figure \* ARABIC</w:instrText>
         <w:fldChar w:fldCharType="separate"/>
-        <w:t>1</w:t>
+        <w:t>26</w:t>
         <w:fldChar w:fldCharType="end"/>
       </w:r>
       <w:r>
@@ -5306,7 +5367,7 @@
       </w:r>
     </w:p>
     <w:p>
-      <w:bookmarkStart w:id="35605" w:name="bm_ch3_7"/>
+      <w:bookmarkStart w:id="75217" w:name="bm_ch3_7"/>
       <w:pPr>
         <w:pStyle w:val="Heading2"/>
         <w:spacing w:line="360" w:lineRule="auto"/>
@@ -5321,7 +5382,7 @@
         </w:rPr>
         <w:t>3.7 Conception des données</w:t>
       </w:r>
-      <w:bookmarkEnd w:id="35605"/>
+      <w:bookmarkEnd w:id="75217"/>
     </w:p>
     <w:p>
       <w:pPr>
@@ -5375,6 +5436,9 @@
       </w:r>
     </w:p>
     <w:p>
+      <w:pPr>
+        <w:pStyle w:val="Caption"/>
+      </w:pPr>
       <w:r>
         <w:rPr>
           <w:rFonts w:ascii="Times New Roman" w:hAnsi="Times New Roman" w:eastAsia="Times New Roman"/>
@@ -5383,7 +5447,31 @@
           <w:color w:val="000000"/>
           <w:sz w:val="22"/>
         </w:rPr>
-        <w:t>Tableau : Principales tables persistantes et rôle</w:t>
+        <w:t xml:space="preserve">Tableau </w:t>
+      </w:r>
+      <w:r>
+        <w:rPr>
+          <w:rFonts w:ascii="Times New Roman" w:hAnsi="Times New Roman" w:eastAsia="Times New Roman"/>
+          <w:b/>
+          <w:i w:val="0"/>
+          <w:color w:val="000000"/>
+          <w:sz w:val="22"/>
+        </w:rPr>
+        <w:fldChar w:fldCharType="begin"/>
+        <w:instrText xml:space="preserve">SEQ Tableau \* ARABIC</w:instrText>
+        <w:fldChar w:fldCharType="separate"/>
+        <w:t>3</w:t>
+        <w:fldChar w:fldCharType="end"/>
+      </w:r>
+      <w:r>
+        <w:rPr>
+          <w:rFonts w:ascii="Times New Roman" w:hAnsi="Times New Roman" w:eastAsia="Times New Roman"/>
+          <w:b/>
+          <w:i w:val="0"/>
+          <w:color w:val="000000"/>
+          <w:sz w:val="22"/>
+        </w:rPr>
+        <w:t xml:space="preserve"> : Principales tables persistantes et rôle</w:t>
       </w:r>
     </w:p>
     <w:tbl>
@@ -5734,7 +5822,7 @@
       </w:r>
     </w:p>
     <w:p>
-      <w:bookmarkStart w:id="92393" w:name="bm_ch3_8"/>
+      <w:bookmarkStart w:id="13200" w:name="bm_ch3_8"/>
       <w:pPr>
         <w:pStyle w:val="Heading2"/>
         <w:spacing w:line="360" w:lineRule="auto"/>
@@ -5749,7 +5837,7 @@
         </w:rPr>
         <w:t>3.8 Conception de la sécurité de passation</w:t>
       </w:r>
-      <w:bookmarkEnd w:id="92393"/>
+      <w:bookmarkEnd w:id="13200"/>
     </w:p>
     <w:p>
       <w:pPr>
@@ -5837,7 +5925,7 @@
       </w:r>
     </w:p>
     <w:p>
-      <w:bookmarkStart w:id="86527" w:name="bm_ch3_9"/>
+      <w:bookmarkStart w:id="47437" w:name="bm_ch3_9"/>
       <w:pPr>
         <w:pStyle w:val="Heading2"/>
         <w:spacing w:line="360" w:lineRule="auto"/>
@@ -5852,7 +5940,7 @@
         </w:rPr>
         <w:t>3.9 Conception de la correction automatique</w:t>
       </w:r>
-      <w:bookmarkEnd w:id="86527"/>
+      <w:bookmarkEnd w:id="47437"/>
     </w:p>
     <w:p>
       <w:pPr>
@@ -5906,7 +5994,7 @@
       </w:r>
     </w:p>
     <w:p>
-      <w:bookmarkStart w:id="92370" w:name="bm_ch3_10"/>
+      <w:bookmarkStart w:id="59776" w:name="bm_ch3_10"/>
       <w:pPr>
         <w:pStyle w:val="Heading2"/>
         <w:spacing w:line="360" w:lineRule="auto"/>
@@ -5921,7 +6009,7 @@
         </w:rPr>
         <w:t>3.10 Conclusion partielle</w:t>
       </w:r>
-      <w:bookmarkEnd w:id="92370"/>
+      <w:bookmarkEnd w:id="59776"/>
     </w:p>
     <w:p>
       <w:pPr>
@@ -5946,7 +6034,7 @@
       </w:r>
     </w:p>
     <w:p>
-      <w:bookmarkStart w:id="92667" w:name="bm_ch4"/>
+      <w:bookmarkStart w:id="27316" w:name="bm_ch4"/>
       <w:pPr>
         <w:pStyle w:val="Heading1"/>
         <w:spacing w:line="360" w:lineRule="auto"/>
@@ -5961,10 +6049,10 @@
         </w:rPr>
         <w:t>Chapitre 4 : Réalisation et mise en œuvre</w:t>
       </w:r>
-      <w:bookmarkEnd w:id="92667"/>
-    </w:p>
-    <w:p>
-      <w:bookmarkStart w:id="62006" w:name="bm_ch4_1"/>
+      <w:bookmarkEnd w:id="27316"/>
+    </w:p>
+    <w:p>
+      <w:bookmarkStart w:id="1074" w:name="bm_ch4_1"/>
       <w:pPr>
         <w:pStyle w:val="Heading2"/>
         <w:spacing w:line="360" w:lineRule="auto"/>
@@ -5979,7 +6067,7 @@
         </w:rPr>
         <w:t>4.1 Environnement de travail</w:t>
       </w:r>
-      <w:bookmarkEnd w:id="62006"/>
+      <w:bookmarkEnd w:id="1074"/>
     </w:p>
     <w:p>
       <w:pPr>
@@ -6016,7 +6104,7 @@
       </w:r>
     </w:p>
     <w:p>
-      <w:bookmarkStart w:id="54661" w:name="bm_ch4_2"/>
+      <w:bookmarkStart w:id="28107" w:name="bm_ch4_2"/>
       <w:pPr>
         <w:pStyle w:val="Heading2"/>
         <w:spacing w:line="360" w:lineRule="auto"/>
@@ -6031,7 +6119,7 @@
         </w:rPr>
         <w:t>4.2 Choix technologiques</w:t>
       </w:r>
-      <w:bookmarkEnd w:id="54661"/>
+      <w:bookmarkEnd w:id="28107"/>
     </w:p>
     <w:p>
       <w:pPr>
@@ -6068,7 +6156,7 @@
       </w:r>
     </w:p>
     <w:p>
-      <w:bookmarkStart w:id="46937" w:name="bm_ch4_3"/>
+      <w:bookmarkStart w:id="55968" w:name="bm_ch4_3"/>
       <w:pPr>
         <w:pStyle w:val="Heading2"/>
         <w:spacing w:line="360" w:lineRule="auto"/>
@@ -6083,7 +6171,7 @@
         </w:rPr>
         <w:t>4.3 Organisation du code et architecture applicative</w:t>
       </w:r>
-      <w:bookmarkEnd w:id="46937"/>
+      <w:bookmarkEnd w:id="55968"/>
     </w:p>
     <w:p>
       <w:pPr>
@@ -6120,7 +6208,7 @@
       </w:r>
     </w:p>
     <w:p>
-      <w:bookmarkStart w:id="74909" w:name="bm_ch4_4"/>
+      <w:bookmarkStart w:id="22284" w:name="bm_ch4_4"/>
       <w:pPr>
         <w:pStyle w:val="Heading2"/>
         <w:spacing w:line="360" w:lineRule="auto"/>
@@ -6135,10 +6223,10 @@
         </w:rPr>
         <w:t>4.4 Réalisation des modules principaux</w:t>
       </w:r>
-      <w:bookmarkEnd w:id="74909"/>
-    </w:p>
-    <w:p>
-      <w:bookmarkStart w:id="87294" w:name="4_4_1_Authentification_et_sessions"/>
+      <w:bookmarkEnd w:id="22284"/>
+    </w:p>
+    <w:p>
+      <w:bookmarkStart w:id="15695" w:name="4_4_1_Authentification_et_sessions"/>
       <w:pPr>
         <w:pStyle w:val="Heading3"/>
         <w:spacing w:line="360" w:lineRule="auto"/>
@@ -6153,7 +6241,7 @@
         </w:rPr>
         <w:t>4.4.1 Authentification et sessions</w:t>
       </w:r>
-      <w:bookmarkEnd w:id="87294"/>
+      <w:bookmarkEnd w:id="15695"/>
     </w:p>
     <w:p>
       <w:pPr>
@@ -6190,7 +6278,7 @@
       </w:r>
     </w:p>
     <w:p>
-      <w:bookmarkStart w:id="91543" w:name="4_4_2_Module_administrateur_d__tablissem"/>
+      <w:bookmarkStart w:id="3866" w:name="4_4_2_Module_administrateur_d__tablissem"/>
       <w:pPr>
         <w:pStyle w:val="Heading3"/>
         <w:spacing w:line="360" w:lineRule="auto"/>
@@ -6205,7 +6293,7 @@
         </w:rPr>
         <w:t>4.4.2 Module administrateur d'établissement</w:t>
       </w:r>
-      <w:bookmarkEnd w:id="91543"/>
+      <w:bookmarkEnd w:id="3866"/>
     </w:p>
     <w:p>
       <w:pPr>
@@ -6242,7 +6330,7 @@
       </w:r>
     </w:p>
     <w:p>
-      <w:bookmarkStart w:id="61682" w:name="4_4_3_Module_professeur"/>
+      <w:bookmarkStart w:id="77211" w:name="4_4_3_Module_professeur"/>
       <w:pPr>
         <w:pStyle w:val="Heading3"/>
         <w:spacing w:line="360" w:lineRule="auto"/>
@@ -6257,7 +6345,7 @@
         </w:rPr>
         <w:t>4.4.3 Module professeur</w:t>
       </w:r>
-      <w:bookmarkEnd w:id="61682"/>
+      <w:bookmarkEnd w:id="77211"/>
     </w:p>
     <w:p>
       <w:pPr>
@@ -6294,7 +6382,7 @@
       </w:r>
     </w:p>
     <w:p>
-      <w:bookmarkStart w:id="81147" w:name="4_4_4_Module__tudiant_et_parcours_de_com"/>
+      <w:bookmarkStart w:id="32492" w:name="4_4_4_Module__tudiant_et_parcours_de_com"/>
       <w:pPr>
         <w:pStyle w:val="Heading3"/>
         <w:spacing w:line="360" w:lineRule="auto"/>
@@ -6309,7 +6397,7 @@
         </w:rPr>
         <w:t>4.4.4 Module étudiant et parcours de composition</w:t>
       </w:r>
-      <w:bookmarkEnd w:id="81147"/>
+      <w:bookmarkEnd w:id="32492"/>
     </w:p>
     <w:p>
       <w:pPr>
@@ -6336,6 +6424,7 @@
     </w:p>
     <w:p>
       <w:pPr>
+        <w:pStyle w:val="Caption"/>
         <w:spacing w:after="200" w:line="360" w:lineRule="auto"/>
         <w:jc w:val="center"/>
       </w:pPr>
@@ -6360,7 +6449,7 @@
         <w:fldChar w:fldCharType="begin"/>
         <w:instrText xml:space="preserve">SEQ Figure \* ARABIC</w:instrText>
         <w:fldChar w:fldCharType="separate"/>
-        <w:t>1</w:t>
+        <w:t>27</w:t>
         <w:fldChar w:fldCharType="end"/>
       </w:r>
       <w:r>
@@ -6399,6 +6488,7 @@
     </w:p>
     <w:p>
       <w:pPr>
+        <w:pStyle w:val="Caption"/>
         <w:spacing w:after="200" w:line="360" w:lineRule="auto"/>
         <w:jc w:val="center"/>
       </w:pPr>
@@ -6423,7 +6513,7 @@
         <w:fldChar w:fldCharType="begin"/>
         <w:instrText xml:space="preserve">SEQ Figure \* ARABIC</w:instrText>
         <w:fldChar w:fldCharType="separate"/>
-        <w:t>1</w:t>
+        <w:t>28</w:t>
         <w:fldChar w:fldCharType="end"/>
       </w:r>
       <w:r>
@@ -6455,7 +6545,7 @@
       </w:r>
     </w:p>
     <w:p>
-      <w:bookmarkStart w:id="97357" w:name="4_4_5_Sandbox_et_correction_automatique"/>
+      <w:bookmarkStart w:id="32675" w:name="4_4_5_Sandbox_et_correction_automatique"/>
       <w:pPr>
         <w:pStyle w:val="Heading3"/>
         <w:spacing w:line="360" w:lineRule="auto"/>
@@ -6470,7 +6560,7 @@
         </w:rPr>
         <w:t>4.4.5 Sandbox et correction automatique</w:t>
       </w:r>
-      <w:bookmarkEnd w:id="97357"/>
+      <w:bookmarkEnd w:id="32675"/>
     </w:p>
     <w:p>
       <w:pPr>
@@ -6490,7 +6580,7 @@
       </w:r>
     </w:p>
     <w:p>
-      <w:bookmarkStart w:id="47161" w:name="4_4_6_Landing_page_et_contact"/>
+      <w:bookmarkStart w:id="91279" w:name="4_4_6_Landing_page_et_contact"/>
       <w:pPr>
         <w:pStyle w:val="Heading3"/>
         <w:spacing w:line="360" w:lineRule="auto"/>
@@ -6505,7 +6595,7 @@
         </w:rPr>
         <w:t>4.4.6 Landing page et contact</w:t>
       </w:r>
-      <w:bookmarkEnd w:id="47161"/>
+      <w:bookmarkEnd w:id="91279"/>
     </w:p>
     <w:p>
       <w:pPr>
@@ -6525,7 +6615,7 @@
       </w:r>
     </w:p>
     <w:p>
-      <w:bookmarkStart w:id="48046" w:name="bm_ch4_5"/>
+      <w:bookmarkStart w:id="45984" w:name="bm_ch4_5"/>
       <w:pPr>
         <w:pStyle w:val="Heading2"/>
         <w:spacing w:line="360" w:lineRule="auto"/>
@@ -6540,7 +6630,7 @@
         </w:rPr>
         <w:t>4.5 Points techniques difficiles</w:t>
       </w:r>
-      <w:bookmarkEnd w:id="48046"/>
+      <w:bookmarkEnd w:id="45984"/>
     </w:p>
     <w:p>
       <w:pPr>
@@ -6560,7 +6650,7 @@
       </w:r>
     </w:p>
     <w:p>
-      <w:bookmarkStart w:id="48152" w:name="bm_ch4_6"/>
+      <w:bookmarkStart w:id="86812" w:name="bm_ch4_6"/>
       <w:pPr>
         <w:pStyle w:val="Heading2"/>
         <w:spacing w:line="360" w:lineRule="auto"/>
@@ -6575,7 +6665,7 @@
         </w:rPr>
         <w:t>4.6 Déploiement</w:t>
       </w:r>
-      <w:bookmarkEnd w:id="48152"/>
+      <w:bookmarkEnd w:id="86812"/>
     </w:p>
     <w:p>
       <w:pPr>
@@ -6595,7 +6685,7 @@
       </w:r>
     </w:p>
     <w:p>
-      <w:bookmarkStart w:id="2796" w:name="bm_ch4_7"/>
+      <w:bookmarkStart w:id="39530" w:name="bm_ch4_7"/>
       <w:pPr>
         <w:pStyle w:val="Heading2"/>
         <w:spacing w:line="360" w:lineRule="auto"/>
@@ -6610,7 +6700,7 @@
         </w:rPr>
         <w:t>4.7 Conclusion partielle</w:t>
       </w:r>
-      <w:bookmarkEnd w:id="2796"/>
+      <w:bookmarkEnd w:id="39530"/>
     </w:p>
     <w:p>
       <w:pPr>
@@ -6635,7 +6725,7 @@
       </w:r>
     </w:p>
     <w:p>
-      <w:bookmarkStart w:id="73599" w:name="bm_ch5"/>
+      <w:bookmarkStart w:id="27189" w:name="bm_ch5"/>
       <w:pPr>
         <w:pStyle w:val="Heading1"/>
         <w:spacing w:line="360" w:lineRule="auto"/>
@@ -6650,10 +6740,10 @@
         </w:rPr>
         <w:t>Chapitre 5 : Tests, résultats, limites et perspectives</w:t>
       </w:r>
-      <w:bookmarkEnd w:id="73599"/>
-    </w:p>
-    <w:p>
-      <w:bookmarkStart w:id="95475" w:name="bm_ch5_1"/>
+      <w:bookmarkEnd w:id="27189"/>
+    </w:p>
+    <w:p>
+      <w:bookmarkStart w:id="67409" w:name="bm_ch5_1"/>
       <w:pPr>
         <w:pStyle w:val="Heading2"/>
         <w:spacing w:line="360" w:lineRule="auto"/>
@@ -6668,7 +6758,7 @@
         </w:rPr>
         <w:t>5.1 Stratégie de tests</w:t>
       </w:r>
-      <w:bookmarkEnd w:id="95475"/>
+      <w:bookmarkEnd w:id="67409"/>
     </w:p>
     <w:p>
       <w:pPr>
@@ -6705,7 +6795,7 @@
       </w:r>
     </w:p>
     <w:p>
-      <w:bookmarkStart w:id="43599" w:name="bm_ch5_2"/>
+      <w:bookmarkStart w:id="53975" w:name="bm_ch5_2"/>
       <w:pPr>
         <w:pStyle w:val="Heading2"/>
         <w:spacing w:line="360" w:lineRule="auto"/>
@@ -6720,10 +6810,10 @@
         </w:rPr>
         <w:t>5.2 Jeux de tests et résultats</w:t>
       </w:r>
-      <w:bookmarkEnd w:id="43599"/>
-    </w:p>
-    <w:p>
-      <w:bookmarkStart w:id="21885" w:name="5_2_1_Authentification_et_acc_s"/>
+      <w:bookmarkEnd w:id="53975"/>
+    </w:p>
+    <w:p>
+      <w:bookmarkStart w:id="43466" w:name="5_2_1_Authentification_et_acc_s"/>
       <w:pPr>
         <w:pStyle w:val="Heading3"/>
         <w:spacing w:line="360" w:lineRule="auto"/>
@@ -6738,7 +6828,7 @@
         </w:rPr>
         <w:t>5.2.1 Authentification et accès</w:t>
       </w:r>
-      <w:bookmarkEnd w:id="21885"/>
+      <w:bookmarkEnd w:id="43466"/>
     </w:p>
     <w:p>
       <w:pPr>
@@ -6758,7 +6848,7 @@
       </w:r>
     </w:p>
     <w:p>
-      <w:bookmarkStart w:id="36687" w:name="5_2_2_Administration"/>
+      <w:bookmarkStart w:id="39286" w:name="5_2_2_Administration"/>
       <w:pPr>
         <w:pStyle w:val="Heading3"/>
         <w:spacing w:line="360" w:lineRule="auto"/>
@@ -6773,7 +6863,7 @@
         </w:rPr>
         <w:t>5.2.2 Administration</w:t>
       </w:r>
-      <w:bookmarkEnd w:id="36687"/>
+      <w:bookmarkEnd w:id="39286"/>
     </w:p>
     <w:p>
       <w:pPr>
@@ -6793,7 +6883,7 @@
       </w:r>
     </w:p>
     <w:p>
-      <w:bookmarkStart w:id="95794" w:name="5_2_3_Examens_c_t__professeur"/>
+      <w:bookmarkStart w:id="39558" w:name="5_2_3_Examens_c_t__professeur"/>
       <w:pPr>
         <w:pStyle w:val="Heading3"/>
         <w:spacing w:line="360" w:lineRule="auto"/>
@@ -6808,7 +6898,7 @@
         </w:rPr>
         <w:t>5.2.3 Examens côté professeur</w:t>
       </w:r>
-      <w:bookmarkEnd w:id="95794"/>
+      <w:bookmarkEnd w:id="39558"/>
     </w:p>
     <w:p>
       <w:pPr>
@@ -6828,7 +6918,7 @@
       </w:r>
     </w:p>
     <w:p>
-      <w:bookmarkStart w:id="55897" w:name="5_2_4_Parcours__tudiant_et_contr_les_de_"/>
+      <w:bookmarkStart w:id="36957" w:name="5_2_4_Parcours__tudiant_et_contr_les_de_"/>
       <w:pPr>
         <w:pStyle w:val="Heading3"/>
         <w:spacing w:line="360" w:lineRule="auto"/>
@@ -6843,7 +6933,7 @@
         </w:rPr>
         <w:t>5.2.4 Parcours étudiant et contrôles de passation</w:t>
       </w:r>
-      <w:bookmarkEnd w:id="55897"/>
+      <w:bookmarkEnd w:id="36957"/>
     </w:p>
     <w:p>
       <w:pPr>
@@ -6880,7 +6970,7 @@
       </w:r>
     </w:p>
     <w:p>
-      <w:bookmarkStart w:id="42153" w:name="bm_ch5_3"/>
+      <w:bookmarkStart w:id="80291" w:name="bm_ch5_3"/>
       <w:pPr>
         <w:pStyle w:val="Heading2"/>
         <w:spacing w:line="360" w:lineRule="auto"/>
@@ -6895,7 +6985,7 @@
         </w:rPr>
         <w:t>5.3 Discussion des résultats</w:t>
       </w:r>
-      <w:bookmarkEnd w:id="42153"/>
+      <w:bookmarkEnd w:id="80291"/>
     </w:p>
     <w:p>
       <w:pPr>
@@ -6932,7 +7022,7 @@
       </w:r>
     </w:p>
     <w:p>
-      <w:bookmarkStart w:id="93837" w:name="bm_ch5_4"/>
+      <w:bookmarkStart w:id="92984" w:name="bm_ch5_4"/>
       <w:pPr>
         <w:pStyle w:val="Heading2"/>
         <w:spacing w:line="360" w:lineRule="auto"/>
@@ -6947,7 +7037,7 @@
         </w:rPr>
         <w:t>5.4 Limites et risques résiduels</w:t>
       </w:r>
-      <w:bookmarkEnd w:id="93837"/>
+      <w:bookmarkEnd w:id="92984"/>
     </w:p>
     <w:p>
       <w:pPr>
@@ -6967,7 +7057,7 @@
       </w:r>
     </w:p>
     <w:p>
-      <w:bookmarkStart w:id="94628" w:name="bm_ch5_5"/>
+      <w:bookmarkStart w:id="32909" w:name="bm_ch5_5"/>
       <w:pPr>
         <w:pStyle w:val="Heading2"/>
         <w:spacing w:line="360" w:lineRule="auto"/>
@@ -6982,7 +7072,7 @@
         </w:rPr>
         <w:t>5.5 Perspectives</w:t>
       </w:r>
-      <w:bookmarkEnd w:id="94628"/>
+      <w:bookmarkEnd w:id="32909"/>
     </w:p>
     <w:p>
       <w:pPr>
@@ -7019,7 +7109,7 @@
       </w:r>
     </w:p>
     <w:p>
-      <w:bookmarkStart w:id="21091" w:name="bm_ch5_6"/>
+      <w:bookmarkStart w:id="53446" w:name="bm_ch5_6"/>
       <w:pPr>
         <w:pStyle w:val="Heading2"/>
         <w:spacing w:line="360" w:lineRule="auto"/>
@@ -7034,7 +7124,7 @@
         </w:rPr>
         <w:t>5.6 Conclusion partielle</w:t>
       </w:r>
-      <w:bookmarkEnd w:id="21091"/>
+      <w:bookmarkEnd w:id="53446"/>
     </w:p>
     <w:p>
       <w:pPr>
@@ -7059,7 +7149,7 @@
       </w:r>
     </w:p>
     <w:p>
-      <w:bookmarkStart w:id="50576" w:name="bm_concl"/>
+      <w:bookmarkStart w:id="7237" w:name="bm_concl"/>
       <w:pPr>
         <w:pStyle w:val="Heading1"/>
         <w:spacing w:line="360" w:lineRule="auto"/>
@@ -7074,7 +7164,7 @@
         </w:rPr>
         <w:t>Conclusion générale</w:t>
       </w:r>
-      <w:bookmarkEnd w:id="50576"/>
+      <w:bookmarkEnd w:id="7237"/>
     </w:p>
     <w:p>
       <w:pPr>
@@ -7133,7 +7223,7 @@
       </w:r>
     </w:p>
     <w:p>
-      <w:bookmarkStart w:id="68509" w:name="bm_biblio"/>
+      <w:bookmarkStart w:id="90345" w:name="bm_biblio"/>
       <w:pPr>
         <w:pStyle w:val="Heading1"/>
         <w:spacing w:line="360" w:lineRule="auto"/>
@@ -7148,7 +7238,7 @@
         </w:rPr>
         <w:t>Bibliographie et webographie</w:t>
       </w:r>
-      <w:bookmarkEnd w:id="68509"/>
+      <w:bookmarkEnd w:id="90345"/>
     </w:p>
     <w:p>
       <w:pPr>
@@ -7181,7 +7271,7 @@
         </w:rPr>
         <w:t xml:space="preserve">[2] Vercel, Next.js Documentation, </w:t>
       </w:r>
-      <w:hyperlink r:id="rId11">
+      <w:hyperlink r:id="rId12">
         <w:r>
           <w:rPr>
             <w:rFonts w:ascii="Times New Roman" w:hAnsi="Times New Roman"/>
@@ -7218,7 +7308,7 @@
         </w:rPr>
         <w:t xml:space="preserve">[3] Prisma, Prisma Documentation, </w:t>
       </w:r>
-      <w:hyperlink r:id="rId12">
+      <w:hyperlink r:id="rId13">
         <w:r>
           <w:rPr>
             <w:rFonts w:ascii="Times New Roman" w:hAnsi="Times New Roman"/>
@@ -7255,7 +7345,7 @@
         </w:rPr>
         <w:t xml:space="preserve">[4] Oracle, MySQL 8 Documentation, </w:t>
       </w:r>
-      <w:hyperlink r:id="rId13">
+      <w:hyperlink r:id="rId14">
         <w:r>
           <w:rPr>
             <w:rFonts w:ascii="Times New Roman" w:hAnsi="Times New Roman"/>
@@ -7292,7 +7382,7 @@
         </w:rPr>
         <w:t xml:space="preserve">[5] Redis Ltd, Redis Documentation, </w:t>
       </w:r>
-      <w:hyperlink r:id="rId14">
+      <w:hyperlink r:id="rId15">
         <w:r>
           <w:rPr>
             <w:rFonts w:ascii="Times New Roman" w:hAnsi="Times New Roman"/>
@@ -7329,7 +7419,7 @@
         </w:rPr>
         <w:t xml:space="preserve">[6] Docker Inc., Docker Documentation, </w:t>
       </w:r>
-      <w:hyperlink r:id="rId15">
+      <w:hyperlink r:id="rId16">
         <w:r>
           <w:rPr>
             <w:rFonts w:ascii="Times New Roman" w:hAnsi="Times New Roman"/>
@@ -7382,7 +7472,7 @@
         </w:rPr>
         <w:t xml:space="preserve">[8] freeCodeCamp, </w:t>
       </w:r>
-      <w:hyperlink r:id="rId16">
+      <w:hyperlink r:id="rId17">
         <w:r>
           <w:rPr>
             <w:rFonts w:ascii="Times New Roman" w:hAnsi="Times New Roman"/>
@@ -7419,7 +7509,7 @@
         </w:rPr>
         <w:t xml:space="preserve">[9] Moodle HQ, Moodle Documentation, </w:t>
       </w:r>
-      <w:hyperlink r:id="rId17">
+      <w:hyperlink r:id="rId18">
         <w:r>
           <w:rPr>
             <w:rFonts w:ascii="Times New Roman" w:hAnsi="Times New Roman"/>
@@ -7456,7 +7546,7 @@
         </w:rPr>
         <w:t xml:space="preserve">[10] Judge0, Judge0 CE, </w:t>
       </w:r>
-      <w:hyperlink r:id="rId18">
+      <w:hyperlink r:id="rId19">
         <w:r>
           <w:rPr>
             <w:rFonts w:ascii="Times New Roman" w:hAnsi="Times New Roman"/>
@@ -7484,7 +7574,7 @@
       </w:r>
     </w:p>
     <w:p>
-      <w:bookmarkStart w:id="76834" w:name="bm_annexes"/>
+      <w:bookmarkStart w:id="73095" w:name="bm_annexes"/>
       <w:pPr>
         <w:pStyle w:val="Heading1"/>
         <w:spacing w:line="360" w:lineRule="auto"/>
@@ -7499,10 +7589,10 @@
         </w:rPr>
         <w:t>Annexes</w:t>
       </w:r>
-      <w:bookmarkEnd w:id="76834"/>
-    </w:p>
-    <w:p>
-      <w:bookmarkStart w:id="19222" w:name="Annexe_A___Inventaire_des_diagrammes_UML"/>
+      <w:bookmarkEnd w:id="73095"/>
+    </w:p>
+    <w:p>
+      <w:bookmarkStart w:id="84476" w:name="Annexe_A___Inventaire_des_diagrammes_UML"/>
       <w:pPr>
         <w:pStyle w:val="Heading2"/>
         <w:spacing w:line="360" w:lineRule="auto"/>
@@ -7517,7 +7607,7 @@
         </w:rPr>
         <w:t>Annexe A : Inventaire des diagrammes UML</w:t>
       </w:r>
-      <w:bookmarkEnd w:id="19222"/>
+      <w:bookmarkEnd w:id="84476"/>
     </w:p>
     <w:p>
       <w:pPr>
@@ -7536,7 +7626,7 @@
       </w:r>
     </w:p>
     <w:p>
-      <w:bookmarkStart w:id="2271" w:name="Annexe_B___Pr_fixes_d_identifiants"/>
+      <w:bookmarkStart w:id="59312" w:name="Annexe_B___Pr_fixes_d_identifiants"/>
       <w:pPr>
         <w:pStyle w:val="Heading2"/>
         <w:spacing w:line="360" w:lineRule="auto"/>
@@ -7551,7 +7641,7 @@
         </w:rPr>
         <w:t>Annexe B : Préfixes d'identifiants</w:t>
       </w:r>
-      <w:bookmarkEnd w:id="2271"/>
+      <w:bookmarkEnd w:id="59312"/>
     </w:p>
     <w:p>
       <w:pPr>
@@ -7570,7 +7660,7 @@
       </w:r>
     </w:p>
     <w:p>
-      <w:bookmarkStart w:id="92090" w:name="Annexe_C___Captures_d__cran_compl_mentai"/>
+      <w:bookmarkStart w:id="80607" w:name="Annexe_C___Captures_d__cran_compl_mentai"/>
       <w:pPr>
         <w:pStyle w:val="Heading2"/>
         <w:spacing w:line="360" w:lineRule="auto"/>
@@ -7585,7 +7675,7 @@
         </w:rPr>
         <w:t>Annexe C : Captures d'écran complémentaires</w:t>
       </w:r>
-      <w:bookmarkEnd w:id="92090"/>
+      <w:bookmarkEnd w:id="80607"/>
     </w:p>
     <w:p>
       <w:pPr>
@@ -7604,7 +7694,7 @@
       </w:r>
     </w:p>
     <w:p>
-      <w:bookmarkStart w:id="84394" w:name="Annexe_D___Mod_le_CSV_d_import_des__tudi"/>
+      <w:bookmarkStart w:id="62665" w:name="Annexe_D___Mod_le_CSV_d_import_des__tudi"/>
       <w:pPr>
         <w:pStyle w:val="Heading2"/>
         <w:spacing w:line="360" w:lineRule="auto"/>
@@ -7619,7 +7709,7 @@
         </w:rPr>
         <w:t>Annexe D : Modèle CSV d'import des étudiants</w:t>
       </w:r>
-      <w:bookmarkEnd w:id="84394"/>
+      <w:bookmarkEnd w:id="62665"/>
     </w:p>
     <w:p>
       <w:pPr>
@@ -7643,7 +7733,7 @@
       </w:r>
     </w:p>
     <w:p>
-      <w:bookmarkStart w:id="89155" w:name="bm_tdm"/>
+      <w:bookmarkStart w:id="79420" w:name="bm_tdm"/>
       <w:pPr>
         <w:pStyle w:val="Heading1"/>
         <w:spacing w:line="360" w:lineRule="auto"/>
@@ -7658,7 +7748,7 @@
         </w:rPr>
         <w:t>Table des matières</w:t>
       </w:r>
-      <w:bookmarkEnd w:id="89155"/>
+      <w:bookmarkEnd w:id="79420"/>
     </w:p>
     <w:p>
       <w:pPr>
@@ -7673,7 +7763,7 @@
           <w:color w:val="000000"/>
           <w:sz w:val="22"/>
         </w:rPr>
-        <w:t>Table complète des titres et sous-titres. Dans Word : sélectionner le champ, clic droit, Mettre à jour les champs, choisir Mettre à jour toute la table. Les entrées deviennent cliquables.</w:t>
+        <w:t>Table complète des titres et sous-titres. Dans Word : sélectionner le champ, clic droit, Mettre à jour les champs, choisir Mettre à jour toute la table. Les entrées deviennent cliquables. Les pages préliminaires restent en chiffres romains ; le corps en chiffres arabes.</w:t>
       </w:r>
     </w:p>
     <w:p>
@@ -7697,13 +7787,12 @@
       </w:r>
     </w:p>
     <w:sectPr>
-      <w:footerReference w:type="default" r:id="rId10"/>
+      <w:footerReference w:type="default" r:id="rId11"/>
       <w:pgSz w:w="11906" w:h="16838"/>
       <w:pgMar w:top="1417" w:right="1417" w:bottom="1417" w:left="1984" w:header="720" w:footer="720" w:gutter="0"/>
       <w:cols w:space="720"/>
-      <w:titlePg/>
       <w:docGrid w:linePitch="360"/>
-      <w:pgNumType w:start="1"/>
+      <w:pgNumType w:fmt="decimal" w:start="1"/>
     </w:sectPr>
   </w:body>
 </w:document>
@@ -7714,6 +7803,16 @@
   <w:p>
     <w:pPr>
       <w:pStyle w:val="Footer"/>
+    </w:pPr>
+  </w:p>
+</w:ftr>
+</file>
+
+<file path=word/footer2.xml><?xml version="1.0" encoding="utf-8"?>
+<w:ftr xmlns:m="http://schemas.openxmlformats.org/officeDocument/2006/math" xmlns:mc="http://schemas.openxmlformats.org/markup-compatibility/2006" xmlns:mo="http://schemas.microsoft.com/office/mac/office/2008/main" xmlns:mv="urn:schemas-microsoft-com:mac:vml" xmlns:o="urn:schemas-microsoft-com:office:office" xmlns:r="http://schemas.openxmlformats.org/officeDocument/2006/relationships" xmlns:v="urn:schemas-microsoft-com:vml" xmlns:w10="urn:schemas-microsoft-com:office:word" xmlns:w14="http://schemas.microsoft.com/office/word/2010/wordml" xmlns:w="http://schemas.openxmlformats.org/wordprocessingml/2006/main" xmlns:wne="http://schemas.microsoft.com/office/word/2006/wordml" xmlns:wp14="http://schemas.microsoft.com/office/word/2010/wordprocessingDrawing" xmlns:wp="http://schemas.openxmlformats.org/drawingml/2006/wordprocessingDrawing" xmlns:wpc="http://schemas.microsoft.com/office/word/2010/wordprocessingCanvas" xmlns:wpg="http://schemas.microsoft.com/office/word/2010/wordprocessingGroup" xmlns:wpi="http://schemas.microsoft.com/office/word/2010/wordprocessingInk" xmlns:wps="http://schemas.microsoft.com/office/word/2010/wordprocessingShape" mc:Ignorable="w14 wp14">
+  <w:p>
+    <w:pPr>
+      <w:pStyle w:val="Footer"/>
       <w:jc w:val="right"/>
     </w:pPr>
     <w:r>
@@ -7725,7 +7824,7 @@
         <w:sz w:val="24"/>
       </w:rPr>
       <w:fldChar w:fldCharType="begin"/>
-      <w:instrText xml:space="preserve">PAGE \* ROMAN</w:instrText>
+      <w:instrText xml:space="preserve">PAGE</w:instrText>
       <w:fldChar w:fldCharType="separate"/>
       <w:t>i</w:t>
       <w:fldChar w:fldCharType="end"/>
@@ -7734,7 +7833,7 @@
 </w:ftr>
 </file>
 
-<file path=word/footer2.xml><?xml version="1.0" encoding="utf-8"?>
+<file path=word/footer3.xml><?xml version="1.0" encoding="utf-8"?>
 <w:ftr xmlns:m="http://schemas.openxmlformats.org/officeDocument/2006/math" xmlns:mc="http://schemas.openxmlformats.org/markup-compatibility/2006" xmlns:mo="http://schemas.microsoft.com/office/mac/office/2008/main" xmlns:mv="urn:schemas-microsoft-com:mac:vml" xmlns:o="urn:schemas-microsoft-com:office:office" xmlns:r="http://schemas.openxmlformats.org/officeDocument/2006/relationships" xmlns:v="urn:schemas-microsoft-com:vml" xmlns:w10="urn:schemas-microsoft-com:office:word" xmlns:w14="http://schemas.microsoft.com/office/word/2010/wordml" xmlns:w="http://schemas.openxmlformats.org/wordprocessingml/2006/main" xmlns:wne="http://schemas.microsoft.com/office/word/2006/wordml" xmlns:wp14="http://schemas.microsoft.com/office/word/2010/wordprocessingDrawing" xmlns:wp="http://schemas.openxmlformats.org/drawingml/2006/wordprocessingDrawing" xmlns:wpc="http://schemas.microsoft.com/office/word/2010/wordprocessingCanvas" xmlns:wpg="http://schemas.microsoft.com/office/word/2010/wordprocessingGroup" xmlns:wpi="http://schemas.microsoft.com/office/word/2010/wordprocessingInk" xmlns:wps="http://schemas.microsoft.com/office/word/2010/wordprocessingShape" mc:Ignorable="w14 wp14">
   <w:p>
     <w:pPr>

</xml_diff>

<commit_message>
Ajoute l'architecture logique manquante et insère les diagrammes UML.
La figure 1 du chapitre 3 n'avait jamais de PlantUML associé. Ajout de
00_architecture_logique, rendu PNG de tous les diagrammes, et insertion
automatique des images dans le rapport Word.

Co-authored-by: progirix <progirix@users.noreply.github.com>
</commit_message>
<xml_diff>
--- a/docs/Rapport_Cylentic.docx
+++ b/docs/Rapport_Cylentic.docx
@@ -492,7 +492,7 @@
       </w:pPr>
     </w:p>
     <w:p>
-      <w:bookmarkStart w:id="42929" w:name="bm_dedicace"/>
+      <w:bookmarkStart w:id="69586" w:name="bm_dedicace"/>
       <w:pPr>
         <w:pStyle w:val="Heading1"/>
         <w:spacing w:line="360" w:lineRule="auto"/>
@@ -507,7 +507,7 @@
         </w:rPr>
         <w:t>Dédicace</w:t>
       </w:r>
-      <w:bookmarkEnd w:id="42929"/>
+      <w:bookmarkEnd w:id="69586"/>
     </w:p>
     <w:p>
       <w:pPr>
@@ -532,7 +532,7 @@
       </w:r>
     </w:p>
     <w:p>
-      <w:bookmarkStart w:id="7106" w:name="bm_remerciements"/>
+      <w:bookmarkStart w:id="86757" w:name="bm_remerciements"/>
       <w:pPr>
         <w:pStyle w:val="Heading1"/>
         <w:spacing w:line="360" w:lineRule="auto"/>
@@ -547,7 +547,7 @@
         </w:rPr>
         <w:t>Remerciements</w:t>
       </w:r>
-      <w:bookmarkEnd w:id="7106"/>
+      <w:bookmarkEnd w:id="86757"/>
     </w:p>
     <w:p>
       <w:pPr>
@@ -606,7 +606,7 @@
       </w:r>
     </w:p>
     <w:p>
-      <w:bookmarkStart w:id="6477" w:name="bm_sommaire"/>
+      <w:bookmarkStart w:id="40860" w:name="bm_sommaire"/>
       <w:pPr>
         <w:pStyle w:val="Heading1"/>
         <w:spacing w:line="360" w:lineRule="auto"/>
@@ -621,7 +621,7 @@
         </w:rPr>
         <w:t>Sommaire</w:t>
       </w:r>
-      <w:bookmarkEnd w:id="6477"/>
+      <w:bookmarkEnd w:id="40860"/>
     </w:p>
     <w:p>
       <w:pPr>
@@ -665,7 +665,7 @@
       </w:r>
     </w:p>
     <w:p>
-      <w:bookmarkStart w:id="77989" w:name="bm_sigles"/>
+      <w:bookmarkStart w:id="82009" w:name="bm_sigles"/>
       <w:pPr>
         <w:pStyle w:val="Heading1"/>
         <w:spacing w:line="360" w:lineRule="auto"/>
@@ -680,7 +680,7 @@
         </w:rPr>
         <w:t>Liste des sigles et abréviations</w:t>
       </w:r>
-      <w:bookmarkEnd w:id="77989"/>
+      <w:bookmarkEnd w:id="82009"/>
     </w:p>
     <w:p>
       <w:pPr>
@@ -992,7 +992,7 @@
       </w:r>
     </w:p>
     <w:p>
-      <w:bookmarkStart w:id="3846" w:name="bm_liste_figures"/>
+      <w:bookmarkStart w:id="13361" w:name="bm_liste_figures"/>
       <w:pPr>
         <w:pStyle w:val="Heading1"/>
         <w:spacing w:line="360" w:lineRule="auto"/>
@@ -1007,7 +1007,7 @@
         </w:rPr>
         <w:t>Liste des figures</w:t>
       </w:r>
-      <w:bookmarkEnd w:id="3846"/>
+      <w:bookmarkEnd w:id="13361"/>
     </w:p>
     <w:p>
       <w:pPr>
@@ -1051,7 +1051,7 @@
       </w:r>
     </w:p>
     <w:p>
-      <w:bookmarkStart w:id="50810" w:name="bm_liste_tableaux"/>
+      <w:bookmarkStart w:id="25355" w:name="bm_liste_tableaux"/>
       <w:pPr>
         <w:pStyle w:val="Heading1"/>
         <w:spacing w:line="360" w:lineRule="auto"/>
@@ -1066,7 +1066,7 @@
         </w:rPr>
         <w:t>Liste des tableaux</w:t>
       </w:r>
-      <w:bookmarkEnd w:id="50810"/>
+      <w:bookmarkEnd w:id="25355"/>
     </w:p>
     <w:p>
       <w:pPr>
@@ -1110,7 +1110,7 @@
       </w:r>
     </w:p>
     <w:p>
-      <w:bookmarkStart w:id="90894" w:name="bm_resume"/>
+      <w:bookmarkStart w:id="71618" w:name="bm_resume"/>
       <w:pPr>
         <w:pStyle w:val="Heading1"/>
         <w:spacing w:line="360" w:lineRule="auto"/>
@@ -1125,7 +1125,7 @@
         </w:rPr>
         <w:t>Résumé</w:t>
       </w:r>
-      <w:bookmarkEnd w:id="90894"/>
+      <w:bookmarkEnd w:id="71618"/>
     </w:p>
     <w:p>
       <w:pPr>
@@ -1167,7 +1167,7 @@
       </w:r>
     </w:p>
     <w:p>
-      <w:bookmarkStart w:id="68317" w:name="bm_abstract"/>
+      <w:bookmarkStart w:id="87866" w:name="bm_abstract"/>
       <w:pPr>
         <w:pStyle w:val="Heading1"/>
         <w:spacing w:line="360" w:lineRule="auto"/>
@@ -1182,7 +1182,7 @@
         </w:rPr>
         <w:t>Abstract</w:t>
       </w:r>
-      <w:bookmarkEnd w:id="68317"/>
+      <w:bookmarkEnd w:id="87866"/>
     </w:p>
     <w:p>
       <w:pPr>
@@ -1231,7 +1231,7 @@
       </w:pPr>
     </w:p>
     <w:p>
-      <w:bookmarkStart w:id="26026" w:name="bm_intro"/>
+      <w:bookmarkStart w:id="23261" w:name="bm_intro"/>
       <w:pPr>
         <w:pStyle w:val="Heading1"/>
         <w:spacing w:line="360" w:lineRule="auto"/>
@@ -1246,7 +1246,7 @@
         </w:rPr>
         <w:t>Introduction générale</w:t>
       </w:r>
-      <w:bookmarkEnd w:id="26026"/>
+      <w:bookmarkEnd w:id="23261"/>
     </w:p>
     <w:p>
       <w:pPr>
@@ -1317,7 +1317,7 @@
       </w:r>
     </w:p>
     <w:p>
-      <w:bookmarkStart w:id="63766" w:name="bm_probl"/>
+      <w:bookmarkStart w:id="84223" w:name="bm_probl"/>
       <w:pPr>
         <w:pStyle w:val="Heading1"/>
         <w:spacing w:line="360" w:lineRule="auto"/>
@@ -1332,7 +1332,7 @@
         </w:rPr>
         <w:t>Problématique</w:t>
       </w:r>
-      <w:bookmarkEnd w:id="63766"/>
+      <w:bookmarkEnd w:id="84223"/>
     </w:p>
     <w:p>
       <w:pPr>
@@ -1487,7 +1487,7 @@
       </w:r>
     </w:p>
     <w:p>
-      <w:bookmarkStart w:id="99185" w:name="bm_ch1"/>
+      <w:bookmarkStart w:id="10858" w:name="bm_ch1"/>
       <w:pPr>
         <w:pStyle w:val="Heading1"/>
         <w:spacing w:line="360" w:lineRule="auto"/>
@@ -1502,7 +1502,7 @@
         </w:rPr>
         <w:t>Chapitre 1 : Contexte et étude de l'existant</w:t>
       </w:r>
-      <w:bookmarkEnd w:id="99185"/>
+      <w:bookmarkEnd w:id="10858"/>
     </w:p>
     <w:p>
       <w:pPr>
@@ -1522,7 +1522,7 @@
       </w:r>
     </w:p>
     <w:p>
-      <w:bookmarkStart w:id="54017" w:name="bm_ch1_1"/>
+      <w:bookmarkStart w:id="10100" w:name="bm_ch1_1"/>
       <w:pPr>
         <w:pStyle w:val="Heading2"/>
         <w:spacing w:line="360" w:lineRule="auto"/>
@@ -1537,7 +1537,7 @@
         </w:rPr>
         <w:t>1.1 Contexte pédagogique et technologique</w:t>
       </w:r>
-      <w:bookmarkEnd w:id="54017"/>
+      <w:bookmarkEnd w:id="10100"/>
     </w:p>
     <w:p>
       <w:pPr>
@@ -1591,7 +1591,7 @@
       </w:r>
     </w:p>
     <w:p>
-      <w:bookmarkStart w:id="569" w:name="bm_ch1_2"/>
+      <w:bookmarkStart w:id="30438" w:name="bm_ch1_2"/>
       <w:pPr>
         <w:pStyle w:val="Heading2"/>
         <w:spacing w:line="360" w:lineRule="auto"/>
@@ -1606,7 +1606,7 @@
         </w:rPr>
         <w:t>1.2 Sous-problèmes et contraintes locales</w:t>
       </w:r>
-      <w:bookmarkEnd w:id="569"/>
+      <w:bookmarkEnd w:id="30438"/>
     </w:p>
     <w:p>
       <w:pPr>
@@ -1660,7 +1660,7 @@
       </w:r>
     </w:p>
     <w:p>
-      <w:bookmarkStart w:id="85571" w:name="bm_ch1_3"/>
+      <w:bookmarkStart w:id="40220" w:name="bm_ch1_3"/>
       <w:pPr>
         <w:pStyle w:val="Heading2"/>
         <w:spacing w:line="360" w:lineRule="auto"/>
@@ -1675,7 +1675,7 @@
         </w:rPr>
         <w:t>1.3 Examen des solutions existantes</w:t>
       </w:r>
-      <w:bookmarkEnd w:id="85571"/>
+      <w:bookmarkEnd w:id="40220"/>
     </w:p>
     <w:p>
       <w:pPr>
@@ -2684,7 +2684,7 @@
       </w:r>
     </w:p>
     <w:p>
-      <w:bookmarkStart w:id="52404" w:name="bm_ch1_4"/>
+      <w:bookmarkStart w:id="58233" w:name="bm_ch1_4"/>
       <w:pPr>
         <w:pStyle w:val="Heading2"/>
         <w:spacing w:line="360" w:lineRule="auto"/>
@@ -2699,7 +2699,7 @@
         </w:rPr>
         <w:t>1.4 Positionnement de Cylentic</w:t>
       </w:r>
-      <w:bookmarkEnd w:id="52404"/>
+      <w:bookmarkEnd w:id="58233"/>
     </w:p>
     <w:p>
       <w:pPr>
@@ -2736,7 +2736,7 @@
       </w:r>
     </w:p>
     <w:p>
-      <w:bookmarkStart w:id="3995" w:name="bm_ch1_5"/>
+      <w:bookmarkStart w:id="11155" w:name="bm_ch1_5"/>
       <w:pPr>
         <w:pStyle w:val="Heading2"/>
         <w:spacing w:line="360" w:lineRule="auto"/>
@@ -2751,7 +2751,7 @@
         </w:rPr>
         <w:t>1.5 Conclusion partielle</w:t>
       </w:r>
-      <w:bookmarkEnd w:id="3995"/>
+      <w:bookmarkEnd w:id="11155"/>
     </w:p>
     <w:p>
       <w:pPr>
@@ -2776,7 +2776,7 @@
       </w:r>
     </w:p>
     <w:p>
-      <w:bookmarkStart w:id="7443" w:name="bm_ch2"/>
+      <w:bookmarkStart w:id="34675" w:name="bm_ch2"/>
       <w:pPr>
         <w:pStyle w:val="Heading1"/>
         <w:spacing w:line="360" w:lineRule="auto"/>
@@ -2791,10 +2791,10 @@
         </w:rPr>
         <w:t>Chapitre 2 : Analyse des besoins et spécification du système</w:t>
       </w:r>
-      <w:bookmarkEnd w:id="7443"/>
-    </w:p>
-    <w:p>
-      <w:bookmarkStart w:id="8609" w:name="bm_ch2_1"/>
+      <w:bookmarkEnd w:id="34675"/>
+    </w:p>
+    <w:p>
+      <w:bookmarkStart w:id="81818" w:name="bm_ch2_1"/>
       <w:pPr>
         <w:pStyle w:val="Heading2"/>
         <w:spacing w:line="360" w:lineRule="auto"/>
@@ -2809,7 +2809,7 @@
         </w:rPr>
         <w:t>2.1 Périmètre du projet et du MVP</w:t>
       </w:r>
-      <w:bookmarkEnd w:id="8609"/>
+      <w:bookmarkEnd w:id="81818"/>
     </w:p>
     <w:p>
       <w:pPr>
@@ -2863,7 +2863,7 @@
       </w:r>
     </w:p>
     <w:p>
-      <w:bookmarkStart w:id="911" w:name="bm_ch2_2"/>
+      <w:bookmarkStart w:id="32976" w:name="bm_ch2_2"/>
       <w:pPr>
         <w:pStyle w:val="Heading2"/>
         <w:spacing w:line="360" w:lineRule="auto"/>
@@ -2878,7 +2878,7 @@
         </w:rPr>
         <w:t>2.2 Identification des acteurs</w:t>
       </w:r>
-      <w:bookmarkEnd w:id="911"/>
+      <w:bookmarkEnd w:id="32976"/>
     </w:p>
     <w:p>
       <w:pPr>
@@ -3242,7 +3242,7 @@
       </w:r>
     </w:p>
     <w:p>
-      <w:bookmarkStart w:id="35085" w:name="bm_ch2_3"/>
+      <w:bookmarkStart w:id="41380" w:name="bm_ch2_3"/>
       <w:pPr>
         <w:pStyle w:val="Heading2"/>
         <w:spacing w:line="360" w:lineRule="auto"/>
@@ -3257,7 +3257,7 @@
         </w:rPr>
         <w:t>2.3 Besoins fonctionnels</w:t>
       </w:r>
-      <w:bookmarkEnd w:id="35085"/>
+      <w:bookmarkEnd w:id="41380"/>
     </w:p>
     <w:p>
       <w:pPr>
@@ -3362,7 +3362,7 @@
       </w:r>
     </w:p>
     <w:p>
-      <w:bookmarkStart w:id="19544" w:name="bm_ch2_4"/>
+      <w:bookmarkStart w:id="73467" w:name="bm_ch2_4"/>
       <w:pPr>
         <w:pStyle w:val="Heading2"/>
         <w:spacing w:line="360" w:lineRule="auto"/>
@@ -3377,7 +3377,7 @@
         </w:rPr>
         <w:t>2.4 Besoins non fonctionnels</w:t>
       </w:r>
-      <w:bookmarkEnd w:id="19544"/>
+      <w:bookmarkEnd w:id="73467"/>
     </w:p>
     <w:p>
       <w:pPr>
@@ -3414,7 +3414,7 @@
       </w:r>
     </w:p>
     <w:p>
-      <w:bookmarkStart w:id="24374" w:name="bm_ch2_5"/>
+      <w:bookmarkStart w:id="80510" w:name="bm_ch2_5"/>
       <w:pPr>
         <w:pStyle w:val="Heading2"/>
         <w:spacing w:line="360" w:lineRule="auto"/>
@@ -3429,7 +3429,7 @@
         </w:rPr>
         <w:t>2.5 Règles métier structurantes</w:t>
       </w:r>
-      <w:bookmarkEnd w:id="24374"/>
+      <w:bookmarkEnd w:id="80510"/>
     </w:p>
     <w:p>
       <w:pPr>
@@ -3449,7 +3449,7 @@
       </w:r>
     </w:p>
     <w:p>
-      <w:bookmarkStart w:id="66572" w:name="bm_ch2_6"/>
+      <w:bookmarkStart w:id="58575" w:name="bm_ch2_6"/>
       <w:pPr>
         <w:pStyle w:val="Heading2"/>
         <w:spacing w:line="360" w:lineRule="auto"/>
@@ -3464,7 +3464,7 @@
         </w:rPr>
         <w:t>2.6 Scénarios d'usage prioritaires</w:t>
       </w:r>
-      <w:bookmarkEnd w:id="66572"/>
+      <w:bookmarkEnd w:id="58575"/>
     </w:p>
     <w:p>
       <w:pPr>
@@ -3484,7 +3484,7 @@
       </w:r>
     </w:p>
     <w:p>
-      <w:bookmarkStart w:id="63664" w:name="bm_ch2_7"/>
+      <w:bookmarkStart w:id="72441" w:name="bm_ch2_7"/>
       <w:pPr>
         <w:pStyle w:val="Heading2"/>
         <w:spacing w:line="360" w:lineRule="auto"/>
@@ -3499,7 +3499,7 @@
         </w:rPr>
         <w:t>2.7 Conclusion partielle</w:t>
       </w:r>
-      <w:bookmarkEnd w:id="63664"/>
+      <w:bookmarkEnd w:id="72441"/>
     </w:p>
     <w:p>
       <w:pPr>
@@ -3524,7 +3524,7 @@
       </w:r>
     </w:p>
     <w:p>
-      <w:bookmarkStart w:id="20670" w:name="bm_ch3"/>
+      <w:bookmarkStart w:id="90342" w:name="bm_ch3"/>
       <w:pPr>
         <w:pStyle w:val="Heading1"/>
         <w:spacing w:line="360" w:lineRule="auto"/>
@@ -3539,10 +3539,10 @@
         </w:rPr>
         <w:t>Chapitre 3 : Conception du système Cylentic</w:t>
       </w:r>
-      <w:bookmarkEnd w:id="20670"/>
-    </w:p>
-    <w:p>
-      <w:bookmarkStart w:id="75154" w:name="bm_ch3_1"/>
+      <w:bookmarkEnd w:id="90342"/>
+    </w:p>
+    <w:p>
+      <w:bookmarkStart w:id="18099" w:name="bm_ch3_1"/>
       <w:pPr>
         <w:pStyle w:val="Heading2"/>
         <w:spacing w:line="360" w:lineRule="auto"/>
@@ -3557,7 +3557,7 @@
         </w:rPr>
         <w:t>3.1 Démarche de conception</w:t>
       </w:r>
-      <w:bookmarkEnd w:id="75154"/>
+      <w:bookmarkEnd w:id="18099"/>
     </w:p>
     <w:p>
       <w:pPr>
@@ -3627,7 +3627,7 @@
       </w:r>
     </w:p>
     <w:p>
-      <w:bookmarkStart w:id="7053" w:name="bm_ch3_2"/>
+      <w:bookmarkStart w:id="20128" w:name="bm_ch3_2"/>
       <w:pPr>
         <w:pStyle w:val="Heading2"/>
         <w:spacing w:line="360" w:lineRule="auto"/>
@@ -3642,7 +3642,7 @@
         </w:rPr>
         <w:t>3.2 Architecture générale et déploiement</w:t>
       </w:r>
-      <w:bookmarkEnd w:id="7053"/>
+      <w:bookmarkEnd w:id="20128"/>
     </w:p>
     <w:p>
       <w:pPr>
@@ -3697,9 +3697,43 @@
     </w:p>
     <w:p>
       <w:pPr>
-        <w:spacing w:after="480" w:line="360" w:lineRule="auto"/>
-        <w:jc w:val="both"/>
-      </w:pPr>
+        <w:spacing w:after="80" w:line="240" w:lineRule="auto"/>
+        <w:jc w:val="center"/>
+      </w:pPr>
+      <w:r>
+        <w:drawing>
+          <wp:inline xmlns:a="http://schemas.openxmlformats.org/drawingml/2006/main" xmlns:pic="http://schemas.openxmlformats.org/drawingml/2006/picture">
+            <wp:extent cx="5040000" cy="4447983"/>
+            <wp:docPr id="1" name="Picture 1"/>
+            <wp:cNvGraphicFramePr>
+              <a:graphicFrameLocks noChangeAspect="1"/>
+            </wp:cNvGraphicFramePr>
+            <a:graphic>
+              <a:graphicData uri="http://schemas.openxmlformats.org/drawingml/2006/picture">
+                <pic:pic>
+                  <pic:nvPicPr>
+                    <pic:cNvPr id="0" name="00_architecture_logique.png"/>
+                    <pic:cNvPicPr/>
+                  </pic:nvPicPr>
+                  <pic:blipFill>
+                    <a:blip r:embed="rId12"/>
+                    <a:stretch>
+                      <a:fillRect/>
+                    </a:stretch>
+                  </pic:blipFill>
+                  <pic:spPr>
+                    <a:xfrm>
+                      <a:off x="0" y="0"/>
+                      <a:ext cx="5040000" cy="4447983"/>
+                    </a:xfrm>
+                    <a:prstGeom prst="rect"/>
+                  </pic:spPr>
+                </pic:pic>
+              </a:graphicData>
+            </a:graphic>
+          </wp:inline>
+        </w:drawing>
+      </w:r>
     </w:p>
     <w:p>
       <w:pPr>
@@ -3761,9 +3795,43 @@
     </w:p>
     <w:p>
       <w:pPr>
-        <w:spacing w:after="480" w:line="360" w:lineRule="auto"/>
-        <w:jc w:val="both"/>
-      </w:pPr>
+        <w:spacing w:after="80" w:line="240" w:lineRule="auto"/>
+        <w:jc w:val="center"/>
+      </w:pPr>
+      <w:r>
+        <w:drawing>
+          <wp:inline xmlns:a="http://schemas.openxmlformats.org/drawingml/2006/main" xmlns:pic="http://schemas.openxmlformats.org/drawingml/2006/picture">
+            <wp:extent cx="5040000" cy="2346277"/>
+            <wp:docPr id="2" name="Picture 2"/>
+            <wp:cNvGraphicFramePr>
+              <a:graphicFrameLocks noChangeAspect="1"/>
+            </wp:cNvGraphicFramePr>
+            <a:graphic>
+              <a:graphicData uri="http://schemas.openxmlformats.org/drawingml/2006/picture">
+                <pic:pic>
+                  <pic:nvPicPr>
+                    <pic:cNvPr id="0" name="08_deploiement.png"/>
+                    <pic:cNvPicPr/>
+                  </pic:nvPicPr>
+                  <pic:blipFill>
+                    <a:blip r:embed="rId13"/>
+                    <a:stretch>
+                      <a:fillRect/>
+                    </a:stretch>
+                  </pic:blipFill>
+                  <pic:spPr>
+                    <a:xfrm>
+                      <a:off x="0" y="0"/>
+                      <a:ext cx="5040000" cy="2346277"/>
+                    </a:xfrm>
+                    <a:prstGeom prst="rect"/>
+                  </pic:spPr>
+                </pic:pic>
+              </a:graphicData>
+            </a:graphic>
+          </wp:inline>
+        </w:drawing>
+      </w:r>
     </w:p>
     <w:p>
       <w:pPr>
@@ -3807,7 +3875,7 @@
       </w:r>
     </w:p>
     <w:p>
-      <w:bookmarkStart w:id="69514" w:name="bm_ch3_3"/>
+      <w:bookmarkStart w:id="81965" w:name="bm_ch3_3"/>
       <w:pPr>
         <w:pStyle w:val="Heading2"/>
         <w:spacing w:line="360" w:lineRule="auto"/>
@@ -3822,7 +3890,7 @@
         </w:rPr>
         <w:t>3.3 Vue des cas d'utilisation</w:t>
       </w:r>
-      <w:bookmarkEnd w:id="69514"/>
+      <w:bookmarkEnd w:id="81965"/>
     </w:p>
     <w:p>
       <w:pPr>
@@ -3860,9 +3928,43 @@
     </w:p>
     <w:p>
       <w:pPr>
-        <w:spacing w:after="480" w:line="360" w:lineRule="auto"/>
-        <w:jc w:val="both"/>
-      </w:pPr>
+        <w:spacing w:after="80" w:line="240" w:lineRule="auto"/>
+        <w:jc w:val="center"/>
+      </w:pPr>
+      <w:r>
+        <w:drawing>
+          <wp:inline xmlns:a="http://schemas.openxmlformats.org/drawingml/2006/main" xmlns:pic="http://schemas.openxmlformats.org/drawingml/2006/picture">
+            <wp:extent cx="5040000" cy="5546154"/>
+            <wp:docPr id="3" name="Picture 3"/>
+            <wp:cNvGraphicFramePr>
+              <a:graphicFrameLocks noChangeAspect="1"/>
+            </wp:cNvGraphicFramePr>
+            <a:graphic>
+              <a:graphicData uri="http://schemas.openxmlformats.org/drawingml/2006/picture">
+                <pic:pic>
+                  <pic:nvPicPr>
+                    <pic:cNvPr id="0" name="01_usecase_super_admin.png"/>
+                    <pic:cNvPicPr/>
+                  </pic:nvPicPr>
+                  <pic:blipFill>
+                    <a:blip r:embed="rId14"/>
+                    <a:stretch>
+                      <a:fillRect/>
+                    </a:stretch>
+                  </pic:blipFill>
+                  <pic:spPr>
+                    <a:xfrm>
+                      <a:off x="0" y="0"/>
+                      <a:ext cx="5040000" cy="5546154"/>
+                    </a:xfrm>
+                    <a:prstGeom prst="rect"/>
+                  </pic:spPr>
+                </pic:pic>
+              </a:graphicData>
+            </a:graphic>
+          </wp:inline>
+        </w:drawing>
+      </w:r>
     </w:p>
     <w:p>
       <w:pPr>
@@ -3924,9 +4026,43 @@
     </w:p>
     <w:p>
       <w:pPr>
-        <w:spacing w:after="480" w:line="360" w:lineRule="auto"/>
-        <w:jc w:val="both"/>
-      </w:pPr>
+        <w:spacing w:after="80" w:line="240" w:lineRule="auto"/>
+        <w:jc w:val="center"/>
+      </w:pPr>
+      <w:r>
+        <w:drawing>
+          <wp:inline xmlns:a="http://schemas.openxmlformats.org/drawingml/2006/main" xmlns:pic="http://schemas.openxmlformats.org/drawingml/2006/picture">
+            <wp:extent cx="5040000" cy="6088819"/>
+            <wp:docPr id="4" name="Picture 4"/>
+            <wp:cNvGraphicFramePr>
+              <a:graphicFrameLocks noChangeAspect="1"/>
+            </wp:cNvGraphicFramePr>
+            <a:graphic>
+              <a:graphicData uri="http://schemas.openxmlformats.org/drawingml/2006/picture">
+                <pic:pic>
+                  <pic:nvPicPr>
+                    <pic:cNvPr id="0" name="02a_usecase_admin_organisation.png"/>
+                    <pic:cNvPicPr/>
+                  </pic:nvPicPr>
+                  <pic:blipFill>
+                    <a:blip r:embed="rId15"/>
+                    <a:stretch>
+                      <a:fillRect/>
+                    </a:stretch>
+                  </pic:blipFill>
+                  <pic:spPr>
+                    <a:xfrm>
+                      <a:off x="0" y="0"/>
+                      <a:ext cx="5040000" cy="6088819"/>
+                    </a:xfrm>
+                    <a:prstGeom prst="rect"/>
+                  </pic:spPr>
+                </pic:pic>
+              </a:graphicData>
+            </a:graphic>
+          </wp:inline>
+        </w:drawing>
+      </w:r>
     </w:p>
     <w:p>
       <w:pPr>
@@ -3971,9 +4107,43 @@
     </w:p>
     <w:p>
       <w:pPr>
-        <w:spacing w:after="480" w:line="360" w:lineRule="auto"/>
-        <w:jc w:val="both"/>
-      </w:pPr>
+        <w:spacing w:after="80" w:line="240" w:lineRule="auto"/>
+        <w:jc w:val="center"/>
+      </w:pPr>
+      <w:r>
+        <w:drawing>
+          <wp:inline xmlns:a="http://schemas.openxmlformats.org/drawingml/2006/main" xmlns:pic="http://schemas.openxmlformats.org/drawingml/2006/picture">
+            <wp:extent cx="5040000" cy="4854518"/>
+            <wp:docPr id="5" name="Picture 5"/>
+            <wp:cNvGraphicFramePr>
+              <a:graphicFrameLocks noChangeAspect="1"/>
+            </wp:cNvGraphicFramePr>
+            <a:graphic>
+              <a:graphicData uri="http://schemas.openxmlformats.org/drawingml/2006/picture">
+                <pic:pic>
+                  <pic:nvPicPr>
+                    <pic:cNvPr id="0" name="02b_usecase_admin_comptes.png"/>
+                    <pic:cNvPicPr/>
+                  </pic:nvPicPr>
+                  <pic:blipFill>
+                    <a:blip r:embed="rId16"/>
+                    <a:stretch>
+                      <a:fillRect/>
+                    </a:stretch>
+                  </pic:blipFill>
+                  <pic:spPr>
+                    <a:xfrm>
+                      <a:off x="0" y="0"/>
+                      <a:ext cx="5040000" cy="4854518"/>
+                    </a:xfrm>
+                    <a:prstGeom prst="rect"/>
+                  </pic:spPr>
+                </pic:pic>
+              </a:graphicData>
+            </a:graphic>
+          </wp:inline>
+        </w:drawing>
+      </w:r>
     </w:p>
     <w:p>
       <w:pPr>
@@ -4035,9 +4205,43 @@
     </w:p>
     <w:p>
       <w:pPr>
-        <w:spacing w:after="480" w:line="360" w:lineRule="auto"/>
-        <w:jc w:val="both"/>
-      </w:pPr>
+        <w:spacing w:after="80" w:line="240" w:lineRule="auto"/>
+        <w:jc w:val="center"/>
+      </w:pPr>
+      <w:r>
+        <w:drawing>
+          <wp:inline xmlns:a="http://schemas.openxmlformats.org/drawingml/2006/main" xmlns:pic="http://schemas.openxmlformats.org/drawingml/2006/picture">
+            <wp:extent cx="5040000" cy="8478845"/>
+            <wp:docPr id="6" name="Picture 6"/>
+            <wp:cNvGraphicFramePr>
+              <a:graphicFrameLocks noChangeAspect="1"/>
+            </wp:cNvGraphicFramePr>
+            <a:graphic>
+              <a:graphicData uri="http://schemas.openxmlformats.org/drawingml/2006/picture">
+                <pic:pic>
+                  <pic:nvPicPr>
+                    <pic:cNvPr id="0" name="03a_usecase_professeur_examens.png"/>
+                    <pic:cNvPicPr/>
+                  </pic:nvPicPr>
+                  <pic:blipFill>
+                    <a:blip r:embed="rId17"/>
+                    <a:stretch>
+                      <a:fillRect/>
+                    </a:stretch>
+                  </pic:blipFill>
+                  <pic:spPr>
+                    <a:xfrm>
+                      <a:off x="0" y="0"/>
+                      <a:ext cx="5040000" cy="8478845"/>
+                    </a:xfrm>
+                    <a:prstGeom prst="rect"/>
+                  </pic:spPr>
+                </pic:pic>
+              </a:graphicData>
+            </a:graphic>
+          </wp:inline>
+        </w:drawing>
+      </w:r>
     </w:p>
     <w:p>
       <w:pPr>
@@ -4082,9 +4286,43 @@
     </w:p>
     <w:p>
       <w:pPr>
-        <w:spacing w:after="480" w:line="360" w:lineRule="auto"/>
-        <w:jc w:val="both"/>
-      </w:pPr>
+        <w:spacing w:after="80" w:line="240" w:lineRule="auto"/>
+        <w:jc w:val="center"/>
+      </w:pPr>
+      <w:r>
+        <w:drawing>
+          <wp:inline xmlns:a="http://schemas.openxmlformats.org/drawingml/2006/main" xmlns:pic="http://schemas.openxmlformats.org/drawingml/2006/picture">
+            <wp:extent cx="5040000" cy="5339208"/>
+            <wp:docPr id="7" name="Picture 7"/>
+            <wp:cNvGraphicFramePr>
+              <a:graphicFrameLocks noChangeAspect="1"/>
+            </wp:cNvGraphicFramePr>
+            <a:graphic>
+              <a:graphicData uri="http://schemas.openxmlformats.org/drawingml/2006/picture">
+                <pic:pic>
+                  <pic:nvPicPr>
+                    <pic:cNvPr id="0" name="03b_usecase_professeur_suivi.png"/>
+                    <pic:cNvPicPr/>
+                  </pic:nvPicPr>
+                  <pic:blipFill>
+                    <a:blip r:embed="rId18"/>
+                    <a:stretch>
+                      <a:fillRect/>
+                    </a:stretch>
+                  </pic:blipFill>
+                  <pic:spPr>
+                    <a:xfrm>
+                      <a:off x="0" y="0"/>
+                      <a:ext cx="5040000" cy="5339208"/>
+                    </a:xfrm>
+                    <a:prstGeom prst="rect"/>
+                  </pic:spPr>
+                </pic:pic>
+              </a:graphicData>
+            </a:graphic>
+          </wp:inline>
+        </w:drawing>
+      </w:r>
     </w:p>
     <w:p>
       <w:pPr>
@@ -4146,9 +4384,43 @@
     </w:p>
     <w:p>
       <w:pPr>
-        <w:spacing w:after="480" w:line="360" w:lineRule="auto"/>
-        <w:jc w:val="both"/>
-      </w:pPr>
+        <w:spacing w:after="80" w:line="240" w:lineRule="auto"/>
+        <w:jc w:val="center"/>
+      </w:pPr>
+      <w:r>
+        <w:drawing>
+          <wp:inline xmlns:a="http://schemas.openxmlformats.org/drawingml/2006/main" xmlns:pic="http://schemas.openxmlformats.org/drawingml/2006/picture">
+            <wp:extent cx="5040000" cy="6905603"/>
+            <wp:docPr id="8" name="Picture 8"/>
+            <wp:cNvGraphicFramePr>
+              <a:graphicFrameLocks noChangeAspect="1"/>
+            </wp:cNvGraphicFramePr>
+            <a:graphic>
+              <a:graphicData uri="http://schemas.openxmlformats.org/drawingml/2006/picture">
+                <pic:pic>
+                  <pic:nvPicPr>
+                    <pic:cNvPr id="0" name="04_usecase_etudiant.png"/>
+                    <pic:cNvPicPr/>
+                  </pic:nvPicPr>
+                  <pic:blipFill>
+                    <a:blip r:embed="rId19"/>
+                    <a:stretch>
+                      <a:fillRect/>
+                    </a:stretch>
+                  </pic:blipFill>
+                  <pic:spPr>
+                    <a:xfrm>
+                      <a:off x="0" y="0"/>
+                      <a:ext cx="5040000" cy="6905603"/>
+                    </a:xfrm>
+                    <a:prstGeom prst="rect"/>
+                  </pic:spPr>
+                </pic:pic>
+              </a:graphicData>
+            </a:graphic>
+          </wp:inline>
+        </w:drawing>
+      </w:r>
     </w:p>
     <w:p>
       <w:pPr>
@@ -4192,7 +4464,7 @@
       </w:r>
     </w:p>
     <w:p>
-      <w:bookmarkStart w:id="69533" w:name="bm_ch3_4"/>
+      <w:bookmarkStart w:id="9773" w:name="bm_ch3_4"/>
       <w:pPr>
         <w:pStyle w:val="Heading2"/>
         <w:spacing w:line="360" w:lineRule="auto"/>
@@ -4207,7 +4479,7 @@
         </w:rPr>
         <w:t>3.4 Structure statique : classes et objets</w:t>
       </w:r>
-      <w:bookmarkEnd w:id="69533"/>
+      <w:bookmarkEnd w:id="9773"/>
     </w:p>
     <w:p>
       <w:pPr>
@@ -4245,9 +4517,43 @@
     </w:p>
     <w:p>
       <w:pPr>
-        <w:spacing w:after="480" w:line="360" w:lineRule="auto"/>
-        <w:jc w:val="both"/>
-      </w:pPr>
+        <w:spacing w:after="80" w:line="240" w:lineRule="auto"/>
+        <w:jc w:val="center"/>
+      </w:pPr>
+      <w:r>
+        <w:drawing>
+          <wp:inline xmlns:a="http://schemas.openxmlformats.org/drawingml/2006/main" xmlns:pic="http://schemas.openxmlformats.org/drawingml/2006/picture">
+            <wp:extent cx="5040000" cy="5788219"/>
+            <wp:docPr id="9" name="Picture 9"/>
+            <wp:cNvGraphicFramePr>
+              <a:graphicFrameLocks noChangeAspect="1"/>
+            </wp:cNvGraphicFramePr>
+            <a:graphic>
+              <a:graphicData uri="http://schemas.openxmlformats.org/drawingml/2006/picture">
+                <pic:pic>
+                  <pic:nvPicPr>
+                    <pic:cNvPr id="0" name="05a_classes_organisation.png"/>
+                    <pic:cNvPicPr/>
+                  </pic:nvPicPr>
+                  <pic:blipFill>
+                    <a:blip r:embed="rId20"/>
+                    <a:stretch>
+                      <a:fillRect/>
+                    </a:stretch>
+                  </pic:blipFill>
+                  <pic:spPr>
+                    <a:xfrm>
+                      <a:off x="0" y="0"/>
+                      <a:ext cx="5040000" cy="5788219"/>
+                    </a:xfrm>
+                    <a:prstGeom prst="rect"/>
+                  </pic:spPr>
+                </pic:pic>
+              </a:graphicData>
+            </a:graphic>
+          </wp:inline>
+        </w:drawing>
+      </w:r>
     </w:p>
     <w:p>
       <w:pPr>
@@ -4292,9 +4598,43 @@
     </w:p>
     <w:p>
       <w:pPr>
-        <w:spacing w:after="480" w:line="360" w:lineRule="auto"/>
-        <w:jc w:val="both"/>
-      </w:pPr>
+        <w:spacing w:after="80" w:line="240" w:lineRule="auto"/>
+        <w:jc w:val="center"/>
+      </w:pPr>
+      <w:r>
+        <w:drawing>
+          <wp:inline xmlns:a="http://schemas.openxmlformats.org/drawingml/2006/main" xmlns:pic="http://schemas.openxmlformats.org/drawingml/2006/picture">
+            <wp:extent cx="5040000" cy="2723008"/>
+            <wp:docPr id="10" name="Picture 10"/>
+            <wp:cNvGraphicFramePr>
+              <a:graphicFrameLocks noChangeAspect="1"/>
+            </wp:cNvGraphicFramePr>
+            <a:graphic>
+              <a:graphicData uri="http://schemas.openxmlformats.org/drawingml/2006/picture">
+                <pic:pic>
+                  <pic:nvPicPr>
+                    <pic:cNvPr id="0" name="05b1_classes_conception_examen.png"/>
+                    <pic:cNvPicPr/>
+                  </pic:nvPicPr>
+                  <pic:blipFill>
+                    <a:blip r:embed="rId21"/>
+                    <a:stretch>
+                      <a:fillRect/>
+                    </a:stretch>
+                  </pic:blipFill>
+                  <pic:spPr>
+                    <a:xfrm>
+                      <a:off x="0" y="0"/>
+                      <a:ext cx="5040000" cy="2723008"/>
+                    </a:xfrm>
+                    <a:prstGeom prst="rect"/>
+                  </pic:spPr>
+                </pic:pic>
+              </a:graphicData>
+            </a:graphic>
+          </wp:inline>
+        </w:drawing>
+      </w:r>
     </w:p>
     <w:p>
       <w:pPr>
@@ -4339,9 +4679,43 @@
     </w:p>
     <w:p>
       <w:pPr>
-        <w:spacing w:after="480" w:line="360" w:lineRule="auto"/>
-        <w:jc w:val="both"/>
-      </w:pPr>
+        <w:spacing w:after="80" w:line="240" w:lineRule="auto"/>
+        <w:jc w:val="center"/>
+      </w:pPr>
+      <w:r>
+        <w:drawing>
+          <wp:inline xmlns:a="http://schemas.openxmlformats.org/drawingml/2006/main" xmlns:pic="http://schemas.openxmlformats.org/drawingml/2006/picture">
+            <wp:extent cx="5040000" cy="3920563"/>
+            <wp:docPr id="11" name="Picture 11"/>
+            <wp:cNvGraphicFramePr>
+              <a:graphicFrameLocks noChangeAspect="1"/>
+            </wp:cNvGraphicFramePr>
+            <a:graphic>
+              <a:graphicData uri="http://schemas.openxmlformats.org/drawingml/2006/picture">
+                <pic:pic>
+                  <pic:nvPicPr>
+                    <pic:cNvPr id="0" name="05b2_classes_passation.png"/>
+                    <pic:cNvPicPr/>
+                  </pic:nvPicPr>
+                  <pic:blipFill>
+                    <a:blip r:embed="rId22"/>
+                    <a:stretch>
+                      <a:fillRect/>
+                    </a:stretch>
+                  </pic:blipFill>
+                  <pic:spPr>
+                    <a:xfrm>
+                      <a:off x="0" y="0"/>
+                      <a:ext cx="5040000" cy="3920563"/>
+                    </a:xfrm>
+                    <a:prstGeom prst="rect"/>
+                  </pic:spPr>
+                </pic:pic>
+              </a:graphicData>
+            </a:graphic>
+          </wp:inline>
+        </w:drawing>
+      </w:r>
     </w:p>
     <w:p>
       <w:pPr>
@@ -4403,9 +4777,43 @@
     </w:p>
     <w:p>
       <w:pPr>
-        <w:spacing w:after="480" w:line="360" w:lineRule="auto"/>
-        <w:jc w:val="both"/>
-      </w:pPr>
+        <w:spacing w:after="80" w:line="240" w:lineRule="auto"/>
+        <w:jc w:val="center"/>
+      </w:pPr>
+      <w:r>
+        <w:drawing>
+          <wp:inline xmlns:a="http://schemas.openxmlformats.org/drawingml/2006/main" xmlns:pic="http://schemas.openxmlformats.org/drawingml/2006/picture">
+            <wp:extent cx="5040000" cy="4857517"/>
+            <wp:docPr id="12" name="Picture 12"/>
+            <wp:cNvGraphicFramePr>
+              <a:graphicFrameLocks noChangeAspect="1"/>
+            </wp:cNvGraphicFramePr>
+            <a:graphic>
+              <a:graphicData uri="http://schemas.openxmlformats.org/drawingml/2006/picture">
+                <pic:pic>
+                  <pic:nvPicPr>
+                    <pic:cNvPr id="0" name="06a_objets_organisation.png"/>
+                    <pic:cNvPicPr/>
+                  </pic:nvPicPr>
+                  <pic:blipFill>
+                    <a:blip r:embed="rId23"/>
+                    <a:stretch>
+                      <a:fillRect/>
+                    </a:stretch>
+                  </pic:blipFill>
+                  <pic:spPr>
+                    <a:xfrm>
+                      <a:off x="0" y="0"/>
+                      <a:ext cx="5040000" cy="4857517"/>
+                    </a:xfrm>
+                    <a:prstGeom prst="rect"/>
+                  </pic:spPr>
+                </pic:pic>
+              </a:graphicData>
+            </a:graphic>
+          </wp:inline>
+        </w:drawing>
+      </w:r>
     </w:p>
     <w:p>
       <w:pPr>
@@ -4450,9 +4858,43 @@
     </w:p>
     <w:p>
       <w:pPr>
-        <w:spacing w:after="480" w:line="360" w:lineRule="auto"/>
-        <w:jc w:val="both"/>
-      </w:pPr>
+        <w:spacing w:after="80" w:line="240" w:lineRule="auto"/>
+        <w:jc w:val="center"/>
+      </w:pPr>
+      <w:r>
+        <w:drawing>
+          <wp:inline xmlns:a="http://schemas.openxmlformats.org/drawingml/2006/main" xmlns:pic="http://schemas.openxmlformats.org/drawingml/2006/picture">
+            <wp:extent cx="5040000" cy="2167552"/>
+            <wp:docPr id="13" name="Picture 13"/>
+            <wp:cNvGraphicFramePr>
+              <a:graphicFrameLocks noChangeAspect="1"/>
+            </wp:cNvGraphicFramePr>
+            <a:graphic>
+              <a:graphicData uri="http://schemas.openxmlformats.org/drawingml/2006/picture">
+                <pic:pic>
+                  <pic:nvPicPr>
+                    <pic:cNvPr id="0" name="06b_objets_conception_examen.png"/>
+                    <pic:cNvPicPr/>
+                  </pic:nvPicPr>
+                  <pic:blipFill>
+                    <a:blip r:embed="rId24"/>
+                    <a:stretch>
+                      <a:fillRect/>
+                    </a:stretch>
+                  </pic:blipFill>
+                  <pic:spPr>
+                    <a:xfrm>
+                      <a:off x="0" y="0"/>
+                      <a:ext cx="5040000" cy="2167552"/>
+                    </a:xfrm>
+                    <a:prstGeom prst="rect"/>
+                  </pic:spPr>
+                </pic:pic>
+              </a:graphicData>
+            </a:graphic>
+          </wp:inline>
+        </w:drawing>
+      </w:r>
     </w:p>
     <w:p>
       <w:pPr>
@@ -4497,9 +4939,43 @@
     </w:p>
     <w:p>
       <w:pPr>
-        <w:spacing w:after="480" w:line="360" w:lineRule="auto"/>
-        <w:jc w:val="both"/>
-      </w:pPr>
+        <w:spacing w:after="80" w:line="240" w:lineRule="auto"/>
+        <w:jc w:val="center"/>
+      </w:pPr>
+      <w:r>
+        <w:drawing>
+          <wp:inline xmlns:a="http://schemas.openxmlformats.org/drawingml/2006/main" xmlns:pic="http://schemas.openxmlformats.org/drawingml/2006/picture">
+            <wp:extent cx="5040000" cy="4050998"/>
+            <wp:docPr id="14" name="Picture 14"/>
+            <wp:cNvGraphicFramePr>
+              <a:graphicFrameLocks noChangeAspect="1"/>
+            </wp:cNvGraphicFramePr>
+            <a:graphic>
+              <a:graphicData uri="http://schemas.openxmlformats.org/drawingml/2006/picture">
+                <pic:pic>
+                  <pic:nvPicPr>
+                    <pic:cNvPr id="0" name="06c_objets_passation.png"/>
+                    <pic:cNvPicPr/>
+                  </pic:nvPicPr>
+                  <pic:blipFill>
+                    <a:blip r:embed="rId25"/>
+                    <a:stretch>
+                      <a:fillRect/>
+                    </a:stretch>
+                  </pic:blipFill>
+                  <pic:spPr>
+                    <a:xfrm>
+                      <a:off x="0" y="0"/>
+                      <a:ext cx="5040000" cy="4050998"/>
+                    </a:xfrm>
+                    <a:prstGeom prst="rect"/>
+                  </pic:spPr>
+                </pic:pic>
+              </a:graphicData>
+            </a:graphic>
+          </wp:inline>
+        </w:drawing>
+      </w:r>
     </w:p>
     <w:p>
       <w:pPr>
@@ -4543,7 +5019,7 @@
       </w:r>
     </w:p>
     <w:p>
-      <w:bookmarkStart w:id="36789" w:name="bm_ch3_5"/>
+      <w:bookmarkStart w:id="88216" w:name="bm_ch3_5"/>
       <w:pPr>
         <w:pStyle w:val="Heading2"/>
         <w:spacing w:line="360" w:lineRule="auto"/>
@@ -4558,7 +5034,7 @@
         </w:rPr>
         <w:t>3.5 Organisation en composants</w:t>
       </w:r>
-      <w:bookmarkEnd w:id="36789"/>
+      <w:bookmarkEnd w:id="88216"/>
     </w:p>
     <w:p>
       <w:pPr>
@@ -4579,9 +5055,43 @@
     </w:p>
     <w:p>
       <w:pPr>
-        <w:spacing w:after="480" w:line="360" w:lineRule="auto"/>
-        <w:jc w:val="both"/>
-      </w:pPr>
+        <w:spacing w:after="80" w:line="240" w:lineRule="auto"/>
+        <w:jc w:val="center"/>
+      </w:pPr>
+      <w:r>
+        <w:drawing>
+          <wp:inline xmlns:a="http://schemas.openxmlformats.org/drawingml/2006/main" xmlns:pic="http://schemas.openxmlformats.org/drawingml/2006/picture">
+            <wp:extent cx="5040000" cy="1636889"/>
+            <wp:docPr id="15" name="Picture 15"/>
+            <wp:cNvGraphicFramePr>
+              <a:graphicFrameLocks noChangeAspect="1"/>
+            </wp:cNvGraphicFramePr>
+            <a:graphic>
+              <a:graphicData uri="http://schemas.openxmlformats.org/drawingml/2006/picture">
+                <pic:pic>
+                  <pic:nvPicPr>
+                    <pic:cNvPr id="0" name="07a_composants_vue_ensemble.png"/>
+                    <pic:cNvPicPr/>
+                  </pic:nvPicPr>
+                  <pic:blipFill>
+                    <a:blip r:embed="rId26"/>
+                    <a:stretch>
+                      <a:fillRect/>
+                    </a:stretch>
+                  </pic:blipFill>
+                  <pic:spPr>
+                    <a:xfrm>
+                      <a:off x="0" y="0"/>
+                      <a:ext cx="5040000" cy="1636889"/>
+                    </a:xfrm>
+                    <a:prstGeom prst="rect"/>
+                  </pic:spPr>
+                </pic:pic>
+              </a:graphicData>
+            </a:graphic>
+          </wp:inline>
+        </w:drawing>
+      </w:r>
     </w:p>
     <w:p>
       <w:pPr>
@@ -4626,9 +5136,43 @@
     </w:p>
     <w:p>
       <w:pPr>
-        <w:spacing w:after="480" w:line="360" w:lineRule="auto"/>
-        <w:jc w:val="both"/>
-      </w:pPr>
+        <w:spacing w:after="80" w:line="240" w:lineRule="auto"/>
+        <w:jc w:val="center"/>
+      </w:pPr>
+      <w:r>
+        <w:drawing>
+          <wp:inline xmlns:a="http://schemas.openxmlformats.org/drawingml/2006/main" xmlns:pic="http://schemas.openxmlformats.org/drawingml/2006/picture">
+            <wp:extent cx="5040000" cy="2566360"/>
+            <wp:docPr id="16" name="Picture 16"/>
+            <wp:cNvGraphicFramePr>
+              <a:graphicFrameLocks noChangeAspect="1"/>
+            </wp:cNvGraphicFramePr>
+            <a:graphic>
+              <a:graphicData uri="http://schemas.openxmlformats.org/drawingml/2006/picture">
+                <pic:pic>
+                  <pic:nvPicPr>
+                    <pic:cNvPr id="0" name="07b_composants_admin_auth.png"/>
+                    <pic:cNvPicPr/>
+                  </pic:nvPicPr>
+                  <pic:blipFill>
+                    <a:blip r:embed="rId27"/>
+                    <a:stretch>
+                      <a:fillRect/>
+                    </a:stretch>
+                  </pic:blipFill>
+                  <pic:spPr>
+                    <a:xfrm>
+                      <a:off x="0" y="0"/>
+                      <a:ext cx="5040000" cy="2566360"/>
+                    </a:xfrm>
+                    <a:prstGeom prst="rect"/>
+                  </pic:spPr>
+                </pic:pic>
+              </a:graphicData>
+            </a:graphic>
+          </wp:inline>
+        </w:drawing>
+      </w:r>
     </w:p>
     <w:p>
       <w:pPr>
@@ -4673,9 +5217,43 @@
     </w:p>
     <w:p>
       <w:pPr>
-        <w:spacing w:after="480" w:line="360" w:lineRule="auto"/>
-        <w:jc w:val="both"/>
-      </w:pPr>
+        <w:spacing w:after="80" w:line="240" w:lineRule="auto"/>
+        <w:jc w:val="center"/>
+      </w:pPr>
+      <w:r>
+        <w:drawing>
+          <wp:inline xmlns:a="http://schemas.openxmlformats.org/drawingml/2006/main" xmlns:pic="http://schemas.openxmlformats.org/drawingml/2006/picture">
+            <wp:extent cx="5040000" cy="3049268"/>
+            <wp:docPr id="17" name="Picture 17"/>
+            <wp:cNvGraphicFramePr>
+              <a:graphicFrameLocks noChangeAspect="1"/>
+            </wp:cNvGraphicFramePr>
+            <a:graphic>
+              <a:graphicData uri="http://schemas.openxmlformats.org/drawingml/2006/picture">
+                <pic:pic>
+                  <pic:nvPicPr>
+                    <pic:cNvPr id="0" name="07c_composants_examens.png"/>
+                    <pic:cNvPicPr/>
+                  </pic:nvPicPr>
+                  <pic:blipFill>
+                    <a:blip r:embed="rId28"/>
+                    <a:stretch>
+                      <a:fillRect/>
+                    </a:stretch>
+                  </pic:blipFill>
+                  <pic:spPr>
+                    <a:xfrm>
+                      <a:off x="0" y="0"/>
+                      <a:ext cx="5040000" cy="3049268"/>
+                    </a:xfrm>
+                    <a:prstGeom prst="rect"/>
+                  </pic:spPr>
+                </pic:pic>
+              </a:graphicData>
+            </a:graphic>
+          </wp:inline>
+        </w:drawing>
+      </w:r>
     </w:p>
     <w:p>
       <w:pPr>
@@ -4736,7 +5314,7 @@
       </w:r>
     </w:p>
     <w:p>
-      <w:bookmarkStart w:id="7856" w:name="bm_ch3_6"/>
+      <w:bookmarkStart w:id="49488" w:name="bm_ch3_6"/>
       <w:pPr>
         <w:pStyle w:val="Heading2"/>
         <w:spacing w:line="360" w:lineRule="auto"/>
@@ -4751,10 +5329,10 @@
         </w:rPr>
         <w:t>3.6 Dynamique du système</w:t>
       </w:r>
-      <w:bookmarkEnd w:id="7856"/>
-    </w:p>
-    <w:p>
-      <w:bookmarkStart w:id="37078" w:name="3_6_1_Cycle_de_vie_d_un_examen"/>
+      <w:bookmarkEnd w:id="49488"/>
+    </w:p>
+    <w:p>
+      <w:bookmarkStart w:id="59688" w:name="3_6_1_Cycle_de_vie_d_un_examen"/>
       <w:pPr>
         <w:pStyle w:val="Heading3"/>
         <w:spacing w:line="360" w:lineRule="auto"/>
@@ -4769,7 +5347,7 @@
         </w:rPr>
         <w:t>3.6.1 Cycle de vie d'un examen</w:t>
       </w:r>
-      <w:bookmarkEnd w:id="37078"/>
+      <w:bookmarkEnd w:id="59688"/>
     </w:p>
     <w:p>
       <w:pPr>
@@ -4790,9 +5368,43 @@
     </w:p>
     <w:p>
       <w:pPr>
-        <w:spacing w:after="480" w:line="360" w:lineRule="auto"/>
-        <w:jc w:val="both"/>
-      </w:pPr>
+        <w:spacing w:after="80" w:line="240" w:lineRule="auto"/>
+        <w:jc w:val="center"/>
+      </w:pPr>
+      <w:r>
+        <w:drawing>
+          <wp:inline xmlns:a="http://schemas.openxmlformats.org/drawingml/2006/main" xmlns:pic="http://schemas.openxmlformats.org/drawingml/2006/picture">
+            <wp:extent cx="5040000" cy="1256305"/>
+            <wp:docPr id="18" name="Picture 18"/>
+            <wp:cNvGraphicFramePr>
+              <a:graphicFrameLocks noChangeAspect="1"/>
+            </wp:cNvGraphicFramePr>
+            <a:graphic>
+              <a:graphicData uri="http://schemas.openxmlformats.org/drawingml/2006/picture">
+                <pic:pic>
+                  <pic:nvPicPr>
+                    <pic:cNvPr id="0" name="09_etats_examen.png"/>
+                    <pic:cNvPicPr/>
+                  </pic:nvPicPr>
+                  <pic:blipFill>
+                    <a:blip r:embed="rId29"/>
+                    <a:stretch>
+                      <a:fillRect/>
+                    </a:stretch>
+                  </pic:blipFill>
+                  <pic:spPr>
+                    <a:xfrm>
+                      <a:off x="0" y="0"/>
+                      <a:ext cx="5040000" cy="1256305"/>
+                    </a:xfrm>
+                    <a:prstGeom prst="rect"/>
+                  </pic:spPr>
+                </pic:pic>
+              </a:graphicData>
+            </a:graphic>
+          </wp:inline>
+        </w:drawing>
+      </w:r>
     </w:p>
     <w:p>
       <w:pPr>
@@ -4836,7 +5448,7 @@
       </w:r>
     </w:p>
     <w:p>
-      <w:bookmarkStart w:id="7010" w:name="3_6_2_Interactions_principales"/>
+      <w:bookmarkStart w:id="24775" w:name="3_6_2_Interactions_principales"/>
       <w:pPr>
         <w:pStyle w:val="Heading3"/>
         <w:spacing w:line="360" w:lineRule="auto"/>
@@ -4851,7 +5463,7 @@
         </w:rPr>
         <w:t>3.6.2 Interactions principales</w:t>
       </w:r>
-      <w:bookmarkEnd w:id="7010"/>
+      <w:bookmarkEnd w:id="24775"/>
     </w:p>
     <w:p>
       <w:pPr>
@@ -4872,9 +5484,43 @@
     </w:p>
     <w:p>
       <w:pPr>
-        <w:spacing w:after="480" w:line="360" w:lineRule="auto"/>
-        <w:jc w:val="both"/>
-      </w:pPr>
+        <w:spacing w:after="80" w:line="240" w:lineRule="auto"/>
+        <w:jc w:val="center"/>
+      </w:pPr>
+      <w:r>
+        <w:drawing>
+          <wp:inline xmlns:a="http://schemas.openxmlformats.org/drawingml/2006/main" xmlns:pic="http://schemas.openxmlformats.org/drawingml/2006/picture">
+            <wp:extent cx="5040000" cy="5006842"/>
+            <wp:docPr id="19" name="Picture 19"/>
+            <wp:cNvGraphicFramePr>
+              <a:graphicFrameLocks noChangeAspect="1"/>
+            </wp:cNvGraphicFramePr>
+            <a:graphic>
+              <a:graphicData uri="http://schemas.openxmlformats.org/drawingml/2006/picture">
+                <pic:pic>
+                  <pic:nvPicPr>
+                    <pic:cNvPr id="0" name="10_sequence_connexion.png"/>
+                    <pic:cNvPicPr/>
+                  </pic:nvPicPr>
+                  <pic:blipFill>
+                    <a:blip r:embed="rId30"/>
+                    <a:stretch>
+                      <a:fillRect/>
+                    </a:stretch>
+                  </pic:blipFill>
+                  <pic:spPr>
+                    <a:xfrm>
+                      <a:off x="0" y="0"/>
+                      <a:ext cx="5040000" cy="5006842"/>
+                    </a:xfrm>
+                    <a:prstGeom prst="rect"/>
+                  </pic:spPr>
+                </pic:pic>
+              </a:graphicData>
+            </a:graphic>
+          </wp:inline>
+        </w:drawing>
+      </w:r>
     </w:p>
     <w:p>
       <w:pPr>
@@ -4936,9 +5582,43 @@
     </w:p>
     <w:p>
       <w:pPr>
-        <w:spacing w:after="480" w:line="360" w:lineRule="auto"/>
-        <w:jc w:val="both"/>
-      </w:pPr>
+        <w:spacing w:after="80" w:line="240" w:lineRule="auto"/>
+        <w:jc w:val="center"/>
+      </w:pPr>
+      <w:r>
+        <w:drawing>
+          <wp:inline xmlns:a="http://schemas.openxmlformats.org/drawingml/2006/main" xmlns:pic="http://schemas.openxmlformats.org/drawingml/2006/picture">
+            <wp:extent cx="5040000" cy="5005479"/>
+            <wp:docPr id="20" name="Picture 20"/>
+            <wp:cNvGraphicFramePr>
+              <a:graphicFrameLocks noChangeAspect="1"/>
+            </wp:cNvGraphicFramePr>
+            <a:graphic>
+              <a:graphicData uri="http://schemas.openxmlformats.org/drawingml/2006/picture">
+                <pic:pic>
+                  <pic:nvPicPr>
+                    <pic:cNvPr id="0" name="11_sequence_publication.png"/>
+                    <pic:cNvPicPr/>
+                  </pic:nvPicPr>
+                  <pic:blipFill>
+                    <a:blip r:embed="rId31"/>
+                    <a:stretch>
+                      <a:fillRect/>
+                    </a:stretch>
+                  </pic:blipFill>
+                  <pic:spPr>
+                    <a:xfrm>
+                      <a:off x="0" y="0"/>
+                      <a:ext cx="5040000" cy="5005479"/>
+                    </a:xfrm>
+                    <a:prstGeom prst="rect"/>
+                  </pic:spPr>
+                </pic:pic>
+              </a:graphicData>
+            </a:graphic>
+          </wp:inline>
+        </w:drawing>
+      </w:r>
     </w:p>
     <w:p>
       <w:pPr>
@@ -5000,9 +5680,43 @@
     </w:p>
     <w:p>
       <w:pPr>
-        <w:spacing w:after="480" w:line="360" w:lineRule="auto"/>
-        <w:jc w:val="both"/>
-      </w:pPr>
+        <w:spacing w:after="80" w:line="240" w:lineRule="auto"/>
+        <w:jc w:val="center"/>
+      </w:pPr>
+      <w:r>
+        <w:drawing>
+          <wp:inline xmlns:a="http://schemas.openxmlformats.org/drawingml/2006/main" xmlns:pic="http://schemas.openxmlformats.org/drawingml/2006/picture">
+            <wp:extent cx="5040000" cy="3684878"/>
+            <wp:docPr id="21" name="Picture 21"/>
+            <wp:cNvGraphicFramePr>
+              <a:graphicFrameLocks noChangeAspect="1"/>
+            </wp:cNvGraphicFramePr>
+            <a:graphic>
+              <a:graphicData uri="http://schemas.openxmlformats.org/drawingml/2006/picture">
+                <pic:pic>
+                  <pic:nvPicPr>
+                    <pic:cNvPr id="0" name="12_sequence_acces_etudiant.png"/>
+                    <pic:cNvPicPr/>
+                  </pic:nvPicPr>
+                  <pic:blipFill>
+                    <a:blip r:embed="rId32"/>
+                    <a:stretch>
+                      <a:fillRect/>
+                    </a:stretch>
+                  </pic:blipFill>
+                  <pic:spPr>
+                    <a:xfrm>
+                      <a:off x="0" y="0"/>
+                      <a:ext cx="5040000" cy="3684878"/>
+                    </a:xfrm>
+                    <a:prstGeom prst="rect"/>
+                  </pic:spPr>
+                </pic:pic>
+              </a:graphicData>
+            </a:graphic>
+          </wp:inline>
+        </w:drawing>
+      </w:r>
     </w:p>
     <w:p>
       <w:pPr>
@@ -5064,9 +5778,43 @@
     </w:p>
     <w:p>
       <w:pPr>
-        <w:spacing w:after="480" w:line="360" w:lineRule="auto"/>
-        <w:jc w:val="both"/>
-      </w:pPr>
+        <w:spacing w:after="80" w:line="240" w:lineRule="auto"/>
+        <w:jc w:val="center"/>
+      </w:pPr>
+      <w:r>
+        <w:drawing>
+          <wp:inline xmlns:a="http://schemas.openxmlformats.org/drawingml/2006/main" xmlns:pic="http://schemas.openxmlformats.org/drawingml/2006/picture">
+            <wp:extent cx="5040000" cy="3349818"/>
+            <wp:docPr id="22" name="Picture 22"/>
+            <wp:cNvGraphicFramePr>
+              <a:graphicFrameLocks noChangeAspect="1"/>
+            </wp:cNvGraphicFramePr>
+            <a:graphic>
+              <a:graphicData uri="http://schemas.openxmlformats.org/drawingml/2006/picture">
+                <pic:pic>
+                  <pic:nvPicPr>
+                    <pic:cNvPr id="0" name="13_sequence_execution.png"/>
+                    <pic:cNvPicPr/>
+                  </pic:nvPicPr>
+                  <pic:blipFill>
+                    <a:blip r:embed="rId33"/>
+                    <a:stretch>
+                      <a:fillRect/>
+                    </a:stretch>
+                  </pic:blipFill>
+                  <pic:spPr>
+                    <a:xfrm>
+                      <a:off x="0" y="0"/>
+                      <a:ext cx="5040000" cy="3349818"/>
+                    </a:xfrm>
+                    <a:prstGeom prst="rect"/>
+                  </pic:spPr>
+                </pic:pic>
+              </a:graphicData>
+            </a:graphic>
+          </wp:inline>
+        </w:drawing>
+      </w:r>
     </w:p>
     <w:p>
       <w:pPr>
@@ -5128,9 +5876,43 @@
     </w:p>
     <w:p>
       <w:pPr>
-        <w:spacing w:after="480" w:line="360" w:lineRule="auto"/>
-        <w:jc w:val="both"/>
-      </w:pPr>
+        <w:spacing w:after="80" w:line="240" w:lineRule="auto"/>
+        <w:jc w:val="center"/>
+      </w:pPr>
+      <w:r>
+        <w:drawing>
+          <wp:inline xmlns:a="http://schemas.openxmlformats.org/drawingml/2006/main" xmlns:pic="http://schemas.openxmlformats.org/drawingml/2006/picture">
+            <wp:extent cx="5040000" cy="5108747"/>
+            <wp:docPr id="23" name="Picture 23"/>
+            <wp:cNvGraphicFramePr>
+              <a:graphicFrameLocks noChangeAspect="1"/>
+            </wp:cNvGraphicFramePr>
+            <a:graphic>
+              <a:graphicData uri="http://schemas.openxmlformats.org/drawingml/2006/picture">
+                <pic:pic>
+                  <pic:nvPicPr>
+                    <pic:cNvPr id="0" name="14_sequence_soumission_correction.png"/>
+                    <pic:cNvPicPr/>
+                  </pic:nvPicPr>
+                  <pic:blipFill>
+                    <a:blip r:embed="rId34"/>
+                    <a:stretch>
+                      <a:fillRect/>
+                    </a:stretch>
+                  </pic:blipFill>
+                  <pic:spPr>
+                    <a:xfrm>
+                      <a:off x="0" y="0"/>
+                      <a:ext cx="5040000" cy="5108747"/>
+                    </a:xfrm>
+                    <a:prstGeom prst="rect"/>
+                  </pic:spPr>
+                </pic:pic>
+              </a:graphicData>
+            </a:graphic>
+          </wp:inline>
+        </w:drawing>
+      </w:r>
     </w:p>
     <w:p>
       <w:pPr>
@@ -5192,9 +5974,43 @@
     </w:p>
     <w:p>
       <w:pPr>
-        <w:spacing w:after="480" w:line="360" w:lineRule="auto"/>
-        <w:jc w:val="both"/>
-      </w:pPr>
+        <w:spacing w:after="80" w:line="240" w:lineRule="auto"/>
+        <w:jc w:val="center"/>
+      </w:pPr>
+      <w:r>
+        <w:drawing>
+          <wp:inline xmlns:a="http://schemas.openxmlformats.org/drawingml/2006/main" xmlns:pic="http://schemas.openxmlformats.org/drawingml/2006/picture">
+            <wp:extent cx="5040000" cy="4504414"/>
+            <wp:docPr id="24" name="Picture 24"/>
+            <wp:cNvGraphicFramePr>
+              <a:graphicFrameLocks noChangeAspect="1"/>
+            </wp:cNvGraphicFramePr>
+            <a:graphic>
+              <a:graphicData uri="http://schemas.openxmlformats.org/drawingml/2006/picture">
+                <pic:pic>
+                  <pic:nvPicPr>
+                    <pic:cNvPr id="0" name="15_sequence_incidents.png"/>
+                    <pic:cNvPicPr/>
+                  </pic:nvPicPr>
+                  <pic:blipFill>
+                    <a:blip r:embed="rId35"/>
+                    <a:stretch>
+                      <a:fillRect/>
+                    </a:stretch>
+                  </pic:blipFill>
+                  <pic:spPr>
+                    <a:xfrm>
+                      <a:off x="0" y="0"/>
+                      <a:ext cx="5040000" cy="4504414"/>
+                    </a:xfrm>
+                    <a:prstGeom prst="rect"/>
+                  </pic:spPr>
+                </pic:pic>
+              </a:graphicData>
+            </a:graphic>
+          </wp:inline>
+        </w:drawing>
+      </w:r>
     </w:p>
     <w:p>
       <w:pPr>
@@ -5238,7 +6054,7 @@
       </w:r>
     </w:p>
     <w:p>
-      <w:bookmarkStart w:id="73550" w:name="3_6_3_Parcours_d_activit__de_l__tudiant"/>
+      <w:bookmarkStart w:id="82522" w:name="3_6_3_Parcours_d_activit__de_l__tudiant"/>
       <w:pPr>
         <w:pStyle w:val="Heading3"/>
         <w:spacing w:line="360" w:lineRule="auto"/>
@@ -5253,7 +6069,7 @@
         </w:rPr>
         <w:t>3.6.3 Parcours d'activité de l'étudiant</w:t>
       </w:r>
-      <w:bookmarkEnd w:id="73550"/>
+      <w:bookmarkEnd w:id="82522"/>
     </w:p>
     <w:p>
       <w:pPr>
@@ -5274,9 +6090,43 @@
     </w:p>
     <w:p>
       <w:pPr>
-        <w:spacing w:after="480" w:line="360" w:lineRule="auto"/>
-        <w:jc w:val="both"/>
-      </w:pPr>
+        <w:spacing w:after="80" w:line="240" w:lineRule="auto"/>
+        <w:jc w:val="center"/>
+      </w:pPr>
+      <w:r>
+        <w:drawing>
+          <wp:inline xmlns:a="http://schemas.openxmlformats.org/drawingml/2006/main" xmlns:pic="http://schemas.openxmlformats.org/drawingml/2006/picture">
+            <wp:extent cx="5040000" cy="7913090"/>
+            <wp:docPr id="25" name="Picture 25"/>
+            <wp:cNvGraphicFramePr>
+              <a:graphicFrameLocks noChangeAspect="1"/>
+            </wp:cNvGraphicFramePr>
+            <a:graphic>
+              <a:graphicData uri="http://schemas.openxmlformats.org/drawingml/2006/picture">
+                <pic:pic>
+                  <pic:nvPicPr>
+                    <pic:cNvPr id="0" name="16a_activite_acces_attente.png"/>
+                    <pic:cNvPicPr/>
+                  </pic:nvPicPr>
+                  <pic:blipFill>
+                    <a:blip r:embed="rId36"/>
+                    <a:stretch>
+                      <a:fillRect/>
+                    </a:stretch>
+                  </pic:blipFill>
+                  <pic:spPr>
+                    <a:xfrm>
+                      <a:off x="0" y="0"/>
+                      <a:ext cx="5040000" cy="7913090"/>
+                    </a:xfrm>
+                    <a:prstGeom prst="rect"/>
+                  </pic:spPr>
+                </pic:pic>
+              </a:graphicData>
+            </a:graphic>
+          </wp:inline>
+        </w:drawing>
+      </w:r>
     </w:p>
     <w:p>
       <w:pPr>
@@ -5321,9 +6171,43 @@
     </w:p>
     <w:p>
       <w:pPr>
-        <w:spacing w:after="480" w:line="360" w:lineRule="auto"/>
-        <w:jc w:val="both"/>
-      </w:pPr>
+        <w:spacing w:after="80" w:line="240" w:lineRule="auto"/>
+        <w:jc w:val="center"/>
+      </w:pPr>
+      <w:r>
+        <w:drawing>
+          <wp:inline xmlns:a="http://schemas.openxmlformats.org/drawingml/2006/main" xmlns:pic="http://schemas.openxmlformats.org/drawingml/2006/picture">
+            <wp:extent cx="5040000" cy="8510863"/>
+            <wp:docPr id="26" name="Picture 26"/>
+            <wp:cNvGraphicFramePr>
+              <a:graphicFrameLocks noChangeAspect="1"/>
+            </wp:cNvGraphicFramePr>
+            <a:graphic>
+              <a:graphicData uri="http://schemas.openxmlformats.org/drawingml/2006/picture">
+                <pic:pic>
+                  <pic:nvPicPr>
+                    <pic:cNvPr id="0" name="16b_activite_composition_soumission.png"/>
+                    <pic:cNvPicPr/>
+                  </pic:nvPicPr>
+                  <pic:blipFill>
+                    <a:blip r:embed="rId37"/>
+                    <a:stretch>
+                      <a:fillRect/>
+                    </a:stretch>
+                  </pic:blipFill>
+                  <pic:spPr>
+                    <a:xfrm>
+                      <a:off x="0" y="0"/>
+                      <a:ext cx="5040000" cy="8510863"/>
+                    </a:xfrm>
+                    <a:prstGeom prst="rect"/>
+                  </pic:spPr>
+                </pic:pic>
+              </a:graphicData>
+            </a:graphic>
+          </wp:inline>
+        </w:drawing>
+      </w:r>
     </w:p>
     <w:p>
       <w:pPr>
@@ -5367,7 +6251,7 @@
       </w:r>
     </w:p>
     <w:p>
-      <w:bookmarkStart w:id="75217" w:name="bm_ch3_7"/>
+      <w:bookmarkStart w:id="23135" w:name="bm_ch3_7"/>
       <w:pPr>
         <w:pStyle w:val="Heading2"/>
         <w:spacing w:line="360" w:lineRule="auto"/>
@@ -5382,7 +6266,7 @@
         </w:rPr>
         <w:t>3.7 Conception des données</w:t>
       </w:r>
-      <w:bookmarkEnd w:id="75217"/>
+      <w:bookmarkEnd w:id="23135"/>
     </w:p>
     <w:p>
       <w:pPr>
@@ -5822,7 +6706,7 @@
       </w:r>
     </w:p>
     <w:p>
-      <w:bookmarkStart w:id="13200" w:name="bm_ch3_8"/>
+      <w:bookmarkStart w:id="76845" w:name="bm_ch3_8"/>
       <w:pPr>
         <w:pStyle w:val="Heading2"/>
         <w:spacing w:line="360" w:lineRule="auto"/>
@@ -5837,7 +6721,7 @@
         </w:rPr>
         <w:t>3.8 Conception de la sécurité de passation</w:t>
       </w:r>
-      <w:bookmarkEnd w:id="13200"/>
+      <w:bookmarkEnd w:id="76845"/>
     </w:p>
     <w:p>
       <w:pPr>
@@ -5925,7 +6809,7 @@
       </w:r>
     </w:p>
     <w:p>
-      <w:bookmarkStart w:id="47437" w:name="bm_ch3_9"/>
+      <w:bookmarkStart w:id="15237" w:name="bm_ch3_9"/>
       <w:pPr>
         <w:pStyle w:val="Heading2"/>
         <w:spacing w:line="360" w:lineRule="auto"/>
@@ -5940,7 +6824,7 @@
         </w:rPr>
         <w:t>3.9 Conception de la correction automatique</w:t>
       </w:r>
-      <w:bookmarkEnd w:id="47437"/>
+      <w:bookmarkEnd w:id="15237"/>
     </w:p>
     <w:p>
       <w:pPr>
@@ -5994,7 +6878,7 @@
       </w:r>
     </w:p>
     <w:p>
-      <w:bookmarkStart w:id="59776" w:name="bm_ch3_10"/>
+      <w:bookmarkStart w:id="39266" w:name="bm_ch3_10"/>
       <w:pPr>
         <w:pStyle w:val="Heading2"/>
         <w:spacing w:line="360" w:lineRule="auto"/>
@@ -6009,7 +6893,7 @@
         </w:rPr>
         <w:t>3.10 Conclusion partielle</w:t>
       </w:r>
-      <w:bookmarkEnd w:id="59776"/>
+      <w:bookmarkEnd w:id="39266"/>
     </w:p>
     <w:p>
       <w:pPr>
@@ -6034,7 +6918,7 @@
       </w:r>
     </w:p>
     <w:p>
-      <w:bookmarkStart w:id="27316" w:name="bm_ch4"/>
+      <w:bookmarkStart w:id="44329" w:name="bm_ch4"/>
       <w:pPr>
         <w:pStyle w:val="Heading1"/>
         <w:spacing w:line="360" w:lineRule="auto"/>
@@ -6049,10 +6933,10 @@
         </w:rPr>
         <w:t>Chapitre 4 : Réalisation et mise en œuvre</w:t>
       </w:r>
-      <w:bookmarkEnd w:id="27316"/>
-    </w:p>
-    <w:p>
-      <w:bookmarkStart w:id="1074" w:name="bm_ch4_1"/>
+      <w:bookmarkEnd w:id="44329"/>
+    </w:p>
+    <w:p>
+      <w:bookmarkStart w:id="31248" w:name="bm_ch4_1"/>
       <w:pPr>
         <w:pStyle w:val="Heading2"/>
         <w:spacing w:line="360" w:lineRule="auto"/>
@@ -6067,7 +6951,7 @@
         </w:rPr>
         <w:t>4.1 Environnement de travail</w:t>
       </w:r>
-      <w:bookmarkEnd w:id="1074"/>
+      <w:bookmarkEnd w:id="31248"/>
     </w:p>
     <w:p>
       <w:pPr>
@@ -6104,7 +6988,7 @@
       </w:r>
     </w:p>
     <w:p>
-      <w:bookmarkStart w:id="28107" w:name="bm_ch4_2"/>
+      <w:bookmarkStart w:id="22105" w:name="bm_ch4_2"/>
       <w:pPr>
         <w:pStyle w:val="Heading2"/>
         <w:spacing w:line="360" w:lineRule="auto"/>
@@ -6119,7 +7003,7 @@
         </w:rPr>
         <w:t>4.2 Choix technologiques</w:t>
       </w:r>
-      <w:bookmarkEnd w:id="28107"/>
+      <w:bookmarkEnd w:id="22105"/>
     </w:p>
     <w:p>
       <w:pPr>
@@ -6156,7 +7040,7 @@
       </w:r>
     </w:p>
     <w:p>
-      <w:bookmarkStart w:id="55968" w:name="bm_ch4_3"/>
+      <w:bookmarkStart w:id="38769" w:name="bm_ch4_3"/>
       <w:pPr>
         <w:pStyle w:val="Heading2"/>
         <w:spacing w:line="360" w:lineRule="auto"/>
@@ -6171,7 +7055,7 @@
         </w:rPr>
         <w:t>4.3 Organisation du code et architecture applicative</w:t>
       </w:r>
-      <w:bookmarkEnd w:id="55968"/>
+      <w:bookmarkEnd w:id="38769"/>
     </w:p>
     <w:p>
       <w:pPr>
@@ -6208,7 +7092,7 @@
       </w:r>
     </w:p>
     <w:p>
-      <w:bookmarkStart w:id="22284" w:name="bm_ch4_4"/>
+      <w:bookmarkStart w:id="52474" w:name="bm_ch4_4"/>
       <w:pPr>
         <w:pStyle w:val="Heading2"/>
         <w:spacing w:line="360" w:lineRule="auto"/>
@@ -6223,10 +7107,10 @@
         </w:rPr>
         <w:t>4.4 Réalisation des modules principaux</w:t>
       </w:r>
-      <w:bookmarkEnd w:id="22284"/>
-    </w:p>
-    <w:p>
-      <w:bookmarkStart w:id="15695" w:name="4_4_1_Authentification_et_sessions"/>
+      <w:bookmarkEnd w:id="52474"/>
+    </w:p>
+    <w:p>
+      <w:bookmarkStart w:id="27168" w:name="4_4_1_Authentification_et_sessions"/>
       <w:pPr>
         <w:pStyle w:val="Heading3"/>
         <w:spacing w:line="360" w:lineRule="auto"/>
@@ -6241,7 +7125,7 @@
         </w:rPr>
         <w:t>4.4.1 Authentification et sessions</w:t>
       </w:r>
-      <w:bookmarkEnd w:id="15695"/>
+      <w:bookmarkEnd w:id="27168"/>
     </w:p>
     <w:p>
       <w:pPr>
@@ -6278,7 +7162,7 @@
       </w:r>
     </w:p>
     <w:p>
-      <w:bookmarkStart w:id="3866" w:name="4_4_2_Module_administrateur_d__tablissem"/>
+      <w:bookmarkStart w:id="86346" w:name="4_4_2_Module_administrateur_d__tablissem"/>
       <w:pPr>
         <w:pStyle w:val="Heading3"/>
         <w:spacing w:line="360" w:lineRule="auto"/>
@@ -6293,7 +7177,7 @@
         </w:rPr>
         <w:t>4.4.2 Module administrateur d'établissement</w:t>
       </w:r>
-      <w:bookmarkEnd w:id="3866"/>
+      <w:bookmarkEnd w:id="86346"/>
     </w:p>
     <w:p>
       <w:pPr>
@@ -6330,7 +7214,7 @@
       </w:r>
     </w:p>
     <w:p>
-      <w:bookmarkStart w:id="77211" w:name="4_4_3_Module_professeur"/>
+      <w:bookmarkStart w:id="18429" w:name="4_4_3_Module_professeur"/>
       <w:pPr>
         <w:pStyle w:val="Heading3"/>
         <w:spacing w:line="360" w:lineRule="auto"/>
@@ -6345,7 +7229,7 @@
         </w:rPr>
         <w:t>4.4.3 Module professeur</w:t>
       </w:r>
-      <w:bookmarkEnd w:id="77211"/>
+      <w:bookmarkEnd w:id="18429"/>
     </w:p>
     <w:p>
       <w:pPr>
@@ -6382,7 +7266,7 @@
       </w:r>
     </w:p>
     <w:p>
-      <w:bookmarkStart w:id="32492" w:name="4_4_4_Module__tudiant_et_parcours_de_com"/>
+      <w:bookmarkStart w:id="74382" w:name="4_4_4_Module__tudiant_et_parcours_de_com"/>
       <w:pPr>
         <w:pStyle w:val="Heading3"/>
         <w:spacing w:line="360" w:lineRule="auto"/>
@@ -6397,7 +7281,7 @@
         </w:rPr>
         <w:t>4.4.4 Module étudiant et parcours de composition</w:t>
       </w:r>
-      <w:bookmarkEnd w:id="32492"/>
+      <w:bookmarkEnd w:id="74382"/>
     </w:p>
     <w:p>
       <w:pPr>
@@ -6418,9 +7302,10 @@
     </w:p>
     <w:p>
       <w:pPr>
-        <w:spacing w:after="480" w:line="360" w:lineRule="auto"/>
-        <w:jc w:val="both"/>
-      </w:pPr>
+        <w:spacing w:after="480" w:line="240" w:lineRule="auto"/>
+        <w:jc w:val="center"/>
+      </w:pPr>
+      <w:r/>
     </w:p>
     <w:p>
       <w:pPr>
@@ -6482,9 +7367,10 @@
     </w:p>
     <w:p>
       <w:pPr>
-        <w:spacing w:after="480" w:line="360" w:lineRule="auto"/>
-        <w:jc w:val="both"/>
-      </w:pPr>
+        <w:spacing w:after="480" w:line="240" w:lineRule="auto"/>
+        <w:jc w:val="center"/>
+      </w:pPr>
+      <w:r/>
     </w:p>
     <w:p>
       <w:pPr>
@@ -6545,7 +7431,7 @@
       </w:r>
     </w:p>
     <w:p>
-      <w:bookmarkStart w:id="32675" w:name="4_4_5_Sandbox_et_correction_automatique"/>
+      <w:bookmarkStart w:id="14237" w:name="4_4_5_Sandbox_et_correction_automatique"/>
       <w:pPr>
         <w:pStyle w:val="Heading3"/>
         <w:spacing w:line="360" w:lineRule="auto"/>
@@ -6560,7 +7446,7 @@
         </w:rPr>
         <w:t>4.4.5 Sandbox et correction automatique</w:t>
       </w:r>
-      <w:bookmarkEnd w:id="32675"/>
+      <w:bookmarkEnd w:id="14237"/>
     </w:p>
     <w:p>
       <w:pPr>
@@ -6580,7 +7466,7 @@
       </w:r>
     </w:p>
     <w:p>
-      <w:bookmarkStart w:id="91279" w:name="4_4_6_Landing_page_et_contact"/>
+      <w:bookmarkStart w:id="87642" w:name="4_4_6_Landing_page_et_contact"/>
       <w:pPr>
         <w:pStyle w:val="Heading3"/>
         <w:spacing w:line="360" w:lineRule="auto"/>
@@ -6595,7 +7481,7 @@
         </w:rPr>
         <w:t>4.4.6 Landing page et contact</w:t>
       </w:r>
-      <w:bookmarkEnd w:id="91279"/>
+      <w:bookmarkEnd w:id="87642"/>
     </w:p>
     <w:p>
       <w:pPr>
@@ -6615,7 +7501,7 @@
       </w:r>
     </w:p>
     <w:p>
-      <w:bookmarkStart w:id="45984" w:name="bm_ch4_5"/>
+      <w:bookmarkStart w:id="68868" w:name="bm_ch4_5"/>
       <w:pPr>
         <w:pStyle w:val="Heading2"/>
         <w:spacing w:line="360" w:lineRule="auto"/>
@@ -6630,7 +7516,7 @@
         </w:rPr>
         <w:t>4.5 Points techniques difficiles</w:t>
       </w:r>
-      <w:bookmarkEnd w:id="45984"/>
+      <w:bookmarkEnd w:id="68868"/>
     </w:p>
     <w:p>
       <w:pPr>
@@ -6650,7 +7536,7 @@
       </w:r>
     </w:p>
     <w:p>
-      <w:bookmarkStart w:id="86812" w:name="bm_ch4_6"/>
+      <w:bookmarkStart w:id="90902" w:name="bm_ch4_6"/>
       <w:pPr>
         <w:pStyle w:val="Heading2"/>
         <w:spacing w:line="360" w:lineRule="auto"/>
@@ -6665,7 +7551,7 @@
         </w:rPr>
         <w:t>4.6 Déploiement</w:t>
       </w:r>
-      <w:bookmarkEnd w:id="86812"/>
+      <w:bookmarkEnd w:id="90902"/>
     </w:p>
     <w:p>
       <w:pPr>
@@ -6685,7 +7571,7 @@
       </w:r>
     </w:p>
     <w:p>
-      <w:bookmarkStart w:id="39530" w:name="bm_ch4_7"/>
+      <w:bookmarkStart w:id="18556" w:name="bm_ch4_7"/>
       <w:pPr>
         <w:pStyle w:val="Heading2"/>
         <w:spacing w:line="360" w:lineRule="auto"/>
@@ -6700,7 +7586,7 @@
         </w:rPr>
         <w:t>4.7 Conclusion partielle</w:t>
       </w:r>
-      <w:bookmarkEnd w:id="39530"/>
+      <w:bookmarkEnd w:id="18556"/>
     </w:p>
     <w:p>
       <w:pPr>
@@ -6725,7 +7611,7 @@
       </w:r>
     </w:p>
     <w:p>
-      <w:bookmarkStart w:id="27189" w:name="bm_ch5"/>
+      <w:bookmarkStart w:id="58481" w:name="bm_ch5"/>
       <w:pPr>
         <w:pStyle w:val="Heading1"/>
         <w:spacing w:line="360" w:lineRule="auto"/>
@@ -6740,10 +7626,10 @@
         </w:rPr>
         <w:t>Chapitre 5 : Tests, résultats, limites et perspectives</w:t>
       </w:r>
-      <w:bookmarkEnd w:id="27189"/>
-    </w:p>
-    <w:p>
-      <w:bookmarkStart w:id="67409" w:name="bm_ch5_1"/>
+      <w:bookmarkEnd w:id="58481"/>
+    </w:p>
+    <w:p>
+      <w:bookmarkStart w:id="1747" w:name="bm_ch5_1"/>
       <w:pPr>
         <w:pStyle w:val="Heading2"/>
         <w:spacing w:line="360" w:lineRule="auto"/>
@@ -6758,7 +7644,7 @@
         </w:rPr>
         <w:t>5.1 Stratégie de tests</w:t>
       </w:r>
-      <w:bookmarkEnd w:id="67409"/>
+      <w:bookmarkEnd w:id="1747"/>
     </w:p>
     <w:p>
       <w:pPr>
@@ -6795,7 +7681,7 @@
       </w:r>
     </w:p>
     <w:p>
-      <w:bookmarkStart w:id="53975" w:name="bm_ch5_2"/>
+      <w:bookmarkStart w:id="74138" w:name="bm_ch5_2"/>
       <w:pPr>
         <w:pStyle w:val="Heading2"/>
         <w:spacing w:line="360" w:lineRule="auto"/>
@@ -6810,10 +7696,10 @@
         </w:rPr>
         <w:t>5.2 Jeux de tests et résultats</w:t>
       </w:r>
-      <w:bookmarkEnd w:id="53975"/>
-    </w:p>
-    <w:p>
-      <w:bookmarkStart w:id="43466" w:name="5_2_1_Authentification_et_acc_s"/>
+      <w:bookmarkEnd w:id="74138"/>
+    </w:p>
+    <w:p>
+      <w:bookmarkStart w:id="36717" w:name="5_2_1_Authentification_et_acc_s"/>
       <w:pPr>
         <w:pStyle w:val="Heading3"/>
         <w:spacing w:line="360" w:lineRule="auto"/>
@@ -6828,7 +7714,7 @@
         </w:rPr>
         <w:t>5.2.1 Authentification et accès</w:t>
       </w:r>
-      <w:bookmarkEnd w:id="43466"/>
+      <w:bookmarkEnd w:id="36717"/>
     </w:p>
     <w:p>
       <w:pPr>
@@ -6848,7 +7734,7 @@
       </w:r>
     </w:p>
     <w:p>
-      <w:bookmarkStart w:id="39286" w:name="5_2_2_Administration"/>
+      <w:bookmarkStart w:id="1743" w:name="5_2_2_Administration"/>
       <w:pPr>
         <w:pStyle w:val="Heading3"/>
         <w:spacing w:line="360" w:lineRule="auto"/>
@@ -6863,7 +7749,7 @@
         </w:rPr>
         <w:t>5.2.2 Administration</w:t>
       </w:r>
-      <w:bookmarkEnd w:id="39286"/>
+      <w:bookmarkEnd w:id="1743"/>
     </w:p>
     <w:p>
       <w:pPr>
@@ -6883,7 +7769,7 @@
       </w:r>
     </w:p>
     <w:p>
-      <w:bookmarkStart w:id="39558" w:name="5_2_3_Examens_c_t__professeur"/>
+      <w:bookmarkStart w:id="72869" w:name="5_2_3_Examens_c_t__professeur"/>
       <w:pPr>
         <w:pStyle w:val="Heading3"/>
         <w:spacing w:line="360" w:lineRule="auto"/>
@@ -6898,7 +7784,7 @@
         </w:rPr>
         <w:t>5.2.3 Examens côté professeur</w:t>
       </w:r>
-      <w:bookmarkEnd w:id="39558"/>
+      <w:bookmarkEnd w:id="72869"/>
     </w:p>
     <w:p>
       <w:pPr>
@@ -6918,7 +7804,7 @@
       </w:r>
     </w:p>
     <w:p>
-      <w:bookmarkStart w:id="36957" w:name="5_2_4_Parcours__tudiant_et_contr_les_de_"/>
+      <w:bookmarkStart w:id="18465" w:name="5_2_4_Parcours__tudiant_et_contr_les_de_"/>
       <w:pPr>
         <w:pStyle w:val="Heading3"/>
         <w:spacing w:line="360" w:lineRule="auto"/>
@@ -6933,7 +7819,7 @@
         </w:rPr>
         <w:t>5.2.4 Parcours étudiant et contrôles de passation</w:t>
       </w:r>
-      <w:bookmarkEnd w:id="36957"/>
+      <w:bookmarkEnd w:id="18465"/>
     </w:p>
     <w:p>
       <w:pPr>
@@ -6970,7 +7856,7 @@
       </w:r>
     </w:p>
     <w:p>
-      <w:bookmarkStart w:id="80291" w:name="bm_ch5_3"/>
+      <w:bookmarkStart w:id="30118" w:name="bm_ch5_3"/>
       <w:pPr>
         <w:pStyle w:val="Heading2"/>
         <w:spacing w:line="360" w:lineRule="auto"/>
@@ -6985,7 +7871,7 @@
         </w:rPr>
         <w:t>5.3 Discussion des résultats</w:t>
       </w:r>
-      <w:bookmarkEnd w:id="80291"/>
+      <w:bookmarkEnd w:id="30118"/>
     </w:p>
     <w:p>
       <w:pPr>
@@ -7022,7 +7908,7 @@
       </w:r>
     </w:p>
     <w:p>
-      <w:bookmarkStart w:id="92984" w:name="bm_ch5_4"/>
+      <w:bookmarkStart w:id="37055" w:name="bm_ch5_4"/>
       <w:pPr>
         <w:pStyle w:val="Heading2"/>
         <w:spacing w:line="360" w:lineRule="auto"/>
@@ -7037,7 +7923,7 @@
         </w:rPr>
         <w:t>5.4 Limites et risques résiduels</w:t>
       </w:r>
-      <w:bookmarkEnd w:id="92984"/>
+      <w:bookmarkEnd w:id="37055"/>
     </w:p>
     <w:p>
       <w:pPr>
@@ -7057,7 +7943,7 @@
       </w:r>
     </w:p>
     <w:p>
-      <w:bookmarkStart w:id="32909" w:name="bm_ch5_5"/>
+      <w:bookmarkStart w:id="15599" w:name="bm_ch5_5"/>
       <w:pPr>
         <w:pStyle w:val="Heading2"/>
         <w:spacing w:line="360" w:lineRule="auto"/>
@@ -7072,7 +7958,7 @@
         </w:rPr>
         <w:t>5.5 Perspectives</w:t>
       </w:r>
-      <w:bookmarkEnd w:id="32909"/>
+      <w:bookmarkEnd w:id="15599"/>
     </w:p>
     <w:p>
       <w:pPr>
@@ -7109,7 +7995,7 @@
       </w:r>
     </w:p>
     <w:p>
-      <w:bookmarkStart w:id="53446" w:name="bm_ch5_6"/>
+      <w:bookmarkStart w:id="55741" w:name="bm_ch5_6"/>
       <w:pPr>
         <w:pStyle w:val="Heading2"/>
         <w:spacing w:line="360" w:lineRule="auto"/>
@@ -7124,7 +8010,7 @@
         </w:rPr>
         <w:t>5.6 Conclusion partielle</w:t>
       </w:r>
-      <w:bookmarkEnd w:id="53446"/>
+      <w:bookmarkEnd w:id="55741"/>
     </w:p>
     <w:p>
       <w:pPr>
@@ -7149,7 +8035,7 @@
       </w:r>
     </w:p>
     <w:p>
-      <w:bookmarkStart w:id="7237" w:name="bm_concl"/>
+      <w:bookmarkStart w:id="50424" w:name="bm_concl"/>
       <w:pPr>
         <w:pStyle w:val="Heading1"/>
         <w:spacing w:line="360" w:lineRule="auto"/>
@@ -7164,7 +8050,7 @@
         </w:rPr>
         <w:t>Conclusion générale</w:t>
       </w:r>
-      <w:bookmarkEnd w:id="7237"/>
+      <w:bookmarkEnd w:id="50424"/>
     </w:p>
     <w:p>
       <w:pPr>
@@ -7223,7 +8109,7 @@
       </w:r>
     </w:p>
     <w:p>
-      <w:bookmarkStart w:id="90345" w:name="bm_biblio"/>
+      <w:bookmarkStart w:id="32318" w:name="bm_biblio"/>
       <w:pPr>
         <w:pStyle w:val="Heading1"/>
         <w:spacing w:line="360" w:lineRule="auto"/>
@@ -7238,7 +8124,7 @@
         </w:rPr>
         <w:t>Bibliographie et webographie</w:t>
       </w:r>
-      <w:bookmarkEnd w:id="90345"/>
+      <w:bookmarkEnd w:id="32318"/>
     </w:p>
     <w:p>
       <w:pPr>
@@ -7271,7 +8157,7 @@
         </w:rPr>
         <w:t xml:space="preserve">[2] Vercel, Next.js Documentation, </w:t>
       </w:r>
-      <w:hyperlink r:id="rId12">
+      <w:hyperlink r:id="rId38">
         <w:r>
           <w:rPr>
             <w:rFonts w:ascii="Times New Roman" w:hAnsi="Times New Roman"/>
@@ -7308,7 +8194,7 @@
         </w:rPr>
         <w:t xml:space="preserve">[3] Prisma, Prisma Documentation, </w:t>
       </w:r>
-      <w:hyperlink r:id="rId13">
+      <w:hyperlink r:id="rId39">
         <w:r>
           <w:rPr>
             <w:rFonts w:ascii="Times New Roman" w:hAnsi="Times New Roman"/>
@@ -7345,7 +8231,7 @@
         </w:rPr>
         <w:t xml:space="preserve">[4] Oracle, MySQL 8 Documentation, </w:t>
       </w:r>
-      <w:hyperlink r:id="rId14">
+      <w:hyperlink r:id="rId40">
         <w:r>
           <w:rPr>
             <w:rFonts w:ascii="Times New Roman" w:hAnsi="Times New Roman"/>
@@ -7382,7 +8268,7 @@
         </w:rPr>
         <w:t xml:space="preserve">[5] Redis Ltd, Redis Documentation, </w:t>
       </w:r>
-      <w:hyperlink r:id="rId15">
+      <w:hyperlink r:id="rId41">
         <w:r>
           <w:rPr>
             <w:rFonts w:ascii="Times New Roman" w:hAnsi="Times New Roman"/>
@@ -7419,7 +8305,7 @@
         </w:rPr>
         <w:t xml:space="preserve">[6] Docker Inc., Docker Documentation, </w:t>
       </w:r>
-      <w:hyperlink r:id="rId16">
+      <w:hyperlink r:id="rId42">
         <w:r>
           <w:rPr>
             <w:rFonts w:ascii="Times New Roman" w:hAnsi="Times New Roman"/>
@@ -7472,7 +8358,7 @@
         </w:rPr>
         <w:t xml:space="preserve">[8] freeCodeCamp, </w:t>
       </w:r>
-      <w:hyperlink r:id="rId17">
+      <w:hyperlink r:id="rId43">
         <w:r>
           <w:rPr>
             <w:rFonts w:ascii="Times New Roman" w:hAnsi="Times New Roman"/>
@@ -7509,7 +8395,7 @@
         </w:rPr>
         <w:t xml:space="preserve">[9] Moodle HQ, Moodle Documentation, </w:t>
       </w:r>
-      <w:hyperlink r:id="rId18">
+      <w:hyperlink r:id="rId44">
         <w:r>
           <w:rPr>
             <w:rFonts w:ascii="Times New Roman" w:hAnsi="Times New Roman"/>
@@ -7546,7 +8432,7 @@
         </w:rPr>
         <w:t xml:space="preserve">[10] Judge0, Judge0 CE, </w:t>
       </w:r>
-      <w:hyperlink r:id="rId19">
+      <w:hyperlink r:id="rId45">
         <w:r>
           <w:rPr>
             <w:rFonts w:ascii="Times New Roman" w:hAnsi="Times New Roman"/>
@@ -7574,7 +8460,7 @@
       </w:r>
     </w:p>
     <w:p>
-      <w:bookmarkStart w:id="73095" w:name="bm_annexes"/>
+      <w:bookmarkStart w:id="81363" w:name="bm_annexes"/>
       <w:pPr>
         <w:pStyle w:val="Heading1"/>
         <w:spacing w:line="360" w:lineRule="auto"/>
@@ -7589,10 +8475,10 @@
         </w:rPr>
         <w:t>Annexes</w:t>
       </w:r>
-      <w:bookmarkEnd w:id="73095"/>
-    </w:p>
-    <w:p>
-      <w:bookmarkStart w:id="84476" w:name="Annexe_A___Inventaire_des_diagrammes_UML"/>
+      <w:bookmarkEnd w:id="81363"/>
+    </w:p>
+    <w:p>
+      <w:bookmarkStart w:id="74081" w:name="Annexe_A___Inventaire_des_diagrammes_UML"/>
       <w:pPr>
         <w:pStyle w:val="Heading2"/>
         <w:spacing w:line="360" w:lineRule="auto"/>
@@ -7607,7 +8493,7 @@
         </w:rPr>
         <w:t>Annexe A : Inventaire des diagrammes UML</w:t>
       </w:r>
-      <w:bookmarkEnd w:id="84476"/>
+      <w:bookmarkEnd w:id="74081"/>
     </w:p>
     <w:p>
       <w:pPr>
@@ -7626,7 +8512,7 @@
       </w:r>
     </w:p>
     <w:p>
-      <w:bookmarkStart w:id="59312" w:name="Annexe_B___Pr_fixes_d_identifiants"/>
+      <w:bookmarkStart w:id="49317" w:name="Annexe_B___Pr_fixes_d_identifiants"/>
       <w:pPr>
         <w:pStyle w:val="Heading2"/>
         <w:spacing w:line="360" w:lineRule="auto"/>
@@ -7641,7 +8527,7 @@
         </w:rPr>
         <w:t>Annexe B : Préfixes d'identifiants</w:t>
       </w:r>
-      <w:bookmarkEnd w:id="59312"/>
+      <w:bookmarkEnd w:id="49317"/>
     </w:p>
     <w:p>
       <w:pPr>
@@ -7660,7 +8546,7 @@
       </w:r>
     </w:p>
     <w:p>
-      <w:bookmarkStart w:id="80607" w:name="Annexe_C___Captures_d__cran_compl_mentai"/>
+      <w:bookmarkStart w:id="28085" w:name="Annexe_C___Captures_d__cran_compl_mentai"/>
       <w:pPr>
         <w:pStyle w:val="Heading2"/>
         <w:spacing w:line="360" w:lineRule="auto"/>
@@ -7675,7 +8561,7 @@
         </w:rPr>
         <w:t>Annexe C : Captures d'écran complémentaires</w:t>
       </w:r>
-      <w:bookmarkEnd w:id="80607"/>
+      <w:bookmarkEnd w:id="28085"/>
     </w:p>
     <w:p>
       <w:pPr>
@@ -7694,7 +8580,7 @@
       </w:r>
     </w:p>
     <w:p>
-      <w:bookmarkStart w:id="62665" w:name="Annexe_D___Mod_le_CSV_d_import_des__tudi"/>
+      <w:bookmarkStart w:id="11124" w:name="Annexe_D___Mod_le_CSV_d_import_des__tudi"/>
       <w:pPr>
         <w:pStyle w:val="Heading2"/>
         <w:spacing w:line="360" w:lineRule="auto"/>
@@ -7709,7 +8595,7 @@
         </w:rPr>
         <w:t>Annexe D : Modèle CSV d'import des étudiants</w:t>
       </w:r>
-      <w:bookmarkEnd w:id="62665"/>
+      <w:bookmarkEnd w:id="11124"/>
     </w:p>
     <w:p>
       <w:pPr>
@@ -7733,7 +8619,7 @@
       </w:r>
     </w:p>
     <w:p>
-      <w:bookmarkStart w:id="79420" w:name="bm_tdm"/>
+      <w:bookmarkStart w:id="72626" w:name="bm_tdm"/>
       <w:pPr>
         <w:pStyle w:val="Heading1"/>
         <w:spacing w:line="360" w:lineRule="auto"/>
@@ -7748,7 +8634,7 @@
         </w:rPr>
         <w:t>Table des matières</w:t>
       </w:r>
-      <w:bookmarkEnd w:id="79420"/>
+      <w:bookmarkEnd w:id="72626"/>
     </w:p>
     <w:p>
       <w:pPr>

</xml_diff>

<commit_message>
Étend les captures d'écran de l'interface Cylentic dans le rapport.
Le chapitre 4 prévoit dix vues produit (connexion, admin, professeur,
étudiant, landing) et l'annexe C en ajoute quatre optionnelles, au lieu
de seulement deux captures étudiant.

Co-authored-by: progirix <progirix@users.noreply.github.com>
</commit_message>
<xml_diff>
--- a/docs/Rapport_Cylentic.docx
+++ b/docs/Rapport_Cylentic.docx
@@ -492,7 +492,7 @@
       </w:pPr>
     </w:p>
     <w:p>
-      <w:bookmarkStart w:id="69586" w:name="bm_dedicace"/>
+      <w:bookmarkStart w:id="81498" w:name="bm_dedicace"/>
       <w:pPr>
         <w:pStyle w:val="Heading1"/>
         <w:spacing w:line="360" w:lineRule="auto"/>
@@ -507,7 +507,7 @@
         </w:rPr>
         <w:t>Dédicace</w:t>
       </w:r>
-      <w:bookmarkEnd w:id="69586"/>
+      <w:bookmarkEnd w:id="81498"/>
     </w:p>
     <w:p>
       <w:pPr>
@@ -532,7 +532,7 @@
       </w:r>
     </w:p>
     <w:p>
-      <w:bookmarkStart w:id="86757" w:name="bm_remerciements"/>
+      <w:bookmarkStart w:id="29255" w:name="bm_remerciements"/>
       <w:pPr>
         <w:pStyle w:val="Heading1"/>
         <w:spacing w:line="360" w:lineRule="auto"/>
@@ -547,7 +547,7 @@
         </w:rPr>
         <w:t>Remerciements</w:t>
       </w:r>
-      <w:bookmarkEnd w:id="86757"/>
+      <w:bookmarkEnd w:id="29255"/>
     </w:p>
     <w:p>
       <w:pPr>
@@ -606,7 +606,7 @@
       </w:r>
     </w:p>
     <w:p>
-      <w:bookmarkStart w:id="40860" w:name="bm_sommaire"/>
+      <w:bookmarkStart w:id="20256" w:name="bm_sommaire"/>
       <w:pPr>
         <w:pStyle w:val="Heading1"/>
         <w:spacing w:line="360" w:lineRule="auto"/>
@@ -621,7 +621,7 @@
         </w:rPr>
         <w:t>Sommaire</w:t>
       </w:r>
-      <w:bookmarkEnd w:id="40860"/>
+      <w:bookmarkEnd w:id="20256"/>
     </w:p>
     <w:p>
       <w:pPr>
@@ -665,7 +665,7 @@
       </w:r>
     </w:p>
     <w:p>
-      <w:bookmarkStart w:id="82009" w:name="bm_sigles"/>
+      <w:bookmarkStart w:id="24855" w:name="bm_sigles"/>
       <w:pPr>
         <w:pStyle w:val="Heading1"/>
         <w:spacing w:line="360" w:lineRule="auto"/>
@@ -680,7 +680,7 @@
         </w:rPr>
         <w:t>Liste des sigles et abréviations</w:t>
       </w:r>
-      <w:bookmarkEnd w:id="82009"/>
+      <w:bookmarkEnd w:id="24855"/>
     </w:p>
     <w:p>
       <w:pPr>
@@ -992,7 +992,7 @@
       </w:r>
     </w:p>
     <w:p>
-      <w:bookmarkStart w:id="13361" w:name="bm_liste_figures"/>
+      <w:bookmarkStart w:id="32515" w:name="bm_liste_figures"/>
       <w:pPr>
         <w:pStyle w:val="Heading1"/>
         <w:spacing w:line="360" w:lineRule="auto"/>
@@ -1007,7 +1007,7 @@
         </w:rPr>
         <w:t>Liste des figures</w:t>
       </w:r>
-      <w:bookmarkEnd w:id="13361"/>
+      <w:bookmarkEnd w:id="32515"/>
     </w:p>
     <w:p>
       <w:pPr>
@@ -1051,7 +1051,7 @@
       </w:r>
     </w:p>
     <w:p>
-      <w:bookmarkStart w:id="25355" w:name="bm_liste_tableaux"/>
+      <w:bookmarkStart w:id="61927" w:name="bm_liste_tableaux"/>
       <w:pPr>
         <w:pStyle w:val="Heading1"/>
         <w:spacing w:line="360" w:lineRule="auto"/>
@@ -1066,7 +1066,7 @@
         </w:rPr>
         <w:t>Liste des tableaux</w:t>
       </w:r>
-      <w:bookmarkEnd w:id="25355"/>
+      <w:bookmarkEnd w:id="61927"/>
     </w:p>
     <w:p>
       <w:pPr>
@@ -1110,7 +1110,7 @@
       </w:r>
     </w:p>
     <w:p>
-      <w:bookmarkStart w:id="71618" w:name="bm_resume"/>
+      <w:bookmarkStart w:id="82143" w:name="bm_resume"/>
       <w:pPr>
         <w:pStyle w:val="Heading1"/>
         <w:spacing w:line="360" w:lineRule="auto"/>
@@ -1125,7 +1125,7 @@
         </w:rPr>
         <w:t>Résumé</w:t>
       </w:r>
-      <w:bookmarkEnd w:id="71618"/>
+      <w:bookmarkEnd w:id="82143"/>
     </w:p>
     <w:p>
       <w:pPr>
@@ -1167,7 +1167,7 @@
       </w:r>
     </w:p>
     <w:p>
-      <w:bookmarkStart w:id="87866" w:name="bm_abstract"/>
+      <w:bookmarkStart w:id="41316" w:name="bm_abstract"/>
       <w:pPr>
         <w:pStyle w:val="Heading1"/>
         <w:spacing w:line="360" w:lineRule="auto"/>
@@ -1182,7 +1182,7 @@
         </w:rPr>
         <w:t>Abstract</w:t>
       </w:r>
-      <w:bookmarkEnd w:id="87866"/>
+      <w:bookmarkEnd w:id="41316"/>
     </w:p>
     <w:p>
       <w:pPr>
@@ -1231,7 +1231,7 @@
       </w:pPr>
     </w:p>
     <w:p>
-      <w:bookmarkStart w:id="23261" w:name="bm_intro"/>
+      <w:bookmarkStart w:id="10229" w:name="bm_intro"/>
       <w:pPr>
         <w:pStyle w:val="Heading1"/>
         <w:spacing w:line="360" w:lineRule="auto"/>
@@ -1246,7 +1246,7 @@
         </w:rPr>
         <w:t>Introduction générale</w:t>
       </w:r>
-      <w:bookmarkEnd w:id="23261"/>
+      <w:bookmarkEnd w:id="10229"/>
     </w:p>
     <w:p>
       <w:pPr>
@@ -1317,7 +1317,7 @@
       </w:r>
     </w:p>
     <w:p>
-      <w:bookmarkStart w:id="84223" w:name="bm_probl"/>
+      <w:bookmarkStart w:id="36002" w:name="bm_probl"/>
       <w:pPr>
         <w:pStyle w:val="Heading1"/>
         <w:spacing w:line="360" w:lineRule="auto"/>
@@ -1332,7 +1332,7 @@
         </w:rPr>
         <w:t>Problématique</w:t>
       </w:r>
-      <w:bookmarkEnd w:id="84223"/>
+      <w:bookmarkEnd w:id="36002"/>
     </w:p>
     <w:p>
       <w:pPr>
@@ -1487,7 +1487,7 @@
       </w:r>
     </w:p>
     <w:p>
-      <w:bookmarkStart w:id="10858" w:name="bm_ch1"/>
+      <w:bookmarkStart w:id="8176" w:name="bm_ch1"/>
       <w:pPr>
         <w:pStyle w:val="Heading1"/>
         <w:spacing w:line="360" w:lineRule="auto"/>
@@ -1502,7 +1502,7 @@
         </w:rPr>
         <w:t>Chapitre 1 : Contexte et étude de l'existant</w:t>
       </w:r>
-      <w:bookmarkEnd w:id="10858"/>
+      <w:bookmarkEnd w:id="8176"/>
     </w:p>
     <w:p>
       <w:pPr>
@@ -1522,7 +1522,7 @@
       </w:r>
     </w:p>
     <w:p>
-      <w:bookmarkStart w:id="10100" w:name="bm_ch1_1"/>
+      <w:bookmarkStart w:id="94401" w:name="bm_ch1_1"/>
       <w:pPr>
         <w:pStyle w:val="Heading2"/>
         <w:spacing w:line="360" w:lineRule="auto"/>
@@ -1537,7 +1537,7 @@
         </w:rPr>
         <w:t>1.1 Contexte pédagogique et technologique</w:t>
       </w:r>
-      <w:bookmarkEnd w:id="10100"/>
+      <w:bookmarkEnd w:id="94401"/>
     </w:p>
     <w:p>
       <w:pPr>
@@ -1591,7 +1591,7 @@
       </w:r>
     </w:p>
     <w:p>
-      <w:bookmarkStart w:id="30438" w:name="bm_ch1_2"/>
+      <w:bookmarkStart w:id="87321" w:name="bm_ch1_2"/>
       <w:pPr>
         <w:pStyle w:val="Heading2"/>
         <w:spacing w:line="360" w:lineRule="auto"/>
@@ -1606,7 +1606,7 @@
         </w:rPr>
         <w:t>1.2 Sous-problèmes et contraintes locales</w:t>
       </w:r>
-      <w:bookmarkEnd w:id="30438"/>
+      <w:bookmarkEnd w:id="87321"/>
     </w:p>
     <w:p>
       <w:pPr>
@@ -1660,7 +1660,7 @@
       </w:r>
     </w:p>
     <w:p>
-      <w:bookmarkStart w:id="40220" w:name="bm_ch1_3"/>
+      <w:bookmarkStart w:id="33905" w:name="bm_ch1_3"/>
       <w:pPr>
         <w:pStyle w:val="Heading2"/>
         <w:spacing w:line="360" w:lineRule="auto"/>
@@ -1675,7 +1675,7 @@
         </w:rPr>
         <w:t>1.3 Examen des solutions existantes</w:t>
       </w:r>
-      <w:bookmarkEnd w:id="40220"/>
+      <w:bookmarkEnd w:id="33905"/>
     </w:p>
     <w:p>
       <w:pPr>
@@ -2684,7 +2684,7 @@
       </w:r>
     </w:p>
     <w:p>
-      <w:bookmarkStart w:id="58233" w:name="bm_ch1_4"/>
+      <w:bookmarkStart w:id="49240" w:name="bm_ch1_4"/>
       <w:pPr>
         <w:pStyle w:val="Heading2"/>
         <w:spacing w:line="360" w:lineRule="auto"/>
@@ -2699,7 +2699,7 @@
         </w:rPr>
         <w:t>1.4 Positionnement de Cylentic</w:t>
       </w:r>
-      <w:bookmarkEnd w:id="58233"/>
+      <w:bookmarkEnd w:id="49240"/>
     </w:p>
     <w:p>
       <w:pPr>
@@ -2736,7 +2736,7 @@
       </w:r>
     </w:p>
     <w:p>
-      <w:bookmarkStart w:id="11155" w:name="bm_ch1_5"/>
+      <w:bookmarkStart w:id="36124" w:name="bm_ch1_5"/>
       <w:pPr>
         <w:pStyle w:val="Heading2"/>
         <w:spacing w:line="360" w:lineRule="auto"/>
@@ -2751,7 +2751,7 @@
         </w:rPr>
         <w:t>1.5 Conclusion partielle</w:t>
       </w:r>
-      <w:bookmarkEnd w:id="11155"/>
+      <w:bookmarkEnd w:id="36124"/>
     </w:p>
     <w:p>
       <w:pPr>
@@ -2776,7 +2776,7 @@
       </w:r>
     </w:p>
     <w:p>
-      <w:bookmarkStart w:id="34675" w:name="bm_ch2"/>
+      <w:bookmarkStart w:id="36500" w:name="bm_ch2"/>
       <w:pPr>
         <w:pStyle w:val="Heading1"/>
         <w:spacing w:line="360" w:lineRule="auto"/>
@@ -2791,10 +2791,10 @@
         </w:rPr>
         <w:t>Chapitre 2 : Analyse des besoins et spécification du système</w:t>
       </w:r>
-      <w:bookmarkEnd w:id="34675"/>
-    </w:p>
-    <w:p>
-      <w:bookmarkStart w:id="81818" w:name="bm_ch2_1"/>
+      <w:bookmarkEnd w:id="36500"/>
+    </w:p>
+    <w:p>
+      <w:bookmarkStart w:id="27806" w:name="bm_ch2_1"/>
       <w:pPr>
         <w:pStyle w:val="Heading2"/>
         <w:spacing w:line="360" w:lineRule="auto"/>
@@ -2809,7 +2809,7 @@
         </w:rPr>
         <w:t>2.1 Périmètre du projet et du MVP</w:t>
       </w:r>
-      <w:bookmarkEnd w:id="81818"/>
+      <w:bookmarkEnd w:id="27806"/>
     </w:p>
     <w:p>
       <w:pPr>
@@ -2863,7 +2863,7 @@
       </w:r>
     </w:p>
     <w:p>
-      <w:bookmarkStart w:id="32976" w:name="bm_ch2_2"/>
+      <w:bookmarkStart w:id="650" w:name="bm_ch2_2"/>
       <w:pPr>
         <w:pStyle w:val="Heading2"/>
         <w:spacing w:line="360" w:lineRule="auto"/>
@@ -2878,7 +2878,7 @@
         </w:rPr>
         <w:t>2.2 Identification des acteurs</w:t>
       </w:r>
-      <w:bookmarkEnd w:id="32976"/>
+      <w:bookmarkEnd w:id="650"/>
     </w:p>
     <w:p>
       <w:pPr>
@@ -3242,7 +3242,7 @@
       </w:r>
     </w:p>
     <w:p>
-      <w:bookmarkStart w:id="41380" w:name="bm_ch2_3"/>
+      <w:bookmarkStart w:id="50082" w:name="bm_ch2_3"/>
       <w:pPr>
         <w:pStyle w:val="Heading2"/>
         <w:spacing w:line="360" w:lineRule="auto"/>
@@ -3257,7 +3257,7 @@
         </w:rPr>
         <w:t>2.3 Besoins fonctionnels</w:t>
       </w:r>
-      <w:bookmarkEnd w:id="41380"/>
+      <w:bookmarkEnd w:id="50082"/>
     </w:p>
     <w:p>
       <w:pPr>
@@ -3362,7 +3362,7 @@
       </w:r>
     </w:p>
     <w:p>
-      <w:bookmarkStart w:id="73467" w:name="bm_ch2_4"/>
+      <w:bookmarkStart w:id="98810" w:name="bm_ch2_4"/>
       <w:pPr>
         <w:pStyle w:val="Heading2"/>
         <w:spacing w:line="360" w:lineRule="auto"/>
@@ -3377,7 +3377,7 @@
         </w:rPr>
         <w:t>2.4 Besoins non fonctionnels</w:t>
       </w:r>
-      <w:bookmarkEnd w:id="73467"/>
+      <w:bookmarkEnd w:id="98810"/>
     </w:p>
     <w:p>
       <w:pPr>
@@ -3414,7 +3414,7 @@
       </w:r>
     </w:p>
     <w:p>
-      <w:bookmarkStart w:id="80510" w:name="bm_ch2_5"/>
+      <w:bookmarkStart w:id="26155" w:name="bm_ch2_5"/>
       <w:pPr>
         <w:pStyle w:val="Heading2"/>
         <w:spacing w:line="360" w:lineRule="auto"/>
@@ -3429,7 +3429,7 @@
         </w:rPr>
         <w:t>2.5 Règles métier structurantes</w:t>
       </w:r>
-      <w:bookmarkEnd w:id="80510"/>
+      <w:bookmarkEnd w:id="26155"/>
     </w:p>
     <w:p>
       <w:pPr>
@@ -3449,7 +3449,7 @@
       </w:r>
     </w:p>
     <w:p>
-      <w:bookmarkStart w:id="58575" w:name="bm_ch2_6"/>
+      <w:bookmarkStart w:id="888" w:name="bm_ch2_6"/>
       <w:pPr>
         <w:pStyle w:val="Heading2"/>
         <w:spacing w:line="360" w:lineRule="auto"/>
@@ -3464,7 +3464,7 @@
         </w:rPr>
         <w:t>2.6 Scénarios d'usage prioritaires</w:t>
       </w:r>
-      <w:bookmarkEnd w:id="58575"/>
+      <w:bookmarkEnd w:id="888"/>
     </w:p>
     <w:p>
       <w:pPr>
@@ -3484,7 +3484,7 @@
       </w:r>
     </w:p>
     <w:p>
-      <w:bookmarkStart w:id="72441" w:name="bm_ch2_7"/>
+      <w:bookmarkStart w:id="187" w:name="bm_ch2_7"/>
       <w:pPr>
         <w:pStyle w:val="Heading2"/>
         <w:spacing w:line="360" w:lineRule="auto"/>
@@ -3499,7 +3499,7 @@
         </w:rPr>
         <w:t>2.7 Conclusion partielle</w:t>
       </w:r>
-      <w:bookmarkEnd w:id="72441"/>
+      <w:bookmarkEnd w:id="187"/>
     </w:p>
     <w:p>
       <w:pPr>
@@ -3524,7 +3524,7 @@
       </w:r>
     </w:p>
     <w:p>
-      <w:bookmarkStart w:id="90342" w:name="bm_ch3"/>
+      <w:bookmarkStart w:id="91592" w:name="bm_ch3"/>
       <w:pPr>
         <w:pStyle w:val="Heading1"/>
         <w:spacing w:line="360" w:lineRule="auto"/>
@@ -3539,10 +3539,10 @@
         </w:rPr>
         <w:t>Chapitre 3 : Conception du système Cylentic</w:t>
       </w:r>
-      <w:bookmarkEnd w:id="90342"/>
-    </w:p>
-    <w:p>
-      <w:bookmarkStart w:id="18099" w:name="bm_ch3_1"/>
+      <w:bookmarkEnd w:id="91592"/>
+    </w:p>
+    <w:p>
+      <w:bookmarkStart w:id="84377" w:name="bm_ch3_1"/>
       <w:pPr>
         <w:pStyle w:val="Heading2"/>
         <w:spacing w:line="360" w:lineRule="auto"/>
@@ -3557,7 +3557,7 @@
         </w:rPr>
         <w:t>3.1 Démarche de conception</w:t>
       </w:r>
-      <w:bookmarkEnd w:id="18099"/>
+      <w:bookmarkEnd w:id="84377"/>
     </w:p>
     <w:p>
       <w:pPr>
@@ -3627,7 +3627,7 @@
       </w:r>
     </w:p>
     <w:p>
-      <w:bookmarkStart w:id="20128" w:name="bm_ch3_2"/>
+      <w:bookmarkStart w:id="7014" w:name="bm_ch3_2"/>
       <w:pPr>
         <w:pStyle w:val="Heading2"/>
         <w:spacing w:line="360" w:lineRule="auto"/>
@@ -3642,7 +3642,7 @@
         </w:rPr>
         <w:t>3.2 Architecture générale et déploiement</w:t>
       </w:r>
-      <w:bookmarkEnd w:id="20128"/>
+      <w:bookmarkEnd w:id="7014"/>
     </w:p>
     <w:p>
       <w:pPr>
@@ -3875,7 +3875,7 @@
       </w:r>
     </w:p>
     <w:p>
-      <w:bookmarkStart w:id="81965" w:name="bm_ch3_3"/>
+      <w:bookmarkStart w:id="35791" w:name="bm_ch3_3"/>
       <w:pPr>
         <w:pStyle w:val="Heading2"/>
         <w:spacing w:line="360" w:lineRule="auto"/>
@@ -3890,7 +3890,7 @@
         </w:rPr>
         <w:t>3.3 Vue des cas d'utilisation</w:t>
       </w:r>
-      <w:bookmarkEnd w:id="81965"/>
+      <w:bookmarkEnd w:id="35791"/>
     </w:p>
     <w:p>
       <w:pPr>
@@ -4464,7 +4464,7 @@
       </w:r>
     </w:p>
     <w:p>
-      <w:bookmarkStart w:id="9773" w:name="bm_ch3_4"/>
+      <w:bookmarkStart w:id="7215" w:name="bm_ch3_4"/>
       <w:pPr>
         <w:pStyle w:val="Heading2"/>
         <w:spacing w:line="360" w:lineRule="auto"/>
@@ -4479,7 +4479,7 @@
         </w:rPr>
         <w:t>3.4 Structure statique : classes et objets</w:t>
       </w:r>
-      <w:bookmarkEnd w:id="9773"/>
+      <w:bookmarkEnd w:id="7215"/>
     </w:p>
     <w:p>
       <w:pPr>
@@ -5019,7 +5019,7 @@
       </w:r>
     </w:p>
     <w:p>
-      <w:bookmarkStart w:id="88216" w:name="bm_ch3_5"/>
+      <w:bookmarkStart w:id="24961" w:name="bm_ch3_5"/>
       <w:pPr>
         <w:pStyle w:val="Heading2"/>
         <w:spacing w:line="360" w:lineRule="auto"/>
@@ -5034,7 +5034,7 @@
         </w:rPr>
         <w:t>3.5 Organisation en composants</w:t>
       </w:r>
-      <w:bookmarkEnd w:id="88216"/>
+      <w:bookmarkEnd w:id="24961"/>
     </w:p>
     <w:p>
       <w:pPr>
@@ -5314,7 +5314,7 @@
       </w:r>
     </w:p>
     <w:p>
-      <w:bookmarkStart w:id="49488" w:name="bm_ch3_6"/>
+      <w:bookmarkStart w:id="96373" w:name="bm_ch3_6"/>
       <w:pPr>
         <w:pStyle w:val="Heading2"/>
         <w:spacing w:line="360" w:lineRule="auto"/>
@@ -5329,10 +5329,10 @@
         </w:rPr>
         <w:t>3.6 Dynamique du système</w:t>
       </w:r>
-      <w:bookmarkEnd w:id="49488"/>
-    </w:p>
-    <w:p>
-      <w:bookmarkStart w:id="59688" w:name="3_6_1_Cycle_de_vie_d_un_examen"/>
+      <w:bookmarkEnd w:id="96373"/>
+    </w:p>
+    <w:p>
+      <w:bookmarkStart w:id="63438" w:name="3_6_1_Cycle_de_vie_d_un_examen"/>
       <w:pPr>
         <w:pStyle w:val="Heading3"/>
         <w:spacing w:line="360" w:lineRule="auto"/>
@@ -5347,7 +5347,7 @@
         </w:rPr>
         <w:t>3.6.1 Cycle de vie d'un examen</w:t>
       </w:r>
-      <w:bookmarkEnd w:id="59688"/>
+      <w:bookmarkEnd w:id="63438"/>
     </w:p>
     <w:p>
       <w:pPr>
@@ -5448,7 +5448,7 @@
       </w:r>
     </w:p>
     <w:p>
-      <w:bookmarkStart w:id="24775" w:name="3_6_2_Interactions_principales"/>
+      <w:bookmarkStart w:id="92455" w:name="3_6_2_Interactions_principales"/>
       <w:pPr>
         <w:pStyle w:val="Heading3"/>
         <w:spacing w:line="360" w:lineRule="auto"/>
@@ -5463,7 +5463,7 @@
         </w:rPr>
         <w:t>3.6.2 Interactions principales</w:t>
       </w:r>
-      <w:bookmarkEnd w:id="24775"/>
+      <w:bookmarkEnd w:id="92455"/>
     </w:p>
     <w:p>
       <w:pPr>
@@ -6054,7 +6054,7 @@
       </w:r>
     </w:p>
     <w:p>
-      <w:bookmarkStart w:id="82522" w:name="3_6_3_Parcours_d_activit__de_l__tudiant"/>
+      <w:bookmarkStart w:id="8698" w:name="3_6_3_Parcours_d_activit__de_l__tudiant"/>
       <w:pPr>
         <w:pStyle w:val="Heading3"/>
         <w:spacing w:line="360" w:lineRule="auto"/>
@@ -6069,7 +6069,7 @@
         </w:rPr>
         <w:t>3.6.3 Parcours d'activité de l'étudiant</w:t>
       </w:r>
-      <w:bookmarkEnd w:id="82522"/>
+      <w:bookmarkEnd w:id="8698"/>
     </w:p>
     <w:p>
       <w:pPr>
@@ -6251,7 +6251,7 @@
       </w:r>
     </w:p>
     <w:p>
-      <w:bookmarkStart w:id="23135" w:name="bm_ch3_7"/>
+      <w:bookmarkStart w:id="86024" w:name="bm_ch3_7"/>
       <w:pPr>
         <w:pStyle w:val="Heading2"/>
         <w:spacing w:line="360" w:lineRule="auto"/>
@@ -6266,7 +6266,7 @@
         </w:rPr>
         <w:t>3.7 Conception des données</w:t>
       </w:r>
-      <w:bookmarkEnd w:id="23135"/>
+      <w:bookmarkEnd w:id="86024"/>
     </w:p>
     <w:p>
       <w:pPr>
@@ -6706,7 +6706,7 @@
       </w:r>
     </w:p>
     <w:p>
-      <w:bookmarkStart w:id="76845" w:name="bm_ch3_8"/>
+      <w:bookmarkStart w:id="98373" w:name="bm_ch3_8"/>
       <w:pPr>
         <w:pStyle w:val="Heading2"/>
         <w:spacing w:line="360" w:lineRule="auto"/>
@@ -6721,7 +6721,7 @@
         </w:rPr>
         <w:t>3.8 Conception de la sécurité de passation</w:t>
       </w:r>
-      <w:bookmarkEnd w:id="76845"/>
+      <w:bookmarkEnd w:id="98373"/>
     </w:p>
     <w:p>
       <w:pPr>
@@ -6809,7 +6809,7 @@
       </w:r>
     </w:p>
     <w:p>
-      <w:bookmarkStart w:id="15237" w:name="bm_ch3_9"/>
+      <w:bookmarkStart w:id="7462" w:name="bm_ch3_9"/>
       <w:pPr>
         <w:pStyle w:val="Heading2"/>
         <w:spacing w:line="360" w:lineRule="auto"/>
@@ -6824,7 +6824,7 @@
         </w:rPr>
         <w:t>3.9 Conception de la correction automatique</w:t>
       </w:r>
-      <w:bookmarkEnd w:id="15237"/>
+      <w:bookmarkEnd w:id="7462"/>
     </w:p>
     <w:p>
       <w:pPr>
@@ -6878,7 +6878,7 @@
       </w:r>
     </w:p>
     <w:p>
-      <w:bookmarkStart w:id="39266" w:name="bm_ch3_10"/>
+      <w:bookmarkStart w:id="96015" w:name="bm_ch3_10"/>
       <w:pPr>
         <w:pStyle w:val="Heading2"/>
         <w:spacing w:line="360" w:lineRule="auto"/>
@@ -6893,7 +6893,7 @@
         </w:rPr>
         <w:t>3.10 Conclusion partielle</w:t>
       </w:r>
-      <w:bookmarkEnd w:id="39266"/>
+      <w:bookmarkEnd w:id="96015"/>
     </w:p>
     <w:p>
       <w:pPr>
@@ -6918,7 +6918,7 @@
       </w:r>
     </w:p>
     <w:p>
-      <w:bookmarkStart w:id="44329" w:name="bm_ch4"/>
+      <w:bookmarkStart w:id="92602" w:name="bm_ch4"/>
       <w:pPr>
         <w:pStyle w:val="Heading1"/>
         <w:spacing w:line="360" w:lineRule="auto"/>
@@ -6933,10 +6933,10 @@
         </w:rPr>
         <w:t>Chapitre 4 : Réalisation et mise en œuvre</w:t>
       </w:r>
-      <w:bookmarkEnd w:id="44329"/>
-    </w:p>
-    <w:p>
-      <w:bookmarkStart w:id="31248" w:name="bm_ch4_1"/>
+      <w:bookmarkEnd w:id="92602"/>
+    </w:p>
+    <w:p>
+      <w:bookmarkStart w:id="73033" w:name="bm_ch4_1"/>
       <w:pPr>
         <w:pStyle w:val="Heading2"/>
         <w:spacing w:line="360" w:lineRule="auto"/>
@@ -6951,7 +6951,7 @@
         </w:rPr>
         <w:t>4.1 Environnement de travail</w:t>
       </w:r>
-      <w:bookmarkEnd w:id="31248"/>
+      <w:bookmarkEnd w:id="73033"/>
     </w:p>
     <w:p>
       <w:pPr>
@@ -6988,7 +6988,7 @@
       </w:r>
     </w:p>
     <w:p>
-      <w:bookmarkStart w:id="22105" w:name="bm_ch4_2"/>
+      <w:bookmarkStart w:id="2996" w:name="bm_ch4_2"/>
       <w:pPr>
         <w:pStyle w:val="Heading2"/>
         <w:spacing w:line="360" w:lineRule="auto"/>
@@ -7003,7 +7003,7 @@
         </w:rPr>
         <w:t>4.2 Choix technologiques</w:t>
       </w:r>
-      <w:bookmarkEnd w:id="22105"/>
+      <w:bookmarkEnd w:id="2996"/>
     </w:p>
     <w:p>
       <w:pPr>
@@ -7040,7 +7040,7 @@
       </w:r>
     </w:p>
     <w:p>
-      <w:bookmarkStart w:id="38769" w:name="bm_ch4_3"/>
+      <w:bookmarkStart w:id="55218" w:name="bm_ch4_3"/>
       <w:pPr>
         <w:pStyle w:val="Heading2"/>
         <w:spacing w:line="360" w:lineRule="auto"/>
@@ -7055,7 +7055,7 @@
         </w:rPr>
         <w:t>4.3 Organisation du code et architecture applicative</w:t>
       </w:r>
-      <w:bookmarkEnd w:id="38769"/>
+      <w:bookmarkEnd w:id="55218"/>
     </w:p>
     <w:p>
       <w:pPr>
@@ -7092,7 +7092,7 @@
       </w:r>
     </w:p>
     <w:p>
-      <w:bookmarkStart w:id="52474" w:name="bm_ch4_4"/>
+      <w:bookmarkStart w:id="22156" w:name="bm_ch4_4"/>
       <w:pPr>
         <w:pStyle w:val="Heading2"/>
         <w:spacing w:line="360" w:lineRule="auto"/>
@@ -7107,10 +7107,10 @@
         </w:rPr>
         <w:t>4.4 Réalisation des modules principaux</w:t>
       </w:r>
-      <w:bookmarkEnd w:id="52474"/>
-    </w:p>
-    <w:p>
-      <w:bookmarkStart w:id="27168" w:name="4_4_1_Authentification_et_sessions"/>
+      <w:bookmarkEnd w:id="22156"/>
+    </w:p>
+    <w:p>
+      <w:bookmarkStart w:id="77265" w:name="4_4_1_Authentification_et_sessions"/>
       <w:pPr>
         <w:pStyle w:val="Heading3"/>
         <w:spacing w:line="360" w:lineRule="auto"/>
@@ -7125,7 +7125,7 @@
         </w:rPr>
         <w:t>4.4.1 Authentification et sessions</w:t>
       </w:r>
-      <w:bookmarkEnd w:id="27168"/>
+      <w:bookmarkEnd w:id="77265"/>
     </w:p>
     <w:p>
       <w:pPr>
@@ -7146,166 +7146,19 @@
     </w:p>
     <w:p>
       <w:pPr>
-        <w:spacing w:after="160" w:line="360" w:lineRule="auto"/>
-        <w:ind w:firstLine="425"/>
-        <w:jc w:val="both"/>
-      </w:pPr>
-      <w:r>
-        <w:rPr>
-          <w:rFonts w:ascii="Times New Roman" w:hAnsi="Times New Roman" w:eastAsia="Times New Roman"/>
-          <w:b w:val="0"/>
-          <w:i w:val="0"/>
-          <w:color w:val="000000"/>
-          <w:sz w:val="24"/>
-        </w:rPr>
-        <w:t>Un point sensible a été corrigé pendant la réalisation. Avec next start, l'environnement passe en production et le cookie était initialement marqué Secure. Or, en accès salle via une adresse HTTP locale, le navigateur refuse ce cookie. La connexion semblait alors échouer pour tous les profils. La solution livrée active Secure uniquement lorsque la requête est réellement en HTTPS, ou si FORCE_SECURE_COOKIES est explicitement forcé.</w:t>
-      </w:r>
-    </w:p>
-    <w:p>
-      <w:bookmarkStart w:id="86346" w:name="4_4_2_Module_administrateur_d__tablissem"/>
-      <w:pPr>
-        <w:pStyle w:val="Heading3"/>
-        <w:spacing w:line="360" w:lineRule="auto"/>
-      </w:pPr>
-      <w:r>
-        <w:rPr>
-          <w:rFonts w:ascii="Times New Roman" w:hAnsi="Times New Roman" w:eastAsia="Times New Roman"/>
-          <w:b/>
-          <w:i w:val="0"/>
-          <w:color w:val="000000"/>
-          <w:sz w:val="24"/>
-        </w:rPr>
-        <w:t>4.4.2 Module administrateur d'établissement</w:t>
-      </w:r>
-      <w:bookmarkEnd w:id="86346"/>
-    </w:p>
-    <w:p>
-      <w:pPr>
-        <w:spacing w:after="160" w:line="360" w:lineRule="auto"/>
-        <w:ind w:firstLine="425"/>
-        <w:jc w:val="both"/>
-      </w:pPr>
-      <w:r>
-        <w:rPr>
-          <w:rFonts w:ascii="Times New Roman" w:hAnsi="Times New Roman" w:eastAsia="Times New Roman"/>
-          <w:b w:val="0"/>
-          <w:i w:val="0"/>
-          <w:color w:val="000000"/>
-          <w:sz w:val="24"/>
-        </w:rPr>
-        <w:t>Après inscription, l'administrateur est guidé dans un onboarding : année académique, classes, premiers utilisateurs. Tant que ces étapes ne sont pas complètes, le tableau de bord peut rediriger vers le parcours d'installation. Les tableaux de bord présentent ensuite population, examens et activité. Les étudiants peuvent être créés manuellement ou importés par CSV, avec un rapport d'erreurs ligne à ligne. Les professeurs reçoivent un identifiant PROF-* et un mot de passe par défaut. Les administrateurs sont plafonnés à deux comptes actifs : on ne peut pas s'auto désactiver, et le système refuse de laisser l'établissement sans administrateur actif.</w:t>
-      </w:r>
-    </w:p>
-    <w:p>
-      <w:pPr>
-        <w:spacing w:after="160" w:line="360" w:lineRule="auto"/>
-        <w:ind w:firstLine="425"/>
-        <w:jc w:val="both"/>
-      </w:pPr>
-      <w:r>
-        <w:rPr>
-          <w:rFonts w:ascii="Times New Roman" w:hAnsi="Times New Roman" w:eastAsia="Times New Roman"/>
-          <w:b w:val="0"/>
-          <w:i w:val="0"/>
-          <w:color w:val="000000"/>
-          <w:sz w:val="24"/>
-        </w:rPr>
-        <w:t>La promotion de rentrée a aussi été livrée. Le parcours propose le choix ou la création de l'année cible, l'association des classes sources vers les classes de destination, puis la confirmation. La transaction met à jour les profils étudiants, active la nouvelle année et peut archiver l'année précédente.</w:t>
-      </w:r>
-    </w:p>
-    <w:p>
-      <w:bookmarkStart w:id="18429" w:name="4_4_3_Module_professeur"/>
-      <w:pPr>
-        <w:pStyle w:val="Heading3"/>
-        <w:spacing w:line="360" w:lineRule="auto"/>
-      </w:pPr>
-      <w:r>
-        <w:rPr>
-          <w:rFonts w:ascii="Times New Roman" w:hAnsi="Times New Roman" w:eastAsia="Times New Roman"/>
-          <w:b/>
-          <w:i w:val="0"/>
-          <w:color w:val="000000"/>
-          <w:sz w:val="24"/>
-        </w:rPr>
-        <w:t>4.4.3 Module professeur</w:t>
-      </w:r>
-      <w:bookmarkEnd w:id="18429"/>
-    </w:p>
-    <w:p>
-      <w:pPr>
-        <w:spacing w:after="160" w:line="360" w:lineRule="auto"/>
-        <w:ind w:firstLine="425"/>
-        <w:jc w:val="both"/>
-      </w:pPr>
-      <w:r>
-        <w:rPr>
-          <w:rFonts w:ascii="Times New Roman" w:hAnsi="Times New Roman" w:eastAsia="Times New Roman"/>
-          <w:b w:val="0"/>
-          <w:i w:val="0"/>
-          <w:color w:val="000000"/>
-          <w:sz w:val="24"/>
-        </w:rPr>
-        <w:t>Le cycle de vie d'un examen reste celui conçu au chapitre 3. Le professeur crée un brouillon, compose les exercices (code Python avec tests et/ou QCM), puis publie. La publication génère un code d'accès affichable aussi en mode présentation pour le vidéoprojecteur. Pendant l'épreuve, le suivi live montre les statuts. Après l'examen, le professeur consulte les copies, peut ajuster une note manuelle et exporter les résultats (Excel, PDF) ainsi que la présence (CSV).</w:t>
-      </w:r>
-    </w:p>
-    <w:p>
-      <w:pPr>
-        <w:spacing w:after="160" w:line="360" w:lineRule="auto"/>
-        <w:ind w:firstLine="425"/>
-        <w:jc w:val="both"/>
-      </w:pPr>
-      <w:r>
-        <w:rPr>
-          <w:rFonts w:ascii="Times New Roman" w:hAnsi="Times New Roman" w:eastAsia="Times New Roman"/>
-          <w:b w:val="0"/>
-          <w:i w:val="0"/>
-          <w:color w:val="000000"/>
-          <w:sz w:val="24"/>
-        </w:rPr>
-        <w:t>Plusieurs capacités ont étendu le MVP en cours de projet. Le planning peut être modifié sur un examen publié, avec synchronisation côté composition. Le contenu reste modifiable tant que la date de début n'est pas atteinte, via une règle partagée de verrouillage. La duplication crée un nouveau brouillon en reprenant la structure sans recopier les participations.</w:t>
-      </w:r>
-    </w:p>
-    <w:p>
-      <w:bookmarkStart w:id="74382" w:name="4_4_4_Module__tudiant_et_parcours_de_com"/>
-      <w:pPr>
-        <w:pStyle w:val="Heading3"/>
-        <w:spacing w:line="360" w:lineRule="auto"/>
-      </w:pPr>
-      <w:r>
-        <w:rPr>
-          <w:rFonts w:ascii="Times New Roman" w:hAnsi="Times New Roman" w:eastAsia="Times New Roman"/>
-          <w:b/>
-          <w:i w:val="0"/>
-          <w:color w:val="000000"/>
-          <w:sz w:val="24"/>
-        </w:rPr>
-        <w:t>4.4.4 Module étudiant et parcours de composition</w:t>
-      </w:r>
-      <w:bookmarkEnd w:id="74382"/>
-    </w:p>
-    <w:p>
-      <w:pPr>
-        <w:spacing w:after="160" w:line="360" w:lineRule="auto"/>
-        <w:ind w:firstLine="425"/>
-        <w:jc w:val="both"/>
-      </w:pPr>
-      <w:r>
-        <w:rPr>
-          <w:rFonts w:ascii="Times New Roman" w:hAnsi="Times New Roman" w:eastAsia="Times New Roman"/>
-          <w:b w:val="0"/>
-          <w:i w:val="0"/>
-          <w:color w:val="000000"/>
-          <w:sz w:val="24"/>
-        </w:rPr>
-        <w:t>Le parcours étudiant est volontairement explicite. La première page présente les consignes et exige le plein écran. Tant que l'API Fullscreen est refusée ou indisponible, l'étudiant ne peut pas avancer. Une fois le plein écran accepté, il entre en salle d'attente. Un compte à rebours est synchronisé avec le serveur via un polling sur l'API de session. L'énoncé reste masqué. Dès cette étape, l'heure de connexion et l'adresse IP sont enregistrées.</w:t>
-      </w:r>
-    </w:p>
-    <w:p>
-      <w:pPr>
-        <w:spacing w:after="480" w:line="240" w:lineRule="auto"/>
+        <w:spacing w:after="240" w:line="240" w:lineRule="auto" w:before="240"/>
         <w:jc w:val="center"/>
       </w:pPr>
-      <w:r/>
+      <w:r>
+        <w:rPr>
+          <w:rFonts w:ascii="Times New Roman" w:hAnsi="Times New Roman" w:eastAsia="Times New Roman"/>
+          <w:b w:val="0"/>
+          <w:i/>
+          <w:color w:val="000000"/>
+          <w:sz w:val="20"/>
+        </w:rPr>
+        <w:t>[Insérer ici la capture d'écran correspondante]</w:t>
+      </w:r>
     </w:p>
     <w:p>
       <w:pPr>
@@ -7345,7 +7198,7 @@
           <w:color w:val="000000"/>
           <w:sz w:val="22"/>
         </w:rPr>
-        <w:t xml:space="preserve"> : Salle d'attente avant le démarrage de l'examen</w:t>
+        <w:t xml:space="preserve"> : Page de connexion multi rôles</w:t>
       </w:r>
     </w:p>
     <w:p>
@@ -7362,15 +7215,59 @@
           <w:color w:val="000000"/>
           <w:sz w:val="24"/>
         </w:rPr>
-        <w:t>Au démarrage, la page de composition affiche le menu des exercices, l'énoncé, l'éditeur Monaco pour Python, le bouton d'exécution, le timer global et la soumission. Un autosave périodique, complété par le stockage local du navigateur, limite les pertes en cas de coupure brève. Un second polling permet de mettre à jour la fin d'examen si le professeur modifie le planning en cours de session.</w:t>
-      </w:r>
-    </w:p>
-    <w:p>
-      <w:pPr>
-        <w:spacing w:after="480" w:line="240" w:lineRule="auto"/>
+        <w:t>Un point sensible a été corrigé pendant la réalisation. Avec next start, l'environnement passe en production et le cookie était initialement marqué Secure. Or, en accès salle via une adresse HTTP locale, le navigateur refuse ce cookie. La connexion semblait alors échouer pour tous les profils. La solution livrée active Secure uniquement lorsque la requête est réellement en HTTPS, ou si FORCE_SECURE_COOKIES est explicitement forcé.</w:t>
+      </w:r>
+    </w:p>
+    <w:p>
+      <w:bookmarkStart w:id="82084" w:name="4_4_2_Module_administrateur_d__tablissem"/>
+      <w:pPr>
+        <w:pStyle w:val="Heading3"/>
+        <w:spacing w:line="360" w:lineRule="auto"/>
+      </w:pPr>
+      <w:r>
+        <w:rPr>
+          <w:rFonts w:ascii="Times New Roman" w:hAnsi="Times New Roman" w:eastAsia="Times New Roman"/>
+          <w:b/>
+          <w:i w:val="0"/>
+          <w:color w:val="000000"/>
+          <w:sz w:val="24"/>
+        </w:rPr>
+        <w:t>4.4.2 Module administrateur d'établissement</w:t>
+      </w:r>
+      <w:bookmarkEnd w:id="82084"/>
+    </w:p>
+    <w:p>
+      <w:pPr>
+        <w:spacing w:after="160" w:line="360" w:lineRule="auto"/>
+        <w:ind w:firstLine="425"/>
+        <w:jc w:val="both"/>
+      </w:pPr>
+      <w:r>
+        <w:rPr>
+          <w:rFonts w:ascii="Times New Roman" w:hAnsi="Times New Roman" w:eastAsia="Times New Roman"/>
+          <w:b w:val="0"/>
+          <w:i w:val="0"/>
+          <w:color w:val="000000"/>
+          <w:sz w:val="24"/>
+        </w:rPr>
+        <w:t>Après inscription, l'administrateur est guidé dans un onboarding : année académique, classes, premiers utilisateurs. Tant que ces étapes ne sont pas complètes, le tableau de bord peut rediriger vers le parcours d'installation. Les tableaux de bord présentent ensuite population, examens et activité. Les étudiants peuvent être créés manuellement ou importés par CSV, avec un rapport d'erreurs ligne à ligne. Les professeurs reçoivent un identifiant PROF-* et un mot de passe par défaut. Les administrateurs sont plafonnés à deux comptes actifs : on ne peut pas s'auto désactiver, et le système refuse de laisser l'établissement sans administrateur actif.</w:t>
+      </w:r>
+    </w:p>
+    <w:p>
+      <w:pPr>
+        <w:spacing w:after="240" w:line="240" w:lineRule="auto" w:before="240"/>
         <w:jc w:val="center"/>
       </w:pPr>
-      <w:r/>
+      <w:r>
+        <w:rPr>
+          <w:rFonts w:ascii="Times New Roman" w:hAnsi="Times New Roman" w:eastAsia="Times New Roman"/>
+          <w:b w:val="0"/>
+          <w:i/>
+          <w:color w:val="000000"/>
+          <w:sz w:val="20"/>
+        </w:rPr>
+        <w:t>[Insérer ici la capture d'écran correspondante]</w:t>
+      </w:r>
     </w:p>
     <w:p>
       <w:pPr>
@@ -7410,7 +7307,7 @@
           <w:color w:val="000000"/>
           <w:sz w:val="22"/>
         </w:rPr>
-        <w:t xml:space="preserve"> : Environnement de composition pendant l'épreuve</w:t>
+        <w:t xml:space="preserve"> : Espace administrateur d'établissement</w:t>
       </w:r>
     </w:p>
     <w:p>
@@ -7427,11 +7324,11 @@
           <w:color w:val="000000"/>
           <w:sz w:val="24"/>
         </w:rPr>
-        <w:t>Les contrôles de passation signalent au serveur les sorties de plein écran, les changements d'onglet et certains collages. Au second incident de sortie du plein écran, la participation est exclue et redirigée vers une confirmation avec motif. La soumission peut être manuelle, automatique à l'expiration du timer, ou forcée par exclusion. Une fois la participation close, aucune reconnexion utile n'est possible. Aucun score n'est montré à l'étudiant.</w:t>
-      </w:r>
-    </w:p>
-    <w:p>
-      <w:bookmarkStart w:id="14237" w:name="4_4_5_Sandbox_et_correction_automatique"/>
+        <w:t>La promotion de rentrée a aussi été livrée. Le parcours propose le choix ou la création de l'année cible, l'association des classes sources vers les classes de destination, puis la confirmation. La transaction met à jour les profils étudiants, active la nouvelle année et peut archiver l'année précédente.</w:t>
+      </w:r>
+    </w:p>
+    <w:p>
+      <w:bookmarkStart w:id="74112" w:name="4_4_3_Module_professeur"/>
       <w:pPr>
         <w:pStyle w:val="Heading3"/>
         <w:spacing w:line="360" w:lineRule="auto"/>
@@ -7444,9 +7341,9 @@
           <w:color w:val="000000"/>
           <w:sz w:val="24"/>
         </w:rPr>
-        <w:t>4.4.5 Sandbox et correction automatique</w:t>
-      </w:r>
-      <w:bookmarkEnd w:id="14237"/>
+        <w:t>4.4.3 Module professeur</w:t>
+      </w:r>
+      <w:bookmarkEnd w:id="74112"/>
     </w:p>
     <w:p>
       <w:pPr>
@@ -7462,26 +7359,236 @@
           <w:color w:val="000000"/>
           <w:sz w:val="24"/>
         </w:rPr>
-        <w:t>Le service sandbox exécute le code Python dans un conteneur éphémère, avec timeout et sans accès réseau. En développement, un repli local peut exister si Docker est absent ; ce mode n'est pas recommandé pour une salle réelle. La correction automatique parcourt chaque test unitaire, exécute le programme, normalise la sortie, puis compare à la sortie attendue. Le poids de chaque test intervient dans le score automatique. Le professeur peut ensuite imposer un score manuel, qui prend le dessus lorsqu'il est renseigné.</w:t>
-      </w:r>
-    </w:p>
-    <w:p>
-      <w:bookmarkStart w:id="87642" w:name="4_4_6_Landing_page_et_contact"/>
-      <w:pPr>
-        <w:pStyle w:val="Heading3"/>
-        <w:spacing w:line="360" w:lineRule="auto"/>
-      </w:pPr>
-      <w:r>
-        <w:rPr>
-          <w:rFonts w:ascii="Times New Roman" w:hAnsi="Times New Roman" w:eastAsia="Times New Roman"/>
-          <w:b/>
-          <w:i w:val="0"/>
-          <w:color w:val="000000"/>
-          <w:sz w:val="24"/>
-        </w:rPr>
-        <w:t>4.4.6 Landing page et contact</w:t>
-      </w:r>
-      <w:bookmarkEnd w:id="87642"/>
+        <w:t>Le cycle de vie d'un examen reste celui conçu au chapitre 3. Le professeur crée un brouillon, compose les exercices (code Python avec tests et/ou QCM), puis publie. La publication génère un code d'accès affichable aussi en mode présentation pour le vidéoprojecteur. Pendant l'épreuve, le suivi live montre les statuts. Après l'examen, le professeur consulte les copies, peut ajuster une note manuelle et exporter les résultats (Excel, PDF) ainsi que la présence (CSV).</w:t>
+      </w:r>
+    </w:p>
+    <w:p>
+      <w:pPr>
+        <w:spacing w:after="240" w:line="240" w:lineRule="auto" w:before="240"/>
+        <w:jc w:val="center"/>
+      </w:pPr>
+      <w:r>
+        <w:rPr>
+          <w:rFonts w:ascii="Times New Roman" w:hAnsi="Times New Roman" w:eastAsia="Times New Roman"/>
+          <w:b w:val="0"/>
+          <w:i/>
+          <w:color w:val="000000"/>
+          <w:sz w:val="20"/>
+        </w:rPr>
+        <w:t>[Insérer ici la capture d'écran correspondante]</w:t>
+      </w:r>
+    </w:p>
+    <w:p>
+      <w:pPr>
+        <w:pStyle w:val="Caption"/>
+        <w:spacing w:after="200" w:line="360" w:lineRule="auto"/>
+        <w:jc w:val="center"/>
+      </w:pPr>
+      <w:r>
+        <w:rPr>
+          <w:rFonts w:ascii="Times New Roman" w:hAnsi="Times New Roman" w:eastAsia="Times New Roman"/>
+          <w:b w:val="0"/>
+          <w:i w:val="0"/>
+          <w:color w:val="000000"/>
+          <w:sz w:val="22"/>
+        </w:rPr>
+        <w:t xml:space="preserve">Figure </w:t>
+      </w:r>
+      <w:r>
+        <w:rPr>
+          <w:rFonts w:ascii="Times New Roman" w:hAnsi="Times New Roman" w:eastAsia="Times New Roman"/>
+          <w:b w:val="0"/>
+          <w:i w:val="0"/>
+          <w:color w:val="000000"/>
+          <w:sz w:val="22"/>
+        </w:rPr>
+        <w:fldChar w:fldCharType="begin"/>
+        <w:instrText xml:space="preserve">SEQ Figure \* ARABIC</w:instrText>
+        <w:fldChar w:fldCharType="separate"/>
+        <w:t>29</w:t>
+        <w:fldChar w:fldCharType="end"/>
+      </w:r>
+      <w:r>
+        <w:rPr>
+          <w:rFonts w:ascii="Times New Roman" w:hAnsi="Times New Roman" w:eastAsia="Times New Roman"/>
+          <w:b w:val="0"/>
+          <w:i w:val="0"/>
+          <w:color w:val="000000"/>
+          <w:sz w:val="22"/>
+        </w:rPr>
+        <w:t xml:space="preserve"> : Composition d'un examen côté professeur</w:t>
+      </w:r>
+    </w:p>
+    <w:p>
+      <w:pPr>
+        <w:spacing w:after="240" w:line="240" w:lineRule="auto" w:before="240"/>
+        <w:jc w:val="center"/>
+      </w:pPr>
+      <w:r>
+        <w:rPr>
+          <w:rFonts w:ascii="Times New Roman" w:hAnsi="Times New Roman" w:eastAsia="Times New Roman"/>
+          <w:b w:val="0"/>
+          <w:i/>
+          <w:color w:val="000000"/>
+          <w:sz w:val="20"/>
+        </w:rPr>
+        <w:t>[Insérer ici la capture d'écran correspondante]</w:t>
+      </w:r>
+    </w:p>
+    <w:p>
+      <w:pPr>
+        <w:pStyle w:val="Caption"/>
+        <w:spacing w:after="200" w:line="360" w:lineRule="auto"/>
+        <w:jc w:val="center"/>
+      </w:pPr>
+      <w:r>
+        <w:rPr>
+          <w:rFonts w:ascii="Times New Roman" w:hAnsi="Times New Roman" w:eastAsia="Times New Roman"/>
+          <w:b w:val="0"/>
+          <w:i w:val="0"/>
+          <w:color w:val="000000"/>
+          <w:sz w:val="22"/>
+        </w:rPr>
+        <w:t xml:space="preserve">Figure </w:t>
+      </w:r>
+      <w:r>
+        <w:rPr>
+          <w:rFonts w:ascii="Times New Roman" w:hAnsi="Times New Roman" w:eastAsia="Times New Roman"/>
+          <w:b w:val="0"/>
+          <w:i w:val="0"/>
+          <w:color w:val="000000"/>
+          <w:sz w:val="22"/>
+        </w:rPr>
+        <w:fldChar w:fldCharType="begin"/>
+        <w:instrText xml:space="preserve">SEQ Figure \* ARABIC</w:instrText>
+        <w:fldChar w:fldCharType="separate"/>
+        <w:t>30</w:t>
+        <w:fldChar w:fldCharType="end"/>
+      </w:r>
+      <w:r>
+        <w:rPr>
+          <w:rFonts w:ascii="Times New Roman" w:hAnsi="Times New Roman" w:eastAsia="Times New Roman"/>
+          <w:b w:val="0"/>
+          <w:i w:val="0"/>
+          <w:color w:val="000000"/>
+          <w:sz w:val="22"/>
+        </w:rPr>
+        <w:t xml:space="preserve"> : Publication et code d'accès d'examen</w:t>
+      </w:r>
+    </w:p>
+    <w:p>
+      <w:pPr>
+        <w:spacing w:after="240" w:line="240" w:lineRule="auto" w:before="240"/>
+        <w:jc w:val="center"/>
+      </w:pPr>
+      <w:r>
+        <w:rPr>
+          <w:rFonts w:ascii="Times New Roman" w:hAnsi="Times New Roman" w:eastAsia="Times New Roman"/>
+          <w:b w:val="0"/>
+          <w:i/>
+          <w:color w:val="000000"/>
+          <w:sz w:val="20"/>
+        </w:rPr>
+        <w:t>[Insérer ici la capture d'écran correspondante]</w:t>
+      </w:r>
+    </w:p>
+    <w:p>
+      <w:pPr>
+        <w:pStyle w:val="Caption"/>
+        <w:spacing w:after="200" w:line="360" w:lineRule="auto"/>
+        <w:jc w:val="center"/>
+      </w:pPr>
+      <w:r>
+        <w:rPr>
+          <w:rFonts w:ascii="Times New Roman" w:hAnsi="Times New Roman" w:eastAsia="Times New Roman"/>
+          <w:b w:val="0"/>
+          <w:i w:val="0"/>
+          <w:color w:val="000000"/>
+          <w:sz w:val="22"/>
+        </w:rPr>
+        <w:t xml:space="preserve">Figure </w:t>
+      </w:r>
+      <w:r>
+        <w:rPr>
+          <w:rFonts w:ascii="Times New Roman" w:hAnsi="Times New Roman" w:eastAsia="Times New Roman"/>
+          <w:b w:val="0"/>
+          <w:i w:val="0"/>
+          <w:color w:val="000000"/>
+          <w:sz w:val="22"/>
+        </w:rPr>
+        <w:fldChar w:fldCharType="begin"/>
+        <w:instrText xml:space="preserve">SEQ Figure \* ARABIC</w:instrText>
+        <w:fldChar w:fldCharType="separate"/>
+        <w:t>31</w:t>
+        <w:fldChar w:fldCharType="end"/>
+      </w:r>
+      <w:r>
+        <w:rPr>
+          <w:rFonts w:ascii="Times New Roman" w:hAnsi="Times New Roman" w:eastAsia="Times New Roman"/>
+          <w:b w:val="0"/>
+          <w:i w:val="0"/>
+          <w:color w:val="000000"/>
+          <w:sz w:val="22"/>
+        </w:rPr>
+        <w:t xml:space="preserve"> : Suivi live des participations</w:t>
+      </w:r>
+    </w:p>
+    <w:p>
+      <w:pPr>
+        <w:spacing w:after="240" w:line="240" w:lineRule="auto" w:before="240"/>
+        <w:jc w:val="center"/>
+      </w:pPr>
+      <w:r>
+        <w:rPr>
+          <w:rFonts w:ascii="Times New Roman" w:hAnsi="Times New Roman" w:eastAsia="Times New Roman"/>
+          <w:b w:val="0"/>
+          <w:i/>
+          <w:color w:val="000000"/>
+          <w:sz w:val="20"/>
+        </w:rPr>
+        <w:t>[Insérer ici la capture d'écran correspondante]</w:t>
+      </w:r>
+    </w:p>
+    <w:p>
+      <w:pPr>
+        <w:pStyle w:val="Caption"/>
+        <w:spacing w:after="200" w:line="360" w:lineRule="auto"/>
+        <w:jc w:val="center"/>
+      </w:pPr>
+      <w:r>
+        <w:rPr>
+          <w:rFonts w:ascii="Times New Roman" w:hAnsi="Times New Roman" w:eastAsia="Times New Roman"/>
+          <w:b w:val="0"/>
+          <w:i w:val="0"/>
+          <w:color w:val="000000"/>
+          <w:sz w:val="22"/>
+        </w:rPr>
+        <w:t xml:space="preserve">Figure </w:t>
+      </w:r>
+      <w:r>
+        <w:rPr>
+          <w:rFonts w:ascii="Times New Roman" w:hAnsi="Times New Roman" w:eastAsia="Times New Roman"/>
+          <w:b w:val="0"/>
+          <w:i w:val="0"/>
+          <w:color w:val="000000"/>
+          <w:sz w:val="22"/>
+        </w:rPr>
+        <w:fldChar w:fldCharType="begin"/>
+        <w:instrText xml:space="preserve">SEQ Figure \* ARABIC</w:instrText>
+        <w:fldChar w:fldCharType="separate"/>
+        <w:t>32</w:t>
+        <w:fldChar w:fldCharType="end"/>
+      </w:r>
+      <w:r>
+        <w:rPr>
+          <w:rFonts w:ascii="Times New Roman" w:hAnsi="Times New Roman" w:eastAsia="Times New Roman"/>
+          <w:b w:val="0"/>
+          <w:i w:val="0"/>
+          <w:color w:val="000000"/>
+          <w:sz w:val="22"/>
+        </w:rPr>
+        <w:t xml:space="preserve"> : Résultats et exports professeur</w:t>
+      </w:r>
     </w:p>
     <w:p>
       <w:pPr>
@@ -7497,13 +7604,13 @@
           <w:color w:val="000000"/>
           <w:sz w:val="24"/>
         </w:rPr>
-        <w:t>La landing présente le produit. Le formulaire de contact appelle une API dédiée, enregistre une notification de type landing.contact et rend cette demande consultable côté Super Admin.</w:t>
-      </w:r>
-    </w:p>
-    <w:p>
-      <w:bookmarkStart w:id="68868" w:name="bm_ch4_5"/>
-      <w:pPr>
-        <w:pStyle w:val="Heading2"/>
+        <w:t>Plusieurs capacités ont étendu le MVP en cours de projet. Le planning peut être modifié sur un examen publié, avec synchronisation côté composition. Le contenu reste modifiable tant que la date de début n'est pas atteinte, via une règle partagée de verrouillage. La duplication crée un nouveau brouillon en reprenant la structure sans recopier les participations.</w:t>
+      </w:r>
+    </w:p>
+    <w:p>
+      <w:bookmarkStart w:id="1397" w:name="4_4_4_Module__tudiant_et_parcours_de_com"/>
+      <w:pPr>
+        <w:pStyle w:val="Heading3"/>
         <w:spacing w:line="360" w:lineRule="auto"/>
       </w:pPr>
       <w:r>
@@ -7514,9 +7621,9 @@
           <w:color w:val="000000"/>
           <w:sz w:val="24"/>
         </w:rPr>
-        <w:t>4.5 Points techniques difficiles</w:t>
-      </w:r>
-      <w:bookmarkEnd w:id="68868"/>
+        <w:t>4.4.4 Module étudiant et parcours de composition</w:t>
+      </w:r>
+      <w:bookmarkEnd w:id="1397"/>
     </w:p>
     <w:p>
       <w:pPr>
@@ -7532,26 +7639,122 @@
           <w:color w:val="000000"/>
           <w:sz w:val="24"/>
         </w:rPr>
-        <w:t>Plusieurs problèmes concrets ont marqué la réalisation. Le cookie Secure en HTTP bloquait les connexions sur le réseau local ; il a fallu le conditionner à la présence réelle de HTTPS. Les objets Decimal de Prisma provoquaient un crash lorsqu'ils étaient passés directement à des composants clients ; la réponse a été de sérialiser les points en nombres côté serveur. Le timer étudiant ne suivait pas les changements de planning tant que la session n'était chargée qu'une seule fois ; un polling de synchronisation a réglé ce point. Le verrouillage trop strict des exercices empêchait toute modification d'un examen publié avant le démarrage ; la règle canModifyExamExercises a clarifié le comportement. Enfin, le passage d'icônes depuis des fichiers serveur vers des composants clients a exigé un mapping par chaînes côté client.</w:t>
-      </w:r>
-    </w:p>
-    <w:p>
-      <w:bookmarkStart w:id="90902" w:name="bm_ch4_6"/>
-      <w:pPr>
-        <w:pStyle w:val="Heading2"/>
-        <w:spacing w:line="360" w:lineRule="auto"/>
-      </w:pPr>
-      <w:r>
-        <w:rPr>
-          <w:rFonts w:ascii="Times New Roman" w:hAnsi="Times New Roman" w:eastAsia="Times New Roman"/>
-          <w:b/>
-          <w:i w:val="0"/>
-          <w:color w:val="000000"/>
-          <w:sz w:val="24"/>
-        </w:rPr>
-        <w:t>4.6 Déploiement</w:t>
-      </w:r>
-      <w:bookmarkEnd w:id="90902"/>
+        <w:t>Le parcours étudiant est volontairement explicite. La première page présente les consignes et exige le plein écran. Tant que l'API Fullscreen est refusée ou indisponible, l'étudiant ne peut pas avancer. Une fois le plein écran accepté, il entre en salle d'attente. Un compte à rebours est synchronisé avec le serveur via un polling sur l'API de session. L'énoncé reste masqué. Dès cette étape, l'heure de connexion et l'adresse IP sont enregistrées.</w:t>
+      </w:r>
+    </w:p>
+    <w:p>
+      <w:pPr>
+        <w:spacing w:after="240" w:line="240" w:lineRule="auto" w:before="240"/>
+        <w:jc w:val="center"/>
+      </w:pPr>
+      <w:r>
+        <w:rPr>
+          <w:rFonts w:ascii="Times New Roman" w:hAnsi="Times New Roman" w:eastAsia="Times New Roman"/>
+          <w:b w:val="0"/>
+          <w:i/>
+          <w:color w:val="000000"/>
+          <w:sz w:val="20"/>
+        </w:rPr>
+        <w:t>[Insérer ici la capture d'écran correspondante]</w:t>
+      </w:r>
+    </w:p>
+    <w:p>
+      <w:pPr>
+        <w:pStyle w:val="Caption"/>
+        <w:spacing w:after="200" w:line="360" w:lineRule="auto"/>
+        <w:jc w:val="center"/>
+      </w:pPr>
+      <w:r>
+        <w:rPr>
+          <w:rFonts w:ascii="Times New Roman" w:hAnsi="Times New Roman" w:eastAsia="Times New Roman"/>
+          <w:b w:val="0"/>
+          <w:i w:val="0"/>
+          <w:color w:val="000000"/>
+          <w:sz w:val="22"/>
+        </w:rPr>
+        <w:t xml:space="preserve">Figure </w:t>
+      </w:r>
+      <w:r>
+        <w:rPr>
+          <w:rFonts w:ascii="Times New Roman" w:hAnsi="Times New Roman" w:eastAsia="Times New Roman"/>
+          <w:b w:val="0"/>
+          <w:i w:val="0"/>
+          <w:color w:val="000000"/>
+          <w:sz w:val="22"/>
+        </w:rPr>
+        <w:fldChar w:fldCharType="begin"/>
+        <w:instrText xml:space="preserve">SEQ Figure \* ARABIC</w:instrText>
+        <w:fldChar w:fldCharType="separate"/>
+        <w:t>33</w:t>
+        <w:fldChar w:fldCharType="end"/>
+      </w:r>
+      <w:r>
+        <w:rPr>
+          <w:rFonts w:ascii="Times New Roman" w:hAnsi="Times New Roman" w:eastAsia="Times New Roman"/>
+          <w:b w:val="0"/>
+          <w:i w:val="0"/>
+          <w:color w:val="000000"/>
+          <w:sz w:val="22"/>
+        </w:rPr>
+        <w:t xml:space="preserve"> : Consignes et activation du plein écran</w:t>
+      </w:r>
+    </w:p>
+    <w:p>
+      <w:pPr>
+        <w:spacing w:after="240" w:line="240" w:lineRule="auto" w:before="240"/>
+        <w:jc w:val="center"/>
+      </w:pPr>
+      <w:r>
+        <w:rPr>
+          <w:rFonts w:ascii="Times New Roman" w:hAnsi="Times New Roman" w:eastAsia="Times New Roman"/>
+          <w:b w:val="0"/>
+          <w:i/>
+          <w:color w:val="000000"/>
+          <w:sz w:val="20"/>
+        </w:rPr>
+        <w:t>[Insérer ici la capture d'écran correspondante]</w:t>
+      </w:r>
+    </w:p>
+    <w:p>
+      <w:pPr>
+        <w:pStyle w:val="Caption"/>
+        <w:spacing w:after="200" w:line="360" w:lineRule="auto"/>
+        <w:jc w:val="center"/>
+      </w:pPr>
+      <w:r>
+        <w:rPr>
+          <w:rFonts w:ascii="Times New Roman" w:hAnsi="Times New Roman" w:eastAsia="Times New Roman"/>
+          <w:b w:val="0"/>
+          <w:i w:val="0"/>
+          <w:color w:val="000000"/>
+          <w:sz w:val="22"/>
+        </w:rPr>
+        <w:t xml:space="preserve">Figure </w:t>
+      </w:r>
+      <w:r>
+        <w:rPr>
+          <w:rFonts w:ascii="Times New Roman" w:hAnsi="Times New Roman" w:eastAsia="Times New Roman"/>
+          <w:b w:val="0"/>
+          <w:i w:val="0"/>
+          <w:color w:val="000000"/>
+          <w:sz w:val="22"/>
+        </w:rPr>
+        <w:fldChar w:fldCharType="begin"/>
+        <w:instrText xml:space="preserve">SEQ Figure \* ARABIC</w:instrText>
+        <w:fldChar w:fldCharType="separate"/>
+        <w:t>34</w:t>
+        <w:fldChar w:fldCharType="end"/>
+      </w:r>
+      <w:r>
+        <w:rPr>
+          <w:rFonts w:ascii="Times New Roman" w:hAnsi="Times New Roman" w:eastAsia="Times New Roman"/>
+          <w:b w:val="0"/>
+          <w:i w:val="0"/>
+          <w:color w:val="000000"/>
+          <w:sz w:val="22"/>
+        </w:rPr>
+        <w:t xml:space="preserve"> : Salle d'attente avant le démarrage de l'examen</w:t>
+      </w:r>
     </w:p>
     <w:p>
       <w:pPr>
@@ -7567,26 +7770,65 @@
           <w:color w:val="000000"/>
           <w:sz w:val="24"/>
         </w:rPr>
-        <w:t>Pour une démonstration en salle, le scénario recommandé est simple : produire un build, démarrer avec next start en écoutant sur toutes les interfaces, puis accéder via http://adresse-de-l-hote:3000 depuis les postes étudiants. Il faut parfois ouvrir le port 3000 dans le pare-feu de la machine hôte. En production derrière HTTPS, le cookie Secure peut être activé normalement, avec ou sans FORCE_SECURE_COOKIES selon le proxy.</w:t>
-      </w:r>
-    </w:p>
-    <w:p>
-      <w:bookmarkStart w:id="18556" w:name="bm_ch4_7"/>
-      <w:pPr>
-        <w:pStyle w:val="Heading2"/>
-        <w:spacing w:line="360" w:lineRule="auto"/>
-      </w:pPr>
-      <w:r>
-        <w:rPr>
-          <w:rFonts w:ascii="Times New Roman" w:hAnsi="Times New Roman" w:eastAsia="Times New Roman"/>
-          <w:b/>
-          <w:i w:val="0"/>
-          <w:color w:val="000000"/>
-          <w:sz w:val="24"/>
-        </w:rPr>
-        <w:t>4.7 Conclusion partielle</w:t>
-      </w:r>
-      <w:bookmarkEnd w:id="18556"/>
+        <w:t>Au démarrage, la page de composition affiche le menu des exercices, l'énoncé, l'éditeur Monaco pour Python, le bouton d'exécution, le timer global et la soumission. Un autosave périodique, complété par le stockage local du navigateur, limite les pertes en cas de coupure brève. Un second polling permet de mettre à jour la fin d'examen si le professeur modifie le planning en cours de session.</w:t>
+      </w:r>
+    </w:p>
+    <w:p>
+      <w:pPr>
+        <w:spacing w:after="240" w:line="240" w:lineRule="auto" w:before="240"/>
+        <w:jc w:val="center"/>
+      </w:pPr>
+      <w:r>
+        <w:rPr>
+          <w:rFonts w:ascii="Times New Roman" w:hAnsi="Times New Roman" w:eastAsia="Times New Roman"/>
+          <w:b w:val="0"/>
+          <w:i/>
+          <w:color w:val="000000"/>
+          <w:sz w:val="20"/>
+        </w:rPr>
+        <w:t>[Insérer ici la capture d'écran correspondante]</w:t>
+      </w:r>
+    </w:p>
+    <w:p>
+      <w:pPr>
+        <w:pStyle w:val="Caption"/>
+        <w:spacing w:after="200" w:line="360" w:lineRule="auto"/>
+        <w:jc w:val="center"/>
+      </w:pPr>
+      <w:r>
+        <w:rPr>
+          <w:rFonts w:ascii="Times New Roman" w:hAnsi="Times New Roman" w:eastAsia="Times New Roman"/>
+          <w:b w:val="0"/>
+          <w:i w:val="0"/>
+          <w:color w:val="000000"/>
+          <w:sz w:val="22"/>
+        </w:rPr>
+        <w:t xml:space="preserve">Figure </w:t>
+      </w:r>
+      <w:r>
+        <w:rPr>
+          <w:rFonts w:ascii="Times New Roman" w:hAnsi="Times New Roman" w:eastAsia="Times New Roman"/>
+          <w:b w:val="0"/>
+          <w:i w:val="0"/>
+          <w:color w:val="000000"/>
+          <w:sz w:val="22"/>
+        </w:rPr>
+        <w:fldChar w:fldCharType="begin"/>
+        <w:instrText xml:space="preserve">SEQ Figure \* ARABIC</w:instrText>
+        <w:fldChar w:fldCharType="separate"/>
+        <w:t>35</w:t>
+        <w:fldChar w:fldCharType="end"/>
+      </w:r>
+      <w:r>
+        <w:rPr>
+          <w:rFonts w:ascii="Times New Roman" w:hAnsi="Times New Roman" w:eastAsia="Times New Roman"/>
+          <w:b w:val="0"/>
+          <w:i w:val="0"/>
+          <w:color w:val="000000"/>
+          <w:sz w:val="22"/>
+        </w:rPr>
+        <w:t xml:space="preserve"> : Environnement de composition pendant l'épreuve</w:t>
+      </w:r>
     </w:p>
     <w:p>
       <w:pPr>
@@ -7602,18 +7844,13 @@
           <w:color w:val="000000"/>
           <w:sz w:val="24"/>
         </w:rPr>
-        <w:t>Le MVP livre aujourd'hui une chaîne complète, suffisamment intégrée pour la démonstration et pour des usages pilotes. Les priorités d'ingénierie ont privilégié la fiabilité des parcours critiques (authentification, examen, contrôles de passation, correction, exports) plutôt qu'une infrastructure temps réel complète. Redis, les workers et le multi langage restent volontairement dans les perspectives.</w:t>
-      </w:r>
-    </w:p>
-    <w:p>
-      <w:r>
-        <w:br w:type="page"/>
-      </w:r>
-    </w:p>
-    <w:p>
-      <w:bookmarkStart w:id="58481" w:name="bm_ch5"/>
-      <w:pPr>
-        <w:pStyle w:val="Heading1"/>
+        <w:t>Les contrôles de passation signalent au serveur les sorties de plein écran, les changements d'onglet et certains collages. Au second incident de sortie du plein écran, la participation est exclue et redirigée vers une confirmation avec motif. La soumission peut être manuelle, automatique à l'expiration du timer, ou forcée par exclusion. Une fois la participation close, aucune reconnexion utile n'est possible. Aucun score n'est montré à l'étudiant.</w:t>
+      </w:r>
+    </w:p>
+    <w:p>
+      <w:bookmarkStart w:id="14002" w:name="4_4_5_Sandbox_et_correction_automatique"/>
+      <w:pPr>
+        <w:pStyle w:val="Heading3"/>
         <w:spacing w:line="360" w:lineRule="auto"/>
       </w:pPr>
       <w:r>
@@ -7622,29 +7859,11 @@
           <w:b/>
           <w:i w:val="0"/>
           <w:color w:val="000000"/>
-          <w:sz w:val="28"/>
-        </w:rPr>
-        <w:t>Chapitre 5 : Tests, résultats, limites et perspectives</w:t>
-      </w:r>
-      <w:bookmarkEnd w:id="58481"/>
-    </w:p>
-    <w:p>
-      <w:bookmarkStart w:id="1747" w:name="bm_ch5_1"/>
-      <w:pPr>
-        <w:pStyle w:val="Heading2"/>
-        <w:spacing w:line="360" w:lineRule="auto"/>
-      </w:pPr>
-      <w:r>
-        <w:rPr>
-          <w:rFonts w:ascii="Times New Roman" w:hAnsi="Times New Roman" w:eastAsia="Times New Roman"/>
-          <w:b/>
-          <w:i w:val="0"/>
-          <w:color w:val="000000"/>
           <w:sz w:val="24"/>
         </w:rPr>
-        <w:t>5.1 Stratégie de tests</w:t>
-      </w:r>
-      <w:bookmarkEnd w:id="1747"/>
+        <w:t>4.4.5 Sandbox et correction automatique</w:t>
+      </w:r>
+      <w:bookmarkEnd w:id="14002"/>
     </w:p>
     <w:p>
       <w:pPr>
@@ -7660,8 +7879,26 @@
           <w:color w:val="000000"/>
           <w:sz w:val="24"/>
         </w:rPr>
-        <w:t>La campagne cherchait à confirmer les exigences fonctionnelles critiques, à contrôler les règles métier, à vérifier la non régression technique via le build TypeScript, et à s'assurer du bon fonctionnement multi postes en HTTP local. Les tests unitaires automatisés exhaustifs n'ont pas été l'axe principal sous contrainte de temps. L'équipe a privilégié des scénarios bout en bout, plus représentatifs d'un livrable démontrable.</w:t>
-      </w:r>
+        <w:t>Le service sandbox exécute le code Python dans un conteneur éphémère, avec timeout et sans accès réseau. En développement, un repli local peut exister si Docker est absent ; ce mode n'est pas recommandé pour une salle réelle. La correction automatique parcourt chaque test unitaire, exécute le programme, normalise la sortie, puis compare à la sortie attendue. Le poids de chaque test intervient dans le score automatique. Le professeur peut ensuite imposer un score manuel, qui prend le dessus lorsqu'il est renseigné.</w:t>
+      </w:r>
+    </w:p>
+    <w:p>
+      <w:bookmarkStart w:id="87614" w:name="4_4_6_Landing_page_et_contact"/>
+      <w:pPr>
+        <w:pStyle w:val="Heading3"/>
+        <w:spacing w:line="360" w:lineRule="auto"/>
+      </w:pPr>
+      <w:r>
+        <w:rPr>
+          <w:rFonts w:ascii="Times New Roman" w:hAnsi="Times New Roman" w:eastAsia="Times New Roman"/>
+          <w:b/>
+          <w:i w:val="0"/>
+          <w:color w:val="000000"/>
+          <w:sz w:val="24"/>
+        </w:rPr>
+        <w:t>4.4.6 Landing page et contact</w:t>
+      </w:r>
+      <w:bookmarkEnd w:id="87614"/>
     </w:p>
     <w:p>
       <w:pPr>
@@ -7677,11 +7914,68 @@
           <w:color w:val="000000"/>
           <w:sz w:val="24"/>
         </w:rPr>
-        <w:t>La validation a donc combiné le build Next.js, des parcours manuels rôle par rôle, des essais de bornes sur les règles métier, des tests multi appareils sur le réseau local, et des vérifications après chaque correctif majeur (cookie Secure, Decimal, synchronisation du timer). Les jeux de données s'appuyaient sur un établissement de démonstration, des comptes types, des examens dans plusieurs états et des CSV volontairement valides ou invalides.</w:t>
-      </w:r>
-    </w:p>
-    <w:p>
-      <w:bookmarkStart w:id="74138" w:name="bm_ch5_2"/>
+        <w:t>La landing présente le produit. Le formulaire de contact appelle une API dédiée, enregistre une notification de type landing.contact et rend cette demande consultable côté Super Admin.</w:t>
+      </w:r>
+    </w:p>
+    <w:p>
+      <w:pPr>
+        <w:spacing w:after="240" w:line="240" w:lineRule="auto" w:before="240"/>
+        <w:jc w:val="center"/>
+      </w:pPr>
+      <w:r>
+        <w:rPr>
+          <w:rFonts w:ascii="Times New Roman" w:hAnsi="Times New Roman" w:eastAsia="Times New Roman"/>
+          <w:b w:val="0"/>
+          <w:i/>
+          <w:color w:val="000000"/>
+          <w:sz w:val="20"/>
+        </w:rPr>
+        <w:t>[Insérer ici la capture d'écran correspondante]</w:t>
+      </w:r>
+    </w:p>
+    <w:p>
+      <w:pPr>
+        <w:pStyle w:val="Caption"/>
+        <w:spacing w:after="200" w:line="360" w:lineRule="auto"/>
+        <w:jc w:val="center"/>
+      </w:pPr>
+      <w:r>
+        <w:rPr>
+          <w:rFonts w:ascii="Times New Roman" w:hAnsi="Times New Roman" w:eastAsia="Times New Roman"/>
+          <w:b w:val="0"/>
+          <w:i w:val="0"/>
+          <w:color w:val="000000"/>
+          <w:sz w:val="22"/>
+        </w:rPr>
+        <w:t xml:space="preserve">Figure </w:t>
+      </w:r>
+      <w:r>
+        <w:rPr>
+          <w:rFonts w:ascii="Times New Roman" w:hAnsi="Times New Roman" w:eastAsia="Times New Roman"/>
+          <w:b w:val="0"/>
+          <w:i w:val="0"/>
+          <w:color w:val="000000"/>
+          <w:sz w:val="22"/>
+        </w:rPr>
+        <w:fldChar w:fldCharType="begin"/>
+        <w:instrText xml:space="preserve">SEQ Figure \* ARABIC</w:instrText>
+        <w:fldChar w:fldCharType="separate"/>
+        <w:t>36</w:t>
+        <w:fldChar w:fldCharType="end"/>
+      </w:r>
+      <w:r>
+        <w:rPr>
+          <w:rFonts w:ascii="Times New Roman" w:hAnsi="Times New Roman" w:eastAsia="Times New Roman"/>
+          <w:b w:val="0"/>
+          <w:i w:val="0"/>
+          <w:color w:val="000000"/>
+          <w:sz w:val="22"/>
+        </w:rPr>
+        <w:t xml:space="preserve"> : Page d'accueil Cylentic</w:t>
+      </w:r>
+    </w:p>
+    <w:p>
+      <w:bookmarkStart w:id="33621" w:name="bm_ch4_5"/>
       <w:pPr>
         <w:pStyle w:val="Heading2"/>
         <w:spacing w:line="360" w:lineRule="auto"/>
@@ -7694,27 +7988,9 @@
           <w:color w:val="000000"/>
           <w:sz w:val="24"/>
         </w:rPr>
-        <w:t>5.2 Jeux de tests et résultats</w:t>
-      </w:r>
-      <w:bookmarkEnd w:id="74138"/>
-    </w:p>
-    <w:p>
-      <w:bookmarkStart w:id="36717" w:name="5_2_1_Authentification_et_acc_s"/>
-      <w:pPr>
-        <w:pStyle w:val="Heading3"/>
-        <w:spacing w:line="360" w:lineRule="auto"/>
-      </w:pPr>
-      <w:r>
-        <w:rPr>
-          <w:rFonts w:ascii="Times New Roman" w:hAnsi="Times New Roman" w:eastAsia="Times New Roman"/>
-          <w:b/>
-          <w:i w:val="0"/>
-          <w:color w:val="000000"/>
-          <w:sz w:val="24"/>
-        </w:rPr>
-        <w:t>5.2.1 Authentification et accès</w:t>
-      </w:r>
-      <w:bookmarkEnd w:id="36717"/>
+        <w:t>4.5 Points techniques difficiles</w:t>
+      </w:r>
+      <w:bookmarkEnd w:id="33621"/>
     </w:p>
     <w:p>
       <w:pPr>
@@ -7730,13 +8006,13 @@
           <w:color w:val="000000"/>
           <w:sz w:val="24"/>
         </w:rPr>
-        <w:t>Les essais de connexion montrent un comportement stable pour les différents rôles lorsque les identifiants sont corrects. Un mauvais mot de passe est rejeté. Un étudiant sans code d'examen ne peut pas démarrer le parcours d'épreuve. Le middleware empêche un rôle d'accéder aux espaces d'un autre. La déconnexion vide correctement le cookie. L'accès depuis un autre appareil en HTTP fonctionne après le correctif Secure.</w:t>
-      </w:r>
-    </w:p>
-    <w:p>
-      <w:bookmarkStart w:id="1743" w:name="5_2_2_Administration"/>
-      <w:pPr>
-        <w:pStyle w:val="Heading3"/>
+        <w:t>Plusieurs problèmes concrets ont marqué la réalisation. Le cookie Secure en HTTP bloquait les connexions sur le réseau local ; il a fallu le conditionner à la présence réelle de HTTPS. Les objets Decimal de Prisma provoquaient un crash lorsqu'ils étaient passés directement à des composants clients ; la réponse a été de sérialiser les points en nombres côté serveur. Le timer étudiant ne suivait pas les changements de planning tant que la session n'était chargée qu'une seule fois ; un polling de synchronisation a réglé ce point. Le verrouillage trop strict des exercices empêchait toute modification d'un examen publié avant le démarrage ; la règle canModifyExamExercises a clarifié le comportement. Enfin, le passage d'icônes depuis des fichiers serveur vers des composants clients a exigé un mapping par chaînes côté client.</w:t>
+      </w:r>
+    </w:p>
+    <w:p>
+      <w:bookmarkStart w:id="72828" w:name="bm_ch4_6"/>
+      <w:pPr>
+        <w:pStyle w:val="Heading2"/>
         <w:spacing w:line="360" w:lineRule="auto"/>
       </w:pPr>
       <w:r>
@@ -7747,9 +8023,9 @@
           <w:color w:val="000000"/>
           <w:sz w:val="24"/>
         </w:rPr>
-        <w:t>5.2.2 Administration</w:t>
-      </w:r>
-      <w:bookmarkEnd w:id="1743"/>
+        <w:t>4.6 Déploiement</w:t>
+      </w:r>
+      <w:bookmarkEnd w:id="72828"/>
     </w:p>
     <w:p>
       <w:pPr>
@@ -7765,13 +8041,13 @@
           <w:color w:val="000000"/>
           <w:sz w:val="24"/>
         </w:rPr>
-        <w:t>La création de classes et d'étudiants manuels fonctionne, avec génération d'identifiants. L'import CSV crée les lignes valides et rejette clairement les classes inconnues ou les emails incorrects, en laissant un rapport exploitable. La limite de deux administrateurs actifs est respectée, tout comme l'interdiction de se désactiver soi-même. La promotion de rentrée met à jour les profils et l'année active. Le formulaire de contact de la landing enregistre une notification visible côté Super Admin.</w:t>
-      </w:r>
-    </w:p>
-    <w:p>
-      <w:bookmarkStart w:id="72869" w:name="5_2_3_Examens_c_t__professeur"/>
-      <w:pPr>
-        <w:pStyle w:val="Heading3"/>
+        <w:t>Pour une démonstration en salle, le scénario recommandé est simple : produire un build, démarrer avec next start en écoutant sur toutes les interfaces, puis accéder via http://adresse-de-l-hote:3000 depuis les postes étudiants. Il faut parfois ouvrir le port 3000 dans le pare-feu de la machine hôte. En production derrière HTTPS, le cookie Secure peut être activé normalement, avec ou sans FORCE_SECURE_COOKIES selon le proxy.</w:t>
+      </w:r>
+    </w:p>
+    <w:p>
+      <w:bookmarkStart w:id="13455" w:name="bm_ch4_7"/>
+      <w:pPr>
+        <w:pStyle w:val="Heading2"/>
         <w:spacing w:line="360" w:lineRule="auto"/>
       </w:pPr>
       <w:r>
@@ -7782,9 +8058,9 @@
           <w:color w:val="000000"/>
           <w:sz w:val="24"/>
         </w:rPr>
-        <w:t>5.2.3 Examens côté professeur</w:t>
-      </w:r>
-      <w:bookmarkEnd w:id="72869"/>
+        <w:t>4.7 Conclusion partielle</w:t>
+      </w:r>
+      <w:bookmarkEnd w:id="13455"/>
     </w:p>
     <w:p>
       <w:pPr>
@@ -7800,13 +8076,18 @@
           <w:color w:val="000000"/>
           <w:sz w:val="24"/>
         </w:rPr>
-        <w:t>Un examen sans exercice ne peut pas être publié. Avec du contenu, la publication génère le code d'accès et permet le mode présentation. La duplication produit un nouveau brouillon complet. L'édition du planning sur un examen publié se répercute en salle d'attente et en composition. L'ajout d'exercices reste possible avant le démarrage et est refusé après. Le suivi live, les exports et l'ajustement manuel des notes se comportent conformément aux règles prévues.</w:t>
-      </w:r>
-    </w:p>
-    <w:p>
-      <w:bookmarkStart w:id="18465" w:name="5_2_4_Parcours__tudiant_et_contr_les_de_"/>
-      <w:pPr>
-        <w:pStyle w:val="Heading3"/>
+        <w:t>Le MVP livre aujourd'hui une chaîne complète, suffisamment intégrée pour la démonstration et pour des usages pilotes. Les priorités d'ingénierie ont privilégié la fiabilité des parcours critiques (authentification, examen, contrôles de passation, correction, exports) plutôt qu'une infrastructure temps réel complète. Redis, les workers et le multi langage restent volontairement dans les perspectives.</w:t>
+      </w:r>
+    </w:p>
+    <w:p>
+      <w:r>
+        <w:br w:type="page"/>
+      </w:r>
+    </w:p>
+    <w:p>
+      <w:bookmarkStart w:id="93965" w:name="bm_ch5"/>
+      <w:pPr>
+        <w:pStyle w:val="Heading1"/>
         <w:spacing w:line="360" w:lineRule="auto"/>
       </w:pPr>
       <w:r>
@@ -7815,11 +8096,29 @@
           <w:b/>
           <w:i w:val="0"/>
           <w:color w:val="000000"/>
+          <w:sz w:val="28"/>
+        </w:rPr>
+        <w:t>Chapitre 5 : Tests, résultats, limites et perspectives</w:t>
+      </w:r>
+      <w:bookmarkEnd w:id="93965"/>
+    </w:p>
+    <w:p>
+      <w:bookmarkStart w:id="95026" w:name="bm_ch5_1"/>
+      <w:pPr>
+        <w:pStyle w:val="Heading2"/>
+        <w:spacing w:line="360" w:lineRule="auto"/>
+      </w:pPr>
+      <w:r>
+        <w:rPr>
+          <w:rFonts w:ascii="Times New Roman" w:hAnsi="Times New Roman" w:eastAsia="Times New Roman"/>
+          <w:b/>
+          <w:i w:val="0"/>
+          <w:color w:val="000000"/>
           <w:sz w:val="24"/>
         </w:rPr>
-        <w:t>5.2.4 Parcours étudiant et contrôles de passation</w:t>
-      </w:r>
-      <w:bookmarkEnd w:id="18465"/>
+        <w:t>5.1 Stratégie de tests</w:t>
+      </w:r>
+      <w:bookmarkEnd w:id="95026"/>
     </w:p>
     <w:p>
       <w:pPr>
@@ -7835,7 +8134,7 @@
           <w:color w:val="000000"/>
           <w:sz w:val="24"/>
         </w:rPr>
-        <w:t>Un code d'examen invalide est refusé, avec protection contre les tentatives excessives. Sans plein écran, l'étudiant reste bloqué aux consignes. Au démarrage, la bascule vers la composition est automatique. L'exécution sandbox, l'autosave, la navigation entre exercices et la soumission manuelle ou automatique au timer fonctionnent. Les incidents de plein écran incrémentent un compteur et conduisent à l'exclusion au second incident. Le changement d'onglet est journalisé. Après soumission, la reconnexion est bloquée.</w:t>
+        <w:t>La campagne cherchait à confirmer les exigences fonctionnelles critiques, à contrôler les règles métier, à vérifier la non régression technique via le build TypeScript, et à s'assurer du bon fonctionnement multi postes en HTTP local. Les tests unitaires automatisés exhaustifs n'ont pas été l'axe principal sous contrainte de temps. L'équipe a privilégié des scénarios bout en bout, plus représentatifs d'un livrable démontrable.</w:t>
       </w:r>
     </w:p>
     <w:p>
@@ -7852,11 +8151,11 @@
           <w:color w:val="000000"/>
           <w:sz w:val="24"/>
         </w:rPr>
-        <w:t>Au total, la campagne manuelle ciblée a porté sur trente neuf cas critiques (authentification, administration, professeur, étudiant). Tous sont passés après les correctifs majeurs. Ce résultat doit être lu comme une validation fonctionnelle du périmètre MVP, et non comme une couverture automatisée exhaustive.</w:t>
-      </w:r>
-    </w:p>
-    <w:p>
-      <w:bookmarkStart w:id="30118" w:name="bm_ch5_3"/>
+        <w:t>La validation a donc combiné le build Next.js, des parcours manuels rôle par rôle, des essais de bornes sur les règles métier, des tests multi appareils sur le réseau local, et des vérifications après chaque correctif majeur (cookie Secure, Decimal, synchronisation du timer). Les jeux de données s'appuyaient sur un établissement de démonstration, des comptes types, des examens dans plusieurs états et des CSV volontairement valides ou invalides.</w:t>
+      </w:r>
+    </w:p>
+    <w:p>
+      <w:bookmarkStart w:id="78821" w:name="bm_ch5_2"/>
       <w:pPr>
         <w:pStyle w:val="Heading2"/>
         <w:spacing w:line="360" w:lineRule="auto"/>
@@ -7869,9 +8168,27 @@
           <w:color w:val="000000"/>
           <w:sz w:val="24"/>
         </w:rPr>
-        <w:t>5.3 Discussion des résultats</w:t>
-      </w:r>
-      <w:bookmarkEnd w:id="30118"/>
+        <w:t>5.2 Jeux de tests et résultats</w:t>
+      </w:r>
+      <w:bookmarkEnd w:id="78821"/>
+    </w:p>
+    <w:p>
+      <w:bookmarkStart w:id="50149" w:name="5_2_1_Authentification_et_acc_s"/>
+      <w:pPr>
+        <w:pStyle w:val="Heading3"/>
+        <w:spacing w:line="360" w:lineRule="auto"/>
+      </w:pPr>
+      <w:r>
+        <w:rPr>
+          <w:rFonts w:ascii="Times New Roman" w:hAnsi="Times New Roman" w:eastAsia="Times New Roman"/>
+          <w:b/>
+          <w:i w:val="0"/>
+          <w:color w:val="000000"/>
+          <w:sz w:val="24"/>
+        </w:rPr>
+        <w:t>5.2.1 Authentification et accès</w:t>
+      </w:r>
+      <w:bookmarkEnd w:id="50149"/>
     </w:p>
     <w:p>
       <w:pPr>
@@ -7887,8 +8204,26 @@
           <w:color w:val="000000"/>
           <w:sz w:val="24"/>
         </w:rPr>
-        <w:t>Le MVP permet aujourd'hui un parcours d'examen crédible, de la salle d'attente jusqu'à la soumission sous contraintes. La correction automatique des tests unitaires réduit le temps de traitement pour le professeur sans lui retirer le contrôle pédagogique. Les incidents horodatés, la présence numérique et le journal d'activité offrent une traçabilité utile. L'outil est exploitable en salle sur réseau local. L'administration scolaire et la présence produit (landing, contact, espaces par rôle) complètent un livrable démontrable de bout en bout.</w:t>
-      </w:r>
+        <w:t>Les essais de connexion montrent un comportement stable pour les différents rôles lorsque les identifiants sont corrects. Un mauvais mot de passe est rejeté. Un étudiant sans code d'examen ne peut pas démarrer le parcours d'épreuve. Le middleware empêche un rôle d'accéder aux espaces d'un autre. La déconnexion vide correctement le cookie. L'accès depuis un autre appareil en HTTP fonctionne après le correctif Secure.</w:t>
+      </w:r>
+    </w:p>
+    <w:p>
+      <w:bookmarkStart w:id="99212" w:name="5_2_2_Administration"/>
+      <w:pPr>
+        <w:pStyle w:val="Heading3"/>
+        <w:spacing w:line="360" w:lineRule="auto"/>
+      </w:pPr>
+      <w:r>
+        <w:rPr>
+          <w:rFonts w:ascii="Times New Roman" w:hAnsi="Times New Roman" w:eastAsia="Times New Roman"/>
+          <w:b/>
+          <w:i w:val="0"/>
+          <w:color w:val="000000"/>
+          <w:sz w:val="24"/>
+        </w:rPr>
+        <w:t>5.2.2 Administration</w:t>
+      </w:r>
+      <w:bookmarkEnd w:id="99212"/>
     </w:p>
     <w:p>
       <w:pPr>
@@ -7904,13 +8239,13 @@
           <w:color w:val="000000"/>
           <w:sz w:val="24"/>
         </w:rPr>
-        <w:t>Trois anomalies ont particulièrement pesé avant d'être corrigées. Le cookie Secure bloquait toutes les connexions locales. Les props Decimal cassaient des composants clients. Le timer de composition n'évoluait pas après une modification professeur sans polling de synchronisation. Ces points confirment que la valeur du MVP tient autant aux parcours qu'à la robustesse des détails d'exécution en salle.</w:t>
-      </w:r>
-    </w:p>
-    <w:p>
-      <w:bookmarkStart w:id="37055" w:name="bm_ch5_4"/>
-      <w:pPr>
-        <w:pStyle w:val="Heading2"/>
+        <w:t>La création de classes et d'étudiants manuels fonctionne, avec génération d'identifiants. L'import CSV crée les lignes valides et rejette clairement les classes inconnues ou les emails incorrects, en laissant un rapport exploitable. La limite de deux administrateurs actifs est respectée, tout comme l'interdiction de se désactiver soi-même. La promotion de rentrée met à jour les profils et l'année active. Le formulaire de contact de la landing enregistre une notification visible côté Super Admin.</w:t>
+      </w:r>
+    </w:p>
+    <w:p>
+      <w:bookmarkStart w:id="83731" w:name="5_2_3_Examens_c_t__professeur"/>
+      <w:pPr>
+        <w:pStyle w:val="Heading3"/>
         <w:spacing w:line="360" w:lineRule="auto"/>
       </w:pPr>
       <w:r>
@@ -7921,9 +8256,9 @@
           <w:color w:val="000000"/>
           <w:sz w:val="24"/>
         </w:rPr>
-        <w:t>5.4 Limites et risques résiduels</w:t>
-      </w:r>
-      <w:bookmarkEnd w:id="37055"/>
+        <w:t>5.2.3 Examens côté professeur</w:t>
+      </w:r>
+      <w:bookmarkEnd w:id="83731"/>
     </w:p>
     <w:p>
       <w:pPr>
@@ -7939,13 +8274,13 @@
           <w:color w:val="000000"/>
           <w:sz w:val="24"/>
         </w:rPr>
-        <w:t>La sécurité navigateur reste une dissuasion et une détection, non une isolation absolue de poste. Un second appareil, une capture d'écran externe ou une machine virtuelle hors contrôle ne sont pas bloqués techniquement. Le langage supporté est encore limité à Python. La sandbox dépend de Docker. Les workers et la file de correction ne sont pas industrialisés. Le temps réel repose sur du polling, acceptable pour des promotions modestes mais à revoir sous forte charge. L'activation par email, le paiement réel, une intégration Moodle profonde, certains raffinements QCM et une suite de tests bout en bout automatisés restent hors du livrable actuel ou partiels.</w:t>
-      </w:r>
-    </w:p>
-    <w:p>
-      <w:bookmarkStart w:id="15599" w:name="bm_ch5_5"/>
-      <w:pPr>
-        <w:pStyle w:val="Heading2"/>
+        <w:t>Un examen sans exercice ne peut pas être publié. Avec du contenu, la publication génère le code d'accès et permet le mode présentation. La duplication produit un nouveau brouillon complet. L'édition du planning sur un examen publié se répercute en salle d'attente et en composition. L'ajout d'exercices reste possible avant le démarrage et est refusé après. Le suivi live, les exports et l'ajustement manuel des notes se comportent conformément aux règles prévues.</w:t>
+      </w:r>
+    </w:p>
+    <w:p>
+      <w:bookmarkStart w:id="23857" w:name="5_2_4_Parcours__tudiant_et_contr_les_de_"/>
+      <w:pPr>
+        <w:pStyle w:val="Heading3"/>
         <w:spacing w:line="360" w:lineRule="auto"/>
       </w:pPr>
       <w:r>
@@ -7956,9 +8291,9 @@
           <w:color w:val="000000"/>
           <w:sz w:val="24"/>
         </w:rPr>
-        <w:t>5.5 Perspectives</w:t>
-      </w:r>
-      <w:bookmarkEnd w:id="15599"/>
+        <w:t>5.2.4 Parcours étudiant et contrôles de passation</w:t>
+      </w:r>
+      <w:bookmarkEnd w:id="23857"/>
     </w:p>
     <w:p>
       <w:pPr>
@@ -7974,7 +8309,7 @@
           <w:color w:val="000000"/>
           <w:sz w:val="24"/>
         </w:rPr>
-        <w:t>La feuille de route naturelle commence par l'élargissement des langages (Java, C, C++), l'activation des comptes par email et l'introduction de Redis avec un canal temps réel plus robuste. Les QCM avancés, la facturation réelle, une file de correction capable d'absorber des pics de soumissions, puis une API publique ou Moodle, constituent les étapes suivantes. Une interface dédiée au registre de salle pour les surveillants fermerait un chaînon encore humain. Toute surveillance vidéo, en revanche, devra d'abord trancher des questions éthiques et de protection des données avant d'être envisagée.</w:t>
+        <w:t>Un code d'examen invalide est refusé, avec protection contre les tentatives excessives. Sans plein écran, l'étudiant reste bloqué aux consignes. Au démarrage, la bascule vers la composition est automatique. L'exécution sandbox, l'autosave, la navigation entre exercices et la soumission manuelle ou automatique au timer fonctionnent. Les incidents de plein écran incrémentent un compteur et conduisent à l'exclusion au second incident. Le changement d'onglet est journalisé. Après soumission, la reconnexion est bloquée.</w:t>
       </w:r>
     </w:p>
     <w:p>
@@ -7991,11 +8326,11 @@
           <w:color w:val="000000"/>
           <w:sz w:val="24"/>
         </w:rPr>
-        <w:t>Quatre recommandations pragmatiques ressortent pour la suite. D'abord, prioriser une suite bout en bout automatisée sur le trajet connexion, publication, composition et soumission. Ensuite, introduire Redis dès que le live doit dépasser quelques dizaines d'étudiants simultanés. Préparer ensuite une procédure salle simple (adresse, pare-feu, navigateurs supportés). Enfin, cadrer tôt le positionnement juridique avant toute dérive vers une surveillance intrusive.</w:t>
-      </w:r>
-    </w:p>
-    <w:p>
-      <w:bookmarkStart w:id="55741" w:name="bm_ch5_6"/>
+        <w:t>Au total, la campagne manuelle ciblée a porté sur trente neuf cas critiques (authentification, administration, professeur, étudiant). Tous sont passés après les correctifs majeurs. Ce résultat doit être lu comme une validation fonctionnelle du périmètre MVP, et non comme une couverture automatisée exhaustive.</w:t>
+      </w:r>
+    </w:p>
+    <w:p>
+      <w:bookmarkStart w:id="41067" w:name="bm_ch5_3"/>
       <w:pPr>
         <w:pStyle w:val="Heading2"/>
         <w:spacing w:line="360" w:lineRule="auto"/>
@@ -8008,9 +8343,9 @@
           <w:color w:val="000000"/>
           <w:sz w:val="24"/>
         </w:rPr>
-        <w:t>5.6 Conclusion partielle</w:t>
-      </w:r>
-      <w:bookmarkEnd w:id="55741"/>
+        <w:t>5.3 Discussion des résultats</w:t>
+      </w:r>
+      <w:bookmarkEnd w:id="41067"/>
     </w:p>
     <w:p>
       <w:pPr>
@@ -8026,31 +8361,8 @@
           <w:color w:val="000000"/>
           <w:sz w:val="24"/>
         </w:rPr>
-        <w:t>La validation confirme que le MVP Cylentic est fonctionnellement démontrable et techniquement cohérent sur son périmètre. Les limites restantes relèvent surtout d'arbitrages de priorité (infrastructure temps réel, multi langages, automatisation des tests), et non d'un défaut d'architecture fondamental.</w:t>
-      </w:r>
-    </w:p>
-    <w:p>
-      <w:r>
-        <w:br w:type="page"/>
-      </w:r>
-    </w:p>
-    <w:p>
-      <w:bookmarkStart w:id="50424" w:name="bm_concl"/>
-      <w:pPr>
-        <w:pStyle w:val="Heading1"/>
-        <w:spacing w:line="360" w:lineRule="auto"/>
-      </w:pPr>
-      <w:r>
-        <w:rPr>
-          <w:rFonts w:ascii="Times New Roman" w:hAnsi="Times New Roman" w:eastAsia="Times New Roman"/>
-          <w:b/>
-          <w:i w:val="0"/>
-          <w:color w:val="000000"/>
-          <w:sz w:val="28"/>
-        </w:rPr>
-        <w:t>Conclusion générale</w:t>
-      </w:r>
-      <w:bookmarkEnd w:id="50424"/>
+        <w:t>Le MVP permet aujourd'hui un parcours d'examen crédible, de la salle d'attente jusqu'à la soumission sous contraintes. La correction automatique des tests unitaires réduit le temps de traitement pour le professeur sans lui retirer le contrôle pédagogique. Les incidents horodatés, la présence numérique et le journal d'activité offrent une traçabilité utile. L'outil est exploitable en salle sur réseau local. L'administration scolaire et la présence produit (landing, contact, espaces par rôle) complètent un livrable démontrable de bout en bout.</w:t>
+      </w:r>
     </w:p>
     <w:p>
       <w:pPr>
@@ -8066,8 +8378,26 @@
           <w:color w:val="000000"/>
           <w:sz w:val="24"/>
         </w:rPr>
-        <w:t>Ce projet partait d'un écart concret : besoin d'évaluer la programmation sur machine, difficulté à garantir l'intégrité des rendus lorsque la génération de code devient banale. Cylentic propose une réponse pragmatique pour une salle d'examen : plateforme web multi établissement, parcours étudiant contrôlé, exécution isolée et journal d'incidents lisible.</w:t>
-      </w:r>
+        <w:t>Trois anomalies ont particulièrement pesé avant d'être corrigées. Le cookie Secure bloquait toutes les connexions locales. Les props Decimal cassaient des composants clients. Le timer de composition n'évoluait pas après une modification professeur sans polling de synchronisation. Ces points confirment que la valeur du MVP tient autant aux parcours qu'à la robustesse des détails d'exécution en salle.</w:t>
+      </w:r>
+    </w:p>
+    <w:p>
+      <w:bookmarkStart w:id="9394" w:name="bm_ch5_4"/>
+      <w:pPr>
+        <w:pStyle w:val="Heading2"/>
+        <w:spacing w:line="360" w:lineRule="auto"/>
+      </w:pPr>
+      <w:r>
+        <w:rPr>
+          <w:rFonts w:ascii="Times New Roman" w:hAnsi="Times New Roman" w:eastAsia="Times New Roman"/>
+          <w:b/>
+          <w:i w:val="0"/>
+          <w:color w:val="000000"/>
+          <w:sz w:val="24"/>
+        </w:rPr>
+        <w:t>5.4 Limites et risques résiduels</w:t>
+      </w:r>
+      <w:bookmarkEnd w:id="9394"/>
     </w:p>
     <w:p>
       <w:pPr>
@@ -8083,8 +8413,26 @@
           <w:color w:val="000000"/>
           <w:sz w:val="24"/>
         </w:rPr>
-        <w:t>L'analyse a borné un MVP assumé. La conception a fixé rôles, données et flux. La réalisation a livré une chaîne complète, de l'onboarding administrateur à la soumission étudiant, avec publication, contrôles de passation, correction automatique et exports. La validation a confirmé les parcours critiques après correction des anomalies de cookie Secure, de sérialisation Decimal et de synchronisation du timer.</w:t>
-      </w:r>
+        <w:t>La sécurité navigateur reste une dissuasion et une détection, non une isolation absolue de poste. Un second appareil, une capture d'écran externe ou une machine virtuelle hors contrôle ne sont pas bloqués techniquement. Le langage supporté est encore limité à Python. La sandbox dépend de Docker. Les workers et la file de correction ne sont pas industrialisés. Le temps réel repose sur du polling, acceptable pour des promotions modestes mais à revoir sous forte charge. L'activation par email, le paiement réel, une intégration Moodle profonde, certains raffinements QCM et une suite de tests bout en bout automatisés restent hors du livrable actuel ou partiels.</w:t>
+      </w:r>
+    </w:p>
+    <w:p>
+      <w:bookmarkStart w:id="65170" w:name="bm_ch5_5"/>
+      <w:pPr>
+        <w:pStyle w:val="Heading2"/>
+        <w:spacing w:line="360" w:lineRule="auto"/>
+      </w:pPr>
+      <w:r>
+        <w:rPr>
+          <w:rFonts w:ascii="Times New Roman" w:hAnsi="Times New Roman" w:eastAsia="Times New Roman"/>
+          <w:b/>
+          <w:i w:val="0"/>
+          <w:color w:val="000000"/>
+          <w:sz w:val="24"/>
+        </w:rPr>
+        <w:t>5.5 Perspectives</w:t>
+      </w:r>
+      <w:bookmarkEnd w:id="65170"/>
     </w:p>
     <w:p>
       <w:pPr>
@@ -8100,7 +8448,59 @@
           <w:color w:val="000000"/>
           <w:sz w:val="24"/>
         </w:rPr>
-        <w:t>Des limites demeurent : second appareil hors contrôle, Python seul pour l'instant, Redis et workers non industrialisés, temps réel par polling. Elles n'effacent pas le résultat principal : un système utilisable dans son périmètre, justifié dans ses choix, prêt pour des usages pilotes. Les objectifs fixés pour le MVP sont atteints ; la suite pourra élargir les langages et renforcer l'infrastructure de charge.</w:t>
+        <w:t>La feuille de route naturelle commence par l'élargissement des langages (Java, C, C++), l'activation des comptes par email et l'introduction de Redis avec un canal temps réel plus robuste. Les QCM avancés, la facturation réelle, une file de correction capable d'absorber des pics de soumissions, puis une API publique ou Moodle, constituent les étapes suivantes. Une interface dédiée au registre de salle pour les surveillants fermerait un chaînon encore humain. Toute surveillance vidéo, en revanche, devra d'abord trancher des questions éthiques et de protection des données avant d'être envisagée.</w:t>
+      </w:r>
+    </w:p>
+    <w:p>
+      <w:pPr>
+        <w:spacing w:after="160" w:line="360" w:lineRule="auto"/>
+        <w:ind w:firstLine="425"/>
+        <w:jc w:val="both"/>
+      </w:pPr>
+      <w:r>
+        <w:rPr>
+          <w:rFonts w:ascii="Times New Roman" w:hAnsi="Times New Roman" w:eastAsia="Times New Roman"/>
+          <w:b w:val="0"/>
+          <w:i w:val="0"/>
+          <w:color w:val="000000"/>
+          <w:sz w:val="24"/>
+        </w:rPr>
+        <w:t>Quatre recommandations pragmatiques ressortent pour la suite. D'abord, prioriser une suite bout en bout automatisée sur le trajet connexion, publication, composition et soumission. Ensuite, introduire Redis dès que le live doit dépasser quelques dizaines d'étudiants simultanés. Préparer ensuite une procédure salle simple (adresse, pare-feu, navigateurs supportés). Enfin, cadrer tôt le positionnement juridique avant toute dérive vers une surveillance intrusive.</w:t>
+      </w:r>
+    </w:p>
+    <w:p>
+      <w:bookmarkStart w:id="82430" w:name="bm_ch5_6"/>
+      <w:pPr>
+        <w:pStyle w:val="Heading2"/>
+        <w:spacing w:line="360" w:lineRule="auto"/>
+      </w:pPr>
+      <w:r>
+        <w:rPr>
+          <w:rFonts w:ascii="Times New Roman" w:hAnsi="Times New Roman" w:eastAsia="Times New Roman"/>
+          <w:b/>
+          <w:i w:val="0"/>
+          <w:color w:val="000000"/>
+          <w:sz w:val="24"/>
+        </w:rPr>
+        <w:t>5.6 Conclusion partielle</w:t>
+      </w:r>
+      <w:bookmarkEnd w:id="82430"/>
+    </w:p>
+    <w:p>
+      <w:pPr>
+        <w:spacing w:after="160" w:line="360" w:lineRule="auto"/>
+        <w:ind w:firstLine="425"/>
+        <w:jc w:val="both"/>
+      </w:pPr>
+      <w:r>
+        <w:rPr>
+          <w:rFonts w:ascii="Times New Roman" w:hAnsi="Times New Roman" w:eastAsia="Times New Roman"/>
+          <w:b w:val="0"/>
+          <w:i w:val="0"/>
+          <w:color w:val="000000"/>
+          <w:sz w:val="24"/>
+        </w:rPr>
+        <w:t>La validation confirme que le MVP Cylentic est fonctionnellement démontrable et techniquement cohérent sur son périmètre. Les limites restantes relèvent surtout d'arbitrages de priorité (infrastructure temps réel, multi langages, automatisation des tests), et non d'un défaut d'architecture fondamental.</w:t>
       </w:r>
     </w:p>
     <w:p>
@@ -8109,7 +8509,7 @@
       </w:r>
     </w:p>
     <w:p>
-      <w:bookmarkStart w:id="32318" w:name="bm_biblio"/>
+      <w:bookmarkStart w:id="31573" w:name="bm_concl"/>
       <w:pPr>
         <w:pStyle w:val="Heading1"/>
         <w:spacing w:line="360" w:lineRule="auto"/>
@@ -8122,9 +8522,83 @@
           <w:color w:val="000000"/>
           <w:sz w:val="28"/>
         </w:rPr>
+        <w:t>Conclusion générale</w:t>
+      </w:r>
+      <w:bookmarkEnd w:id="31573"/>
+    </w:p>
+    <w:p>
+      <w:pPr>
+        <w:spacing w:after="160" w:line="360" w:lineRule="auto"/>
+        <w:ind w:firstLine="425"/>
+        <w:jc w:val="both"/>
+      </w:pPr>
+      <w:r>
+        <w:rPr>
+          <w:rFonts w:ascii="Times New Roman" w:hAnsi="Times New Roman" w:eastAsia="Times New Roman"/>
+          <w:b w:val="0"/>
+          <w:i w:val="0"/>
+          <w:color w:val="000000"/>
+          <w:sz w:val="24"/>
+        </w:rPr>
+        <w:t>Ce projet partait d'un écart concret : besoin d'évaluer la programmation sur machine, difficulté à garantir l'intégrité des rendus lorsque la génération de code devient banale. Cylentic propose une réponse pragmatique pour une salle d'examen : plateforme web multi établissement, parcours étudiant contrôlé, exécution isolée et journal d'incidents lisible.</w:t>
+      </w:r>
+    </w:p>
+    <w:p>
+      <w:pPr>
+        <w:spacing w:after="160" w:line="360" w:lineRule="auto"/>
+        <w:ind w:firstLine="425"/>
+        <w:jc w:val="both"/>
+      </w:pPr>
+      <w:r>
+        <w:rPr>
+          <w:rFonts w:ascii="Times New Roman" w:hAnsi="Times New Roman" w:eastAsia="Times New Roman"/>
+          <w:b w:val="0"/>
+          <w:i w:val="0"/>
+          <w:color w:val="000000"/>
+          <w:sz w:val="24"/>
+        </w:rPr>
+        <w:t>L'analyse a borné un MVP assumé. La conception a fixé rôles, données et flux. La réalisation a livré une chaîne complète, de l'onboarding administrateur à la soumission étudiant, avec publication, contrôles de passation, correction automatique et exports. La validation a confirmé les parcours critiques après correction des anomalies de cookie Secure, de sérialisation Decimal et de synchronisation du timer.</w:t>
+      </w:r>
+    </w:p>
+    <w:p>
+      <w:pPr>
+        <w:spacing w:after="160" w:line="360" w:lineRule="auto"/>
+        <w:ind w:firstLine="425"/>
+        <w:jc w:val="both"/>
+      </w:pPr>
+      <w:r>
+        <w:rPr>
+          <w:rFonts w:ascii="Times New Roman" w:hAnsi="Times New Roman" w:eastAsia="Times New Roman"/>
+          <w:b w:val="0"/>
+          <w:i w:val="0"/>
+          <w:color w:val="000000"/>
+          <w:sz w:val="24"/>
+        </w:rPr>
+        <w:t>Des limites demeurent : second appareil hors contrôle, Python seul pour l'instant, Redis et workers non industrialisés, temps réel par polling. Elles n'effacent pas le résultat principal : un système utilisable dans son périmètre, justifié dans ses choix, prêt pour des usages pilotes. Les objectifs fixés pour le MVP sont atteints ; la suite pourra élargir les langages et renforcer l'infrastructure de charge.</w:t>
+      </w:r>
+    </w:p>
+    <w:p>
+      <w:r>
+        <w:br w:type="page"/>
+      </w:r>
+    </w:p>
+    <w:p>
+      <w:bookmarkStart w:id="30643" w:name="bm_biblio"/>
+      <w:pPr>
+        <w:pStyle w:val="Heading1"/>
+        <w:spacing w:line="360" w:lineRule="auto"/>
+      </w:pPr>
+      <w:r>
+        <w:rPr>
+          <w:rFonts w:ascii="Times New Roman" w:hAnsi="Times New Roman" w:eastAsia="Times New Roman"/>
+          <w:b/>
+          <w:i w:val="0"/>
+          <w:color w:val="000000"/>
+          <w:sz w:val="28"/>
+        </w:rPr>
         <w:t>Bibliographie et webographie</w:t>
       </w:r>
-      <w:bookmarkEnd w:id="32318"/>
+      <w:bookmarkEnd w:id="30643"/>
     </w:p>
     <w:p>
       <w:pPr>
@@ -8460,7 +8934,7 @@
       </w:r>
     </w:p>
     <w:p>
-      <w:bookmarkStart w:id="81363" w:name="bm_annexes"/>
+      <w:bookmarkStart w:id="66282" w:name="bm_annexes"/>
       <w:pPr>
         <w:pStyle w:val="Heading1"/>
         <w:spacing w:line="360" w:lineRule="auto"/>
@@ -8475,10 +8949,10 @@
         </w:rPr>
         <w:t>Annexes</w:t>
       </w:r>
-      <w:bookmarkEnd w:id="81363"/>
-    </w:p>
-    <w:p>
-      <w:bookmarkStart w:id="74081" w:name="Annexe_A___Inventaire_des_diagrammes_UML"/>
+      <w:bookmarkEnd w:id="66282"/>
+    </w:p>
+    <w:p>
+      <w:bookmarkStart w:id="83219" w:name="Annexe_A___Inventaire_des_diagrammes_UML"/>
       <w:pPr>
         <w:pStyle w:val="Heading2"/>
         <w:spacing w:line="360" w:lineRule="auto"/>
@@ -8493,7 +8967,7 @@
         </w:rPr>
         <w:t>Annexe A : Inventaire des diagrammes UML</w:t>
       </w:r>
-      <w:bookmarkEnd w:id="74081"/>
+      <w:bookmarkEnd w:id="83219"/>
     </w:p>
     <w:p>
       <w:pPr>
@@ -8512,7 +8986,7 @@
       </w:r>
     </w:p>
     <w:p>
-      <w:bookmarkStart w:id="49317" w:name="Annexe_B___Pr_fixes_d_identifiants"/>
+      <w:bookmarkStart w:id="69371" w:name="Annexe_B___Pr_fixes_d_identifiants"/>
       <w:pPr>
         <w:pStyle w:val="Heading2"/>
         <w:spacing w:line="360" w:lineRule="auto"/>
@@ -8527,7 +9001,7 @@
         </w:rPr>
         <w:t>Annexe B : Préfixes d'identifiants</w:t>
       </w:r>
-      <w:bookmarkEnd w:id="49317"/>
+      <w:bookmarkEnd w:id="69371"/>
     </w:p>
     <w:p>
       <w:pPr>
@@ -8546,7 +9020,7 @@
       </w:r>
     </w:p>
     <w:p>
-      <w:bookmarkStart w:id="28085" w:name="Annexe_C___Captures_d__cran_compl_mentai"/>
+      <w:bookmarkStart w:id="30296" w:name="Annexe_C___Captures_d__cran_compl_mentai"/>
       <w:pPr>
         <w:pStyle w:val="Heading2"/>
         <w:spacing w:line="360" w:lineRule="auto"/>
@@ -8561,7 +9035,7 @@
         </w:rPr>
         <w:t>Annexe C : Captures d'écran complémentaires</w:t>
       </w:r>
-      <w:bookmarkEnd w:id="28085"/>
+      <w:bookmarkEnd w:id="30296"/>
     </w:p>
     <w:p>
       <w:pPr>
@@ -8576,11 +9050,239 @@
           <w:color w:val="000000"/>
           <w:sz w:val="24"/>
         </w:rPr>
-        <w:t>Cette annexe regroupe les captures d'administration, de publication, de journal d'incidents et d'exports au-delà des figures placées dans le corps du rapport.</w:t>
-      </w:r>
-    </w:p>
-    <w:p>
-      <w:bookmarkStart w:id="11124" w:name="Annexe_D___Mod_le_CSV_d_import_des__tudi"/>
+        <w:t>Le chapitre 4 prévoit déjà dix captures de l'interface Cylentic (connexion, administration, parcours professeur, parcours étudiant et landing). Cette annexe peut accueillir des vues supplémentaires si le jury le souhaite : tableau de bord Super Admin, détail d'une copie corrigée, journal d'incidents filtré, écran d'exclusion après sorties du plein écran, ou résultat d'un import CSV avec rapport d'erreurs.</w:t>
+      </w:r>
+    </w:p>
+    <w:p>
+      <w:pPr>
+        <w:spacing w:after="240" w:line="240" w:lineRule="auto" w:before="240"/>
+        <w:jc w:val="center"/>
+      </w:pPr>
+      <w:r>
+        <w:rPr>
+          <w:rFonts w:ascii="Times New Roman" w:hAnsi="Times New Roman" w:eastAsia="Times New Roman"/>
+          <w:b w:val="0"/>
+          <w:i/>
+          <w:color w:val="000000"/>
+          <w:sz w:val="20"/>
+        </w:rPr>
+        <w:t>[Insérer ici la capture d'écran correspondante]</w:t>
+      </w:r>
+    </w:p>
+    <w:p>
+      <w:pPr>
+        <w:pStyle w:val="Caption"/>
+        <w:spacing w:after="200" w:line="360" w:lineRule="auto"/>
+        <w:jc w:val="center"/>
+      </w:pPr>
+      <w:r>
+        <w:rPr>
+          <w:rFonts w:ascii="Times New Roman" w:hAnsi="Times New Roman" w:eastAsia="Times New Roman"/>
+          <w:b w:val="0"/>
+          <w:i w:val="0"/>
+          <w:color w:val="000000"/>
+          <w:sz w:val="22"/>
+        </w:rPr>
+        <w:t xml:space="preserve">Figure </w:t>
+      </w:r>
+      <w:r>
+        <w:rPr>
+          <w:rFonts w:ascii="Times New Roman" w:hAnsi="Times New Roman" w:eastAsia="Times New Roman"/>
+          <w:b w:val="0"/>
+          <w:i w:val="0"/>
+          <w:color w:val="000000"/>
+          <w:sz w:val="22"/>
+        </w:rPr>
+        <w:fldChar w:fldCharType="begin"/>
+        <w:instrText xml:space="preserve">SEQ Figure \* ARABIC</w:instrText>
+        <w:fldChar w:fldCharType="separate"/>
+        <w:t>37</w:t>
+        <w:fldChar w:fldCharType="end"/>
+      </w:r>
+      <w:r>
+        <w:rPr>
+          <w:rFonts w:ascii="Times New Roman" w:hAnsi="Times New Roman" w:eastAsia="Times New Roman"/>
+          <w:b w:val="0"/>
+          <w:i w:val="0"/>
+          <w:color w:val="000000"/>
+          <w:sz w:val="22"/>
+        </w:rPr>
+        <w:t xml:space="preserve"> : Tableau de bord Super Admin</w:t>
+      </w:r>
+    </w:p>
+    <w:p>
+      <w:pPr>
+        <w:spacing w:after="240" w:line="240" w:lineRule="auto" w:before="240"/>
+        <w:jc w:val="center"/>
+      </w:pPr>
+      <w:r>
+        <w:rPr>
+          <w:rFonts w:ascii="Times New Roman" w:hAnsi="Times New Roman" w:eastAsia="Times New Roman"/>
+          <w:b w:val="0"/>
+          <w:i/>
+          <w:color w:val="000000"/>
+          <w:sz w:val="20"/>
+        </w:rPr>
+        <w:t>[Insérer ici la capture d'écran correspondante]</w:t>
+      </w:r>
+    </w:p>
+    <w:p>
+      <w:pPr>
+        <w:pStyle w:val="Caption"/>
+        <w:spacing w:after="200" w:line="360" w:lineRule="auto"/>
+        <w:jc w:val="center"/>
+      </w:pPr>
+      <w:r>
+        <w:rPr>
+          <w:rFonts w:ascii="Times New Roman" w:hAnsi="Times New Roman" w:eastAsia="Times New Roman"/>
+          <w:b w:val="0"/>
+          <w:i w:val="0"/>
+          <w:color w:val="000000"/>
+          <w:sz w:val="22"/>
+        </w:rPr>
+        <w:t xml:space="preserve">Figure </w:t>
+      </w:r>
+      <w:r>
+        <w:rPr>
+          <w:rFonts w:ascii="Times New Roman" w:hAnsi="Times New Roman" w:eastAsia="Times New Roman"/>
+          <w:b w:val="0"/>
+          <w:i w:val="0"/>
+          <w:color w:val="000000"/>
+          <w:sz w:val="22"/>
+        </w:rPr>
+        <w:fldChar w:fldCharType="begin"/>
+        <w:instrText xml:space="preserve">SEQ Figure \* ARABIC</w:instrText>
+        <w:fldChar w:fldCharType="separate"/>
+        <w:t>38</w:t>
+        <w:fldChar w:fldCharType="end"/>
+      </w:r>
+      <w:r>
+        <w:rPr>
+          <w:rFonts w:ascii="Times New Roman" w:hAnsi="Times New Roman" w:eastAsia="Times New Roman"/>
+          <w:b w:val="0"/>
+          <w:i w:val="0"/>
+          <w:color w:val="000000"/>
+          <w:sz w:val="22"/>
+        </w:rPr>
+        <w:t xml:space="preserve"> : Journal d'incidents d'une participation</w:t>
+      </w:r>
+    </w:p>
+    <w:p>
+      <w:pPr>
+        <w:spacing w:after="240" w:line="240" w:lineRule="auto" w:before="240"/>
+        <w:jc w:val="center"/>
+      </w:pPr>
+      <w:r>
+        <w:rPr>
+          <w:rFonts w:ascii="Times New Roman" w:hAnsi="Times New Roman" w:eastAsia="Times New Roman"/>
+          <w:b w:val="0"/>
+          <w:i/>
+          <w:color w:val="000000"/>
+          <w:sz w:val="20"/>
+        </w:rPr>
+        <w:t>[Insérer ici la capture d'écran correspondante]</w:t>
+      </w:r>
+    </w:p>
+    <w:p>
+      <w:pPr>
+        <w:pStyle w:val="Caption"/>
+        <w:spacing w:after="200" w:line="360" w:lineRule="auto"/>
+        <w:jc w:val="center"/>
+      </w:pPr>
+      <w:r>
+        <w:rPr>
+          <w:rFonts w:ascii="Times New Roman" w:hAnsi="Times New Roman" w:eastAsia="Times New Roman"/>
+          <w:b w:val="0"/>
+          <w:i w:val="0"/>
+          <w:color w:val="000000"/>
+          <w:sz w:val="22"/>
+        </w:rPr>
+        <w:t xml:space="preserve">Figure </w:t>
+      </w:r>
+      <w:r>
+        <w:rPr>
+          <w:rFonts w:ascii="Times New Roman" w:hAnsi="Times New Roman" w:eastAsia="Times New Roman"/>
+          <w:b w:val="0"/>
+          <w:i w:val="0"/>
+          <w:color w:val="000000"/>
+          <w:sz w:val="22"/>
+        </w:rPr>
+        <w:fldChar w:fldCharType="begin"/>
+        <w:instrText xml:space="preserve">SEQ Figure \* ARABIC</w:instrText>
+        <w:fldChar w:fldCharType="separate"/>
+        <w:t>39</w:t>
+        <w:fldChar w:fldCharType="end"/>
+      </w:r>
+      <w:r>
+        <w:rPr>
+          <w:rFonts w:ascii="Times New Roman" w:hAnsi="Times New Roman" w:eastAsia="Times New Roman"/>
+          <w:b w:val="0"/>
+          <w:i w:val="0"/>
+          <w:color w:val="000000"/>
+          <w:sz w:val="22"/>
+        </w:rPr>
+        <w:t xml:space="preserve"> : Écran d'exclusion technique (plein écran)</w:t>
+      </w:r>
+    </w:p>
+    <w:p>
+      <w:pPr>
+        <w:spacing w:after="240" w:line="240" w:lineRule="auto" w:before="240"/>
+        <w:jc w:val="center"/>
+      </w:pPr>
+      <w:r>
+        <w:rPr>
+          <w:rFonts w:ascii="Times New Roman" w:hAnsi="Times New Roman" w:eastAsia="Times New Roman"/>
+          <w:b w:val="0"/>
+          <w:i/>
+          <w:color w:val="000000"/>
+          <w:sz w:val="20"/>
+        </w:rPr>
+        <w:t>[Insérer ici la capture d'écran correspondante]</w:t>
+      </w:r>
+    </w:p>
+    <w:p>
+      <w:pPr>
+        <w:pStyle w:val="Caption"/>
+        <w:spacing w:after="200" w:line="360" w:lineRule="auto"/>
+        <w:jc w:val="center"/>
+      </w:pPr>
+      <w:r>
+        <w:rPr>
+          <w:rFonts w:ascii="Times New Roman" w:hAnsi="Times New Roman" w:eastAsia="Times New Roman"/>
+          <w:b w:val="0"/>
+          <w:i w:val="0"/>
+          <w:color w:val="000000"/>
+          <w:sz w:val="22"/>
+        </w:rPr>
+        <w:t xml:space="preserve">Figure </w:t>
+      </w:r>
+      <w:r>
+        <w:rPr>
+          <w:rFonts w:ascii="Times New Roman" w:hAnsi="Times New Roman" w:eastAsia="Times New Roman"/>
+          <w:b w:val="0"/>
+          <w:i w:val="0"/>
+          <w:color w:val="000000"/>
+          <w:sz w:val="22"/>
+        </w:rPr>
+        <w:fldChar w:fldCharType="begin"/>
+        <w:instrText xml:space="preserve">SEQ Figure \* ARABIC</w:instrText>
+        <w:fldChar w:fldCharType="separate"/>
+        <w:t>40</w:t>
+        <w:fldChar w:fldCharType="end"/>
+      </w:r>
+      <w:r>
+        <w:rPr>
+          <w:rFonts w:ascii="Times New Roman" w:hAnsi="Times New Roman" w:eastAsia="Times New Roman"/>
+          <w:b w:val="0"/>
+          <w:i w:val="0"/>
+          <w:color w:val="000000"/>
+          <w:sz w:val="22"/>
+        </w:rPr>
+        <w:t xml:space="preserve"> : Rapport d'erreurs d'import CSV</w:t>
+      </w:r>
+    </w:p>
+    <w:p>
+      <w:bookmarkStart w:id="7150" w:name="Annexe_D___Mod_le_CSV_d_import_des__tudi"/>
       <w:pPr>
         <w:pStyle w:val="Heading2"/>
         <w:spacing w:line="360" w:lineRule="auto"/>
@@ -8595,7 +9297,7 @@
         </w:rPr>
         <w:t>Annexe D : Modèle CSV d'import des étudiants</w:t>
       </w:r>
-      <w:bookmarkEnd w:id="11124"/>
+      <w:bookmarkEnd w:id="7150"/>
     </w:p>
     <w:p>
       <w:pPr>
@@ -8619,7 +9321,7 @@
       </w:r>
     </w:p>
     <w:p>
-      <w:bookmarkStart w:id="72626" w:name="bm_tdm"/>
+      <w:bookmarkStart w:id="89133" w:name="bm_tdm"/>
       <w:pPr>
         <w:pStyle w:val="Heading1"/>
         <w:spacing w:line="360" w:lineRule="auto"/>
@@ -8634,7 +9336,7 @@
         </w:rPr>
         <w:t>Table des matières</w:t>
       </w:r>
-      <w:bookmarkEnd w:id="72626"/>
+      <w:bookmarkEnd w:id="89133"/>
     </w:p>
     <w:p>
       <w:pPr>

</xml_diff>

<commit_message>
Réduit le rapport de quelques pages sans toucher au fond utile.
Suppression des conclusions partielles (redondantes) et des trois
diagrammes d'objets (doublon pédagogique des classes). Figures
renumérotées 1–33.

Co-authored-by: progirix <progirix@users.noreply.github.com>
</commit_message>
<xml_diff>
--- a/docs/Rapport_Cylentic.docx
+++ b/docs/Rapport_Cylentic.docx
@@ -7408,57 +7408,6 @@
     </w:p>
     <w:p>
       <w:pPr>
-        <w:pStyle w:val="Titre2"/>
-        <w:rPr>
-          <w:lang w:val="fr-FR"/>
-        </w:rPr>
-      </w:pPr>
-      <w:bookmarkStart w:id="42" w:name="bm_ch1_5"/>
-      <w:bookmarkStart w:id="43" w:name="_Toc235048534"/>
-      <w:r>
-        <w:rPr>
-          <w:rFonts w:ascii="Times New Roman" w:eastAsia="Times New Roman" w:hAnsi="Times New Roman"/>
-          <w:lang w:val="fr-FR"/>
-        </w:rPr>
-        <w:t>1.5 Conclusion partielle</w:t>
-      </w:r>
-      <w:bookmarkEnd w:id="42"/>
-      <w:bookmarkEnd w:id="43"/>
-    </w:p>
-    <w:p>
-      <w:pPr>
-        <w:ind w:firstLine="425"/>
-        <w:jc w:val="both"/>
-        <w:rPr>
-          <w:lang w:val="fr-FR"/>
-        </w:rPr>
-      </w:pPr>
-      <w:r>
-        <w:rPr>
-          <w:rFonts w:ascii="Times New Roman" w:hAnsi="Times New Roman" w:eastAsia="Times New Roman"/>
-          <w:b w:val="0"/>
-          <w:i w:val="0"/>
-          <w:color w:val="000000"/>
-          <w:sz w:val="24"/>
-        </w:rPr>
-        <w:t>Le constat est net : le problème existe, les outils ne le couvrent que par morceaux, et Cylentic a une place utile. Le chapitre suivant fixe le cahier des charges du MVP.</w:t>
-      </w:r>
-    </w:p>
-    <w:p>
-      <w:pPr>
-        <w:rPr>
-          <w:lang w:val="fr-FR"/>
-        </w:rPr>
-      </w:pPr>
-      <w:r>
-        <w:rPr>
-          <w:lang w:val="fr-FR"/>
-        </w:rPr>
-        <w:br w:type="page"/>
-      </w:r>
-    </w:p>
-    <w:p>
-      <w:pPr>
         <w:pStyle w:val="Titre1"/>
         <w:rPr>
           <w:lang w:val="fr-FR"/>
@@ -8177,55 +8126,6 @@
     </w:p>
     <w:p>
       <w:pPr>
-        <w:pStyle w:val="Titre2"/>
-        <w:rPr>
-          <w:lang w:val="fr-FR"/>
-        </w:rPr>
-      </w:pPr>
-      <w:bookmarkStart w:id="60" w:name="bm_ch2_7"/>
-      <w:bookmarkStart w:id="61" w:name="_Toc235048542"/>
-      <w:r>
-        <w:rPr>
-          <w:rFonts w:ascii="Times New Roman" w:eastAsia="Times New Roman" w:hAnsi="Times New Roman"/>
-          <w:lang w:val="fr-FR"/>
-        </w:rPr>
-        <w:lastRenderedPageBreak/>
-        <w:t>2.7 Conclusion partielle</w:t>
-      </w:r>
-      <w:bookmarkEnd w:id="60"/>
-      <w:bookmarkEnd w:id="61"/>
-    </w:p>
-    <w:p>
-      <w:pPr>
-        <w:ind w:firstLine="425"/>
-        <w:jc w:val="both"/>
-        <w:rPr>
-          <w:lang w:val="fr-FR"/>
-        </w:rPr>
-      </w:pPr>
-      <w:r>
-        <w:rPr>
-          <w:color w:val="000000"/>
-          <w:lang w:val="fr-FR"/>
-        </w:rPr>
-        <w:t>Le cahier des charges de Cylentic est posé : périmètre du MVP, acteurs, besoins fonctionnels et non fonctionnels, règles métier et scénarios prioritaires. Sur cette base, la conception du chapitre suivant peut se développer sans improvisation fonctionnelle.</w:t>
-      </w:r>
-    </w:p>
-    <w:p>
-      <w:pPr>
-        <w:rPr>
-          <w:lang w:val="fr-FR"/>
-        </w:rPr>
-      </w:pPr>
-      <w:r>
-        <w:rPr>
-          <w:lang w:val="fr-FR"/>
-        </w:rPr>
-        <w:br w:type="page"/>
-      </w:r>
-    </w:p>
-    <w:p>
-      <w:pPr>
         <w:pStyle w:val="Titre1"/>
         <w:rPr>
           <w:lang w:val="fr-FR"/>
@@ -9523,15 +9423,17 @@
       </w:pPr>
       <w:bookmarkStart w:id="79" w:name="bm_ch3_4"/>
       <w:bookmarkStart w:id="80" w:name="_Toc235048547"/>
-      <w:r>
-        <w:rPr>
-          <w:rFonts w:ascii="Times New Roman" w:eastAsia="Times New Roman" w:hAnsi="Times New Roman"/>
-          <w:lang w:val="fr-FR"/>
-        </w:rPr>
-        <w:t>3.4 Structure statique : classes et objets</w:t>
-      </w:r>
       <w:bookmarkEnd w:id="79"/>
       <w:bookmarkEnd w:id="80"/>
+      <w:r>
+        <w:rPr>
+          <w:rFonts w:ascii="Times New Roman" w:hAnsi="Times New Roman"/>
+          <w:b/>
+          <w:color w:val="000000"/>
+          <w:sz w:val="24"/>
+        </w:rPr>
+        <w:t>3.4 Structure statique : diagrammes de classes</w:t>
+      </w:r>
     </w:p>
     <w:p>
       <w:pPr>
@@ -9916,364 +9818,6 @@
     </w:p>
     <w:p>
       <w:pPr>
-        <w:ind w:firstLine="425"/>
-        <w:jc w:val="both"/>
-        <w:rPr>
-          <w:lang w:val="fr-FR"/>
-        </w:rPr>
-      </w:pPr>
-      <w:r>
-        <w:rPr>
-          <w:color w:val="000000"/>
-          <w:lang w:val="fr-FR"/>
-        </w:rPr>
-        <w:t>Les diagrammes d'objets illustrent le même découpage avec des instances concrètes. Ils facilitent la relecture pédagogique : un établissement exemple, un professeur nommé, un examen publié, une participation en cours, un incident de sortie du plein écran. Les attributs des objets reprennent l'intégralité des champs du modèle, sans abréviation.</w:t>
-      </w:r>
-    </w:p>
-    <w:p>
-      <w:pPr>
-        <w:spacing w:after="80" w:line="240" w:lineRule="auto"/>
-        <w:jc w:val="center"/>
-      </w:pPr>
-      <w:r>
-        <w:rPr>
-          <w:noProof/>
-        </w:rPr>
-        <w:lastRenderedPageBreak/>
-        <w:drawing>
-          <wp:inline distT="0" distB="0" distL="0" distR="0" wp14:anchorId="56B972DA" wp14:editId="2377F5A1">
-            <wp:extent cx="5040000" cy="4857517"/>
-            <wp:effectExtent l="0" t="0" r="0" b="0"/>
-            <wp:docPr id="12" name="Picture 12"/>
-            <wp:cNvGraphicFramePr>
-              <a:graphicFrameLocks xmlns:a="http://schemas.openxmlformats.org/drawingml/2006/main" noChangeAspect="1"/>
-            </wp:cNvGraphicFramePr>
-            <a:graphic xmlns:a="http://schemas.openxmlformats.org/drawingml/2006/main">
-              <a:graphicData uri="http://schemas.openxmlformats.org/drawingml/2006/picture">
-                <pic:pic xmlns:pic="http://schemas.openxmlformats.org/drawingml/2006/picture">
-                  <pic:nvPicPr>
-                    <pic:cNvPr id="0" name="06a_objets_organisation.png"/>
-                    <pic:cNvPicPr/>
-                  </pic:nvPicPr>
-                  <pic:blipFill>
-                    <a:blip r:embed="rId22"/>
-                    <a:stretch>
-                      <a:fillRect/>
-                    </a:stretch>
-                  </pic:blipFill>
-                  <pic:spPr>
-                    <a:xfrm>
-                      <a:off x="0" y="0"/>
-                      <a:ext cx="5040000" cy="4857517"/>
-                    </a:xfrm>
-                    <a:prstGeom prst="rect">
-                      <a:avLst/>
-                    </a:prstGeom>
-                  </pic:spPr>
-                </pic:pic>
-              </a:graphicData>
-            </a:graphic>
-          </wp:inline>
-        </w:drawing>
-      </w:r>
-    </w:p>
-    <w:p>
-      <w:pPr>
-        <w:pStyle w:val="Lgende"/>
-        <w:spacing w:after="200" w:line="360" w:lineRule="auto"/>
-        <w:jc w:val="center"/>
-      </w:pPr>
-      <w:bookmarkStart w:id="84" w:name="_Toc235048695"/>
-      <w:r>
-        <w:rPr>
-          <w:b w:val="0"/>
-          <w:color w:val="000000"/>
-          <w:sz w:val="22"/>
-        </w:rPr>
-        <w:t xml:space="preserve">Figure </w:t>
-      </w:r>
-      <w:r>
-        <w:rPr>
-          <w:b w:val="0"/>
-          <w:color w:val="000000"/>
-          <w:sz w:val="22"/>
-        </w:rPr>
-        <w:fldChar w:fldCharType="begin"/>
-      </w:r>
-      <w:r>
-        <w:rPr>
-          <w:b w:val="0"/>
-          <w:color w:val="000000"/>
-          <w:sz w:val="22"/>
-        </w:rPr>
-        <w:instrText>SEQ Figure \* ARABIC</w:instrText>
-      </w:r>
-      <w:r>
-        <w:rPr>
-          <w:b w:val="0"/>
-          <w:color w:val="000000"/>
-          <w:sz w:val="22"/>
-        </w:rPr>
-        <w:fldChar w:fldCharType="separate"/>
-      </w:r>
-      <w:r>
-        <w:rPr>
-          <w:b w:val="0"/>
-          <w:color w:val="000000"/>
-          <w:sz w:val="22"/>
-        </w:rPr>
-        <w:t>12</w:t>
-      </w:r>
-      <w:r>
-        <w:rPr>
-          <w:b w:val="0"/>
-          <w:color w:val="000000"/>
-          <w:sz w:val="22"/>
-        </w:rPr>
-        <w:fldChar w:fldCharType="end"/>
-      </w:r>
-      <w:r>
-        <w:rPr>
-          <w:b w:val="0"/>
-          <w:color w:val="000000"/>
-          <w:sz w:val="22"/>
-        </w:rPr>
-        <w:t xml:space="preserve"> : Objets organisation</w:t>
-      </w:r>
-      <w:bookmarkEnd w:id="84"/>
-    </w:p>
-    <w:p>
-      <w:pPr>
-        <w:spacing w:after="80" w:line="240" w:lineRule="auto"/>
-        <w:jc w:val="center"/>
-      </w:pPr>
-      <w:r>
-        <w:rPr>
-          <w:noProof/>
-        </w:rPr>
-        <w:drawing>
-          <wp:inline distT="0" distB="0" distL="0" distR="0" wp14:anchorId="4C16F28F" wp14:editId="27644652">
-            <wp:extent cx="5040000" cy="2167552"/>
-            <wp:effectExtent l="0" t="0" r="0" b="0"/>
-            <wp:docPr id="13" name="Picture 13"/>
-            <wp:cNvGraphicFramePr>
-              <a:graphicFrameLocks xmlns:a="http://schemas.openxmlformats.org/drawingml/2006/main" noChangeAspect="1"/>
-            </wp:cNvGraphicFramePr>
-            <a:graphic xmlns:a="http://schemas.openxmlformats.org/drawingml/2006/main">
-              <a:graphicData uri="http://schemas.openxmlformats.org/drawingml/2006/picture">
-                <pic:pic xmlns:pic="http://schemas.openxmlformats.org/drawingml/2006/picture">
-                  <pic:nvPicPr>
-                    <pic:cNvPr id="0" name="06b_objets_conception_examen.png"/>
-                    <pic:cNvPicPr/>
-                  </pic:nvPicPr>
-                  <pic:blipFill>
-                    <a:blip r:embed="rId23"/>
-                    <a:stretch>
-                      <a:fillRect/>
-                    </a:stretch>
-                  </pic:blipFill>
-                  <pic:spPr>
-                    <a:xfrm>
-                      <a:off x="0" y="0"/>
-                      <a:ext cx="5040000" cy="2167552"/>
-                    </a:xfrm>
-                    <a:prstGeom prst="rect">
-                      <a:avLst/>
-                    </a:prstGeom>
-                  </pic:spPr>
-                </pic:pic>
-              </a:graphicData>
-            </a:graphic>
-          </wp:inline>
-        </w:drawing>
-      </w:r>
-    </w:p>
-    <w:p>
-      <w:pPr>
-        <w:pStyle w:val="Lgende"/>
-        <w:spacing w:after="200" w:line="360" w:lineRule="auto"/>
-        <w:jc w:val="center"/>
-      </w:pPr>
-      <w:bookmarkStart w:id="85" w:name="_Toc235048696"/>
-      <w:r>
-        <w:rPr>
-          <w:b w:val="0"/>
-          <w:color w:val="000000"/>
-          <w:sz w:val="22"/>
-        </w:rPr>
-        <w:t xml:space="preserve">Figure </w:t>
-      </w:r>
-      <w:r>
-        <w:rPr>
-          <w:b w:val="0"/>
-          <w:color w:val="000000"/>
-          <w:sz w:val="22"/>
-        </w:rPr>
-        <w:fldChar w:fldCharType="begin"/>
-      </w:r>
-      <w:r>
-        <w:rPr>
-          <w:b w:val="0"/>
-          <w:color w:val="000000"/>
-          <w:sz w:val="22"/>
-        </w:rPr>
-        <w:instrText>SEQ Figure \* ARABIC</w:instrText>
-      </w:r>
-      <w:r>
-        <w:rPr>
-          <w:b w:val="0"/>
-          <w:color w:val="000000"/>
-          <w:sz w:val="22"/>
-        </w:rPr>
-        <w:fldChar w:fldCharType="separate"/>
-      </w:r>
-      <w:r>
-        <w:rPr>
-          <w:b w:val="0"/>
-          <w:color w:val="000000"/>
-          <w:sz w:val="22"/>
-        </w:rPr>
-        <w:t>13</w:t>
-      </w:r>
-      <w:r>
-        <w:rPr>
-          <w:b w:val="0"/>
-          <w:color w:val="000000"/>
-          <w:sz w:val="22"/>
-        </w:rPr>
-        <w:fldChar w:fldCharType="end"/>
-      </w:r>
-      <w:r>
-        <w:rPr>
-          <w:b w:val="0"/>
-          <w:color w:val="000000"/>
-          <w:sz w:val="22"/>
-        </w:rPr>
-        <w:t xml:space="preserve"> : Objets conception d'examen</w:t>
-      </w:r>
-      <w:bookmarkEnd w:id="85"/>
-    </w:p>
-    <w:p>
-      <w:pPr>
-        <w:spacing w:after="80" w:line="240" w:lineRule="auto"/>
-        <w:jc w:val="center"/>
-      </w:pPr>
-      <w:r>
-        <w:rPr>
-          <w:noProof/>
-        </w:rPr>
-        <w:lastRenderedPageBreak/>
-        <w:drawing>
-          <wp:inline distT="0" distB="0" distL="0" distR="0" wp14:anchorId="4CEA809E" wp14:editId="5B551C84">
-            <wp:extent cx="5040000" cy="4050998"/>
-            <wp:effectExtent l="0" t="0" r="0" b="0"/>
-            <wp:docPr id="14" name="Picture 14"/>
-            <wp:cNvGraphicFramePr>
-              <a:graphicFrameLocks xmlns:a="http://schemas.openxmlformats.org/drawingml/2006/main" noChangeAspect="1"/>
-            </wp:cNvGraphicFramePr>
-            <a:graphic xmlns:a="http://schemas.openxmlformats.org/drawingml/2006/main">
-              <a:graphicData uri="http://schemas.openxmlformats.org/drawingml/2006/picture">
-                <pic:pic xmlns:pic="http://schemas.openxmlformats.org/drawingml/2006/picture">
-                  <pic:nvPicPr>
-                    <pic:cNvPr id="0" name="06c_objets_passation.png"/>
-                    <pic:cNvPicPr/>
-                  </pic:nvPicPr>
-                  <pic:blipFill>
-                    <a:blip r:embed="rId24"/>
-                    <a:stretch>
-                      <a:fillRect/>
-                    </a:stretch>
-                  </pic:blipFill>
-                  <pic:spPr>
-                    <a:xfrm>
-                      <a:off x="0" y="0"/>
-                      <a:ext cx="5040000" cy="4050998"/>
-                    </a:xfrm>
-                    <a:prstGeom prst="rect">
-                      <a:avLst/>
-                    </a:prstGeom>
-                  </pic:spPr>
-                </pic:pic>
-              </a:graphicData>
-            </a:graphic>
-          </wp:inline>
-        </w:drawing>
-      </w:r>
-    </w:p>
-    <w:p>
-      <w:pPr>
-        <w:pStyle w:val="Lgende"/>
-        <w:spacing w:after="200" w:line="360" w:lineRule="auto"/>
-        <w:jc w:val="center"/>
-        <w:rPr>
-          <w:lang w:val="fr-FR"/>
-        </w:rPr>
-      </w:pPr>
-      <w:bookmarkStart w:id="86" w:name="_Toc235048697"/>
-      <w:r>
-        <w:rPr>
-          <w:b w:val="0"/>
-          <w:color w:val="000000"/>
-          <w:sz w:val="22"/>
-          <w:lang w:val="fr-FR"/>
-        </w:rPr>
-        <w:t xml:space="preserve">Figure </w:t>
-      </w:r>
-      <w:r>
-        <w:rPr>
-          <w:b w:val="0"/>
-          <w:color w:val="000000"/>
-          <w:sz w:val="22"/>
-        </w:rPr>
-        <w:fldChar w:fldCharType="begin"/>
-      </w:r>
-      <w:r>
-        <w:rPr>
-          <w:b w:val="0"/>
-          <w:color w:val="000000"/>
-          <w:sz w:val="22"/>
-          <w:lang w:val="fr-FR"/>
-        </w:rPr>
-        <w:instrText>SEQ Figure \* ARABIC</w:instrText>
-      </w:r>
-      <w:r>
-        <w:rPr>
-          <w:b w:val="0"/>
-          <w:color w:val="000000"/>
-          <w:sz w:val="22"/>
-        </w:rPr>
-        <w:fldChar w:fldCharType="separate"/>
-      </w:r>
-      <w:r>
-        <w:rPr>
-          <w:b w:val="0"/>
-          <w:color w:val="000000"/>
-          <w:sz w:val="22"/>
-          <w:lang w:val="fr-FR"/>
-        </w:rPr>
-        <w:t>14</w:t>
-      </w:r>
-      <w:r>
-        <w:rPr>
-          <w:b w:val="0"/>
-          <w:color w:val="000000"/>
-          <w:sz w:val="22"/>
-        </w:rPr>
-        <w:fldChar w:fldCharType="end"/>
-      </w:r>
-      <w:r>
-        <w:rPr>
-          <w:b w:val="0"/>
-          <w:color w:val="000000"/>
-          <w:sz w:val="22"/>
-          <w:lang w:val="fr-FR"/>
-        </w:rPr>
-        <w:t xml:space="preserve"> : Objets passation</w:t>
-      </w:r>
-      <w:bookmarkEnd w:id="86"/>
-    </w:p>
-    <w:p>
-      <w:pPr>
         <w:pStyle w:val="Titre2"/>
         <w:rPr>
           <w:lang w:val="fr-FR"/>
@@ -10359,64 +9903,14 @@
         <w:spacing w:after="200" w:line="360" w:lineRule="auto"/>
         <w:jc w:val="center"/>
       </w:pPr>
-      <w:bookmarkStart w:id="89" w:name="_Toc235048698"/>
-      <w:r>
-        <w:rPr>
-          <w:b w:val="0"/>
+      <w:r>
+        <w:rPr>
+          <w:rFonts w:ascii="Times New Roman" w:hAnsi="Times New Roman"/>
           <w:color w:val="000000"/>
           <w:sz w:val="22"/>
         </w:rPr>
-        <w:t xml:space="preserve">Figure </w:t>
-      </w:r>
-      <w:r>
-        <w:rPr>
-          <w:b w:val="0"/>
-          <w:color w:val="000000"/>
-          <w:sz w:val="22"/>
-        </w:rPr>
-        <w:fldChar w:fldCharType="begin"/>
-      </w:r>
-      <w:r>
-        <w:rPr>
-          <w:b w:val="0"/>
-          <w:color w:val="000000"/>
-          <w:sz w:val="22"/>
-        </w:rPr>
-        <w:instrText>SEQ Figure \* ARABIC</w:instrText>
-      </w:r>
-      <w:r>
-        <w:rPr>
-          <w:b w:val="0"/>
-          <w:color w:val="000000"/>
-          <w:sz w:val="22"/>
-        </w:rPr>
-        <w:fldChar w:fldCharType="separate"/>
-      </w:r>
-      <w:r>
-        <w:rPr>
-          <w:b w:val="0"/>
-          <w:color w:val="000000"/>
-          <w:sz w:val="22"/>
-        </w:rPr>
-        <w:t>15</w:t>
-      </w:r>
-      <w:r>
-        <w:rPr>
-          <w:b w:val="0"/>
-          <w:color w:val="000000"/>
-          <w:sz w:val="22"/>
-        </w:rPr>
-        <w:fldChar w:fldCharType="end"/>
-      </w:r>
-      <w:r>
-        <w:rPr>
-          <w:b w:val="0"/>
-          <w:color w:val="000000"/>
-          <w:sz w:val="22"/>
-        </w:rPr>
-        <w:t xml:space="preserve"> : Composants vue d'ensemble</w:t>
-      </w:r>
-      <w:bookmarkEnd w:id="89"/>
+        <w:t>Figure 12 : Composants vue d'ensemble</w:t>
+      </w:r>
     </w:p>
     <w:p>
       <w:pPr>
@@ -10471,64 +9965,14 @@
         <w:spacing w:after="200" w:line="360" w:lineRule="auto"/>
         <w:jc w:val="center"/>
       </w:pPr>
-      <w:bookmarkStart w:id="90" w:name="_Toc235048699"/>
-      <w:r>
-        <w:rPr>
-          <w:b w:val="0"/>
+      <w:r>
+        <w:rPr>
+          <w:rFonts w:ascii="Times New Roman" w:hAnsi="Times New Roman"/>
           <w:color w:val="000000"/>
           <w:sz w:val="22"/>
         </w:rPr>
-        <w:t xml:space="preserve">Figure </w:t>
-      </w:r>
-      <w:r>
-        <w:rPr>
-          <w:b w:val="0"/>
-          <w:color w:val="000000"/>
-          <w:sz w:val="22"/>
-        </w:rPr>
-        <w:fldChar w:fldCharType="begin"/>
-      </w:r>
-      <w:r>
-        <w:rPr>
-          <w:b w:val="0"/>
-          <w:color w:val="000000"/>
-          <w:sz w:val="22"/>
-        </w:rPr>
-        <w:instrText>SEQ Figure \* ARABIC</w:instrText>
-      </w:r>
-      <w:r>
-        <w:rPr>
-          <w:b w:val="0"/>
-          <w:color w:val="000000"/>
-          <w:sz w:val="22"/>
-        </w:rPr>
-        <w:fldChar w:fldCharType="separate"/>
-      </w:r>
-      <w:r>
-        <w:rPr>
-          <w:b w:val="0"/>
-          <w:color w:val="000000"/>
-          <w:sz w:val="22"/>
-        </w:rPr>
-        <w:t>16</w:t>
-      </w:r>
-      <w:r>
-        <w:rPr>
-          <w:b w:val="0"/>
-          <w:color w:val="000000"/>
-          <w:sz w:val="22"/>
-        </w:rPr>
-        <w:fldChar w:fldCharType="end"/>
-      </w:r>
-      <w:r>
-        <w:rPr>
-          <w:b w:val="0"/>
-          <w:color w:val="000000"/>
-          <w:sz w:val="22"/>
-        </w:rPr>
-        <w:t xml:space="preserve"> : Composants administration et authentification</w:t>
-      </w:r>
-      <w:bookmarkEnd w:id="90"/>
+        <w:t>Figure 13 : Composants administration et authentification</w:t>
+      </w:r>
     </w:p>
     <w:p>
       <w:pPr>
@@ -10585,68 +10029,14 @@
           <w:lang w:val="fr-FR"/>
         </w:rPr>
       </w:pPr>
-      <w:bookmarkStart w:id="91" w:name="_Toc235048700"/>
-      <w:r>
-        <w:rPr>
-          <w:b w:val="0"/>
+      <w:r>
+        <w:rPr>
+          <w:rFonts w:ascii="Times New Roman" w:hAnsi="Times New Roman"/>
           <w:color w:val="000000"/>
           <w:sz w:val="22"/>
-          <w:lang w:val="fr-FR"/>
-        </w:rPr>
-        <w:t xml:space="preserve">Figure </w:t>
-      </w:r>
-      <w:r>
-        <w:rPr>
-          <w:b w:val="0"/>
-          <w:color w:val="000000"/>
-          <w:sz w:val="22"/>
-        </w:rPr>
-        <w:fldChar w:fldCharType="begin"/>
-      </w:r>
-      <w:r>
-        <w:rPr>
-          <w:b w:val="0"/>
-          <w:color w:val="000000"/>
-          <w:sz w:val="22"/>
-          <w:lang w:val="fr-FR"/>
-        </w:rPr>
-        <w:instrText>SEQ Figure \* ARABIC</w:instrText>
-      </w:r>
-      <w:r>
-        <w:rPr>
-          <w:b w:val="0"/>
-          <w:color w:val="000000"/>
-          <w:sz w:val="22"/>
-        </w:rPr>
-        <w:fldChar w:fldCharType="separate"/>
-      </w:r>
-      <w:r>
-        <w:rPr>
-          <w:b w:val="0"/>
-          <w:color w:val="000000"/>
-          <w:sz w:val="22"/>
-          <w:lang w:val="fr-FR"/>
-        </w:rPr>
-        <w:t>17</w:t>
-      </w:r>
-      <w:r>
-        <w:rPr>
-          <w:b w:val="0"/>
-          <w:color w:val="000000"/>
-          <w:sz w:val="22"/>
-        </w:rPr>
-        <w:fldChar w:fldCharType="end"/>
-      </w:r>
-      <w:r>
-        <w:rPr>
-          <w:b w:val="0"/>
-          <w:color w:val="000000"/>
-          <w:sz w:val="22"/>
-          <w:lang w:val="fr-FR"/>
-        </w:rPr>
-        <w:t xml:space="preserve"> : Composants examens et passation</w:t>
-      </w:r>
-      <w:bookmarkEnd w:id="91"/>
+        </w:rPr>
+        <w:t>Figure 14 : Composants examens et passation</w:t>
+      </w:r>
     </w:p>
     <w:p>
       <w:pPr>
@@ -10774,68 +10164,14 @@
           <w:lang w:val="fr-FR"/>
         </w:rPr>
       </w:pPr>
-      <w:bookmarkStart w:id="96" w:name="_Toc235048701"/>
-      <w:r>
-        <w:rPr>
-          <w:b w:val="0"/>
+      <w:r>
+        <w:rPr>
+          <w:rFonts w:ascii="Times New Roman" w:hAnsi="Times New Roman"/>
           <w:color w:val="000000"/>
           <w:sz w:val="22"/>
-          <w:lang w:val="fr-FR"/>
-        </w:rPr>
-        <w:t xml:space="preserve">Figure </w:t>
-      </w:r>
-      <w:r>
-        <w:rPr>
-          <w:b w:val="0"/>
-          <w:color w:val="000000"/>
-          <w:sz w:val="22"/>
-        </w:rPr>
-        <w:fldChar w:fldCharType="begin"/>
-      </w:r>
-      <w:r>
-        <w:rPr>
-          <w:b w:val="0"/>
-          <w:color w:val="000000"/>
-          <w:sz w:val="22"/>
-          <w:lang w:val="fr-FR"/>
-        </w:rPr>
-        <w:instrText>SEQ Figure \* ARABIC</w:instrText>
-      </w:r>
-      <w:r>
-        <w:rPr>
-          <w:b w:val="0"/>
-          <w:color w:val="000000"/>
-          <w:sz w:val="22"/>
-        </w:rPr>
-        <w:fldChar w:fldCharType="separate"/>
-      </w:r>
-      <w:r>
-        <w:rPr>
-          <w:b w:val="0"/>
-          <w:color w:val="000000"/>
-          <w:sz w:val="22"/>
-          <w:lang w:val="fr-FR"/>
-        </w:rPr>
-        <w:t>18</w:t>
-      </w:r>
-      <w:r>
-        <w:rPr>
-          <w:b w:val="0"/>
-          <w:color w:val="000000"/>
-          <w:sz w:val="22"/>
-        </w:rPr>
-        <w:fldChar w:fldCharType="end"/>
-      </w:r>
-      <w:r>
-        <w:rPr>
-          <w:b w:val="0"/>
-          <w:color w:val="000000"/>
-          <w:sz w:val="22"/>
-          <w:lang w:val="fr-FR"/>
-        </w:rPr>
-        <w:t xml:space="preserve"> : États du cycle de vie d'un examen</w:t>
-      </w:r>
-      <w:bookmarkEnd w:id="96"/>
+        </w:rPr>
+        <w:t>Figure 15 : États du cycle de vie d'un examen</w:t>
+      </w:r>
     </w:p>
     <w:p>
       <w:pPr>
@@ -10928,68 +10264,14 @@
           <w:lang w:val="fr-FR"/>
         </w:rPr>
       </w:pPr>
-      <w:bookmarkStart w:id="99" w:name="_Toc235048702"/>
-      <w:r>
-        <w:rPr>
-          <w:b w:val="0"/>
+      <w:r>
+        <w:rPr>
+          <w:rFonts w:ascii="Times New Roman" w:hAnsi="Times New Roman"/>
           <w:color w:val="000000"/>
           <w:sz w:val="22"/>
-          <w:lang w:val="fr-FR"/>
-        </w:rPr>
-        <w:t xml:space="preserve">Figure </w:t>
-      </w:r>
-      <w:r>
-        <w:rPr>
-          <w:b w:val="0"/>
-          <w:color w:val="000000"/>
-          <w:sz w:val="22"/>
-        </w:rPr>
-        <w:fldChar w:fldCharType="begin"/>
-      </w:r>
-      <w:r>
-        <w:rPr>
-          <w:b w:val="0"/>
-          <w:color w:val="000000"/>
-          <w:sz w:val="22"/>
-          <w:lang w:val="fr-FR"/>
-        </w:rPr>
-        <w:instrText>SEQ Figure \* ARABIC</w:instrText>
-      </w:r>
-      <w:r>
-        <w:rPr>
-          <w:b w:val="0"/>
-          <w:color w:val="000000"/>
-          <w:sz w:val="22"/>
-        </w:rPr>
-        <w:fldChar w:fldCharType="separate"/>
-      </w:r>
-      <w:r>
-        <w:rPr>
-          <w:b w:val="0"/>
-          <w:color w:val="000000"/>
-          <w:sz w:val="22"/>
-          <w:lang w:val="fr-FR"/>
-        </w:rPr>
-        <w:t>19</w:t>
-      </w:r>
-      <w:r>
-        <w:rPr>
-          <w:b w:val="0"/>
-          <w:color w:val="000000"/>
-          <w:sz w:val="22"/>
-        </w:rPr>
-        <w:fldChar w:fldCharType="end"/>
-      </w:r>
-      <w:r>
-        <w:rPr>
-          <w:b w:val="0"/>
-          <w:color w:val="000000"/>
-          <w:sz w:val="22"/>
-          <w:lang w:val="fr-FR"/>
-        </w:rPr>
-        <w:t xml:space="preserve"> : Séquence de connexion</w:t>
-      </w:r>
-      <w:bookmarkEnd w:id="99"/>
+        </w:rPr>
+        <w:t>Figure 16 : Séquence de connexion</w:t>
+      </w:r>
     </w:p>
     <w:p>
       <w:pPr>
@@ -11066,68 +10348,14 @@
           <w:lang w:val="fr-FR"/>
         </w:rPr>
       </w:pPr>
-      <w:bookmarkStart w:id="100" w:name="_Toc235048703"/>
-      <w:r>
-        <w:rPr>
-          <w:b w:val="0"/>
+      <w:r>
+        <w:rPr>
+          <w:rFonts w:ascii="Times New Roman" w:hAnsi="Times New Roman"/>
           <w:color w:val="000000"/>
           <w:sz w:val="22"/>
-          <w:lang w:val="fr-FR"/>
-        </w:rPr>
-        <w:t xml:space="preserve">Figure </w:t>
-      </w:r>
-      <w:r>
-        <w:rPr>
-          <w:b w:val="0"/>
-          <w:color w:val="000000"/>
-          <w:sz w:val="22"/>
-        </w:rPr>
-        <w:fldChar w:fldCharType="begin"/>
-      </w:r>
-      <w:r>
-        <w:rPr>
-          <w:b w:val="0"/>
-          <w:color w:val="000000"/>
-          <w:sz w:val="22"/>
-          <w:lang w:val="fr-FR"/>
-        </w:rPr>
-        <w:instrText>SEQ Figure \* ARABIC</w:instrText>
-      </w:r>
-      <w:r>
-        <w:rPr>
-          <w:b w:val="0"/>
-          <w:color w:val="000000"/>
-          <w:sz w:val="22"/>
-        </w:rPr>
-        <w:fldChar w:fldCharType="separate"/>
-      </w:r>
-      <w:r>
-        <w:rPr>
-          <w:b w:val="0"/>
-          <w:color w:val="000000"/>
-          <w:sz w:val="22"/>
-          <w:lang w:val="fr-FR"/>
-        </w:rPr>
-        <w:t>20</w:t>
-      </w:r>
-      <w:r>
-        <w:rPr>
-          <w:b w:val="0"/>
-          <w:color w:val="000000"/>
-          <w:sz w:val="22"/>
-        </w:rPr>
-        <w:fldChar w:fldCharType="end"/>
-      </w:r>
-      <w:r>
-        <w:rPr>
-          <w:b w:val="0"/>
-          <w:color w:val="000000"/>
-          <w:sz w:val="22"/>
-          <w:lang w:val="fr-FR"/>
-        </w:rPr>
-        <w:t xml:space="preserve"> : Séquence de publication d'un examen</w:t>
-      </w:r>
-      <w:bookmarkEnd w:id="100"/>
+        </w:rPr>
+        <w:t>Figure 17 : Séquence de publication d'un examen</w:t>
+      </w:r>
     </w:p>
     <w:p>
       <w:pPr>
@@ -11201,68 +10429,14 @@
           <w:lang w:val="fr-FR"/>
         </w:rPr>
       </w:pPr>
-      <w:bookmarkStart w:id="101" w:name="_Toc235048704"/>
-      <w:r>
-        <w:rPr>
-          <w:b w:val="0"/>
+      <w:r>
+        <w:rPr>
+          <w:rFonts w:ascii="Times New Roman" w:hAnsi="Times New Roman"/>
           <w:color w:val="000000"/>
           <w:sz w:val="22"/>
-          <w:lang w:val="fr-FR"/>
-        </w:rPr>
-        <w:t xml:space="preserve">Figure </w:t>
-      </w:r>
-      <w:r>
-        <w:rPr>
-          <w:b w:val="0"/>
-          <w:color w:val="000000"/>
-          <w:sz w:val="22"/>
-        </w:rPr>
-        <w:fldChar w:fldCharType="begin"/>
-      </w:r>
-      <w:r>
-        <w:rPr>
-          <w:b w:val="0"/>
-          <w:color w:val="000000"/>
-          <w:sz w:val="22"/>
-          <w:lang w:val="fr-FR"/>
-        </w:rPr>
-        <w:instrText>SEQ Figure \* ARABIC</w:instrText>
-      </w:r>
-      <w:r>
-        <w:rPr>
-          <w:b w:val="0"/>
-          <w:color w:val="000000"/>
-          <w:sz w:val="22"/>
-        </w:rPr>
-        <w:fldChar w:fldCharType="separate"/>
-      </w:r>
-      <w:r>
-        <w:rPr>
-          <w:b w:val="0"/>
-          <w:color w:val="000000"/>
-          <w:sz w:val="22"/>
-          <w:lang w:val="fr-FR"/>
-        </w:rPr>
-        <w:t>21</w:t>
-      </w:r>
-      <w:r>
-        <w:rPr>
-          <w:b w:val="0"/>
-          <w:color w:val="000000"/>
-          <w:sz w:val="22"/>
-        </w:rPr>
-        <w:fldChar w:fldCharType="end"/>
-      </w:r>
-      <w:r>
-        <w:rPr>
-          <w:b w:val="0"/>
-          <w:color w:val="000000"/>
-          <w:sz w:val="22"/>
-          <w:lang w:val="fr-FR"/>
-        </w:rPr>
-        <w:t xml:space="preserve"> : Séquence d'accès étudiant</w:t>
-      </w:r>
-      <w:bookmarkEnd w:id="101"/>
+        </w:rPr>
+        <w:t>Figure 18 : Séquence d'accès étudiant</w:t>
+      </w:r>
     </w:p>
     <w:p>
       <w:pPr>
@@ -11335,68 +10509,14 @@
           <w:lang w:val="fr-FR"/>
         </w:rPr>
       </w:pPr>
-      <w:bookmarkStart w:id="102" w:name="_Toc235048705"/>
-      <w:r>
-        <w:rPr>
-          <w:b w:val="0"/>
+      <w:r>
+        <w:rPr>
+          <w:rFonts w:ascii="Times New Roman" w:hAnsi="Times New Roman"/>
           <w:color w:val="000000"/>
           <w:sz w:val="22"/>
-          <w:lang w:val="fr-FR"/>
-        </w:rPr>
-        <w:t xml:space="preserve">Figure </w:t>
-      </w:r>
-      <w:r>
-        <w:rPr>
-          <w:b w:val="0"/>
-          <w:color w:val="000000"/>
-          <w:sz w:val="22"/>
-        </w:rPr>
-        <w:fldChar w:fldCharType="begin"/>
-      </w:r>
-      <w:r>
-        <w:rPr>
-          <w:b w:val="0"/>
-          <w:color w:val="000000"/>
-          <w:sz w:val="22"/>
-          <w:lang w:val="fr-FR"/>
-        </w:rPr>
-        <w:instrText>SEQ Figure \* ARABIC</w:instrText>
-      </w:r>
-      <w:r>
-        <w:rPr>
-          <w:b w:val="0"/>
-          <w:color w:val="000000"/>
-          <w:sz w:val="22"/>
-        </w:rPr>
-        <w:fldChar w:fldCharType="separate"/>
-      </w:r>
-      <w:r>
-        <w:rPr>
-          <w:b w:val="0"/>
-          <w:color w:val="000000"/>
-          <w:sz w:val="22"/>
-          <w:lang w:val="fr-FR"/>
-        </w:rPr>
-        <w:t>22</w:t>
-      </w:r>
-      <w:r>
-        <w:rPr>
-          <w:b w:val="0"/>
-          <w:color w:val="000000"/>
-          <w:sz w:val="22"/>
-        </w:rPr>
-        <w:fldChar w:fldCharType="end"/>
-      </w:r>
-      <w:r>
-        <w:rPr>
-          <w:b w:val="0"/>
-          <w:color w:val="000000"/>
-          <w:sz w:val="22"/>
-          <w:lang w:val="fr-FR"/>
-        </w:rPr>
-        <w:t xml:space="preserve"> : Séquence d'exécution du code</w:t>
-      </w:r>
-      <w:bookmarkEnd w:id="102"/>
+        </w:rPr>
+        <w:t>Figure 19 : Séquence d'exécution du code</w:t>
+      </w:r>
     </w:p>
     <w:p>
       <w:pPr>
@@ -11470,68 +10590,14 @@
           <w:lang w:val="fr-FR"/>
         </w:rPr>
       </w:pPr>
-      <w:bookmarkStart w:id="103" w:name="_Toc235048706"/>
-      <w:r>
-        <w:rPr>
-          <w:b w:val="0"/>
+      <w:r>
+        <w:rPr>
+          <w:rFonts w:ascii="Times New Roman" w:hAnsi="Times New Roman"/>
           <w:color w:val="000000"/>
           <w:sz w:val="22"/>
-          <w:lang w:val="fr-FR"/>
-        </w:rPr>
-        <w:t xml:space="preserve">Figure </w:t>
-      </w:r>
-      <w:r>
-        <w:rPr>
-          <w:b w:val="0"/>
-          <w:color w:val="000000"/>
-          <w:sz w:val="22"/>
-        </w:rPr>
-        <w:fldChar w:fldCharType="begin"/>
-      </w:r>
-      <w:r>
-        <w:rPr>
-          <w:b w:val="0"/>
-          <w:color w:val="000000"/>
-          <w:sz w:val="22"/>
-          <w:lang w:val="fr-FR"/>
-        </w:rPr>
-        <w:instrText>SEQ Figure \* ARABIC</w:instrText>
-      </w:r>
-      <w:r>
-        <w:rPr>
-          <w:b w:val="0"/>
-          <w:color w:val="000000"/>
-          <w:sz w:val="22"/>
-        </w:rPr>
-        <w:fldChar w:fldCharType="separate"/>
-      </w:r>
-      <w:r>
-        <w:rPr>
-          <w:b w:val="0"/>
-          <w:color w:val="000000"/>
-          <w:sz w:val="22"/>
-          <w:lang w:val="fr-FR"/>
-        </w:rPr>
-        <w:t>23</w:t>
-      </w:r>
-      <w:r>
-        <w:rPr>
-          <w:b w:val="0"/>
-          <w:color w:val="000000"/>
-          <w:sz w:val="22"/>
-        </w:rPr>
-        <w:fldChar w:fldCharType="end"/>
-      </w:r>
-      <w:r>
-        <w:rPr>
-          <w:b w:val="0"/>
-          <w:color w:val="000000"/>
-          <w:sz w:val="22"/>
-          <w:lang w:val="fr-FR"/>
-        </w:rPr>
-        <w:t xml:space="preserve"> : Séquence de soumission et correction</w:t>
-      </w:r>
-      <w:bookmarkEnd w:id="103"/>
+        </w:rPr>
+        <w:t>Figure 20 : Séquence de soumission et correction</w:t>
+      </w:r>
     </w:p>
     <w:p>
       <w:pPr>
@@ -11605,68 +10671,14 @@
           <w:lang w:val="fr-FR"/>
         </w:rPr>
       </w:pPr>
-      <w:bookmarkStart w:id="104" w:name="_Toc235048707"/>
-      <w:r>
-        <w:rPr>
-          <w:b w:val="0"/>
+      <w:r>
+        <w:rPr>
+          <w:rFonts w:ascii="Times New Roman" w:hAnsi="Times New Roman"/>
           <w:color w:val="000000"/>
           <w:sz w:val="22"/>
-          <w:lang w:val="fr-FR"/>
-        </w:rPr>
-        <w:t xml:space="preserve">Figure </w:t>
-      </w:r>
-      <w:r>
-        <w:rPr>
-          <w:b w:val="0"/>
-          <w:color w:val="000000"/>
-          <w:sz w:val="22"/>
-        </w:rPr>
-        <w:fldChar w:fldCharType="begin"/>
-      </w:r>
-      <w:r>
-        <w:rPr>
-          <w:b w:val="0"/>
-          <w:color w:val="000000"/>
-          <w:sz w:val="22"/>
-          <w:lang w:val="fr-FR"/>
-        </w:rPr>
-        <w:instrText>SEQ Figure \* ARABIC</w:instrText>
-      </w:r>
-      <w:r>
-        <w:rPr>
-          <w:b w:val="0"/>
-          <w:color w:val="000000"/>
-          <w:sz w:val="22"/>
-        </w:rPr>
-        <w:fldChar w:fldCharType="separate"/>
-      </w:r>
-      <w:r>
-        <w:rPr>
-          <w:b w:val="0"/>
-          <w:color w:val="000000"/>
-          <w:sz w:val="22"/>
-          <w:lang w:val="fr-FR"/>
-        </w:rPr>
-        <w:t>24</w:t>
-      </w:r>
-      <w:r>
-        <w:rPr>
-          <w:b w:val="0"/>
-          <w:color w:val="000000"/>
-          <w:sz w:val="22"/>
-        </w:rPr>
-        <w:fldChar w:fldCharType="end"/>
-      </w:r>
-      <w:r>
-        <w:rPr>
-          <w:b w:val="0"/>
-          <w:color w:val="000000"/>
-          <w:sz w:val="22"/>
-          <w:lang w:val="fr-FR"/>
-        </w:rPr>
-        <w:t xml:space="preserve"> : Séquence d'enregistrement d'un incident</w:t>
-      </w:r>
-      <w:bookmarkEnd w:id="104"/>
+        </w:rPr>
+        <w:t>Figure 21 : Séquence d'enregistrement d'un incident</w:t>
+      </w:r>
     </w:p>
     <w:p>
       <w:pPr>
@@ -11759,68 +10771,14 @@
           <w:lang w:val="fr-FR"/>
         </w:rPr>
       </w:pPr>
-      <w:bookmarkStart w:id="107" w:name="_Toc235048708"/>
-      <w:r>
-        <w:rPr>
-          <w:b w:val="0"/>
+      <w:r>
+        <w:rPr>
+          <w:rFonts w:ascii="Times New Roman" w:hAnsi="Times New Roman"/>
           <w:color w:val="000000"/>
           <w:sz w:val="22"/>
-          <w:lang w:val="fr-FR"/>
-        </w:rPr>
-        <w:t xml:space="preserve">Figure </w:t>
-      </w:r>
-      <w:r>
-        <w:rPr>
-          <w:b w:val="0"/>
-          <w:color w:val="000000"/>
-          <w:sz w:val="22"/>
-        </w:rPr>
-        <w:fldChar w:fldCharType="begin"/>
-      </w:r>
-      <w:r>
-        <w:rPr>
-          <w:b w:val="0"/>
-          <w:color w:val="000000"/>
-          <w:sz w:val="22"/>
-          <w:lang w:val="fr-FR"/>
-        </w:rPr>
-        <w:instrText>SEQ Figure \* ARABIC</w:instrText>
-      </w:r>
-      <w:r>
-        <w:rPr>
-          <w:b w:val="0"/>
-          <w:color w:val="000000"/>
-          <w:sz w:val="22"/>
-        </w:rPr>
-        <w:fldChar w:fldCharType="separate"/>
-      </w:r>
-      <w:r>
-        <w:rPr>
-          <w:b w:val="0"/>
-          <w:color w:val="000000"/>
-          <w:sz w:val="22"/>
-          <w:lang w:val="fr-FR"/>
-        </w:rPr>
-        <w:t>25</w:t>
-      </w:r>
-      <w:r>
-        <w:rPr>
-          <w:b w:val="0"/>
-          <w:color w:val="000000"/>
-          <w:sz w:val="22"/>
-        </w:rPr>
-        <w:fldChar w:fldCharType="end"/>
-      </w:r>
-      <w:r>
-        <w:rPr>
-          <w:b w:val="0"/>
-          <w:color w:val="000000"/>
-          <w:sz w:val="22"/>
-          <w:lang w:val="fr-FR"/>
-        </w:rPr>
-        <w:t xml:space="preserve"> : Activité accès et salle d'attente</w:t>
-      </w:r>
-      <w:bookmarkEnd w:id="107"/>
+        </w:rPr>
+        <w:t>Figure 22 : Activité accès et salle d'attente</w:t>
+      </w:r>
     </w:p>
     <w:p>
       <w:pPr>
@@ -11878,68 +10836,14 @@
           <w:lang w:val="fr-FR"/>
         </w:rPr>
       </w:pPr>
-      <w:bookmarkStart w:id="108" w:name="_Toc235048709"/>
-      <w:r>
-        <w:rPr>
-          <w:b w:val="0"/>
+      <w:r>
+        <w:rPr>
+          <w:rFonts w:ascii="Times New Roman" w:hAnsi="Times New Roman"/>
           <w:color w:val="000000"/>
           <w:sz w:val="22"/>
-          <w:lang w:val="fr-FR"/>
-        </w:rPr>
-        <w:t xml:space="preserve">Figure </w:t>
-      </w:r>
-      <w:r>
-        <w:rPr>
-          <w:b w:val="0"/>
-          <w:color w:val="000000"/>
-          <w:sz w:val="22"/>
-        </w:rPr>
-        <w:fldChar w:fldCharType="begin"/>
-      </w:r>
-      <w:r>
-        <w:rPr>
-          <w:b w:val="0"/>
-          <w:color w:val="000000"/>
-          <w:sz w:val="22"/>
-          <w:lang w:val="fr-FR"/>
-        </w:rPr>
-        <w:instrText>SEQ Figure \* ARABIC</w:instrText>
-      </w:r>
-      <w:r>
-        <w:rPr>
-          <w:b w:val="0"/>
-          <w:color w:val="000000"/>
-          <w:sz w:val="22"/>
-        </w:rPr>
-        <w:fldChar w:fldCharType="separate"/>
-      </w:r>
-      <w:r>
-        <w:rPr>
-          <w:b w:val="0"/>
-          <w:color w:val="000000"/>
-          <w:sz w:val="22"/>
-          <w:lang w:val="fr-FR"/>
-        </w:rPr>
-        <w:t>26</w:t>
-      </w:r>
-      <w:r>
-        <w:rPr>
-          <w:b w:val="0"/>
-          <w:color w:val="000000"/>
-          <w:sz w:val="22"/>
-        </w:rPr>
-        <w:fldChar w:fldCharType="end"/>
-      </w:r>
-      <w:r>
-        <w:rPr>
-          <w:b w:val="0"/>
-          <w:color w:val="000000"/>
-          <w:sz w:val="22"/>
-          <w:lang w:val="fr-FR"/>
-        </w:rPr>
-        <w:t xml:space="preserve"> : Activité composition et soumission</w:t>
-      </w:r>
-      <w:bookmarkEnd w:id="108"/>
+        </w:rPr>
+        <w:t>Figure 23 : Activité composition et soumission</w:t>
+      </w:r>
     </w:p>
     <w:p>
       <w:pPr>
@@ -12547,57 +11451,6 @@
     </w:p>
     <w:p>
       <w:pPr>
-        <w:pStyle w:val="Titre2"/>
-        <w:rPr>
-          <w:lang w:val="fr-FR"/>
-        </w:rPr>
-      </w:pPr>
-      <w:bookmarkStart w:id="116" w:name="bm_ch3_10"/>
-      <w:bookmarkStart w:id="117" w:name="_Toc235048556"/>
-      <w:r>
-        <w:rPr>
-          <w:rFonts w:ascii="Times New Roman" w:eastAsia="Times New Roman" w:hAnsi="Times New Roman"/>
-          <w:lang w:val="fr-FR"/>
-        </w:rPr>
-        <w:t>3.10 Conclusion partielle</w:t>
-      </w:r>
-      <w:bookmarkEnd w:id="116"/>
-      <w:bookmarkEnd w:id="117"/>
-    </w:p>
-    <w:p>
-      <w:pPr>
-        <w:ind w:firstLine="425"/>
-        <w:jc w:val="both"/>
-        <w:rPr>
-          <w:lang w:val="fr-FR"/>
-        </w:rPr>
-      </w:pPr>
-      <w:r>
-        <w:rPr>
-          <w:rFonts w:ascii="Times New Roman" w:hAnsi="Times New Roman" w:eastAsia="Times New Roman"/>
-          <w:b w:val="0"/>
-          <w:i w:val="0"/>
-          <w:color w:val="000000"/>
-          <w:sz w:val="24"/>
-        </w:rPr>
-        <w:t>Au terme de la conception, Cylentic repose sur une application Next.js, des diagrammes UML calés sur le domaine réel, un déploiement lisible, un cycle de vie d'examen explicite et des flux pour les moments sensibles de l'épreuve. Sécurité et correction restent celles d'un MVP : des gardes techniques compréhensibles, un journal utilisable, une note machine qui ne remplace pas le professeur. Le chapitre suivant peut donc s'évaluer sur des fonctions claires.</w:t>
-      </w:r>
-    </w:p>
-    <w:p>
-      <w:pPr>
-        <w:rPr>
-          <w:lang w:val="fr-FR"/>
-        </w:rPr>
-      </w:pPr>
-      <w:r>
-        <w:rPr>
-          <w:lang w:val="fr-FR"/>
-        </w:rPr>
-        <w:br w:type="page"/>
-      </w:r>
-    </w:p>
-    <w:p>
-      <w:pPr>
         <w:pStyle w:val="Titre1"/>
         <w:rPr>
           <w:lang w:val="fr-FR"/>
@@ -12904,65 +11757,12 @@
       </w:pPr>
       <w:r>
         <w:rPr>
-          <w:b w:val="0"/>
+          <w:rFonts w:ascii="Times New Roman" w:hAnsi="Times New Roman"/>
           <w:color w:val="000000"/>
           <w:sz w:val="22"/>
-          <w:lang w:val="fr-FR"/>
-        </w:rPr>
-        <w:t xml:space="preserve">Figure </w:t>
-      </w:r>
-      <w:r>
-        <w:rPr>
-          <w:b w:val="0"/>
-          <w:color w:val="000000"/>
-          <w:sz w:val="22"/>
-        </w:rPr>
-        <w:fldChar w:fldCharType="begin"/>
-      </w:r>
-      <w:r>
-        <w:rPr>
-          <w:b w:val="0"/>
-          <w:color w:val="000000"/>
-          <w:sz w:val="22"/>
-          <w:lang w:val="fr-FR"/>
-        </w:rPr>
-        <w:instrText>SEQ Figure \* ARABIC</w:instrText>
-      </w:r>
-      <w:r>
-        <w:rPr>
-          <w:b w:val="0"/>
-          <w:color w:val="000000"/>
-          <w:sz w:val="22"/>
-        </w:rPr>
-        <w:fldChar w:fldCharType="separate"/>
-      </w:r>
-      <w:r>
-        <w:rPr>
-          <w:b w:val="0"/>
-          <w:color w:val="000000"/>
-          <w:sz w:val="22"/>
-          <w:lang w:val="fr-FR"/>
-        </w:rPr>
-        <w:t>27</w:t>
-      </w:r>
-      <w:r>
-        <w:rPr>
-          <w:b w:val="0"/>
-          <w:color w:val="000000"/>
-          <w:sz w:val="22"/>
-        </w:rPr>
-        <w:fldChar w:fldCharType="end"/>
-      </w:r>
-      <w:r>
-        <w:rPr>
-          <w:b w:val="0"/>
-          <w:color w:val="000000"/>
-          <w:sz w:val="22"/>
-          <w:lang w:val="fr-FR"/>
-        </w:rPr>
-        <w:t xml:space="preserve"> : Page de connexion multi rôles</w:t>
-      </w:r>
-      <w:bookmarkEnd w:id="131"/>
+        </w:rPr>
+        <w:t>Figure 24 : Page de connexion multi rôles</w:t>
+      </w:r>
     </w:p>
     <w:p>
       <w:pPr>
@@ -13109,68 +11909,14 @@
           <w:lang w:val="fr-FR"/>
         </w:rPr>
       </w:pPr>
-      <w:bookmarkStart w:id="134" w:name="_Toc235048711"/>
-      <w:r>
-        <w:rPr>
-          <w:b w:val="0"/>
+      <w:r>
+        <w:rPr>
+          <w:rFonts w:ascii="Times New Roman" w:hAnsi="Times New Roman"/>
           <w:color w:val="000000"/>
           <w:sz w:val="22"/>
-          <w:lang w:val="fr-FR"/>
-        </w:rPr>
-        <w:t xml:space="preserve">Figure </w:t>
-      </w:r>
-      <w:r>
-        <w:rPr>
-          <w:b w:val="0"/>
-          <w:color w:val="000000"/>
-          <w:sz w:val="22"/>
-        </w:rPr>
-        <w:fldChar w:fldCharType="begin"/>
-      </w:r>
-      <w:r>
-        <w:rPr>
-          <w:b w:val="0"/>
-          <w:color w:val="000000"/>
-          <w:sz w:val="22"/>
-          <w:lang w:val="fr-FR"/>
-        </w:rPr>
-        <w:instrText>SEQ Figure \* ARABIC</w:instrText>
-      </w:r>
-      <w:r>
-        <w:rPr>
-          <w:b w:val="0"/>
-          <w:color w:val="000000"/>
-          <w:sz w:val="22"/>
-        </w:rPr>
-        <w:fldChar w:fldCharType="separate"/>
-      </w:r>
-      <w:r>
-        <w:rPr>
-          <w:b w:val="0"/>
-          <w:color w:val="000000"/>
-          <w:sz w:val="22"/>
-          <w:lang w:val="fr-FR"/>
-        </w:rPr>
-        <w:t>28</w:t>
-      </w:r>
-      <w:r>
-        <w:rPr>
-          <w:b w:val="0"/>
-          <w:color w:val="000000"/>
-          <w:sz w:val="22"/>
-        </w:rPr>
-        <w:fldChar w:fldCharType="end"/>
-      </w:r>
-      <w:r>
-        <w:rPr>
-          <w:b w:val="0"/>
-          <w:color w:val="000000"/>
-          <w:sz w:val="22"/>
-          <w:lang w:val="fr-FR"/>
-        </w:rPr>
-        <w:t xml:space="preserve"> : Espace administrateur d'établissement</w:t>
-      </w:r>
-      <w:bookmarkEnd w:id="134"/>
+        </w:rPr>
+        <w:t>Figure 25 : Espace administrateur d'établissement</w:t>
+      </w:r>
     </w:p>
     <w:p>
       <w:pPr>
@@ -13294,68 +12040,14 @@
           <w:lang w:val="fr-FR"/>
         </w:rPr>
       </w:pPr>
-      <w:bookmarkStart w:id="137" w:name="_Toc235048712"/>
-      <w:r>
-        <w:rPr>
-          <w:b w:val="0"/>
+      <w:r>
+        <w:rPr>
+          <w:rFonts w:ascii="Times New Roman" w:hAnsi="Times New Roman"/>
           <w:color w:val="000000"/>
           <w:sz w:val="22"/>
-          <w:lang w:val="fr-FR"/>
-        </w:rPr>
-        <w:t xml:space="preserve">Figure </w:t>
-      </w:r>
-      <w:r>
-        <w:rPr>
-          <w:b w:val="0"/>
-          <w:color w:val="000000"/>
-          <w:sz w:val="22"/>
-        </w:rPr>
-        <w:fldChar w:fldCharType="begin"/>
-      </w:r>
-      <w:r>
-        <w:rPr>
-          <w:b w:val="0"/>
-          <w:color w:val="000000"/>
-          <w:sz w:val="22"/>
-          <w:lang w:val="fr-FR"/>
-        </w:rPr>
-        <w:instrText>SEQ Figure \* ARABIC</w:instrText>
-      </w:r>
-      <w:r>
-        <w:rPr>
-          <w:b w:val="0"/>
-          <w:color w:val="000000"/>
-          <w:sz w:val="22"/>
-        </w:rPr>
-        <w:fldChar w:fldCharType="separate"/>
-      </w:r>
-      <w:r>
-        <w:rPr>
-          <w:b w:val="0"/>
-          <w:color w:val="000000"/>
-          <w:sz w:val="22"/>
-          <w:lang w:val="fr-FR"/>
-        </w:rPr>
-        <w:t>29</w:t>
-      </w:r>
-      <w:r>
-        <w:rPr>
-          <w:b w:val="0"/>
-          <w:color w:val="000000"/>
-          <w:sz w:val="22"/>
-        </w:rPr>
-        <w:fldChar w:fldCharType="end"/>
-      </w:r>
-      <w:r>
-        <w:rPr>
-          <w:b w:val="0"/>
-          <w:color w:val="000000"/>
-          <w:sz w:val="22"/>
-          <w:lang w:val="fr-FR"/>
-        </w:rPr>
-        <w:t xml:space="preserve"> : Composition d'un examen côté professeur</w:t>
-      </w:r>
-      <w:bookmarkEnd w:id="137"/>
+        </w:rPr>
+        <w:t>Figure 26 : Composition d'un examen côté professeur</w:t>
+      </w:r>
     </w:p>
     <w:p>
       <w:pPr>
@@ -13422,68 +12114,14 @@
           <w:lang w:val="fr-FR"/>
         </w:rPr>
       </w:pPr>
-      <w:bookmarkStart w:id="138" w:name="_Toc235048713"/>
-      <w:r>
-        <w:rPr>
-          <w:b w:val="0"/>
+      <w:r>
+        <w:rPr>
+          <w:rFonts w:ascii="Times New Roman" w:hAnsi="Times New Roman"/>
           <w:color w:val="000000"/>
           <w:sz w:val="22"/>
-          <w:lang w:val="fr-FR"/>
-        </w:rPr>
-        <w:t xml:space="preserve">Figure </w:t>
-      </w:r>
-      <w:r>
-        <w:rPr>
-          <w:b w:val="0"/>
-          <w:color w:val="000000"/>
-          <w:sz w:val="22"/>
-        </w:rPr>
-        <w:fldChar w:fldCharType="begin"/>
-      </w:r>
-      <w:r>
-        <w:rPr>
-          <w:b w:val="0"/>
-          <w:color w:val="000000"/>
-          <w:sz w:val="22"/>
-          <w:lang w:val="fr-FR"/>
-        </w:rPr>
-        <w:instrText>SEQ Figure \* ARABIC</w:instrText>
-      </w:r>
-      <w:r>
-        <w:rPr>
-          <w:b w:val="0"/>
-          <w:color w:val="000000"/>
-          <w:sz w:val="22"/>
-        </w:rPr>
-        <w:fldChar w:fldCharType="separate"/>
-      </w:r>
-      <w:r>
-        <w:rPr>
-          <w:b w:val="0"/>
-          <w:color w:val="000000"/>
-          <w:sz w:val="22"/>
-          <w:lang w:val="fr-FR"/>
-        </w:rPr>
-        <w:t>30</w:t>
-      </w:r>
-      <w:r>
-        <w:rPr>
-          <w:b w:val="0"/>
-          <w:color w:val="000000"/>
-          <w:sz w:val="22"/>
-        </w:rPr>
-        <w:fldChar w:fldCharType="end"/>
-      </w:r>
-      <w:r>
-        <w:rPr>
-          <w:b w:val="0"/>
-          <w:color w:val="000000"/>
-          <w:sz w:val="22"/>
-          <w:lang w:val="fr-FR"/>
-        </w:rPr>
-        <w:t xml:space="preserve"> : Publication et code d'accès d'examen</w:t>
-      </w:r>
-      <w:bookmarkEnd w:id="138"/>
+        </w:rPr>
+        <w:t>Figure 27 : Publication et code d'accès d'examen</w:t>
+      </w:r>
     </w:p>
     <w:p>
       <w:pPr>
@@ -13551,68 +12189,14 @@
           <w:lang w:val="fr-FR"/>
         </w:rPr>
       </w:pPr>
-      <w:bookmarkStart w:id="139" w:name="_Toc235048714"/>
-      <w:r>
-        <w:rPr>
-          <w:b w:val="0"/>
+      <w:r>
+        <w:rPr>
+          <w:rFonts w:ascii="Times New Roman" w:hAnsi="Times New Roman"/>
           <w:color w:val="000000"/>
           <w:sz w:val="22"/>
-          <w:lang w:val="fr-FR"/>
-        </w:rPr>
-        <w:t xml:space="preserve">Figure </w:t>
-      </w:r>
-      <w:r>
-        <w:rPr>
-          <w:b w:val="0"/>
-          <w:color w:val="000000"/>
-          <w:sz w:val="22"/>
-        </w:rPr>
-        <w:fldChar w:fldCharType="begin"/>
-      </w:r>
-      <w:r>
-        <w:rPr>
-          <w:b w:val="0"/>
-          <w:color w:val="000000"/>
-          <w:sz w:val="22"/>
-          <w:lang w:val="fr-FR"/>
-        </w:rPr>
-        <w:instrText>SEQ Figure \* ARABIC</w:instrText>
-      </w:r>
-      <w:r>
-        <w:rPr>
-          <w:b w:val="0"/>
-          <w:color w:val="000000"/>
-          <w:sz w:val="22"/>
-        </w:rPr>
-        <w:fldChar w:fldCharType="separate"/>
-      </w:r>
-      <w:r>
-        <w:rPr>
-          <w:b w:val="0"/>
-          <w:color w:val="000000"/>
-          <w:sz w:val="22"/>
-          <w:lang w:val="fr-FR"/>
-        </w:rPr>
-        <w:t>31</w:t>
-      </w:r>
-      <w:r>
-        <w:rPr>
-          <w:b w:val="0"/>
-          <w:color w:val="000000"/>
-          <w:sz w:val="22"/>
-        </w:rPr>
-        <w:fldChar w:fldCharType="end"/>
-      </w:r>
-      <w:r>
-        <w:rPr>
-          <w:b w:val="0"/>
-          <w:color w:val="000000"/>
-          <w:sz w:val="22"/>
-          <w:lang w:val="fr-FR"/>
-        </w:rPr>
-        <w:t xml:space="preserve"> : Suivi live des participations</w:t>
-      </w:r>
-      <w:bookmarkEnd w:id="139"/>
+        </w:rPr>
+        <w:t>Figure 28 : Suivi live des participations</w:t>
+      </w:r>
     </w:p>
     <w:p>
       <w:pPr>
@@ -13679,68 +12263,14 @@
           <w:lang w:val="fr-FR"/>
         </w:rPr>
       </w:pPr>
-      <w:bookmarkStart w:id="140" w:name="_Toc235048715"/>
-      <w:r>
-        <w:rPr>
-          <w:b w:val="0"/>
+      <w:r>
+        <w:rPr>
+          <w:rFonts w:ascii="Times New Roman" w:hAnsi="Times New Roman"/>
           <w:color w:val="000000"/>
           <w:sz w:val="22"/>
-          <w:lang w:val="fr-FR"/>
-        </w:rPr>
-        <w:t xml:space="preserve">Figure </w:t>
-      </w:r>
-      <w:r>
-        <w:rPr>
-          <w:b w:val="0"/>
-          <w:color w:val="000000"/>
-          <w:sz w:val="22"/>
-        </w:rPr>
-        <w:fldChar w:fldCharType="begin"/>
-      </w:r>
-      <w:r>
-        <w:rPr>
-          <w:b w:val="0"/>
-          <w:color w:val="000000"/>
-          <w:sz w:val="22"/>
-          <w:lang w:val="fr-FR"/>
-        </w:rPr>
-        <w:instrText>SEQ Figure \* ARABIC</w:instrText>
-      </w:r>
-      <w:r>
-        <w:rPr>
-          <w:b w:val="0"/>
-          <w:color w:val="000000"/>
-          <w:sz w:val="22"/>
-        </w:rPr>
-        <w:fldChar w:fldCharType="separate"/>
-      </w:r>
-      <w:r>
-        <w:rPr>
-          <w:b w:val="0"/>
-          <w:color w:val="000000"/>
-          <w:sz w:val="22"/>
-          <w:lang w:val="fr-FR"/>
-        </w:rPr>
-        <w:t>32</w:t>
-      </w:r>
-      <w:r>
-        <w:rPr>
-          <w:b w:val="0"/>
-          <w:color w:val="000000"/>
-          <w:sz w:val="22"/>
-        </w:rPr>
-        <w:fldChar w:fldCharType="end"/>
-      </w:r>
-      <w:r>
-        <w:rPr>
-          <w:b w:val="0"/>
-          <w:color w:val="000000"/>
-          <w:sz w:val="22"/>
-          <w:lang w:val="fr-FR"/>
-        </w:rPr>
-        <w:t xml:space="preserve"> : Résultats et exports professeur</w:t>
-      </w:r>
-      <w:bookmarkEnd w:id="140"/>
+        </w:rPr>
+        <w:t>Figure 29 : Résultats et exports professeur</w:t>
+      </w:r>
     </w:p>
     <w:p>
       <w:pPr>
@@ -13855,68 +12385,14 @@
           <w:lang w:val="fr-FR"/>
         </w:rPr>
       </w:pPr>
-      <w:bookmarkStart w:id="143" w:name="_Toc235048716"/>
-      <w:r>
-        <w:rPr>
-          <w:b w:val="0"/>
+      <w:r>
+        <w:rPr>
+          <w:rFonts w:ascii="Times New Roman" w:hAnsi="Times New Roman"/>
           <w:color w:val="000000"/>
           <w:sz w:val="22"/>
-          <w:lang w:val="fr-FR"/>
-        </w:rPr>
-        <w:t xml:space="preserve">Figure </w:t>
-      </w:r>
-      <w:r>
-        <w:rPr>
-          <w:b w:val="0"/>
-          <w:color w:val="000000"/>
-          <w:sz w:val="22"/>
-        </w:rPr>
-        <w:fldChar w:fldCharType="begin"/>
-      </w:r>
-      <w:r>
-        <w:rPr>
-          <w:b w:val="0"/>
-          <w:color w:val="000000"/>
-          <w:sz w:val="22"/>
-          <w:lang w:val="fr-FR"/>
-        </w:rPr>
-        <w:instrText>SEQ Figure \* ARABIC</w:instrText>
-      </w:r>
-      <w:r>
-        <w:rPr>
-          <w:b w:val="0"/>
-          <w:color w:val="000000"/>
-          <w:sz w:val="22"/>
-        </w:rPr>
-        <w:fldChar w:fldCharType="separate"/>
-      </w:r>
-      <w:r>
-        <w:rPr>
-          <w:b w:val="0"/>
-          <w:color w:val="000000"/>
-          <w:sz w:val="22"/>
-          <w:lang w:val="fr-FR"/>
-        </w:rPr>
-        <w:t>33</w:t>
-      </w:r>
-      <w:r>
-        <w:rPr>
-          <w:b w:val="0"/>
-          <w:color w:val="000000"/>
-          <w:sz w:val="22"/>
-        </w:rPr>
-        <w:fldChar w:fldCharType="end"/>
-      </w:r>
-      <w:r>
-        <w:rPr>
-          <w:b w:val="0"/>
-          <w:color w:val="000000"/>
-          <w:sz w:val="22"/>
-          <w:lang w:val="fr-FR"/>
-        </w:rPr>
-        <w:t xml:space="preserve"> : Consignes et activation du plein écran</w:t>
-      </w:r>
-      <w:bookmarkEnd w:id="143"/>
+        </w:rPr>
+        <w:t>Figure 30 : Consignes et activation du plein écran</w:t>
+      </w:r>
     </w:p>
     <w:p>
       <w:pPr>
@@ -13977,68 +12453,14 @@
           <w:lang w:val="fr-FR"/>
         </w:rPr>
       </w:pPr>
-      <w:bookmarkStart w:id="144" w:name="_Toc235048717"/>
-      <w:r>
-        <w:rPr>
-          <w:b w:val="0"/>
+      <w:r>
+        <w:rPr>
+          <w:rFonts w:ascii="Times New Roman" w:hAnsi="Times New Roman"/>
           <w:color w:val="000000"/>
           <w:sz w:val="22"/>
-          <w:lang w:val="fr-FR"/>
-        </w:rPr>
-        <w:t xml:space="preserve">Figure </w:t>
-      </w:r>
-      <w:r>
-        <w:rPr>
-          <w:b w:val="0"/>
-          <w:color w:val="000000"/>
-          <w:sz w:val="22"/>
-        </w:rPr>
-        <w:fldChar w:fldCharType="begin"/>
-      </w:r>
-      <w:r>
-        <w:rPr>
-          <w:b w:val="0"/>
-          <w:color w:val="000000"/>
-          <w:sz w:val="22"/>
-          <w:lang w:val="fr-FR"/>
-        </w:rPr>
-        <w:instrText>SEQ Figure \* ARABIC</w:instrText>
-      </w:r>
-      <w:r>
-        <w:rPr>
-          <w:b w:val="0"/>
-          <w:color w:val="000000"/>
-          <w:sz w:val="22"/>
-        </w:rPr>
-        <w:fldChar w:fldCharType="separate"/>
-      </w:r>
-      <w:r>
-        <w:rPr>
-          <w:b w:val="0"/>
-          <w:color w:val="000000"/>
-          <w:sz w:val="22"/>
-          <w:lang w:val="fr-FR"/>
-        </w:rPr>
-        <w:t>34</w:t>
-      </w:r>
-      <w:r>
-        <w:rPr>
-          <w:b w:val="0"/>
-          <w:color w:val="000000"/>
-          <w:sz w:val="22"/>
-        </w:rPr>
-        <w:fldChar w:fldCharType="end"/>
-      </w:r>
-      <w:r>
-        <w:rPr>
-          <w:b w:val="0"/>
-          <w:color w:val="000000"/>
-          <w:sz w:val="22"/>
-          <w:lang w:val="fr-FR"/>
-        </w:rPr>
-        <w:t xml:space="preserve"> : Salle d'attente avant le démarrage de l'examen</w:t>
-      </w:r>
-      <w:bookmarkEnd w:id="144"/>
+        </w:rPr>
+        <w:t>Figure 31 : Salle d'attente avant le démarrage de l'examen</w:t>
+      </w:r>
     </w:p>
     <w:p>
       <w:pPr>
@@ -14116,68 +12538,14 @@
           <w:lang w:val="fr-FR"/>
         </w:rPr>
       </w:pPr>
-      <w:bookmarkStart w:id="145" w:name="_Toc235048718"/>
-      <w:r>
-        <w:rPr>
-          <w:b w:val="0"/>
+      <w:r>
+        <w:rPr>
+          <w:rFonts w:ascii="Times New Roman" w:hAnsi="Times New Roman"/>
           <w:color w:val="000000"/>
           <w:sz w:val="22"/>
-          <w:lang w:val="fr-FR"/>
-        </w:rPr>
-        <w:t xml:space="preserve">Figure </w:t>
-      </w:r>
-      <w:r>
-        <w:rPr>
-          <w:b w:val="0"/>
-          <w:color w:val="000000"/>
-          <w:sz w:val="22"/>
-        </w:rPr>
-        <w:fldChar w:fldCharType="begin"/>
-      </w:r>
-      <w:r>
-        <w:rPr>
-          <w:b w:val="0"/>
-          <w:color w:val="000000"/>
-          <w:sz w:val="22"/>
-          <w:lang w:val="fr-FR"/>
-        </w:rPr>
-        <w:instrText>SEQ Figure \* ARABIC</w:instrText>
-      </w:r>
-      <w:r>
-        <w:rPr>
-          <w:b w:val="0"/>
-          <w:color w:val="000000"/>
-          <w:sz w:val="22"/>
-        </w:rPr>
-        <w:fldChar w:fldCharType="separate"/>
-      </w:r>
-      <w:r>
-        <w:rPr>
-          <w:b w:val="0"/>
-          <w:color w:val="000000"/>
-          <w:sz w:val="22"/>
-          <w:lang w:val="fr-FR"/>
-        </w:rPr>
-        <w:t>35</w:t>
-      </w:r>
-      <w:r>
-        <w:rPr>
-          <w:b w:val="0"/>
-          <w:color w:val="000000"/>
-          <w:sz w:val="22"/>
-        </w:rPr>
-        <w:fldChar w:fldCharType="end"/>
-      </w:r>
-      <w:r>
-        <w:rPr>
-          <w:b w:val="0"/>
-          <w:color w:val="000000"/>
-          <w:sz w:val="22"/>
-          <w:lang w:val="fr-FR"/>
-        </w:rPr>
-        <w:t xml:space="preserve"> : Environnement de composition pendant l'épreuve</w:t>
-      </w:r>
-      <w:bookmarkEnd w:id="145"/>
+        </w:rPr>
+        <w:t>Figure 32 : Environnement de composition pendant l'épreuve</w:t>
+      </w:r>
     </w:p>
     <w:p>
       <w:pPr>
@@ -14346,68 +12714,14 @@
           <w:lang w:val="fr-FR"/>
         </w:rPr>
       </w:pPr>
-      <w:bookmarkStart w:id="150" w:name="_Toc235048719"/>
-      <w:r>
-        <w:rPr>
-          <w:b w:val="0"/>
+      <w:r>
+        <w:rPr>
+          <w:rFonts w:ascii="Times New Roman" w:hAnsi="Times New Roman"/>
           <w:color w:val="000000"/>
           <w:sz w:val="22"/>
-          <w:lang w:val="fr-FR"/>
-        </w:rPr>
-        <w:t xml:space="preserve">Figure </w:t>
-      </w:r>
-      <w:r>
-        <w:rPr>
-          <w:b w:val="0"/>
-          <w:color w:val="000000"/>
-          <w:sz w:val="22"/>
-        </w:rPr>
-        <w:fldChar w:fldCharType="begin"/>
-      </w:r>
-      <w:r>
-        <w:rPr>
-          <w:b w:val="0"/>
-          <w:color w:val="000000"/>
-          <w:sz w:val="22"/>
-          <w:lang w:val="fr-FR"/>
-        </w:rPr>
-        <w:instrText>SEQ Figure \* ARABIC</w:instrText>
-      </w:r>
-      <w:r>
-        <w:rPr>
-          <w:b w:val="0"/>
-          <w:color w:val="000000"/>
-          <w:sz w:val="22"/>
-        </w:rPr>
-        <w:fldChar w:fldCharType="separate"/>
-      </w:r>
-      <w:r>
-        <w:rPr>
-          <w:b w:val="0"/>
-          <w:color w:val="000000"/>
-          <w:sz w:val="22"/>
-          <w:lang w:val="fr-FR"/>
-        </w:rPr>
-        <w:t>36</w:t>
-      </w:r>
-      <w:r>
-        <w:rPr>
-          <w:b w:val="0"/>
-          <w:color w:val="000000"/>
-          <w:sz w:val="22"/>
-        </w:rPr>
-        <w:fldChar w:fldCharType="end"/>
-      </w:r>
-      <w:r>
-        <w:rPr>
-          <w:b w:val="0"/>
-          <w:color w:val="000000"/>
-          <w:sz w:val="22"/>
-          <w:lang w:val="fr-FR"/>
-        </w:rPr>
-        <w:t xml:space="preserve"> : Page d'accueil Cylentic</w:t>
-      </w:r>
-      <w:bookmarkEnd w:id="150"/>
+        </w:rPr>
+        <w:t>Figure 33 : Page d'accueil Cylentic</w:t>
+      </w:r>
     </w:p>
     <w:p>
       <w:pPr>
@@ -14489,22 +12803,278 @@
     </w:p>
     <w:p>
       <w:pPr>
+        <w:pStyle w:val="Titre1"/>
+        <w:rPr>
+          <w:lang w:val="fr-FR"/>
+        </w:rPr>
+      </w:pPr>
+      <w:bookmarkStart w:id="157" w:name="bm_ch5"/>
+      <w:bookmarkStart w:id="158" w:name="_Toc235048571"/>
+      <w:bookmarkStart w:id="159" w:name="_Toc235048679"/>
+      <w:r>
+        <w:rPr>
+          <w:rFonts w:ascii="Times New Roman" w:eastAsia="Times New Roman" w:hAnsi="Times New Roman"/>
+          <w:lang w:val="fr-FR"/>
+        </w:rPr>
+        <w:lastRenderedPageBreak/>
+        <w:t>Chapitre 5 : Tests, résultats, limites et perspectives</w:t>
+      </w:r>
+      <w:bookmarkEnd w:id="157"/>
+      <w:bookmarkEnd w:id="158"/>
+      <w:bookmarkEnd w:id="159"/>
+    </w:p>
+    <w:p>
+      <w:pPr>
         <w:pStyle w:val="Titre2"/>
         <w:rPr>
           <w:lang w:val="fr-FR"/>
         </w:rPr>
       </w:pPr>
-      <w:bookmarkStart w:id="155" w:name="bm_ch4_7"/>
-      <w:bookmarkStart w:id="156" w:name="_Toc235048570"/>
+      <w:bookmarkStart w:id="160" w:name="bm_ch5_1"/>
+      <w:bookmarkStart w:id="161" w:name="_Toc235048572"/>
       <w:r>
         <w:rPr>
           <w:rFonts w:ascii="Times New Roman" w:eastAsia="Times New Roman" w:hAnsi="Times New Roman"/>
           <w:lang w:val="fr-FR"/>
         </w:rPr>
-        <w:t>4.7 Conclusion partielle</w:t>
-      </w:r>
-      <w:bookmarkEnd w:id="155"/>
-      <w:bookmarkEnd w:id="156"/>
+        <w:t>5.1 Stratégie de tests</w:t>
+      </w:r>
+      <w:bookmarkEnd w:id="160"/>
+      <w:bookmarkEnd w:id="161"/>
+    </w:p>
+    <w:p>
+      <w:pPr>
+        <w:ind w:firstLine="425"/>
+        <w:jc w:val="both"/>
+        <w:rPr>
+          <w:lang w:val="fr-FR"/>
+        </w:rPr>
+      </w:pPr>
+      <w:r>
+        <w:rPr>
+          <w:color w:val="000000"/>
+          <w:lang w:val="fr-FR"/>
+        </w:rPr>
+        <w:t>La campagne cherchait à confirmer les exigences fonctionnelles critiques, à contrôler les règles métier, à vérifier la non régression technique via le build TypeScript, et à s'assurer du bon fonctionnement multi postes en HTTP local. Les tests unitaires automatisés exhaustifs n'ont pas été l'axe principal sous contrainte de temps. L'équipe a privilégié des scénarios bout en bout, plus représentatifs d'un livrable démontrable.</w:t>
+      </w:r>
+    </w:p>
+    <w:p>
+      <w:pPr>
+        <w:ind w:firstLine="425"/>
+        <w:jc w:val="both"/>
+        <w:rPr>
+          <w:lang w:val="fr-FR"/>
+        </w:rPr>
+      </w:pPr>
+      <w:r>
+        <w:rPr>
+          <w:color w:val="000000"/>
+          <w:lang w:val="fr-FR"/>
+        </w:rPr>
+        <w:t>La validation a donc combiné le build Next.js, des parcours manuels rôle par rôle, des essais de bornes sur les règles métier, des tests multi appareils sur le réseau local, et des vérifications après chaque correctif majeur (cookie Secure, Decimal, synchronisation du timer). Les jeux de données s'appuyaient sur un établissement de démonstration, des comptes types, des examens dans plusieurs états et des CSV volontairement valides ou invalides.</w:t>
+      </w:r>
+    </w:p>
+    <w:p>
+      <w:pPr>
+        <w:pStyle w:val="Titre2"/>
+        <w:rPr>
+          <w:lang w:val="fr-FR"/>
+        </w:rPr>
+      </w:pPr>
+      <w:bookmarkStart w:id="162" w:name="bm_ch5_2"/>
+      <w:bookmarkStart w:id="163" w:name="_Toc235048573"/>
+      <w:r>
+        <w:rPr>
+          <w:rFonts w:ascii="Times New Roman" w:eastAsia="Times New Roman" w:hAnsi="Times New Roman"/>
+          <w:lang w:val="fr-FR"/>
+        </w:rPr>
+        <w:t>5.2 Jeux de tests et résultats</w:t>
+      </w:r>
+      <w:bookmarkEnd w:id="162"/>
+      <w:bookmarkEnd w:id="163"/>
+    </w:p>
+    <w:p>
+      <w:pPr>
+        <w:pStyle w:val="Titre3"/>
+        <w:rPr>
+          <w:lang w:val="fr-FR"/>
+        </w:rPr>
+      </w:pPr>
+      <w:bookmarkStart w:id="164" w:name="5_2_1_Authentification_et_acc_s"/>
+      <w:bookmarkStart w:id="165" w:name="_Toc235048574"/>
+      <w:r>
+        <w:rPr>
+          <w:rFonts w:ascii="Times New Roman" w:eastAsia="Times New Roman" w:hAnsi="Times New Roman"/>
+          <w:lang w:val="fr-FR"/>
+        </w:rPr>
+        <w:t>5.2.1 Authentification et accès</w:t>
+      </w:r>
+      <w:bookmarkEnd w:id="164"/>
+      <w:bookmarkEnd w:id="165"/>
+    </w:p>
+    <w:p>
+      <w:pPr>
+        <w:ind w:firstLine="425"/>
+        <w:jc w:val="both"/>
+        <w:rPr>
+          <w:lang w:val="fr-FR"/>
+        </w:rPr>
+      </w:pPr>
+      <w:r>
+        <w:rPr>
+          <w:color w:val="000000"/>
+          <w:lang w:val="fr-FR"/>
+        </w:rPr>
+        <w:t>Les essais de connexion montrent un comportement stable pour les différents rôles lorsque les identifiants sont corrects. Un mauvais mot de passe est rejeté. Un étudiant sans code d'examen ne peut pas démarrer le parcours d'épreuve. Le middleware empêche un rôle d'accéder aux espaces d'un autre. La déconnexion vide correctement le cookie. L'accès depuis un autre appareil en HTTP fonctionne après le correctif Secure.</w:t>
+      </w:r>
+    </w:p>
+    <w:p>
+      <w:pPr>
+        <w:pStyle w:val="Titre3"/>
+        <w:rPr>
+          <w:lang w:val="fr-FR"/>
+        </w:rPr>
+      </w:pPr>
+      <w:bookmarkStart w:id="166" w:name="5_2_2_Administration"/>
+      <w:bookmarkStart w:id="167" w:name="_Toc235048575"/>
+      <w:r>
+        <w:rPr>
+          <w:rFonts w:ascii="Times New Roman" w:eastAsia="Times New Roman" w:hAnsi="Times New Roman"/>
+          <w:lang w:val="fr-FR"/>
+        </w:rPr>
+        <w:t>5.2.2 Administration</w:t>
+      </w:r>
+      <w:bookmarkEnd w:id="166"/>
+      <w:bookmarkEnd w:id="167"/>
+    </w:p>
+    <w:p>
+      <w:pPr>
+        <w:ind w:firstLine="425"/>
+        <w:jc w:val="both"/>
+        <w:rPr>
+          <w:lang w:val="fr-FR"/>
+        </w:rPr>
+      </w:pPr>
+      <w:r>
+        <w:rPr>
+          <w:color w:val="000000"/>
+          <w:lang w:val="fr-FR"/>
+        </w:rPr>
+        <w:t>La création de classes et d'étudiants manuels fonctionne, avec génération d'identifiants. L'import CSV crée les lignes valides et rejette clairement les classes inconnues ou les emails incorrects, en laissant un rapport exploitable. La limite de deux administrateurs actifs est respectée, tout comme l'interdiction de se désactiver soi-même. La promotion de rentrée met à jour les profils et l'année active. Le formulaire de contact de la landing enregistre une notification visible côté Super Admin.</w:t>
+      </w:r>
+    </w:p>
+    <w:p>
+      <w:pPr>
+        <w:pStyle w:val="Titre3"/>
+        <w:rPr>
+          <w:lang w:val="fr-FR"/>
+        </w:rPr>
+      </w:pPr>
+      <w:bookmarkStart w:id="168" w:name="5_2_3_Examens_c_t__professeur"/>
+      <w:bookmarkStart w:id="169" w:name="_Toc235048576"/>
+      <w:r>
+        <w:rPr>
+          <w:rFonts w:ascii="Times New Roman" w:eastAsia="Times New Roman" w:hAnsi="Times New Roman"/>
+          <w:lang w:val="fr-FR"/>
+        </w:rPr>
+        <w:t>5.2.3 Examens côté professeur</w:t>
+      </w:r>
+      <w:bookmarkEnd w:id="168"/>
+      <w:bookmarkEnd w:id="169"/>
+    </w:p>
+    <w:p>
+      <w:pPr>
+        <w:ind w:firstLine="425"/>
+        <w:jc w:val="both"/>
+        <w:rPr>
+          <w:lang w:val="fr-FR"/>
+        </w:rPr>
+      </w:pPr>
+      <w:r>
+        <w:rPr>
+          <w:color w:val="000000"/>
+          <w:lang w:val="fr-FR"/>
+        </w:rPr>
+        <w:t xml:space="preserve">Un examen sans exercice ne peut pas être publié. Avec du contenu, la publication génère le code d'accès et permet le mode présentation. La duplication produit un nouveau </w:t>
+      </w:r>
+      <w:r>
+        <w:rPr>
+          <w:color w:val="000000"/>
+          <w:lang w:val="fr-FR"/>
+        </w:rPr>
+        <w:lastRenderedPageBreak/>
+        <w:t>brouillon complet. L'édition du planning sur un examen publié se répercute en salle d'attente et en composition. L'ajout d'exercices reste possible avant le démarrage et est refusé après. Le suivi live, les exports et l'ajustement manuel des notes se comportent conformément aux règles prévues.</w:t>
+      </w:r>
+    </w:p>
+    <w:p>
+      <w:pPr>
+        <w:pStyle w:val="Titre3"/>
+        <w:rPr>
+          <w:lang w:val="fr-FR"/>
+        </w:rPr>
+      </w:pPr>
+      <w:bookmarkStart w:id="170" w:name="5_2_4_Parcours__tudiant_et_contr_les_de_"/>
+      <w:bookmarkStart w:id="171" w:name="_Toc235048577"/>
+      <w:r>
+        <w:rPr>
+          <w:rFonts w:ascii="Times New Roman" w:eastAsia="Times New Roman" w:hAnsi="Times New Roman"/>
+          <w:lang w:val="fr-FR"/>
+        </w:rPr>
+        <w:t>5.2.4 Parcours étudiant et contrôles de passation</w:t>
+      </w:r>
+      <w:bookmarkEnd w:id="170"/>
+      <w:bookmarkEnd w:id="171"/>
+    </w:p>
+    <w:p>
+      <w:pPr>
+        <w:ind w:firstLine="425"/>
+        <w:jc w:val="both"/>
+        <w:rPr>
+          <w:lang w:val="fr-FR"/>
+        </w:rPr>
+      </w:pPr>
+      <w:r>
+        <w:rPr>
+          <w:color w:val="000000"/>
+          <w:lang w:val="fr-FR"/>
+        </w:rPr>
+        <w:t>Un code d'examen invalide est refusé, avec protection contre les tentatives excessives. Sans plein écran, l'étudiant reste bloqué aux consignes. Au démarrage, la bascule vers la composition est automatique. L'exécution sandbox, l'autosave, la navigation entre exercices et la soumission manuelle ou automatique au timer fonctionnent. Les incidents de plein écran incrémentent un compteur et conduisent à l'exclusion au second incident. Le changement d'onglet est journalisé. Après soumission, la reconnexion est bloquée.</w:t>
+      </w:r>
+    </w:p>
+    <w:p>
+      <w:pPr>
+        <w:ind w:firstLine="425"/>
+        <w:jc w:val="both"/>
+        <w:rPr>
+          <w:lang w:val="fr-FR"/>
+        </w:rPr>
+      </w:pPr>
+      <w:r>
+        <w:rPr>
+          <w:color w:val="000000"/>
+          <w:lang w:val="fr-FR"/>
+        </w:rPr>
+        <w:t>Au total, la campagne manuelle ciblée a porté sur trente neuf cas critiques (authentification, administration, professeur, étudiant). Tous sont passés après les correctifs majeurs. Ce résultat doit être lu comme une validation fonctionnelle du périmètre MVP, et non comme une couverture automatisée exhaustive.</w:t>
+      </w:r>
+    </w:p>
+    <w:p>
+      <w:pPr>
+        <w:pStyle w:val="Titre2"/>
+        <w:rPr>
+          <w:lang w:val="fr-FR"/>
+        </w:rPr>
+      </w:pPr>
+      <w:bookmarkStart w:id="172" w:name="bm_ch5_3"/>
+      <w:bookmarkStart w:id="173" w:name="_Toc235048578"/>
+      <w:r>
+        <w:rPr>
+          <w:rFonts w:ascii="Times New Roman" w:eastAsia="Times New Roman" w:hAnsi="Times New Roman"/>
+          <w:lang w:val="fr-FR"/>
+        </w:rPr>
+        <w:t>5.3 Discussion des résultats</w:t>
+      </w:r>
+      <w:bookmarkEnd w:id="172"/>
+      <w:bookmarkEnd w:id="173"/>
     </w:p>
     <w:p>
       <w:pPr>
@@ -14522,62 +13092,8 @@
           <w:color w:val="000000"/>
           <w:sz w:val="24"/>
         </w:rPr>
-        <w:t>Le MVP forme aujourd'hui une chaîne complète, assez intégrée pour une démonstration et pour des essais pilotes. Nous avons d'abord solidifié les parcours critiques (authentification, examen, contrôles de passation, correction, exports), plutôt qu'une infrastructure temps réel complète. Redis, les workers et le multi langage restent pour la suite.</w:t>
-      </w:r>
-    </w:p>
-    <w:p>
-      <w:pPr>
-        <w:rPr>
-          <w:lang w:val="fr-FR"/>
-        </w:rPr>
-      </w:pPr>
-      <w:r>
-        <w:rPr>
-          <w:lang w:val="fr-FR"/>
-        </w:rPr>
-        <w:br w:type="page"/>
-      </w:r>
-    </w:p>
-    <w:p>
-      <w:pPr>
-        <w:pStyle w:val="Titre1"/>
-        <w:rPr>
-          <w:lang w:val="fr-FR"/>
-        </w:rPr>
-      </w:pPr>
-      <w:bookmarkStart w:id="157" w:name="bm_ch5"/>
-      <w:bookmarkStart w:id="158" w:name="_Toc235048571"/>
-      <w:bookmarkStart w:id="159" w:name="_Toc235048679"/>
-      <w:r>
-        <w:rPr>
-          <w:rFonts w:ascii="Times New Roman" w:eastAsia="Times New Roman" w:hAnsi="Times New Roman"/>
-          <w:lang w:val="fr-FR"/>
-        </w:rPr>
-        <w:lastRenderedPageBreak/>
-        <w:t>Chapitre 5 : Tests, résultats, limites et perspectives</w:t>
-      </w:r>
-      <w:bookmarkEnd w:id="157"/>
-      <w:bookmarkEnd w:id="158"/>
-      <w:bookmarkEnd w:id="159"/>
-    </w:p>
-    <w:p>
-      <w:pPr>
-        <w:pStyle w:val="Titre2"/>
-        <w:rPr>
-          <w:lang w:val="fr-FR"/>
-        </w:rPr>
-      </w:pPr>
-      <w:bookmarkStart w:id="160" w:name="bm_ch5_1"/>
-      <w:bookmarkStart w:id="161" w:name="_Toc235048572"/>
-      <w:r>
-        <w:rPr>
-          <w:rFonts w:ascii="Times New Roman" w:eastAsia="Times New Roman" w:hAnsi="Times New Roman"/>
-          <w:lang w:val="fr-FR"/>
-        </w:rPr>
-        <w:t>5.1 Stratégie de tests</w:t>
-      </w:r>
-      <w:bookmarkEnd w:id="160"/>
-      <w:bookmarkEnd w:id="161"/>
+        <w:t>On dispose désormais d'un parcours d'examen crédible, de la salle d'attente jusqu'à la soumission sous contraintes. La correction automatique par tests unitaires fait gagner du temps au professeur sans lui retirer la main sur la note. Les incidents horodatés, la présence numérique et le journal d'activité donnent une traçabilité concrète. L'outil tourne en salle sur réseau local. L'administration scolaire et les écrans produit (landing, contact, espaces par rôle) complètent un livrable qu'on peut montrer de bout en bout.</w:t>
+      </w:r>
     </w:p>
     <w:p>
       <w:pPr>
@@ -14592,8 +13108,28 @@
           <w:color w:val="000000"/>
           <w:lang w:val="fr-FR"/>
         </w:rPr>
-        <w:t>La campagne cherchait à confirmer les exigences fonctionnelles critiques, à contrôler les règles métier, à vérifier la non régression technique via le build TypeScript, et à s'assurer du bon fonctionnement multi postes en HTTP local. Les tests unitaires automatisés exhaustifs n'ont pas été l'axe principal sous contrainte de temps. L'équipe a privilégié des scénarios bout en bout, plus représentatifs d'un livrable démontrable.</w:t>
-      </w:r>
+        <w:t>Trois anomalies ont particulièrement pesé avant d'être corrigées. Le cookie Secure bloquait toutes les connexions locales. Les props Decimal cassaient des composants clients. Le timer de composition n'évoluait pas après une modification professeur sans polling de synchronisation. Ces points confirment que la valeur du MVP tient autant aux parcours qu'à la robustesse des détails d'exécution en salle.</w:t>
+      </w:r>
+    </w:p>
+    <w:p>
+      <w:pPr>
+        <w:pStyle w:val="Titre2"/>
+        <w:rPr>
+          <w:lang w:val="fr-FR"/>
+        </w:rPr>
+      </w:pPr>
+      <w:bookmarkStart w:id="174" w:name="bm_ch5_4"/>
+      <w:bookmarkStart w:id="175" w:name="_Toc235048579"/>
+      <w:r>
+        <w:rPr>
+          <w:rFonts w:ascii="Times New Roman" w:eastAsia="Times New Roman" w:hAnsi="Times New Roman"/>
+          <w:lang w:val="fr-FR"/>
+        </w:rPr>
+        <w:lastRenderedPageBreak/>
+        <w:t>5.4 Limites et risques résiduels</w:t>
+      </w:r>
+      <w:bookmarkEnd w:id="174"/>
+      <w:bookmarkEnd w:id="175"/>
     </w:p>
     <w:p>
       <w:pPr>
@@ -14608,7 +13144,7 @@
           <w:color w:val="000000"/>
           <w:lang w:val="fr-FR"/>
         </w:rPr>
-        <w:t>La validation a donc combiné le build Next.js, des parcours manuels rôle par rôle, des essais de bornes sur les règles métier, des tests multi appareils sur le réseau local, et des vérifications après chaque correctif majeur (cookie Secure, Decimal, synchronisation du timer). Les jeux de données s'appuyaient sur un établissement de démonstration, des comptes types, des examens dans plusieurs états et des CSV volontairement valides ou invalides.</w:t>
+        <w:t>La sécurité navigateur reste une dissuasion et une détection, non une isolation absolue de poste. Un second appareil, une capture d'écran externe ou une machine virtuelle hors contrôle ne sont pas bloqués techniquement. Le langage supporté est encore limité à Python. La sandbox dépend de Docker. Les workers et la file de correction ne sont pas industrialisés. Le temps réel repose sur du polling, acceptable pour des promotions modestes mais à revoir sous forte charge. L'activation par email, le paiement réel, une intégration Moodle profonde, certains raffinements QCM et une suite de tests bout en bout automatisés restent hors du livrable actuel ou partiels.</w:t>
       </w:r>
     </w:p>
     <w:p>
@@ -14618,200 +13154,17 @@
           <w:lang w:val="fr-FR"/>
         </w:rPr>
       </w:pPr>
-      <w:bookmarkStart w:id="162" w:name="bm_ch5_2"/>
-      <w:bookmarkStart w:id="163" w:name="_Toc235048573"/>
+      <w:bookmarkStart w:id="176" w:name="bm_ch5_5"/>
+      <w:bookmarkStart w:id="177" w:name="_Toc235048580"/>
       <w:r>
         <w:rPr>
           <w:rFonts w:ascii="Times New Roman" w:eastAsia="Times New Roman" w:hAnsi="Times New Roman"/>
           <w:lang w:val="fr-FR"/>
         </w:rPr>
-        <w:t>5.2 Jeux de tests et résultats</w:t>
-      </w:r>
-      <w:bookmarkEnd w:id="162"/>
-      <w:bookmarkEnd w:id="163"/>
-    </w:p>
-    <w:p>
-      <w:pPr>
-        <w:pStyle w:val="Titre3"/>
-        <w:rPr>
-          <w:lang w:val="fr-FR"/>
-        </w:rPr>
-      </w:pPr>
-      <w:bookmarkStart w:id="164" w:name="5_2_1_Authentification_et_acc_s"/>
-      <w:bookmarkStart w:id="165" w:name="_Toc235048574"/>
-      <w:r>
-        <w:rPr>
-          <w:rFonts w:ascii="Times New Roman" w:eastAsia="Times New Roman" w:hAnsi="Times New Roman"/>
-          <w:lang w:val="fr-FR"/>
-        </w:rPr>
-        <w:t>5.2.1 Authentification et accès</w:t>
-      </w:r>
-      <w:bookmarkEnd w:id="164"/>
-      <w:bookmarkEnd w:id="165"/>
-    </w:p>
-    <w:p>
-      <w:pPr>
-        <w:ind w:firstLine="425"/>
-        <w:jc w:val="both"/>
-        <w:rPr>
-          <w:lang w:val="fr-FR"/>
-        </w:rPr>
-      </w:pPr>
-      <w:r>
-        <w:rPr>
-          <w:color w:val="000000"/>
-          <w:lang w:val="fr-FR"/>
-        </w:rPr>
-        <w:t>Les essais de connexion montrent un comportement stable pour les différents rôles lorsque les identifiants sont corrects. Un mauvais mot de passe est rejeté. Un étudiant sans code d'examen ne peut pas démarrer le parcours d'épreuve. Le middleware empêche un rôle d'accéder aux espaces d'un autre. La déconnexion vide correctement le cookie. L'accès depuis un autre appareil en HTTP fonctionne après le correctif Secure.</w:t>
-      </w:r>
-    </w:p>
-    <w:p>
-      <w:pPr>
-        <w:pStyle w:val="Titre3"/>
-        <w:rPr>
-          <w:lang w:val="fr-FR"/>
-        </w:rPr>
-      </w:pPr>
-      <w:bookmarkStart w:id="166" w:name="5_2_2_Administration"/>
-      <w:bookmarkStart w:id="167" w:name="_Toc235048575"/>
-      <w:r>
-        <w:rPr>
-          <w:rFonts w:ascii="Times New Roman" w:eastAsia="Times New Roman" w:hAnsi="Times New Roman"/>
-          <w:lang w:val="fr-FR"/>
-        </w:rPr>
-        <w:t>5.2.2 Administration</w:t>
-      </w:r>
-      <w:bookmarkEnd w:id="166"/>
-      <w:bookmarkEnd w:id="167"/>
-    </w:p>
-    <w:p>
-      <w:pPr>
-        <w:ind w:firstLine="425"/>
-        <w:jc w:val="both"/>
-        <w:rPr>
-          <w:lang w:val="fr-FR"/>
-        </w:rPr>
-      </w:pPr>
-      <w:r>
-        <w:rPr>
-          <w:color w:val="000000"/>
-          <w:lang w:val="fr-FR"/>
-        </w:rPr>
-        <w:t>La création de classes et d'étudiants manuels fonctionne, avec génération d'identifiants. L'import CSV crée les lignes valides et rejette clairement les classes inconnues ou les emails incorrects, en laissant un rapport exploitable. La limite de deux administrateurs actifs est respectée, tout comme l'interdiction de se désactiver soi-même. La promotion de rentrée met à jour les profils et l'année active. Le formulaire de contact de la landing enregistre une notification visible côté Super Admin.</w:t>
-      </w:r>
-    </w:p>
-    <w:p>
-      <w:pPr>
-        <w:pStyle w:val="Titre3"/>
-        <w:rPr>
-          <w:lang w:val="fr-FR"/>
-        </w:rPr>
-      </w:pPr>
-      <w:bookmarkStart w:id="168" w:name="5_2_3_Examens_c_t__professeur"/>
-      <w:bookmarkStart w:id="169" w:name="_Toc235048576"/>
-      <w:r>
-        <w:rPr>
-          <w:rFonts w:ascii="Times New Roman" w:eastAsia="Times New Roman" w:hAnsi="Times New Roman"/>
-          <w:lang w:val="fr-FR"/>
-        </w:rPr>
-        <w:t>5.2.3 Examens côté professeur</w:t>
-      </w:r>
-      <w:bookmarkEnd w:id="168"/>
-      <w:bookmarkEnd w:id="169"/>
-    </w:p>
-    <w:p>
-      <w:pPr>
-        <w:ind w:firstLine="425"/>
-        <w:jc w:val="both"/>
-        <w:rPr>
-          <w:lang w:val="fr-FR"/>
-        </w:rPr>
-      </w:pPr>
-      <w:r>
-        <w:rPr>
-          <w:color w:val="000000"/>
-          <w:lang w:val="fr-FR"/>
-        </w:rPr>
-        <w:t xml:space="preserve">Un examen sans exercice ne peut pas être publié. Avec du contenu, la publication génère le code d'accès et permet le mode présentation. La duplication produit un nouveau </w:t>
-      </w:r>
-      <w:r>
-        <w:rPr>
-          <w:color w:val="000000"/>
-          <w:lang w:val="fr-FR"/>
-        </w:rPr>
-        <w:lastRenderedPageBreak/>
-        <w:t>brouillon complet. L'édition du planning sur un examen publié se répercute en salle d'attente et en composition. L'ajout d'exercices reste possible avant le démarrage et est refusé après. Le suivi live, les exports et l'ajustement manuel des notes se comportent conformément aux règles prévues.</w:t>
-      </w:r>
-    </w:p>
-    <w:p>
-      <w:pPr>
-        <w:pStyle w:val="Titre3"/>
-        <w:rPr>
-          <w:lang w:val="fr-FR"/>
-        </w:rPr>
-      </w:pPr>
-      <w:bookmarkStart w:id="170" w:name="5_2_4_Parcours__tudiant_et_contr_les_de_"/>
-      <w:bookmarkStart w:id="171" w:name="_Toc235048577"/>
-      <w:r>
-        <w:rPr>
-          <w:rFonts w:ascii="Times New Roman" w:eastAsia="Times New Roman" w:hAnsi="Times New Roman"/>
-          <w:lang w:val="fr-FR"/>
-        </w:rPr>
-        <w:t>5.2.4 Parcours étudiant et contrôles de passation</w:t>
-      </w:r>
-      <w:bookmarkEnd w:id="170"/>
-      <w:bookmarkEnd w:id="171"/>
-    </w:p>
-    <w:p>
-      <w:pPr>
-        <w:ind w:firstLine="425"/>
-        <w:jc w:val="both"/>
-        <w:rPr>
-          <w:lang w:val="fr-FR"/>
-        </w:rPr>
-      </w:pPr>
-      <w:r>
-        <w:rPr>
-          <w:color w:val="000000"/>
-          <w:lang w:val="fr-FR"/>
-        </w:rPr>
-        <w:t>Un code d'examen invalide est refusé, avec protection contre les tentatives excessives. Sans plein écran, l'étudiant reste bloqué aux consignes. Au démarrage, la bascule vers la composition est automatique. L'exécution sandbox, l'autosave, la navigation entre exercices et la soumission manuelle ou automatique au timer fonctionnent. Les incidents de plein écran incrémentent un compteur et conduisent à l'exclusion au second incident. Le changement d'onglet est journalisé. Après soumission, la reconnexion est bloquée.</w:t>
-      </w:r>
-    </w:p>
-    <w:p>
-      <w:pPr>
-        <w:ind w:firstLine="425"/>
-        <w:jc w:val="both"/>
-        <w:rPr>
-          <w:lang w:val="fr-FR"/>
-        </w:rPr>
-      </w:pPr>
-      <w:r>
-        <w:rPr>
-          <w:color w:val="000000"/>
-          <w:lang w:val="fr-FR"/>
-        </w:rPr>
-        <w:t>Au total, la campagne manuelle ciblée a porté sur trente neuf cas critiques (authentification, administration, professeur, étudiant). Tous sont passés après les correctifs majeurs. Ce résultat doit être lu comme une validation fonctionnelle du périmètre MVP, et non comme une couverture automatisée exhaustive.</w:t>
-      </w:r>
-    </w:p>
-    <w:p>
-      <w:pPr>
-        <w:pStyle w:val="Titre2"/>
-        <w:rPr>
-          <w:lang w:val="fr-FR"/>
-        </w:rPr>
-      </w:pPr>
-      <w:bookmarkStart w:id="172" w:name="bm_ch5_3"/>
-      <w:bookmarkStart w:id="173" w:name="_Toc235048578"/>
-      <w:r>
-        <w:rPr>
-          <w:rFonts w:ascii="Times New Roman" w:eastAsia="Times New Roman" w:hAnsi="Times New Roman"/>
-          <w:lang w:val="fr-FR"/>
-        </w:rPr>
-        <w:t>5.3 Discussion des résultats</w:t>
-      </w:r>
-      <w:bookmarkEnd w:id="172"/>
-      <w:bookmarkEnd w:id="173"/>
+        <w:t>5.5 Perspectives</w:t>
+      </w:r>
+      <w:bookmarkEnd w:id="176"/>
+      <w:bookmarkEnd w:id="177"/>
     </w:p>
     <w:p>
       <w:pPr>
@@ -14829,79 +13182,8 @@
           <w:color w:val="000000"/>
           <w:sz w:val="24"/>
         </w:rPr>
-        <w:t>On dispose désormais d'un parcours d'examen crédible, de la salle d'attente jusqu'à la soumission sous contraintes. La correction automatique par tests unitaires fait gagner du temps au professeur sans lui retirer la main sur la note. Les incidents horodatés, la présence numérique et le journal d'activité donnent une traçabilité concrète. L'outil tourne en salle sur réseau local. L'administration scolaire et les écrans produit (landing, contact, espaces par rôle) complètent un livrable qu'on peut montrer de bout en bout.</w:t>
-      </w:r>
-    </w:p>
-    <w:p>
-      <w:pPr>
-        <w:ind w:firstLine="425"/>
-        <w:jc w:val="both"/>
-        <w:rPr>
-          <w:lang w:val="fr-FR"/>
-        </w:rPr>
-      </w:pPr>
-      <w:r>
-        <w:rPr>
-          <w:color w:val="000000"/>
-          <w:lang w:val="fr-FR"/>
-        </w:rPr>
-        <w:t>Trois anomalies ont particulièrement pesé avant d'être corrigées. Le cookie Secure bloquait toutes les connexions locales. Les props Decimal cassaient des composants clients. Le timer de composition n'évoluait pas après une modification professeur sans polling de synchronisation. Ces points confirment que la valeur du MVP tient autant aux parcours qu'à la robustesse des détails d'exécution en salle.</w:t>
-      </w:r>
-    </w:p>
-    <w:p>
-      <w:pPr>
-        <w:pStyle w:val="Titre2"/>
-        <w:rPr>
-          <w:lang w:val="fr-FR"/>
-        </w:rPr>
-      </w:pPr>
-      <w:bookmarkStart w:id="174" w:name="bm_ch5_4"/>
-      <w:bookmarkStart w:id="175" w:name="_Toc235048579"/>
-      <w:r>
-        <w:rPr>
-          <w:rFonts w:ascii="Times New Roman" w:eastAsia="Times New Roman" w:hAnsi="Times New Roman"/>
-          <w:lang w:val="fr-FR"/>
-        </w:rPr>
-        <w:lastRenderedPageBreak/>
-        <w:t>5.4 Limites et risques résiduels</w:t>
-      </w:r>
-      <w:bookmarkEnd w:id="174"/>
-      <w:bookmarkEnd w:id="175"/>
-    </w:p>
-    <w:p>
-      <w:pPr>
-        <w:ind w:firstLine="425"/>
-        <w:jc w:val="both"/>
-        <w:rPr>
-          <w:lang w:val="fr-FR"/>
-        </w:rPr>
-      </w:pPr>
-      <w:r>
-        <w:rPr>
-          <w:color w:val="000000"/>
-          <w:lang w:val="fr-FR"/>
-        </w:rPr>
-        <w:t>La sécurité navigateur reste une dissuasion et une détection, non une isolation absolue de poste. Un second appareil, une capture d'écran externe ou une machine virtuelle hors contrôle ne sont pas bloqués techniquement. Le langage supporté est encore limité à Python. La sandbox dépend de Docker. Les workers et la file de correction ne sont pas industrialisés. Le temps réel repose sur du polling, acceptable pour des promotions modestes mais à revoir sous forte charge. L'activation par email, le paiement réel, une intégration Moodle profonde, certains raffinements QCM et une suite de tests bout en bout automatisés restent hors du livrable actuel ou partiels.</w:t>
-      </w:r>
-    </w:p>
-    <w:p>
-      <w:pPr>
-        <w:pStyle w:val="Titre2"/>
-        <w:rPr>
-          <w:lang w:val="fr-FR"/>
-        </w:rPr>
-      </w:pPr>
-      <w:bookmarkStart w:id="176" w:name="bm_ch5_5"/>
-      <w:bookmarkStart w:id="177" w:name="_Toc235048580"/>
-      <w:r>
-        <w:rPr>
-          <w:rFonts w:ascii="Times New Roman" w:eastAsia="Times New Roman" w:hAnsi="Times New Roman"/>
-          <w:lang w:val="fr-FR"/>
-        </w:rPr>
-        <w:t>5.5 Perspectives</w:t>
-      </w:r>
-      <w:bookmarkEnd w:id="176"/>
-      <w:bookmarkEnd w:id="177"/>
+        <w:t>Pour la suite, l'ordre le plus raisonnable est d'élargir les langages (Java, C, C++), d'activer les comptes par email, puis d'introduire Redis avec un canal temps réel plus solide. Viendraient ensuite des QCM plus riches, la facturation réelle, une file de correction pour les pics de soumissions, et éventuellement une API ou un lien Moodle. Une interface de registre de salle pour les surveillants comblerait aussi un manque encore géré à la main. La surveillance vidéo, elle, ne devrait être envisagée qu'après un cadrage clair sur l'éthique et les données personnelles.</w:t>
+      </w:r>
     </w:p>
     <w:p>
       <w:pPr>
@@ -14919,77 +13201,7 @@
           <w:color w:val="000000"/>
           <w:sz w:val="24"/>
         </w:rPr>
-        <w:t>Pour la suite, l'ordre le plus raisonnable est d'élargir les langages (Java, C, C++), d'activer les comptes par email, puis d'introduire Redis avec un canal temps réel plus solide. Viendraient ensuite des QCM plus riches, la facturation réelle, une file de correction pour les pics de soumissions, et éventuellement une API ou un lien Moodle. Une interface de registre de salle pour les surveillants comblerait aussi un manque encore géré à la main. La surveillance vidéo, elle, ne devrait être envisagée qu'après un cadrage clair sur l'éthique et les données personnelles.</w:t>
-      </w:r>
-    </w:p>
-    <w:p>
-      <w:pPr>
-        <w:ind w:firstLine="425"/>
-        <w:jc w:val="both"/>
-        <w:rPr>
-          <w:lang w:val="fr-FR"/>
-        </w:rPr>
-      </w:pPr>
-      <w:r>
-        <w:rPr>
-          <w:rFonts w:ascii="Times New Roman" w:hAnsi="Times New Roman" w:eastAsia="Times New Roman"/>
-          <w:b w:val="0"/>
-          <w:i w:val="0"/>
-          <w:color w:val="000000"/>
-          <w:sz w:val="24"/>
-        </w:rPr>
         <w:t>Quelques priorités se dégagent. Il faudra d'abord automatiser le parcours connexion, publication, composition et soumission. Redis devient utile dès que le suivi live dépasse quelques dizaines d'étudiants en même temps. Une procédure salle simple (adresse, pare-feu, navigateurs supportés) évitera les improvisations le jour J. Enfin, le cadre juridique doit être posé tôt, avant toute tentation de surveillance trop intrusive.</w:t>
-      </w:r>
-    </w:p>
-    <w:p>
-      <w:pPr>
-        <w:pStyle w:val="Titre2"/>
-        <w:rPr>
-          <w:lang w:val="fr-FR"/>
-        </w:rPr>
-      </w:pPr>
-      <w:bookmarkStart w:id="178" w:name="bm_ch5_6"/>
-      <w:bookmarkStart w:id="179" w:name="_Toc235048581"/>
-      <w:r>
-        <w:rPr>
-          <w:rFonts w:ascii="Times New Roman" w:eastAsia="Times New Roman" w:hAnsi="Times New Roman"/>
-          <w:lang w:val="fr-FR"/>
-        </w:rPr>
-        <w:t>5.6 Conclusion partielle</w:t>
-      </w:r>
-      <w:bookmarkEnd w:id="178"/>
-      <w:bookmarkEnd w:id="179"/>
-    </w:p>
-    <w:p>
-      <w:pPr>
-        <w:ind w:firstLine="425"/>
-        <w:jc w:val="both"/>
-        <w:rPr>
-          <w:lang w:val="fr-FR"/>
-        </w:rPr>
-      </w:pPr>
-      <w:r>
-        <w:rPr>
-          <w:rFonts w:ascii="Times New Roman" w:hAnsi="Times New Roman" w:eastAsia="Times New Roman"/>
-          <w:b w:val="0"/>
-          <w:i w:val="0"/>
-          <w:color w:val="000000"/>
-          <w:sz w:val="24"/>
-        </w:rPr>
-        <w:t>Au bilan, le MVP Cylentic se démontre sur son périmètre et reste cohérent techniquement. Ce qui manque encore vient surtout de choix de priorité (temps réel, multi langages, tests automatisés), pas d'une faille d'architecture de fond.</w:t>
-      </w:r>
-    </w:p>
-    <w:p>
-      <w:pPr>
-        <w:rPr>
-          <w:lang w:val="fr-FR"/>
-        </w:rPr>
-      </w:pPr>
-      <w:r>
-        <w:rPr>
-          <w:lang w:val="fr-FR"/>
-        </w:rPr>
-        <w:br w:type="page"/>
       </w:r>
     </w:p>
     <w:p>

</xml_diff>

<commit_message>
Restaure le rapport à la version avant réduction de pages.
Remet les conclusions partielles et les diagrammes d'objets.

Co-authored-by: progirix <progirix@users.noreply.github.com>
</commit_message>
<xml_diff>
--- a/docs/Rapport_Cylentic.docx
+++ b/docs/Rapport_Cylentic.docx
@@ -7408,6 +7408,57 @@
     </w:p>
     <w:p>
       <w:pPr>
+        <w:pStyle w:val="Titre2"/>
+        <w:rPr>
+          <w:lang w:val="fr-FR"/>
+        </w:rPr>
+      </w:pPr>
+      <w:bookmarkStart w:id="42" w:name="bm_ch1_5"/>
+      <w:bookmarkStart w:id="43" w:name="_Toc235048534"/>
+      <w:r>
+        <w:rPr>
+          <w:rFonts w:ascii="Times New Roman" w:eastAsia="Times New Roman" w:hAnsi="Times New Roman"/>
+          <w:lang w:val="fr-FR"/>
+        </w:rPr>
+        <w:t>1.5 Conclusion partielle</w:t>
+      </w:r>
+      <w:bookmarkEnd w:id="42"/>
+      <w:bookmarkEnd w:id="43"/>
+    </w:p>
+    <w:p>
+      <w:pPr>
+        <w:ind w:firstLine="425"/>
+        <w:jc w:val="both"/>
+        <w:rPr>
+          <w:lang w:val="fr-FR"/>
+        </w:rPr>
+      </w:pPr>
+      <w:r>
+        <w:rPr>
+          <w:rFonts w:ascii="Times New Roman" w:hAnsi="Times New Roman" w:eastAsia="Times New Roman"/>
+          <w:b w:val="0"/>
+          <w:i w:val="0"/>
+          <w:color w:val="000000"/>
+          <w:sz w:val="24"/>
+        </w:rPr>
+        <w:t>Le constat est net : le problème existe, les outils ne le couvrent que par morceaux, et Cylentic a une place utile. Le chapitre suivant fixe le cahier des charges du MVP.</w:t>
+      </w:r>
+    </w:p>
+    <w:p>
+      <w:pPr>
+        <w:rPr>
+          <w:lang w:val="fr-FR"/>
+        </w:rPr>
+      </w:pPr>
+      <w:r>
+        <w:rPr>
+          <w:lang w:val="fr-FR"/>
+        </w:rPr>
+        <w:br w:type="page"/>
+      </w:r>
+    </w:p>
+    <w:p>
+      <w:pPr>
         <w:pStyle w:val="Titre1"/>
         <w:rPr>
           <w:lang w:val="fr-FR"/>
@@ -8126,6 +8177,55 @@
     </w:p>
     <w:p>
       <w:pPr>
+        <w:pStyle w:val="Titre2"/>
+        <w:rPr>
+          <w:lang w:val="fr-FR"/>
+        </w:rPr>
+      </w:pPr>
+      <w:bookmarkStart w:id="60" w:name="bm_ch2_7"/>
+      <w:bookmarkStart w:id="61" w:name="_Toc235048542"/>
+      <w:r>
+        <w:rPr>
+          <w:rFonts w:ascii="Times New Roman" w:eastAsia="Times New Roman" w:hAnsi="Times New Roman"/>
+          <w:lang w:val="fr-FR"/>
+        </w:rPr>
+        <w:lastRenderedPageBreak/>
+        <w:t>2.7 Conclusion partielle</w:t>
+      </w:r>
+      <w:bookmarkEnd w:id="60"/>
+      <w:bookmarkEnd w:id="61"/>
+    </w:p>
+    <w:p>
+      <w:pPr>
+        <w:ind w:firstLine="425"/>
+        <w:jc w:val="both"/>
+        <w:rPr>
+          <w:lang w:val="fr-FR"/>
+        </w:rPr>
+      </w:pPr>
+      <w:r>
+        <w:rPr>
+          <w:color w:val="000000"/>
+          <w:lang w:val="fr-FR"/>
+        </w:rPr>
+        <w:t>Le cahier des charges de Cylentic est posé : périmètre du MVP, acteurs, besoins fonctionnels et non fonctionnels, règles métier et scénarios prioritaires. Sur cette base, la conception du chapitre suivant peut se développer sans improvisation fonctionnelle.</w:t>
+      </w:r>
+    </w:p>
+    <w:p>
+      <w:pPr>
+        <w:rPr>
+          <w:lang w:val="fr-FR"/>
+        </w:rPr>
+      </w:pPr>
+      <w:r>
+        <w:rPr>
+          <w:lang w:val="fr-FR"/>
+        </w:rPr>
+        <w:br w:type="page"/>
+      </w:r>
+    </w:p>
+    <w:p>
+      <w:pPr>
         <w:pStyle w:val="Titre1"/>
         <w:rPr>
           <w:lang w:val="fr-FR"/>
@@ -9423,17 +9523,15 @@
       </w:pPr>
       <w:bookmarkStart w:id="79" w:name="bm_ch3_4"/>
       <w:bookmarkStart w:id="80" w:name="_Toc235048547"/>
+      <w:r>
+        <w:rPr>
+          <w:rFonts w:ascii="Times New Roman" w:eastAsia="Times New Roman" w:hAnsi="Times New Roman"/>
+          <w:lang w:val="fr-FR"/>
+        </w:rPr>
+        <w:t>3.4 Structure statique : classes et objets</w:t>
+      </w:r>
       <w:bookmarkEnd w:id="79"/>
       <w:bookmarkEnd w:id="80"/>
-      <w:r>
-        <w:rPr>
-          <w:rFonts w:ascii="Times New Roman" w:hAnsi="Times New Roman"/>
-          <w:b/>
-          <w:color w:val="000000"/>
-          <w:sz w:val="24"/>
-        </w:rPr>
-        <w:t>3.4 Structure statique : diagrammes de classes</w:t>
-      </w:r>
     </w:p>
     <w:p>
       <w:pPr>
@@ -9818,6 +9916,364 @@
     </w:p>
     <w:p>
       <w:pPr>
+        <w:ind w:firstLine="425"/>
+        <w:jc w:val="both"/>
+        <w:rPr>
+          <w:lang w:val="fr-FR"/>
+        </w:rPr>
+      </w:pPr>
+      <w:r>
+        <w:rPr>
+          <w:color w:val="000000"/>
+          <w:lang w:val="fr-FR"/>
+        </w:rPr>
+        <w:t>Les diagrammes d'objets illustrent le même découpage avec des instances concrètes. Ils facilitent la relecture pédagogique : un établissement exemple, un professeur nommé, un examen publié, une participation en cours, un incident de sortie du plein écran. Les attributs des objets reprennent l'intégralité des champs du modèle, sans abréviation.</w:t>
+      </w:r>
+    </w:p>
+    <w:p>
+      <w:pPr>
+        <w:spacing w:after="80" w:line="240" w:lineRule="auto"/>
+        <w:jc w:val="center"/>
+      </w:pPr>
+      <w:r>
+        <w:rPr>
+          <w:noProof/>
+        </w:rPr>
+        <w:lastRenderedPageBreak/>
+        <w:drawing>
+          <wp:inline distT="0" distB="0" distL="0" distR="0" wp14:anchorId="56B972DA" wp14:editId="2377F5A1">
+            <wp:extent cx="5040000" cy="4857517"/>
+            <wp:effectExtent l="0" t="0" r="0" b="0"/>
+            <wp:docPr id="12" name="Picture 12"/>
+            <wp:cNvGraphicFramePr>
+              <a:graphicFrameLocks xmlns:a="http://schemas.openxmlformats.org/drawingml/2006/main" noChangeAspect="1"/>
+            </wp:cNvGraphicFramePr>
+            <a:graphic xmlns:a="http://schemas.openxmlformats.org/drawingml/2006/main">
+              <a:graphicData uri="http://schemas.openxmlformats.org/drawingml/2006/picture">
+                <pic:pic xmlns:pic="http://schemas.openxmlformats.org/drawingml/2006/picture">
+                  <pic:nvPicPr>
+                    <pic:cNvPr id="0" name="06a_objets_organisation.png"/>
+                    <pic:cNvPicPr/>
+                  </pic:nvPicPr>
+                  <pic:blipFill>
+                    <a:blip r:embed="rId22"/>
+                    <a:stretch>
+                      <a:fillRect/>
+                    </a:stretch>
+                  </pic:blipFill>
+                  <pic:spPr>
+                    <a:xfrm>
+                      <a:off x="0" y="0"/>
+                      <a:ext cx="5040000" cy="4857517"/>
+                    </a:xfrm>
+                    <a:prstGeom prst="rect">
+                      <a:avLst/>
+                    </a:prstGeom>
+                  </pic:spPr>
+                </pic:pic>
+              </a:graphicData>
+            </a:graphic>
+          </wp:inline>
+        </w:drawing>
+      </w:r>
+    </w:p>
+    <w:p>
+      <w:pPr>
+        <w:pStyle w:val="Lgende"/>
+        <w:spacing w:after="200" w:line="360" w:lineRule="auto"/>
+        <w:jc w:val="center"/>
+      </w:pPr>
+      <w:bookmarkStart w:id="84" w:name="_Toc235048695"/>
+      <w:r>
+        <w:rPr>
+          <w:b w:val="0"/>
+          <w:color w:val="000000"/>
+          <w:sz w:val="22"/>
+        </w:rPr>
+        <w:t xml:space="preserve">Figure </w:t>
+      </w:r>
+      <w:r>
+        <w:rPr>
+          <w:b w:val="0"/>
+          <w:color w:val="000000"/>
+          <w:sz w:val="22"/>
+        </w:rPr>
+        <w:fldChar w:fldCharType="begin"/>
+      </w:r>
+      <w:r>
+        <w:rPr>
+          <w:b w:val="0"/>
+          <w:color w:val="000000"/>
+          <w:sz w:val="22"/>
+        </w:rPr>
+        <w:instrText>SEQ Figure \* ARABIC</w:instrText>
+      </w:r>
+      <w:r>
+        <w:rPr>
+          <w:b w:val="0"/>
+          <w:color w:val="000000"/>
+          <w:sz w:val="22"/>
+        </w:rPr>
+        <w:fldChar w:fldCharType="separate"/>
+      </w:r>
+      <w:r>
+        <w:rPr>
+          <w:b w:val="0"/>
+          <w:color w:val="000000"/>
+          <w:sz w:val="22"/>
+        </w:rPr>
+        <w:t>12</w:t>
+      </w:r>
+      <w:r>
+        <w:rPr>
+          <w:b w:val="0"/>
+          <w:color w:val="000000"/>
+          <w:sz w:val="22"/>
+        </w:rPr>
+        <w:fldChar w:fldCharType="end"/>
+      </w:r>
+      <w:r>
+        <w:rPr>
+          <w:b w:val="0"/>
+          <w:color w:val="000000"/>
+          <w:sz w:val="22"/>
+        </w:rPr>
+        <w:t xml:space="preserve"> : Objets organisation</w:t>
+      </w:r>
+      <w:bookmarkEnd w:id="84"/>
+    </w:p>
+    <w:p>
+      <w:pPr>
+        <w:spacing w:after="80" w:line="240" w:lineRule="auto"/>
+        <w:jc w:val="center"/>
+      </w:pPr>
+      <w:r>
+        <w:rPr>
+          <w:noProof/>
+        </w:rPr>
+        <w:drawing>
+          <wp:inline distT="0" distB="0" distL="0" distR="0" wp14:anchorId="4C16F28F" wp14:editId="27644652">
+            <wp:extent cx="5040000" cy="2167552"/>
+            <wp:effectExtent l="0" t="0" r="0" b="0"/>
+            <wp:docPr id="13" name="Picture 13"/>
+            <wp:cNvGraphicFramePr>
+              <a:graphicFrameLocks xmlns:a="http://schemas.openxmlformats.org/drawingml/2006/main" noChangeAspect="1"/>
+            </wp:cNvGraphicFramePr>
+            <a:graphic xmlns:a="http://schemas.openxmlformats.org/drawingml/2006/main">
+              <a:graphicData uri="http://schemas.openxmlformats.org/drawingml/2006/picture">
+                <pic:pic xmlns:pic="http://schemas.openxmlformats.org/drawingml/2006/picture">
+                  <pic:nvPicPr>
+                    <pic:cNvPr id="0" name="06b_objets_conception_examen.png"/>
+                    <pic:cNvPicPr/>
+                  </pic:nvPicPr>
+                  <pic:blipFill>
+                    <a:blip r:embed="rId23"/>
+                    <a:stretch>
+                      <a:fillRect/>
+                    </a:stretch>
+                  </pic:blipFill>
+                  <pic:spPr>
+                    <a:xfrm>
+                      <a:off x="0" y="0"/>
+                      <a:ext cx="5040000" cy="2167552"/>
+                    </a:xfrm>
+                    <a:prstGeom prst="rect">
+                      <a:avLst/>
+                    </a:prstGeom>
+                  </pic:spPr>
+                </pic:pic>
+              </a:graphicData>
+            </a:graphic>
+          </wp:inline>
+        </w:drawing>
+      </w:r>
+    </w:p>
+    <w:p>
+      <w:pPr>
+        <w:pStyle w:val="Lgende"/>
+        <w:spacing w:after="200" w:line="360" w:lineRule="auto"/>
+        <w:jc w:val="center"/>
+      </w:pPr>
+      <w:bookmarkStart w:id="85" w:name="_Toc235048696"/>
+      <w:r>
+        <w:rPr>
+          <w:b w:val="0"/>
+          <w:color w:val="000000"/>
+          <w:sz w:val="22"/>
+        </w:rPr>
+        <w:t xml:space="preserve">Figure </w:t>
+      </w:r>
+      <w:r>
+        <w:rPr>
+          <w:b w:val="0"/>
+          <w:color w:val="000000"/>
+          <w:sz w:val="22"/>
+        </w:rPr>
+        <w:fldChar w:fldCharType="begin"/>
+      </w:r>
+      <w:r>
+        <w:rPr>
+          <w:b w:val="0"/>
+          <w:color w:val="000000"/>
+          <w:sz w:val="22"/>
+        </w:rPr>
+        <w:instrText>SEQ Figure \* ARABIC</w:instrText>
+      </w:r>
+      <w:r>
+        <w:rPr>
+          <w:b w:val="0"/>
+          <w:color w:val="000000"/>
+          <w:sz w:val="22"/>
+        </w:rPr>
+        <w:fldChar w:fldCharType="separate"/>
+      </w:r>
+      <w:r>
+        <w:rPr>
+          <w:b w:val="0"/>
+          <w:color w:val="000000"/>
+          <w:sz w:val="22"/>
+        </w:rPr>
+        <w:t>13</w:t>
+      </w:r>
+      <w:r>
+        <w:rPr>
+          <w:b w:val="0"/>
+          <w:color w:val="000000"/>
+          <w:sz w:val="22"/>
+        </w:rPr>
+        <w:fldChar w:fldCharType="end"/>
+      </w:r>
+      <w:r>
+        <w:rPr>
+          <w:b w:val="0"/>
+          <w:color w:val="000000"/>
+          <w:sz w:val="22"/>
+        </w:rPr>
+        <w:t xml:space="preserve"> : Objets conception d'examen</w:t>
+      </w:r>
+      <w:bookmarkEnd w:id="85"/>
+    </w:p>
+    <w:p>
+      <w:pPr>
+        <w:spacing w:after="80" w:line="240" w:lineRule="auto"/>
+        <w:jc w:val="center"/>
+      </w:pPr>
+      <w:r>
+        <w:rPr>
+          <w:noProof/>
+        </w:rPr>
+        <w:lastRenderedPageBreak/>
+        <w:drawing>
+          <wp:inline distT="0" distB="0" distL="0" distR="0" wp14:anchorId="4CEA809E" wp14:editId="5B551C84">
+            <wp:extent cx="5040000" cy="4050998"/>
+            <wp:effectExtent l="0" t="0" r="0" b="0"/>
+            <wp:docPr id="14" name="Picture 14"/>
+            <wp:cNvGraphicFramePr>
+              <a:graphicFrameLocks xmlns:a="http://schemas.openxmlformats.org/drawingml/2006/main" noChangeAspect="1"/>
+            </wp:cNvGraphicFramePr>
+            <a:graphic xmlns:a="http://schemas.openxmlformats.org/drawingml/2006/main">
+              <a:graphicData uri="http://schemas.openxmlformats.org/drawingml/2006/picture">
+                <pic:pic xmlns:pic="http://schemas.openxmlformats.org/drawingml/2006/picture">
+                  <pic:nvPicPr>
+                    <pic:cNvPr id="0" name="06c_objets_passation.png"/>
+                    <pic:cNvPicPr/>
+                  </pic:nvPicPr>
+                  <pic:blipFill>
+                    <a:blip r:embed="rId24"/>
+                    <a:stretch>
+                      <a:fillRect/>
+                    </a:stretch>
+                  </pic:blipFill>
+                  <pic:spPr>
+                    <a:xfrm>
+                      <a:off x="0" y="0"/>
+                      <a:ext cx="5040000" cy="4050998"/>
+                    </a:xfrm>
+                    <a:prstGeom prst="rect">
+                      <a:avLst/>
+                    </a:prstGeom>
+                  </pic:spPr>
+                </pic:pic>
+              </a:graphicData>
+            </a:graphic>
+          </wp:inline>
+        </w:drawing>
+      </w:r>
+    </w:p>
+    <w:p>
+      <w:pPr>
+        <w:pStyle w:val="Lgende"/>
+        <w:spacing w:after="200" w:line="360" w:lineRule="auto"/>
+        <w:jc w:val="center"/>
+        <w:rPr>
+          <w:lang w:val="fr-FR"/>
+        </w:rPr>
+      </w:pPr>
+      <w:bookmarkStart w:id="86" w:name="_Toc235048697"/>
+      <w:r>
+        <w:rPr>
+          <w:b w:val="0"/>
+          <w:color w:val="000000"/>
+          <w:sz w:val="22"/>
+          <w:lang w:val="fr-FR"/>
+        </w:rPr>
+        <w:t xml:space="preserve">Figure </w:t>
+      </w:r>
+      <w:r>
+        <w:rPr>
+          <w:b w:val="0"/>
+          <w:color w:val="000000"/>
+          <w:sz w:val="22"/>
+        </w:rPr>
+        <w:fldChar w:fldCharType="begin"/>
+      </w:r>
+      <w:r>
+        <w:rPr>
+          <w:b w:val="0"/>
+          <w:color w:val="000000"/>
+          <w:sz w:val="22"/>
+          <w:lang w:val="fr-FR"/>
+        </w:rPr>
+        <w:instrText>SEQ Figure \* ARABIC</w:instrText>
+      </w:r>
+      <w:r>
+        <w:rPr>
+          <w:b w:val="0"/>
+          <w:color w:val="000000"/>
+          <w:sz w:val="22"/>
+        </w:rPr>
+        <w:fldChar w:fldCharType="separate"/>
+      </w:r>
+      <w:r>
+        <w:rPr>
+          <w:b w:val="0"/>
+          <w:color w:val="000000"/>
+          <w:sz w:val="22"/>
+          <w:lang w:val="fr-FR"/>
+        </w:rPr>
+        <w:t>14</w:t>
+      </w:r>
+      <w:r>
+        <w:rPr>
+          <w:b w:val="0"/>
+          <w:color w:val="000000"/>
+          <w:sz w:val="22"/>
+        </w:rPr>
+        <w:fldChar w:fldCharType="end"/>
+      </w:r>
+      <w:r>
+        <w:rPr>
+          <w:b w:val="0"/>
+          <w:color w:val="000000"/>
+          <w:sz w:val="22"/>
+          <w:lang w:val="fr-FR"/>
+        </w:rPr>
+        <w:t xml:space="preserve"> : Objets passation</w:t>
+      </w:r>
+      <w:bookmarkEnd w:id="86"/>
+    </w:p>
+    <w:p>
+      <w:pPr>
         <w:pStyle w:val="Titre2"/>
         <w:rPr>
           <w:lang w:val="fr-FR"/>
@@ -9903,14 +10359,64 @@
         <w:spacing w:after="200" w:line="360" w:lineRule="auto"/>
         <w:jc w:val="center"/>
       </w:pPr>
-      <w:r>
-        <w:rPr>
-          <w:rFonts w:ascii="Times New Roman" w:hAnsi="Times New Roman"/>
+      <w:bookmarkStart w:id="89" w:name="_Toc235048698"/>
+      <w:r>
+        <w:rPr>
+          <w:b w:val="0"/>
           <w:color w:val="000000"/>
           <w:sz w:val="22"/>
         </w:rPr>
-        <w:t>Figure 12 : Composants vue d'ensemble</w:t>
-      </w:r>
+        <w:t xml:space="preserve">Figure </w:t>
+      </w:r>
+      <w:r>
+        <w:rPr>
+          <w:b w:val="0"/>
+          <w:color w:val="000000"/>
+          <w:sz w:val="22"/>
+        </w:rPr>
+        <w:fldChar w:fldCharType="begin"/>
+      </w:r>
+      <w:r>
+        <w:rPr>
+          <w:b w:val="0"/>
+          <w:color w:val="000000"/>
+          <w:sz w:val="22"/>
+        </w:rPr>
+        <w:instrText>SEQ Figure \* ARABIC</w:instrText>
+      </w:r>
+      <w:r>
+        <w:rPr>
+          <w:b w:val="0"/>
+          <w:color w:val="000000"/>
+          <w:sz w:val="22"/>
+        </w:rPr>
+        <w:fldChar w:fldCharType="separate"/>
+      </w:r>
+      <w:r>
+        <w:rPr>
+          <w:b w:val="0"/>
+          <w:color w:val="000000"/>
+          <w:sz w:val="22"/>
+        </w:rPr>
+        <w:t>15</w:t>
+      </w:r>
+      <w:r>
+        <w:rPr>
+          <w:b w:val="0"/>
+          <w:color w:val="000000"/>
+          <w:sz w:val="22"/>
+        </w:rPr>
+        <w:fldChar w:fldCharType="end"/>
+      </w:r>
+      <w:r>
+        <w:rPr>
+          <w:b w:val="0"/>
+          <w:color w:val="000000"/>
+          <w:sz w:val="22"/>
+        </w:rPr>
+        <w:t xml:space="preserve"> : Composants vue d'ensemble</w:t>
+      </w:r>
+      <w:bookmarkEnd w:id="89"/>
     </w:p>
     <w:p>
       <w:pPr>
@@ -9965,14 +10471,64 @@
         <w:spacing w:after="200" w:line="360" w:lineRule="auto"/>
         <w:jc w:val="center"/>
       </w:pPr>
-      <w:r>
-        <w:rPr>
-          <w:rFonts w:ascii="Times New Roman" w:hAnsi="Times New Roman"/>
+      <w:bookmarkStart w:id="90" w:name="_Toc235048699"/>
+      <w:r>
+        <w:rPr>
+          <w:b w:val="0"/>
           <w:color w:val="000000"/>
           <w:sz w:val="22"/>
         </w:rPr>
-        <w:t>Figure 13 : Composants administration et authentification</w:t>
-      </w:r>
+        <w:t xml:space="preserve">Figure </w:t>
+      </w:r>
+      <w:r>
+        <w:rPr>
+          <w:b w:val="0"/>
+          <w:color w:val="000000"/>
+          <w:sz w:val="22"/>
+        </w:rPr>
+        <w:fldChar w:fldCharType="begin"/>
+      </w:r>
+      <w:r>
+        <w:rPr>
+          <w:b w:val="0"/>
+          <w:color w:val="000000"/>
+          <w:sz w:val="22"/>
+        </w:rPr>
+        <w:instrText>SEQ Figure \* ARABIC</w:instrText>
+      </w:r>
+      <w:r>
+        <w:rPr>
+          <w:b w:val="0"/>
+          <w:color w:val="000000"/>
+          <w:sz w:val="22"/>
+        </w:rPr>
+        <w:fldChar w:fldCharType="separate"/>
+      </w:r>
+      <w:r>
+        <w:rPr>
+          <w:b w:val="0"/>
+          <w:color w:val="000000"/>
+          <w:sz w:val="22"/>
+        </w:rPr>
+        <w:t>16</w:t>
+      </w:r>
+      <w:r>
+        <w:rPr>
+          <w:b w:val="0"/>
+          <w:color w:val="000000"/>
+          <w:sz w:val="22"/>
+        </w:rPr>
+        <w:fldChar w:fldCharType="end"/>
+      </w:r>
+      <w:r>
+        <w:rPr>
+          <w:b w:val="0"/>
+          <w:color w:val="000000"/>
+          <w:sz w:val="22"/>
+        </w:rPr>
+        <w:t xml:space="preserve"> : Composants administration et authentification</w:t>
+      </w:r>
+      <w:bookmarkEnd w:id="90"/>
     </w:p>
     <w:p>
       <w:pPr>
@@ -10029,14 +10585,68 @@
           <w:lang w:val="fr-FR"/>
         </w:rPr>
       </w:pPr>
-      <w:r>
-        <w:rPr>
-          <w:rFonts w:ascii="Times New Roman" w:hAnsi="Times New Roman"/>
+      <w:bookmarkStart w:id="91" w:name="_Toc235048700"/>
+      <w:r>
+        <w:rPr>
+          <w:b w:val="0"/>
           <w:color w:val="000000"/>
           <w:sz w:val="22"/>
-        </w:rPr>
-        <w:t>Figure 14 : Composants examens et passation</w:t>
-      </w:r>
+          <w:lang w:val="fr-FR"/>
+        </w:rPr>
+        <w:t xml:space="preserve">Figure </w:t>
+      </w:r>
+      <w:r>
+        <w:rPr>
+          <w:b w:val="0"/>
+          <w:color w:val="000000"/>
+          <w:sz w:val="22"/>
+        </w:rPr>
+        <w:fldChar w:fldCharType="begin"/>
+      </w:r>
+      <w:r>
+        <w:rPr>
+          <w:b w:val="0"/>
+          <w:color w:val="000000"/>
+          <w:sz w:val="22"/>
+          <w:lang w:val="fr-FR"/>
+        </w:rPr>
+        <w:instrText>SEQ Figure \* ARABIC</w:instrText>
+      </w:r>
+      <w:r>
+        <w:rPr>
+          <w:b w:val="0"/>
+          <w:color w:val="000000"/>
+          <w:sz w:val="22"/>
+        </w:rPr>
+        <w:fldChar w:fldCharType="separate"/>
+      </w:r>
+      <w:r>
+        <w:rPr>
+          <w:b w:val="0"/>
+          <w:color w:val="000000"/>
+          <w:sz w:val="22"/>
+          <w:lang w:val="fr-FR"/>
+        </w:rPr>
+        <w:t>17</w:t>
+      </w:r>
+      <w:r>
+        <w:rPr>
+          <w:b w:val="0"/>
+          <w:color w:val="000000"/>
+          <w:sz w:val="22"/>
+        </w:rPr>
+        <w:fldChar w:fldCharType="end"/>
+      </w:r>
+      <w:r>
+        <w:rPr>
+          <w:b w:val="0"/>
+          <w:color w:val="000000"/>
+          <w:sz w:val="22"/>
+          <w:lang w:val="fr-FR"/>
+        </w:rPr>
+        <w:t xml:space="preserve"> : Composants examens et passation</w:t>
+      </w:r>
+      <w:bookmarkEnd w:id="91"/>
     </w:p>
     <w:p>
       <w:pPr>
@@ -10164,14 +10774,68 @@
           <w:lang w:val="fr-FR"/>
         </w:rPr>
       </w:pPr>
-      <w:r>
-        <w:rPr>
-          <w:rFonts w:ascii="Times New Roman" w:hAnsi="Times New Roman"/>
+      <w:bookmarkStart w:id="96" w:name="_Toc235048701"/>
+      <w:r>
+        <w:rPr>
+          <w:b w:val="0"/>
           <w:color w:val="000000"/>
           <w:sz w:val="22"/>
-        </w:rPr>
-        <w:t>Figure 15 : États du cycle de vie d'un examen</w:t>
-      </w:r>
+          <w:lang w:val="fr-FR"/>
+        </w:rPr>
+        <w:t xml:space="preserve">Figure </w:t>
+      </w:r>
+      <w:r>
+        <w:rPr>
+          <w:b w:val="0"/>
+          <w:color w:val="000000"/>
+          <w:sz w:val="22"/>
+        </w:rPr>
+        <w:fldChar w:fldCharType="begin"/>
+      </w:r>
+      <w:r>
+        <w:rPr>
+          <w:b w:val="0"/>
+          <w:color w:val="000000"/>
+          <w:sz w:val="22"/>
+          <w:lang w:val="fr-FR"/>
+        </w:rPr>
+        <w:instrText>SEQ Figure \* ARABIC</w:instrText>
+      </w:r>
+      <w:r>
+        <w:rPr>
+          <w:b w:val="0"/>
+          <w:color w:val="000000"/>
+          <w:sz w:val="22"/>
+        </w:rPr>
+        <w:fldChar w:fldCharType="separate"/>
+      </w:r>
+      <w:r>
+        <w:rPr>
+          <w:b w:val="0"/>
+          <w:color w:val="000000"/>
+          <w:sz w:val="22"/>
+          <w:lang w:val="fr-FR"/>
+        </w:rPr>
+        <w:t>18</w:t>
+      </w:r>
+      <w:r>
+        <w:rPr>
+          <w:b w:val="0"/>
+          <w:color w:val="000000"/>
+          <w:sz w:val="22"/>
+        </w:rPr>
+        <w:fldChar w:fldCharType="end"/>
+      </w:r>
+      <w:r>
+        <w:rPr>
+          <w:b w:val="0"/>
+          <w:color w:val="000000"/>
+          <w:sz w:val="22"/>
+          <w:lang w:val="fr-FR"/>
+        </w:rPr>
+        <w:t xml:space="preserve"> : États du cycle de vie d'un examen</w:t>
+      </w:r>
+      <w:bookmarkEnd w:id="96"/>
     </w:p>
     <w:p>
       <w:pPr>
@@ -10264,14 +10928,68 @@
           <w:lang w:val="fr-FR"/>
         </w:rPr>
       </w:pPr>
-      <w:r>
-        <w:rPr>
-          <w:rFonts w:ascii="Times New Roman" w:hAnsi="Times New Roman"/>
+      <w:bookmarkStart w:id="99" w:name="_Toc235048702"/>
+      <w:r>
+        <w:rPr>
+          <w:b w:val="0"/>
           <w:color w:val="000000"/>
           <w:sz w:val="22"/>
-        </w:rPr>
-        <w:t>Figure 16 : Séquence de connexion</w:t>
-      </w:r>
+          <w:lang w:val="fr-FR"/>
+        </w:rPr>
+        <w:t xml:space="preserve">Figure </w:t>
+      </w:r>
+      <w:r>
+        <w:rPr>
+          <w:b w:val="0"/>
+          <w:color w:val="000000"/>
+          <w:sz w:val="22"/>
+        </w:rPr>
+        <w:fldChar w:fldCharType="begin"/>
+      </w:r>
+      <w:r>
+        <w:rPr>
+          <w:b w:val="0"/>
+          <w:color w:val="000000"/>
+          <w:sz w:val="22"/>
+          <w:lang w:val="fr-FR"/>
+        </w:rPr>
+        <w:instrText>SEQ Figure \* ARABIC</w:instrText>
+      </w:r>
+      <w:r>
+        <w:rPr>
+          <w:b w:val="0"/>
+          <w:color w:val="000000"/>
+          <w:sz w:val="22"/>
+        </w:rPr>
+        <w:fldChar w:fldCharType="separate"/>
+      </w:r>
+      <w:r>
+        <w:rPr>
+          <w:b w:val="0"/>
+          <w:color w:val="000000"/>
+          <w:sz w:val="22"/>
+          <w:lang w:val="fr-FR"/>
+        </w:rPr>
+        <w:t>19</w:t>
+      </w:r>
+      <w:r>
+        <w:rPr>
+          <w:b w:val="0"/>
+          <w:color w:val="000000"/>
+          <w:sz w:val="22"/>
+        </w:rPr>
+        <w:fldChar w:fldCharType="end"/>
+      </w:r>
+      <w:r>
+        <w:rPr>
+          <w:b w:val="0"/>
+          <w:color w:val="000000"/>
+          <w:sz w:val="22"/>
+          <w:lang w:val="fr-FR"/>
+        </w:rPr>
+        <w:t xml:space="preserve"> : Séquence de connexion</w:t>
+      </w:r>
+      <w:bookmarkEnd w:id="99"/>
     </w:p>
     <w:p>
       <w:pPr>
@@ -10348,14 +11066,68 @@
           <w:lang w:val="fr-FR"/>
         </w:rPr>
       </w:pPr>
-      <w:r>
-        <w:rPr>
-          <w:rFonts w:ascii="Times New Roman" w:hAnsi="Times New Roman"/>
+      <w:bookmarkStart w:id="100" w:name="_Toc235048703"/>
+      <w:r>
+        <w:rPr>
+          <w:b w:val="0"/>
           <w:color w:val="000000"/>
           <w:sz w:val="22"/>
-        </w:rPr>
-        <w:t>Figure 17 : Séquence de publication d'un examen</w:t>
-      </w:r>
+          <w:lang w:val="fr-FR"/>
+        </w:rPr>
+        <w:t xml:space="preserve">Figure </w:t>
+      </w:r>
+      <w:r>
+        <w:rPr>
+          <w:b w:val="0"/>
+          <w:color w:val="000000"/>
+          <w:sz w:val="22"/>
+        </w:rPr>
+        <w:fldChar w:fldCharType="begin"/>
+      </w:r>
+      <w:r>
+        <w:rPr>
+          <w:b w:val="0"/>
+          <w:color w:val="000000"/>
+          <w:sz w:val="22"/>
+          <w:lang w:val="fr-FR"/>
+        </w:rPr>
+        <w:instrText>SEQ Figure \* ARABIC</w:instrText>
+      </w:r>
+      <w:r>
+        <w:rPr>
+          <w:b w:val="0"/>
+          <w:color w:val="000000"/>
+          <w:sz w:val="22"/>
+        </w:rPr>
+        <w:fldChar w:fldCharType="separate"/>
+      </w:r>
+      <w:r>
+        <w:rPr>
+          <w:b w:val="0"/>
+          <w:color w:val="000000"/>
+          <w:sz w:val="22"/>
+          <w:lang w:val="fr-FR"/>
+        </w:rPr>
+        <w:t>20</w:t>
+      </w:r>
+      <w:r>
+        <w:rPr>
+          <w:b w:val="0"/>
+          <w:color w:val="000000"/>
+          <w:sz w:val="22"/>
+        </w:rPr>
+        <w:fldChar w:fldCharType="end"/>
+      </w:r>
+      <w:r>
+        <w:rPr>
+          <w:b w:val="0"/>
+          <w:color w:val="000000"/>
+          <w:sz w:val="22"/>
+          <w:lang w:val="fr-FR"/>
+        </w:rPr>
+        <w:t xml:space="preserve"> : Séquence de publication d'un examen</w:t>
+      </w:r>
+      <w:bookmarkEnd w:id="100"/>
     </w:p>
     <w:p>
       <w:pPr>
@@ -10429,14 +11201,68 @@
           <w:lang w:val="fr-FR"/>
         </w:rPr>
       </w:pPr>
-      <w:r>
-        <w:rPr>
-          <w:rFonts w:ascii="Times New Roman" w:hAnsi="Times New Roman"/>
+      <w:bookmarkStart w:id="101" w:name="_Toc235048704"/>
+      <w:r>
+        <w:rPr>
+          <w:b w:val="0"/>
           <w:color w:val="000000"/>
           <w:sz w:val="22"/>
-        </w:rPr>
-        <w:t>Figure 18 : Séquence d'accès étudiant</w:t>
-      </w:r>
+          <w:lang w:val="fr-FR"/>
+        </w:rPr>
+        <w:t xml:space="preserve">Figure </w:t>
+      </w:r>
+      <w:r>
+        <w:rPr>
+          <w:b w:val="0"/>
+          <w:color w:val="000000"/>
+          <w:sz w:val="22"/>
+        </w:rPr>
+        <w:fldChar w:fldCharType="begin"/>
+      </w:r>
+      <w:r>
+        <w:rPr>
+          <w:b w:val="0"/>
+          <w:color w:val="000000"/>
+          <w:sz w:val="22"/>
+          <w:lang w:val="fr-FR"/>
+        </w:rPr>
+        <w:instrText>SEQ Figure \* ARABIC</w:instrText>
+      </w:r>
+      <w:r>
+        <w:rPr>
+          <w:b w:val="0"/>
+          <w:color w:val="000000"/>
+          <w:sz w:val="22"/>
+        </w:rPr>
+        <w:fldChar w:fldCharType="separate"/>
+      </w:r>
+      <w:r>
+        <w:rPr>
+          <w:b w:val="0"/>
+          <w:color w:val="000000"/>
+          <w:sz w:val="22"/>
+          <w:lang w:val="fr-FR"/>
+        </w:rPr>
+        <w:t>21</w:t>
+      </w:r>
+      <w:r>
+        <w:rPr>
+          <w:b w:val="0"/>
+          <w:color w:val="000000"/>
+          <w:sz w:val="22"/>
+        </w:rPr>
+        <w:fldChar w:fldCharType="end"/>
+      </w:r>
+      <w:r>
+        <w:rPr>
+          <w:b w:val="0"/>
+          <w:color w:val="000000"/>
+          <w:sz w:val="22"/>
+          <w:lang w:val="fr-FR"/>
+        </w:rPr>
+        <w:t xml:space="preserve"> : Séquence d'accès étudiant</w:t>
+      </w:r>
+      <w:bookmarkEnd w:id="101"/>
     </w:p>
     <w:p>
       <w:pPr>
@@ -10509,14 +11335,68 @@
           <w:lang w:val="fr-FR"/>
         </w:rPr>
       </w:pPr>
-      <w:r>
-        <w:rPr>
-          <w:rFonts w:ascii="Times New Roman" w:hAnsi="Times New Roman"/>
+      <w:bookmarkStart w:id="102" w:name="_Toc235048705"/>
+      <w:r>
+        <w:rPr>
+          <w:b w:val="0"/>
           <w:color w:val="000000"/>
           <w:sz w:val="22"/>
-        </w:rPr>
-        <w:t>Figure 19 : Séquence d'exécution du code</w:t>
-      </w:r>
+          <w:lang w:val="fr-FR"/>
+        </w:rPr>
+        <w:t xml:space="preserve">Figure </w:t>
+      </w:r>
+      <w:r>
+        <w:rPr>
+          <w:b w:val="0"/>
+          <w:color w:val="000000"/>
+          <w:sz w:val="22"/>
+        </w:rPr>
+        <w:fldChar w:fldCharType="begin"/>
+      </w:r>
+      <w:r>
+        <w:rPr>
+          <w:b w:val="0"/>
+          <w:color w:val="000000"/>
+          <w:sz w:val="22"/>
+          <w:lang w:val="fr-FR"/>
+        </w:rPr>
+        <w:instrText>SEQ Figure \* ARABIC</w:instrText>
+      </w:r>
+      <w:r>
+        <w:rPr>
+          <w:b w:val="0"/>
+          <w:color w:val="000000"/>
+          <w:sz w:val="22"/>
+        </w:rPr>
+        <w:fldChar w:fldCharType="separate"/>
+      </w:r>
+      <w:r>
+        <w:rPr>
+          <w:b w:val="0"/>
+          <w:color w:val="000000"/>
+          <w:sz w:val="22"/>
+          <w:lang w:val="fr-FR"/>
+        </w:rPr>
+        <w:t>22</w:t>
+      </w:r>
+      <w:r>
+        <w:rPr>
+          <w:b w:val="0"/>
+          <w:color w:val="000000"/>
+          <w:sz w:val="22"/>
+        </w:rPr>
+        <w:fldChar w:fldCharType="end"/>
+      </w:r>
+      <w:r>
+        <w:rPr>
+          <w:b w:val="0"/>
+          <w:color w:val="000000"/>
+          <w:sz w:val="22"/>
+          <w:lang w:val="fr-FR"/>
+        </w:rPr>
+        <w:t xml:space="preserve"> : Séquence d'exécution du code</w:t>
+      </w:r>
+      <w:bookmarkEnd w:id="102"/>
     </w:p>
     <w:p>
       <w:pPr>
@@ -10590,14 +11470,68 @@
           <w:lang w:val="fr-FR"/>
         </w:rPr>
       </w:pPr>
-      <w:r>
-        <w:rPr>
-          <w:rFonts w:ascii="Times New Roman" w:hAnsi="Times New Roman"/>
+      <w:bookmarkStart w:id="103" w:name="_Toc235048706"/>
+      <w:r>
+        <w:rPr>
+          <w:b w:val="0"/>
           <w:color w:val="000000"/>
           <w:sz w:val="22"/>
-        </w:rPr>
-        <w:t>Figure 20 : Séquence de soumission et correction</w:t>
-      </w:r>
+          <w:lang w:val="fr-FR"/>
+        </w:rPr>
+        <w:t xml:space="preserve">Figure </w:t>
+      </w:r>
+      <w:r>
+        <w:rPr>
+          <w:b w:val="0"/>
+          <w:color w:val="000000"/>
+          <w:sz w:val="22"/>
+        </w:rPr>
+        <w:fldChar w:fldCharType="begin"/>
+      </w:r>
+      <w:r>
+        <w:rPr>
+          <w:b w:val="0"/>
+          <w:color w:val="000000"/>
+          <w:sz w:val="22"/>
+          <w:lang w:val="fr-FR"/>
+        </w:rPr>
+        <w:instrText>SEQ Figure \* ARABIC</w:instrText>
+      </w:r>
+      <w:r>
+        <w:rPr>
+          <w:b w:val="0"/>
+          <w:color w:val="000000"/>
+          <w:sz w:val="22"/>
+        </w:rPr>
+        <w:fldChar w:fldCharType="separate"/>
+      </w:r>
+      <w:r>
+        <w:rPr>
+          <w:b w:val="0"/>
+          <w:color w:val="000000"/>
+          <w:sz w:val="22"/>
+          <w:lang w:val="fr-FR"/>
+        </w:rPr>
+        <w:t>23</w:t>
+      </w:r>
+      <w:r>
+        <w:rPr>
+          <w:b w:val="0"/>
+          <w:color w:val="000000"/>
+          <w:sz w:val="22"/>
+        </w:rPr>
+        <w:fldChar w:fldCharType="end"/>
+      </w:r>
+      <w:r>
+        <w:rPr>
+          <w:b w:val="0"/>
+          <w:color w:val="000000"/>
+          <w:sz w:val="22"/>
+          <w:lang w:val="fr-FR"/>
+        </w:rPr>
+        <w:t xml:space="preserve"> : Séquence de soumission et correction</w:t>
+      </w:r>
+      <w:bookmarkEnd w:id="103"/>
     </w:p>
     <w:p>
       <w:pPr>
@@ -10671,14 +11605,68 @@
           <w:lang w:val="fr-FR"/>
         </w:rPr>
       </w:pPr>
-      <w:r>
-        <w:rPr>
-          <w:rFonts w:ascii="Times New Roman" w:hAnsi="Times New Roman"/>
+      <w:bookmarkStart w:id="104" w:name="_Toc235048707"/>
+      <w:r>
+        <w:rPr>
+          <w:b w:val="0"/>
           <w:color w:val="000000"/>
           <w:sz w:val="22"/>
-        </w:rPr>
-        <w:t>Figure 21 : Séquence d'enregistrement d'un incident</w:t>
-      </w:r>
+          <w:lang w:val="fr-FR"/>
+        </w:rPr>
+        <w:t xml:space="preserve">Figure </w:t>
+      </w:r>
+      <w:r>
+        <w:rPr>
+          <w:b w:val="0"/>
+          <w:color w:val="000000"/>
+          <w:sz w:val="22"/>
+        </w:rPr>
+        <w:fldChar w:fldCharType="begin"/>
+      </w:r>
+      <w:r>
+        <w:rPr>
+          <w:b w:val="0"/>
+          <w:color w:val="000000"/>
+          <w:sz w:val="22"/>
+          <w:lang w:val="fr-FR"/>
+        </w:rPr>
+        <w:instrText>SEQ Figure \* ARABIC</w:instrText>
+      </w:r>
+      <w:r>
+        <w:rPr>
+          <w:b w:val="0"/>
+          <w:color w:val="000000"/>
+          <w:sz w:val="22"/>
+        </w:rPr>
+        <w:fldChar w:fldCharType="separate"/>
+      </w:r>
+      <w:r>
+        <w:rPr>
+          <w:b w:val="0"/>
+          <w:color w:val="000000"/>
+          <w:sz w:val="22"/>
+          <w:lang w:val="fr-FR"/>
+        </w:rPr>
+        <w:t>24</w:t>
+      </w:r>
+      <w:r>
+        <w:rPr>
+          <w:b w:val="0"/>
+          <w:color w:val="000000"/>
+          <w:sz w:val="22"/>
+        </w:rPr>
+        <w:fldChar w:fldCharType="end"/>
+      </w:r>
+      <w:r>
+        <w:rPr>
+          <w:b w:val="0"/>
+          <w:color w:val="000000"/>
+          <w:sz w:val="22"/>
+          <w:lang w:val="fr-FR"/>
+        </w:rPr>
+        <w:t xml:space="preserve"> : Séquence d'enregistrement d'un incident</w:t>
+      </w:r>
+      <w:bookmarkEnd w:id="104"/>
     </w:p>
     <w:p>
       <w:pPr>
@@ -10771,14 +11759,68 @@
           <w:lang w:val="fr-FR"/>
         </w:rPr>
       </w:pPr>
-      <w:r>
-        <w:rPr>
-          <w:rFonts w:ascii="Times New Roman" w:hAnsi="Times New Roman"/>
+      <w:bookmarkStart w:id="107" w:name="_Toc235048708"/>
+      <w:r>
+        <w:rPr>
+          <w:b w:val="0"/>
           <w:color w:val="000000"/>
           <w:sz w:val="22"/>
-        </w:rPr>
-        <w:t>Figure 22 : Activité accès et salle d'attente</w:t>
-      </w:r>
+          <w:lang w:val="fr-FR"/>
+        </w:rPr>
+        <w:t xml:space="preserve">Figure </w:t>
+      </w:r>
+      <w:r>
+        <w:rPr>
+          <w:b w:val="0"/>
+          <w:color w:val="000000"/>
+          <w:sz w:val="22"/>
+        </w:rPr>
+        <w:fldChar w:fldCharType="begin"/>
+      </w:r>
+      <w:r>
+        <w:rPr>
+          <w:b w:val="0"/>
+          <w:color w:val="000000"/>
+          <w:sz w:val="22"/>
+          <w:lang w:val="fr-FR"/>
+        </w:rPr>
+        <w:instrText>SEQ Figure \* ARABIC</w:instrText>
+      </w:r>
+      <w:r>
+        <w:rPr>
+          <w:b w:val="0"/>
+          <w:color w:val="000000"/>
+          <w:sz w:val="22"/>
+        </w:rPr>
+        <w:fldChar w:fldCharType="separate"/>
+      </w:r>
+      <w:r>
+        <w:rPr>
+          <w:b w:val="0"/>
+          <w:color w:val="000000"/>
+          <w:sz w:val="22"/>
+          <w:lang w:val="fr-FR"/>
+        </w:rPr>
+        <w:t>25</w:t>
+      </w:r>
+      <w:r>
+        <w:rPr>
+          <w:b w:val="0"/>
+          <w:color w:val="000000"/>
+          <w:sz w:val="22"/>
+        </w:rPr>
+        <w:fldChar w:fldCharType="end"/>
+      </w:r>
+      <w:r>
+        <w:rPr>
+          <w:b w:val="0"/>
+          <w:color w:val="000000"/>
+          <w:sz w:val="22"/>
+          <w:lang w:val="fr-FR"/>
+        </w:rPr>
+        <w:t xml:space="preserve"> : Activité accès et salle d'attente</w:t>
+      </w:r>
+      <w:bookmarkEnd w:id="107"/>
     </w:p>
     <w:p>
       <w:pPr>
@@ -10836,14 +11878,68 @@
           <w:lang w:val="fr-FR"/>
         </w:rPr>
       </w:pPr>
-      <w:r>
-        <w:rPr>
-          <w:rFonts w:ascii="Times New Roman" w:hAnsi="Times New Roman"/>
+      <w:bookmarkStart w:id="108" w:name="_Toc235048709"/>
+      <w:r>
+        <w:rPr>
+          <w:b w:val="0"/>
           <w:color w:val="000000"/>
           <w:sz w:val="22"/>
-        </w:rPr>
-        <w:t>Figure 23 : Activité composition et soumission</w:t>
-      </w:r>
+          <w:lang w:val="fr-FR"/>
+        </w:rPr>
+        <w:t xml:space="preserve">Figure </w:t>
+      </w:r>
+      <w:r>
+        <w:rPr>
+          <w:b w:val="0"/>
+          <w:color w:val="000000"/>
+          <w:sz w:val="22"/>
+        </w:rPr>
+        <w:fldChar w:fldCharType="begin"/>
+      </w:r>
+      <w:r>
+        <w:rPr>
+          <w:b w:val="0"/>
+          <w:color w:val="000000"/>
+          <w:sz w:val="22"/>
+          <w:lang w:val="fr-FR"/>
+        </w:rPr>
+        <w:instrText>SEQ Figure \* ARABIC</w:instrText>
+      </w:r>
+      <w:r>
+        <w:rPr>
+          <w:b w:val="0"/>
+          <w:color w:val="000000"/>
+          <w:sz w:val="22"/>
+        </w:rPr>
+        <w:fldChar w:fldCharType="separate"/>
+      </w:r>
+      <w:r>
+        <w:rPr>
+          <w:b w:val="0"/>
+          <w:color w:val="000000"/>
+          <w:sz w:val="22"/>
+          <w:lang w:val="fr-FR"/>
+        </w:rPr>
+        <w:t>26</w:t>
+      </w:r>
+      <w:r>
+        <w:rPr>
+          <w:b w:val="0"/>
+          <w:color w:val="000000"/>
+          <w:sz w:val="22"/>
+        </w:rPr>
+        <w:fldChar w:fldCharType="end"/>
+      </w:r>
+      <w:r>
+        <w:rPr>
+          <w:b w:val="0"/>
+          <w:color w:val="000000"/>
+          <w:sz w:val="22"/>
+          <w:lang w:val="fr-FR"/>
+        </w:rPr>
+        <w:t xml:space="preserve"> : Activité composition et soumission</w:t>
+      </w:r>
+      <w:bookmarkEnd w:id="108"/>
     </w:p>
     <w:p>
       <w:pPr>
@@ -11451,6 +12547,57 @@
     </w:p>
     <w:p>
       <w:pPr>
+        <w:pStyle w:val="Titre2"/>
+        <w:rPr>
+          <w:lang w:val="fr-FR"/>
+        </w:rPr>
+      </w:pPr>
+      <w:bookmarkStart w:id="116" w:name="bm_ch3_10"/>
+      <w:bookmarkStart w:id="117" w:name="_Toc235048556"/>
+      <w:r>
+        <w:rPr>
+          <w:rFonts w:ascii="Times New Roman" w:eastAsia="Times New Roman" w:hAnsi="Times New Roman"/>
+          <w:lang w:val="fr-FR"/>
+        </w:rPr>
+        <w:t>3.10 Conclusion partielle</w:t>
+      </w:r>
+      <w:bookmarkEnd w:id="116"/>
+      <w:bookmarkEnd w:id="117"/>
+    </w:p>
+    <w:p>
+      <w:pPr>
+        <w:ind w:firstLine="425"/>
+        <w:jc w:val="both"/>
+        <w:rPr>
+          <w:lang w:val="fr-FR"/>
+        </w:rPr>
+      </w:pPr>
+      <w:r>
+        <w:rPr>
+          <w:rFonts w:ascii="Times New Roman" w:hAnsi="Times New Roman" w:eastAsia="Times New Roman"/>
+          <w:b w:val="0"/>
+          <w:i w:val="0"/>
+          <w:color w:val="000000"/>
+          <w:sz w:val="24"/>
+        </w:rPr>
+        <w:t>Au terme de la conception, Cylentic repose sur une application Next.js, des diagrammes UML calés sur le domaine réel, un déploiement lisible, un cycle de vie d'examen explicite et des flux pour les moments sensibles de l'épreuve. Sécurité et correction restent celles d'un MVP : des gardes techniques compréhensibles, un journal utilisable, une note machine qui ne remplace pas le professeur. Le chapitre suivant peut donc s'évaluer sur des fonctions claires.</w:t>
+      </w:r>
+    </w:p>
+    <w:p>
+      <w:pPr>
+        <w:rPr>
+          <w:lang w:val="fr-FR"/>
+        </w:rPr>
+      </w:pPr>
+      <w:r>
+        <w:rPr>
+          <w:lang w:val="fr-FR"/>
+        </w:rPr>
+        <w:br w:type="page"/>
+      </w:r>
+    </w:p>
+    <w:p>
+      <w:pPr>
         <w:pStyle w:val="Titre1"/>
         <w:rPr>
           <w:lang w:val="fr-FR"/>
@@ -11757,12 +12904,65 @@
       </w:pPr>
       <w:r>
         <w:rPr>
-          <w:rFonts w:ascii="Times New Roman" w:hAnsi="Times New Roman"/>
+          <w:b w:val="0"/>
           <w:color w:val="000000"/>
           <w:sz w:val="22"/>
-        </w:rPr>
-        <w:t>Figure 24 : Page de connexion multi rôles</w:t>
-      </w:r>
+          <w:lang w:val="fr-FR"/>
+        </w:rPr>
+        <w:t xml:space="preserve">Figure </w:t>
+      </w:r>
+      <w:r>
+        <w:rPr>
+          <w:b w:val="0"/>
+          <w:color w:val="000000"/>
+          <w:sz w:val="22"/>
+        </w:rPr>
+        <w:fldChar w:fldCharType="begin"/>
+      </w:r>
+      <w:r>
+        <w:rPr>
+          <w:b w:val="0"/>
+          <w:color w:val="000000"/>
+          <w:sz w:val="22"/>
+          <w:lang w:val="fr-FR"/>
+        </w:rPr>
+        <w:instrText>SEQ Figure \* ARABIC</w:instrText>
+      </w:r>
+      <w:r>
+        <w:rPr>
+          <w:b w:val="0"/>
+          <w:color w:val="000000"/>
+          <w:sz w:val="22"/>
+        </w:rPr>
+        <w:fldChar w:fldCharType="separate"/>
+      </w:r>
+      <w:r>
+        <w:rPr>
+          <w:b w:val="0"/>
+          <w:color w:val="000000"/>
+          <w:sz w:val="22"/>
+          <w:lang w:val="fr-FR"/>
+        </w:rPr>
+        <w:t>27</w:t>
+      </w:r>
+      <w:r>
+        <w:rPr>
+          <w:b w:val="0"/>
+          <w:color w:val="000000"/>
+          <w:sz w:val="22"/>
+        </w:rPr>
+        <w:fldChar w:fldCharType="end"/>
+      </w:r>
+      <w:r>
+        <w:rPr>
+          <w:b w:val="0"/>
+          <w:color w:val="000000"/>
+          <w:sz w:val="22"/>
+          <w:lang w:val="fr-FR"/>
+        </w:rPr>
+        <w:t xml:space="preserve"> : Page de connexion multi rôles</w:t>
+      </w:r>
+      <w:bookmarkEnd w:id="131"/>
     </w:p>
     <w:p>
       <w:pPr>
@@ -11909,14 +13109,68 @@
           <w:lang w:val="fr-FR"/>
         </w:rPr>
       </w:pPr>
-      <w:r>
-        <w:rPr>
-          <w:rFonts w:ascii="Times New Roman" w:hAnsi="Times New Roman"/>
+      <w:bookmarkStart w:id="134" w:name="_Toc235048711"/>
+      <w:r>
+        <w:rPr>
+          <w:b w:val="0"/>
           <w:color w:val="000000"/>
           <w:sz w:val="22"/>
-        </w:rPr>
-        <w:t>Figure 25 : Espace administrateur d'établissement</w:t>
-      </w:r>
+          <w:lang w:val="fr-FR"/>
+        </w:rPr>
+        <w:t xml:space="preserve">Figure </w:t>
+      </w:r>
+      <w:r>
+        <w:rPr>
+          <w:b w:val="0"/>
+          <w:color w:val="000000"/>
+          <w:sz w:val="22"/>
+        </w:rPr>
+        <w:fldChar w:fldCharType="begin"/>
+      </w:r>
+      <w:r>
+        <w:rPr>
+          <w:b w:val="0"/>
+          <w:color w:val="000000"/>
+          <w:sz w:val="22"/>
+          <w:lang w:val="fr-FR"/>
+        </w:rPr>
+        <w:instrText>SEQ Figure \* ARABIC</w:instrText>
+      </w:r>
+      <w:r>
+        <w:rPr>
+          <w:b w:val="0"/>
+          <w:color w:val="000000"/>
+          <w:sz w:val="22"/>
+        </w:rPr>
+        <w:fldChar w:fldCharType="separate"/>
+      </w:r>
+      <w:r>
+        <w:rPr>
+          <w:b w:val="0"/>
+          <w:color w:val="000000"/>
+          <w:sz w:val="22"/>
+          <w:lang w:val="fr-FR"/>
+        </w:rPr>
+        <w:t>28</w:t>
+      </w:r>
+      <w:r>
+        <w:rPr>
+          <w:b w:val="0"/>
+          <w:color w:val="000000"/>
+          <w:sz w:val="22"/>
+        </w:rPr>
+        <w:fldChar w:fldCharType="end"/>
+      </w:r>
+      <w:r>
+        <w:rPr>
+          <w:b w:val="0"/>
+          <w:color w:val="000000"/>
+          <w:sz w:val="22"/>
+          <w:lang w:val="fr-FR"/>
+        </w:rPr>
+        <w:t xml:space="preserve"> : Espace administrateur d'établissement</w:t>
+      </w:r>
+      <w:bookmarkEnd w:id="134"/>
     </w:p>
     <w:p>
       <w:pPr>
@@ -12040,14 +13294,68 @@
           <w:lang w:val="fr-FR"/>
         </w:rPr>
       </w:pPr>
-      <w:r>
-        <w:rPr>
-          <w:rFonts w:ascii="Times New Roman" w:hAnsi="Times New Roman"/>
+      <w:bookmarkStart w:id="137" w:name="_Toc235048712"/>
+      <w:r>
+        <w:rPr>
+          <w:b w:val="0"/>
           <w:color w:val="000000"/>
           <w:sz w:val="22"/>
-        </w:rPr>
-        <w:t>Figure 26 : Composition d'un examen côté professeur</w:t>
-      </w:r>
+          <w:lang w:val="fr-FR"/>
+        </w:rPr>
+        <w:t xml:space="preserve">Figure </w:t>
+      </w:r>
+      <w:r>
+        <w:rPr>
+          <w:b w:val="0"/>
+          <w:color w:val="000000"/>
+          <w:sz w:val="22"/>
+        </w:rPr>
+        <w:fldChar w:fldCharType="begin"/>
+      </w:r>
+      <w:r>
+        <w:rPr>
+          <w:b w:val="0"/>
+          <w:color w:val="000000"/>
+          <w:sz w:val="22"/>
+          <w:lang w:val="fr-FR"/>
+        </w:rPr>
+        <w:instrText>SEQ Figure \* ARABIC</w:instrText>
+      </w:r>
+      <w:r>
+        <w:rPr>
+          <w:b w:val="0"/>
+          <w:color w:val="000000"/>
+          <w:sz w:val="22"/>
+        </w:rPr>
+        <w:fldChar w:fldCharType="separate"/>
+      </w:r>
+      <w:r>
+        <w:rPr>
+          <w:b w:val="0"/>
+          <w:color w:val="000000"/>
+          <w:sz w:val="22"/>
+          <w:lang w:val="fr-FR"/>
+        </w:rPr>
+        <w:t>29</w:t>
+      </w:r>
+      <w:r>
+        <w:rPr>
+          <w:b w:val="0"/>
+          <w:color w:val="000000"/>
+          <w:sz w:val="22"/>
+        </w:rPr>
+        <w:fldChar w:fldCharType="end"/>
+      </w:r>
+      <w:r>
+        <w:rPr>
+          <w:b w:val="0"/>
+          <w:color w:val="000000"/>
+          <w:sz w:val="22"/>
+          <w:lang w:val="fr-FR"/>
+        </w:rPr>
+        <w:t xml:space="preserve"> : Composition d'un examen côté professeur</w:t>
+      </w:r>
+      <w:bookmarkEnd w:id="137"/>
     </w:p>
     <w:p>
       <w:pPr>
@@ -12114,14 +13422,68 @@
           <w:lang w:val="fr-FR"/>
         </w:rPr>
       </w:pPr>
-      <w:r>
-        <w:rPr>
-          <w:rFonts w:ascii="Times New Roman" w:hAnsi="Times New Roman"/>
+      <w:bookmarkStart w:id="138" w:name="_Toc235048713"/>
+      <w:r>
+        <w:rPr>
+          <w:b w:val="0"/>
           <w:color w:val="000000"/>
           <w:sz w:val="22"/>
-        </w:rPr>
-        <w:t>Figure 27 : Publication et code d'accès d'examen</w:t>
-      </w:r>
+          <w:lang w:val="fr-FR"/>
+        </w:rPr>
+        <w:t xml:space="preserve">Figure </w:t>
+      </w:r>
+      <w:r>
+        <w:rPr>
+          <w:b w:val="0"/>
+          <w:color w:val="000000"/>
+          <w:sz w:val="22"/>
+        </w:rPr>
+        <w:fldChar w:fldCharType="begin"/>
+      </w:r>
+      <w:r>
+        <w:rPr>
+          <w:b w:val="0"/>
+          <w:color w:val="000000"/>
+          <w:sz w:val="22"/>
+          <w:lang w:val="fr-FR"/>
+        </w:rPr>
+        <w:instrText>SEQ Figure \* ARABIC</w:instrText>
+      </w:r>
+      <w:r>
+        <w:rPr>
+          <w:b w:val="0"/>
+          <w:color w:val="000000"/>
+          <w:sz w:val="22"/>
+        </w:rPr>
+        <w:fldChar w:fldCharType="separate"/>
+      </w:r>
+      <w:r>
+        <w:rPr>
+          <w:b w:val="0"/>
+          <w:color w:val="000000"/>
+          <w:sz w:val="22"/>
+          <w:lang w:val="fr-FR"/>
+        </w:rPr>
+        <w:t>30</w:t>
+      </w:r>
+      <w:r>
+        <w:rPr>
+          <w:b w:val="0"/>
+          <w:color w:val="000000"/>
+          <w:sz w:val="22"/>
+        </w:rPr>
+        <w:fldChar w:fldCharType="end"/>
+      </w:r>
+      <w:r>
+        <w:rPr>
+          <w:b w:val="0"/>
+          <w:color w:val="000000"/>
+          <w:sz w:val="22"/>
+          <w:lang w:val="fr-FR"/>
+        </w:rPr>
+        <w:t xml:space="preserve"> : Publication et code d'accès d'examen</w:t>
+      </w:r>
+      <w:bookmarkEnd w:id="138"/>
     </w:p>
     <w:p>
       <w:pPr>
@@ -12189,14 +13551,68 @@
           <w:lang w:val="fr-FR"/>
         </w:rPr>
       </w:pPr>
-      <w:r>
-        <w:rPr>
-          <w:rFonts w:ascii="Times New Roman" w:hAnsi="Times New Roman"/>
+      <w:bookmarkStart w:id="139" w:name="_Toc235048714"/>
+      <w:r>
+        <w:rPr>
+          <w:b w:val="0"/>
           <w:color w:val="000000"/>
           <w:sz w:val="22"/>
-        </w:rPr>
-        <w:t>Figure 28 : Suivi live des participations</w:t>
-      </w:r>
+          <w:lang w:val="fr-FR"/>
+        </w:rPr>
+        <w:t xml:space="preserve">Figure </w:t>
+      </w:r>
+      <w:r>
+        <w:rPr>
+          <w:b w:val="0"/>
+          <w:color w:val="000000"/>
+          <w:sz w:val="22"/>
+        </w:rPr>
+        <w:fldChar w:fldCharType="begin"/>
+      </w:r>
+      <w:r>
+        <w:rPr>
+          <w:b w:val="0"/>
+          <w:color w:val="000000"/>
+          <w:sz w:val="22"/>
+          <w:lang w:val="fr-FR"/>
+        </w:rPr>
+        <w:instrText>SEQ Figure \* ARABIC</w:instrText>
+      </w:r>
+      <w:r>
+        <w:rPr>
+          <w:b w:val="0"/>
+          <w:color w:val="000000"/>
+          <w:sz w:val="22"/>
+        </w:rPr>
+        <w:fldChar w:fldCharType="separate"/>
+      </w:r>
+      <w:r>
+        <w:rPr>
+          <w:b w:val="0"/>
+          <w:color w:val="000000"/>
+          <w:sz w:val="22"/>
+          <w:lang w:val="fr-FR"/>
+        </w:rPr>
+        <w:t>31</w:t>
+      </w:r>
+      <w:r>
+        <w:rPr>
+          <w:b w:val="0"/>
+          <w:color w:val="000000"/>
+          <w:sz w:val="22"/>
+        </w:rPr>
+        <w:fldChar w:fldCharType="end"/>
+      </w:r>
+      <w:r>
+        <w:rPr>
+          <w:b w:val="0"/>
+          <w:color w:val="000000"/>
+          <w:sz w:val="22"/>
+          <w:lang w:val="fr-FR"/>
+        </w:rPr>
+        <w:t xml:space="preserve"> : Suivi live des participations</w:t>
+      </w:r>
+      <w:bookmarkEnd w:id="139"/>
     </w:p>
     <w:p>
       <w:pPr>
@@ -12263,14 +13679,68 @@
           <w:lang w:val="fr-FR"/>
         </w:rPr>
       </w:pPr>
-      <w:r>
-        <w:rPr>
-          <w:rFonts w:ascii="Times New Roman" w:hAnsi="Times New Roman"/>
+      <w:bookmarkStart w:id="140" w:name="_Toc235048715"/>
+      <w:r>
+        <w:rPr>
+          <w:b w:val="0"/>
           <w:color w:val="000000"/>
           <w:sz w:val="22"/>
-        </w:rPr>
-        <w:t>Figure 29 : Résultats et exports professeur</w:t>
-      </w:r>
+          <w:lang w:val="fr-FR"/>
+        </w:rPr>
+        <w:t xml:space="preserve">Figure </w:t>
+      </w:r>
+      <w:r>
+        <w:rPr>
+          <w:b w:val="0"/>
+          <w:color w:val="000000"/>
+          <w:sz w:val="22"/>
+        </w:rPr>
+        <w:fldChar w:fldCharType="begin"/>
+      </w:r>
+      <w:r>
+        <w:rPr>
+          <w:b w:val="0"/>
+          <w:color w:val="000000"/>
+          <w:sz w:val="22"/>
+          <w:lang w:val="fr-FR"/>
+        </w:rPr>
+        <w:instrText>SEQ Figure \* ARABIC</w:instrText>
+      </w:r>
+      <w:r>
+        <w:rPr>
+          <w:b w:val="0"/>
+          <w:color w:val="000000"/>
+          <w:sz w:val="22"/>
+        </w:rPr>
+        <w:fldChar w:fldCharType="separate"/>
+      </w:r>
+      <w:r>
+        <w:rPr>
+          <w:b w:val="0"/>
+          <w:color w:val="000000"/>
+          <w:sz w:val="22"/>
+          <w:lang w:val="fr-FR"/>
+        </w:rPr>
+        <w:t>32</w:t>
+      </w:r>
+      <w:r>
+        <w:rPr>
+          <w:b w:val="0"/>
+          <w:color w:val="000000"/>
+          <w:sz w:val="22"/>
+        </w:rPr>
+        <w:fldChar w:fldCharType="end"/>
+      </w:r>
+      <w:r>
+        <w:rPr>
+          <w:b w:val="0"/>
+          <w:color w:val="000000"/>
+          <w:sz w:val="22"/>
+          <w:lang w:val="fr-FR"/>
+        </w:rPr>
+        <w:t xml:space="preserve"> : Résultats et exports professeur</w:t>
+      </w:r>
+      <w:bookmarkEnd w:id="140"/>
     </w:p>
     <w:p>
       <w:pPr>
@@ -12385,14 +13855,68 @@
           <w:lang w:val="fr-FR"/>
         </w:rPr>
       </w:pPr>
-      <w:r>
-        <w:rPr>
-          <w:rFonts w:ascii="Times New Roman" w:hAnsi="Times New Roman"/>
+      <w:bookmarkStart w:id="143" w:name="_Toc235048716"/>
+      <w:r>
+        <w:rPr>
+          <w:b w:val="0"/>
           <w:color w:val="000000"/>
           <w:sz w:val="22"/>
-        </w:rPr>
-        <w:t>Figure 30 : Consignes et activation du plein écran</w:t>
-      </w:r>
+          <w:lang w:val="fr-FR"/>
+        </w:rPr>
+        <w:t xml:space="preserve">Figure </w:t>
+      </w:r>
+      <w:r>
+        <w:rPr>
+          <w:b w:val="0"/>
+          <w:color w:val="000000"/>
+          <w:sz w:val="22"/>
+        </w:rPr>
+        <w:fldChar w:fldCharType="begin"/>
+      </w:r>
+      <w:r>
+        <w:rPr>
+          <w:b w:val="0"/>
+          <w:color w:val="000000"/>
+          <w:sz w:val="22"/>
+          <w:lang w:val="fr-FR"/>
+        </w:rPr>
+        <w:instrText>SEQ Figure \* ARABIC</w:instrText>
+      </w:r>
+      <w:r>
+        <w:rPr>
+          <w:b w:val="0"/>
+          <w:color w:val="000000"/>
+          <w:sz w:val="22"/>
+        </w:rPr>
+        <w:fldChar w:fldCharType="separate"/>
+      </w:r>
+      <w:r>
+        <w:rPr>
+          <w:b w:val="0"/>
+          <w:color w:val="000000"/>
+          <w:sz w:val="22"/>
+          <w:lang w:val="fr-FR"/>
+        </w:rPr>
+        <w:t>33</w:t>
+      </w:r>
+      <w:r>
+        <w:rPr>
+          <w:b w:val="0"/>
+          <w:color w:val="000000"/>
+          <w:sz w:val="22"/>
+        </w:rPr>
+        <w:fldChar w:fldCharType="end"/>
+      </w:r>
+      <w:r>
+        <w:rPr>
+          <w:b w:val="0"/>
+          <w:color w:val="000000"/>
+          <w:sz w:val="22"/>
+          <w:lang w:val="fr-FR"/>
+        </w:rPr>
+        <w:t xml:space="preserve"> : Consignes et activation du plein écran</w:t>
+      </w:r>
+      <w:bookmarkEnd w:id="143"/>
     </w:p>
     <w:p>
       <w:pPr>
@@ -12453,14 +13977,68 @@
           <w:lang w:val="fr-FR"/>
         </w:rPr>
       </w:pPr>
-      <w:r>
-        <w:rPr>
-          <w:rFonts w:ascii="Times New Roman" w:hAnsi="Times New Roman"/>
+      <w:bookmarkStart w:id="144" w:name="_Toc235048717"/>
+      <w:r>
+        <w:rPr>
+          <w:b w:val="0"/>
           <w:color w:val="000000"/>
           <w:sz w:val="22"/>
-        </w:rPr>
-        <w:t>Figure 31 : Salle d'attente avant le démarrage de l'examen</w:t>
-      </w:r>
+          <w:lang w:val="fr-FR"/>
+        </w:rPr>
+        <w:t xml:space="preserve">Figure </w:t>
+      </w:r>
+      <w:r>
+        <w:rPr>
+          <w:b w:val="0"/>
+          <w:color w:val="000000"/>
+          <w:sz w:val="22"/>
+        </w:rPr>
+        <w:fldChar w:fldCharType="begin"/>
+      </w:r>
+      <w:r>
+        <w:rPr>
+          <w:b w:val="0"/>
+          <w:color w:val="000000"/>
+          <w:sz w:val="22"/>
+          <w:lang w:val="fr-FR"/>
+        </w:rPr>
+        <w:instrText>SEQ Figure \* ARABIC</w:instrText>
+      </w:r>
+      <w:r>
+        <w:rPr>
+          <w:b w:val="0"/>
+          <w:color w:val="000000"/>
+          <w:sz w:val="22"/>
+        </w:rPr>
+        <w:fldChar w:fldCharType="separate"/>
+      </w:r>
+      <w:r>
+        <w:rPr>
+          <w:b w:val="0"/>
+          <w:color w:val="000000"/>
+          <w:sz w:val="22"/>
+          <w:lang w:val="fr-FR"/>
+        </w:rPr>
+        <w:t>34</w:t>
+      </w:r>
+      <w:r>
+        <w:rPr>
+          <w:b w:val="0"/>
+          <w:color w:val="000000"/>
+          <w:sz w:val="22"/>
+        </w:rPr>
+        <w:fldChar w:fldCharType="end"/>
+      </w:r>
+      <w:r>
+        <w:rPr>
+          <w:b w:val="0"/>
+          <w:color w:val="000000"/>
+          <w:sz w:val="22"/>
+          <w:lang w:val="fr-FR"/>
+        </w:rPr>
+        <w:t xml:space="preserve"> : Salle d'attente avant le démarrage de l'examen</w:t>
+      </w:r>
+      <w:bookmarkEnd w:id="144"/>
     </w:p>
     <w:p>
       <w:pPr>
@@ -12538,14 +14116,68 @@
           <w:lang w:val="fr-FR"/>
         </w:rPr>
       </w:pPr>
-      <w:r>
-        <w:rPr>
-          <w:rFonts w:ascii="Times New Roman" w:hAnsi="Times New Roman"/>
+      <w:bookmarkStart w:id="145" w:name="_Toc235048718"/>
+      <w:r>
+        <w:rPr>
+          <w:b w:val="0"/>
           <w:color w:val="000000"/>
           <w:sz w:val="22"/>
-        </w:rPr>
-        <w:t>Figure 32 : Environnement de composition pendant l'épreuve</w:t>
-      </w:r>
+          <w:lang w:val="fr-FR"/>
+        </w:rPr>
+        <w:t xml:space="preserve">Figure </w:t>
+      </w:r>
+      <w:r>
+        <w:rPr>
+          <w:b w:val="0"/>
+          <w:color w:val="000000"/>
+          <w:sz w:val="22"/>
+        </w:rPr>
+        <w:fldChar w:fldCharType="begin"/>
+      </w:r>
+      <w:r>
+        <w:rPr>
+          <w:b w:val="0"/>
+          <w:color w:val="000000"/>
+          <w:sz w:val="22"/>
+          <w:lang w:val="fr-FR"/>
+        </w:rPr>
+        <w:instrText>SEQ Figure \* ARABIC</w:instrText>
+      </w:r>
+      <w:r>
+        <w:rPr>
+          <w:b w:val="0"/>
+          <w:color w:val="000000"/>
+          <w:sz w:val="22"/>
+        </w:rPr>
+        <w:fldChar w:fldCharType="separate"/>
+      </w:r>
+      <w:r>
+        <w:rPr>
+          <w:b w:val="0"/>
+          <w:color w:val="000000"/>
+          <w:sz w:val="22"/>
+          <w:lang w:val="fr-FR"/>
+        </w:rPr>
+        <w:t>35</w:t>
+      </w:r>
+      <w:r>
+        <w:rPr>
+          <w:b w:val="0"/>
+          <w:color w:val="000000"/>
+          <w:sz w:val="22"/>
+        </w:rPr>
+        <w:fldChar w:fldCharType="end"/>
+      </w:r>
+      <w:r>
+        <w:rPr>
+          <w:b w:val="0"/>
+          <w:color w:val="000000"/>
+          <w:sz w:val="22"/>
+          <w:lang w:val="fr-FR"/>
+        </w:rPr>
+        <w:t xml:space="preserve"> : Environnement de composition pendant l'épreuve</w:t>
+      </w:r>
+      <w:bookmarkEnd w:id="145"/>
     </w:p>
     <w:p>
       <w:pPr>
@@ -12714,14 +14346,68 @@
           <w:lang w:val="fr-FR"/>
         </w:rPr>
       </w:pPr>
-      <w:r>
-        <w:rPr>
-          <w:rFonts w:ascii="Times New Roman" w:hAnsi="Times New Roman"/>
+      <w:bookmarkStart w:id="150" w:name="_Toc235048719"/>
+      <w:r>
+        <w:rPr>
+          <w:b w:val="0"/>
           <w:color w:val="000000"/>
           <w:sz w:val="22"/>
-        </w:rPr>
-        <w:t>Figure 33 : Page d'accueil Cylentic</w:t>
-      </w:r>
+          <w:lang w:val="fr-FR"/>
+        </w:rPr>
+        <w:t xml:space="preserve">Figure </w:t>
+      </w:r>
+      <w:r>
+        <w:rPr>
+          <w:b w:val="0"/>
+          <w:color w:val="000000"/>
+          <w:sz w:val="22"/>
+        </w:rPr>
+        <w:fldChar w:fldCharType="begin"/>
+      </w:r>
+      <w:r>
+        <w:rPr>
+          <w:b w:val="0"/>
+          <w:color w:val="000000"/>
+          <w:sz w:val="22"/>
+          <w:lang w:val="fr-FR"/>
+        </w:rPr>
+        <w:instrText>SEQ Figure \* ARABIC</w:instrText>
+      </w:r>
+      <w:r>
+        <w:rPr>
+          <w:b w:val="0"/>
+          <w:color w:val="000000"/>
+          <w:sz w:val="22"/>
+        </w:rPr>
+        <w:fldChar w:fldCharType="separate"/>
+      </w:r>
+      <w:r>
+        <w:rPr>
+          <w:b w:val="0"/>
+          <w:color w:val="000000"/>
+          <w:sz w:val="22"/>
+          <w:lang w:val="fr-FR"/>
+        </w:rPr>
+        <w:t>36</w:t>
+      </w:r>
+      <w:r>
+        <w:rPr>
+          <w:b w:val="0"/>
+          <w:color w:val="000000"/>
+          <w:sz w:val="22"/>
+        </w:rPr>
+        <w:fldChar w:fldCharType="end"/>
+      </w:r>
+      <w:r>
+        <w:rPr>
+          <w:b w:val="0"/>
+          <w:color w:val="000000"/>
+          <w:sz w:val="22"/>
+          <w:lang w:val="fr-FR"/>
+        </w:rPr>
+        <w:t xml:space="preserve"> : Page d'accueil Cylentic</w:t>
+      </w:r>
+      <w:bookmarkEnd w:id="150"/>
     </w:p>
     <w:p>
       <w:pPr>
@@ -12799,6 +14485,57 @@
         </w:rPr>
         <w:lastRenderedPageBreak/>
         <w:t>http://adresse-de-l-hote:3000 depuis les postes étudiants. Il faut parfois ouvrir le port 3000 dans le pare-feu de la machine hôte. En production derrière HTTPS, le cookie Secure peut être activé normalement, avec ou sans FORCE_SECURE_COOKIES selon le proxy.</w:t>
+      </w:r>
+    </w:p>
+    <w:p>
+      <w:pPr>
+        <w:pStyle w:val="Titre2"/>
+        <w:rPr>
+          <w:lang w:val="fr-FR"/>
+        </w:rPr>
+      </w:pPr>
+      <w:bookmarkStart w:id="155" w:name="bm_ch4_7"/>
+      <w:bookmarkStart w:id="156" w:name="_Toc235048570"/>
+      <w:r>
+        <w:rPr>
+          <w:rFonts w:ascii="Times New Roman" w:eastAsia="Times New Roman" w:hAnsi="Times New Roman"/>
+          <w:lang w:val="fr-FR"/>
+        </w:rPr>
+        <w:t>4.7 Conclusion partielle</w:t>
+      </w:r>
+      <w:bookmarkEnd w:id="155"/>
+      <w:bookmarkEnd w:id="156"/>
+    </w:p>
+    <w:p>
+      <w:pPr>
+        <w:ind w:firstLine="425"/>
+        <w:jc w:val="both"/>
+        <w:rPr>
+          <w:lang w:val="fr-FR"/>
+        </w:rPr>
+      </w:pPr>
+      <w:r>
+        <w:rPr>
+          <w:rFonts w:ascii="Times New Roman" w:hAnsi="Times New Roman" w:eastAsia="Times New Roman"/>
+          <w:b w:val="0"/>
+          <w:i w:val="0"/>
+          <w:color w:val="000000"/>
+          <w:sz w:val="24"/>
+        </w:rPr>
+        <w:t>Le MVP forme aujourd'hui une chaîne complète, assez intégrée pour une démonstration et pour des essais pilotes. Nous avons d'abord solidifié les parcours critiques (authentification, examen, contrôles de passation, correction, exports), plutôt qu'une infrastructure temps réel complète. Redis, les workers et le multi langage restent pour la suite.</w:t>
+      </w:r>
+    </w:p>
+    <w:p>
+      <w:pPr>
+        <w:rPr>
+          <w:lang w:val="fr-FR"/>
+        </w:rPr>
+      </w:pPr>
+      <w:r>
+        <w:rPr>
+          <w:lang w:val="fr-FR"/>
+        </w:rPr>
+        <w:br w:type="page"/>
       </w:r>
     </w:p>
     <w:p>
@@ -13202,6 +14939,57 @@
           <w:sz w:val="24"/>
         </w:rPr>
         <w:t>Quelques priorités se dégagent. Il faudra d'abord automatiser le parcours connexion, publication, composition et soumission. Redis devient utile dès que le suivi live dépasse quelques dizaines d'étudiants en même temps. Une procédure salle simple (adresse, pare-feu, navigateurs supportés) évitera les improvisations le jour J. Enfin, le cadre juridique doit être posé tôt, avant toute tentation de surveillance trop intrusive.</w:t>
+      </w:r>
+    </w:p>
+    <w:p>
+      <w:pPr>
+        <w:pStyle w:val="Titre2"/>
+        <w:rPr>
+          <w:lang w:val="fr-FR"/>
+        </w:rPr>
+      </w:pPr>
+      <w:bookmarkStart w:id="178" w:name="bm_ch5_6"/>
+      <w:bookmarkStart w:id="179" w:name="_Toc235048581"/>
+      <w:r>
+        <w:rPr>
+          <w:rFonts w:ascii="Times New Roman" w:eastAsia="Times New Roman" w:hAnsi="Times New Roman"/>
+          <w:lang w:val="fr-FR"/>
+        </w:rPr>
+        <w:t>5.6 Conclusion partielle</w:t>
+      </w:r>
+      <w:bookmarkEnd w:id="178"/>
+      <w:bookmarkEnd w:id="179"/>
+    </w:p>
+    <w:p>
+      <w:pPr>
+        <w:ind w:firstLine="425"/>
+        <w:jc w:val="both"/>
+        <w:rPr>
+          <w:lang w:val="fr-FR"/>
+        </w:rPr>
+      </w:pPr>
+      <w:r>
+        <w:rPr>
+          <w:rFonts w:ascii="Times New Roman" w:hAnsi="Times New Roman" w:eastAsia="Times New Roman"/>
+          <w:b w:val="0"/>
+          <w:i w:val="0"/>
+          <w:color w:val="000000"/>
+          <w:sz w:val="24"/>
+        </w:rPr>
+        <w:t>Au bilan, le MVP Cylentic se démontre sur son périmètre et reste cohérent techniquement. Ce qui manque encore vient surtout de choix de priorité (temps réel, multi langages, tests automatisés), pas d'une faille d'architecture de fond.</w:t>
+      </w:r>
+    </w:p>
+    <w:p>
+      <w:pPr>
+        <w:rPr>
+          <w:lang w:val="fr-FR"/>
+        </w:rPr>
+      </w:pPr>
+      <w:r>
+        <w:rPr>
+          <w:lang w:val="fr-FR"/>
+        </w:rPr>
+        <w:br w:type="page"/>
       </w:r>
     </w:p>
     <w:p>

</xml_diff>

<commit_message>
Corriger uniquement dédicace et ordre alphabétique des sigles
Base: document final utilisateur. Aucune autre modification.

Co-authored-by: progirix <progirix@users.noreply.github.com>
</commit_message>
<xml_diff>
--- a/docs/Rapport_Cylentic.docx
+++ b/docs/Rapport_Cylentic.docx
@@ -896,7 +896,6 @@
     </w:p>
     <w:p>
       <w:pPr>
-        <w:spacing w:line="360" w:lineRule="auto" w:after="160"/>
         <w:ind w:firstLine="0"/>
         <w:jc w:val="center"/>
       </w:pPr>
@@ -2383,7 +2382,7 @@
     </w:p>
     <w:p>
       <w:pPr>
-        <w:spacing w:line="360" w:lineRule="auto" w:after="160"/>
+        <w:spacing w:after="60"/>
         <w:ind w:firstLine="0"/>
         <w:jc w:val="left"/>
       </w:pPr>
@@ -2399,9 +2398,12 @@
     </w:p>
     <w:p>
       <w:pPr>
-        <w:spacing w:line="360" w:lineRule="auto" w:after="160"/>
+        <w:spacing w:after="60"/>
         <w:ind w:firstLine="0"/>
         <w:jc w:val="left"/>
+        <w:rPr>
+          <w:lang w:val="en-US"/>
+        </w:rPr>
       </w:pPr>
       <w:r>
         <w:rPr>
@@ -2409,15 +2411,25 @@
           <w:b w:val="0"/>
           <w:color w:val="000000"/>
           <w:sz w:val="24"/>
-        </w:rPr>
-        <w:t>ETU : Préfixe d'identifiant étudiant</w:t>
-      </w:r>
-    </w:p>
-    <w:p>
-      <w:pPr>
-        <w:spacing w:line="360" w:lineRule="auto" w:after="160"/>
+          <w:lang w:val="en-US"/>
+        </w:rPr>
+        <w:t>API : Application Programming Interface</w:t>
+      </w:r>
+      <w:r>
+        <w:rPr>
+          <w:color w:val="000000"/>
+          <w:lang w:val="en-US"/>
+        </w:rPr>
+      </w:r>
+    </w:p>
+    <w:p>
+      <w:pPr>
+        <w:spacing w:after="60"/>
         <w:ind w:firstLine="0"/>
         <w:jc w:val="left"/>
+        <w:rPr>
+          <w:lang w:val="en-US"/>
+        </w:rPr>
       </w:pPr>
       <w:r>
         <w:rPr>
@@ -2425,6 +2437,45 @@
           <w:b w:val="0"/>
           <w:color w:val="000000"/>
           <w:sz w:val="24"/>
+          <w:lang w:val="en-US"/>
+        </w:rPr>
+        <w:t>CSV : Comma-Separated Values</w:t>
+      </w:r>
+      <w:r>
+        <w:rPr>
+          <w:color w:val="000000"/>
+          <w:lang w:val="en-US"/>
+        </w:rPr>
+      </w:r>
+    </w:p>
+    <w:p>
+      <w:pPr>
+        <w:spacing w:after="60"/>
+        <w:ind w:firstLine="0"/>
+        <w:jc w:val="left"/>
+      </w:pPr>
+      <w:r>
+        <w:rPr>
+          <w:rFonts w:ascii="Times New Roman" w:hAnsi="Times New Roman" w:eastAsia="Times New Roman"/>
+          <w:b w:val="0"/>
+          <w:color w:val="000000"/>
+          <w:sz w:val="24"/>
+        </w:rPr>
+        <w:t>ETU : Préfixe d'identifiant étudiant</w:t>
+      </w:r>
+    </w:p>
+    <w:p>
+      <w:pPr>
+        <w:spacing w:after="60"/>
+        <w:ind w:firstLine="0"/>
+        <w:jc w:val="left"/>
+      </w:pPr>
+      <w:r>
+        <w:rPr>
+          <w:rFonts w:ascii="Times New Roman" w:hAnsi="Times New Roman" w:eastAsia="Times New Roman"/>
+          <w:b w:val="0"/>
+          <w:color w:val="000000"/>
+          <w:sz w:val="24"/>
         </w:rPr>
         <w:t>HTTP : HyperText Transfer Protocol</w:t>
       </w:r>
@@ -2432,329 +2483,341 @@
     <w:p>
       <w:pPr>
         <w:spacing w:after="60"/>
+        <w:ind w:firstLine="0"/>
+        <w:jc w:val="left"/>
         <w:rPr>
           <w:lang w:val="en-US"/>
         </w:rPr>
       </w:pPr>
       <w:r>
         <w:rPr>
-          <w:color w:val="000000"/>
+          <w:rFonts w:ascii="Times New Roman" w:hAnsi="Times New Roman" w:eastAsia="Times New Roman"/>
+          <w:b w:val="0"/>
+          <w:color w:val="000000"/>
+          <w:sz w:val="24"/>
           <w:lang w:val="en-US"/>
         </w:rPr>
-        <w:t>API:</w:t>
+        <w:t>HTTPS : HyperText Transfer Protocol Secure</w:t>
       </w:r>
       <w:r>
         <w:rPr>
           <w:color w:val="000000"/>
           <w:lang w:val="en-US"/>
         </w:rPr>
-        <w:t xml:space="preserve"> Application Programming Interface</w:t>
       </w:r>
     </w:p>
     <w:p>
       <w:pPr>
         <w:spacing w:after="60"/>
+        <w:ind w:firstLine="0"/>
+        <w:jc w:val="left"/>
         <w:rPr>
           <w:lang w:val="en-US"/>
         </w:rPr>
       </w:pPr>
       <w:r>
         <w:rPr>
-          <w:color w:val="000000"/>
+          <w:rFonts w:ascii="Times New Roman" w:hAnsi="Times New Roman" w:eastAsia="Times New Roman"/>
+          <w:b w:val="0"/>
+          <w:color w:val="000000"/>
+          <w:sz w:val="24"/>
           <w:lang w:val="en-US"/>
         </w:rPr>
-        <w:t>CSV:</w:t>
+        <w:t>IDE : Integrated Development Environment</w:t>
       </w:r>
       <w:r>
         <w:rPr>
           <w:color w:val="000000"/>
           <w:lang w:val="en-US"/>
         </w:rPr>
-        <w:t xml:space="preserve"> Comma-Separated Values</w:t>
       </w:r>
     </w:p>
     <w:p>
       <w:pPr>
         <w:spacing w:after="60"/>
+        <w:ind w:firstLine="0"/>
+        <w:jc w:val="left"/>
         <w:rPr>
           <w:lang w:val="en-US"/>
         </w:rPr>
       </w:pPr>
       <w:r>
         <w:rPr>
-          <w:color w:val="000000"/>
+          <w:rFonts w:ascii="Times New Roman" w:hAnsi="Times New Roman" w:eastAsia="Times New Roman"/>
+          <w:b w:val="0"/>
+          <w:color w:val="000000"/>
+          <w:sz w:val="24"/>
           <w:lang w:val="en-US"/>
         </w:rPr>
-        <w:t>HTTPS:</w:t>
+        <w:t>IP : Internet Protocol</w:t>
       </w:r>
       <w:r>
         <w:rPr>
           <w:color w:val="000000"/>
           <w:lang w:val="en-US"/>
         </w:rPr>
-        <w:t xml:space="preserve"> HyperText Transfer Protocol Secure</w:t>
       </w:r>
     </w:p>
     <w:p>
       <w:pPr>
         <w:spacing w:after="60"/>
+        <w:ind w:firstLine="0"/>
+        <w:jc w:val="left"/>
         <w:rPr>
           <w:lang w:val="en-US"/>
         </w:rPr>
       </w:pPr>
       <w:r>
         <w:rPr>
-          <w:color w:val="000000"/>
+          <w:rFonts w:ascii="Times New Roman" w:hAnsi="Times New Roman" w:eastAsia="Times New Roman"/>
+          <w:b w:val="0"/>
+          <w:color w:val="000000"/>
+          <w:sz w:val="24"/>
           <w:lang w:val="en-US"/>
         </w:rPr>
-        <w:t>IDE:</w:t>
+        <w:t>JSON : JavaScript Object Notation</w:t>
       </w:r>
       <w:r>
         <w:rPr>
           <w:color w:val="000000"/>
           <w:lang w:val="en-US"/>
         </w:rPr>
-        <w:t xml:space="preserve"> Integrated Development Environment</w:t>
       </w:r>
     </w:p>
     <w:p>
       <w:pPr>
         <w:spacing w:after="60"/>
+        <w:ind w:firstLine="0"/>
+        <w:jc w:val="left"/>
         <w:rPr>
           <w:lang w:val="en-US"/>
         </w:rPr>
       </w:pPr>
       <w:r>
         <w:rPr>
-          <w:color w:val="000000"/>
+          <w:rFonts w:ascii="Times New Roman" w:hAnsi="Times New Roman" w:eastAsia="Times New Roman"/>
+          <w:b w:val="0"/>
+          <w:color w:val="000000"/>
+          <w:sz w:val="24"/>
           <w:lang w:val="en-US"/>
         </w:rPr>
-        <w:t>IP:</w:t>
+        <w:t>JWT : JSON Web Token</w:t>
       </w:r>
       <w:r>
         <w:rPr>
           <w:color w:val="000000"/>
           <w:lang w:val="en-US"/>
         </w:rPr>
-        <w:t xml:space="preserve"> Internet Protocol</w:t>
       </w:r>
     </w:p>
     <w:p>
       <w:pPr>
         <w:spacing w:after="60"/>
+        <w:ind w:firstLine="0"/>
+        <w:jc w:val="left"/>
         <w:rPr>
           <w:lang w:val="en-US"/>
         </w:rPr>
       </w:pPr>
       <w:r>
         <w:rPr>
-          <w:color w:val="000000"/>
+          <w:rFonts w:ascii="Times New Roman" w:hAnsi="Times New Roman" w:eastAsia="Times New Roman"/>
+          <w:b w:val="0"/>
+          <w:color w:val="000000"/>
+          <w:sz w:val="24"/>
           <w:lang w:val="en-US"/>
         </w:rPr>
-        <w:t>JSON:</w:t>
+        <w:t>LMS : Learning Management System</w:t>
       </w:r>
       <w:r>
         <w:rPr>
           <w:color w:val="000000"/>
           <w:lang w:val="en-US"/>
         </w:rPr>
-        <w:t xml:space="preserve"> JavaScript Object Notation</w:t>
       </w:r>
     </w:p>
     <w:p>
       <w:pPr>
         <w:spacing w:after="60"/>
-        <w:rPr>
-          <w:lang w:val="en-US"/>
-        </w:rPr>
-      </w:pPr>
-      <w:r>
-        <w:rPr>
-          <w:color w:val="000000"/>
-          <w:lang w:val="en-US"/>
-        </w:rPr>
-        <w:t>JWT:</w:t>
-      </w:r>
-      <w:r>
-        <w:rPr>
-          <w:color w:val="000000"/>
-          <w:lang w:val="en-US"/>
-        </w:rPr>
-        <w:t xml:space="preserve"> JSON Web Token</w:t>
+        <w:ind w:firstLine="0"/>
+        <w:jc w:val="left"/>
+      </w:pPr>
+      <w:proofErr w:type="gramStart"/>
+      <w:r>
+        <w:rPr>
+          <w:rFonts w:ascii="Times New Roman" w:hAnsi="Times New Roman" w:eastAsia="Times New Roman"/>
+          <w:b w:val="0"/>
+          <w:color w:val="000000"/>
+          <w:sz w:val="24"/>
+        </w:rPr>
+        <w:t>MVP : Minimum Viable Product</w:t>
+      </w:r>
+      <w:proofErr w:type="gramEnd"/>
+      <w:r>
+        <w:rPr>
+          <w:color w:val="000000"/>
+        </w:rPr>
       </w:r>
     </w:p>
     <w:p>
       <w:pPr>
         <w:spacing w:after="60"/>
-        <w:rPr>
-          <w:lang w:val="en-US"/>
-        </w:rPr>
-      </w:pPr>
-      <w:r>
-        <w:rPr>
-          <w:color w:val="000000"/>
-          <w:lang w:val="en-US"/>
-        </w:rPr>
-        <w:t>LMS:</w:t>
-      </w:r>
-      <w:r>
-        <w:rPr>
-          <w:color w:val="000000"/>
-          <w:lang w:val="en-US"/>
-        </w:rPr>
-        <w:t xml:space="preserve"> Learning Management System</w:t>
+        <w:ind w:firstLine="0"/>
+        <w:jc w:val="left"/>
+      </w:pPr>
+      <w:proofErr w:type="gramStart"/>
+      <w:r>
+        <w:rPr>
+          <w:rFonts w:ascii="Times New Roman" w:hAnsi="Times New Roman" w:eastAsia="Times New Roman"/>
+          <w:b w:val="0"/>
+          <w:color w:val="000000"/>
+          <w:sz w:val="24"/>
+        </w:rPr>
+        <w:t>PDF : Portable Document Format</w:t>
+      </w:r>
+      <w:proofErr w:type="gramEnd"/>
+      <w:r>
+        <w:rPr>
+          <w:color w:val="000000"/>
+        </w:rPr>
       </w:r>
     </w:p>
     <w:p>
       <w:pPr>
         <w:spacing w:after="60"/>
+        <w:ind w:firstLine="0"/>
+        <w:jc w:val="left"/>
       </w:pPr>
       <w:proofErr w:type="gramStart"/>
       <w:r>
         <w:rPr>
-          <w:color w:val="000000"/>
-        </w:rPr>
-        <w:t>MVP:</w:t>
+          <w:rFonts w:ascii="Times New Roman" w:hAnsi="Times New Roman" w:eastAsia="Times New Roman"/>
+          <w:b w:val="0"/>
+          <w:color w:val="000000"/>
+          <w:sz w:val="24"/>
+        </w:rPr>
+        <w:t>PROF : Préfixe d'identifiant professeur</w:t>
       </w:r>
       <w:proofErr w:type="gramEnd"/>
       <w:r>
         <w:rPr>
           <w:color w:val="000000"/>
         </w:rPr>
-        <w:t xml:space="preserve"> Minimum Viable Product</w:t>
       </w:r>
     </w:p>
     <w:p>
       <w:pPr>
         <w:spacing w:after="60"/>
+        <w:ind w:firstLine="0"/>
+        <w:jc w:val="left"/>
       </w:pPr>
       <w:proofErr w:type="gramStart"/>
       <w:r>
         <w:rPr>
-          <w:color w:val="000000"/>
-        </w:rPr>
-        <w:t>PDF:</w:t>
+          <w:rFonts w:ascii="Times New Roman" w:hAnsi="Times New Roman" w:eastAsia="Times New Roman"/>
+          <w:b w:val="0"/>
+          <w:color w:val="000000"/>
+          <w:sz w:val="24"/>
+        </w:rPr>
+        <w:t>QCM : Questionnaire à choix multiples</w:t>
       </w:r>
       <w:proofErr w:type="gramEnd"/>
       <w:r>
         <w:rPr>
           <w:color w:val="000000"/>
         </w:rPr>
-        <w:t xml:space="preserve"> Portable Document Format</w:t>
       </w:r>
     </w:p>
     <w:p>
       <w:pPr>
         <w:spacing w:after="60"/>
+        <w:ind w:firstLine="0"/>
+        <w:jc w:val="left"/>
       </w:pPr>
       <w:proofErr w:type="gramStart"/>
       <w:r>
         <w:rPr>
-          <w:color w:val="000000"/>
-        </w:rPr>
-        <w:t>PROF:</w:t>
+          <w:rFonts w:ascii="Times New Roman" w:hAnsi="Times New Roman" w:eastAsia="Times New Roman"/>
+          <w:b w:val="0"/>
+          <w:color w:val="000000"/>
+          <w:sz w:val="24"/>
+        </w:rPr>
+        <w:t>REST : Representational State Transfer</w:t>
       </w:r>
       <w:proofErr w:type="gramEnd"/>
       <w:r>
         <w:rPr>
           <w:color w:val="000000"/>
         </w:rPr>
-        <w:t xml:space="preserve"> Préfixe d'identifiant professeur</w:t>
       </w:r>
     </w:p>
     <w:p>
       <w:pPr>
         <w:spacing w:after="60"/>
+        <w:ind w:firstLine="0"/>
+        <w:jc w:val="left"/>
       </w:pPr>
       <w:proofErr w:type="gramStart"/>
       <w:r>
         <w:rPr>
-          <w:color w:val="000000"/>
-        </w:rPr>
-        <w:t>QCM:</w:t>
+          <w:rFonts w:ascii="Times New Roman" w:hAnsi="Times New Roman" w:eastAsia="Times New Roman"/>
+          <w:b w:val="0"/>
+          <w:color w:val="000000"/>
+          <w:sz w:val="24"/>
+        </w:rPr>
+        <w:t>SADM : Préfixe d'identifiant Super Admin</w:t>
       </w:r>
       <w:proofErr w:type="gramEnd"/>
       <w:r>
         <w:rPr>
           <w:color w:val="000000"/>
         </w:rPr>
-        <w:t xml:space="preserve"> Questionnaire à choix multiples</w:t>
       </w:r>
     </w:p>
     <w:p>
       <w:pPr>
         <w:spacing w:after="60"/>
+        <w:ind w:firstLine="0"/>
+        <w:jc w:val="left"/>
       </w:pPr>
       <w:proofErr w:type="gramStart"/>
       <w:r>
         <w:rPr>
-          <w:color w:val="000000"/>
-        </w:rPr>
-        <w:t>REST:</w:t>
+          <w:rFonts w:ascii="Times New Roman" w:hAnsi="Times New Roman" w:eastAsia="Times New Roman"/>
+          <w:b w:val="0"/>
+          <w:color w:val="000000"/>
+          <w:sz w:val="24"/>
+        </w:rPr>
+        <w:t>SGBD : Système de gestion de bases de données</w:t>
       </w:r>
       <w:proofErr w:type="gramEnd"/>
       <w:r>
         <w:rPr>
           <w:color w:val="000000"/>
         </w:rPr>
-        <w:t xml:space="preserve"> Representational State Transfer</w:t>
       </w:r>
     </w:p>
     <w:p>
       <w:pPr>
         <w:spacing w:after="60"/>
+        <w:ind w:firstLine="0"/>
+        <w:jc w:val="left"/>
       </w:pPr>
       <w:proofErr w:type="gramStart"/>
       <w:r>
         <w:rPr>
-          <w:color w:val="000000"/>
-        </w:rPr>
-        <w:t>SADM:</w:t>
+          <w:rFonts w:ascii="Times New Roman" w:hAnsi="Times New Roman" w:eastAsia="Times New Roman"/>
+          <w:b w:val="0"/>
+          <w:color w:val="000000"/>
+          <w:sz w:val="24"/>
+        </w:rPr>
+        <w:t>UML : Unified Modeling Language</w:t>
       </w:r>
       <w:proofErr w:type="gramEnd"/>
       <w:r>
         <w:rPr>
           <w:color w:val="000000"/>
         </w:rPr>
-        <w:t xml:space="preserve"> Préfixe d'identifiant Super Admin</w:t>
-      </w:r>
-    </w:p>
-    <w:p>
-      <w:pPr>
-        <w:spacing w:after="60"/>
-      </w:pPr>
-      <w:proofErr w:type="gramStart"/>
-      <w:r>
-        <w:rPr>
-          <w:color w:val="000000"/>
-        </w:rPr>
-        <w:t>SGBD:</w:t>
-      </w:r>
-      <w:proofErr w:type="gramEnd"/>
-      <w:r>
-        <w:rPr>
-          <w:color w:val="000000"/>
-        </w:rPr>
-        <w:t xml:space="preserve"> Système de gestion de bases de données</w:t>
-      </w:r>
-    </w:p>
-    <w:p>
-      <w:pPr>
-        <w:spacing w:after="60"/>
-      </w:pPr>
-      <w:proofErr w:type="gramStart"/>
-      <w:r>
-        <w:rPr>
-          <w:color w:val="000000"/>
-        </w:rPr>
-        <w:t>UML:</w:t>
-      </w:r>
-      <w:proofErr w:type="gramEnd"/>
-      <w:r>
-        <w:rPr>
-          <w:color w:val="000000"/>
-        </w:rPr>
-        <w:t xml:space="preserve"> Unified Modeling Language</w:t>
       </w:r>
     </w:p>
     <w:p>
@@ -5401,13 +5464,34 @@
           <w:sz w:val="22"/>
         </w:rPr>
       </w:pPr>
-      <w:hyperlink w:anchor="_Toc235108636" w:history="1">
+      <w:r>
+        <w:rPr>
+          <w:i/>
+          <w:color w:val="000000"/>
+        </w:rPr>
+        <w:fldChar w:fldCharType="begin"/>
+      </w:r>
+      <w:r>
+        <w:rPr>
+          <w:i/>
+          <w:color w:val="000000"/>
+        </w:rPr>
+        <w:instrText>TOC \h \z \c "Tableau"</w:instrText>
+      </w:r>
+      <w:r>
+        <w:rPr>
+          <w:i/>
+          <w:color w:val="000000"/>
+        </w:rPr>
+        <w:fldChar w:fldCharType="separate"/>
+      </w:r>
+      <w:hyperlink w:anchor="_Toc235108635" w:history="1">
         <w:r>
           <w:rPr>
             <w:rStyle w:val="Lienhypertexte"/>
             <w:noProof/>
           </w:rPr>
-          <w:t>Tableau 2 : Correspondance entre acteurs et responsabilités</w:t>
+          <w:t>Tableau 1 : Comparaison des solutions existantes et de Cylentic</w:t>
         </w:r>
         <w:r>
           <w:rPr>
@@ -5428,7 +5512,7 @@
             <w:noProof/>
             <w:webHidden/>
           </w:rPr>
-          <w:instrText xml:space="preserve"> PAGEREF _Toc235108636 \h </w:instrText>
+          <w:instrText xml:space="preserve"> PAGEREF _Toc235108635 \h </w:instrText>
         </w:r>
         <w:r>
           <w:rPr>
@@ -5448,7 +5532,7 @@
             <w:noProof/>
             <w:webHidden/>
           </w:rPr>
-          <w:t>7</w:t>
+          <w:t>4</w:t>
         </w:r>
         <w:r>
           <w:rPr>
@@ -5471,6 +5555,76 @@
           <w:sz w:val="22"/>
         </w:rPr>
       </w:pPr>
+      <w:hyperlink w:anchor="_Toc235108636" w:history="1">
+        <w:r>
+          <w:rPr>
+            <w:rStyle w:val="Lienhypertexte"/>
+            <w:noProof/>
+          </w:rPr>
+          <w:t>Tableau 2 : Correspondance entre acteurs et responsabilités</w:t>
+        </w:r>
+        <w:r>
+          <w:rPr>
+            <w:noProof/>
+            <w:webHidden/>
+          </w:rPr>
+          <w:tab/>
+        </w:r>
+        <w:r>
+          <w:rPr>
+            <w:noProof/>
+            <w:webHidden/>
+          </w:rPr>
+          <w:fldChar w:fldCharType="begin"/>
+        </w:r>
+        <w:r>
+          <w:rPr>
+            <w:noProof/>
+            <w:webHidden/>
+          </w:rPr>
+          <w:instrText xml:space="preserve"> PAGEREF _Toc235108636 \h </w:instrText>
+        </w:r>
+        <w:r>
+          <w:rPr>
+            <w:noProof/>
+            <w:webHidden/>
+          </w:rPr>
+        </w:r>
+        <w:r>
+          <w:rPr>
+            <w:noProof/>
+            <w:webHidden/>
+          </w:rPr>
+          <w:fldChar w:fldCharType="separate"/>
+        </w:r>
+        <w:r>
+          <w:rPr>
+            <w:noProof/>
+            <w:webHidden/>
+          </w:rPr>
+          <w:t>7</w:t>
+        </w:r>
+        <w:r>
+          <w:rPr>
+            <w:noProof/>
+            <w:webHidden/>
+          </w:rPr>
+          <w:fldChar w:fldCharType="end"/>
+        </w:r>
+      </w:hyperlink>
+    </w:p>
+    <w:p>
+      <w:pPr>
+        <w:pStyle w:val="Tabledesillustrations"/>
+        <w:tabs>
+          <w:tab w:val="right" w:leader="dot" w:pos="8495"/>
+        </w:tabs>
+        <w:rPr>
+          <w:rFonts w:asciiTheme="minorHAnsi" w:eastAsiaTheme="minorEastAsia" w:hAnsiTheme="minorHAnsi"/>
+          <w:noProof/>
+          <w:sz w:val="22"/>
+        </w:rPr>
+      </w:pPr>
       <w:hyperlink w:anchor="_Toc235108637" w:history="1">
         <w:r>
           <w:rPr>
@@ -5588,22 +5742,6 @@
     <w:p>
       <w:r>
         <w:br w:type="page"/>
-      </w:r>
-    </w:p>
-    <w:p>
-      <w:pPr>
-        <w:spacing w:line="360" w:lineRule="auto" w:after="160"/>
-        <w:ind w:firstLine="0"/>
-        <w:jc w:val="both"/>
-      </w:pPr>
-      <w:r>
-        <w:rPr>
-          <w:rFonts w:ascii="Times New Roman" w:hAnsi="Times New Roman" w:eastAsia="Times New Roman"/>
-          <w:b/>
-          <w:color w:val="000000"/>
-          <w:sz w:val="24"/>
-        </w:rPr>
-        <w:t>Mots-clés : examen de programmation, plateforme web, intégrité académique, sandbox, correction automatique, école d'ingénieurs.</w:t>
       </w:r>
     </w:p>
     <w:p>
@@ -5707,22 +5845,6 @@
     </w:p>
     <w:p>
       <w:pPr>
-        <w:spacing w:line="360" w:lineRule="auto" w:after="160"/>
-        <w:ind w:firstLine="0"/>
-        <w:jc w:val="both"/>
-      </w:pPr>
-      <w:r>
-        <w:rPr>
-          <w:rFonts w:ascii="Times New Roman" w:hAnsi="Times New Roman" w:eastAsia="Times New Roman"/>
-          <w:b/>
-          <w:color w:val="000000"/>
-          <w:sz w:val="24"/>
-        </w:rPr>
-        <w:t>Keywords: programming exam, web platform, academic integrity, sandbox, automatic grading, engineering school.</w:t>
-      </w:r>
-    </w:p>
-    <w:p>
-      <w:pPr>
         <w:pStyle w:val="Titre1"/>
       </w:pPr>
       <w:bookmarkStart w:id="24" w:name="bm_intro"/>
@@ -5777,114 +5899,14 @@
     </w:p>
     <w:p>
       <w:pPr>
-        <w:spacing w:line="360" w:lineRule="auto" w:after="160"/>
         <w:ind w:firstLine="425"/>
         <w:jc w:val="both"/>
       </w:pPr>
       <w:r>
         <w:rPr>
-          <w:rFonts w:ascii="Times New Roman" w:hAnsi="Times New Roman" w:eastAsia="Times New Roman"/>
-          <w:b w:val="0"/>
-          <w:color w:val="000000"/>
-          <w:sz w:val="24"/>
-        </w:rPr>
-        <w:t>Le rapport s'organise en cinq chapitres. Le premier présente l'état de l'art. Le deuxième formalise les besoins et compare les solutions existantes. Le troisième présente la conception. Le quatrième décrit la réalisation. Le cinquième discute les tests, les limites et les perspectives.</w:t>
-      </w:r>
-    </w:p>
-    <w:p>
-      <w:pPr>
-        <w:spacing w:line="360" w:lineRule="auto" w:after="160"/>
-        <w:ind w:firstLine="425"/>
-        <w:jc w:val="both"/>
-      </w:pPr>
-      <w:r>
-        <w:rPr>
-          <w:rFonts w:ascii="Times New Roman" w:hAnsi="Times New Roman" w:eastAsia="Times New Roman"/>
-          <w:b w:val="0"/>
-          <w:color w:val="000000"/>
-          <w:sz w:val="24"/>
-        </w:rPr>
-        <w:t>Au terme de ce travail, plusieurs résultats sont attendus : une analyse structurée des limites des outils existants pour l'évaluation de la programmation en salle ; une conception documentée de Cylentic (UML, architecture, données) ; un prototype fonctionnel couvrant les parcours critiques du MVP ; une validation par tests des scénarios d'examen surveillé.</w:t>
-      </w:r>
-    </w:p>
-    <w:p>
-      <w:pPr>
-        <w:spacing w:line="360" w:lineRule="auto" w:after="160"/>
-        <w:ind w:firstLine="425"/>
-        <w:jc w:val="both"/>
-      </w:pPr>
-      <w:r>
-        <w:rPr>
-          <w:rFonts w:ascii="Times New Roman" w:hAnsi="Times New Roman" w:eastAsia="Times New Roman"/>
-          <w:b w:val="0"/>
-          <w:color w:val="000000"/>
-          <w:sz w:val="24"/>
-        </w:rPr>
-        <w:t>L'atteinte de ces objectifs repose sur les hypothèses de recherche suivantes :</w:t>
-      </w:r>
-    </w:p>
-    <w:p>
-      <w:pPr>
-        <w:spacing w:line="360" w:lineRule="auto" w:after="160"/>
-        <w:ind w:firstLine="0"/>
-        <w:jc w:val="both"/>
-      </w:pPr>
-      <w:r>
-        <w:rPr>
-          <w:rFonts w:ascii="Times New Roman" w:hAnsi="Times New Roman" w:eastAsia="Times New Roman"/>
-          <w:b w:val="0"/>
-          <w:color w:val="000000"/>
-          <w:sz w:val="24"/>
-        </w:rPr>
-        <w:t>• un verrouillage suffisant du navigateur, couplé à la journalisation des incidents, permet de restaurer la crédibilité des épreuves pratiques sur machine ;</w:t>
-      </w:r>
-    </w:p>
-    <w:p>
-      <w:pPr>
-        <w:spacing w:line="360" w:lineRule="auto" w:after="160"/>
-        <w:ind w:firstLine="0"/>
-        <w:jc w:val="both"/>
-      </w:pPr>
-      <w:r>
-        <w:rPr>
-          <w:rFonts w:ascii="Times New Roman" w:hAnsi="Times New Roman" w:eastAsia="Times New Roman"/>
-          <w:b w:val="0"/>
-          <w:color w:val="000000"/>
-          <w:sz w:val="24"/>
-        </w:rPr>
-        <w:t>• l'exécution isolée du code dans une sandbox et la correction automatique par tests unitaires offrent une évaluation fiable et reproductible ;</w:t>
-      </w:r>
-    </w:p>
-    <w:p>
-      <w:pPr>
-        <w:spacing w:line="360" w:lineRule="auto" w:after="160"/>
-        <w:ind w:firstLine="0"/>
-        <w:jc w:val="both"/>
-      </w:pPr>
-      <w:r>
-        <w:rPr>
-          <w:rFonts w:ascii="Times New Roman" w:hAnsi="Times New Roman" w:eastAsia="Times New Roman"/>
-          <w:b w:val="0"/>
-          <w:color w:val="000000"/>
-          <w:sz w:val="24"/>
-        </w:rPr>
-        <w:t>• une architecture web multi établissement, déployable sans installation lourde côté étudiant, répond aux contraintes des salles informatiques partagées.</w:t>
-      </w:r>
-    </w:p>
-    <w:p>
-      <w:pPr>
-        <w:spacing w:line="360" w:lineRule="auto" w:after="160"/>
-        <w:ind w:firstLine="425"/>
-        <w:jc w:val="both"/>
-      </w:pPr>
-      <w:r>
-        <w:rPr>
-          <w:rFonts w:ascii="Times New Roman" w:hAnsi="Times New Roman" w:eastAsia="Times New Roman"/>
-          <w:b w:val="0"/>
-          <w:color w:val="000000"/>
-          <w:sz w:val="24"/>
-        </w:rPr>
-        <w:t>Pour répondre à la problématique, nous avons adopté une démarche méthodologique structurée en cinq étapes : revue de l'état de l'art et analyse comparative des solutions existantes ; spécification des besoins et définition du périmètre du MVP ; conception UML et modélisation de l'architecture ; réalisation itérative avec Next.js, Prisma et MySQL ; validation par tests de parcours complets et contrôle de non régression.</w:t>
+          <w:color w:val="000000"/>
+        </w:rPr>
+        <w:t>Cinq chapitres suivent. On commence par le contexte et l'existant, puis les besoins, la conception, la réalisation, et enfin les tests avec leurs limites.</w:t>
       </w:r>
     </w:p>
     <w:p>
@@ -5906,34 +5928,26 @@
     </w:p>
     <w:p>
       <w:pPr>
-        <w:spacing w:line="360" w:lineRule="auto" w:after="160"/>
         <w:ind w:firstLine="425"/>
         <w:jc w:val="both"/>
       </w:pPr>
       <w:r>
         <w:rPr>
-          <w:rFonts w:ascii="Times New Roman" w:hAnsi="Times New Roman" w:eastAsia="Times New Roman"/>
-          <w:b w:val="0"/>
-          <w:color w:val="000000"/>
-          <w:sz w:val="24"/>
-        </w:rPr>
-        <w:t>Face à la montée des assistants de génération de code, comment garantir l'intégrité et la crédibilité de l'évaluation de la programmation sur machine en salle informatique, tout en permettant l'exécution réelle du code et une correction fiable pour le professeur ?</w:t>
-      </w:r>
-    </w:p>
-    <w:p>
-      <w:pPr>
-        <w:spacing w:line="360" w:lineRule="auto" w:after="160"/>
+          <w:color w:val="000000"/>
+        </w:rPr>
+        <w:t>Comment organiser un examen de programmation sur navigateur qui réduise fortement les possibilités de triche, conserve un rôle clair au surveillant, et restitue une correction lisible pour le professeur ?</w:t>
+      </w:r>
+    </w:p>
+    <w:p>
+      <w:pPr>
         <w:ind w:firstLine="425"/>
         <w:jc w:val="both"/>
       </w:pPr>
       <w:r>
         <w:rPr>
-          <w:rFonts w:ascii="Times New Roman" w:hAnsi="Times New Roman" w:eastAsia="Times New Roman"/>
-          <w:b w:val="0"/>
-          <w:color w:val="000000"/>
-          <w:sz w:val="24"/>
-        </w:rPr>
-        <w:t>L'objectif général consiste à concevoir une plateforme web d'examens de programmation sécurisés, nommée Cylentic.</w:t>
+          <w:color w:val="000000"/>
+        </w:rPr>
+        <w:t>L'objectif général consiste à concevoir et réaliser une plateforme web d'examens de programmation sécurisés, nommée Cylentic.</w:t>
       </w:r>
     </w:p>
     <w:p>
@@ -6028,41 +6042,51 @@
       </w:r>
     </w:p>
     <w:p>
-      <w:r>
-        <w:br w:type="page"/>
-      </w:r>
-    </w:p>
-    <w:p>
-      <w:pPr>
-        <w:pStyle w:val="Titre1"/>
-        <w:spacing w:line="360" w:lineRule="auto" w:after="160"/>
-        <w:ind w:firstLine="0"/>
-        <w:jc w:val="both"/>
-      </w:pPr>
-      <w:r>
-        <w:rPr>
-          <w:rFonts w:ascii="Times New Roman" w:hAnsi="Times New Roman" w:eastAsia="Times New Roman"/>
-          <w:b/>
-          <w:color w:val="000000"/>
-          <w:sz w:val="24"/>
-        </w:rPr>
-        <w:t>Chapitre 1 : État de l'art</w:t>
-      </w:r>
-    </w:p>
-    <w:p>
-      <w:pPr>
-        <w:spacing w:line="360" w:lineRule="auto" w:after="160"/>
+      <w:pPr>
         <w:ind w:firstLine="425"/>
         <w:jc w:val="both"/>
       </w:pPr>
       <w:r>
         <w:rPr>
-          <w:rFonts w:ascii="Times New Roman" w:hAnsi="Times New Roman" w:eastAsia="Times New Roman"/>
-          <w:b w:val="0"/>
-          <w:color w:val="000000"/>
-          <w:sz w:val="24"/>
-        </w:rPr>
-        <w:t>Ce chapitre présente l'état de l'art du domaine : contexte pédagogique, contraintes locales et panorama des solutions existantes. La comparaison détaillée et le positionnement de Cylentic sont traités au chapitre 2.</w:t>
+          <w:color w:val="000000"/>
+        </w:rPr>
+        <w:lastRenderedPageBreak/>
+        <w:t>Le travail a suivi un enchaînement simple : regarder ce qui existait déjà, borner un MVP, modéliser en UML à partir du comportement réel de la plateforme, développer avec Next.js, Prisma et MySQL, puis valider par des parcours complets, en revérifiant après chaque correctif important.</w:t>
+      </w:r>
+    </w:p>
+    <w:p>
+      <w:r>
+        <w:br w:type="page"/>
+      </w:r>
+    </w:p>
+    <w:p>
+      <w:pPr>
+        <w:pStyle w:val="Titre1"/>
+      </w:pPr>
+      <w:bookmarkStart w:id="30" w:name="bm_ch1"/>
+      <w:bookmarkStart w:id="31" w:name="_Toc235117288"/>
+      <w:bookmarkStart w:id="32" w:name="_Toc235117374"/>
+      <w:r>
+        <w:rPr>
+          <w:rFonts w:ascii="Times New Roman" w:eastAsia="Times New Roman" w:hAnsi="Times New Roman"/>
+        </w:rPr>
+        <w:lastRenderedPageBreak/>
+        <w:t>Chapitre 1 : Contexte et étude de l'existant</w:t>
+      </w:r>
+      <w:bookmarkEnd w:id="30"/>
+      <w:bookmarkEnd w:id="31"/>
+      <w:bookmarkEnd w:id="32"/>
+    </w:p>
+    <w:p>
+      <w:pPr>
+        <w:ind w:firstLine="425"/>
+        <w:jc w:val="both"/>
+      </w:pPr>
+      <w:r>
+        <w:rPr>
+          <w:color w:val="000000"/>
+        </w:rPr>
+        <w:t>Ce chapitre replace le projet dans son cadre pédagogique, détaille les sous-problèmes techniques, passe en revue les outils déjà disponibles et situe Cylentic. Le problème et les objectifs ont déjà été formulés dans la problématique.</w:t>
       </w:r>
     </w:p>
     <w:p>
@@ -6181,23 +6205,6 @@
     </w:p>
     <w:p>
       <w:pPr>
-        <w:pStyle w:val="Titre2"/>
-        <w:spacing w:line="360" w:lineRule="auto" w:after="160"/>
-        <w:ind w:firstLine="0"/>
-        <w:jc w:val="both"/>
-      </w:pPr>
-      <w:r>
-        <w:rPr>
-          <w:rFonts w:ascii="Times New Roman" w:hAnsi="Times New Roman" w:eastAsia="Times New Roman"/>
-          <w:b/>
-          <w:color w:val="000000"/>
-          <w:sz w:val="24"/>
-        </w:rPr>
-        <w:t>1.3 Panorama des solutions existantes</w:t>
-      </w:r>
-    </w:p>
-    <w:p>
-      <w:pPr>
         <w:ind w:firstLine="425"/>
         <w:jc w:val="both"/>
       </w:pPr>
@@ -6205,8 +6212,24 @@
         <w:rPr>
           <w:color w:val="000000"/>
         </w:rPr>
-        <w:t>Les outils du marché répondent chacun à une partie du problème. Aucun, dans une forme vraiment adaptée à une épreuve de code en salle, ne les réunit tous.</w:t>
-      </w:r>
+        <w:t>Nous partons de l'hypothèse suivante : si l'on verrouille suffisamment le navigateur et que l'on journalise les événements sensibles, on peut restaurer une crédibilité utile aux examens pratiques sur machine, sans revenir au papier, tout en conservant le jugement pédagogique du professeur.</w:t>
+      </w:r>
+    </w:p>
+    <w:p>
+      <w:pPr>
+        <w:pStyle w:val="Titre2"/>
+      </w:pPr>
+      <w:bookmarkStart w:id="37" w:name="bm_ch1_3"/>
+      <w:bookmarkStart w:id="38" w:name="_Toc235117377"/>
+      <w:r>
+        <w:rPr>
+          <w:rFonts w:ascii="Times New Roman" w:eastAsia="Times New Roman" w:hAnsi="Times New Roman"/>
+        </w:rPr>
+        <w:lastRenderedPageBreak/>
+        <w:t>1.3 Examen des solutions existantes</w:t>
+      </w:r>
+      <w:bookmarkEnd w:id="37"/>
+      <w:bookmarkEnd w:id="38"/>
     </w:p>
     <w:p>
       <w:pPr>
@@ -6217,7 +6240,7 @@
         <w:rPr>
           <w:color w:val="000000"/>
         </w:rPr>
-        <w:t>Les plateformes d'apprentissage comme freeCodeCamp offrent un éditeur et une exécution immédiate, mais dans un cadre ouvert, sans verrouillage digne d'une épreuve ni journal d'incidents orienté professeur.</w:t>
+        <w:t>Les outils du marché répondent chacun à une partie du problème. Aucun, dans une forme vraiment adaptée à une épreuve de code en salle, ne les réunit tous.</w:t>
       </w:r>
     </w:p>
     <w:p>
@@ -6229,7 +6252,7 @@
         <w:rPr>
           <w:color w:val="000000"/>
         </w:rPr>
-        <w:t>Les LMS comme Moodle gèrent cours, comptes, créneaux et QCM. Ils restent généralistes : l'éditeur de code avec exécution isolée n'est pas natif, et la surveillance poussée passe souvent par des extensions coûteuses.</w:t>
+        <w:t>Les plateformes d'apprentissage comme freeCodeCamp offrent un éditeur et une exécution immédiate, mais dans un cadre ouvert, sans verrouillage digne d'une épreuve ni journal d'incidents orienté professeur.</w:t>
       </w:r>
     </w:p>
     <w:p>
@@ -6241,7 +6264,7 @@
         <w:rPr>
           <w:color w:val="000000"/>
         </w:rPr>
-        <w:t>Les outils de surveillance d'examen à distance répondent surtout à des épreuves généralistes. Leur licence est souvent élevée. Ils n'exécutent ni ne corrigent du code de programmation au sens attendu ici.</w:t>
+        <w:t>Les LMS comme Moodle gèrent cours, comptes, créneaux et QCM. Ils restent généralistes : l'éditeur de code avec exécution isolée n'est pas natif, et la surveillance poussée passe souvent par des extensions coûteuses.</w:t>
       </w:r>
     </w:p>
     <w:p>
@@ -6253,218 +6276,78 @@
         <w:rPr>
           <w:color w:val="000000"/>
         </w:rPr>
-        <w:t>Les environnements d'exécution isolée, dont Judge0 est un exemple connu, isolent un programme et renvoient sa sortie. Ce sont des briques utiles, souvent auto hébergeables, mais pas une plateforme d'examen : pas de rôles scolaires, pas de passation contrôlée, pas de journal pédagogique.</w:t>
+        <w:t>Les outils de surveillance d'examen à distance répondent surtout à des épreuves généralistes. Leur licence est souvent élevée. Ils n'exécutent ni ne corrigent du code de programmation au sens attendu ici.</w:t>
       </w:r>
     </w:p>
     <w:p>
       <w:pPr>
         <w:ind w:firstLine="425"/>
         <w:jc w:val="both"/>
-        <w:rPr>
-          <w:i/>
-          <w:color w:val="000000"/>
-          <w:sz w:val="20"/>
-        </w:rPr>
-      </w:pPr>
-    </w:p>
-    <w:p>
-      <w:pPr>
-        <w:pStyle w:val="Titre2"/>
-        <w:spacing w:line="360" w:lineRule="auto" w:after="160"/>
-        <w:ind w:firstLine="425"/>
-        <w:jc w:val="both"/>
-      </w:pPr>
-      <w:r>
-        <w:rPr>
-          <w:rFonts w:ascii="Times New Roman" w:hAnsi="Times New Roman" w:eastAsia="Times New Roman"/>
-          <w:b w:val="0"/>
-          <w:color w:val="000000"/>
-          <w:sz w:val="24"/>
-        </w:rPr>
-        <w:t>1.4 Synthèse des lacunes du domaine</w:t>
-      </w:r>
-    </w:p>
-    <w:p>
-      <w:pPr>
-        <w:pStyle w:val="Titre2"/>
-        <w:spacing w:line="360" w:lineRule="auto" w:after="160"/>
-        <w:ind w:firstLine="0"/>
-        <w:jc w:val="both"/>
-      </w:pPr>
-      <w:r>
-        <w:rPr>
-          <w:rFonts w:ascii="Times New Roman" w:hAnsi="Times New Roman" w:eastAsia="Times New Roman"/>
-          <w:b/>
-          <w:color w:val="000000"/>
-          <w:sz w:val="24"/>
-        </w:rPr>
-        <w:t>1.5 Conclusion</w:t>
-      </w:r>
-    </w:p>
-    <w:p>
-      <w:pPr>
-        <w:ind w:firstLine="425"/>
-        <w:jc w:val="both"/>
-      </w:pPr>
-      <w:r>
-        <w:rPr>
-          <w:color w:val="000000"/>
-        </w:rPr>
-        <w:t>Le constat est net : le problème existe, les outils ne le couvrent que par morceaux, et Cylentic a une place utile. Le chapitre suivant fixe le cahier des charges du MVP.</w:t>
-      </w:r>
-    </w:p>
-    <w:p>
-      <w:r>
-        <w:br w:type="page"/>
-      </w:r>
-    </w:p>
-    <w:p>
-      <w:pPr>
-        <w:pStyle w:val="Titre1"/>
-      </w:pPr>
-      <w:bookmarkStart w:id="44" w:name="bm_ch2"/>
-      <w:bookmarkStart w:id="45" w:name="_Toc235117289"/>
-      <w:bookmarkStart w:id="46" w:name="_Toc235117380"/>
-      <w:r>
-        <w:rPr>
-          <w:rFonts w:ascii="Times New Roman" w:eastAsia="Times New Roman" w:hAnsi="Times New Roman"/>
-        </w:rPr>
-        <w:lastRenderedPageBreak/>
-        <w:t>Chapitre 2 : Analyse des besoins et spécification du système</w:t>
-      </w:r>
-      <w:bookmarkEnd w:id="44"/>
-      <w:bookmarkEnd w:id="45"/>
-      <w:bookmarkEnd w:id="46"/>
-    </w:p>
-    <w:p>
-      <w:pPr>
-        <w:pStyle w:val="Titre2"/>
-        <w:spacing w:line="360" w:lineRule="auto" w:after="160"/>
-        <w:ind w:firstLine="0"/>
-        <w:jc w:val="both"/>
-      </w:pPr>
-      <w:r>
-        <w:rPr>
-          <w:rFonts w:ascii="Times New Roman" w:hAnsi="Times New Roman" w:eastAsia="Times New Roman"/>
-          <w:b/>
-          <w:color w:val="000000"/>
-          <w:sz w:val="24"/>
-        </w:rPr>
-        <w:t>2.1 Comparaison des solutions existantes</w:t>
-      </w:r>
-    </w:p>
-    <w:p>
-      <w:pPr>
-        <w:spacing w:line="360" w:lineRule="auto" w:after="160"/>
-        <w:ind w:firstLine="425"/>
-        <w:jc w:val="both"/>
-      </w:pPr>
-      <w:r>
-        <w:rPr>
-          <w:rFonts w:ascii="Times New Roman" w:hAnsi="Times New Roman" w:eastAsia="Times New Roman"/>
-          <w:b w:val="0"/>
-          <w:color w:val="000000"/>
-          <w:sz w:val="24"/>
-        </w:rPr>
-        <w:t>Pour objectiver l'analyse de l'état de l'art, le tableau ci-dessous compare les principales familles de solutions aux exigences d'un examen de programmation surveillé en salle.</w:t>
-      </w:r>
-    </w:p>
-    <w:p>
-      <w:pPr>
-        <w:spacing w:line="360" w:lineRule="auto" w:after="160"/>
-        <w:ind w:firstLine="0"/>
-        <w:jc w:val="left"/>
-      </w:pPr>
-      <w:r>
-        <w:rPr>
-          <w:rFonts w:ascii="Times New Roman" w:hAnsi="Times New Roman" w:eastAsia="Times New Roman"/>
-          <w:b/>
-          <w:color w:val="000000"/>
-          <w:sz w:val="24"/>
-        </w:rPr>
-        <w:t>Tableau 1 : Comparaison des solutions existantes et de Cylentic</w:t>
-      </w:r>
-    </w:p>
-    <w:p>
-      <w:pPr>
-        <w:pStyle w:val="Titre2"/>
-        <w:spacing w:line="360" w:lineRule="auto" w:after="160"/>
-        <w:ind w:firstLine="425"/>
-        <w:jc w:val="both"/>
-      </w:pPr>
-      <w:r>
-        <w:rPr>
-          <w:rFonts w:ascii="Times New Roman" w:hAnsi="Times New Roman" w:eastAsia="Times New Roman"/>
-          <w:b w:val="0"/>
-          <w:color w:val="000000"/>
-          <w:sz w:val="24"/>
-        </w:rPr>
-        <w:t>2.2 Positionnement de Cylentic</w:t>
-      </w:r>
-    </w:p>
-    <w:p>
-      <w:pPr>
-        <w:spacing w:line="360" w:lineRule="auto" w:after="160"/>
-        <w:ind w:firstLine="425"/>
-        <w:jc w:val="both"/>
-      </w:pPr>
-      <w:r>
-        <w:rPr>
-          <w:rFonts w:ascii="Times New Roman" w:hAnsi="Times New Roman" w:eastAsia="Times New Roman"/>
-          <w:b w:val="0"/>
-          <w:color w:val="000000"/>
-          <w:sz w:val="24"/>
-        </w:rPr>
-        <w:t>1.4 Synthèse des lacunes du domaine</w:t>
-      </w:r>
-    </w:p>
-    <w:p>
-      <w:pPr>
-        <w:spacing w:line="360" w:lineRule="auto" w:after="160"/>
-        <w:ind w:firstLine="425"/>
-        <w:jc w:val="both"/>
-      </w:pPr>
-      <w:r>
-        <w:rPr>
-          <w:rFonts w:ascii="Times New Roman" w:hAnsi="Times New Roman" w:eastAsia="Times New Roman"/>
-          <w:b w:val="0"/>
-          <w:color w:val="000000"/>
-          <w:sz w:val="24"/>
-        </w:rPr>
-        <w:t>L'état de l'art montre que les outils disponibles couvrent chacun une facette du problème : apprentissage ouvert, gestion de cours, surveillance généraliste ou exécution isolée. Aucun ne réunit composition sécurisée, exécution réelle, correction automatique et traçabilité pédagogique dans un cadre adapté aux salles informatiques d'une école d'ingénieurs. Cette lacune justifie l'étude d'une solution dédiée.</w:t>
-      </w:r>
-    </w:p>
-    <w:p>
-      <w:pPr>
-        <w:spacing w:line="360" w:lineRule="auto" w:after="160"/>
-        <w:ind w:firstLine="425"/>
-        <w:jc w:val="both"/>
-      </w:pPr>
-      <w:r>
-        <w:rPr>
-          <w:rFonts w:ascii="Times New Roman" w:hAnsi="Times New Roman" w:eastAsia="Times New Roman"/>
-          <w:b w:val="0"/>
-          <w:color w:val="000000"/>
-          <w:sz w:val="24"/>
-        </w:rPr>
-        <w:t>Cylentic n'est ni une plateforme d'apprentissage ouverte, ni une simple variante de LMS. Elle vise l'évaluation surveillée de la programmation.</w:t>
-      </w:r>
-    </w:p>
-    <w:p>
-      <w:pPr>
-        <w:spacing w:line="360" w:lineRule="auto" w:after="160"/>
-        <w:ind w:firstLine="425"/>
-        <w:jc w:val="both"/>
-      </w:pPr>
-      <w:r>
-        <w:rPr>
-          <w:rFonts w:ascii="Times New Roman" w:hAnsi="Times New Roman" w:eastAsia="Times New Roman"/>
-          <w:b w:val="0"/>
-          <w:color w:val="000000"/>
-          <w:sz w:val="24"/>
-        </w:rPr>
-        <w:t>Sa singularité tient au couplage : éditeur dans le navigateur, sandbox Docker Python, contrôles de passation côté client, règles métier et timers côté serveur, journal d'incidents, exports professeur, et maintien du surveillant physique. S'y ajoute une gouvernance multi établissement, avec un Super Admin plateforme distinct de l'administrateur d'école.</w:t>
-      </w:r>
+      </w:pPr>
+      <w:r>
+        <w:rPr>
+          <w:color w:val="000000"/>
+        </w:rPr>
+        <w:t>Les environnements d'exécution isolée, dont Judge0 est un exemple connu, isolent un programme et renvoient sa sortie. Ce sont des briques utiles, souvent auto hébergeables, mais pas une plateforme d'examen : pas de rôles scolaires, pas de passation contrôlée, pas de journal pédagogique.</w:t>
+      </w:r>
+    </w:p>
+    <w:p>
+      <w:pPr>
+        <w:pStyle w:val="Lgende"/>
+        <w:spacing w:after="200" w:line="360" w:lineRule="auto"/>
+      </w:pPr>
+      <w:bookmarkStart w:id="39" w:name="_Toc235108635"/>
+      <w:r>
+        <w:rPr>
+          <w:color w:val="000000"/>
+          <w:sz w:val="22"/>
+        </w:rPr>
+        <w:t xml:space="preserve">Tableau </w:t>
+      </w:r>
+      <w:r>
+        <w:rPr>
+          <w:color w:val="000000"/>
+          <w:sz w:val="22"/>
+        </w:rPr>
+        <w:fldChar w:fldCharType="begin"/>
+      </w:r>
+      <w:r>
+        <w:rPr>
+          <w:color w:val="000000"/>
+          <w:sz w:val="22"/>
+        </w:rPr>
+        <w:instrText>SEQ Tableau \* ARABIC</w:instrText>
+      </w:r>
+      <w:r>
+        <w:rPr>
+          <w:color w:val="000000"/>
+          <w:sz w:val="22"/>
+        </w:rPr>
+        <w:fldChar w:fldCharType="separate"/>
+      </w:r>
+      <w:r>
+        <w:rPr>
+          <w:noProof/>
+          <w:color w:val="000000"/>
+          <w:sz w:val="22"/>
+        </w:rPr>
+        <w:t>1</w:t>
+      </w:r>
+      <w:r>
+        <w:rPr>
+          <w:color w:val="000000"/>
+          <w:sz w:val="22"/>
+        </w:rPr>
+        <w:fldChar w:fldCharType="end"/>
+      </w:r>
+      <w:r>
+        <w:rPr>
+          <w:color w:val="000000"/>
+          <w:sz w:val="22"/>
+        </w:rPr>
+        <w:t xml:space="preserve"> : Comparaison des solutions existantes et de Cylentic</w:t>
+      </w:r>
+      <w:bookmarkEnd w:id="39"/>
     </w:p>
     <w:tbl>
       <w:tblPr>
@@ -7178,32 +7061,14 @@
     </w:tbl>
     <w:p>
       <w:pPr>
-        <w:pStyle w:val="Titre2"/>
-        <w:spacing w:line="360" w:lineRule="auto" w:after="160"/>
-        <w:ind w:firstLine="0"/>
-        <w:jc w:val="both"/>
-      </w:pPr>
-      <w:r>
-        <w:rPr>
-          <w:rFonts w:ascii="Times New Roman" w:hAnsi="Times New Roman" w:eastAsia="Times New Roman"/>
-          <w:b/>
-          <w:color w:val="000000"/>
-          <w:sz w:val="24"/>
-        </w:rPr>
-        <w:t>2.3 Périmètre du projet et du MVP</w:t>
-      </w:r>
-    </w:p>
-    <w:p>
-      <w:pPr>
         <w:ind w:firstLine="425"/>
         <w:jc w:val="both"/>
-      </w:pPr>
-      <w:r>
-        <w:rPr>
-          <w:color w:val="000000"/>
-        </w:rPr>
-        <w:t>Le projet assume un périmètre volontairement limité pour sa première version. Le MVP inclut : le langage Python, l'authentification avec rôles (Super Admin, administrateur d'établissement, professeur, étudiant), la création et la publication d'examens, la salle d'attente, l'environnement de composition sécurisé, les mécanismes de contrôle navigateur, la correction automatique par tests unitaires, un module QCM de base, la gestion de plusieurs établissements, l'onboarding administrateur, la promotion de rentrée, le contact depuis la landing page, ainsi que les exports de résultats et de présence.</w:t>
-      </w:r>
+        <w:rPr>
+          <w:i/>
+          <w:color w:val="000000"/>
+          <w:sz w:val="20"/>
+        </w:rPr>
+      </w:pPr>
     </w:p>
     <w:p>
       <w:pPr>
@@ -7214,8 +7079,23 @@
         <w:rPr>
           <w:color w:val="000000"/>
         </w:rPr>
-        <w:t>Sont exclus de ce périmètre : le support d'autres langages que Python, la facturation réelle des établissements, la consultation en direct du code pendant l'épreuve, et l'activation de compte par email. Le MVP s'appuie sur des comptes créés par l'administration, un changement de mot de passe imposé si nécessaire, et des exports de résultats déjà disponibles pour le professeur (Excel, PDF) ainsi qu'un export de présence (CSV).</w:t>
-      </w:r>
+        <w:t>Au total, aucune de ces solutions n'offre ensemble composition sécurisée, exécution isolée, correction et traçabilité pour une école. Cylentic vise précisément cet espace.</w:t>
+      </w:r>
+    </w:p>
+    <w:p>
+      <w:pPr>
+        <w:pStyle w:val="Titre2"/>
+      </w:pPr>
+      <w:bookmarkStart w:id="40" w:name="bm_ch1_4"/>
+      <w:bookmarkStart w:id="41" w:name="_Toc235117378"/>
+      <w:r>
+        <w:rPr>
+          <w:rFonts w:ascii="Times New Roman" w:eastAsia="Times New Roman" w:hAnsi="Times New Roman"/>
+        </w:rPr>
+        <w:t>1.4 Positionnement de Cylentic</w:t>
+      </w:r>
+      <w:bookmarkEnd w:id="40"/>
+      <w:bookmarkEnd w:id="41"/>
     </w:p>
     <w:p>
       <w:pPr>
@@ -7226,25 +7106,148 @@
         <w:rPr>
           <w:color w:val="000000"/>
         </w:rPr>
+        <w:t xml:space="preserve">Cylentic n'est ni une plateforme d'apprentissage ouverte, ni une simple variante de LMS. </w:t>
+      </w:r>
+      <w:r>
+        <w:rPr>
+          <w:color w:val="000000"/>
+        </w:rPr>
+        <w:t>Elle</w:t>
+      </w:r>
+      <w:r>
+        <w:rPr>
+          <w:color w:val="000000"/>
+        </w:rPr>
+        <w:t xml:space="preserve"> vise l'évaluation surveillée de la programmation.</w:t>
+      </w:r>
+    </w:p>
+    <w:p>
+      <w:pPr>
+        <w:ind w:firstLine="425"/>
+        <w:jc w:val="both"/>
+      </w:pPr>
+      <w:r>
+        <w:rPr>
+          <w:color w:val="000000"/>
+        </w:rPr>
+        <w:t>Sa singularité tient au couplage : éditeur dans le navigateur, sandbox Docker Python, contrôles de passation côté client, règles métier et timers côté serveur, journal d'incidents, exports professeur, et maintien du surveillant physique. S'y ajoute une gouvernance multi établissement, avec un Super Admin plateforme distinct de l'administrateur d'école.</w:t>
+      </w:r>
+    </w:p>
+    <w:p>
+      <w:pPr>
+        <w:pStyle w:val="Titre2"/>
+      </w:pPr>
+      <w:bookmarkStart w:id="42" w:name="bm_ch1_5"/>
+      <w:bookmarkStart w:id="43" w:name="_Toc235117379"/>
+      <w:r>
+        <w:rPr>
+          <w:rFonts w:ascii="Times New Roman" w:eastAsia="Times New Roman" w:hAnsi="Times New Roman"/>
+        </w:rPr>
+        <w:t>1.5 Conclusion partielle</w:t>
+      </w:r>
+      <w:bookmarkEnd w:id="42"/>
+      <w:bookmarkEnd w:id="43"/>
+    </w:p>
+    <w:p>
+      <w:pPr>
+        <w:ind w:firstLine="425"/>
+        <w:jc w:val="both"/>
+      </w:pPr>
+      <w:r>
+        <w:rPr>
+          <w:color w:val="000000"/>
+        </w:rPr>
+        <w:t>Le constat est net : le problème existe, les outils ne le couvrent que par morceaux, et Cylentic a une place utile. Le chapitre suivant fixe le cahier des charges du MVP.</w:t>
+      </w:r>
+    </w:p>
+    <w:p>
+      <w:r>
+        <w:br w:type="page"/>
+      </w:r>
+    </w:p>
+    <w:p>
+      <w:pPr>
+        <w:pStyle w:val="Titre1"/>
+      </w:pPr>
+      <w:bookmarkStart w:id="44" w:name="bm_ch2"/>
+      <w:bookmarkStart w:id="45" w:name="_Toc235117289"/>
+      <w:bookmarkStart w:id="46" w:name="_Toc235117380"/>
+      <w:r>
+        <w:rPr>
+          <w:rFonts w:ascii="Times New Roman" w:eastAsia="Times New Roman" w:hAnsi="Times New Roman"/>
+        </w:rPr>
+        <w:lastRenderedPageBreak/>
+        <w:t>Chapitre 2 : Analyse des besoins et spécification du système</w:t>
+      </w:r>
+      <w:bookmarkEnd w:id="44"/>
+      <w:bookmarkEnd w:id="45"/>
+      <w:bookmarkEnd w:id="46"/>
+    </w:p>
+    <w:p>
+      <w:pPr>
+        <w:pStyle w:val="Titre2"/>
+      </w:pPr>
+      <w:bookmarkStart w:id="47" w:name="bm_ch2_1"/>
+      <w:bookmarkStart w:id="48" w:name="_Toc235117381"/>
+      <w:r>
+        <w:rPr>
+          <w:rFonts w:ascii="Times New Roman" w:eastAsia="Times New Roman" w:hAnsi="Times New Roman"/>
+        </w:rPr>
+        <w:t>2.1 Périmètre du projet et du MVP</w:t>
+      </w:r>
+      <w:bookmarkEnd w:id="47"/>
+      <w:bookmarkEnd w:id="48"/>
+    </w:p>
+    <w:p>
+      <w:pPr>
+        <w:ind w:firstLine="425"/>
+        <w:jc w:val="both"/>
+      </w:pPr>
+      <w:r>
+        <w:rPr>
+          <w:color w:val="000000"/>
+        </w:rPr>
+        <w:t>Le projet assume un périmètre volontairement limité pour sa première version. Le MVP inclut : le langage Python, l'authentification avec rôles (Super Admin, administrateur d'établissement, professeur, étudiant), la création et la publication d'examens, la salle d'attente, l'environnement de composition sécurisé, les mécanismes de contrôle navigateur, la correction automatique par tests unitaires, un module QCM de base, la gestion de plusieurs établissements, l'onboarding administrateur, la promotion de rentrée, le contact depuis la landing page, ainsi que les exports de résultats et de présence.</w:t>
+      </w:r>
+    </w:p>
+    <w:p>
+      <w:pPr>
+        <w:ind w:firstLine="425"/>
+        <w:jc w:val="both"/>
+      </w:pPr>
+      <w:r>
+        <w:rPr>
+          <w:color w:val="000000"/>
+        </w:rPr>
+        <w:t>Sont exclus de ce périmètre : le support d'autres langages que Python, la facturation réelle des établissements, la consultation en direct du code pendant l'épreuve, et l'activation de compte par email. Le MVP s'appuie sur des comptes créés par l'administration, un changement de mot de passe imposé si nécessaire, et des exports de résultats déjà disponibles pour le professeur (Excel, PDF) ainsi qu'un export de présence (CSV).</w:t>
+      </w:r>
+    </w:p>
+    <w:p>
+      <w:pPr>
+        <w:ind w:firstLine="425"/>
+        <w:jc w:val="both"/>
+      </w:pPr>
+      <w:r>
+        <w:rPr>
+          <w:color w:val="000000"/>
+        </w:rPr>
         <w:t>Ce périmètre restreint concentre l'effort sur le cœur du problème : la passation contrôlée et la correction automatique, plutôt que sur des fonctions secondaires.</w:t>
       </w:r>
     </w:p>
     <w:p>
       <w:pPr>
         <w:pStyle w:val="Titre2"/>
-        <w:spacing w:line="360" w:lineRule="auto" w:after="160"/>
-        <w:ind w:firstLine="0"/>
-        <w:jc w:val="both"/>
-      </w:pPr>
-      <w:r>
-        <w:rPr>
-          <w:rFonts w:ascii="Times New Roman" w:hAnsi="Times New Roman" w:eastAsia="Times New Roman"/>
-          <w:b/>
-          <w:color w:val="000000"/>
-          <w:sz w:val="24"/>
-        </w:rPr>
-        <w:t>2.4 Identification des acteurs</w:t>
-      </w:r>
+      </w:pPr>
+      <w:bookmarkStart w:id="49" w:name="bm_ch2_2"/>
+      <w:bookmarkStart w:id="50" w:name="_Toc235117382"/>
+      <w:r>
+        <w:rPr>
+          <w:rFonts w:ascii="Times New Roman" w:eastAsia="Times New Roman" w:hAnsi="Times New Roman"/>
+        </w:rPr>
+        <w:t>2.2 Identification des acteurs</w:t>
+      </w:r>
+      <w:bookmarkEnd w:id="49"/>
+      <w:bookmarkEnd w:id="50"/>
     </w:p>
     <w:p>
       <w:pPr>
@@ -7555,19 +7558,17 @@
     <w:p>
       <w:pPr>
         <w:pStyle w:val="Titre2"/>
-        <w:spacing w:line="360" w:lineRule="auto" w:after="160"/>
-        <w:ind w:firstLine="0"/>
-        <w:jc w:val="both"/>
-      </w:pPr>
-      <w:r>
-        <w:rPr>
-          <w:rFonts w:ascii="Times New Roman" w:hAnsi="Times New Roman" w:eastAsia="Times New Roman"/>
-          <w:b/>
-          <w:color w:val="000000"/>
-          <w:sz w:val="24"/>
-        </w:rPr>
-        <w:t>2.5 Besoins fonctionnels</w:t>
-      </w:r>
+      </w:pPr>
+      <w:bookmarkStart w:id="52" w:name="bm_ch2_3"/>
+      <w:bookmarkStart w:id="53" w:name="_Toc235117383"/>
+      <w:r>
+        <w:rPr>
+          <w:rFonts w:ascii="Times New Roman" w:eastAsia="Times New Roman" w:hAnsi="Times New Roman"/>
+        </w:rPr>
+        <w:t>2.3 Besoins fonctionnels</w:t>
+      </w:r>
+      <w:bookmarkEnd w:id="52"/>
+      <w:bookmarkEnd w:id="53"/>
     </w:p>
     <w:p>
       <w:pPr>
@@ -7644,19 +7645,18 @@
     <w:p>
       <w:pPr>
         <w:pStyle w:val="Titre2"/>
-        <w:spacing w:line="360" w:lineRule="auto" w:after="160"/>
-        <w:ind w:firstLine="0"/>
-        <w:jc w:val="both"/>
-      </w:pPr>
-      <w:r>
-        <w:rPr>
-          <w:rFonts w:ascii="Times New Roman" w:hAnsi="Times New Roman" w:eastAsia="Times New Roman"/>
-          <w:b/>
-          <w:color w:val="000000"/>
-          <w:sz w:val="24"/>
-        </w:rPr>
-        <w:t>2.6 Besoins non fonctionnels</w:t>
-      </w:r>
+      </w:pPr>
+      <w:bookmarkStart w:id="54" w:name="bm_ch2_4"/>
+      <w:bookmarkStart w:id="55" w:name="_Toc235117384"/>
+      <w:r>
+        <w:rPr>
+          <w:rFonts w:ascii="Times New Roman" w:eastAsia="Times New Roman" w:hAnsi="Times New Roman"/>
+        </w:rPr>
+        <w:lastRenderedPageBreak/>
+        <w:t>2.4 Besoins non fonctionnels</w:t>
+      </w:r>
+      <w:bookmarkEnd w:id="54"/>
+      <w:bookmarkEnd w:id="55"/>
     </w:p>
     <w:p>
       <w:pPr>
@@ -7685,19 +7685,17 @@
     <w:p>
       <w:pPr>
         <w:pStyle w:val="Titre2"/>
-        <w:spacing w:line="360" w:lineRule="auto" w:after="160"/>
-        <w:ind w:firstLine="0"/>
-        <w:jc w:val="both"/>
-      </w:pPr>
-      <w:r>
-        <w:rPr>
-          <w:rFonts w:ascii="Times New Roman" w:hAnsi="Times New Roman" w:eastAsia="Times New Roman"/>
-          <w:b/>
-          <w:color w:val="000000"/>
-          <w:sz w:val="24"/>
-        </w:rPr>
-        <w:t>2.7 Règles métier structurantes</w:t>
-      </w:r>
+      </w:pPr>
+      <w:bookmarkStart w:id="56" w:name="bm_ch2_5"/>
+      <w:bookmarkStart w:id="57" w:name="_Toc235117385"/>
+      <w:r>
+        <w:rPr>
+          <w:rFonts w:ascii="Times New Roman" w:eastAsia="Times New Roman" w:hAnsi="Times New Roman"/>
+        </w:rPr>
+        <w:t>2.5 Règles métier structurantes</w:t>
+      </w:r>
+      <w:bookmarkEnd w:id="56"/>
+      <w:bookmarkEnd w:id="57"/>
     </w:p>
     <w:p>
       <w:pPr>
@@ -7714,19 +7712,17 @@
     <w:p>
       <w:pPr>
         <w:pStyle w:val="Titre2"/>
-        <w:spacing w:line="360" w:lineRule="auto" w:after="160"/>
-        <w:ind w:firstLine="0"/>
-        <w:jc w:val="both"/>
-      </w:pPr>
-      <w:r>
-        <w:rPr>
-          <w:rFonts w:ascii="Times New Roman" w:hAnsi="Times New Roman" w:eastAsia="Times New Roman"/>
-          <w:b/>
-          <w:color w:val="000000"/>
-          <w:sz w:val="24"/>
-        </w:rPr>
-        <w:t>2.8 Scénarios d'usage prioritaires</w:t>
-      </w:r>
+      </w:pPr>
+      <w:bookmarkStart w:id="58" w:name="bm_ch2_6"/>
+      <w:bookmarkStart w:id="59" w:name="_Toc235117386"/>
+      <w:r>
+        <w:rPr>
+          <w:rFonts w:ascii="Times New Roman" w:eastAsia="Times New Roman" w:hAnsi="Times New Roman"/>
+        </w:rPr>
+        <w:t>2.6 Scénarios d'usage prioritaires</w:t>
+      </w:r>
+      <w:bookmarkEnd w:id="58"/>
+      <w:bookmarkEnd w:id="59"/>
     </w:p>
     <w:p>
       <w:pPr>
@@ -7743,19 +7739,18 @@
     <w:p>
       <w:pPr>
         <w:pStyle w:val="Titre2"/>
-        <w:spacing w:line="360" w:lineRule="auto" w:after="160"/>
-        <w:ind w:firstLine="0"/>
-        <w:jc w:val="both"/>
-      </w:pPr>
-      <w:r>
-        <w:rPr>
-          <w:rFonts w:ascii="Times New Roman" w:hAnsi="Times New Roman" w:eastAsia="Times New Roman"/>
-          <w:b/>
-          <w:color w:val="000000"/>
-          <w:sz w:val="24"/>
-        </w:rPr>
-        <w:t>2.9 Conclusion</w:t>
-      </w:r>
+      </w:pPr>
+      <w:bookmarkStart w:id="60" w:name="bm_ch2_7"/>
+      <w:bookmarkStart w:id="61" w:name="_Toc235117387"/>
+      <w:r>
+        <w:rPr>
+          <w:rFonts w:ascii="Times New Roman" w:eastAsia="Times New Roman" w:hAnsi="Times New Roman"/>
+        </w:rPr>
+        <w:lastRenderedPageBreak/>
+        <w:t>2.7 Conclusion partielle</w:t>
+      </w:r>
+      <w:bookmarkEnd w:id="60"/>
+      <w:bookmarkEnd w:id="61"/>
     </w:p>
     <w:p>
       <w:pPr>
@@ -8052,22 +8047,6 @@
     </w:p>
     <w:p>
       <w:pPr>
-        <w:spacing w:line="360" w:lineRule="auto" w:after="160"/>
-        <w:ind w:firstLine="425"/>
-        <w:jc w:val="both"/>
-      </w:pPr>
-      <w:r>
-        <w:rPr>
-          <w:rFonts w:ascii="Times New Roman" w:hAnsi="Times New Roman" w:eastAsia="Times New Roman"/>
-          <w:b w:val="0"/>
-          <w:color w:val="000000"/>
-          <w:sz w:val="24"/>
-        </w:rPr>
-        <w:t>La figure 1 présente l'architecture logique de Cylentic : interface web, services métier, persistance des données et sandbox d'exécution du code.</w:t>
-      </w:r>
-    </w:p>
-    <w:p>
-      <w:pPr>
         <w:ind w:firstLine="425"/>
         <w:jc w:val="both"/>
       </w:pPr>
@@ -8196,22 +8175,6 @@
         <w:t xml:space="preserve"> : Déploiement de l'infrastructure</w:t>
       </w:r>
       <w:bookmarkEnd w:id="70"/>
-    </w:p>
-    <w:p>
-      <w:pPr>
-        <w:spacing w:line="360" w:lineRule="auto" w:after="160"/>
-        <w:ind w:firstLine="425"/>
-        <w:jc w:val="both"/>
-      </w:pPr>
-      <w:r>
-        <w:rPr>
-          <w:rFonts w:ascii="Times New Roman" w:hAnsi="Times New Roman" w:eastAsia="Times New Roman"/>
-          <w:b w:val="0"/>
-          <w:color w:val="000000"/>
-          <w:sz w:val="24"/>
-        </w:rPr>
-        <w:t>La figure 2 illustre le déploiement physique de l'infrastructure : serveur applicatif, base MySQL, conteneurs Docker et postes clients en salle.</w:t>
-      </w:r>
     </w:p>
     <w:p>
       <w:pPr>
@@ -8367,22 +8330,6 @@
     </w:p>
     <w:p>
       <w:pPr>
-        <w:spacing w:line="360" w:lineRule="auto" w:after="160"/>
-        <w:ind w:firstLine="425"/>
-        <w:jc w:val="both"/>
-      </w:pPr>
-      <w:r>
-        <w:rPr>
-          <w:rFonts w:ascii="Times New Roman" w:hAnsi="Times New Roman" w:eastAsia="Times New Roman"/>
-          <w:b w:val="0"/>
-          <w:color w:val="000000"/>
-          <w:sz w:val="24"/>
-        </w:rPr>
-        <w:t>La figure 3 décrit les interactions du Super Admin avec la plateforme : gestion des établissements et pilotage global.</w:t>
-      </w:r>
-    </w:p>
-    <w:p>
-      <w:pPr>
         <w:ind w:firstLine="425"/>
         <w:jc w:val="both"/>
       </w:pPr>
@@ -8508,22 +8455,6 @@
     </w:p>
     <w:p>
       <w:pPr>
-        <w:spacing w:line="360" w:lineRule="auto" w:after="160"/>
-        <w:ind w:firstLine="425"/>
-        <w:jc w:val="both"/>
-      </w:pPr>
-      <w:r>
-        <w:rPr>
-          <w:rFonts w:ascii="Times New Roman" w:hAnsi="Times New Roman" w:eastAsia="Times New Roman"/>
-          <w:b w:val="0"/>
-          <w:color w:val="000000"/>
-          <w:sz w:val="24"/>
-        </w:rPr>
-        <w:t>La figure 4 montre les cas d'utilisation de l'administrateur d'établissement pour la gestion de l'organisation scolaire.</w:t>
-      </w:r>
-    </w:p>
-    <w:p>
-      <w:pPr>
         <w:spacing w:after="80" w:line="240" w:lineRule="auto"/>
         <w:jc w:val="center"/>
       </w:pPr>
@@ -8637,22 +8568,6 @@
     </w:p>
     <w:p>
       <w:pPr>
-        <w:spacing w:line="360" w:lineRule="auto" w:after="160"/>
-        <w:ind w:firstLine="425"/>
-        <w:jc w:val="both"/>
-      </w:pPr>
-      <w:r>
-        <w:rPr>
-          <w:rFonts w:ascii="Times New Roman" w:hAnsi="Times New Roman" w:eastAsia="Times New Roman"/>
-          <w:b w:val="0"/>
-          <w:color w:val="000000"/>
-          <w:sz w:val="24"/>
-        </w:rPr>
-        <w:t>La figure 5 présente la gestion des comptes professeurs et étudiants par l'administrateur d'établissement.</w:t>
-      </w:r>
-    </w:p>
-    <w:p>
-      <w:pPr>
         <w:ind w:firstLine="425"/>
         <w:jc w:val="both"/>
       </w:pPr>
@@ -8778,22 +8693,6 @@
     </w:p>
     <w:p>
       <w:pPr>
-        <w:spacing w:line="360" w:lineRule="auto" w:after="160"/>
-        <w:ind w:firstLine="425"/>
-        <w:jc w:val="both"/>
-      </w:pPr>
-      <w:r>
-        <w:rPr>
-          <w:rFonts w:ascii="Times New Roman" w:hAnsi="Times New Roman" w:eastAsia="Times New Roman"/>
-          <w:b w:val="0"/>
-          <w:color w:val="000000"/>
-          <w:sz w:val="24"/>
-        </w:rPr>
-        <w:t>La figure 6 détaille les actions du professeur lors de la création, de la publication et de la configuration d'un examen.</w:t>
-      </w:r>
-    </w:p>
-    <w:p>
-      <w:pPr>
         <w:spacing w:after="80" w:line="240" w:lineRule="auto"/>
         <w:jc w:val="center"/>
       </w:pPr>
@@ -8907,22 +8806,6 @@
     </w:p>
     <w:p>
       <w:pPr>
-        <w:spacing w:line="360" w:lineRule="auto" w:after="160"/>
-        <w:ind w:firstLine="425"/>
-        <w:jc w:val="both"/>
-      </w:pPr>
-      <w:r>
-        <w:rPr>
-          <w:rFonts w:ascii="Times New Roman" w:hAnsi="Times New Roman" w:eastAsia="Times New Roman"/>
-          <w:b w:val="0"/>
-          <w:color w:val="000000"/>
-          <w:sz w:val="24"/>
-        </w:rPr>
-        <w:t>La figure 7 illustre le suivi en direct des participations et la consultation des résultats par le professeur.</w:t>
-      </w:r>
-    </w:p>
-    <w:p>
-      <w:pPr>
         <w:ind w:firstLine="425"/>
         <w:jc w:val="both"/>
       </w:pPr>
@@ -9048,22 +8931,6 @@
     </w:p>
     <w:p>
       <w:pPr>
-        <w:spacing w:line="360" w:lineRule="auto" w:after="160"/>
-        <w:ind w:firstLine="425"/>
-        <w:jc w:val="both"/>
-      </w:pPr>
-      <w:r>
-        <w:rPr>
-          <w:rFonts w:ascii="Times New Roman" w:hAnsi="Times New Roman" w:eastAsia="Times New Roman"/>
-          <w:b w:val="0"/>
-          <w:color w:val="000000"/>
-          <w:sz w:val="24"/>
-        </w:rPr>
-        <w:t>La figure 8 représente le parcours étudiant : connexion, salle d'attente, composition et soumission de l'examen.</w:t>
-      </w:r>
-    </w:p>
-    <w:p>
-      <w:pPr>
         <w:pStyle w:val="Titre2"/>
       </w:pPr>
       <w:bookmarkStart w:id="79" w:name="bm_ch3_4"/>
@@ -9219,22 +9086,6 @@
         <w:t xml:space="preserve"> : Classes organisation et comptes</w:t>
       </w:r>
       <w:bookmarkEnd w:id="81"/>
-    </w:p>
-    <w:p>
-      <w:pPr>
-        <w:spacing w:line="360" w:lineRule="auto" w:after="160"/>
-        <w:ind w:firstLine="425"/>
-        <w:jc w:val="both"/>
-      </w:pPr>
-      <w:r>
-        <w:rPr>
-          <w:rFonts w:ascii="Times New Roman" w:hAnsi="Times New Roman" w:eastAsia="Times New Roman"/>
-          <w:b w:val="0"/>
-          <w:color w:val="000000"/>
-          <w:sz w:val="24"/>
-        </w:rPr>
-        <w:t>La figure 9 modélise les classes liées à l'organisation, aux établissements et aux comptes utilisateurs.</w:t>
-      </w:r>
     </w:p>
     <w:p>
       <w:pPr>
@@ -9351,22 +9202,6 @@
     </w:p>
     <w:p>
       <w:pPr>
-        <w:spacing w:line="360" w:lineRule="auto" w:after="160"/>
-        <w:ind w:firstLine="425"/>
-        <w:jc w:val="both"/>
-      </w:pPr>
-      <w:r>
-        <w:rPr>
-          <w:rFonts w:ascii="Times New Roman" w:hAnsi="Times New Roman" w:eastAsia="Times New Roman"/>
-          <w:b w:val="0"/>
-          <w:color w:val="000000"/>
-          <w:sz w:val="24"/>
-        </w:rPr>
-        <w:t>La figure 10 présente les classes intervenant dans la conception d'un examen et de ses exercices.</w:t>
-      </w:r>
-    </w:p>
-    <w:p>
-      <w:pPr>
         <w:spacing w:after="80" w:line="240" w:lineRule="auto"/>
         <w:jc w:val="center"/>
       </w:pPr>
@@ -9476,22 +9311,6 @@
         <w:t xml:space="preserve"> : Classes passation et correction</w:t>
       </w:r>
       <w:bookmarkEnd w:id="83"/>
-    </w:p>
-    <w:p>
-      <w:pPr>
-        <w:spacing w:line="360" w:lineRule="auto" w:after="160"/>
-        <w:ind w:firstLine="425"/>
-        <w:jc w:val="both"/>
-      </w:pPr>
-      <w:r>
-        <w:rPr>
-          <w:rFonts w:ascii="Times New Roman" w:hAnsi="Times New Roman" w:eastAsia="Times New Roman"/>
-          <w:b w:val="0"/>
-          <w:color w:val="000000"/>
-          <w:sz w:val="24"/>
-        </w:rPr>
-        <w:t>La figure 11 décrit les classes de la passation d'examen, de la participation et de la correction automatique.</w:t>
-      </w:r>
     </w:p>
     <w:p>
       <w:pPr>
@@ -9620,22 +9439,6 @@
     </w:p>
     <w:p>
       <w:pPr>
-        <w:spacing w:line="360" w:lineRule="auto" w:after="160"/>
-        <w:ind w:firstLine="425"/>
-        <w:jc w:val="both"/>
-      </w:pPr>
-      <w:r>
-        <w:rPr>
-          <w:rFonts w:ascii="Times New Roman" w:hAnsi="Times New Roman" w:eastAsia="Times New Roman"/>
-          <w:b w:val="0"/>
-          <w:color w:val="000000"/>
-          <w:sz w:val="24"/>
-        </w:rPr>
-        <w:t>La figure 12 montre un diagramme d'objets illustrant les relations entre établissement, classes et utilisateurs.</w:t>
-      </w:r>
-    </w:p>
-    <w:p>
-      <w:pPr>
         <w:spacing w:after="80" w:line="240" w:lineRule="auto"/>
         <w:jc w:val="center"/>
       </w:pPr>
@@ -9745,22 +9548,6 @@
         <w:t xml:space="preserve"> : Objets conception d'examen</w:t>
       </w:r>
       <w:bookmarkEnd w:id="85"/>
-    </w:p>
-    <w:p>
-      <w:pPr>
-        <w:spacing w:line="360" w:lineRule="auto" w:after="160"/>
-        <w:ind w:firstLine="425"/>
-        <w:jc w:val="both"/>
-      </w:pPr>
-      <w:r>
-        <w:rPr>
-          <w:rFonts w:ascii="Times New Roman" w:hAnsi="Times New Roman" w:eastAsia="Times New Roman"/>
-          <w:b w:val="0"/>
-          <w:color w:val="000000"/>
-          <w:sz w:val="24"/>
-        </w:rPr>
-        <w:t>La figure 13 illustre un examen instancié avec ses exercices et tests unitaires associés.</w:t>
-      </w:r>
     </w:p>
     <w:p>
       <w:pPr>
@@ -9877,22 +9664,6 @@
     </w:p>
     <w:p>
       <w:pPr>
-        <w:spacing w:line="360" w:lineRule="auto" w:after="160"/>
-        <w:ind w:firstLine="425"/>
-        <w:jc w:val="both"/>
-      </w:pPr>
-      <w:r>
-        <w:rPr>
-          <w:rFonts w:ascii="Times New Roman" w:hAnsi="Times New Roman" w:eastAsia="Times New Roman"/>
-          <w:b w:val="0"/>
-          <w:color w:val="000000"/>
-          <w:sz w:val="24"/>
-        </w:rPr>
-        <w:t>La figure 14 présente une participation étudiante en cours avec copie, incidents et résultats.</w:t>
-      </w:r>
-    </w:p>
-    <w:p>
-      <w:pPr>
         <w:pStyle w:val="Titre2"/>
       </w:pPr>
       <w:bookmarkStart w:id="87" w:name="bm_ch3_5"/>
@@ -10029,22 +9800,6 @@
         <w:t xml:space="preserve"> : Composants vue d'ensemble</w:t>
       </w:r>
       <w:bookmarkEnd w:id="89"/>
-    </w:p>
-    <w:p>
-      <w:pPr>
-        <w:spacing w:line="360" w:lineRule="auto" w:after="160"/>
-        <w:ind w:firstLine="425"/>
-        <w:jc w:val="both"/>
-      </w:pPr>
-      <w:r>
-        <w:rPr>
-          <w:rFonts w:ascii="Times New Roman" w:hAnsi="Times New Roman" w:eastAsia="Times New Roman"/>
-          <w:b w:val="0"/>
-          <w:color w:val="000000"/>
-          <w:sz w:val="24"/>
-        </w:rPr>
-        <w:t>La figure 15 donne une vue d'ensemble des composants logiciels de Cylentic et de leurs dépendances.</w:t>
-      </w:r>
     </w:p>
     <w:p>
       <w:pPr>
@@ -10161,22 +9916,6 @@
     </w:p>
     <w:p>
       <w:pPr>
-        <w:spacing w:line="360" w:lineRule="auto" w:after="160"/>
-        <w:ind w:firstLine="425"/>
-        <w:jc w:val="both"/>
-      </w:pPr>
-      <w:r>
-        <w:rPr>
-          <w:rFonts w:ascii="Times New Roman" w:hAnsi="Times New Roman" w:eastAsia="Times New Roman"/>
-          <w:b w:val="0"/>
-          <w:color w:val="000000"/>
-          <w:sz w:val="24"/>
-        </w:rPr>
-        <w:t>La figure 16 détaille les composants d'administration, d'authentification et de gestion des rôles.</w:t>
-      </w:r>
-    </w:p>
-    <w:p>
-      <w:pPr>
         <w:spacing w:after="80" w:line="240" w:lineRule="auto"/>
         <w:jc w:val="center"/>
       </w:pPr>
@@ -10289,22 +10028,6 @@
     </w:p>
     <w:p>
       <w:pPr>
-        <w:spacing w:line="360" w:lineRule="auto" w:after="160"/>
-        <w:ind w:firstLine="425"/>
-        <w:jc w:val="both"/>
-      </w:pPr>
-      <w:r>
-        <w:rPr>
-          <w:rFonts w:ascii="Times New Roman" w:hAnsi="Times New Roman" w:eastAsia="Times New Roman"/>
-          <w:b w:val="0"/>
-          <w:color w:val="000000"/>
-          <w:sz w:val="24"/>
-        </w:rPr>
-        <w:t>La figure 17 présente les composants chargés des examens, de la passation contrôlée et de l'exécution de code.</w:t>
-      </w:r>
-    </w:p>
-    <w:p>
-      <w:pPr>
         <w:ind w:firstLine="425"/>
         <w:jc w:val="both"/>
       </w:pPr>
@@ -10469,22 +10192,6 @@
         <w:t xml:space="preserve"> : États du cycle de vie d'un examen</w:t>
       </w:r>
       <w:bookmarkEnd w:id="96"/>
-    </w:p>
-    <w:p>
-      <w:pPr>
-        <w:spacing w:line="360" w:lineRule="auto" w:after="160"/>
-        <w:ind w:firstLine="425"/>
-        <w:jc w:val="both"/>
-      </w:pPr>
-      <w:r>
-        <w:rPr>
-          <w:rFonts w:ascii="Times New Roman" w:hAnsi="Times New Roman" w:eastAsia="Times New Roman"/>
-          <w:b w:val="0"/>
-          <w:color w:val="000000"/>
-          <w:sz w:val="24"/>
-        </w:rPr>
-        <w:t>La figure 18 montre les états successifs d'un examen, du brouillon à la clôture des résultats.</w:t>
-      </w:r>
     </w:p>
     <w:p>
       <w:pPr>
@@ -10628,22 +10335,6 @@
     </w:p>
     <w:p>
       <w:pPr>
-        <w:spacing w:line="360" w:lineRule="auto" w:after="160"/>
-        <w:ind w:firstLine="425"/>
-        <w:jc w:val="both"/>
-      </w:pPr>
-      <w:r>
-        <w:rPr>
-          <w:rFonts w:ascii="Times New Roman" w:hAnsi="Times New Roman" w:eastAsia="Times New Roman"/>
-          <w:b w:val="0"/>
-          <w:color w:val="000000"/>
-          <w:sz w:val="24"/>
-        </w:rPr>
-        <w:t>La figure 19 décrit la séquence d'authentification et d'attribution du rôle à la connexion.</w:t>
-      </w:r>
-    </w:p>
-    <w:p>
-      <w:pPr>
         <w:ind w:firstLine="425"/>
         <w:jc w:val="both"/>
       </w:pPr>
@@ -10775,22 +10466,6 @@
     </w:p>
     <w:p>
       <w:pPr>
-        <w:spacing w:line="360" w:lineRule="auto" w:after="160"/>
-        <w:ind w:firstLine="425"/>
-        <w:jc w:val="both"/>
-      </w:pPr>
-      <w:r>
-        <w:rPr>
-          <w:rFonts w:ascii="Times New Roman" w:hAnsi="Times New Roman" w:eastAsia="Times New Roman"/>
-          <w:b w:val="0"/>
-          <w:color w:val="000000"/>
-          <w:sz w:val="24"/>
-        </w:rPr>
-        <w:t>La figure 20 illustre la publication d'un examen et la génération du code d'accès.</w:t>
-      </w:r>
-    </w:p>
-    <w:p>
-      <w:pPr>
         <w:ind w:firstLine="425"/>
         <w:jc w:val="both"/>
       </w:pPr>
@@ -10928,22 +10603,6 @@
     </w:p>
     <w:p>
       <w:pPr>
-        <w:spacing w:line="360" w:lineRule="auto" w:after="160"/>
-        <w:ind w:firstLine="425"/>
-        <w:jc w:val="both"/>
-      </w:pPr>
-      <w:r>
-        <w:rPr>
-          <w:rFonts w:ascii="Times New Roman" w:hAnsi="Times New Roman" w:eastAsia="Times New Roman"/>
-          <w:b w:val="0"/>
-          <w:color w:val="000000"/>
-          <w:sz w:val="24"/>
-        </w:rPr>
-        <w:t>La figure 21 présente l'accès étudiant à l'examen via identifiant, mot de passe et code d'accès.</w:t>
-      </w:r>
-    </w:p>
-    <w:p>
-      <w:pPr>
         <w:ind w:firstLine="425"/>
         <w:jc w:val="both"/>
       </w:pPr>
@@ -11068,22 +10727,6 @@
     </w:p>
     <w:p>
       <w:pPr>
-        <w:spacing w:line="360" w:lineRule="auto" w:after="160"/>
-        <w:ind w:firstLine="425"/>
-        <w:jc w:val="both"/>
-      </w:pPr>
-      <w:r>
-        <w:rPr>
-          <w:rFonts w:ascii="Times New Roman" w:hAnsi="Times New Roman" w:eastAsia="Times New Roman"/>
-          <w:b w:val="0"/>
-          <w:color w:val="000000"/>
-          <w:sz w:val="24"/>
-        </w:rPr>
-        <w:t>La figure 22 montre l'exécution du code Python dans la sandbox Docker isolée.</w:t>
-      </w:r>
-    </w:p>
-    <w:p>
-      <w:pPr>
         <w:ind w:firstLine="425"/>
         <w:jc w:val="both"/>
       </w:pPr>
@@ -11206,22 +10849,6 @@
         <w:t xml:space="preserve"> : Séquence de soumission et correction</w:t>
       </w:r>
       <w:bookmarkEnd w:id="103"/>
-    </w:p>
-    <w:p>
-      <w:pPr>
-        <w:spacing w:line="360" w:lineRule="auto" w:after="160"/>
-        <w:ind w:firstLine="425"/>
-        <w:jc w:val="both"/>
-      </w:pPr>
-      <w:r>
-        <w:rPr>
-          <w:rFonts w:ascii="Times New Roman" w:hAnsi="Times New Roman" w:eastAsia="Times New Roman"/>
-          <w:b w:val="0"/>
-          <w:color w:val="000000"/>
-          <w:sz w:val="24"/>
-        </w:rPr>
-        <w:t>La figure 23 décrit la soumission de la copie et le déclenchement de la correction automatique.</w:t>
-      </w:r>
     </w:p>
     <w:p>
       <w:pPr>
@@ -11350,22 +10977,6 @@
     </w:p>
     <w:p>
       <w:pPr>
-        <w:spacing w:line="360" w:lineRule="auto" w:after="160"/>
-        <w:ind w:firstLine="425"/>
-        <w:jc w:val="both"/>
-      </w:pPr>
-      <w:r>
-        <w:rPr>
-          <w:rFonts w:ascii="Times New Roman" w:hAnsi="Times New Roman" w:eastAsia="Times New Roman"/>
-          <w:b w:val="0"/>
-          <w:color w:val="000000"/>
-          <w:sz w:val="24"/>
-        </w:rPr>
-        <w:t>La figure 24 illustre l'enregistrement d'un incident de passation et son traitement.</w:t>
-      </w:r>
-    </w:p>
-    <w:p>
-      <w:pPr>
         <w:pStyle w:val="Titre3"/>
       </w:pPr>
       <w:bookmarkStart w:id="105" w:name="3_6_3_Parcours_d_activit__de_l__tudiant"/>
@@ -11506,22 +11117,6 @@
     </w:p>
     <w:p>
       <w:pPr>
-        <w:spacing w:line="360" w:lineRule="auto" w:after="160"/>
-        <w:ind w:firstLine="425"/>
-        <w:jc w:val="both"/>
-      </w:pPr>
-      <w:r>
-        <w:rPr>
-          <w:rFonts w:ascii="Times New Roman" w:hAnsi="Times New Roman" w:eastAsia="Times New Roman"/>
-          <w:b w:val="0"/>
-          <w:color w:val="000000"/>
-          <w:sz w:val="24"/>
-        </w:rPr>
-        <w:t>La figure 25 présente le flux d'activité depuis la connexion jusqu'à la salle d'attente.</w:t>
-      </w:r>
-    </w:p>
-    <w:p>
-      <w:pPr>
         <w:spacing w:after="80" w:line="240" w:lineRule="auto"/>
         <w:jc w:val="center"/>
       </w:pPr>
@@ -11632,22 +11227,6 @@
         <w:t xml:space="preserve"> : Activité composition et soumission</w:t>
       </w:r>
       <w:bookmarkEnd w:id="108"/>
-    </w:p>
-    <w:p>
-      <w:pPr>
-        <w:spacing w:line="360" w:lineRule="auto" w:after="160"/>
-        <w:ind w:firstLine="425"/>
-        <w:jc w:val="both"/>
-      </w:pPr>
-      <w:r>
-        <w:rPr>
-          <w:rFonts w:ascii="Times New Roman" w:hAnsi="Times New Roman" w:eastAsia="Times New Roman"/>
-          <w:b w:val="0"/>
-          <w:color w:val="000000"/>
-          <w:sz w:val="24"/>
-        </w:rPr>
-        <w:t>La figure 26 décrit les activités de composition, d'exécution d'essai et de soumission finale.</w:t>
-      </w:r>
     </w:p>
     <w:p>
       <w:pPr>
@@ -12254,19 +11833,17 @@
     <w:p>
       <w:pPr>
         <w:pStyle w:val="Titre2"/>
-        <w:spacing w:line="360" w:lineRule="auto" w:after="160"/>
-        <w:ind w:firstLine="0"/>
-        <w:jc w:val="both"/>
-      </w:pPr>
-      <w:r>
-        <w:rPr>
-          <w:rFonts w:ascii="Times New Roman" w:hAnsi="Times New Roman" w:eastAsia="Times New Roman"/>
-          <w:b/>
-          <w:color w:val="000000"/>
-          <w:sz w:val="24"/>
-        </w:rPr>
-        <w:t>3.10 Conclusion</w:t>
-      </w:r>
+      </w:pPr>
+      <w:bookmarkStart w:id="116" w:name="bm_ch3_10"/>
+      <w:bookmarkStart w:id="117" w:name="_Toc235117401"/>
+      <w:r>
+        <w:rPr>
+          <w:rFonts w:ascii="Times New Roman" w:eastAsia="Times New Roman" w:hAnsi="Times New Roman"/>
+        </w:rPr>
+        <w:t>3.10 Conclusion partielle</w:t>
+      </w:r>
+      <w:bookmarkEnd w:id="116"/>
+      <w:bookmarkEnd w:id="117"/>
     </w:p>
     <w:p>
       <w:pPr>
@@ -12591,22 +12168,6 @@
     </w:p>
     <w:p>
       <w:pPr>
-        <w:spacing w:line="360" w:lineRule="auto" w:after="160"/>
-        <w:ind w:firstLine="425"/>
-        <w:jc w:val="both"/>
-      </w:pPr>
-      <w:r>
-        <w:rPr>
-          <w:rFonts w:ascii="Times New Roman" w:hAnsi="Times New Roman" w:eastAsia="Times New Roman"/>
-          <w:b w:val="0"/>
-          <w:color w:val="000000"/>
-          <w:sz w:val="24"/>
-        </w:rPr>
-        <w:t>La figure 27 montre l'interface de connexion permettant l'accès selon le rôle de l'utilisateur.</w:t>
-      </w:r>
-    </w:p>
-    <w:p>
-      <w:pPr>
         <w:ind w:firstLine="425"/>
         <w:jc w:val="both"/>
       </w:pPr>
@@ -12800,22 +12361,6 @@
     </w:p>
     <w:p>
       <w:pPr>
-        <w:spacing w:line="360" w:lineRule="auto" w:after="160"/>
-        <w:ind w:firstLine="425"/>
-        <w:jc w:val="both"/>
-      </w:pPr>
-      <w:r>
-        <w:rPr>
-          <w:rFonts w:ascii="Times New Roman" w:hAnsi="Times New Roman" w:eastAsia="Times New Roman"/>
-          <w:b w:val="0"/>
-          <w:color w:val="000000"/>
-          <w:sz w:val="24"/>
-        </w:rPr>
-        <w:t>La figure 28 présente l'espace de gestion réservé à l'administrateur d'établissement.</w:t>
-      </w:r>
-    </w:p>
-    <w:p>
-      <w:pPr>
         <w:ind w:firstLine="425"/>
         <w:jc w:val="both"/>
       </w:pPr>
@@ -12971,22 +12516,6 @@
     </w:p>
     <w:p>
       <w:pPr>
-        <w:spacing w:line="360" w:lineRule="auto" w:after="160"/>
-        <w:ind w:firstLine="425"/>
-        <w:jc w:val="both"/>
-      </w:pPr>
-      <w:r>
-        <w:rPr>
-          <w:rFonts w:ascii="Times New Roman" w:hAnsi="Times New Roman" w:eastAsia="Times New Roman"/>
-          <w:b w:val="0"/>
-          <w:color w:val="000000"/>
-          <w:sz w:val="24"/>
-        </w:rPr>
-        <w:t>La figure 29 illustre l'interface de création et d'édition d'un examen par le professeur.</w:t>
-      </w:r>
-    </w:p>
-    <w:p>
-      <w:pPr>
         <w:spacing w:before="240" w:after="240" w:line="240" w:lineRule="auto"/>
         <w:jc w:val="center"/>
         <w:rPr>
@@ -13108,22 +12637,6 @@
     </w:p>
     <w:p>
       <w:pPr>
-        <w:spacing w:line="360" w:lineRule="auto" w:after="160"/>
-        <w:ind w:firstLine="425"/>
-        <w:jc w:val="both"/>
-      </w:pPr>
-      <w:r>
-        <w:rPr>
-          <w:rFonts w:ascii="Times New Roman" w:hAnsi="Times New Roman" w:eastAsia="Times New Roman"/>
-          <w:b w:val="0"/>
-          <w:color w:val="000000"/>
-          <w:sz w:val="24"/>
-        </w:rPr>
-        <w:t>La figure 30 montre l'écran de publication d'un examen et l'affichage du code d'accès.</w:t>
-      </w:r>
-    </w:p>
-    <w:p>
-      <w:pPr>
         <w:spacing w:before="240" w:after="240" w:line="240" w:lineRule="auto"/>
         <w:jc w:val="center"/>
         <w:rPr>
@@ -13244,22 +12757,6 @@
     </w:p>
     <w:p>
       <w:pPr>
-        <w:spacing w:line="360" w:lineRule="auto" w:after="160"/>
-        <w:ind w:firstLine="425"/>
-        <w:jc w:val="both"/>
-      </w:pPr>
-      <w:r>
-        <w:rPr>
-          <w:rFonts w:ascii="Times New Roman" w:hAnsi="Times New Roman" w:eastAsia="Times New Roman"/>
-          <w:b w:val="0"/>
-          <w:color w:val="000000"/>
-          <w:sz w:val="24"/>
-        </w:rPr>
-        <w:t>La figure 31 présente le tableau de suivi en direct des étudiants pendant l'épreuve.</w:t>
-      </w:r>
-    </w:p>
-    <w:p>
-      <w:pPr>
         <w:spacing w:before="240" w:after="240" w:line="240" w:lineRule="auto"/>
         <w:jc w:val="center"/>
         <w:rPr>
@@ -13380,22 +12877,6 @@
     </w:p>
     <w:p>
       <w:pPr>
-        <w:spacing w:line="360" w:lineRule="auto" w:after="160"/>
-        <w:ind w:firstLine="425"/>
-        <w:jc w:val="both"/>
-      </w:pPr>
-      <w:r>
-        <w:rPr>
-          <w:rFonts w:ascii="Times New Roman" w:hAnsi="Times New Roman" w:eastAsia="Times New Roman"/>
-          <w:b w:val="0"/>
-          <w:color w:val="000000"/>
-          <w:sz w:val="24"/>
-        </w:rPr>
-        <w:t>La figure 32 illustre la consultation des résultats et les options d'export pour le professeur.</w:t>
-      </w:r>
-    </w:p>
-    <w:p>
-      <w:pPr>
         <w:ind w:firstLine="425"/>
         <w:jc w:val="both"/>
       </w:pPr>
@@ -13548,22 +13029,6 @@
     </w:p>
     <w:p>
       <w:pPr>
-        <w:spacing w:line="360" w:lineRule="auto" w:after="160"/>
-        <w:ind w:firstLine="425"/>
-        <w:jc w:val="both"/>
-      </w:pPr>
-      <w:r>
-        <w:rPr>
-          <w:rFonts w:ascii="Times New Roman" w:hAnsi="Times New Roman" w:eastAsia="Times New Roman"/>
-          <w:b w:val="0"/>
-          <w:color w:val="000000"/>
-          <w:sz w:val="24"/>
-        </w:rPr>
-        <w:t>La figure 33 montre les consignes de sécurité et l'activation du mode plein écran côté étudiant.</w:t>
-      </w:r>
-    </w:p>
-    <w:p>
-      <w:pPr>
         <w:spacing w:before="240" w:after="240" w:line="240" w:lineRule="auto"/>
         <w:jc w:val="center"/>
       </w:pPr>
@@ -13676,22 +13141,6 @@
     </w:p>
     <w:p>
       <w:pPr>
-        <w:spacing w:line="360" w:lineRule="auto" w:after="160"/>
-        <w:ind w:firstLine="425"/>
-        <w:jc w:val="both"/>
-      </w:pPr>
-      <w:r>
-        <w:rPr>
-          <w:rFonts w:ascii="Times New Roman" w:hAnsi="Times New Roman" w:eastAsia="Times New Roman"/>
-          <w:b w:val="0"/>
-          <w:color w:val="000000"/>
-          <w:sz w:val="24"/>
-        </w:rPr>
-        <w:t>La figure 34 présente la salle d'attente affichée avant le démarrage officiel de l'épreuve.</w:t>
-      </w:r>
-    </w:p>
-    <w:p>
-      <w:pPr>
         <w:ind w:firstLine="425"/>
         <w:jc w:val="both"/>
       </w:pPr>
@@ -13817,22 +13266,6 @@
     </w:p>
     <w:p>
       <w:pPr>
-        <w:spacing w:line="360" w:lineRule="auto" w:after="160"/>
-        <w:ind w:firstLine="425"/>
-        <w:jc w:val="both"/>
-      </w:pPr>
-      <w:r>
-        <w:rPr>
-          <w:rFonts w:ascii="Times New Roman" w:hAnsi="Times New Roman" w:eastAsia="Times New Roman"/>
-          <w:b w:val="0"/>
-          <w:color w:val="000000"/>
-          <w:sz w:val="24"/>
-        </w:rPr>
-        <w:t>La figure 35 illustre l'éditeur de code et l'environnement de composition pendant l'examen.</w:t>
-      </w:r>
-    </w:p>
-    <w:p>
-      <w:pPr>
         <w:ind w:firstLine="425"/>
         <w:jc w:val="both"/>
       </w:pPr>
@@ -14034,34 +13467,45 @@
     </w:p>
     <w:p>
       <w:pPr>
-        <w:spacing w:line="360" w:lineRule="auto" w:after="160"/>
+        <w:pStyle w:val="Titre2"/>
+      </w:pPr>
+      <w:bookmarkStart w:id="152" w:name="bm_ch4_5"/>
+      <w:bookmarkStart w:id="153" w:name="_Toc235117414"/>
+      <w:r>
+        <w:rPr>
+          <w:rFonts w:ascii="Times New Roman" w:eastAsia="Times New Roman" w:hAnsi="Times New Roman"/>
+        </w:rPr>
+        <w:t>4.5 Points techniques difficiles</w:t>
+      </w:r>
+      <w:bookmarkEnd w:id="152"/>
+      <w:bookmarkEnd w:id="153"/>
+    </w:p>
+    <w:p>
+      <w:pPr>
         <w:ind w:firstLine="425"/>
         <w:jc w:val="both"/>
       </w:pPr>
       <w:r>
         <w:rPr>
-          <w:rFonts w:ascii="Times New Roman" w:hAnsi="Times New Roman" w:eastAsia="Times New Roman"/>
-          <w:b w:val="0"/>
-          <w:color w:val="000000"/>
-          <w:sz w:val="24"/>
-        </w:rPr>
-        <w:t>La figure 36 montre la page d'accueil publique de la plateforme Cylentic.</w:t>
+          <w:color w:val="000000"/>
+        </w:rPr>
+        <w:t>Plusieurs problèmes concrets ont marqué la réalisation. Le cookie Secure en HTTP bloquait les connexions sur le réseau local ; il a fallu le conditionner à la présence réelle de HTTPS. Les objets Décimal de Prisma provoquaient un crash lorsqu'ils étaient passés directement à des composants clients ; la réponse a été de sérialiser les points en nombres côté serveur. Le timer étudiant ne suivait pas les changements de planning tant que la session n'était chargée qu'une seule fois ; un polling de synchronisation a réglé ce point. Le verrouillage trop strict des exercices empêchait toute modification d'un examen publié avant le démarrage ; la règle canModifyExamExercises a clarifié le comportement. Enfin, le passage d'icônes depuis des fichiers serveur vers des composants clients a exigé un mapping par chaînes côté client.</w:t>
       </w:r>
     </w:p>
     <w:p>
       <w:pPr>
         <w:pStyle w:val="Titre2"/>
       </w:pPr>
-      <w:bookmarkStart w:id="152" w:name="bm_ch4_5"/>
-      <w:bookmarkStart w:id="153" w:name="_Toc235117414"/>
+      <w:bookmarkStart w:id="154" w:name="bm_ch4_6"/>
+      <w:bookmarkStart w:id="155" w:name="_Toc235117415"/>
       <w:r>
         <w:rPr>
           <w:rFonts w:ascii="Times New Roman" w:eastAsia="Times New Roman" w:hAnsi="Times New Roman"/>
         </w:rPr>
-        <w:t>4.5 Points techniques difficiles</w:t>
-      </w:r>
-      <w:bookmarkEnd w:id="152"/>
-      <w:bookmarkEnd w:id="153"/>
+        <w:t>4.6 Déploiement</w:t>
+      </w:r>
+      <w:bookmarkEnd w:id="154"/>
+      <w:bookmarkEnd w:id="155"/>
     </w:p>
     <w:p>
       <w:pPr>
@@ -14072,33 +13516,6 @@
         <w:rPr>
           <w:color w:val="000000"/>
         </w:rPr>
-        <w:t>Plusieurs problèmes concrets ont marqué la réalisation. Le cookie Secure en HTTP bloquait les connexions sur le réseau local ; il a fallu le conditionner à la présence réelle de HTTPS. Les objets Décimal de Prisma provoquaient un crash lorsqu'ils étaient passés directement à des composants clients ; la réponse a été de sérialiser les points en nombres côté serveur. Le timer étudiant ne suivait pas les changements de planning tant que la session n'était chargée qu'une seule fois ; un polling de synchronisation a réglé ce point. Le verrouillage trop strict des exercices empêchait toute modification d'un examen publié avant le démarrage ; la règle canModifyExamExercises a clarifié le comportement. Enfin, le passage d'icônes depuis des fichiers serveur vers des composants clients a exigé un mapping par chaînes côté client.</w:t>
-      </w:r>
-    </w:p>
-    <w:p>
-      <w:pPr>
-        <w:pStyle w:val="Titre2"/>
-      </w:pPr>
-      <w:bookmarkStart w:id="154" w:name="bm_ch4_6"/>
-      <w:bookmarkStart w:id="155" w:name="_Toc235117415"/>
-      <w:r>
-        <w:rPr>
-          <w:rFonts w:ascii="Times New Roman" w:eastAsia="Times New Roman" w:hAnsi="Times New Roman"/>
-        </w:rPr>
-        <w:t>4.6 Déploiement</w:t>
-      </w:r>
-      <w:bookmarkEnd w:id="154"/>
-      <w:bookmarkEnd w:id="155"/>
-    </w:p>
-    <w:p>
-      <w:pPr>
-        <w:ind w:firstLine="425"/>
-        <w:jc w:val="both"/>
-      </w:pPr>
-      <w:r>
-        <w:rPr>
-          <w:color w:val="000000"/>
-        </w:rPr>
         <w:t xml:space="preserve">Pour une démonstration en salle, le scénario recommandé est simple : produire un build, démarrer avec next start en écoutant sur toutes les interfaces, puis accéder via </w:t>
       </w:r>
       <w:r>
@@ -14112,19 +13529,17 @@
     <w:p>
       <w:pPr>
         <w:pStyle w:val="Titre2"/>
-        <w:spacing w:line="360" w:lineRule="auto" w:after="160"/>
-        <w:ind w:firstLine="0"/>
-        <w:jc w:val="both"/>
-      </w:pPr>
-      <w:r>
-        <w:rPr>
-          <w:rFonts w:ascii="Times New Roman" w:hAnsi="Times New Roman" w:eastAsia="Times New Roman"/>
-          <w:b/>
-          <w:color w:val="000000"/>
-          <w:sz w:val="24"/>
-        </w:rPr>
-        <w:t>4.7 Conclusion</w:t>
-      </w:r>
+      </w:pPr>
+      <w:bookmarkStart w:id="156" w:name="bm_ch4_7"/>
+      <w:bookmarkStart w:id="157" w:name="_Toc235117416"/>
+      <w:r>
+        <w:rPr>
+          <w:rFonts w:ascii="Times New Roman" w:eastAsia="Times New Roman" w:hAnsi="Times New Roman"/>
+        </w:rPr>
+        <w:t>4.7 Conclusion partielle</w:t>
+      </w:r>
+      <w:bookmarkEnd w:id="156"/>
+      <w:bookmarkEnd w:id="157"/>
     </w:p>
     <w:p>
       <w:pPr>
@@ -14495,301 +13910,26 @@
     <w:p>
       <w:pPr>
         <w:pStyle w:val="Titre2"/>
-        <w:spacing w:line="360" w:lineRule="auto" w:after="160"/>
-        <w:ind w:firstLine="0"/>
-        <w:jc w:val="both"/>
-      </w:pPr>
-      <w:r>
-        <w:rPr>
-          <w:rFonts w:ascii="Times New Roman" w:hAnsi="Times New Roman" w:eastAsia="Times New Roman"/>
-          <w:b/>
-          <w:color w:val="000000"/>
-          <w:sz w:val="24"/>
-        </w:rPr>
-        <w:t>5.6 Coût estimatif du projet</w:t>
-      </w:r>
-    </w:p>
-    <w:p>
-      <w:pPr>
-        <w:spacing w:line="360" w:lineRule="auto" w:after="160"/>
+      </w:pPr>
+      <w:bookmarkStart w:id="179" w:name="bm_ch5_6"/>
+      <w:bookmarkStart w:id="180" w:name="_Toc235117427"/>
+      <w:r>
+        <w:rPr>
+          <w:rFonts w:ascii="Times New Roman" w:eastAsia="Times New Roman" w:hAnsi="Times New Roman"/>
+        </w:rPr>
+        <w:t>5.6 Conclusion partielle</w:t>
+      </w:r>
+      <w:bookmarkEnd w:id="179"/>
+      <w:bookmarkEnd w:id="180"/>
+    </w:p>
+    <w:p>
+      <w:pPr>
         <w:ind w:firstLine="425"/>
         <w:jc w:val="both"/>
       </w:pPr>
       <w:r>
         <w:rPr>
-          <w:rFonts w:ascii="Times New Roman" w:hAnsi="Times New Roman" w:eastAsia="Times New Roman"/>
-          <w:b w:val="0"/>
-          <w:color w:val="000000"/>
-          <w:sz w:val="24"/>
-        </w:rPr>
-        <w:t>Le tableau ci-dessous estime le coût du projet pour un déploiement pilote sur douze mois. Les postes de développement sont intégrés au cadre académique du projet de fin d'année.</w:t>
-      </w:r>
-    </w:p>
-    <w:tbl>
-      <w:tblPr>
-        <w:tblStyle w:val="Grilledutableau"/>
-        <w:tblW w:type="auto" w:w="0"/>
-        <w:tblLook w:firstColumn="1" w:firstRow="1" w:lastColumn="0" w:lastRow="0" w:noHBand="0" w:noVBand="1" w:val="04A0"/>
-      </w:tblPr>
-      <w:tblGrid>
-        <w:gridCol w:w="2835"/>
-        <w:gridCol w:w="2835"/>
-        <w:gridCol w:w="2835"/>
-      </w:tblGrid>
-      <w:tr>
-        <w:tc>
-          <w:tcPr>
-            <w:tcW w:type="dxa" w:w="2835"/>
-          </w:tcPr>
-          <w:p>
-            <w:r>
-              <w:t>Poste</w:t>
-            </w:r>
-          </w:p>
-        </w:tc>
-        <w:tc>
-          <w:tcPr>
-            <w:tcW w:type="dxa" w:w="2835"/>
-          </w:tcPr>
-          <w:p>
-            <w:r>
-              <w:t>Détail</w:t>
-            </w:r>
-          </w:p>
-        </w:tc>
-        <w:tc>
-          <w:tcPr>
-            <w:tcW w:type="dxa" w:w="2835"/>
-          </w:tcPr>
-          <w:p>
-            <w:r>
-              <w:t>Coût estimé (FCFA)</w:t>
-            </w:r>
-          </w:p>
-        </w:tc>
-      </w:tr>
-      <w:tr>
-        <w:tc>
-          <w:tcPr>
-            <w:tcW w:type="dxa" w:w="2835"/>
-          </w:tcPr>
-          <w:p>
-            <w:r>
-              <w:t>Développement</w:t>
-            </w:r>
-          </w:p>
-        </w:tc>
-        <w:tc>
-          <w:tcPr>
-            <w:tcW w:type="dxa" w:w="2835"/>
-          </w:tcPr>
-          <w:p>
-            <w:r>
-              <w:t>Équipe de 3 étudiants, cadre académique</w:t>
-            </w:r>
-          </w:p>
-        </w:tc>
-        <w:tc>
-          <w:tcPr>
-            <w:tcW w:type="dxa" w:w="2835"/>
-          </w:tcPr>
-          <w:p>
-            <w:r>
-              <w:t>0</w:t>
-            </w:r>
-          </w:p>
-        </w:tc>
-      </w:tr>
-      <w:tr>
-        <w:tc>
-          <w:tcPr>
-            <w:tcW w:type="dxa" w:w="2835"/>
-          </w:tcPr>
-          <w:p>
-            <w:r>
-              <w:t>Hébergement VPS</w:t>
-            </w:r>
-          </w:p>
-        </w:tc>
-        <w:tc>
-          <w:tcPr>
-            <w:tcW w:type="dxa" w:w="2835"/>
-          </w:tcPr>
-          <w:p>
-            <w:r>
-              <w:t>Serveur 4 vCPU, 8 Go RAM, 12 mois</w:t>
-            </w:r>
-          </w:p>
-        </w:tc>
-        <w:tc>
-          <w:tcPr>
-            <w:tcW w:type="dxa" w:w="2835"/>
-          </w:tcPr>
-          <w:p>
-            <w:r>
-              <w:t>180 000</w:t>
-            </w:r>
-          </w:p>
-        </w:tc>
-      </w:tr>
-      <w:tr>
-        <w:tc>
-          <w:tcPr>
-            <w:tcW w:type="dxa" w:w="2835"/>
-          </w:tcPr>
-          <w:p>
-            <w:r>
-              <w:t>Nom de domaine</w:t>
-            </w:r>
-          </w:p>
-        </w:tc>
-        <w:tc>
-          <w:tcPr>
-            <w:tcW w:type="dxa" w:w="2835"/>
-          </w:tcPr>
-          <w:p>
-            <w:r>
-              <w:t>Enregistrement annuel</w:t>
-            </w:r>
-          </w:p>
-        </w:tc>
-        <w:tc>
-          <w:tcPr>
-            <w:tcW w:type="dxa" w:w="2835"/>
-          </w:tcPr>
-          <w:p>
-            <w:r>
-              <w:t>15 000</w:t>
-            </w:r>
-          </w:p>
-        </w:tc>
-      </w:tr>
-      <w:tr>
-        <w:tc>
-          <w:tcPr>
-            <w:tcW w:type="dxa" w:w="2835"/>
-          </w:tcPr>
-          <w:p>
-            <w:r>
-              <w:t>Outils</w:t>
-            </w:r>
-          </w:p>
-        </w:tc>
-        <w:tc>
-          <w:tcPr>
-            <w:tcW w:type="dxa" w:w="2835"/>
-          </w:tcPr>
-          <w:p>
-            <w:r>
-              <w:t>IDE, Git, Docker (open source)</w:t>
-            </w:r>
-          </w:p>
-        </w:tc>
-        <w:tc>
-          <w:tcPr>
-            <w:tcW w:type="dxa" w:w="2835"/>
-          </w:tcPr>
-          <w:p>
-            <w:r>
-              <w:t>0</w:t>
-            </w:r>
-          </w:p>
-        </w:tc>
-      </w:tr>
-      <w:tr>
-        <w:tc>
-          <w:tcPr>
-            <w:tcW w:type="dxa" w:w="2835"/>
-          </w:tcPr>
-          <w:p>
-            <w:r>
-              <w:t>Total</w:t>
-            </w:r>
-          </w:p>
-        </w:tc>
-        <w:tc>
-          <w:tcPr>
-            <w:tcW w:type="dxa" w:w="2835"/>
-          </w:tcPr>
-          <w:p>
-            <w:r>
-              <w:t>Déploiement pilote sur 12 mois</w:t>
-            </w:r>
-          </w:p>
-        </w:tc>
-        <w:tc>
-          <w:tcPr>
-            <w:tcW w:type="dxa" w:w="2835"/>
-          </w:tcPr>
-          <w:p>
-            <w:r>
-              <w:t>195 000</w:t>
-            </w:r>
-          </w:p>
-        </w:tc>
-      </w:tr>
-    </w:tbl>
-    <w:p>
-      <w:pPr>
-        <w:spacing w:line="360" w:lineRule="auto" w:after="160"/>
-        <w:ind w:firstLine="0"/>
-        <w:jc w:val="left"/>
-      </w:pPr>
-      <w:r>
-        <w:rPr>
-          <w:rFonts w:ascii="Times New Roman" w:hAnsi="Times New Roman" w:eastAsia="Times New Roman"/>
-          <w:b/>
-          <w:color w:val="000000"/>
-          <w:sz w:val="24"/>
-        </w:rPr>
-        <w:t>Tableau 4 : Coût estimatif du projet Cylentic</w:t>
-      </w:r>
-    </w:p>
-    <w:p>
-      <w:pPr>
-        <w:spacing w:line="360" w:lineRule="auto" w:after="160"/>
-        <w:ind w:firstLine="0"/>
-        <w:jc w:val="left"/>
-      </w:pPr>
-      <w:r>
-        <w:rPr>
-          <w:rFonts w:ascii="Times New Roman" w:hAnsi="Times New Roman" w:eastAsia="Times New Roman"/>
-          <w:b w:val="0"/>
-          <w:color w:val="000000"/>
-          <w:sz w:val="24"/>
-        </w:rPr>
-        <w:t>Source : estimation réalisée par l'équipe projet, juillet 2026.</w:t>
-      </w:r>
-    </w:p>
-    <w:p>
-      <w:pPr>
-        <w:pStyle w:val="Titre2"/>
-        <w:spacing w:line="360" w:lineRule="auto" w:after="160"/>
-        <w:ind w:firstLine="425"/>
-        <w:jc w:val="both"/>
-      </w:pPr>
-      <w:r>
-        <w:rPr>
-          <w:rFonts w:ascii="Times New Roman" w:hAnsi="Times New Roman" w:eastAsia="Times New Roman"/>
-          <w:b w:val="0"/>
-          <w:color w:val="000000"/>
-          <w:sz w:val="24"/>
-        </w:rPr>
-        <w:t>5.7 Conclusion</w:t>
-      </w:r>
-    </w:p>
-    <w:p>
-      <w:pPr>
-        <w:spacing w:line="360" w:lineRule="auto" w:after="160"/>
-        <w:ind w:firstLine="425"/>
-        <w:jc w:val="both"/>
-      </w:pPr>
-      <w:r>
-        <w:rPr>
-          <w:rFonts w:ascii="Times New Roman" w:hAnsi="Times New Roman" w:eastAsia="Times New Roman"/>
-          <w:b w:val="0"/>
-          <w:color w:val="000000"/>
-          <w:sz w:val="24"/>
+          <w:color w:val="000000"/>
         </w:rPr>
         <w:t>Au bilan, le MVP Cylentic se démontre sur son périmètre et reste cohérent techniquement. Ce qui manque encore vient surtout de choix de priorité (temps réel, multi langages, tests automatisés), pas d'une faille d'architecture de fond.</w:t>
       </w:r>
@@ -14861,309 +14001,279 @@
     <w:p>
       <w:pPr>
         <w:pStyle w:val="Titre1"/>
-        <w:spacing w:line="360" w:lineRule="auto" w:after="160"/>
-        <w:ind w:firstLine="0"/>
-        <w:jc w:val="both"/>
-      </w:pPr>
-      <w:r>
-        <w:rPr>
-          <w:rFonts w:ascii="Times New Roman" w:hAnsi="Times New Roman" w:eastAsia="Times New Roman"/>
-          <w:b/>
-          <w:color w:val="000000"/>
-          <w:sz w:val="24"/>
-        </w:rPr>
-        <w:t>Bibliographie</w:t>
-      </w:r>
-    </w:p>
-    <w:p>
-      <w:pPr>
-        <w:spacing w:line="360" w:lineRule="auto" w:after="160"/>
-        <w:ind w:firstLine="0"/>
-        <w:jc w:val="left"/>
-      </w:pPr>
-      <w:r>
-        <w:rPr>
-          <w:rFonts w:ascii="Times New Roman" w:hAnsi="Times New Roman" w:eastAsia="Times New Roman"/>
-          <w:b w:val="0"/>
-          <w:color w:val="000000"/>
-          <w:sz w:val="24"/>
-        </w:rPr>
-        <w:t>[1] Object Management Group, OMG Unified Modeling Language (OMG UML), Version 2.5.1, 2017.</w:t>
-      </w:r>
-    </w:p>
-    <w:p>
-      <w:pPr>
-        <w:spacing w:line="360" w:lineRule="auto" w:after="160"/>
-        <w:ind w:firstLine="0"/>
-        <w:jc w:val="left"/>
-      </w:pPr>
-      <w:r>
-        <w:rPr>
-          <w:rFonts w:ascii="Times New Roman" w:hAnsi="Times New Roman" w:eastAsia="Times New Roman"/>
-          <w:b w:val="0"/>
-          <w:color w:val="000000"/>
-          <w:sz w:val="24"/>
-        </w:rPr>
-        <w:t>[2] R. S. Pressman et B. R. Maxim, Software Engineering: A Practitioner's Approach, 9e éd., McGraw-Hill, 2019.</w:t>
-      </w:r>
-    </w:p>
-    <w:p>
-      <w:pPr>
-        <w:spacing w:line="360" w:lineRule="auto" w:after="160"/>
-        <w:ind w:firstLine="0"/>
-        <w:jc w:val="left"/>
-      </w:pPr>
-      <w:r>
-        <w:rPr>
-          <w:rFonts w:ascii="Times New Roman" w:hAnsi="Times New Roman" w:eastAsia="Times New Roman"/>
-          <w:b w:val="0"/>
-          <w:color w:val="000000"/>
-          <w:sz w:val="24"/>
-        </w:rPr>
-        <w:t>[3] I. Sommerville, Software Engineering, 10e éd., Pearson, 2016.</w:t>
-      </w:r>
-    </w:p>
-    <w:p>
-      <w:pPr>
-        <w:spacing w:line="360" w:lineRule="auto" w:after="160"/>
-        <w:ind w:firstLine="0"/>
-        <w:jc w:val="left"/>
-      </w:pPr>
-      <w:r>
-        <w:rPr>
-          <w:rFonts w:ascii="Times New Roman" w:hAnsi="Times New Roman" w:eastAsia="Times New Roman"/>
-          <w:b w:val="0"/>
-          <w:color w:val="000000"/>
-          <w:sz w:val="24"/>
-        </w:rPr>
-        <w:t>[4] G. Booch, J. Rumbaugh et I. Jacobson, The Unified Modeling Language User Guide, 2e éd., Addison-Wesley, 2005.</w:t>
-      </w:r>
-    </w:p>
-    <w:p>
-      <w:pPr>
-        <w:spacing w:line="360" w:lineRule="auto" w:after="160"/>
-        <w:ind w:firstLine="0"/>
-        <w:jc w:val="left"/>
-      </w:pPr>
-      <w:r>
-        <w:rPr>
-          <w:rFonts w:ascii="Times New Roman" w:hAnsi="Times New Roman" w:eastAsia="Times New Roman"/>
-          <w:b w:val="0"/>
-          <w:color w:val="000000"/>
-          <w:sz w:val="24"/>
-        </w:rPr>
-        <w:t>[5] ESTA, Guide du stagiaire Master/Ingénieur, année académique 2024-2025.</w:t>
-      </w:r>
-    </w:p>
-    <w:p>
-      <w:pPr>
-        <w:spacing w:line="360" w:lineRule="auto" w:after="160"/>
-        <w:ind w:firstLine="0"/>
-        <w:jc w:val="left"/>
-      </w:pPr>
-      <w:r>
-        <w:rPr>
-          <w:rFonts w:ascii="Times New Roman" w:hAnsi="Times New Roman" w:eastAsia="Times New Roman"/>
-          <w:b w:val="0"/>
-          <w:color w:val="000000"/>
-          <w:sz w:val="24"/>
-        </w:rPr>
-        <w:t>[6] M. Fowler, Patterns of Enterprise Application Architecture, Addison-Wesley, 2002.</w:t>
-      </w:r>
-    </w:p>
-    <w:p>
-      <w:pPr>
-        <w:spacing w:line="360" w:lineRule="auto" w:after="160"/>
-        <w:ind w:firstLine="425"/>
-        <w:jc w:val="both"/>
-      </w:pPr>
-      <w:r>
-        <w:rPr>
-          <w:rFonts w:ascii="Times New Roman" w:hAnsi="Times New Roman" w:eastAsia="Times New Roman"/>
-          <w:b w:val="0"/>
-          <w:color w:val="000000"/>
-          <w:sz w:val="24"/>
-        </w:rPr>
-      </w:r>
+      </w:pPr>
+      <w:bookmarkStart w:id="184" w:name="bm_biblio"/>
+      <w:bookmarkStart w:id="185" w:name="_Toc235117294"/>
+      <w:bookmarkStart w:id="186" w:name="_Toc235117429"/>
+      <w:r>
+        <w:rPr>
+          <w:rFonts w:ascii="Times New Roman" w:eastAsia="Times New Roman" w:hAnsi="Times New Roman"/>
+        </w:rPr>
+        <w:lastRenderedPageBreak/>
+        <w:t>Bibliographie et webographie</w:t>
+      </w:r>
+      <w:bookmarkEnd w:id="184"/>
+      <w:bookmarkEnd w:id="185"/>
+      <w:bookmarkEnd w:id="186"/>
+    </w:p>
+    <w:p>
+      <w:pPr>
+        <w:spacing w:after="120"/>
+      </w:pPr>
+      <w:r>
+        <w:rPr>
+          <w:color w:val="000000"/>
+        </w:rPr>
+        <w:t xml:space="preserve">[1] Object Management Group, OMG Unified Modeling Language (OMG UML), documentation officielle. </w:t>
+      </w:r>
+    </w:p>
+    <w:p>
+      <w:pPr>
+        <w:spacing w:after="120"/>
+      </w:pPr>
+      <w:r>
+        <w:rPr>
+          <w:color w:val="000000"/>
+        </w:rPr>
+        <w:t xml:space="preserve">[2] Vercel, Next.js Documentation, </w:t>
+      </w:r>
+      <w:hyperlink r:id="rId46">
+        <w:r>
+          <w:rPr>
+            <w:color w:val="0000FF"/>
+            <w:u w:val="single"/>
+          </w:rPr>
+          <w:t>https://nextjs.org/docs</w:t>
+        </w:r>
+      </w:hyperlink>
+      <w:r>
+        <w:rPr>
+          <w:color w:val="000000"/>
+        </w:rPr>
+        <w:t>, consulté le 15/07/2026 à 09h20.</w:t>
+      </w:r>
+    </w:p>
+    <w:p>
+      <w:pPr>
+        <w:spacing w:after="120"/>
+      </w:pPr>
+      <w:r>
+        <w:rPr>
+          <w:color w:val="000000"/>
+        </w:rPr>
+        <w:t xml:space="preserve">[3] Prisma, Prisma Documentation, </w:t>
+      </w:r>
+      <w:hyperlink r:id="rId47">
+        <w:r>
+          <w:rPr>
+            <w:color w:val="0000FF"/>
+            <w:u w:val="single"/>
+          </w:rPr>
+          <w:t>https://www.prisma.io/docs</w:t>
+        </w:r>
+      </w:hyperlink>
+      <w:r>
+        <w:rPr>
+          <w:color w:val="000000"/>
+        </w:rPr>
+        <w:t>, consulté le 15/07/2026 à 09h45.</w:t>
+      </w:r>
+    </w:p>
+    <w:p>
+      <w:pPr>
+        <w:spacing w:after="120"/>
+      </w:pPr>
+      <w:r>
+        <w:rPr>
+          <w:color w:val="000000"/>
+        </w:rPr>
+        <w:t xml:space="preserve">[4] Oracle, MySQL 8 Documentation, </w:t>
+      </w:r>
+      <w:hyperlink r:id="rId48">
+        <w:r>
+          <w:rPr>
+            <w:color w:val="0000FF"/>
+            <w:u w:val="single"/>
+          </w:rPr>
+          <w:t>https://dev.mysql.com/doc/</w:t>
+        </w:r>
+      </w:hyperlink>
+      <w:r>
+        <w:rPr>
+          <w:color w:val="000000"/>
+        </w:rPr>
+        <w:t>, consulté le 15/07/2026 à 10h15.</w:t>
+      </w:r>
+    </w:p>
+    <w:p>
+      <w:pPr>
+        <w:spacing w:after="120"/>
+      </w:pPr>
+      <w:r>
+        <w:rPr>
+          <w:color w:val="000000"/>
+        </w:rPr>
+        <w:t xml:space="preserve">[5] Redis Ltd, Redis Documentation, </w:t>
+      </w:r>
+      <w:hyperlink r:id="rId49">
+        <w:r>
+          <w:rPr>
+            <w:color w:val="0000FF"/>
+            <w:u w:val="single"/>
+          </w:rPr>
+          <w:t>https://redis.io/docs/</w:t>
+        </w:r>
+      </w:hyperlink>
+      <w:r>
+        <w:rPr>
+          <w:color w:val="000000"/>
+        </w:rPr>
+        <w:t>, consulté le 15/07/2026 à 10h40.</w:t>
+      </w:r>
+    </w:p>
+    <w:p>
+      <w:pPr>
+        <w:spacing w:after="120"/>
+      </w:pPr>
+      <w:r>
+        <w:rPr>
+          <w:color w:val="000000"/>
+        </w:rPr>
+        <w:t xml:space="preserve">[6] Docker Inc., Docker Documentation, </w:t>
+      </w:r>
+      <w:hyperlink r:id="rId50">
+        <w:r>
+          <w:rPr>
+            <w:color w:val="0000FF"/>
+            <w:u w:val="single"/>
+          </w:rPr>
+          <w:t>https://docs.docker.com/</w:t>
+        </w:r>
+      </w:hyperlink>
+      <w:r>
+        <w:rPr>
+          <w:color w:val="000000"/>
+        </w:rPr>
+        <w:t>, consulté le 15/07/2026 à 11h25.</w:t>
+      </w:r>
+    </w:p>
+    <w:p>
+      <w:pPr>
+        <w:spacing w:after="120"/>
+      </w:pPr>
+      <w:r>
+        <w:rPr>
+          <w:color w:val="000000"/>
+        </w:rPr>
+        <w:t>[</w:t>
+      </w:r>
+      <w:r>
+        <w:rPr>
+          <w:color w:val="000000"/>
+        </w:rPr>
+        <w:t>7</w:t>
+      </w:r>
+      <w:r>
+        <w:rPr>
+          <w:color w:val="000000"/>
+        </w:rPr>
+        <w:t xml:space="preserve">] freeCodeCamp, </w:t>
+      </w:r>
+      <w:hyperlink r:id="rId51">
+        <w:r>
+          <w:rPr>
+            <w:color w:val="0000FF"/>
+            <w:u w:val="single"/>
+          </w:rPr>
+          <w:t>https://www.freecodecamp.org/</w:t>
+        </w:r>
+      </w:hyperlink>
+      <w:r>
+        <w:rPr>
+          <w:color w:val="000000"/>
+        </w:rPr>
+        <w:t>, consulté le 15/07/2026 à 14h10.</w:t>
+      </w:r>
+    </w:p>
+    <w:p>
+      <w:pPr>
+        <w:spacing w:after="120"/>
+      </w:pPr>
+      <w:r>
+        <w:rPr>
+          <w:color w:val="000000"/>
+        </w:rPr>
+        <w:t>[</w:t>
+      </w:r>
+      <w:r>
+        <w:rPr>
+          <w:color w:val="000000"/>
+        </w:rPr>
+        <w:t>8</w:t>
+      </w:r>
+      <w:r>
+        <w:rPr>
+          <w:color w:val="000000"/>
+        </w:rPr>
+        <w:t xml:space="preserve">] Moodle HQ, Moodle Documentation, </w:t>
+      </w:r>
+      <w:hyperlink r:id="rId52">
+        <w:r>
+          <w:rPr>
+            <w:color w:val="0000FF"/>
+            <w:u w:val="single"/>
+          </w:rPr>
+          <w:t>https://docs.moodle.org/</w:t>
+        </w:r>
+      </w:hyperlink>
+      <w:r>
+        <w:rPr>
+          <w:color w:val="000000"/>
+        </w:rPr>
+        <w:t>, consulté le 15/07/2026 à 15h05.</w:t>
+      </w:r>
+    </w:p>
+    <w:p>
+      <w:pPr>
+        <w:spacing w:after="120"/>
+      </w:pPr>
+      <w:r>
+        <w:rPr>
+          <w:color w:val="000000"/>
+        </w:rPr>
+        <w:t>[</w:t>
+      </w:r>
+      <w:r>
+        <w:rPr>
+          <w:color w:val="000000"/>
+        </w:rPr>
+        <w:t>9</w:t>
+      </w:r>
+      <w:r>
+        <w:rPr>
+          <w:color w:val="000000"/>
+        </w:rPr>
+        <w:t xml:space="preserve">] Judge0, Judge0 CE, </w:t>
+      </w:r>
+      <w:hyperlink r:id="rId53">
+        <w:r>
+          <w:rPr>
+            <w:color w:val="0000FF"/>
+            <w:u w:val="single"/>
+          </w:rPr>
+          <w:t>https://judge0.com/</w:t>
+        </w:r>
+      </w:hyperlink>
+      <w:r>
+        <w:rPr>
+          <w:color w:val="000000"/>
+        </w:rPr>
+        <w:t>, consulté le 15/07/2026 à 16h30.</w:t>
+      </w:r>
+    </w:p>
+    <w:p>
       <w:r>
         <w:br w:type="page"/>
-      </w:r>
-    </w:p>
-    <w:p>
-      <w:pPr>
-        <w:pStyle w:val="Titre1"/>
-        <w:spacing w:line="360" w:lineRule="auto" w:after="160"/>
-        <w:ind w:firstLine="425"/>
-        <w:jc w:val="both"/>
-      </w:pPr>
-      <w:r>
-        <w:rPr>
-          <w:rFonts w:ascii="Times New Roman" w:hAnsi="Times New Roman" w:eastAsia="Times New Roman"/>
-          <w:b w:val="0"/>
-          <w:color w:val="000000"/>
-          <w:sz w:val="24"/>
-        </w:rPr>
-        <w:t>Webographie</w:t>
-      </w:r>
-    </w:p>
-    <w:p>
-      <w:pPr>
-        <w:spacing w:line="360" w:lineRule="auto" w:after="160"/>
-        <w:ind w:firstLine="0"/>
-        <w:jc w:val="left"/>
-      </w:pPr>
-      <w:r>
-        <w:rPr>
-          <w:rFonts w:ascii="Times New Roman" w:hAnsi="Times New Roman" w:eastAsia="Times New Roman"/>
-          <w:b w:val="0"/>
-          <w:color w:val="000000"/>
-          <w:sz w:val="24"/>
-        </w:rPr>
-        <w:t>[1] Vercel, Next.js Documentation, https://nextjs.org/docs, consulté le 15/07/2026 à 09h20.</w:t>
-      </w:r>
-    </w:p>
-    <w:p>
-      <w:pPr>
-        <w:spacing w:line="360" w:lineRule="auto" w:after="160"/>
-        <w:ind w:firstLine="0"/>
-        <w:jc w:val="left"/>
-      </w:pPr>
-      <w:r>
-        <w:rPr>
-          <w:rFonts w:ascii="Times New Roman" w:hAnsi="Times New Roman" w:eastAsia="Times New Roman"/>
-          <w:b w:val="0"/>
-          <w:color w:val="000000"/>
-          <w:sz w:val="24"/>
-        </w:rPr>
-        <w:t>[2] Prisma, Prisma Documentation, https://www.prisma.io/docs, consulté le 15/07/2026 à 09h45.</w:t>
-      </w:r>
-    </w:p>
-    <w:p>
-      <w:pPr>
-        <w:spacing w:line="360" w:lineRule="auto" w:after="160"/>
-        <w:ind w:firstLine="0"/>
-        <w:jc w:val="left"/>
-      </w:pPr>
-      <w:r>
-        <w:rPr>
-          <w:rFonts w:ascii="Times New Roman" w:hAnsi="Times New Roman" w:eastAsia="Times New Roman"/>
-          <w:b w:val="0"/>
-          <w:color w:val="000000"/>
-          <w:sz w:val="24"/>
-        </w:rPr>
-        <w:t>[3] Oracle, MySQL 8 Documentation, https://dev.mysql.com/doc/, consulté le 15/07/2026 à 10h15.</w:t>
-      </w:r>
-    </w:p>
-    <w:p>
-      <w:pPr>
-        <w:spacing w:line="360" w:lineRule="auto" w:after="160"/>
-        <w:ind w:firstLine="0"/>
-        <w:jc w:val="left"/>
-      </w:pPr>
-      <w:r>
-        <w:rPr>
-          <w:rFonts w:ascii="Times New Roman" w:hAnsi="Times New Roman" w:eastAsia="Times New Roman"/>
-          <w:b w:val="0"/>
-          <w:color w:val="000000"/>
-          <w:sz w:val="24"/>
-        </w:rPr>
-        <w:t>[4] Redis Ltd, Redis Documentation, https://redis.io/docs/, consulté le 15/07/2026 à 10h40.</w:t>
-      </w:r>
-    </w:p>
-    <w:p>
-      <w:pPr>
-        <w:spacing w:line="360" w:lineRule="auto" w:after="160"/>
-        <w:ind w:firstLine="0"/>
-        <w:jc w:val="left"/>
-      </w:pPr>
-      <w:r>
-        <w:rPr>
-          <w:rFonts w:ascii="Times New Roman" w:hAnsi="Times New Roman" w:eastAsia="Times New Roman"/>
-          <w:b w:val="0"/>
-          <w:color w:val="000000"/>
-          <w:sz w:val="24"/>
-        </w:rPr>
-        <w:t>[5] Docker Inc., Docker Documentation, https://docs.docker.com/, consulté le 15/07/2026 à 11h25.</w:t>
-      </w:r>
-    </w:p>
-    <w:p>
-      <w:pPr>
-        <w:spacing w:line="360" w:lineRule="auto" w:after="160"/>
-        <w:ind w:firstLine="0"/>
-        <w:jc w:val="left"/>
-      </w:pPr>
-      <w:r>
-        <w:rPr>
-          <w:rFonts w:ascii="Times New Roman" w:hAnsi="Times New Roman" w:eastAsia="Times New Roman"/>
-          <w:b w:val="0"/>
-          <w:color w:val="000000"/>
-          <w:sz w:val="24"/>
-        </w:rPr>
-        <w:t>[6] freeCodeCamp, https://www.freecodecamp.org/, consulté le 15/07/2026 à 14h10.</w:t>
-      </w:r>
-    </w:p>
-    <w:p>
-      <w:pPr>
-        <w:spacing w:line="360" w:lineRule="auto" w:after="160"/>
-        <w:ind w:firstLine="0"/>
-        <w:jc w:val="left"/>
-      </w:pPr>
-      <w:r>
-        <w:rPr>
-          <w:rFonts w:ascii="Times New Roman" w:hAnsi="Times New Roman" w:eastAsia="Times New Roman"/>
-          <w:b w:val="0"/>
-          <w:color w:val="000000"/>
-          <w:sz w:val="24"/>
-        </w:rPr>
-        <w:t>[7] Moodle HQ, Moodle Documentation, https://docs.moodle.org/, consulté le 15/07/2026 à 15h05.</w:t>
-      </w:r>
-    </w:p>
-    <w:p>
-      <w:pPr>
-        <w:spacing w:line="360" w:lineRule="auto" w:after="160"/>
-        <w:ind w:firstLine="0"/>
-        <w:jc w:val="left"/>
-      </w:pPr>
-      <w:r>
-        <w:rPr>
-          <w:rFonts w:ascii="Times New Roman" w:hAnsi="Times New Roman" w:eastAsia="Times New Roman"/>
-          <w:b w:val="0"/>
-          <w:color w:val="000000"/>
-          <w:sz w:val="24"/>
-        </w:rPr>
-        <w:t>[8] Judge0, Judge0 CE, https://judge0.com/, consulté le 15/07/2026 à 16h30.</w:t>
-      </w:r>
-    </w:p>
-    <w:p>
-      <w:pPr>
-        <w:spacing w:line="360" w:lineRule="auto" w:after="160"/>
-        <w:ind w:firstLine="0"/>
-        <w:jc w:val="left"/>
-      </w:pPr>
-      <w:r>
-        <w:rPr>
-          <w:rFonts w:ascii="Times New Roman" w:hAnsi="Times New Roman" w:eastAsia="Times New Roman"/>
-          <w:b w:val="0"/>
-          <w:color w:val="000000"/>
-          <w:sz w:val="24"/>
-        </w:rPr>
-        <w:t>[9] Monaco Editor, https://microsoft.github.io/monaco-editor/, consulté le 15/07/2026 à 17h05.</w:t>
-      </w:r>
-    </w:p>
-    <w:p>
-      <w:pPr>
-        <w:spacing w:line="360" w:lineRule="auto" w:after="160"/>
-        <w:ind w:firstLine="0"/>
-        <w:jc w:val="left"/>
-      </w:pPr>
-      <w:r>
-        <w:rPr>
-          <w:rFonts w:ascii="Times New Roman" w:hAnsi="Times New Roman" w:eastAsia="Times New Roman"/>
-          <w:b w:val="0"/>
-          <w:color w:val="000000"/>
-          <w:sz w:val="24"/>
-        </w:rPr>
-        <w:t>[10] PlantUML, https://plantuml.com/, consulté le 15/07/2026 à 17h40.</w:t>
       </w:r>
     </w:p>
     <w:p>

</xml_diff>

<commit_message>
Ajouter les mots-clés au résumé et à l'abstract
Co-authored-by: progirix <progirix@users.noreply.github.com>
</commit_message>
<xml_diff>
--- a/docs/Rapport_Cylentic.docx
+++ b/docs/Rapport_Cylentic.docx
@@ -5740,6 +5740,22 @@
       </w:r>
     </w:p>
     <w:p>
+      <w:pPr>
+        <w:spacing w:line="360" w:lineRule="auto" w:after="160"/>
+        <w:ind w:firstLine="0"/>
+        <w:jc w:val="both"/>
+      </w:pPr>
+      <w:r>
+        <w:rPr>
+          <w:rFonts w:ascii="Times New Roman" w:hAnsi="Times New Roman" w:eastAsia="Times New Roman"/>
+          <w:b/>
+          <w:color w:val="000000"/>
+          <w:sz w:val="24"/>
+        </w:rPr>
+        <w:t>Mots-clés : examen de programmation, plateforme web, intégrité académique, sandbox, correction automatique, école d'ingénieurs.</w:t>
+      </w:r>
+    </w:p>
+    <w:p>
       <w:r>
         <w:br w:type="page"/>
       </w:r>
@@ -5826,6 +5842,22 @@
           <w:lang w:val="en-US"/>
         </w:rPr>
         <w:t xml:space="preserve"> exam sessions, isolated Python execution, incident logging, automatic grading and teacher facing exports. This report presents the requirements analysis, design, implementation and validation results of the platform.</w:t>
+      </w:r>
+    </w:p>
+    <w:p>
+      <w:pPr>
+        <w:spacing w:line="360" w:lineRule="auto" w:after="160"/>
+        <w:ind w:firstLine="0"/>
+        <w:jc w:val="both"/>
+      </w:pPr>
+      <w:r>
+        <w:rPr>
+          <w:rFonts w:ascii="Times New Roman" w:hAnsi="Times New Roman" w:eastAsia="Times New Roman"/>
+          <w:b/>
+          <w:color w:val="000000"/>
+          <w:sz w:val="24"/>
+        </w:rPr>
+        <w:t>Keywords: programming exam, web platform, academic integrity, sandbox, automatic grading, engineering school.</w:t>
       </w:r>
     </w:p>
     <w:p>

</xml_diff>

<commit_message>
Reformuler la problématique (poser le problème à résoudre)
Co-authored-by: progirix <progirix@users.noreply.github.com>
</commit_message>
<xml_diff>
--- a/docs/Rapport_Cylentic.docx
+++ b/docs/Rapport_Cylentic.docx
@@ -5960,14 +5960,50 @@
     </w:p>
     <w:p>
       <w:pPr>
+        <w:spacing w:line="360" w:lineRule="auto" w:after="160"/>
         <w:ind w:firstLine="425"/>
         <w:jc w:val="both"/>
       </w:pPr>
       <w:r>
         <w:rPr>
-          <w:color w:val="000000"/>
-        </w:rPr>
-        <w:t>Comment organiser un examen de programmation sur navigateur qui réduise fortement les possibilités de triche, conserve un rôle clair au surveillant, et restitue une correction lisible pour le professeur ?</w:t>
+          <w:rFonts w:ascii="Times New Roman" w:hAnsi="Times New Roman" w:eastAsia="Times New Roman"/>
+          <w:b w:val="0"/>
+          <w:color w:val="000000"/>
+          <w:sz w:val="24"/>
+        </w:rPr>
+        <w:t>Malgré l'intérêt des examens pratiques sur machine, la démocratisation des assistants de génération de code compromet la crédibilité des rendus hors salle. Les outils existants ne réunissent pas, dans une forme adaptée aux salles informatiques, composition sécurisée, exécution réelle du code et correction exploitable pour le professeur. Cette situation soulève la question de l'intégrité de l'évaluation de la programmation.</w:t>
+      </w:r>
+    </w:p>
+    <w:p>
+      <w:pPr>
+        <w:spacing w:line="360" w:lineRule="auto" w:after="160"/>
+        <w:ind w:firstLine="425"/>
+        <w:jc w:val="both"/>
+      </w:pPr>
+      <w:r>
+        <w:rPr>
+          <w:rFonts w:ascii="Times New Roman" w:hAnsi="Times New Roman" w:eastAsia="Times New Roman"/>
+          <w:b w:val="0"/>
+          <w:color w:val="000000"/>
+          <w:sz w:val="24"/>
+        </w:rPr>
+        <w:t>Dès lors, la question centrale de ce travail peut être formulée comme suit :</w:t>
+      </w:r>
+    </w:p>
+    <w:p>
+      <w:pPr>
+        <w:spacing w:line="360" w:lineRule="auto" w:after="160"/>
+        <w:ind w:firstLine="425"/>
+        <w:jc w:val="both"/>
+      </w:pPr>
+      <w:r>
+        <w:rPr>
+          <w:rFonts w:ascii="Times New Roman" w:hAnsi="Times New Roman" w:eastAsia="Times New Roman"/>
+          <w:b w:val="0"/>
+          <w:color w:val="000000"/>
+          <w:sz w:val="24"/>
+        </w:rPr>
+        <w:t>Comment garantir l'intégrité et la crédibilité de l'évaluation de la programmation sur machine en salle informatique, face aux risques de triche assistée par des outils de génération de code, tout en permettant l'exécution réelle du programme et une correction fiable pour le professeur ?</w:t>
       </w:r>
     </w:p>
     <w:p>

</xml_diff>

<commit_message>
Alléger le français de la problématique
Co-authored-by: progirix <progirix@users.noreply.github.com>
</commit_message>
<xml_diff>
--- a/docs/Rapport_Cylentic.docx
+++ b/docs/Rapport_Cylentic.docx
@@ -5971,7 +5971,7 @@
           <w:color w:val="000000"/>
           <w:sz w:val="24"/>
         </w:rPr>
-        <w:t>Malgré l'intérêt des examens pratiques sur machine, la démocratisation des assistants de génération de code compromet la crédibilité des rendus hors salle. Les outils existants ne réunissent pas, dans une forme adaptée aux salles informatiques, composition sécurisée, exécution réelle du code et correction exploitable pour le professeur. Cette situation soulève la question de l'intégrité de l'évaluation de la programmation.</w:t>
+        <w:t>Aujourd'hui, un étudiant peut facilement obtenir une solution de code plausible grâce à un assistant. Le professeur voit souvent un résultat, sans savoir comment il a été obtenu. Les examens papier limitent la triche, mais ne permettent pas d'exécuter réellement un programme. Les outils déjà disponibles ne couvrent pas bien, dans une salle informatique, à la fois la sécurité de la passation, l'exécution du code et une correction claire.</w:t>
       </w:r>
     </w:p>
     <w:p>
@@ -5987,7 +5987,7 @@
           <w:color w:val="000000"/>
           <w:sz w:val="24"/>
         </w:rPr>
-        <w:t>Dès lors, la question centrale de ce travail peut être formulée comme suit :</w:t>
+        <w:t>Le problème que nous cherchons à résoudre peut donc être formulé ainsi :</w:t>
       </w:r>
     </w:p>
     <w:p>
@@ -6003,7 +6003,7 @@
           <w:color w:val="000000"/>
           <w:sz w:val="24"/>
         </w:rPr>
-        <w:t>Comment garantir l'intégrité et la crédibilité de l'évaluation de la programmation sur machine en salle informatique, face aux risques de triche assistée par des outils de génération de code, tout en permettant l'exécution réelle du programme et une correction fiable pour le professeur ?</w:t>
+        <w:t>Comment évaluer la programmation sur machine de façon crédible, en limitant la triche liée aux outils de génération de code, tout en laissant l'étudiant exécuter son programme et en donnant au professeur une correction fiable ?</w:t>
       </w:r>
     </w:p>
     <w:p>

</xml_diff>

<commit_message>
Remplacer le mot passation par un français plus simple
Co-authored-by: progirix <progirix@users.noreply.github.com>
</commit_message>
<xml_diff>
--- a/docs/Rapport_Cylentic.docx
+++ b/docs/Rapport_Cylentic.docx
@@ -953,11 +953,9 @@
         <w:rPr>
           <w:color w:val="000000"/>
         </w:rPr>
-        <w:t>Nos remerciements vont à l'administration et au corps enseignant de notre établissement, ainsi qu'aux camarades qui ont testé les premiers parcours de passation et signalé les points durs de l'interface.</w:t>
-      </w:r>
-      <w:r>
-        <w:br w:type="page"/>
-      </w:r>
+        <w:t>Nos remerciements vont à l'administration et au corps enseignant de notre établissement, ainsi qu'aux camarades qui ont testé les premiers parcours d'examen et signalé les points durs de l'interface.</w:t>
+      </w:r>
+      <w:r/>
     </w:p>
     <w:p>
       <w:pPr>
@@ -3593,7 +3591,7 @@
             <w:rStyle w:val="Lienhypertexte"/>
             <w:noProof/>
           </w:rPr>
-          <w:t>Figure 11 : Classes passation et correction</w:t>
+          <w:t>Figure 11 : Classes composition et correction</w:t>
         </w:r>
         <w:r>
           <w:rPr>
@@ -3634,7 +3632,7 @@
             <w:noProof/>
             <w:webHidden/>
           </w:rPr>
-          <w:t>20</w:t>
+          <w:t/>
         </w:r>
         <w:r>
           <w:rPr>
@@ -3644,6 +3642,7 @@
           <w:fldChar w:fldCharType="end"/>
         </w:r>
       </w:hyperlink>
+      <w:r/>
     </w:p>
     <w:p>
       <w:pPr>
@@ -3806,7 +3805,7 @@
             <w:rStyle w:val="Lienhypertexte"/>
             <w:noProof/>
           </w:rPr>
-          <w:t>Figure 14 : Objets passation</w:t>
+          <w:t>Figure 14 : Objets composition</w:t>
         </w:r>
         <w:r>
           <w:rPr>
@@ -3847,7 +3846,7 @@
             <w:noProof/>
             <w:webHidden/>
           </w:rPr>
-          <w:t>22</w:t>
+          <w:t/>
         </w:r>
         <w:r>
           <w:rPr>
@@ -3857,6 +3856,7 @@
           <w:fldChar w:fldCharType="end"/>
         </w:r>
       </w:hyperlink>
+      <w:r/>
     </w:p>
     <w:p>
       <w:pPr>
@@ -4019,7 +4019,7 @@
             <w:rStyle w:val="Lienhypertexte"/>
             <w:noProof/>
           </w:rPr>
-          <w:t>Figure 17 : Composants examens et passation</w:t>
+          <w:t>Figure 17 : Composants examens et composition</w:t>
         </w:r>
         <w:r>
           <w:rPr>
@@ -4060,7 +4060,7 @@
             <w:noProof/>
             <w:webHidden/>
           </w:rPr>
-          <w:t>23</w:t>
+          <w:t/>
         </w:r>
         <w:r>
           <w:rPr>
@@ -4070,6 +4070,7 @@
           <w:fldChar w:fldCharType="end"/>
         </w:r>
       </w:hyperlink>
+      <w:r/>
     </w:p>
     <w:p>
       <w:pPr>
@@ -5736,7 +5737,7 @@
         <w:rPr>
           <w:color w:val="000000"/>
         </w:rPr>
-        <w:t>Le MVP couvre la gestion des établissements et des comptes, la création et la publication d'examens, la passation contrôlée dans le navigateur, l'exécution isolée de code Python, la journalisation des incidents, la correction automatique et les exports destinés au professeur. Ce rapport présente l'analyse du besoin, la conception, la réalisation et les résultats de validation de la plateforme.</w:t>
+        <w:t>Le MVP couvre la gestion des établissements et des comptes, la création et la publication d'examens, la composition contrôlée dans le navigateur, l'exécution isolée de code Python, la journalisation des incidents, la correction automatique et les exports destinés au professeur. Ce rapport présente l'analyse du besoin, la conception, la réalisation et les résultats de validation de la plateforme.</w:t>
       </w:r>
     </w:p>
     <w:p>
@@ -5971,7 +5972,7 @@
           <w:color w:val="000000"/>
           <w:sz w:val="24"/>
         </w:rPr>
-        <w:t>Aujourd'hui, un étudiant peut facilement obtenir une solution de code plausible grâce à un assistant. Le professeur voit souvent un résultat, sans savoir comment il a été obtenu. Les examens papier limitent la triche, mais ne permettent pas d'exécuter réellement un programme. Les outils déjà disponibles ne couvrent pas bien, dans une salle informatique, à la fois la sécurité de la passation, l'exécution du code et une correction claire.</w:t>
+        <w:t>Aujourd'hui, un étudiant peut facilement obtenir une solution de code plausible grâce à un assistant. Le professeur voit souvent un résultat, sans savoir comment il a été obtenu. Les examens papier limitent la triche, mais ne permettent pas d'exécuter réellement un programme. Les outils déjà disponibles ne couvrent pas bien, dans une salle informatique, à la fois la sécurité pendant l'examen, l'exécution du code et une correction claire.</w:t>
       </w:r>
     </w:p>
     <w:p>
@@ -6356,7 +6357,7 @@
         <w:rPr>
           <w:color w:val="000000"/>
         </w:rPr>
-        <w:t>Les environnements d'exécution isolée, dont Judge0 est un exemple connu, isolent un programme et renvoient sa sortie. Ce sont des briques utiles, souvent auto hébergeables, mais pas une plateforme d'examen : pas de rôles scolaires, pas de passation contrôlée, pas de journal pédagogique.</w:t>
+        <w:t>Les environnements d'exécution isolée, dont Judge0 est un exemple connu, isolent un programme et renvoient sa sortie. Ce sont des briques utiles, souvent auto hébergeables, mais pas une plateforme d'examen : pas de rôles scolaires, pas de composition contrôlée, pas de journal pédagogique.</w:t>
       </w:r>
     </w:p>
     <w:p>
@@ -7198,7 +7199,7 @@
         <w:rPr>
           <w:color w:val="000000"/>
         </w:rPr>
-        <w:t>Sa singularité tient au couplage : éditeur dans le navigateur, sandbox Docker Python, contrôles de passation côté client, règles métier et timers côté serveur, journal d'incidents, exports professeur, et maintien du surveillant physique. S'y ajoute une gouvernance multi établissement, avec un Super Admin plateforme distinct de l'administrateur d'école.</w:t>
+        <w:t>Sa singularité tient au couplage : éditeur dans le navigateur, sandbox Docker Python, contrôles pendant l'examen côté client, règles métier et timers côté serveur, journal d'incidents, exports professeur, et maintien du surveillant physique. S'y ajoute une gouvernance multi établissement, avec un Super Admin plateforme distinct de l'administrateur d'école.</w:t>
       </w:r>
     </w:p>
     <w:p>
@@ -7299,7 +7300,7 @@
         <w:rPr>
           <w:color w:val="000000"/>
         </w:rPr>
-        <w:t>Ce périmètre restreint concentre l'effort sur le cœur du problème : la passation contrôlée et la correction automatique, plutôt que sur des fonctions secondaires.</w:t>
+        <w:t>Ce périmètre restreint concentre l'effort sur le cœur du problème : la composition contrôlée et la correction automatique, plutôt que sur des fonctions secondaires.</w:t>
       </w:r>
     </w:p>
     <w:p>
@@ -7774,7 +7775,7 @@
         <w:rPr>
           <w:color w:val="000000"/>
         </w:rPr>
-        <w:t>Plusieurs règles métier structurent le fonctionnement. Le code d'accès d'un examen est généré dans un format lisible, sans caractères ambigus. Un examen publié devient la référence de passation ; une fois l'épreuve engagée, le contenu n'est plus librement modifiable. Les sorties répétées du plein écran entraînent un avertissement puis une exclusion technique avec soumission forcée. Un étudiant ne voit pas son score immédiatement après dépôt. Les identifiants sont structurés selon le rôle, ce qui permet de déduire ce rôle à la connexion. Les données de chaque établissement restent isolées. La plateforme prévoit aussi une limite forte sur le nombre d'administrateurs actifs par établissement.</w:t>
+        <w:t>Plusieurs règles métier structurent le fonctionnement. Le code d'accès d'un examen est généré dans un format lisible, sans caractères ambigus. Un examen publié devient la référence de composition ; une fois l'épreuve engagée, le contenu n'est plus librement modifiable. Les sorties répétées du plein écran entraînent un avertissement puis une exclusion technique avec soumission forcée. Un étudiant ne voit pas son score immédiatement après dépôt. Les identifiants sont structurés selon le rôle, ce qui permet de déduire ce rôle à la connexion. Les données de chaque établissement restent isolées. La plateforme prévoit aussi une limite forte sur le nombre d'administrateurs actifs par établissement.</w:t>
       </w:r>
     </w:p>
     <w:p>
@@ -7971,22 +7972,19 @@
         <w:rPr>
           <w:color w:val="000000"/>
         </w:rPr>
-        <w:lastRenderedPageBreak/>
-        <w:t xml:space="preserve">Côté client, l'étudiant compose dans le navigateur avec l'éditeur Monaco. Les contrôles de passation (plein écran, visibilité d'onglet, garde du presse papiers, verrouillage clavier) vivent dans des hooks dédiés. Côté serveur, la logique métier est </w:t>
+        <w:t>Côté client, l'étudiant compose dans le navigateur avec l'éditeur Monaco. Les contrôles pendant l'examen (plein écran, visibilité d'onglet, garde du presse papiers, verrouillage clavier) vivent dans des hooks dédiés. Côté serveur, la logique métier est séparée des routes : authentification, examens, participation, correction et sandbox forment des services distincts. Deux workers complètent le tableau : un pour la correction en file, un pour les transitions de statut d'examen.</w:t>
       </w:r>
       <w:proofErr w:type="gramStart"/>
       <w:r>
         <w:rPr>
           <w:color w:val="000000"/>
         </w:rPr>
-        <w:t>séparée</w:t>
       </w:r>
       <w:proofErr w:type="gramEnd"/>
       <w:r>
         <w:rPr>
           <w:color w:val="000000"/>
         </w:rPr>
-        <w:t xml:space="preserve"> des routes : authentification, examens, participation, correction et sandbox forment des services distincts. Deux workers complètent le tableau : un pour la correction en file, un pour les transitions de statut d'examen.</w:t>
       </w:r>
     </w:p>
     <w:p>
@@ -8643,7 +8641,7 @@
         <w:rPr>
           <w:color w:val="000000"/>
         </w:rPr>
-        <w:t>Le professeur porte la responsabilité pédagogique. Il crée les examens, compose les exercices de code et les QCM, publie l'épreuve (ce qui génère le code d'accès), suit la salle, consulte les résultats et lit le journal d'incidents. Là encore, deux vues séparent la conception de l'examen et le suivi pendant ou après la passation.</w:t>
+        <w:t>Le professeur porte la responsabilité pédagogique. Il crée les examens, compose les exercices de code et les QCM, publie l'épreuve (ce qui génère le code d'accès), suit la salle, consulte les résultats et lit le journal d'incidents. Là encore, deux vues séparent la conception de l'examen et le suivi pendant ou après la composition.</w:t>
       </w:r>
     </w:p>
     <w:p>
@@ -9021,14 +9019,12 @@
         <w:rPr>
           <w:color w:val="000000"/>
         </w:rPr>
-        <w:t xml:space="preserve">Le modèle de classes découpe le domaine en trois paquets cohérents. Le premier couvre l'organisation et les comptes : administrateurs plateforme, établissements, plans d'abonnement, utilisateurs, profils professeur et étudiant, classes et années académiques. Le deuxième couvre la conception de l'examen : examen, rattachement aux classes, exercices, tests unitaires, questions et choix QCM. Le troisième couvre la passation : </w:t>
-      </w:r>
-      <w:r>
-        <w:rPr>
-          <w:color w:val="000000"/>
-        </w:rPr>
-        <w:lastRenderedPageBreak/>
-        <w:t>participation, sauvegardes automatiques, soumissions, résultats de tests, réponses QCM et incidents.</w:t>
+        <w:t>Le modèle de classes découpe le domaine en trois paquets cohérents. Le premier couvre l'organisation et les comptes : administrateurs plateforme, établissements, plans d'abonnement, utilisateurs, profils professeur et étudiant, classes et années académiques. Le deuxième couvre la conception de l'examen : examen, rattachement aux classes, exercices, tests unitaires, questions et choix QCM. Le troisième couvre la composition : participation, sauvegardes automatiques, soumissions, résultats de tests, réponses QCM et incidents.</w:t>
+      </w:r>
+      <w:r>
+        <w:rPr>
+          <w:color w:val="000000"/>
+        </w:rPr>
       </w:r>
     </w:p>
     <w:p>
@@ -9327,7 +9323,7 @@
           <w:color w:val="000000"/>
           <w:sz w:val="22"/>
         </w:rPr>
-        <w:t xml:space="preserve">Figure </w:t>
+        <w:t>Figure 11 : Classes composition et correction</w:t>
       </w:r>
       <w:r>
         <w:rPr>
@@ -9335,7 +9331,6 @@
           <w:color w:val="000000"/>
           <w:sz w:val="22"/>
         </w:rPr>
-        <w:fldChar w:fldCharType="begin"/>
       </w:r>
       <w:r>
         <w:rPr>
@@ -9343,7 +9338,6 @@
           <w:color w:val="000000"/>
           <w:sz w:val="22"/>
         </w:rPr>
-        <w:instrText>SEQ Figure \* ARABIC</w:instrText>
       </w:r>
       <w:r>
         <w:rPr>
@@ -9351,7 +9345,6 @@
           <w:color w:val="000000"/>
           <w:sz w:val="22"/>
         </w:rPr>
-        <w:fldChar w:fldCharType="separate"/>
       </w:r>
       <w:r>
         <w:rPr>
@@ -9360,7 +9353,6 @@
           <w:color w:val="000000"/>
           <w:sz w:val="22"/>
         </w:rPr>
-        <w:t>11</w:t>
       </w:r>
       <w:r>
         <w:rPr>
@@ -9368,7 +9360,6 @@
           <w:color w:val="000000"/>
           <w:sz w:val="22"/>
         </w:rPr>
-        <w:fldChar w:fldCharType="end"/>
       </w:r>
       <w:r>
         <w:rPr>
@@ -9376,7 +9367,6 @@
           <w:color w:val="000000"/>
           <w:sz w:val="22"/>
         </w:rPr>
-        <w:t xml:space="preserve"> : Classes passation et correction</w:t>
       </w:r>
       <w:bookmarkEnd w:id="83"/>
     </w:p>
@@ -9677,7 +9667,7 @@
           <w:color w:val="000000"/>
           <w:sz w:val="22"/>
         </w:rPr>
-        <w:t xml:space="preserve">Figure </w:t>
+        <w:t>Figure 14 : Objets composition</w:t>
       </w:r>
       <w:r>
         <w:rPr>
@@ -9685,7 +9675,6 @@
           <w:color w:val="000000"/>
           <w:sz w:val="22"/>
         </w:rPr>
-        <w:fldChar w:fldCharType="begin"/>
       </w:r>
       <w:r>
         <w:rPr>
@@ -9693,7 +9682,6 @@
           <w:color w:val="000000"/>
           <w:sz w:val="22"/>
         </w:rPr>
-        <w:instrText>SEQ Figure \* ARABIC</w:instrText>
       </w:r>
       <w:r>
         <w:rPr>
@@ -9701,7 +9689,6 @@
           <w:color w:val="000000"/>
           <w:sz w:val="22"/>
         </w:rPr>
-        <w:fldChar w:fldCharType="separate"/>
       </w:r>
       <w:r>
         <w:rPr>
@@ -9710,7 +9697,6 @@
           <w:color w:val="000000"/>
           <w:sz w:val="22"/>
         </w:rPr>
-        <w:t>14</w:t>
       </w:r>
       <w:r>
         <w:rPr>
@@ -9718,7 +9704,6 @@
           <w:color w:val="000000"/>
           <w:sz w:val="22"/>
         </w:rPr>
-        <w:fldChar w:fldCharType="end"/>
       </w:r>
       <w:r>
         <w:rPr>
@@ -9726,7 +9711,6 @@
           <w:color w:val="000000"/>
           <w:sz w:val="22"/>
         </w:rPr>
-        <w:t xml:space="preserve"> : Objets passation</w:t>
       </w:r>
       <w:bookmarkEnd w:id="86"/>
     </w:p>
@@ -9754,7 +9738,7 @@
         <w:rPr>
           <w:color w:val="000000"/>
         </w:rPr>
-        <w:t>Les composants décrivent le découpage logiciel sans retomber dans le détail des classes métier. La vue d'ensemble relie l'interface navigateur, le middleware d'authentification, la couche API, les services métier, l'accès aux données, les workers, MySQL, Redis et la sandbox. Deux vues complémentaires précisent d'une part l'administration et l'authentification, d'autre part le cœur examens et passation.</w:t>
+        <w:t>Les composants décrivent le découpage logiciel sans retomber dans le détail des classes métier. La vue d'ensemble relie l'interface navigateur, le middleware d'authentification, la couche API, les services métier, l'accès aux données, les workers, MySQL, Redis et la sandbox. Deux vues complémentaires précisent d'une part l'administration et l'authentification, d'autre part le cœur examens et composition.</w:t>
       </w:r>
     </w:p>
     <w:p>
@@ -10041,7 +10025,7 @@
           <w:color w:val="000000"/>
           <w:sz w:val="22"/>
         </w:rPr>
-        <w:t xml:space="preserve">Figure </w:t>
+        <w:t>Figure 17 : Composants examens et composition</w:t>
       </w:r>
       <w:r>
         <w:rPr>
@@ -10049,7 +10033,6 @@
           <w:color w:val="000000"/>
           <w:sz w:val="22"/>
         </w:rPr>
-        <w:fldChar w:fldCharType="begin"/>
       </w:r>
       <w:r>
         <w:rPr>
@@ -10057,7 +10040,6 @@
           <w:color w:val="000000"/>
           <w:sz w:val="22"/>
         </w:rPr>
-        <w:instrText>SEQ Figure \* ARABIC</w:instrText>
       </w:r>
       <w:r>
         <w:rPr>
@@ -10065,7 +10047,6 @@
           <w:color w:val="000000"/>
           <w:sz w:val="22"/>
         </w:rPr>
-        <w:fldChar w:fldCharType="separate"/>
       </w:r>
       <w:r>
         <w:rPr>
@@ -10074,7 +10055,6 @@
           <w:color w:val="000000"/>
           <w:sz w:val="22"/>
         </w:rPr>
-        <w:t>17</w:t>
       </w:r>
       <w:r>
         <w:rPr>
@@ -10082,7 +10062,6 @@
           <w:color w:val="000000"/>
           <w:sz w:val="22"/>
         </w:rPr>
-        <w:fldChar w:fldCharType="end"/>
       </w:r>
       <w:r>
         <w:rPr>
@@ -10090,7 +10069,6 @@
           <w:color w:val="000000"/>
           <w:sz w:val="22"/>
         </w:rPr>
-        <w:t xml:space="preserve"> : Composants examens et passation</w:t>
       </w:r>
       <w:bookmarkEnd w:id="91"/>
     </w:p>
@@ -10146,7 +10124,7 @@
         <w:rPr>
           <w:color w:val="000000"/>
         </w:rPr>
-        <w:t>Un examen naît en brouillon. La publication le rend accessible via un code d'accès et fixe son statut à publié. Le démarrage le fait passer en cours. La clôture le termine. L'archivage le range hors du travail courant. La suppression reste possible tant que l'examen n'a pas basculé dans les états verrouillés de passation. Ce cycle, présent dans l'énumération ExamStatus, structure aussi le tableau de bord enseignant.</w:t>
+        <w:t>Un examen naît en brouillon. La publication le rend accessible via un code d'accès et fixe son statut à publié. Le démarrage le fait passer en cours. La clôture le termine. L'archivage le range hors du travail courant. La suppression reste possible tant que l'examen n'a pas basculé dans les états verrouillés de composition. Ce cycle, présent dans l'énumération ExamStatus, structure aussi le tableau de bord enseignant.</w:t>
       </w:r>
     </w:p>
     <w:p>
@@ -10927,7 +10905,7 @@
         <w:rPr>
           <w:color w:val="000000"/>
         </w:rPr>
-        <w:t>Les incidents (sortie du plein écran, changement d'onglet, collage, fermeture de session, souci réseau) sont enregistrés pendant la passation. Pour les sorties du plein écran, un seuil de deux occurrences entraîne l'exclusion : la participation est soumise avec le motif correspondant, puis corrigée. Cette règle est assumée comme garde technique. Elle ne remplace pas l'appréciation disciplinaire humaine.</w:t>
+        <w:t>Les incidents (sortie du plein écran, changement d'onglet, collage, fermeture de session, souci réseau) sont enregistrés pendant l'examen. Pour les sorties du plein écran, un seuil de deux occurrences entraîne l'exclusion : la participation est soumise avec le motif correspondant, puis corrigée. Cette règle est assumée comme garde technique. Elle ne remplace pas l'appréciation disciplinaire humaine.</w:t>
       </w:r>
     </w:p>
     <w:p>
@@ -11637,7 +11615,7 @@
                 <w:color w:val="000000"/>
                 <w:sz w:val="20"/>
               </w:rPr>
-              <w:t>Présence et statut de passation</w:t>
+              <w:t>Présence et statut de composition</w:t>
             </w:r>
           </w:p>
         </w:tc>
@@ -11780,8 +11758,7 @@
         <w:rPr>
           <w:rFonts w:ascii="Times New Roman" w:eastAsia="Times New Roman" w:hAnsi="Times New Roman"/>
         </w:rPr>
-        <w:lastRenderedPageBreak/>
-        <w:t>3.8 Conception de la sécurité de passation</w:t>
+        <w:t>3.8 Conception de la sécurité pendant l'examen</w:t>
       </w:r>
       <w:bookmarkEnd w:id="112"/>
       <w:bookmarkEnd w:id="113"/>
@@ -11843,7 +11820,7 @@
         <w:rPr>
           <w:color w:val="000000"/>
         </w:rPr>
-        <w:t>Dans une salle burkinabè typique, cette conception se lit concrètement. Le surveillant circule, le navigateur enferme la session, le serveur garde l'heure et les preuves. Si le réseau vacille brièvement, les sauvegardes automatiques et la reprise de participation réduisent la perte de travail. Le système ne promet pas une invulnérabilité. Il promet une passation plus traçable qu'une session libre sur un poste partagé.</w:t>
+        <w:t>Dans une salle burkinabè typique, cette conception se lit concrètement. Le surveillant circule, le navigateur enferme la session, le serveur garde l'heure et les preuves. Si le réseau vacille brièvement, les sauvegardes automatiques et la reprise de participation réduisent la perte de travail. Le système ne promet pas une invulnérabilité. Il promet une composition plus traçable qu'une session libre sur un poste partagé.</w:t>
       </w:r>
     </w:p>
     <w:p>
@@ -11972,7 +11949,7 @@
         <w:rPr>
           <w:color w:val="000000"/>
         </w:rPr>
-        <w:t>Le projet repose sur Node.js et npm, avec Next.js 16 en App Router pour les pages et les API. Prisma 7 s'appuie sur MySQL pour le modèle de données. Docker sert à isoler l'exécution du code Python des étudiants. L'édition et le suivi se font principalement dans VS Code ou Cursor. Les essais de passation et de contrôle navigateur ont été menés en priorité sur Chrome et Edge, navigateurs compatibles avec l'API Fullscreen.</w:t>
+        <w:t>Le projet repose sur Node.js et npm, avec Next.js 16 en App Router pour les pages et les API. Prisma 7 s'appuie sur MySQL pour le modèle de données. Docker sert à isoler l'exécution du code Python des étudiants. L'édition et le suivi se font principalement dans VS Code ou Cursor. Les essais de composition et de contrôle navigateur ont été menés en priorité sur Chrome et Edge, navigateurs compatibles avec l'API Fullscreen.</w:t>
       </w:r>
     </w:p>
     <w:p>
@@ -13341,7 +13318,7 @@
         <w:rPr>
           <w:color w:val="000000"/>
         </w:rPr>
-        <w:t>Les contrôles de passation signalent au serveur les sorties de plein écran, les changements d'onglet et certains collages. Au second incident de sortie du plein écran, la participation est exclue et redirigée vers une confirmation avec motif. La soumission peut être manuelle, automatique à l'expiration du timer, ou forcée par exclusion. Une fois la participation close, aucune reconnexion utile n'est possible. Aucun score n'est montré à l'étudiant.</w:t>
+        <w:t>Les contrôles pendant l'examen signalent au serveur les sorties de plein écran, les changements d'onglet et certains collages. Au second incident de sortie du plein écran, la participation est exclue et redirigée vers une confirmation avec motif. La soumission peut être manuelle, automatique à l'expiration du timer, ou forcée par exclusion. Une fois la participation close, aucune reconnexion utile n'est possible. Aucun score n'est montré à l'étudiant.</w:t>
       </w:r>
     </w:p>
     <w:p>
@@ -13618,7 +13595,7 @@
         <w:rPr>
           <w:color w:val="000000"/>
         </w:rPr>
-        <w:t>Le MVP forme aujourd'hui une chaîne complète, assez intégrée pour une démonstration et pour des essais pilotes. Nous avons d'abord solidifié les parcours critiques (authentification, examen, contrôles de passation, correction, exports), plutôt qu'une infrastructure temps réel complète. Redis, les workers et le multi langage restent pour la suite.</w:t>
+        <w:t>Le MVP forme aujourd'hui une chaîne complète, assez intégrée pour une démonstration et pour des essais pilotes. Nous avons d'abord solidifié les parcours critiques (authentification, examen, contrôles pendant l'examen, correction, exports), plutôt qu'une infrastructure temps réel complète. Redis, les workers et le multi langage restent pour la suite.</w:t>
       </w:r>
     </w:p>
     <w:p>
@@ -13822,7 +13799,7 @@
         <w:rPr>
           <w:rFonts w:ascii="Times New Roman" w:eastAsia="Times New Roman" w:hAnsi="Times New Roman"/>
         </w:rPr>
-        <w:t>5.2.4 Parcours étudiant et contrôles de passation</w:t>
+        <w:t>5.2.4 Parcours étudiant et contrôles pendant l'examen</w:t>
       </w:r>
       <w:bookmarkEnd w:id="171"/>
       <w:bookmarkEnd w:id="172"/>
@@ -14046,7 +14023,7 @@
         <w:rPr>
           <w:color w:val="000000"/>
         </w:rPr>
-        <w:t>Nous avons borné un MVP réaliste, conçu les rôles, les données et les flux, puis livré une chaîne complète, de l'onboarding administrateur jusqu'à la soumission étudiant, avec publication, contrôles de passation, correction automatique et exports. Les tests ont validé les parcours critiques une fois corrigés les problèmes de cookie Secure, de sérialisation Decimal et de synchronisation du timer.</w:t>
+        <w:t>Nous avons borné un MVP réaliste, conçu les rôles, les données et les flux, puis livré une chaîne complète, de l'onboarding administrateur jusqu'à la soumission étudiant, avec publication, contrôles pendant l'examen, correction automatique et exports. Les tests ont validé les parcours critiques une fois corrigés les problèmes de cookie Secure, de sérialisation Decimal et de synchronisation du timer.</w:t>
       </w:r>
     </w:p>
     <w:p>
@@ -17134,7 +17111,7 @@
             <w:rStyle w:val="Lienhypertexte"/>
             <w:noProof/>
           </w:rPr>
-          <w:t>3.8 Conception de la sécurité de passation</w:t>
+          <w:t>3.8 Conception de la sécurité pendant l'examen</w:t>
         </w:r>
         <w:r>
           <w:rPr>
@@ -17175,7 +17152,7 @@
             <w:noProof/>
             <w:webHidden/>
           </w:rPr>
-          <w:t>33</w:t>
+          <w:t/>
         </w:r>
         <w:r>
           <w:rPr>
@@ -17185,6 +17162,7 @@
           <w:fldChar w:fldCharType="end"/>
         </w:r>
       </w:hyperlink>
+      <w:r/>
     </w:p>
     <w:p>
       <w:pPr>
@@ -18838,7 +18816,7 @@
             <w:rStyle w:val="Lienhypertexte"/>
             <w:noProof/>
           </w:rPr>
-          <w:t>5.2.4 Parcours étudiant et contrôles de passation</w:t>
+          <w:t>5.2.4 Parcours étudiant et contrôles pendant l'examen</w:t>
         </w:r>
         <w:r>
           <w:rPr>
@@ -18879,7 +18857,7 @@
             <w:noProof/>
             <w:webHidden/>
           </w:rPr>
-          <w:t>45</w:t>
+          <w:t/>
         </w:r>
         <w:r>
           <w:rPr>
@@ -18889,6 +18867,7 @@
           <w:fldChar w:fldCharType="end"/>
         </w:r>
       </w:hyperlink>
+      <w:r/>
     </w:p>
     <w:p>
       <w:pPr>

</xml_diff>

<commit_message>
Objectif général : concevoir (sans réaliser)
Co-authored-by: progirix <progirix@users.noreply.github.com>
</commit_message>
<xml_diff>
--- a/docs/Rapport_Cylentic.docx
+++ b/docs/Rapport_Cylentic.docx
@@ -6014,9 +6014,12 @@
       </w:pPr>
       <w:r>
         <w:rPr>
-          <w:color w:val="000000"/>
-        </w:rPr>
-        <w:t>L'objectif général consiste à concevoir et réaliser une plateforme web d'examens de programmation sécurisés, nommée Cylentic.</w:t>
+          <w:rFonts w:ascii="Times New Roman" w:hAnsi="Times New Roman" w:eastAsia="Times New Roman"/>
+          <w:b w:val="0"/>
+          <w:color w:val="000000"/>
+          <w:sz w:val="24"/>
+        </w:rPr>
+        <w:t>L'objectif général consiste à concevoir une plateforme web d'examens de programmation sécurisés, nommée Cylentic.</w:t>
       </w:r>
     </w:p>
     <w:p>

</xml_diff>

<commit_message>
Ajouter résultats attendus, hypothèses et méthodologie dans l'introduction
Co-authored-by: progirix <progirix@users.noreply.github.com>
</commit_message>
<xml_diff>
--- a/docs/Rapport_Cylentic.docx
+++ b/docs/Rapport_Cylentic.docx
@@ -5932,14 +5932,18 @@
     </w:p>
     <w:p>
       <w:pPr>
+        <w:spacing w:line="360" w:lineRule="auto" w:after="160"/>
         <w:ind w:firstLine="425"/>
         <w:jc w:val="both"/>
       </w:pPr>
       <w:r>
         <w:rPr>
-          <w:color w:val="000000"/>
-        </w:rPr>
-        <w:t>Cinq chapitres suivent. On commence par le contexte et l'existant, puis les besoins, la conception, la réalisation, et enfin les tests avec leurs limites.</w:t>
+          <w:rFonts w:ascii="Times New Roman" w:hAnsi="Times New Roman" w:eastAsia="Times New Roman"/>
+          <w:b w:val="0"/>
+          <w:color w:val="000000"/>
+          <w:sz w:val="24"/>
+        </w:rPr>
+        <w:t>Le rapport est organisé en cinq chapitres. Le premier présente le contexte et l'existant. Le deuxième précise les besoins. Le troisième décrit la conception. Le quatrième présente la réalisation. Le cinquième traite des tests, des limites et des perspectives.</w:t>
       </w:r>
     </w:p>
     <w:p>
@@ -6115,15 +6119,242 @@
     </w:p>
     <w:p>
       <w:pPr>
+        <w:spacing w:line="360" w:lineRule="auto" w:after="160"/>
         <w:ind w:firstLine="425"/>
         <w:jc w:val="both"/>
       </w:pPr>
       <w:r>
         <w:rPr>
-          <w:color w:val="000000"/>
-        </w:rPr>
-        <w:lastRenderedPageBreak/>
-        <w:t>Le travail a suivi un enchaînement simple : regarder ce qui existait déjà, borner un MVP, modéliser en UML à partir du comportement réel de la plateforme, développer avec Next.js, Prisma et MySQL, puis valider par des parcours complets, en revérifiant après chaque correctif important.</w:t>
+          <w:rFonts w:ascii="Times New Roman" w:hAnsi="Times New Roman" w:eastAsia="Times New Roman"/>
+          <w:b w:val="0"/>
+          <w:color w:val="000000"/>
+          <w:sz w:val="24"/>
+        </w:rPr>
+        <w:t>Au terme de ce travail, plusieurs résultats sont attendus :</w:t>
+      </w:r>
+    </w:p>
+    <w:p>
+      <w:pPr>
+        <w:spacing w:line="360" w:lineRule="auto" w:after="120"/>
+        <w:ind w:firstLine="0"/>
+        <w:jc w:val="left"/>
+      </w:pPr>
+      <w:r>
+        <w:rPr>
+          <w:rFonts w:ascii="Times New Roman" w:hAnsi="Times New Roman" w:eastAsia="Times New Roman"/>
+          <w:b w:val="0"/>
+          <w:color w:val="000000"/>
+          <w:sz w:val="24"/>
+        </w:rPr>
+        <w:t>• une analyse claire des limites des outils existants pour évaluer la programmation en salle ;</w:t>
+      </w:r>
+    </w:p>
+    <w:p>
+      <w:pPr>
+        <w:spacing w:line="360" w:lineRule="auto" w:after="120"/>
+        <w:ind w:firstLine="0"/>
+        <w:jc w:val="left"/>
+      </w:pPr>
+      <w:r>
+        <w:rPr>
+          <w:rFonts w:ascii="Times New Roman" w:hAnsi="Times New Roman" w:eastAsia="Times New Roman"/>
+          <w:b w:val="0"/>
+          <w:color w:val="000000"/>
+          <w:sz w:val="24"/>
+        </w:rPr>
+        <w:t>• une conception documentée de Cylentic (besoins, architecture, diagrammes) ;</w:t>
+      </w:r>
+    </w:p>
+    <w:p>
+      <w:pPr>
+        <w:spacing w:line="360" w:lineRule="auto" w:after="120"/>
+        <w:ind w:firstLine="0"/>
+        <w:jc w:val="left"/>
+      </w:pPr>
+      <w:r>
+        <w:rPr>
+          <w:rFonts w:ascii="Times New Roman" w:hAnsi="Times New Roman" w:eastAsia="Times New Roman"/>
+          <w:b w:val="0"/>
+          <w:color w:val="000000"/>
+          <w:sz w:val="24"/>
+        </w:rPr>
+        <w:t>• un prototype qui couvre les parcours principaux d'un examen sécurisé ;</w:t>
+      </w:r>
+    </w:p>
+    <w:p>
+      <w:pPr>
+        <w:spacing w:line="360" w:lineRule="auto" w:after="120"/>
+        <w:ind w:firstLine="0"/>
+        <w:jc w:val="left"/>
+      </w:pPr>
+      <w:r>
+        <w:rPr>
+          <w:rFonts w:ascii="Times New Roman" w:hAnsi="Times New Roman" w:eastAsia="Times New Roman"/>
+          <w:b w:val="0"/>
+          <w:color w:val="000000"/>
+          <w:sz w:val="24"/>
+        </w:rPr>
+        <w:t>• une validation par tests des scénarios critiques (connexion, composition, correction, exports).</w:t>
+      </w:r>
+    </w:p>
+    <w:p>
+      <w:pPr>
+        <w:spacing w:line="360" w:lineRule="auto" w:after="160"/>
+        <w:ind w:firstLine="425"/>
+        <w:jc w:val="both"/>
+      </w:pPr>
+      <w:r>
+        <w:rPr>
+          <w:rFonts w:ascii="Times New Roman" w:hAnsi="Times New Roman" w:eastAsia="Times New Roman"/>
+          <w:b w:val="0"/>
+          <w:color w:val="000000"/>
+          <w:sz w:val="24"/>
+        </w:rPr>
+        <w:t>Pour atteindre ces objectifs, nous partons des hypothèses de recherche suivantes :</w:t>
+      </w:r>
+    </w:p>
+    <w:p>
+      <w:pPr>
+        <w:spacing w:line="360" w:lineRule="auto" w:after="120"/>
+        <w:ind w:firstLine="0"/>
+        <w:jc w:val="left"/>
+      </w:pPr>
+      <w:r>
+        <w:rPr>
+          <w:rFonts w:ascii="Times New Roman" w:hAnsi="Times New Roman" w:eastAsia="Times New Roman"/>
+          <w:b w:val="0"/>
+          <w:color w:val="000000"/>
+          <w:sz w:val="24"/>
+        </w:rPr>
+        <w:t>• si le navigateur est suffisamment contrôlé et si les incidents sont enregistrés, on peut rendre l'examen sur machine plus crédible ;</w:t>
+      </w:r>
+    </w:p>
+    <w:p>
+      <w:pPr>
+        <w:spacing w:line="360" w:lineRule="auto" w:after="120"/>
+        <w:ind w:firstLine="0"/>
+        <w:jc w:val="left"/>
+      </w:pPr>
+      <w:r>
+        <w:rPr>
+          <w:rFonts w:ascii="Times New Roman" w:hAnsi="Times New Roman" w:eastAsia="Times New Roman"/>
+          <w:b w:val="0"/>
+          <w:color w:val="000000"/>
+          <w:sz w:val="24"/>
+        </w:rPr>
+        <w:t>• si le code est exécuté dans un environnement isolé et corrigé avec des tests unitaires, l'évaluation devient plus fiable et plus rapide ;</w:t>
+      </w:r>
+    </w:p>
+    <w:p>
+      <w:pPr>
+        <w:spacing w:line="360" w:lineRule="auto" w:after="120"/>
+        <w:ind w:firstLine="0"/>
+        <w:jc w:val="left"/>
+      </w:pPr>
+      <w:r>
+        <w:rPr>
+          <w:rFonts w:ascii="Times New Roman" w:hAnsi="Times New Roman" w:eastAsia="Times New Roman"/>
+          <w:b w:val="0"/>
+          <w:color w:val="000000"/>
+          <w:sz w:val="24"/>
+        </w:rPr>
+        <w:t>• si la plateforme reste utilisable dans un simple navigateur, elle convient aux salles informatiques partagées, même avec un réseau parfois instable.</w:t>
+      </w:r>
+    </w:p>
+    <w:p>
+      <w:pPr>
+        <w:spacing w:line="360" w:lineRule="auto" w:after="160"/>
+        <w:ind w:firstLine="425"/>
+        <w:jc w:val="both"/>
+      </w:pPr>
+      <w:r>
+        <w:rPr>
+          <w:rFonts w:ascii="Times New Roman" w:hAnsi="Times New Roman" w:eastAsia="Times New Roman"/>
+          <w:b w:val="0"/>
+          <w:color w:val="000000"/>
+          <w:sz w:val="24"/>
+        </w:rPr>
+        <w:t>Pour y arriver, nous avons suivi une démarche méthodologique en plusieurs étapes :</w:t>
+      </w:r>
+    </w:p>
+    <w:p>
+      <w:pPr>
+        <w:spacing w:line="360" w:lineRule="auto" w:after="120"/>
+        <w:ind w:firstLine="0"/>
+        <w:jc w:val="left"/>
+      </w:pPr>
+      <w:r>
+        <w:rPr>
+          <w:rFonts w:ascii="Times New Roman" w:hAnsi="Times New Roman" w:eastAsia="Times New Roman"/>
+          <w:b w:val="0"/>
+          <w:color w:val="000000"/>
+          <w:sz w:val="24"/>
+        </w:rPr>
+        <w:t>• revue de l'existant et identification des limites des solutions actuelles ;</w:t>
+      </w:r>
+    </w:p>
+    <w:p>
+      <w:pPr>
+        <w:spacing w:line="360" w:lineRule="auto" w:after="120"/>
+        <w:ind w:firstLine="0"/>
+        <w:jc w:val="left"/>
+      </w:pPr>
+      <w:r>
+        <w:rPr>
+          <w:rFonts w:ascii="Times New Roman" w:hAnsi="Times New Roman" w:eastAsia="Times New Roman"/>
+          <w:b w:val="0"/>
+          <w:color w:val="000000"/>
+          <w:sz w:val="24"/>
+        </w:rPr>
+        <w:t>• analyse des besoins et définition d'un MVP borné ;</w:t>
+      </w:r>
+    </w:p>
+    <w:p>
+      <w:pPr>
+        <w:spacing w:line="360" w:lineRule="auto" w:after="120"/>
+        <w:ind w:firstLine="0"/>
+        <w:jc w:val="left"/>
+      </w:pPr>
+      <w:r>
+        <w:rPr>
+          <w:rFonts w:ascii="Times New Roman" w:hAnsi="Times New Roman" w:eastAsia="Times New Roman"/>
+          <w:b w:val="0"/>
+          <w:color w:val="000000"/>
+          <w:sz w:val="24"/>
+        </w:rPr>
+        <w:t>• conception de la plateforme (UML, architecture, données, sécurité) ;</w:t>
+      </w:r>
+    </w:p>
+    <w:p>
+      <w:pPr>
+        <w:spacing w:line="360" w:lineRule="auto" w:after="120"/>
+        <w:ind w:firstLine="0"/>
+        <w:jc w:val="left"/>
+      </w:pPr>
+      <w:r>
+        <w:rPr>
+          <w:rFonts w:ascii="Times New Roman" w:hAnsi="Times New Roman" w:eastAsia="Times New Roman"/>
+          <w:b w:val="0"/>
+          <w:color w:val="000000"/>
+          <w:sz w:val="24"/>
+        </w:rPr>
+        <w:t>• réalisation itérative avec Next.js, Prisma et MySQL ;</w:t>
+      </w:r>
+    </w:p>
+    <w:p>
+      <w:pPr>
+        <w:spacing w:line="360" w:lineRule="auto" w:after="120"/>
+        <w:ind w:firstLine="0"/>
+        <w:jc w:val="left"/>
+      </w:pPr>
+      <w:r>
+        <w:rPr>
+          <w:rFonts w:ascii="Times New Roman" w:hAnsi="Times New Roman" w:eastAsia="Times New Roman"/>
+          <w:b w:val="0"/>
+          <w:color w:val="000000"/>
+          <w:sz w:val="24"/>
+        </w:rPr>
+        <w:t>• tests des parcours complets et contrôle après chaque correctif important.</w:t>
       </w:r>
     </w:p>
     <w:p>

</xml_diff>

<commit_message>
Chapitre 1 = état de l'art ; comparaison déplacée au chapitre 2
Co-authored-by: progirix <progirix@users.noreply.github.com>
</commit_message>
<xml_diff>
--- a/docs/Rapport_Cylentic.docx
+++ b/docs/Rapport_Cylentic.docx
@@ -1726,7 +1726,7 @@
             <w:rStyle w:val="Lienhypertexte"/>
             <w:noProof/>
           </w:rPr>
-          <w:t>Chapitre 1 : Contexte et étude de l'existant</w:t>
+          <w:t>Chapitre 1 : État de l'art</w:t>
         </w:r>
         <w:r>
           <w:rPr>
@@ -1767,7 +1767,7 @@
             <w:noProof/>
             <w:webHidden/>
           </w:rPr>
-          <w:t>3</w:t>
+          <w:t/>
         </w:r>
         <w:r>
           <w:rPr>
@@ -5452,97 +5452,6 @@
       </w:r>
       <w:bookmarkEnd w:id="16"/>
       <w:bookmarkEnd w:id="17"/>
-    </w:p>
-    <w:p>
-      <w:pPr>
-        <w:pStyle w:val="Tabledesillustrations"/>
-        <w:tabs>
-          <w:tab w:val="right" w:leader="dot" w:pos="8495"/>
-        </w:tabs>
-        <w:rPr>
-          <w:rFonts w:asciiTheme="minorHAnsi" w:eastAsiaTheme="minorEastAsia" w:hAnsiTheme="minorHAnsi"/>
-          <w:noProof/>
-          <w:sz w:val="22"/>
-        </w:rPr>
-      </w:pPr>
-      <w:r>
-        <w:rPr>
-          <w:i/>
-          <w:color w:val="000000"/>
-        </w:rPr>
-        <w:fldChar w:fldCharType="begin"/>
-      </w:r>
-      <w:r>
-        <w:rPr>
-          <w:i/>
-          <w:color w:val="000000"/>
-        </w:rPr>
-        <w:instrText>TOC \h \z \c "Tableau"</w:instrText>
-      </w:r>
-      <w:r>
-        <w:rPr>
-          <w:i/>
-          <w:color w:val="000000"/>
-        </w:rPr>
-        <w:fldChar w:fldCharType="separate"/>
-      </w:r>
-      <w:hyperlink w:anchor="_Toc235108635" w:history="1">
-        <w:r>
-          <w:rPr>
-            <w:rStyle w:val="Lienhypertexte"/>
-            <w:noProof/>
-          </w:rPr>
-          <w:t>Tableau 1 : Comparaison des solutions existantes et de Cylentic</w:t>
-        </w:r>
-        <w:r>
-          <w:rPr>
-            <w:noProof/>
-            <w:webHidden/>
-          </w:rPr>
-          <w:tab/>
-        </w:r>
-        <w:r>
-          <w:rPr>
-            <w:noProof/>
-            <w:webHidden/>
-          </w:rPr>
-          <w:fldChar w:fldCharType="begin"/>
-        </w:r>
-        <w:r>
-          <w:rPr>
-            <w:noProof/>
-            <w:webHidden/>
-          </w:rPr>
-          <w:instrText xml:space="preserve"> PAGEREF _Toc235108635 \h </w:instrText>
-        </w:r>
-        <w:r>
-          <w:rPr>
-            <w:noProof/>
-            <w:webHidden/>
-          </w:rPr>
-        </w:r>
-        <w:r>
-          <w:rPr>
-            <w:noProof/>
-            <w:webHidden/>
-          </w:rPr>
-          <w:fldChar w:fldCharType="separate"/>
-        </w:r>
-        <w:r>
-          <w:rPr>
-            <w:noProof/>
-            <w:webHidden/>
-          </w:rPr>
-          <w:t>4</w:t>
-        </w:r>
-        <w:r>
-          <w:rPr>
-            <w:noProof/>
-            <w:webHidden/>
-          </w:rPr>
-          <w:fldChar w:fldCharType="end"/>
-        </w:r>
-      </w:hyperlink>
     </w:p>
     <w:p>
       <w:pPr>
@@ -5943,7 +5852,7 @@
           <w:color w:val="000000"/>
           <w:sz w:val="24"/>
         </w:rPr>
-        <w:t>Le rapport est organisé en cinq chapitres. Le premier présente le contexte et l'existant. Le deuxième précise les besoins. Le troisième décrit la conception. Le quatrième présente la réalisation. Le cinquième traite des tests, des limites et des perspectives.</w:t>
+        <w:t>Le rapport est organisé en cinq chapitres. Le premier présente l'état de l'art. Le deuxième compare les solutions existantes, positionne Cylentic et précise les besoins. Le troisième décrit la conception. Le quatrième présente la réalisation. Le cinquième traite des tests, des limites et des perspectives.</w:t>
       </w:r>
     </w:p>
     <w:p>
@@ -6279,6 +6188,22 @@
     </w:p>
     <w:p>
       <w:pPr>
+        <w:spacing w:line="360" w:lineRule="auto" w:after="160"/>
+        <w:ind w:firstLine="0"/>
+        <w:jc w:val="both"/>
+      </w:pPr>
+      <w:r>
+        <w:rPr>
+          <w:rFonts w:ascii="Times New Roman" w:hAnsi="Times New Roman" w:eastAsia="Times New Roman"/>
+          <w:b w:val="0"/>
+          <w:color w:val="000000"/>
+          <w:sz w:val="24"/>
+        </w:rPr>
+        <w:t>• revue de l'état de l'art et identification des limites des solutions actuelles ;</w:t>
+      </w:r>
+    </w:p>
+    <w:p>
+      <w:pPr>
         <w:spacing w:line="360" w:lineRule="auto" w:after="120"/>
         <w:ind w:firstLine="0"/>
         <w:jc w:val="left"/>
@@ -6290,7 +6215,7 @@
           <w:color w:val="000000"/>
           <w:sz w:val="24"/>
         </w:rPr>
-        <w:t>• revue de l'existant et identification des limites des solutions actuelles ;</w:t>
+        <w:t>• analyse des besoins et définition d'un MVP borné ;</w:t>
       </w:r>
     </w:p>
     <w:p>
@@ -6306,7 +6231,7 @@
           <w:color w:val="000000"/>
           <w:sz w:val="24"/>
         </w:rPr>
-        <w:t>• analyse des besoins et définition d'un MVP borné ;</w:t>
+        <w:t>• conception de la plateforme (UML, architecture, données, sécurité) ;</w:t>
       </w:r>
     </w:p>
     <w:p>
@@ -6322,7 +6247,7 @@
           <w:color w:val="000000"/>
           <w:sz w:val="24"/>
         </w:rPr>
-        <w:t>• conception de la plateforme (UML, architecture, données, sécurité) ;</w:t>
+        <w:t>• réalisation itérative avec Next.js, Prisma et MySQL ;</w:t>
       </w:r>
     </w:p>
     <w:p>
@@ -6338,33 +6263,20 @@
           <w:color w:val="000000"/>
           <w:sz w:val="24"/>
         </w:rPr>
-        <w:t>• réalisation itérative avec Next.js, Prisma et MySQL ;</w:t>
-      </w:r>
-    </w:p>
-    <w:p>
-      <w:pPr>
-        <w:spacing w:line="360" w:lineRule="auto" w:after="120"/>
+        <w:t>• tests des parcours complets et contrôle après chaque correctif important.</w:t>
+      </w:r>
+    </w:p>
+    <w:p>
+      <w:r>
+        <w:br w:type="page"/>
+      </w:r>
+    </w:p>
+    <w:p>
+      <w:pPr>
+        <w:pStyle w:val="Titre1"/>
+        <w:spacing w:line="360" w:lineRule="auto" w:after="160"/>
         <w:ind w:firstLine="0"/>
         <w:jc w:val="left"/>
-      </w:pPr>
-      <w:r>
-        <w:rPr>
-          <w:rFonts w:ascii="Times New Roman" w:hAnsi="Times New Roman" w:eastAsia="Times New Roman"/>
-          <w:b w:val="0"/>
-          <w:color w:val="000000"/>
-          <w:sz w:val="24"/>
-        </w:rPr>
-        <w:t>• tests des parcours complets et contrôle après chaque correctif important.</w:t>
-      </w:r>
-    </w:p>
-    <w:p>
-      <w:r>
-        <w:br w:type="page"/>
-      </w:r>
-    </w:p>
-    <w:p>
-      <w:pPr>
-        <w:pStyle w:val="Titre1"/>
       </w:pPr>
       <w:bookmarkStart w:id="30" w:name="bm_ch1"/>
       <w:bookmarkStart w:id="31" w:name="_Toc235117288"/>
@@ -6372,9 +6284,11 @@
       <w:r>
         <w:rPr>
           <w:rFonts w:ascii="Times New Roman" w:eastAsia="Times New Roman" w:hAnsi="Times New Roman"/>
-        </w:rPr>
-        <w:lastRenderedPageBreak/>
-        <w:t>Chapitre 1 : Contexte et étude de l'existant</w:t>
+          <w:b/>
+          <w:color w:val="000000"/>
+          <w:sz w:val="24"/>
+        </w:rPr>
+        <w:t>Chapitre 1 : État de l'art</w:t>
       </w:r>
       <w:bookmarkEnd w:id="30"/>
       <w:bookmarkEnd w:id="31"/>
@@ -6382,14 +6296,18 @@
     </w:p>
     <w:p>
       <w:pPr>
+        <w:spacing w:line="360" w:lineRule="auto" w:after="160"/>
         <w:ind w:firstLine="425"/>
         <w:jc w:val="both"/>
       </w:pPr>
       <w:r>
         <w:rPr>
-          <w:color w:val="000000"/>
-        </w:rPr>
-        <w:t>Ce chapitre replace le projet dans son cadre pédagogique, détaille les sous-problèmes techniques, passe en revue les outils déjà disponibles et situe Cylentic. Le problème et les objectifs ont déjà été formulés dans la problématique.</w:t>
+          <w:rFonts w:ascii="Times New Roman" w:hAnsi="Times New Roman" w:eastAsia="Times New Roman"/>
+          <w:b w:val="0"/>
+          <w:color w:val="000000"/>
+          <w:sz w:val="24"/>
+        </w:rPr>
+        <w:t>Ce chapitre présente l'état de l'art du domaine. Il rappelle le contexte pédagogique, les contraintes locales et les grandes familles d'outils existants, puis synthétise leurs limites. La comparaison détaillée et le positionnement de Cylentic sont traités au chapitre 2.</w:t>
       </w:r>
     </w:p>
     <w:p>
@@ -6508,6 +6426,27 @@
     </w:p>
     <w:p>
       <w:pPr>
+        <w:pStyle w:val="Titre2"/>
+        <w:spacing w:line="360" w:lineRule="auto" w:after="160"/>
+        <w:ind w:firstLine="0"/>
+        <w:jc w:val="left"/>
+      </w:pPr>
+      <w:bookmarkStart w:id="37" w:name="bm_ch1_3"/>
+      <w:bookmarkStart w:id="38" w:name="_Toc235117377"/>
+      <w:r>
+        <w:rPr>
+          <w:rFonts w:ascii="Times New Roman" w:eastAsia="Times New Roman" w:hAnsi="Times New Roman"/>
+          <w:b/>
+          <w:color w:val="000000"/>
+          <w:sz w:val="24"/>
+        </w:rPr>
+        <w:t>1.3 Panorama des solutions existantes</w:t>
+      </w:r>
+      <w:bookmarkEnd w:id="37"/>
+      <w:bookmarkEnd w:id="38"/>
+    </w:p>
+    <w:p>
+      <w:pPr>
         <w:ind w:firstLine="425"/>
         <w:jc w:val="both"/>
       </w:pPr>
@@ -6515,24 +6454,8 @@
         <w:rPr>
           <w:color w:val="000000"/>
         </w:rPr>
-        <w:t>Nous partons de l'hypothèse suivante : si l'on verrouille suffisamment le navigateur et que l'on journalise les événements sensibles, on peut restaurer une crédibilité utile aux examens pratiques sur machine, sans revenir au papier, tout en conservant le jugement pédagogique du professeur.</w:t>
-      </w:r>
-    </w:p>
-    <w:p>
-      <w:pPr>
-        <w:pStyle w:val="Titre2"/>
-      </w:pPr>
-      <w:bookmarkStart w:id="37" w:name="bm_ch1_3"/>
-      <w:bookmarkStart w:id="38" w:name="_Toc235117377"/>
-      <w:r>
-        <w:rPr>
-          <w:rFonts w:ascii="Times New Roman" w:eastAsia="Times New Roman" w:hAnsi="Times New Roman"/>
-        </w:rPr>
-        <w:lastRenderedPageBreak/>
-        <w:t>1.3 Examen des solutions existantes</w:t>
-      </w:r>
-      <w:bookmarkEnd w:id="37"/>
-      <w:bookmarkEnd w:id="38"/>
+        <w:t>Les outils du marché répondent chacun à une partie du problème. Aucun, dans une forme vraiment adaptée à une épreuve de code en salle, ne les réunit tous.</w:t>
+      </w:r>
     </w:p>
     <w:p>
       <w:pPr>
@@ -6543,7 +6466,7 @@
         <w:rPr>
           <w:color w:val="000000"/>
         </w:rPr>
-        <w:t>Les outils du marché répondent chacun à une partie du problème. Aucun, dans une forme vraiment adaptée à une épreuve de code en salle, ne les réunit tous.</w:t>
+        <w:t>Les plateformes d'apprentissage comme freeCodeCamp offrent un éditeur et une exécution immédiate, mais dans un cadre ouvert, sans verrouillage digne d'une épreuve ni journal d'incidents orienté professeur.</w:t>
       </w:r>
     </w:p>
     <w:p>
@@ -6555,7 +6478,7 @@
         <w:rPr>
           <w:color w:val="000000"/>
         </w:rPr>
-        <w:t>Les plateformes d'apprentissage comme freeCodeCamp offrent un éditeur et une exécution immédiate, mais dans un cadre ouvert, sans verrouillage digne d'une épreuve ni journal d'incidents orienté professeur.</w:t>
+        <w:t>Les LMS comme Moodle gèrent cours, comptes, créneaux et QCM. Ils restent généralistes : l'éditeur de code avec exécution isolée n'est pas natif, et la surveillance poussée passe souvent par des extensions coûteuses.</w:t>
       </w:r>
     </w:p>
     <w:p>
@@ -6567,7 +6490,7 @@
         <w:rPr>
           <w:color w:val="000000"/>
         </w:rPr>
-        <w:t>Les LMS comme Moodle gèrent cours, comptes, créneaux et QCM. Ils restent généralistes : l'éditeur de code avec exécution isolée n'est pas natif, et la surveillance poussée passe souvent par des extensions coûteuses.</w:t>
+        <w:t>Les outils de surveillance d'examen à distance répondent surtout à des épreuves généralistes. Leur licence est souvent élevée. Ils n'exécutent ni ne corrigent du code de programmation au sens attendu ici.</w:t>
       </w:r>
     </w:p>
     <w:p>
@@ -6579,78 +6502,177 @@
         <w:rPr>
           <w:color w:val="000000"/>
         </w:rPr>
-        <w:t>Les outils de surveillance d'examen à distance répondent surtout à des épreuves généralistes. Leur licence est souvent élevée. Ils n'exécutent ni ne corrigent du code de programmation au sens attendu ici.</w:t>
+        <w:t>Les environnements d'exécution isolée, dont Judge0 est un exemple connu, isolent un programme et renvoient sa sortie. Ce sont des briques utiles, souvent auto hébergeables, mais pas une plateforme d'examen : pas de rôles scolaires, pas de composition contrôlée, pas de journal pédagogique.</w:t>
       </w:r>
     </w:p>
     <w:p>
       <w:pPr>
         <w:ind w:firstLine="425"/>
         <w:jc w:val="both"/>
-      </w:pPr>
-      <w:r>
-        <w:rPr>
-          <w:color w:val="000000"/>
-        </w:rPr>
-        <w:t>Les environnements d'exécution isolée, dont Judge0 est un exemple connu, isolent un programme et renvoient sa sortie. Ce sont des briques utiles, souvent auto hébergeables, mais pas une plateforme d'examen : pas de rôles scolaires, pas de composition contrôlée, pas de journal pédagogique.</w:t>
-      </w:r>
-    </w:p>
-    <w:p>
-      <w:pPr>
-        <w:pStyle w:val="Lgende"/>
-        <w:spacing w:after="200" w:line="360" w:lineRule="auto"/>
-      </w:pPr>
-      <w:bookmarkStart w:id="39" w:name="_Toc235108635"/>
-      <w:r>
-        <w:rPr>
-          <w:color w:val="000000"/>
-          <w:sz w:val="22"/>
-        </w:rPr>
-        <w:t xml:space="preserve">Tableau </w:t>
-      </w:r>
-      <w:r>
-        <w:rPr>
-          <w:color w:val="000000"/>
-          <w:sz w:val="22"/>
-        </w:rPr>
-        <w:fldChar w:fldCharType="begin"/>
-      </w:r>
-      <w:r>
-        <w:rPr>
-          <w:color w:val="000000"/>
-          <w:sz w:val="22"/>
-        </w:rPr>
-        <w:instrText>SEQ Tableau \* ARABIC</w:instrText>
-      </w:r>
-      <w:r>
-        <w:rPr>
-          <w:color w:val="000000"/>
-          <w:sz w:val="22"/>
-        </w:rPr>
-        <w:fldChar w:fldCharType="separate"/>
-      </w:r>
-      <w:r>
-        <w:rPr>
-          <w:noProof/>
-          <w:color w:val="000000"/>
-          <w:sz w:val="22"/>
-        </w:rPr>
-        <w:t>1</w:t>
-      </w:r>
-      <w:r>
-        <w:rPr>
-          <w:color w:val="000000"/>
-          <w:sz w:val="22"/>
-        </w:rPr>
-        <w:fldChar w:fldCharType="end"/>
-      </w:r>
-      <w:r>
-        <w:rPr>
-          <w:color w:val="000000"/>
-          <w:sz w:val="22"/>
-        </w:rPr>
-        <w:t xml:space="preserve"> : Comparaison des solutions existantes et de Cylentic</w:t>
-      </w:r>
-      <w:bookmarkEnd w:id="39"/>
+        <w:rPr>
+          <w:i/>
+          <w:color w:val="000000"/>
+          <w:sz w:val="20"/>
+        </w:rPr>
+      </w:pPr>
+    </w:p>
+    <w:p>
+      <w:pPr>
+        <w:pStyle w:val="Titre2"/>
+        <w:spacing w:line="360" w:lineRule="auto" w:after="160"/>
+        <w:ind w:firstLine="0"/>
+        <w:jc w:val="left"/>
+      </w:pPr>
+      <w:r>
+        <w:rPr>
+          <w:rFonts w:ascii="Times New Roman" w:hAnsi="Times New Roman" w:eastAsia="Times New Roman"/>
+          <w:b/>
+          <w:color w:val="000000"/>
+          <w:sz w:val="24"/>
+        </w:rPr>
+        <w:t>1.4 Synthèse des lacunes du domaine</w:t>
+      </w:r>
+    </w:p>
+    <w:p>
+      <w:pPr>
+        <w:spacing w:line="360" w:lineRule="auto" w:after="160"/>
+        <w:ind w:firstLine="425"/>
+        <w:jc w:val="both"/>
+      </w:pPr>
+      <w:r>
+        <w:rPr>
+          <w:rFonts w:ascii="Times New Roman" w:hAnsi="Times New Roman" w:eastAsia="Times New Roman"/>
+          <w:b w:val="0"/>
+          <w:color w:val="000000"/>
+          <w:sz w:val="24"/>
+        </w:rPr>
+        <w:t>L'état de l'art montre que chaque famille d'outils couvre une partie du besoin : apprentissage ouvert, gestion de cours, surveillance générale ou exécution isolée. Aucune ne réunit clairement, pour une école, une composition sécurisée en salle, une exécution réelle du code, une correction automatique et une traçabilité utile au professeur. Cette lacune justifie l'analyse des besoins et la comparaison structurée du chapitre suivant.</w:t>
+      </w:r>
+    </w:p>
+    <w:p>
+      <w:pPr>
+        <w:pStyle w:val="Titre2"/>
+        <w:spacing w:line="360" w:lineRule="auto" w:after="160"/>
+        <w:ind w:firstLine="0"/>
+        <w:jc w:val="left"/>
+      </w:pPr>
+      <w:bookmarkStart w:id="42" w:name="bm_ch1_5"/>
+      <w:bookmarkStart w:id="43" w:name="_Toc235117379"/>
+      <w:r>
+        <w:rPr>
+          <w:rFonts w:ascii="Times New Roman" w:eastAsia="Times New Roman" w:hAnsi="Times New Roman"/>
+          <w:b/>
+          <w:color w:val="000000"/>
+          <w:sz w:val="24"/>
+        </w:rPr>
+        <w:t>1.5 Conclusion</w:t>
+      </w:r>
+      <w:bookmarkEnd w:id="42"/>
+      <w:bookmarkEnd w:id="43"/>
+    </w:p>
+    <w:p>
+      <w:pPr>
+        <w:spacing w:line="360" w:lineRule="auto" w:after="160"/>
+        <w:ind w:firstLine="425"/>
+        <w:jc w:val="both"/>
+      </w:pPr>
+      <w:r>
+        <w:rPr>
+          <w:rFonts w:ascii="Times New Roman" w:hAnsi="Times New Roman" w:eastAsia="Times New Roman"/>
+          <w:b w:val="0"/>
+          <w:color w:val="000000"/>
+          <w:sz w:val="24"/>
+        </w:rPr>
+        <w:t>Le contexte, les contraintes locales et le panorama des outils forment un état de l'art clair : le besoin d'évaluer la programmation sur machine de façon crédible reste mal couvert. Le chapitre 2 compare les solutions existantes, positionne Cylentic, puis fixe le cahier des charges du MVP.</w:t>
+      </w:r>
+    </w:p>
+    <w:p>
+      <w:r>
+        <w:br w:type="page"/>
+      </w:r>
+    </w:p>
+    <w:p>
+      <w:pPr>
+        <w:pStyle w:val="Titre1"/>
+      </w:pPr>
+      <w:bookmarkStart w:id="44" w:name="bm_ch2"/>
+      <w:bookmarkStart w:id="45" w:name="_Toc235117289"/>
+      <w:bookmarkStart w:id="46" w:name="_Toc235117380"/>
+      <w:r>
+        <w:rPr>
+          <w:rFonts w:ascii="Times New Roman" w:eastAsia="Times New Roman" w:hAnsi="Times New Roman"/>
+        </w:rPr>
+        <w:lastRenderedPageBreak/>
+        <w:t>Chapitre 2 : Analyse des besoins et spécification du système</w:t>
+      </w:r>
+      <w:bookmarkEnd w:id="44"/>
+      <w:bookmarkEnd w:id="45"/>
+      <w:bookmarkEnd w:id="46"/>
+    </w:p>
+    <w:p>
+      <w:pPr>
+        <w:spacing w:line="360" w:lineRule="auto" w:after="160"/>
+        <w:ind w:firstLine="425"/>
+        <w:jc w:val="both"/>
+      </w:pPr>
+      <w:r>
+        <w:rPr>
+          <w:rFonts w:ascii="Times New Roman" w:hAnsi="Times New Roman" w:eastAsia="Times New Roman"/>
+          <w:b w:val="0"/>
+          <w:color w:val="000000"/>
+          <w:sz w:val="24"/>
+        </w:rPr>
+        <w:t>Ce chapitre commence par comparer les solutions existantes et positionner Cylentic. Il fixe ensuite le périmètre du MVP, les acteurs, puis les besoins fonctionnels et non fonctionnels du système.</w:t>
+      </w:r>
+    </w:p>
+    <w:p>
+      <w:pPr>
+        <w:pStyle w:val="Titre2"/>
+        <w:spacing w:line="360" w:lineRule="auto" w:after="160"/>
+        <w:ind w:firstLine="0"/>
+        <w:jc w:val="left"/>
+      </w:pPr>
+      <w:r>
+        <w:rPr>
+          <w:rFonts w:ascii="Times New Roman" w:hAnsi="Times New Roman" w:eastAsia="Times New Roman"/>
+          <w:b/>
+          <w:color w:val="000000"/>
+          <w:sz w:val="24"/>
+        </w:rPr>
+        <w:t>2.1 Comparaison des solutions existantes</w:t>
+      </w:r>
+    </w:p>
+    <w:p>
+      <w:pPr>
+        <w:spacing w:line="360" w:lineRule="auto" w:after="160"/>
+        <w:ind w:firstLine="425"/>
+        <w:jc w:val="both"/>
+      </w:pPr>
+      <w:r>
+        <w:rPr>
+          <w:rFonts w:ascii="Times New Roman" w:hAnsi="Times New Roman" w:eastAsia="Times New Roman"/>
+          <w:b w:val="0"/>
+          <w:color w:val="000000"/>
+          <w:sz w:val="24"/>
+        </w:rPr>
+        <w:t>Pour préciser l'état de l'art, le tableau ci-dessous compare les principales familles de solutions aux exigences d'un examen de programmation surveillé en salle.</w:t>
+      </w:r>
+    </w:p>
+    <w:p>
+      <w:pPr>
+        <w:spacing w:line="360" w:lineRule="auto" w:after="160"/>
+        <w:ind w:firstLine="0"/>
+        <w:jc w:val="left"/>
+      </w:pPr>
+      <w:r>
+        <w:rPr>
+          <w:rFonts w:ascii="Times New Roman" w:hAnsi="Times New Roman" w:eastAsia="Times New Roman"/>
+          <w:b/>
+          <w:color w:val="000000"/>
+          <w:sz w:val="24"/>
+        </w:rPr>
+        <w:t>Tableau 1 : Comparaison des solutions existantes et de Cylentic</w:t>
+      </w:r>
     </w:p>
     <w:tbl>
       <w:tblPr>
@@ -7364,65 +7386,87 @@
     </w:tbl>
     <w:p>
       <w:pPr>
+        <w:spacing w:line="360" w:lineRule="auto"/>
         <w:ind w:firstLine="425"/>
         <w:jc w:val="both"/>
-        <w:rPr>
-          <w:i/>
-          <w:color w:val="000000"/>
-          <w:sz w:val="20"/>
-        </w:rPr>
-      </w:pPr>
-    </w:p>
-    <w:p>
-      <w:pPr>
+      </w:pPr>
+      <w:r>
+        <w:rPr>
+          <w:rFonts w:ascii="Times New Roman" w:hAnsi="Times New Roman" w:eastAsia="Times New Roman"/>
+          <w:sz w:val="24"/>
+        </w:rPr>
+        <w:t>Aucune de ces solutions ne couvre à la fois composition sécurisée, exécution isolée, correction et traçabilité pour une école. C'est dans cet espace que se place Cylentic.</w:t>
+      </w:r>
+    </w:p>
+    <w:p>
+      <w:pPr>
+        <w:pStyle w:val="Titre2"/>
+        <w:spacing w:line="360" w:lineRule="auto" w:after="160"/>
+        <w:ind w:firstLine="0"/>
+        <w:jc w:val="left"/>
+      </w:pPr>
+      <w:r>
+        <w:rPr>
+          <w:rFonts w:ascii="Times New Roman" w:hAnsi="Times New Roman" w:eastAsia="Times New Roman"/>
+          <w:b/>
+          <w:color w:val="000000"/>
+          <w:sz w:val="24"/>
+        </w:rPr>
+        <w:t>2.2 Positionnement de Cylentic</w:t>
+      </w:r>
+    </w:p>
+    <w:p>
+      <w:pPr>
+        <w:spacing w:line="360" w:lineRule="auto" w:after="160"/>
         <w:ind w:firstLine="425"/>
         <w:jc w:val="both"/>
       </w:pPr>
       <w:r>
         <w:rPr>
-          <w:color w:val="000000"/>
-        </w:rPr>
-        <w:t>Au total, aucune de ces solutions n'offre ensemble composition sécurisée, exécution isolée, correction et traçabilité pour une école. Cylentic vise précisément cet espace.</w:t>
-      </w:r>
-    </w:p>
-    <w:p>
-      <w:pPr>
-        <w:pStyle w:val="Titre2"/>
-      </w:pPr>
-      <w:bookmarkStart w:id="40" w:name="bm_ch1_4"/>
-      <w:bookmarkStart w:id="41" w:name="_Toc235117378"/>
-      <w:r>
-        <w:rPr>
-          <w:rFonts w:ascii="Times New Roman" w:eastAsia="Times New Roman" w:hAnsi="Times New Roman"/>
-        </w:rPr>
-        <w:t>1.4 Positionnement de Cylentic</w:t>
-      </w:r>
-      <w:bookmarkEnd w:id="40"/>
-      <w:bookmarkEnd w:id="41"/>
-    </w:p>
-    <w:p>
-      <w:pPr>
+          <w:rFonts w:ascii="Times New Roman" w:hAnsi="Times New Roman" w:eastAsia="Times New Roman"/>
+          <w:b w:val="0"/>
+          <w:color w:val="000000"/>
+          <w:sz w:val="24"/>
+        </w:rPr>
+        <w:t>Cylentic n'est ni une plateforme d'apprentissage ouverte, ni une simple variante de LMS. Elle vise l'évaluation surveillée de la programmation.</w:t>
+      </w:r>
+    </w:p>
+    <w:p>
+      <w:pPr>
+        <w:spacing w:line="360" w:lineRule="auto" w:after="160"/>
         <w:ind w:firstLine="425"/>
         <w:jc w:val="both"/>
       </w:pPr>
       <w:r>
         <w:rPr>
-          <w:color w:val="000000"/>
-        </w:rPr>
-        <w:t xml:space="preserve">Cylentic n'est ni une plateforme d'apprentissage ouverte, ni une simple variante de LMS. </w:t>
-      </w:r>
-      <w:r>
-        <w:rPr>
-          <w:color w:val="000000"/>
-        </w:rPr>
-        <w:t>Elle</w:t>
-      </w:r>
-      <w:r>
-        <w:rPr>
-          <w:color w:val="000000"/>
-        </w:rPr>
-        <w:t xml:space="preserve"> vise l'évaluation surveillée de la programmation.</w:t>
-      </w:r>
+          <w:rFonts w:ascii="Times New Roman" w:hAnsi="Times New Roman" w:eastAsia="Times New Roman"/>
+          <w:b w:val="0"/>
+          <w:color w:val="000000"/>
+          <w:sz w:val="24"/>
+        </w:rPr>
+        <w:t>Sa singularité tient au couplage : éditeur dans le navigateur, sandbox Docker Python, contrôles pendant l'examen côté client, règles métier et timers côté serveur, journal d'incidents, exports professeur, et maintien du surveillant physique. S'y ajoute une gouvernance multi établissement, avec un Super Admin plateforme distinct de l'administrateur d'école.</w:t>
+      </w:r>
+    </w:p>
+    <w:p>
+      <w:pPr>
+        <w:pStyle w:val="Titre2"/>
+        <w:spacing w:line="360" w:lineRule="auto" w:after="160"/>
+        <w:ind w:firstLine="0"/>
+        <w:jc w:val="left"/>
+      </w:pPr>
+      <w:bookmarkStart w:id="47" w:name="bm_ch2_1"/>
+      <w:bookmarkStart w:id="48" w:name="_Toc235117381"/>
+      <w:r>
+        <w:rPr>
+          <w:rFonts w:ascii="Times New Roman" w:eastAsia="Times New Roman" w:hAnsi="Times New Roman"/>
+          <w:b/>
+          <w:color w:val="000000"/>
+          <w:sz w:val="24"/>
+        </w:rPr>
+        <w:t>2.3 Périmètre du projet et du MVP</w:t>
+      </w:r>
+      <w:bookmarkEnd w:id="47"/>
+      <w:bookmarkEnd w:id="48"/>
     </w:p>
     <w:p>
       <w:pPr>
@@ -7433,23 +7477,8 @@
         <w:rPr>
           <w:color w:val="000000"/>
         </w:rPr>
-        <w:t>Sa singularité tient au couplage : éditeur dans le navigateur, sandbox Docker Python, contrôles pendant l'examen côté client, règles métier et timers côté serveur, journal d'incidents, exports professeur, et maintien du surveillant physique. S'y ajoute une gouvernance multi établissement, avec un Super Admin plateforme distinct de l'administrateur d'école.</w:t>
-      </w:r>
-    </w:p>
-    <w:p>
-      <w:pPr>
-        <w:pStyle w:val="Titre2"/>
-      </w:pPr>
-      <w:bookmarkStart w:id="42" w:name="bm_ch1_5"/>
-      <w:bookmarkStart w:id="43" w:name="_Toc235117379"/>
-      <w:r>
-        <w:rPr>
-          <w:rFonts w:ascii="Times New Roman" w:eastAsia="Times New Roman" w:hAnsi="Times New Roman"/>
-        </w:rPr>
-        <w:t>1.5 Conclusion partielle</w:t>
-      </w:r>
-      <w:bookmarkEnd w:id="42"/>
-      <w:bookmarkEnd w:id="43"/>
+        <w:t>Le projet assume un périmètre volontairement limité pour sa première version. Le MVP inclut : le langage Python, l'authentification avec rôles (Super Admin, administrateur d'établissement, professeur, étudiant), la création et la publication d'examens, la salle d'attente, l'environnement de composition sécurisé, les mécanismes de contrôle navigateur, la correction automatique par tests unitaires, un module QCM de base, la gestion de plusieurs établissements, l'onboarding administrateur, la promotion de rentrée, le contact depuis la landing page, ainsi que les exports de résultats et de présence.</w:t>
+      </w:r>
     </w:p>
     <w:p>
       <w:pPr>
@@ -7460,46 +7489,8 @@
         <w:rPr>
           <w:color w:val="000000"/>
         </w:rPr>
-        <w:t>Le constat est net : le problème existe, les outils ne le couvrent que par morceaux, et Cylentic a une place utile. Le chapitre suivant fixe le cahier des charges du MVP.</w:t>
-      </w:r>
-    </w:p>
-    <w:p>
-      <w:r>
-        <w:br w:type="page"/>
-      </w:r>
-    </w:p>
-    <w:p>
-      <w:pPr>
-        <w:pStyle w:val="Titre1"/>
-      </w:pPr>
-      <w:bookmarkStart w:id="44" w:name="bm_ch2"/>
-      <w:bookmarkStart w:id="45" w:name="_Toc235117289"/>
-      <w:bookmarkStart w:id="46" w:name="_Toc235117380"/>
-      <w:r>
-        <w:rPr>
-          <w:rFonts w:ascii="Times New Roman" w:eastAsia="Times New Roman" w:hAnsi="Times New Roman"/>
-        </w:rPr>
-        <w:lastRenderedPageBreak/>
-        <w:t>Chapitre 2 : Analyse des besoins et spécification du système</w:t>
-      </w:r>
-      <w:bookmarkEnd w:id="44"/>
-      <w:bookmarkEnd w:id="45"/>
-      <w:bookmarkEnd w:id="46"/>
-    </w:p>
-    <w:p>
-      <w:pPr>
-        <w:pStyle w:val="Titre2"/>
-      </w:pPr>
-      <w:bookmarkStart w:id="47" w:name="bm_ch2_1"/>
-      <w:bookmarkStart w:id="48" w:name="_Toc235117381"/>
-      <w:r>
-        <w:rPr>
-          <w:rFonts w:ascii="Times New Roman" w:eastAsia="Times New Roman" w:hAnsi="Times New Roman"/>
-        </w:rPr>
-        <w:t>2.1 Périmètre du projet et du MVP</w:t>
-      </w:r>
-      <w:bookmarkEnd w:id="47"/>
-      <w:bookmarkEnd w:id="48"/>
+        <w:t>Sont exclus de ce périmètre : le support d'autres langages que Python, la facturation réelle des établissements, la consultation en direct du code pendant l'épreuve, et l'activation de compte par email. Le MVP s'appuie sur des comptes créés par l'administration, un changement de mot de passe imposé si nécessaire, et des exports de résultats déjà disponibles pour le professeur (Excel, PDF) ainsi qu'un export de présence (CSV).</w:t>
+      </w:r>
     </w:p>
     <w:p>
       <w:pPr>
@@ -7510,44 +7501,26 @@
         <w:rPr>
           <w:color w:val="000000"/>
         </w:rPr>
-        <w:t>Le projet assume un périmètre volontairement limité pour sa première version. Le MVP inclut : le langage Python, l'authentification avec rôles (Super Admin, administrateur d'établissement, professeur, étudiant), la création et la publication d'examens, la salle d'attente, l'environnement de composition sécurisé, les mécanismes de contrôle navigateur, la correction automatique par tests unitaires, un module QCM de base, la gestion de plusieurs établissements, l'onboarding administrateur, la promotion de rentrée, le contact depuis la landing page, ainsi que les exports de résultats et de présence.</w:t>
-      </w:r>
-    </w:p>
-    <w:p>
-      <w:pPr>
-        <w:ind w:firstLine="425"/>
-        <w:jc w:val="both"/>
-      </w:pPr>
-      <w:r>
-        <w:rPr>
-          <w:color w:val="000000"/>
-        </w:rPr>
-        <w:t>Sont exclus de ce périmètre : le support d'autres langages que Python, la facturation réelle des établissements, la consultation en direct du code pendant l'épreuve, et l'activation de compte par email. Le MVP s'appuie sur des comptes créés par l'administration, un changement de mot de passe imposé si nécessaire, et des exports de résultats déjà disponibles pour le professeur (Excel, PDF) ainsi qu'un export de présence (CSV).</w:t>
-      </w:r>
-    </w:p>
-    <w:p>
-      <w:pPr>
-        <w:ind w:firstLine="425"/>
-        <w:jc w:val="both"/>
-      </w:pPr>
-      <w:r>
-        <w:rPr>
-          <w:color w:val="000000"/>
-        </w:rPr>
         <w:t>Ce périmètre restreint concentre l'effort sur le cœur du problème : la composition contrôlée et la correction automatique, plutôt que sur des fonctions secondaires.</w:t>
       </w:r>
     </w:p>
     <w:p>
       <w:pPr>
         <w:pStyle w:val="Titre2"/>
+        <w:spacing w:line="360" w:lineRule="auto" w:after="160"/>
+        <w:ind w:firstLine="0"/>
+        <w:jc w:val="left"/>
       </w:pPr>
       <w:bookmarkStart w:id="49" w:name="bm_ch2_2"/>
       <w:bookmarkStart w:id="50" w:name="_Toc235117382"/>
       <w:r>
         <w:rPr>
           <w:rFonts w:ascii="Times New Roman" w:eastAsia="Times New Roman" w:hAnsi="Times New Roman"/>
-        </w:rPr>
-        <w:t>2.2 Identification des acteurs</w:t>
+          <w:b/>
+          <w:color w:val="000000"/>
+          <w:sz w:val="24"/>
+        </w:rPr>
+        <w:t>2.4 Identification des acteurs</w:t>
       </w:r>
       <w:bookmarkEnd w:id="49"/>
       <w:bookmarkEnd w:id="50"/>
@@ -7861,14 +7834,20 @@
     <w:p>
       <w:pPr>
         <w:pStyle w:val="Titre2"/>
+        <w:spacing w:line="360" w:lineRule="auto" w:after="160"/>
+        <w:ind w:firstLine="0"/>
+        <w:jc w:val="left"/>
       </w:pPr>
       <w:bookmarkStart w:id="52" w:name="bm_ch2_3"/>
       <w:bookmarkStart w:id="53" w:name="_Toc235117383"/>
       <w:r>
         <w:rPr>
           <w:rFonts w:ascii="Times New Roman" w:eastAsia="Times New Roman" w:hAnsi="Times New Roman"/>
-        </w:rPr>
-        <w:t>2.3 Besoins fonctionnels</w:t>
+          <w:b/>
+          <w:color w:val="000000"/>
+          <w:sz w:val="24"/>
+        </w:rPr>
+        <w:t>2.5 Besoins fonctionnels</w:t>
       </w:r>
       <w:bookmarkEnd w:id="52"/>
       <w:bookmarkEnd w:id="53"/>
@@ -7948,15 +7927,20 @@
     <w:p>
       <w:pPr>
         <w:pStyle w:val="Titre2"/>
+        <w:spacing w:line="360" w:lineRule="auto" w:after="160"/>
+        <w:ind w:firstLine="0"/>
+        <w:jc w:val="left"/>
       </w:pPr>
       <w:bookmarkStart w:id="54" w:name="bm_ch2_4"/>
       <w:bookmarkStart w:id="55" w:name="_Toc235117384"/>
       <w:r>
         <w:rPr>
           <w:rFonts w:ascii="Times New Roman" w:eastAsia="Times New Roman" w:hAnsi="Times New Roman"/>
-        </w:rPr>
-        <w:lastRenderedPageBreak/>
-        <w:t>2.4 Besoins non fonctionnels</w:t>
+          <w:b/>
+          <w:color w:val="000000"/>
+          <w:sz w:val="24"/>
+        </w:rPr>
+        <w:t>2.6 Besoins non fonctionnels</w:t>
       </w:r>
       <w:bookmarkEnd w:id="54"/>
       <w:bookmarkEnd w:id="55"/>
@@ -7988,14 +7972,20 @@
     <w:p>
       <w:pPr>
         <w:pStyle w:val="Titre2"/>
+        <w:spacing w:line="360" w:lineRule="auto" w:after="160"/>
+        <w:ind w:firstLine="0"/>
+        <w:jc w:val="left"/>
       </w:pPr>
       <w:bookmarkStart w:id="56" w:name="bm_ch2_5"/>
       <w:bookmarkStart w:id="57" w:name="_Toc235117385"/>
       <w:r>
         <w:rPr>
           <w:rFonts w:ascii="Times New Roman" w:eastAsia="Times New Roman" w:hAnsi="Times New Roman"/>
-        </w:rPr>
-        <w:t>2.5 Règles métier structurantes</w:t>
+          <w:b/>
+          <w:color w:val="000000"/>
+          <w:sz w:val="24"/>
+        </w:rPr>
+        <w:t>2.7 Règles métier structurantes</w:t>
       </w:r>
       <w:bookmarkEnd w:id="56"/>
       <w:bookmarkEnd w:id="57"/>
@@ -8015,14 +8005,20 @@
     <w:p>
       <w:pPr>
         <w:pStyle w:val="Titre2"/>
+        <w:spacing w:line="360" w:lineRule="auto" w:after="160"/>
+        <w:ind w:firstLine="0"/>
+        <w:jc w:val="left"/>
       </w:pPr>
       <w:bookmarkStart w:id="58" w:name="bm_ch2_6"/>
       <w:bookmarkStart w:id="59" w:name="_Toc235117386"/>
       <w:r>
         <w:rPr>
           <w:rFonts w:ascii="Times New Roman" w:eastAsia="Times New Roman" w:hAnsi="Times New Roman"/>
-        </w:rPr>
-        <w:t>2.6 Scénarios d'usage prioritaires</w:t>
+          <w:b/>
+          <w:color w:val="000000"/>
+          <w:sz w:val="24"/>
+        </w:rPr>
+        <w:t>2.8 Scénarios d'usage prioritaires</w:t>
       </w:r>
       <w:bookmarkEnd w:id="58"/>
       <w:bookmarkEnd w:id="59"/>
@@ -8042,29 +8038,38 @@
     <w:p>
       <w:pPr>
         <w:pStyle w:val="Titre2"/>
+        <w:spacing w:line="360" w:lineRule="auto" w:after="160"/>
+        <w:ind w:firstLine="0"/>
+        <w:jc w:val="left"/>
       </w:pPr>
       <w:bookmarkStart w:id="60" w:name="bm_ch2_7"/>
       <w:bookmarkStart w:id="61" w:name="_Toc235117387"/>
       <w:r>
         <w:rPr>
           <w:rFonts w:ascii="Times New Roman" w:eastAsia="Times New Roman" w:hAnsi="Times New Roman"/>
-        </w:rPr>
-        <w:lastRenderedPageBreak/>
-        <w:t>2.7 Conclusion partielle</w:t>
+          <w:b/>
+          <w:color w:val="000000"/>
+          <w:sz w:val="24"/>
+        </w:rPr>
+        <w:t>2.9 Conclusion</w:t>
       </w:r>
       <w:bookmarkEnd w:id="60"/>
       <w:bookmarkEnd w:id="61"/>
     </w:p>
     <w:p>
       <w:pPr>
+        <w:spacing w:line="360" w:lineRule="auto" w:after="160"/>
         <w:ind w:firstLine="425"/>
         <w:jc w:val="both"/>
       </w:pPr>
       <w:r>
         <w:rPr>
-          <w:color w:val="000000"/>
-        </w:rPr>
-        <w:t>Le cahier des charges de Cylentic est posé : périmètre du MVP, acteurs, besoins fonctionnels et non fonctionnels, règles métier et scénarios prioritaires. Sur cette base, la conception du chapitre suivant peut se développer sans improvisation fonctionnelle.</w:t>
+          <w:rFonts w:ascii="Times New Roman" w:hAnsi="Times New Roman" w:eastAsia="Times New Roman"/>
+          <w:b w:val="0"/>
+          <w:color w:val="000000"/>
+          <w:sz w:val="24"/>
+        </w:rPr>
+        <w:t>Après la comparaison et le positionnement, le cahier des charges de Cylentic est posé : périmètre du MVP, acteurs, besoins fonctionnels et non fonctionnels, règles métier et scénarios prioritaires. Sur cette base, la conception du chapitre suivant peut se développer sans improvisation.</w:t>
       </w:r>
     </w:p>
     <w:p>
@@ -15570,7 +15575,7 @@
             <w:rStyle w:val="Lienhypertexte"/>
             <w:noProof/>
           </w:rPr>
-          <w:t>Chapitre 1 : Contexte et étude de l'existant</w:t>
+          <w:t>Chapitre 1 : État de l'art</w:t>
         </w:r>
         <w:r>
           <w:rPr>
@@ -15611,7 +15616,7 @@
             <w:noProof/>
             <w:webHidden/>
           </w:rPr>
-          <w:t>3</w:t>
+          <w:t/>
         </w:r>
         <w:r>
           <w:rPr>
@@ -15854,7 +15859,7 @@
             <w:rStyle w:val="Lienhypertexte"/>
             <w:noProof/>
           </w:rPr>
-          <w:t>1.4 Positionnement de Cylentic</w:t>
+          <w:t>1.4 Synthèse des lacunes du domaine</w:t>
         </w:r>
         <w:r>
           <w:rPr>
@@ -15895,7 +15900,7 @@
             <w:noProof/>
             <w:webHidden/>
           </w:rPr>
-          <w:t>5</w:t>
+          <w:t/>
         </w:r>
         <w:r>
           <w:rPr>
@@ -16138,7 +16143,7 @@
             <w:rStyle w:val="Lienhypertexte"/>
             <w:noProof/>
           </w:rPr>
-          <w:t>2.2 Identification des acteurs</w:t>
+          <w:t>2.4 Identification des acteurs</w:t>
         </w:r>
         <w:r>
           <w:rPr>
@@ -16179,7 +16184,7 @@
             <w:noProof/>
             <w:webHidden/>
           </w:rPr>
-          <w:t>6</w:t>
+          <w:t/>
         </w:r>
         <w:r>
           <w:rPr>
@@ -16209,7 +16214,7 @@
             <w:rStyle w:val="Lienhypertexte"/>
             <w:noProof/>
           </w:rPr>
-          <w:t>2.3 Besoins fonctionnels</w:t>
+          <w:t>2.5 Besoins fonctionnels</w:t>
         </w:r>
         <w:r>
           <w:rPr>
@@ -16250,7 +16255,7 @@
             <w:noProof/>
             <w:webHidden/>
           </w:rPr>
-          <w:t>7</w:t>
+          <w:t/>
         </w:r>
         <w:r>
           <w:rPr>

</xml_diff>

<commit_message>
Commenter toutes les figures (style mémoire de référence)
Co-authored-by: progirix <progirix@users.noreply.github.com>
</commit_message>
<xml_diff>
--- a/docs/Rapport_Cylentic.docx
+++ b/docs/Rapport_Cylentic.docx
@@ -8352,6 +8352,22 @@
     </w:p>
     <w:p>
       <w:pPr>
+        <w:spacing w:line="360" w:lineRule="auto" w:after="160"/>
+        <w:ind w:firstLine="425"/>
+        <w:jc w:val="both"/>
+      </w:pPr>
+      <w:r>
+        <w:rPr>
+          <w:rFonts w:ascii="Times New Roman" w:hAnsi="Times New Roman" w:eastAsia="Times New Roman"/>
+          <w:b w:val="0"/>
+          <w:color w:val="000000"/>
+          <w:sz w:val="24"/>
+        </w:rPr>
+        <w:t>La figure 1 présente l'architecture logique de Cylentic. On y voit l'interface web, les services métier, la base de données et la sandbox qui exécute le code des étudiants.</w:t>
+      </w:r>
+    </w:p>
+    <w:p>
+      <w:pPr>
         <w:ind w:firstLine="425"/>
         <w:jc w:val="both"/>
       </w:pPr>
@@ -8480,6 +8496,22 @@
         <w:t xml:space="preserve"> : Déploiement de l'infrastructure</w:t>
       </w:r>
       <w:bookmarkEnd w:id="70"/>
+    </w:p>
+    <w:p>
+      <w:pPr>
+        <w:spacing w:line="360" w:lineRule="auto" w:after="160"/>
+        <w:ind w:firstLine="425"/>
+        <w:jc w:val="both"/>
+      </w:pPr>
+      <w:r>
+        <w:rPr>
+          <w:rFonts w:ascii="Times New Roman" w:hAnsi="Times New Roman" w:eastAsia="Times New Roman"/>
+          <w:b w:val="0"/>
+          <w:color w:val="000000"/>
+          <w:sz w:val="24"/>
+        </w:rPr>
+        <w:t>La figure 2 illustre le déploiement de l'infrastructure. Elle montre le serveur applicatif, la base MySQL, les conteneurs Docker et les postes clients utilisés en salle.</w:t>
+      </w:r>
     </w:p>
     <w:p>
       <w:pPr>
@@ -8635,6 +8667,22 @@
     </w:p>
     <w:p>
       <w:pPr>
+        <w:spacing w:line="360" w:lineRule="auto" w:after="160"/>
+        <w:ind w:firstLine="425"/>
+        <w:jc w:val="both"/>
+      </w:pPr>
+      <w:r>
+        <w:rPr>
+          <w:rFonts w:ascii="Times New Roman" w:hAnsi="Times New Roman" w:eastAsia="Times New Roman"/>
+          <w:b w:val="0"/>
+          <w:color w:val="000000"/>
+          <w:sz w:val="24"/>
+        </w:rPr>
+        <w:t>La figure 3 présente les cas d'utilisation du Super Admin. Elle montre ses actions principales sur la plateforme, notamment la gestion des établissements.</w:t>
+      </w:r>
+    </w:p>
+    <w:p>
+      <w:pPr>
         <w:ind w:firstLine="425"/>
         <w:jc w:val="both"/>
       </w:pPr>
@@ -8760,6 +8808,22 @@
     </w:p>
     <w:p>
       <w:pPr>
+        <w:spacing w:line="360" w:lineRule="auto" w:after="160"/>
+        <w:ind w:firstLine="425"/>
+        <w:jc w:val="both"/>
+      </w:pPr>
+      <w:r>
+        <w:rPr>
+          <w:rFonts w:ascii="Times New Roman" w:hAnsi="Times New Roman" w:eastAsia="Times New Roman"/>
+          <w:b w:val="0"/>
+          <w:color w:val="000000"/>
+          <w:sz w:val="24"/>
+        </w:rPr>
+        <w:t>La figure 4 illustre les cas d'utilisation de l'administrateur d'établissement pour l'organisation scolaire : années, classes et structure locale.</w:t>
+      </w:r>
+    </w:p>
+    <w:p>
+      <w:pPr>
         <w:spacing w:after="80" w:line="240" w:lineRule="auto"/>
         <w:jc w:val="center"/>
       </w:pPr>
@@ -8873,6 +8937,22 @@
     </w:p>
     <w:p>
       <w:pPr>
+        <w:spacing w:line="360" w:lineRule="auto" w:after="160"/>
+        <w:ind w:firstLine="425"/>
+        <w:jc w:val="both"/>
+      </w:pPr>
+      <w:r>
+        <w:rPr>
+          <w:rFonts w:ascii="Times New Roman" w:hAnsi="Times New Roman" w:eastAsia="Times New Roman"/>
+          <w:b w:val="0"/>
+          <w:color w:val="000000"/>
+          <w:sz w:val="24"/>
+        </w:rPr>
+        <w:t>La figure 5 présente la gestion des comptes par l'administrateur : création, modification et suivi des comptes professeurs et étudiants.</w:t>
+      </w:r>
+    </w:p>
+    <w:p>
+      <w:pPr>
         <w:ind w:firstLine="425"/>
         <w:jc w:val="both"/>
       </w:pPr>
@@ -8998,6 +9078,22 @@
     </w:p>
     <w:p>
       <w:pPr>
+        <w:spacing w:line="360" w:lineRule="auto" w:after="160"/>
+        <w:ind w:firstLine="425"/>
+        <w:jc w:val="both"/>
+      </w:pPr>
+      <w:r>
+        <w:rPr>
+          <w:rFonts w:ascii="Times New Roman" w:hAnsi="Times New Roman" w:eastAsia="Times New Roman"/>
+          <w:b w:val="0"/>
+          <w:color w:val="000000"/>
+          <w:sz w:val="24"/>
+        </w:rPr>
+        <w:t>La figure 6 détaille les actions du professeur autour des examens : création, édition, publication et configuration des exercices.</w:t>
+      </w:r>
+    </w:p>
+    <w:p>
+      <w:pPr>
         <w:spacing w:after="80" w:line="240" w:lineRule="auto"/>
         <w:jc w:val="center"/>
       </w:pPr>
@@ -9111,6 +9207,22 @@
     </w:p>
     <w:p>
       <w:pPr>
+        <w:spacing w:line="360" w:lineRule="auto" w:after="160"/>
+        <w:ind w:firstLine="425"/>
+        <w:jc w:val="both"/>
+      </w:pPr>
+      <w:r>
+        <w:rPr>
+          <w:rFonts w:ascii="Times New Roman" w:hAnsi="Times New Roman" w:eastAsia="Times New Roman"/>
+          <w:b w:val="0"/>
+          <w:color w:val="000000"/>
+          <w:sz w:val="24"/>
+        </w:rPr>
+        <w:t>La figure 7 illustre le suivi côté professeur. Elle montre comment il consulte les participations, les incidents et les résultats.</w:t>
+      </w:r>
+    </w:p>
+    <w:p>
+      <w:pPr>
         <w:ind w:firstLine="425"/>
         <w:jc w:val="both"/>
       </w:pPr>
@@ -9236,6 +9348,22 @@
     </w:p>
     <w:p>
       <w:pPr>
+        <w:spacing w:line="360" w:lineRule="auto" w:after="160"/>
+        <w:ind w:firstLine="425"/>
+        <w:jc w:val="both"/>
+      </w:pPr>
+      <w:r>
+        <w:rPr>
+          <w:rFonts w:ascii="Times New Roman" w:hAnsi="Times New Roman" w:eastAsia="Times New Roman"/>
+          <w:b w:val="0"/>
+          <w:color w:val="000000"/>
+          <w:sz w:val="24"/>
+        </w:rPr>
+        <w:t>La figure 8 représente le parcours de l'étudiant : connexion, salle d'attente, composition, exécution d'essai et soumission.</w:t>
+      </w:r>
+    </w:p>
+    <w:p>
+      <w:pPr>
         <w:pStyle w:val="Titre2"/>
       </w:pPr>
       <w:bookmarkStart w:id="79" w:name="bm_ch3_4"/>
@@ -9389,6 +9517,22 @@
         <w:t xml:space="preserve"> : Classes organisation et comptes</w:t>
       </w:r>
       <w:bookmarkEnd w:id="81"/>
+    </w:p>
+    <w:p>
+      <w:pPr>
+        <w:spacing w:line="360" w:lineRule="auto" w:after="160"/>
+        <w:ind w:firstLine="425"/>
+        <w:jc w:val="both"/>
+      </w:pPr>
+      <w:r>
+        <w:rPr>
+          <w:rFonts w:ascii="Times New Roman" w:hAnsi="Times New Roman" w:eastAsia="Times New Roman"/>
+          <w:b w:val="0"/>
+          <w:color w:val="000000"/>
+          <w:sz w:val="24"/>
+        </w:rPr>
+        <w:t>La figure 9 présente le diagramme de classes lié à l'organisation et aux comptes. On y voit les établissements, les utilisateurs et leurs rôles.</w:t>
+      </w:r>
     </w:p>
     <w:p>
       <w:pPr>
@@ -9505,6 +9649,22 @@
     </w:p>
     <w:p>
       <w:pPr>
+        <w:spacing w:line="360" w:lineRule="auto" w:after="160"/>
+        <w:ind w:firstLine="425"/>
+        <w:jc w:val="both"/>
+      </w:pPr>
+      <w:r>
+        <w:rPr>
+          <w:rFonts w:ascii="Times New Roman" w:hAnsi="Times New Roman" w:eastAsia="Times New Roman"/>
+          <w:b w:val="0"/>
+          <w:color w:val="000000"/>
+          <w:sz w:val="24"/>
+        </w:rPr>
+        <w:t>La figure 10 illustre les classes utilisées pour concevoir un examen : examen, exercices, tests unitaires et éléments associés.</w:t>
+      </w:r>
+    </w:p>
+    <w:p>
+      <w:pPr>
         <w:spacing w:after="80" w:line="240" w:lineRule="auto"/>
         <w:jc w:val="center"/>
       </w:pPr>
@@ -9608,6 +9768,22 @@
         </w:rPr>
       </w:r>
       <w:bookmarkEnd w:id="83"/>
+    </w:p>
+    <w:p>
+      <w:pPr>
+        <w:spacing w:line="360" w:lineRule="auto" w:after="160"/>
+        <w:ind w:firstLine="425"/>
+        <w:jc w:val="both"/>
+      </w:pPr>
+      <w:r>
+        <w:rPr>
+          <w:rFonts w:ascii="Times New Roman" w:hAnsi="Times New Roman" w:eastAsia="Times New Roman"/>
+          <w:b w:val="0"/>
+          <w:color w:val="000000"/>
+          <w:sz w:val="24"/>
+        </w:rPr>
+        <w:t>La figure 11 présente les classes de la composition et de la correction : participation, copie, incidents et résultats.</w:t>
+      </w:r>
     </w:p>
     <w:p>
       <w:pPr>
@@ -9736,6 +9912,22 @@
     </w:p>
     <w:p>
       <w:pPr>
+        <w:spacing w:line="360" w:lineRule="auto" w:after="160"/>
+        <w:ind w:firstLine="425"/>
+        <w:jc w:val="both"/>
+      </w:pPr>
+      <w:r>
+        <w:rPr>
+          <w:rFonts w:ascii="Times New Roman" w:hAnsi="Times New Roman" w:eastAsia="Times New Roman"/>
+          <w:b w:val="0"/>
+          <w:color w:val="000000"/>
+          <w:sz w:val="24"/>
+        </w:rPr>
+        <w:t>La figure 12 montre un exemple concret d'objets pour l'organisation. Elle aide à comprendre les liens entre établissement, classes et utilisateurs.</w:t>
+      </w:r>
+    </w:p>
+    <w:p>
+      <w:pPr>
         <w:spacing w:after="80" w:line="240" w:lineRule="auto"/>
         <w:jc w:val="center"/>
       </w:pPr>
@@ -9845,6 +10037,22 @@
         <w:t xml:space="preserve"> : Objets conception d'examen</w:t>
       </w:r>
       <w:bookmarkEnd w:id="85"/>
+    </w:p>
+    <w:p>
+      <w:pPr>
+        <w:spacing w:line="360" w:lineRule="auto" w:after="160"/>
+        <w:ind w:firstLine="425"/>
+        <w:jc w:val="both"/>
+      </w:pPr>
+      <w:r>
+        <w:rPr>
+          <w:rFonts w:ascii="Times New Roman" w:hAnsi="Times New Roman" w:eastAsia="Times New Roman"/>
+          <w:b w:val="0"/>
+          <w:color w:val="000000"/>
+          <w:sz w:val="24"/>
+        </w:rPr>
+        <w:t>La figure 13 illustre un examen concret avec ses exercices et ses tests. Elle précise comment les objets se relient au moment de la conception.</w:t>
+      </w:r>
     </w:p>
     <w:p>
       <w:pPr>
@@ -9955,6 +10163,22 @@
     </w:p>
     <w:p>
       <w:pPr>
+        <w:spacing w:line="360" w:lineRule="auto" w:after="160"/>
+        <w:ind w:firstLine="425"/>
+        <w:jc w:val="both"/>
+      </w:pPr>
+      <w:r>
+        <w:rPr>
+          <w:rFonts w:ascii="Times New Roman" w:hAnsi="Times New Roman" w:eastAsia="Times New Roman"/>
+          <w:b w:val="0"/>
+          <w:color w:val="000000"/>
+          <w:sz w:val="24"/>
+        </w:rPr>
+        <w:t>La figure 14 présente un exemple de participation étudiante pendant l'examen, avec la copie, les incidents et les éléments de correction.</w:t>
+      </w:r>
+    </w:p>
+    <w:p>
+      <w:pPr>
         <w:pStyle w:val="Titre2"/>
       </w:pPr>
       <w:bookmarkStart w:id="87" w:name="bm_ch3_5"/>
@@ -10091,6 +10315,22 @@
         <w:t xml:space="preserve"> : Composants vue d'ensemble</w:t>
       </w:r>
       <w:bookmarkEnd w:id="89"/>
+    </w:p>
+    <w:p>
+      <w:pPr>
+        <w:spacing w:line="360" w:lineRule="auto" w:after="160"/>
+        <w:ind w:firstLine="425"/>
+        <w:jc w:val="both"/>
+      </w:pPr>
+      <w:r>
+        <w:rPr>
+          <w:rFonts w:ascii="Times New Roman" w:hAnsi="Times New Roman" w:eastAsia="Times New Roman"/>
+          <w:b w:val="0"/>
+          <w:color w:val="000000"/>
+          <w:sz w:val="24"/>
+        </w:rPr>
+        <w:t>La figure 15 donne une vue d'ensemble des composants logiciels de Cylentic et de la façon dont ils communiquent.</w:t>
+      </w:r>
     </w:p>
     <w:p>
       <w:pPr>
@@ -10207,6 +10447,22 @@
     </w:p>
     <w:p>
       <w:pPr>
+        <w:spacing w:line="360" w:lineRule="auto" w:after="160"/>
+        <w:ind w:firstLine="425"/>
+        <w:jc w:val="both"/>
+      </w:pPr>
+      <w:r>
+        <w:rPr>
+          <w:rFonts w:ascii="Times New Roman" w:hAnsi="Times New Roman" w:eastAsia="Times New Roman"/>
+          <w:b w:val="0"/>
+          <w:color w:val="000000"/>
+          <w:sz w:val="24"/>
+        </w:rPr>
+        <w:t>La figure 16 détaille les composants d'administration et d'authentification. Elle montre comment les rôles et les sessions sont gérés.</w:t>
+      </w:r>
+    </w:p>
+    <w:p>
+      <w:pPr>
         <w:spacing w:after="80" w:line="240" w:lineRule="auto"/>
         <w:jc w:val="center"/>
       </w:pPr>
@@ -10313,6 +10569,22 @@
     </w:p>
     <w:p>
       <w:pPr>
+        <w:spacing w:line="360" w:lineRule="auto" w:after="160"/>
+        <w:ind w:firstLine="425"/>
+        <w:jc w:val="both"/>
+      </w:pPr>
+      <w:r>
+        <w:rPr>
+          <w:rFonts w:ascii="Times New Roman" w:hAnsi="Times New Roman" w:eastAsia="Times New Roman"/>
+          <w:b w:val="0"/>
+          <w:color w:val="000000"/>
+          <w:sz w:val="24"/>
+        </w:rPr>
+        <w:t>La figure 17 présente les composants liés aux examens et à la composition. On y retrouve la préparation de l'épreuve, le parcours étudiant et l'exécution du code.</w:t>
+      </w:r>
+    </w:p>
+    <w:p>
+      <w:pPr>
         <w:ind w:firstLine="425"/>
         <w:jc w:val="both"/>
       </w:pPr>
@@ -10477,6 +10749,22 @@
         <w:t xml:space="preserve"> : États du cycle de vie d'un examen</w:t>
       </w:r>
       <w:bookmarkEnd w:id="96"/>
+    </w:p>
+    <w:p>
+      <w:pPr>
+        <w:spacing w:line="360" w:lineRule="auto" w:after="160"/>
+        <w:ind w:firstLine="425"/>
+        <w:jc w:val="both"/>
+      </w:pPr>
+      <w:r>
+        <w:rPr>
+          <w:rFonts w:ascii="Times New Roman" w:hAnsi="Times New Roman" w:eastAsia="Times New Roman"/>
+          <w:b w:val="0"/>
+          <w:color w:val="000000"/>
+          <w:sz w:val="24"/>
+        </w:rPr>
+        <w:t>La figure 18 montre les états successifs d'un examen, du brouillon jusqu'à la clôture, en passant par la publication et le déroulement de l'épreuve.</w:t>
+      </w:r>
     </w:p>
     <w:p>
       <w:pPr>
@@ -10620,6 +10908,22 @@
     </w:p>
     <w:p>
       <w:pPr>
+        <w:spacing w:line="360" w:lineRule="auto" w:after="160"/>
+        <w:ind w:firstLine="425"/>
+        <w:jc w:val="both"/>
+      </w:pPr>
+      <w:r>
+        <w:rPr>
+          <w:rFonts w:ascii="Times New Roman" w:hAnsi="Times New Roman" w:eastAsia="Times New Roman"/>
+          <w:b w:val="0"/>
+          <w:color w:val="000000"/>
+          <w:sz w:val="24"/>
+        </w:rPr>
+        <w:t>La figure 19 décrit la séquence de connexion. Elle montre les échanges entre l'utilisateur, l'interface et le serveur pour vérifier l'identité et le rôle.</w:t>
+      </w:r>
+    </w:p>
+    <w:p>
+      <w:pPr>
         <w:ind w:firstLine="425"/>
         <w:jc w:val="both"/>
       </w:pPr>
@@ -10751,6 +11055,22 @@
     </w:p>
     <w:p>
       <w:pPr>
+        <w:spacing w:line="360" w:lineRule="auto" w:after="160"/>
+        <w:ind w:firstLine="425"/>
+        <w:jc w:val="both"/>
+      </w:pPr>
+      <w:r>
+        <w:rPr>
+          <w:rFonts w:ascii="Times New Roman" w:hAnsi="Times New Roman" w:eastAsia="Times New Roman"/>
+          <w:b w:val="0"/>
+          <w:color w:val="000000"/>
+          <w:sz w:val="24"/>
+        </w:rPr>
+        <w:t>La figure 20 illustre la publication d'un examen. Elle montre comment le professeur rend l'épreuve accessible et comment le code d'accès est généré.</w:t>
+      </w:r>
+    </w:p>
+    <w:p>
+      <w:pPr>
         <w:ind w:firstLine="425"/>
         <w:jc w:val="both"/>
       </w:pPr>
@@ -10888,6 +11208,22 @@
     </w:p>
     <w:p>
       <w:pPr>
+        <w:spacing w:line="360" w:lineRule="auto" w:after="160"/>
+        <w:ind w:firstLine="425"/>
+        <w:jc w:val="both"/>
+      </w:pPr>
+      <w:r>
+        <w:rPr>
+          <w:rFonts w:ascii="Times New Roman" w:hAnsi="Times New Roman" w:eastAsia="Times New Roman"/>
+          <w:b w:val="0"/>
+          <w:color w:val="000000"/>
+          <w:sz w:val="24"/>
+        </w:rPr>
+        <w:t>La figure 21 présente l'accès de l'étudiant à l'examen : authentification, saisie du code d'accès, consignes, puis entrée en salle d'attente.</w:t>
+      </w:r>
+    </w:p>
+    <w:p>
+      <w:pPr>
         <w:ind w:firstLine="425"/>
         <w:jc w:val="both"/>
       </w:pPr>
@@ -11012,6 +11348,22 @@
     </w:p>
     <w:p>
       <w:pPr>
+        <w:spacing w:line="360" w:lineRule="auto" w:after="160"/>
+        <w:ind w:firstLine="425"/>
+        <w:jc w:val="both"/>
+      </w:pPr>
+      <w:r>
+        <w:rPr>
+          <w:rFonts w:ascii="Times New Roman" w:hAnsi="Times New Roman" w:eastAsia="Times New Roman"/>
+          <w:b w:val="0"/>
+          <w:color w:val="000000"/>
+          <w:sz w:val="24"/>
+        </w:rPr>
+        <w:t>La figure 22 montre l'exécution du code Python dans la sandbox. Le code part du navigateur, est exécuté de façon isolée, puis le résultat revient à l'étudiant.</w:t>
+      </w:r>
+    </w:p>
+    <w:p>
+      <w:pPr>
         <w:ind w:firstLine="425"/>
         <w:jc w:val="both"/>
       </w:pPr>
@@ -11134,6 +11486,22 @@
         <w:t xml:space="preserve"> : Séquence de soumission et correction</w:t>
       </w:r>
       <w:bookmarkEnd w:id="103"/>
+    </w:p>
+    <w:p>
+      <w:pPr>
+        <w:spacing w:line="360" w:lineRule="auto" w:after="160"/>
+        <w:ind w:firstLine="425"/>
+        <w:jc w:val="both"/>
+      </w:pPr>
+      <w:r>
+        <w:rPr>
+          <w:rFonts w:ascii="Times New Roman" w:hAnsi="Times New Roman" w:eastAsia="Times New Roman"/>
+          <w:b w:val="0"/>
+          <w:color w:val="000000"/>
+          <w:sz w:val="24"/>
+        </w:rPr>
+        <w:t>La figure 23 décrit la soumission de la copie et le lancement de la correction automatique à partir des tests unitaires.</w:t>
+      </w:r>
     </w:p>
     <w:p>
       <w:pPr>
@@ -11262,6 +11630,22 @@
     </w:p>
     <w:p>
       <w:pPr>
+        <w:spacing w:line="360" w:lineRule="auto" w:after="160"/>
+        <w:ind w:firstLine="425"/>
+        <w:jc w:val="both"/>
+      </w:pPr>
+      <w:r>
+        <w:rPr>
+          <w:rFonts w:ascii="Times New Roman" w:hAnsi="Times New Roman" w:eastAsia="Times New Roman"/>
+          <w:b w:val="0"/>
+          <w:color w:val="000000"/>
+          <w:sz w:val="24"/>
+        </w:rPr>
+        <w:t>La figure 24 illustre l'enregistrement d'un incident pendant l'examen, par exemple une sortie du plein écran ou un changement d'onglet.</w:t>
+      </w:r>
+    </w:p>
+    <w:p>
+      <w:pPr>
         <w:pStyle w:val="Titre3"/>
       </w:pPr>
       <w:bookmarkStart w:id="105" w:name="3_6_3_Parcours_d_activit__de_l__tudiant"/>
@@ -11402,6 +11786,22 @@
     </w:p>
     <w:p>
       <w:pPr>
+        <w:spacing w:line="360" w:lineRule="auto" w:after="160"/>
+        <w:ind w:firstLine="425"/>
+        <w:jc w:val="both"/>
+      </w:pPr>
+      <w:r>
+        <w:rPr>
+          <w:rFonts w:ascii="Times New Roman" w:hAnsi="Times New Roman" w:eastAsia="Times New Roman"/>
+          <w:b w:val="0"/>
+          <w:color w:val="000000"/>
+          <w:sz w:val="24"/>
+        </w:rPr>
+        <w:t>La figure 25 présente le flux d'activité depuis la connexion jusqu'à la salle d'attente, juste avant le démarrage de l'épreuve.</w:t>
+      </w:r>
+    </w:p>
+    <w:p>
+      <w:pPr>
         <w:spacing w:after="80" w:line="240" w:lineRule="auto"/>
         <w:jc w:val="center"/>
       </w:pPr>
@@ -11512,6 +11912,22 @@
         <w:t xml:space="preserve"> : Activité composition et soumission</w:t>
       </w:r>
       <w:bookmarkEnd w:id="108"/>
+    </w:p>
+    <w:p>
+      <w:pPr>
+        <w:spacing w:line="360" w:lineRule="auto" w:after="160"/>
+        <w:ind w:firstLine="425"/>
+        <w:jc w:val="both"/>
+      </w:pPr>
+      <w:r>
+        <w:rPr>
+          <w:rFonts w:ascii="Times New Roman" w:hAnsi="Times New Roman" w:eastAsia="Times New Roman"/>
+          <w:b w:val="0"/>
+          <w:color w:val="000000"/>
+          <w:sz w:val="24"/>
+        </w:rPr>
+        <w:t>La figure 26 décrit les activités pendant la composition : écriture du code, exécutions d'essai, gestion des incidents, puis soumission finale.</w:t>
+      </w:r>
     </w:p>
     <w:p>
       <w:pPr>
@@ -12452,6 +12868,22 @@
     </w:p>
     <w:p>
       <w:pPr>
+        <w:spacing w:line="360" w:lineRule="auto" w:after="160"/>
+        <w:ind w:firstLine="425"/>
+        <w:jc w:val="both"/>
+      </w:pPr>
+      <w:r>
+        <w:rPr>
+          <w:rFonts w:ascii="Times New Roman" w:hAnsi="Times New Roman" w:eastAsia="Times New Roman"/>
+          <w:b w:val="0"/>
+          <w:color w:val="000000"/>
+          <w:sz w:val="24"/>
+        </w:rPr>
+        <w:t>La figure 27 montre la page de connexion de Cylentic. Selon l'identifiant saisi, l'utilisateur accède à l'espace qui correspond à son rôle.</w:t>
+      </w:r>
+    </w:p>
+    <w:p>
+      <w:pPr>
         <w:ind w:firstLine="425"/>
         <w:jc w:val="both"/>
       </w:pPr>
@@ -12645,6 +13077,22 @@
     </w:p>
     <w:p>
       <w:pPr>
+        <w:spacing w:line="360" w:lineRule="auto" w:after="160"/>
+        <w:ind w:firstLine="425"/>
+        <w:jc w:val="both"/>
+      </w:pPr>
+      <w:r>
+        <w:rPr>
+          <w:rFonts w:ascii="Times New Roman" w:hAnsi="Times New Roman" w:eastAsia="Times New Roman"/>
+          <w:b w:val="0"/>
+          <w:color w:val="000000"/>
+          <w:sz w:val="24"/>
+        </w:rPr>
+        <w:t>La figure 28 présente l'espace de l'administrateur d'établissement. On y gère notamment les classes, les comptes et l'organisation locale.</w:t>
+      </w:r>
+    </w:p>
+    <w:p>
+      <w:pPr>
         <w:ind w:firstLine="425"/>
         <w:jc w:val="both"/>
       </w:pPr>
@@ -12800,6 +13248,22 @@
     </w:p>
     <w:p>
       <w:pPr>
+        <w:spacing w:line="360" w:lineRule="auto" w:after="160"/>
+        <w:ind w:firstLine="425"/>
+        <w:jc w:val="both"/>
+      </w:pPr>
+      <w:r>
+        <w:rPr>
+          <w:rFonts w:ascii="Times New Roman" w:hAnsi="Times New Roman" w:eastAsia="Times New Roman"/>
+          <w:b w:val="0"/>
+          <w:color w:val="000000"/>
+          <w:sz w:val="24"/>
+        </w:rPr>
+        <w:t>La figure 29 illustre l'écran de création et d'édition d'un examen côté professeur, avec les exercices et les paramètres de l'épreuve.</w:t>
+      </w:r>
+    </w:p>
+    <w:p>
+      <w:pPr>
         <w:spacing w:before="240" w:after="240" w:line="240" w:lineRule="auto"/>
         <w:jc w:val="center"/>
         <w:rPr>
@@ -12921,6 +13385,22 @@
     </w:p>
     <w:p>
       <w:pPr>
+        <w:spacing w:line="360" w:lineRule="auto" w:after="160"/>
+        <w:ind w:firstLine="425"/>
+        <w:jc w:val="both"/>
+      </w:pPr>
+      <w:r>
+        <w:rPr>
+          <w:rFonts w:ascii="Times New Roman" w:hAnsi="Times New Roman" w:eastAsia="Times New Roman"/>
+          <w:b w:val="0"/>
+          <w:color w:val="000000"/>
+          <w:sz w:val="24"/>
+        </w:rPr>
+        <w:t>La figure 30 montre l'écran de publication d'un examen et l'affichage du code d'accès à communiquer aux étudiants.</w:t>
+      </w:r>
+    </w:p>
+    <w:p>
+      <w:pPr>
         <w:spacing w:before="240" w:after="240" w:line="240" w:lineRule="auto"/>
         <w:jc w:val="center"/>
         <w:rPr>
@@ -13041,6 +13521,22 @@
     </w:p>
     <w:p>
       <w:pPr>
+        <w:spacing w:line="360" w:lineRule="auto" w:after="160"/>
+        <w:ind w:firstLine="425"/>
+        <w:jc w:val="both"/>
+      </w:pPr>
+      <w:r>
+        <w:rPr>
+          <w:rFonts w:ascii="Times New Roman" w:hAnsi="Times New Roman" w:eastAsia="Times New Roman"/>
+          <w:b w:val="0"/>
+          <w:color w:val="000000"/>
+          <w:sz w:val="24"/>
+        </w:rPr>
+        <w:t>La figure 31 présente le suivi en direct des étudiants pendant l'épreuve : présence, progression et incidents visibles par le professeur.</w:t>
+      </w:r>
+    </w:p>
+    <w:p>
+      <w:pPr>
         <w:spacing w:before="240" w:after="240" w:line="240" w:lineRule="auto"/>
         <w:jc w:val="center"/>
         <w:rPr>
@@ -13161,6 +13657,22 @@
     </w:p>
     <w:p>
       <w:pPr>
+        <w:spacing w:line="360" w:lineRule="auto" w:after="160"/>
+        <w:ind w:firstLine="425"/>
+        <w:jc w:val="both"/>
+      </w:pPr>
+      <w:r>
+        <w:rPr>
+          <w:rFonts w:ascii="Times New Roman" w:hAnsi="Times New Roman" w:eastAsia="Times New Roman"/>
+          <w:b w:val="0"/>
+          <w:color w:val="000000"/>
+          <w:sz w:val="24"/>
+        </w:rPr>
+        <w:t>La figure 32 illustre la consultation des résultats et les exports disponibles pour le professeur après l'examen.</w:t>
+      </w:r>
+    </w:p>
+    <w:p>
+      <w:pPr>
         <w:ind w:firstLine="425"/>
         <w:jc w:val="both"/>
       </w:pPr>
@@ -13313,6 +13825,22 @@
     </w:p>
     <w:p>
       <w:pPr>
+        <w:spacing w:line="360" w:lineRule="auto" w:after="160"/>
+        <w:ind w:firstLine="425"/>
+        <w:jc w:val="both"/>
+      </w:pPr>
+      <w:r>
+        <w:rPr>
+          <w:rFonts w:ascii="Times New Roman" w:hAnsi="Times New Roman" w:eastAsia="Times New Roman"/>
+          <w:b w:val="0"/>
+          <w:color w:val="000000"/>
+          <w:sz w:val="24"/>
+        </w:rPr>
+        <w:t>La figure 33 montre les consignes de sécurité côté étudiant et l'étape d'activation du plein écran avant de composer.</w:t>
+      </w:r>
+    </w:p>
+    <w:p>
+      <w:pPr>
         <w:spacing w:before="240" w:after="240" w:line="240" w:lineRule="auto"/>
         <w:jc w:val="center"/>
       </w:pPr>
@@ -13425,6 +13953,22 @@
     </w:p>
     <w:p>
       <w:pPr>
+        <w:spacing w:line="360" w:lineRule="auto" w:after="160"/>
+        <w:ind w:firstLine="425"/>
+        <w:jc w:val="both"/>
+      </w:pPr>
+      <w:r>
+        <w:rPr>
+          <w:rFonts w:ascii="Times New Roman" w:hAnsi="Times New Roman" w:eastAsia="Times New Roman"/>
+          <w:b w:val="0"/>
+          <w:color w:val="000000"/>
+          <w:sz w:val="24"/>
+        </w:rPr>
+        <w:t>La figure 34 présente la salle d'attente. L'étudiant y reste connecté jusqu'à l'heure de début fixée pour l'épreuve.</w:t>
+      </w:r>
+    </w:p>
+    <w:p>
+      <w:pPr>
         <w:ind w:firstLine="425"/>
         <w:jc w:val="both"/>
       </w:pPr>
@@ -13550,6 +14094,22 @@
     </w:p>
     <w:p>
       <w:pPr>
+        <w:spacing w:line="360" w:lineRule="auto" w:after="160"/>
+        <w:ind w:firstLine="425"/>
+        <w:jc w:val="both"/>
+      </w:pPr>
+      <w:r>
+        <w:rPr>
+          <w:rFonts w:ascii="Times New Roman" w:hAnsi="Times New Roman" w:eastAsia="Times New Roman"/>
+          <w:b w:val="0"/>
+          <w:color w:val="000000"/>
+          <w:sz w:val="24"/>
+        </w:rPr>
+        <w:t>La figure 35 illustre l'environnement de composition pendant l'examen : énoncé, éditeur de code, exécution d'essai et zone de soumission.</w:t>
+      </w:r>
+    </w:p>
+    <w:p>
+      <w:pPr>
         <w:ind w:firstLine="425"/>
         <w:jc w:val="both"/>
       </w:pPr>
@@ -13748,6 +14308,22 @@
         <w:t xml:space="preserve"> : Page d'accueil Cylentic</w:t>
       </w:r>
       <w:bookmarkEnd w:id="151"/>
+    </w:p>
+    <w:p>
+      <w:pPr>
+        <w:spacing w:line="360" w:lineRule="auto" w:after="160"/>
+        <w:ind w:firstLine="425"/>
+        <w:jc w:val="both"/>
+      </w:pPr>
+      <w:r>
+        <w:rPr>
+          <w:rFonts w:ascii="Times New Roman" w:hAnsi="Times New Roman" w:eastAsia="Times New Roman"/>
+          <w:b w:val="0"/>
+          <w:color w:val="000000"/>
+          <w:sz w:val="24"/>
+        </w:rPr>
+        <w:t>La figure 36 montre la page d'accueil publique de Cylentic, point d'entrée avant la connexion aux espaces privés.</w:t>
+      </w:r>
     </w:p>
     <w:p>
       <w:pPr>

</xml_diff>

<commit_message>
Corriger mise en page, liste des tableaux et commentaires de figures
- Remerciements à nouveau sur une page dédiée
- Nettoyage des pages vides entre sommaire et sigles
- Tableau 1 en légende Caption + liste des tableaux reconstruite
- Listes figures/tableaux sans liens bleus (uniformes)
- Commentaires de figures enrichis (style YANOGO)

Co-authored-by: progirix <progirix@users.noreply.github.com>
</commit_message>
<xml_diff>
--- a/docs/Rapport_Cylentic.docx
+++ b/docs/Rapport_Cylentic.docx
@@ -958,6 +958,11 @@
       <w:r/>
     </w:p>
     <w:p>
+      <w:r>
+        <w:br w:type="page"/>
+      </w:r>
+    </w:p>
+    <w:p>
       <w:pPr>
         <w:pStyle w:val="Titre1"/>
       </w:pPr>
@@ -2348,15 +2353,6 @@
     </w:p>
     <w:p>
       <w:r>
-        <w:rPr>
-          <w:i/>
-          <w:color w:val="000000"/>
-        </w:rPr>
-        <w:fldChar w:fldCharType="end"/>
-      </w:r>
-    </w:p>
-    <w:p>
-      <w:r>
         <w:br w:type="page"/>
       </w:r>
     </w:p>
@@ -2844,2589 +2840,18 @@
     <w:p>
       <w:pPr>
         <w:pStyle w:val="Tabledesillustrations"/>
-        <w:tabs>
-          <w:tab w:val="right" w:leader="dot" w:pos="8495"/>
-        </w:tabs>
-        <w:rPr>
-          <w:rFonts w:asciiTheme="minorHAnsi" w:eastAsiaTheme="minorEastAsia" w:hAnsiTheme="minorHAnsi"/>
-          <w:noProof/>
-          <w:sz w:val="22"/>
-          <w:lang w:val="fr-BF" w:eastAsia="fr-BF"/>
-        </w:rPr>
-      </w:pPr>
-      <w:r>
-        <w:rPr>
-          <w:i/>
-          <w:color w:val="000000"/>
+      </w:pPr>
+      <w:r>
+        <w:rPr>
+          <w:rFonts w:ascii="Times New Roman" w:hAnsi="Times New Roman" w:eastAsia="Times New Roman"/>
+          <w:b w:val="0"/>
+          <w:color w:val="000000"/>
+          <w:sz w:val="24"/>
         </w:rPr>
         <w:fldChar w:fldCharType="begin"/>
-      </w:r>
-      <w:r>
-        <w:rPr>
-          <w:i/>
-          <w:color w:val="000000"/>
-        </w:rPr>
-        <w:instrText>TOC \h \z \c "Figure"</w:instrText>
-      </w:r>
-      <w:r>
-        <w:rPr>
-          <w:i/>
-          <w:color w:val="000000"/>
-        </w:rPr>
+        <w:instrText xml:space="preserve">TOC \z \c "Figure"</w:instrText>
         <w:fldChar w:fldCharType="separate"/>
-      </w:r>
-      <w:hyperlink w:anchor="_Toc235117297" w:history="1">
-        <w:r>
-          <w:rPr>
-            <w:rStyle w:val="Lienhypertexte"/>
-            <w:noProof/>
-          </w:rPr>
-          <w:t>Figure 1 : Architecture logique de Cylentic</w:t>
-        </w:r>
-        <w:r>
-          <w:rPr>
-            <w:noProof/>
-            <w:webHidden/>
-          </w:rPr>
-          <w:tab/>
-        </w:r>
-        <w:r>
-          <w:rPr>
-            <w:noProof/>
-            <w:webHidden/>
-          </w:rPr>
-          <w:fldChar w:fldCharType="begin"/>
-        </w:r>
-        <w:r>
-          <w:rPr>
-            <w:noProof/>
-            <w:webHidden/>
-          </w:rPr>
-          <w:instrText xml:space="preserve"> PAGEREF _Toc235117297 \h </w:instrText>
-        </w:r>
-        <w:r>
-          <w:rPr>
-            <w:noProof/>
-            <w:webHidden/>
-          </w:rPr>
-        </w:r>
-        <w:r>
-          <w:rPr>
-            <w:noProof/>
-            <w:webHidden/>
-          </w:rPr>
-          <w:fldChar w:fldCharType="separate"/>
-        </w:r>
-        <w:r>
-          <w:rPr>
-            <w:noProof/>
-            <w:webHidden/>
-          </w:rPr>
-          <w:t>11</w:t>
-        </w:r>
-        <w:r>
-          <w:rPr>
-            <w:noProof/>
-            <w:webHidden/>
-          </w:rPr>
-          <w:fldChar w:fldCharType="end"/>
-        </w:r>
-      </w:hyperlink>
-    </w:p>
-    <w:p>
-      <w:pPr>
-        <w:pStyle w:val="Tabledesillustrations"/>
-        <w:tabs>
-          <w:tab w:val="right" w:leader="dot" w:pos="8495"/>
-        </w:tabs>
-        <w:rPr>
-          <w:rFonts w:asciiTheme="minorHAnsi" w:eastAsiaTheme="minorEastAsia" w:hAnsiTheme="minorHAnsi"/>
-          <w:noProof/>
-          <w:sz w:val="22"/>
-          <w:lang w:val="fr-BF" w:eastAsia="fr-BF"/>
-        </w:rPr>
-      </w:pPr>
-      <w:hyperlink w:anchor="_Toc235117298" w:history="1">
-        <w:r>
-          <w:rPr>
-            <w:rStyle w:val="Lienhypertexte"/>
-            <w:noProof/>
-          </w:rPr>
-          <w:t>Figure 2 : Déploiement de l'infrastructure</w:t>
-        </w:r>
-        <w:r>
-          <w:rPr>
-            <w:noProof/>
-            <w:webHidden/>
-          </w:rPr>
-          <w:tab/>
-        </w:r>
-        <w:r>
-          <w:rPr>
-            <w:noProof/>
-            <w:webHidden/>
-          </w:rPr>
-          <w:fldChar w:fldCharType="begin"/>
-        </w:r>
-        <w:r>
-          <w:rPr>
-            <w:noProof/>
-            <w:webHidden/>
-          </w:rPr>
-          <w:instrText xml:space="preserve"> PAGEREF _Toc235117298 \h </w:instrText>
-        </w:r>
-        <w:r>
-          <w:rPr>
-            <w:noProof/>
-            <w:webHidden/>
-          </w:rPr>
-        </w:r>
-        <w:r>
-          <w:rPr>
-            <w:noProof/>
-            <w:webHidden/>
-          </w:rPr>
-          <w:fldChar w:fldCharType="separate"/>
-        </w:r>
-        <w:r>
-          <w:rPr>
-            <w:noProof/>
-            <w:webHidden/>
-          </w:rPr>
-          <w:t>12</w:t>
-        </w:r>
-        <w:r>
-          <w:rPr>
-            <w:noProof/>
-            <w:webHidden/>
-          </w:rPr>
-          <w:fldChar w:fldCharType="end"/>
-        </w:r>
-      </w:hyperlink>
-    </w:p>
-    <w:p>
-      <w:pPr>
-        <w:pStyle w:val="Tabledesillustrations"/>
-        <w:tabs>
-          <w:tab w:val="right" w:leader="dot" w:pos="8495"/>
-        </w:tabs>
-        <w:rPr>
-          <w:rFonts w:asciiTheme="minorHAnsi" w:eastAsiaTheme="minorEastAsia" w:hAnsiTheme="minorHAnsi"/>
-          <w:noProof/>
-          <w:sz w:val="22"/>
-          <w:lang w:val="fr-BF" w:eastAsia="fr-BF"/>
-        </w:rPr>
-      </w:pPr>
-      <w:hyperlink w:anchor="_Toc235117299" w:history="1">
-        <w:r>
-          <w:rPr>
-            <w:rStyle w:val="Lienhypertexte"/>
-            <w:noProof/>
-          </w:rPr>
-          <w:t>Figure 3 : Cas d'utilisation du Super Admin</w:t>
-        </w:r>
-        <w:r>
-          <w:rPr>
-            <w:noProof/>
-            <w:webHidden/>
-          </w:rPr>
-          <w:tab/>
-        </w:r>
-        <w:r>
-          <w:rPr>
-            <w:noProof/>
-            <w:webHidden/>
-          </w:rPr>
-          <w:fldChar w:fldCharType="begin"/>
-        </w:r>
-        <w:r>
-          <w:rPr>
-            <w:noProof/>
-            <w:webHidden/>
-          </w:rPr>
-          <w:instrText xml:space="preserve"> PAGEREF _Toc235117299 \h </w:instrText>
-        </w:r>
-        <w:r>
-          <w:rPr>
-            <w:noProof/>
-            <w:webHidden/>
-          </w:rPr>
-        </w:r>
-        <w:r>
-          <w:rPr>
-            <w:noProof/>
-            <w:webHidden/>
-          </w:rPr>
-          <w:fldChar w:fldCharType="separate"/>
-        </w:r>
-        <w:r>
-          <w:rPr>
-            <w:noProof/>
-            <w:webHidden/>
-          </w:rPr>
-          <w:t>13</w:t>
-        </w:r>
-        <w:r>
-          <w:rPr>
-            <w:noProof/>
-            <w:webHidden/>
-          </w:rPr>
-          <w:fldChar w:fldCharType="end"/>
-        </w:r>
-      </w:hyperlink>
-    </w:p>
-    <w:p>
-      <w:pPr>
-        <w:pStyle w:val="Tabledesillustrations"/>
-        <w:tabs>
-          <w:tab w:val="right" w:leader="dot" w:pos="8495"/>
-        </w:tabs>
-        <w:rPr>
-          <w:rFonts w:asciiTheme="minorHAnsi" w:eastAsiaTheme="minorEastAsia" w:hAnsiTheme="minorHAnsi"/>
-          <w:noProof/>
-          <w:sz w:val="22"/>
-          <w:lang w:val="fr-BF" w:eastAsia="fr-BF"/>
-        </w:rPr>
-      </w:pPr>
-      <w:hyperlink w:anchor="_Toc235117300" w:history="1">
-        <w:r>
-          <w:rPr>
-            <w:rStyle w:val="Lienhypertexte"/>
-            <w:noProof/>
-          </w:rPr>
-          <w:t>Figure 4 : Cas d'utilisation de l'administrateur (organisation)</w:t>
-        </w:r>
-        <w:r>
-          <w:rPr>
-            <w:noProof/>
-            <w:webHidden/>
-          </w:rPr>
-          <w:tab/>
-        </w:r>
-        <w:r>
-          <w:rPr>
-            <w:noProof/>
-            <w:webHidden/>
-          </w:rPr>
-          <w:fldChar w:fldCharType="begin"/>
-        </w:r>
-        <w:r>
-          <w:rPr>
-            <w:noProof/>
-            <w:webHidden/>
-          </w:rPr>
-          <w:instrText xml:space="preserve"> PAGEREF _Toc235117300 \h </w:instrText>
-        </w:r>
-        <w:r>
-          <w:rPr>
-            <w:noProof/>
-            <w:webHidden/>
-          </w:rPr>
-        </w:r>
-        <w:r>
-          <w:rPr>
-            <w:noProof/>
-            <w:webHidden/>
-          </w:rPr>
-          <w:fldChar w:fldCharType="separate"/>
-        </w:r>
-        <w:r>
-          <w:rPr>
-            <w:noProof/>
-            <w:webHidden/>
-          </w:rPr>
-          <w:t>14</w:t>
-        </w:r>
-        <w:r>
-          <w:rPr>
-            <w:noProof/>
-            <w:webHidden/>
-          </w:rPr>
-          <w:fldChar w:fldCharType="end"/>
-        </w:r>
-      </w:hyperlink>
-    </w:p>
-    <w:p>
-      <w:pPr>
-        <w:pStyle w:val="Tabledesillustrations"/>
-        <w:tabs>
-          <w:tab w:val="right" w:leader="dot" w:pos="8495"/>
-        </w:tabs>
-        <w:rPr>
-          <w:rFonts w:asciiTheme="minorHAnsi" w:eastAsiaTheme="minorEastAsia" w:hAnsiTheme="minorHAnsi"/>
-          <w:noProof/>
-          <w:sz w:val="22"/>
-          <w:lang w:val="fr-BF" w:eastAsia="fr-BF"/>
-        </w:rPr>
-      </w:pPr>
-      <w:hyperlink w:anchor="_Toc235117301" w:history="1">
-        <w:r>
-          <w:rPr>
-            <w:rStyle w:val="Lienhypertexte"/>
-            <w:noProof/>
-          </w:rPr>
-          <w:t>Figure 5 : Cas d'utilisation de l'administrateur (comptes)</w:t>
-        </w:r>
-        <w:r>
-          <w:rPr>
-            <w:noProof/>
-            <w:webHidden/>
-          </w:rPr>
-          <w:tab/>
-        </w:r>
-        <w:r>
-          <w:rPr>
-            <w:noProof/>
-            <w:webHidden/>
-          </w:rPr>
-          <w:fldChar w:fldCharType="begin"/>
-        </w:r>
-        <w:r>
-          <w:rPr>
-            <w:noProof/>
-            <w:webHidden/>
-          </w:rPr>
-          <w:instrText xml:space="preserve"> PAGEREF _Toc235117301 \h </w:instrText>
-        </w:r>
-        <w:r>
-          <w:rPr>
-            <w:noProof/>
-            <w:webHidden/>
-          </w:rPr>
-        </w:r>
-        <w:r>
-          <w:rPr>
-            <w:noProof/>
-            <w:webHidden/>
-          </w:rPr>
-          <w:fldChar w:fldCharType="separate"/>
-        </w:r>
-        <w:r>
-          <w:rPr>
-            <w:noProof/>
-            <w:webHidden/>
-          </w:rPr>
-          <w:t>15</w:t>
-        </w:r>
-        <w:r>
-          <w:rPr>
-            <w:noProof/>
-            <w:webHidden/>
-          </w:rPr>
-          <w:fldChar w:fldCharType="end"/>
-        </w:r>
-      </w:hyperlink>
-    </w:p>
-    <w:p>
-      <w:pPr>
-        <w:pStyle w:val="Tabledesillustrations"/>
-        <w:tabs>
-          <w:tab w:val="right" w:leader="dot" w:pos="8495"/>
-        </w:tabs>
-        <w:rPr>
-          <w:rFonts w:asciiTheme="minorHAnsi" w:eastAsiaTheme="minorEastAsia" w:hAnsiTheme="minorHAnsi"/>
-          <w:noProof/>
-          <w:sz w:val="22"/>
-          <w:lang w:val="fr-BF" w:eastAsia="fr-BF"/>
-        </w:rPr>
-      </w:pPr>
-      <w:hyperlink w:anchor="_Toc235117302" w:history="1">
-        <w:r>
-          <w:rPr>
-            <w:rStyle w:val="Lienhypertexte"/>
-            <w:noProof/>
-          </w:rPr>
-          <w:t>Figure 6 : Cas d'utilisation du professeur (examens)</w:t>
-        </w:r>
-        <w:r>
-          <w:rPr>
-            <w:noProof/>
-            <w:webHidden/>
-          </w:rPr>
-          <w:tab/>
-        </w:r>
-        <w:r>
-          <w:rPr>
-            <w:noProof/>
-            <w:webHidden/>
-          </w:rPr>
-          <w:fldChar w:fldCharType="begin"/>
-        </w:r>
-        <w:r>
-          <w:rPr>
-            <w:noProof/>
-            <w:webHidden/>
-          </w:rPr>
-          <w:instrText xml:space="preserve"> PAGEREF _Toc235117302 \h </w:instrText>
-        </w:r>
-        <w:r>
-          <w:rPr>
-            <w:noProof/>
-            <w:webHidden/>
-          </w:rPr>
-        </w:r>
-        <w:r>
-          <w:rPr>
-            <w:noProof/>
-            <w:webHidden/>
-          </w:rPr>
-          <w:fldChar w:fldCharType="separate"/>
-        </w:r>
-        <w:r>
-          <w:rPr>
-            <w:noProof/>
-            <w:webHidden/>
-          </w:rPr>
-          <w:t>16</w:t>
-        </w:r>
-        <w:r>
-          <w:rPr>
-            <w:noProof/>
-            <w:webHidden/>
-          </w:rPr>
-          <w:fldChar w:fldCharType="end"/>
-        </w:r>
-      </w:hyperlink>
-    </w:p>
-    <w:p>
-      <w:pPr>
-        <w:pStyle w:val="Tabledesillustrations"/>
-        <w:tabs>
-          <w:tab w:val="right" w:leader="dot" w:pos="8495"/>
-        </w:tabs>
-        <w:rPr>
-          <w:rFonts w:asciiTheme="minorHAnsi" w:eastAsiaTheme="minorEastAsia" w:hAnsiTheme="minorHAnsi"/>
-          <w:noProof/>
-          <w:sz w:val="22"/>
-          <w:lang w:val="fr-BF" w:eastAsia="fr-BF"/>
-        </w:rPr>
-      </w:pPr>
-      <w:hyperlink w:anchor="_Toc235117303" w:history="1">
-        <w:r>
-          <w:rPr>
-            <w:rStyle w:val="Lienhypertexte"/>
-            <w:noProof/>
-          </w:rPr>
-          <w:t>Figure 7 : Cas d'utilisation du professeur (suivi)</w:t>
-        </w:r>
-        <w:r>
-          <w:rPr>
-            <w:noProof/>
-            <w:webHidden/>
-          </w:rPr>
-          <w:tab/>
-        </w:r>
-        <w:r>
-          <w:rPr>
-            <w:noProof/>
-            <w:webHidden/>
-          </w:rPr>
-          <w:fldChar w:fldCharType="begin"/>
-        </w:r>
-        <w:r>
-          <w:rPr>
-            <w:noProof/>
-            <w:webHidden/>
-          </w:rPr>
-          <w:instrText xml:space="preserve"> PAGEREF _Toc235117303 \h </w:instrText>
-        </w:r>
-        <w:r>
-          <w:rPr>
-            <w:noProof/>
-            <w:webHidden/>
-          </w:rPr>
-        </w:r>
-        <w:r>
-          <w:rPr>
-            <w:noProof/>
-            <w:webHidden/>
-          </w:rPr>
-          <w:fldChar w:fldCharType="separate"/>
-        </w:r>
-        <w:r>
-          <w:rPr>
-            <w:noProof/>
-            <w:webHidden/>
-          </w:rPr>
-          <w:t>17</w:t>
-        </w:r>
-        <w:r>
-          <w:rPr>
-            <w:noProof/>
-            <w:webHidden/>
-          </w:rPr>
-          <w:fldChar w:fldCharType="end"/>
-        </w:r>
-      </w:hyperlink>
-    </w:p>
-    <w:p>
-      <w:pPr>
-        <w:pStyle w:val="Tabledesillustrations"/>
-        <w:tabs>
-          <w:tab w:val="right" w:leader="dot" w:pos="8495"/>
-        </w:tabs>
-        <w:rPr>
-          <w:rFonts w:asciiTheme="minorHAnsi" w:eastAsiaTheme="minorEastAsia" w:hAnsiTheme="minorHAnsi"/>
-          <w:noProof/>
-          <w:sz w:val="22"/>
-          <w:lang w:val="fr-BF" w:eastAsia="fr-BF"/>
-        </w:rPr>
-      </w:pPr>
-      <w:hyperlink w:anchor="_Toc235117304" w:history="1">
-        <w:r>
-          <w:rPr>
-            <w:rStyle w:val="Lienhypertexte"/>
-            <w:noProof/>
-          </w:rPr>
-          <w:t>Figure 8 : Cas d'utilisation de l'étudiant</w:t>
-        </w:r>
-        <w:r>
-          <w:rPr>
-            <w:noProof/>
-            <w:webHidden/>
-          </w:rPr>
-          <w:tab/>
-        </w:r>
-        <w:r>
-          <w:rPr>
-            <w:noProof/>
-            <w:webHidden/>
-          </w:rPr>
-          <w:fldChar w:fldCharType="begin"/>
-        </w:r>
-        <w:r>
-          <w:rPr>
-            <w:noProof/>
-            <w:webHidden/>
-          </w:rPr>
-          <w:instrText xml:space="preserve"> PAGEREF _Toc235117304 \h </w:instrText>
-        </w:r>
-        <w:r>
-          <w:rPr>
-            <w:noProof/>
-            <w:webHidden/>
-          </w:rPr>
-        </w:r>
-        <w:r>
-          <w:rPr>
-            <w:noProof/>
-            <w:webHidden/>
-          </w:rPr>
-          <w:fldChar w:fldCharType="separate"/>
-        </w:r>
-        <w:r>
-          <w:rPr>
-            <w:noProof/>
-            <w:webHidden/>
-          </w:rPr>
-          <w:t>18</w:t>
-        </w:r>
-        <w:r>
-          <w:rPr>
-            <w:noProof/>
-            <w:webHidden/>
-          </w:rPr>
-          <w:fldChar w:fldCharType="end"/>
-        </w:r>
-      </w:hyperlink>
-    </w:p>
-    <w:p>
-      <w:pPr>
-        <w:pStyle w:val="Tabledesillustrations"/>
-        <w:tabs>
-          <w:tab w:val="right" w:leader="dot" w:pos="8495"/>
-        </w:tabs>
-        <w:rPr>
-          <w:rFonts w:asciiTheme="minorHAnsi" w:eastAsiaTheme="minorEastAsia" w:hAnsiTheme="minorHAnsi"/>
-          <w:noProof/>
-          <w:sz w:val="22"/>
-          <w:lang w:val="fr-BF" w:eastAsia="fr-BF"/>
-        </w:rPr>
-      </w:pPr>
-      <w:hyperlink w:anchor="_Toc235117305" w:history="1">
-        <w:r>
-          <w:rPr>
-            <w:rStyle w:val="Lienhypertexte"/>
-            <w:noProof/>
-          </w:rPr>
-          <w:t>Figure 9 : Classes organisation et comptes</w:t>
-        </w:r>
-        <w:r>
-          <w:rPr>
-            <w:noProof/>
-            <w:webHidden/>
-          </w:rPr>
-          <w:tab/>
-        </w:r>
-        <w:r>
-          <w:rPr>
-            <w:noProof/>
-            <w:webHidden/>
-          </w:rPr>
-          <w:fldChar w:fldCharType="begin"/>
-        </w:r>
-        <w:r>
-          <w:rPr>
-            <w:noProof/>
-            <w:webHidden/>
-          </w:rPr>
-          <w:instrText xml:space="preserve"> PAGEREF _Toc235117305 \h </w:instrText>
-        </w:r>
-        <w:r>
-          <w:rPr>
-            <w:noProof/>
-            <w:webHidden/>
-          </w:rPr>
-        </w:r>
-        <w:r>
-          <w:rPr>
-            <w:noProof/>
-            <w:webHidden/>
-          </w:rPr>
-          <w:fldChar w:fldCharType="separate"/>
-        </w:r>
-        <w:r>
-          <w:rPr>
-            <w:noProof/>
-            <w:webHidden/>
-          </w:rPr>
-          <w:t>19</w:t>
-        </w:r>
-        <w:r>
-          <w:rPr>
-            <w:noProof/>
-            <w:webHidden/>
-          </w:rPr>
-          <w:fldChar w:fldCharType="end"/>
-        </w:r>
-      </w:hyperlink>
-    </w:p>
-    <w:p>
-      <w:pPr>
-        <w:pStyle w:val="Tabledesillustrations"/>
-        <w:tabs>
-          <w:tab w:val="right" w:leader="dot" w:pos="8495"/>
-        </w:tabs>
-        <w:rPr>
-          <w:rFonts w:asciiTheme="minorHAnsi" w:eastAsiaTheme="minorEastAsia" w:hAnsiTheme="minorHAnsi"/>
-          <w:noProof/>
-          <w:sz w:val="22"/>
-          <w:lang w:val="fr-BF" w:eastAsia="fr-BF"/>
-        </w:rPr>
-      </w:pPr>
-      <w:hyperlink w:anchor="_Toc235117306" w:history="1">
-        <w:r>
-          <w:rPr>
-            <w:rStyle w:val="Lienhypertexte"/>
-            <w:noProof/>
-          </w:rPr>
-          <w:t>Figure 10 : Classes conception d'examen</w:t>
-        </w:r>
-        <w:r>
-          <w:rPr>
-            <w:noProof/>
-            <w:webHidden/>
-          </w:rPr>
-          <w:tab/>
-        </w:r>
-        <w:r>
-          <w:rPr>
-            <w:noProof/>
-            <w:webHidden/>
-          </w:rPr>
-          <w:fldChar w:fldCharType="begin"/>
-        </w:r>
-        <w:r>
-          <w:rPr>
-            <w:noProof/>
-            <w:webHidden/>
-          </w:rPr>
-          <w:instrText xml:space="preserve"> PAGEREF _Toc235117306 \h </w:instrText>
-        </w:r>
-        <w:r>
-          <w:rPr>
-            <w:noProof/>
-            <w:webHidden/>
-          </w:rPr>
-        </w:r>
-        <w:r>
-          <w:rPr>
-            <w:noProof/>
-            <w:webHidden/>
-          </w:rPr>
-          <w:fldChar w:fldCharType="separate"/>
-        </w:r>
-        <w:r>
-          <w:rPr>
-            <w:noProof/>
-            <w:webHidden/>
-          </w:rPr>
-          <w:t>20</w:t>
-        </w:r>
-        <w:r>
-          <w:rPr>
-            <w:noProof/>
-            <w:webHidden/>
-          </w:rPr>
-          <w:fldChar w:fldCharType="end"/>
-        </w:r>
-      </w:hyperlink>
-    </w:p>
-    <w:p>
-      <w:pPr>
-        <w:pStyle w:val="Tabledesillustrations"/>
-        <w:tabs>
-          <w:tab w:val="right" w:leader="dot" w:pos="8495"/>
-        </w:tabs>
-        <w:rPr>
-          <w:rFonts w:asciiTheme="minorHAnsi" w:eastAsiaTheme="minorEastAsia" w:hAnsiTheme="minorHAnsi"/>
-          <w:noProof/>
-          <w:sz w:val="22"/>
-          <w:lang w:val="fr-BF" w:eastAsia="fr-BF"/>
-        </w:rPr>
-      </w:pPr>
-      <w:hyperlink w:anchor="_Toc235117307" w:history="1">
-        <w:r>
-          <w:rPr>
-            <w:rStyle w:val="Lienhypertexte"/>
-            <w:noProof/>
-          </w:rPr>
-          <w:t>Figure 11 : Classes composition et correction</w:t>
-        </w:r>
-        <w:r>
-          <w:rPr>
-            <w:noProof/>
-            <w:webHidden/>
-          </w:rPr>
-          <w:tab/>
-        </w:r>
-        <w:r>
-          <w:rPr>
-            <w:noProof/>
-            <w:webHidden/>
-          </w:rPr>
-          <w:fldChar w:fldCharType="begin"/>
-        </w:r>
-        <w:r>
-          <w:rPr>
-            <w:noProof/>
-            <w:webHidden/>
-          </w:rPr>
-          <w:instrText xml:space="preserve"> PAGEREF _Toc235117307 \h </w:instrText>
-        </w:r>
-        <w:r>
-          <w:rPr>
-            <w:noProof/>
-            <w:webHidden/>
-          </w:rPr>
-        </w:r>
-        <w:r>
-          <w:rPr>
-            <w:noProof/>
-            <w:webHidden/>
-          </w:rPr>
-          <w:fldChar w:fldCharType="separate"/>
-        </w:r>
-        <w:r>
-          <w:rPr>
-            <w:noProof/>
-            <w:webHidden/>
-          </w:rPr>
-          <w:t/>
-        </w:r>
-        <w:r>
-          <w:rPr>
-            <w:noProof/>
-            <w:webHidden/>
-          </w:rPr>
-          <w:fldChar w:fldCharType="end"/>
-        </w:r>
-      </w:hyperlink>
-      <w:r/>
-    </w:p>
-    <w:p>
-      <w:pPr>
-        <w:pStyle w:val="Tabledesillustrations"/>
-        <w:tabs>
-          <w:tab w:val="right" w:leader="dot" w:pos="8495"/>
-        </w:tabs>
-        <w:rPr>
-          <w:rFonts w:asciiTheme="minorHAnsi" w:eastAsiaTheme="minorEastAsia" w:hAnsiTheme="minorHAnsi"/>
-          <w:noProof/>
-          <w:sz w:val="22"/>
-          <w:lang w:val="fr-BF" w:eastAsia="fr-BF"/>
-        </w:rPr>
-      </w:pPr>
-      <w:hyperlink w:anchor="_Toc235117308" w:history="1">
-        <w:r>
-          <w:rPr>
-            <w:rStyle w:val="Lienhypertexte"/>
-            <w:noProof/>
-          </w:rPr>
-          <w:t>Figure 12 : Objets organisation</w:t>
-        </w:r>
-        <w:r>
-          <w:rPr>
-            <w:noProof/>
-            <w:webHidden/>
-          </w:rPr>
-          <w:tab/>
-        </w:r>
-        <w:r>
-          <w:rPr>
-            <w:noProof/>
-            <w:webHidden/>
-          </w:rPr>
-          <w:fldChar w:fldCharType="begin"/>
-        </w:r>
-        <w:r>
-          <w:rPr>
-            <w:noProof/>
-            <w:webHidden/>
-          </w:rPr>
-          <w:instrText xml:space="preserve"> PAGEREF _Toc235117308 \h </w:instrText>
-        </w:r>
-        <w:r>
-          <w:rPr>
-            <w:noProof/>
-            <w:webHidden/>
-          </w:rPr>
-        </w:r>
-        <w:r>
-          <w:rPr>
-            <w:noProof/>
-            <w:webHidden/>
-          </w:rPr>
-          <w:fldChar w:fldCharType="separate"/>
-        </w:r>
-        <w:r>
-          <w:rPr>
-            <w:noProof/>
-            <w:webHidden/>
-          </w:rPr>
-          <w:t>21</w:t>
-        </w:r>
-        <w:r>
-          <w:rPr>
-            <w:noProof/>
-            <w:webHidden/>
-          </w:rPr>
-          <w:fldChar w:fldCharType="end"/>
-        </w:r>
-      </w:hyperlink>
-    </w:p>
-    <w:p>
-      <w:pPr>
-        <w:pStyle w:val="Tabledesillustrations"/>
-        <w:tabs>
-          <w:tab w:val="right" w:leader="dot" w:pos="8495"/>
-        </w:tabs>
-        <w:rPr>
-          <w:rFonts w:asciiTheme="minorHAnsi" w:eastAsiaTheme="minorEastAsia" w:hAnsiTheme="minorHAnsi"/>
-          <w:noProof/>
-          <w:sz w:val="22"/>
-          <w:lang w:val="fr-BF" w:eastAsia="fr-BF"/>
-        </w:rPr>
-      </w:pPr>
-      <w:hyperlink w:anchor="_Toc235117309" w:history="1">
-        <w:r>
-          <w:rPr>
-            <w:rStyle w:val="Lienhypertexte"/>
-            <w:noProof/>
-          </w:rPr>
-          <w:t>Figure 13 : Objets conception d'examen</w:t>
-        </w:r>
-        <w:r>
-          <w:rPr>
-            <w:noProof/>
-            <w:webHidden/>
-          </w:rPr>
-          <w:tab/>
-        </w:r>
-        <w:r>
-          <w:rPr>
-            <w:noProof/>
-            <w:webHidden/>
-          </w:rPr>
-          <w:fldChar w:fldCharType="begin"/>
-        </w:r>
-        <w:r>
-          <w:rPr>
-            <w:noProof/>
-            <w:webHidden/>
-          </w:rPr>
-          <w:instrText xml:space="preserve"> PAGEREF _Toc235117309 \h </w:instrText>
-        </w:r>
-        <w:r>
-          <w:rPr>
-            <w:noProof/>
-            <w:webHidden/>
-          </w:rPr>
-        </w:r>
-        <w:r>
-          <w:rPr>
-            <w:noProof/>
-            <w:webHidden/>
-          </w:rPr>
-          <w:fldChar w:fldCharType="separate"/>
-        </w:r>
-        <w:r>
-          <w:rPr>
-            <w:noProof/>
-            <w:webHidden/>
-          </w:rPr>
-          <w:t>21</w:t>
-        </w:r>
-        <w:r>
-          <w:rPr>
-            <w:noProof/>
-            <w:webHidden/>
-          </w:rPr>
-          <w:fldChar w:fldCharType="end"/>
-        </w:r>
-      </w:hyperlink>
-    </w:p>
-    <w:p>
-      <w:pPr>
-        <w:pStyle w:val="Tabledesillustrations"/>
-        <w:tabs>
-          <w:tab w:val="right" w:leader="dot" w:pos="8495"/>
-        </w:tabs>
-        <w:rPr>
-          <w:rFonts w:asciiTheme="minorHAnsi" w:eastAsiaTheme="minorEastAsia" w:hAnsiTheme="minorHAnsi"/>
-          <w:noProof/>
-          <w:sz w:val="22"/>
-          <w:lang w:val="fr-BF" w:eastAsia="fr-BF"/>
-        </w:rPr>
-      </w:pPr>
-      <w:hyperlink w:anchor="_Toc235117310" w:history="1">
-        <w:r>
-          <w:rPr>
-            <w:rStyle w:val="Lienhypertexte"/>
-            <w:noProof/>
-          </w:rPr>
-          <w:t>Figure 14 : Objets composition</w:t>
-        </w:r>
-        <w:r>
-          <w:rPr>
-            <w:noProof/>
-            <w:webHidden/>
-          </w:rPr>
-          <w:tab/>
-        </w:r>
-        <w:r>
-          <w:rPr>
-            <w:noProof/>
-            <w:webHidden/>
-          </w:rPr>
-          <w:fldChar w:fldCharType="begin"/>
-        </w:r>
-        <w:r>
-          <w:rPr>
-            <w:noProof/>
-            <w:webHidden/>
-          </w:rPr>
-          <w:instrText xml:space="preserve"> PAGEREF _Toc235117310 \h </w:instrText>
-        </w:r>
-        <w:r>
-          <w:rPr>
-            <w:noProof/>
-            <w:webHidden/>
-          </w:rPr>
-        </w:r>
-        <w:r>
-          <w:rPr>
-            <w:noProof/>
-            <w:webHidden/>
-          </w:rPr>
-          <w:fldChar w:fldCharType="separate"/>
-        </w:r>
-        <w:r>
-          <w:rPr>
-            <w:noProof/>
-            <w:webHidden/>
-          </w:rPr>
-          <w:t/>
-        </w:r>
-        <w:r>
-          <w:rPr>
-            <w:noProof/>
-            <w:webHidden/>
-          </w:rPr>
-          <w:fldChar w:fldCharType="end"/>
-        </w:r>
-      </w:hyperlink>
-      <w:r/>
-    </w:p>
-    <w:p>
-      <w:pPr>
-        <w:pStyle w:val="Tabledesillustrations"/>
-        <w:tabs>
-          <w:tab w:val="right" w:leader="dot" w:pos="8495"/>
-        </w:tabs>
-        <w:rPr>
-          <w:rFonts w:asciiTheme="minorHAnsi" w:eastAsiaTheme="minorEastAsia" w:hAnsiTheme="minorHAnsi"/>
-          <w:noProof/>
-          <w:sz w:val="22"/>
-          <w:lang w:val="fr-BF" w:eastAsia="fr-BF"/>
-        </w:rPr>
-      </w:pPr>
-      <w:hyperlink w:anchor="_Toc235117311" w:history="1">
-        <w:r>
-          <w:rPr>
-            <w:rStyle w:val="Lienhypertexte"/>
-            <w:noProof/>
-          </w:rPr>
-          <w:t>Figure 15 : Composants vue d'ensemble</w:t>
-        </w:r>
-        <w:r>
-          <w:rPr>
-            <w:noProof/>
-            <w:webHidden/>
-          </w:rPr>
-          <w:tab/>
-        </w:r>
-        <w:r>
-          <w:rPr>
-            <w:noProof/>
-            <w:webHidden/>
-          </w:rPr>
-          <w:fldChar w:fldCharType="begin"/>
-        </w:r>
-        <w:r>
-          <w:rPr>
-            <w:noProof/>
-            <w:webHidden/>
-          </w:rPr>
-          <w:instrText xml:space="preserve"> PAGEREF _Toc235117311 \h </w:instrText>
-        </w:r>
-        <w:r>
-          <w:rPr>
-            <w:noProof/>
-            <w:webHidden/>
-          </w:rPr>
-        </w:r>
-        <w:r>
-          <w:rPr>
-            <w:noProof/>
-            <w:webHidden/>
-          </w:rPr>
-          <w:fldChar w:fldCharType="separate"/>
-        </w:r>
-        <w:r>
-          <w:rPr>
-            <w:noProof/>
-            <w:webHidden/>
-          </w:rPr>
-          <w:t>22</w:t>
-        </w:r>
-        <w:r>
-          <w:rPr>
-            <w:noProof/>
-            <w:webHidden/>
-          </w:rPr>
-          <w:fldChar w:fldCharType="end"/>
-        </w:r>
-      </w:hyperlink>
-    </w:p>
-    <w:p>
-      <w:pPr>
-        <w:pStyle w:val="Tabledesillustrations"/>
-        <w:tabs>
-          <w:tab w:val="right" w:leader="dot" w:pos="8495"/>
-        </w:tabs>
-        <w:rPr>
-          <w:rFonts w:asciiTheme="minorHAnsi" w:eastAsiaTheme="minorEastAsia" w:hAnsiTheme="minorHAnsi"/>
-          <w:noProof/>
-          <w:sz w:val="22"/>
-          <w:lang w:val="fr-BF" w:eastAsia="fr-BF"/>
-        </w:rPr>
-      </w:pPr>
-      <w:hyperlink w:anchor="_Toc235117312" w:history="1">
-        <w:r>
-          <w:rPr>
-            <w:rStyle w:val="Lienhypertexte"/>
-            <w:noProof/>
-          </w:rPr>
-          <w:t>Figure 16 : Composants administration et authentification</w:t>
-        </w:r>
-        <w:r>
-          <w:rPr>
-            <w:noProof/>
-            <w:webHidden/>
-          </w:rPr>
-          <w:tab/>
-        </w:r>
-        <w:r>
-          <w:rPr>
-            <w:noProof/>
-            <w:webHidden/>
-          </w:rPr>
-          <w:fldChar w:fldCharType="begin"/>
-        </w:r>
-        <w:r>
-          <w:rPr>
-            <w:noProof/>
-            <w:webHidden/>
-          </w:rPr>
-          <w:instrText xml:space="preserve"> PAGEREF _Toc235117312 \h </w:instrText>
-        </w:r>
-        <w:r>
-          <w:rPr>
-            <w:noProof/>
-            <w:webHidden/>
-          </w:rPr>
-        </w:r>
-        <w:r>
-          <w:rPr>
-            <w:noProof/>
-            <w:webHidden/>
-          </w:rPr>
-          <w:fldChar w:fldCharType="separate"/>
-        </w:r>
-        <w:r>
-          <w:rPr>
-            <w:noProof/>
-            <w:webHidden/>
-          </w:rPr>
-          <w:t>23</w:t>
-        </w:r>
-        <w:r>
-          <w:rPr>
-            <w:noProof/>
-            <w:webHidden/>
-          </w:rPr>
-          <w:fldChar w:fldCharType="end"/>
-        </w:r>
-      </w:hyperlink>
-    </w:p>
-    <w:p>
-      <w:pPr>
-        <w:pStyle w:val="Tabledesillustrations"/>
-        <w:tabs>
-          <w:tab w:val="right" w:leader="dot" w:pos="8495"/>
-        </w:tabs>
-        <w:rPr>
-          <w:rFonts w:asciiTheme="minorHAnsi" w:eastAsiaTheme="minorEastAsia" w:hAnsiTheme="minorHAnsi"/>
-          <w:noProof/>
-          <w:sz w:val="22"/>
-          <w:lang w:val="fr-BF" w:eastAsia="fr-BF"/>
-        </w:rPr>
-      </w:pPr>
-      <w:hyperlink w:anchor="_Toc235117313" w:history="1">
-        <w:r>
-          <w:rPr>
-            <w:rStyle w:val="Lienhypertexte"/>
-            <w:noProof/>
-          </w:rPr>
-          <w:t>Figure 17 : Composants examens et composition</w:t>
-        </w:r>
-        <w:r>
-          <w:rPr>
-            <w:noProof/>
-            <w:webHidden/>
-          </w:rPr>
-          <w:tab/>
-        </w:r>
-        <w:r>
-          <w:rPr>
-            <w:noProof/>
-            <w:webHidden/>
-          </w:rPr>
-          <w:fldChar w:fldCharType="begin"/>
-        </w:r>
-        <w:r>
-          <w:rPr>
-            <w:noProof/>
-            <w:webHidden/>
-          </w:rPr>
-          <w:instrText xml:space="preserve"> PAGEREF _Toc235117313 \h </w:instrText>
-        </w:r>
-        <w:r>
-          <w:rPr>
-            <w:noProof/>
-            <w:webHidden/>
-          </w:rPr>
-        </w:r>
-        <w:r>
-          <w:rPr>
-            <w:noProof/>
-            <w:webHidden/>
-          </w:rPr>
-          <w:fldChar w:fldCharType="separate"/>
-        </w:r>
-        <w:r>
-          <w:rPr>
-            <w:noProof/>
-            <w:webHidden/>
-          </w:rPr>
-          <w:t/>
-        </w:r>
-        <w:r>
-          <w:rPr>
-            <w:noProof/>
-            <w:webHidden/>
-          </w:rPr>
-          <w:fldChar w:fldCharType="end"/>
-        </w:r>
-      </w:hyperlink>
-      <w:r/>
-    </w:p>
-    <w:p>
-      <w:pPr>
-        <w:pStyle w:val="Tabledesillustrations"/>
-        <w:tabs>
-          <w:tab w:val="right" w:leader="dot" w:pos="8495"/>
-        </w:tabs>
-        <w:rPr>
-          <w:rFonts w:asciiTheme="minorHAnsi" w:eastAsiaTheme="minorEastAsia" w:hAnsiTheme="minorHAnsi"/>
-          <w:noProof/>
-          <w:sz w:val="22"/>
-          <w:lang w:val="fr-BF" w:eastAsia="fr-BF"/>
-        </w:rPr>
-      </w:pPr>
-      <w:hyperlink w:anchor="_Toc235117314" w:history="1">
-        <w:r>
-          <w:rPr>
-            <w:rStyle w:val="Lienhypertexte"/>
-            <w:noProof/>
-          </w:rPr>
-          <w:t>Figure 18 : États du cycle de vie d'un examen</w:t>
-        </w:r>
-        <w:r>
-          <w:rPr>
-            <w:noProof/>
-            <w:webHidden/>
-          </w:rPr>
-          <w:tab/>
-        </w:r>
-        <w:r>
-          <w:rPr>
-            <w:noProof/>
-            <w:webHidden/>
-          </w:rPr>
-          <w:fldChar w:fldCharType="begin"/>
-        </w:r>
-        <w:r>
-          <w:rPr>
-            <w:noProof/>
-            <w:webHidden/>
-          </w:rPr>
-          <w:instrText xml:space="preserve"> PAGEREF _Toc235117314 \h </w:instrText>
-        </w:r>
-        <w:r>
-          <w:rPr>
-            <w:noProof/>
-            <w:webHidden/>
-          </w:rPr>
-        </w:r>
-        <w:r>
-          <w:rPr>
-            <w:noProof/>
-            <w:webHidden/>
-          </w:rPr>
-          <w:fldChar w:fldCharType="separate"/>
-        </w:r>
-        <w:r>
-          <w:rPr>
-            <w:noProof/>
-            <w:webHidden/>
-          </w:rPr>
-          <w:t>24</w:t>
-        </w:r>
-        <w:r>
-          <w:rPr>
-            <w:noProof/>
-            <w:webHidden/>
-          </w:rPr>
-          <w:fldChar w:fldCharType="end"/>
-        </w:r>
-      </w:hyperlink>
-    </w:p>
-    <w:p>
-      <w:pPr>
-        <w:pStyle w:val="Tabledesillustrations"/>
-        <w:tabs>
-          <w:tab w:val="right" w:leader="dot" w:pos="8495"/>
-        </w:tabs>
-        <w:rPr>
-          <w:rFonts w:asciiTheme="minorHAnsi" w:eastAsiaTheme="minorEastAsia" w:hAnsiTheme="minorHAnsi"/>
-          <w:noProof/>
-          <w:sz w:val="22"/>
-          <w:lang w:val="fr-BF" w:eastAsia="fr-BF"/>
-        </w:rPr>
-      </w:pPr>
-      <w:hyperlink w:anchor="_Toc235117315" w:history="1">
-        <w:r>
-          <w:rPr>
-            <w:rStyle w:val="Lienhypertexte"/>
-            <w:noProof/>
-          </w:rPr>
-          <w:t>Figure 19 : Séquence de connexion</w:t>
-        </w:r>
-        <w:r>
-          <w:rPr>
-            <w:noProof/>
-            <w:webHidden/>
-          </w:rPr>
-          <w:tab/>
-        </w:r>
-        <w:r>
-          <w:rPr>
-            <w:noProof/>
-            <w:webHidden/>
-          </w:rPr>
-          <w:fldChar w:fldCharType="begin"/>
-        </w:r>
-        <w:r>
-          <w:rPr>
-            <w:noProof/>
-            <w:webHidden/>
-          </w:rPr>
-          <w:instrText xml:space="preserve"> PAGEREF _Toc235117315 \h </w:instrText>
-        </w:r>
-        <w:r>
-          <w:rPr>
-            <w:noProof/>
-            <w:webHidden/>
-          </w:rPr>
-        </w:r>
-        <w:r>
-          <w:rPr>
-            <w:noProof/>
-            <w:webHidden/>
-          </w:rPr>
-          <w:fldChar w:fldCharType="separate"/>
-        </w:r>
-        <w:r>
-          <w:rPr>
-            <w:noProof/>
-            <w:webHidden/>
-          </w:rPr>
-          <w:t>25</w:t>
-        </w:r>
-        <w:r>
-          <w:rPr>
-            <w:noProof/>
-            <w:webHidden/>
-          </w:rPr>
-          <w:fldChar w:fldCharType="end"/>
-        </w:r>
-      </w:hyperlink>
-    </w:p>
-    <w:p>
-      <w:pPr>
-        <w:pStyle w:val="Tabledesillustrations"/>
-        <w:tabs>
-          <w:tab w:val="right" w:leader="dot" w:pos="8495"/>
-        </w:tabs>
-        <w:rPr>
-          <w:rFonts w:asciiTheme="minorHAnsi" w:eastAsiaTheme="minorEastAsia" w:hAnsiTheme="minorHAnsi"/>
-          <w:noProof/>
-          <w:sz w:val="22"/>
-          <w:lang w:val="fr-BF" w:eastAsia="fr-BF"/>
-        </w:rPr>
-      </w:pPr>
-      <w:hyperlink w:anchor="_Toc235117316" w:history="1">
-        <w:r>
-          <w:rPr>
-            <w:rStyle w:val="Lienhypertexte"/>
-            <w:noProof/>
-          </w:rPr>
-          <w:t>Figure 20 : Séquence de publication d'un examen</w:t>
-        </w:r>
-        <w:r>
-          <w:rPr>
-            <w:noProof/>
-            <w:webHidden/>
-          </w:rPr>
-          <w:tab/>
-        </w:r>
-        <w:r>
-          <w:rPr>
-            <w:noProof/>
-            <w:webHidden/>
-          </w:rPr>
-          <w:fldChar w:fldCharType="begin"/>
-        </w:r>
-        <w:r>
-          <w:rPr>
-            <w:noProof/>
-            <w:webHidden/>
-          </w:rPr>
-          <w:instrText xml:space="preserve"> PAGEREF _Toc235117316 \h </w:instrText>
-        </w:r>
-        <w:r>
-          <w:rPr>
-            <w:noProof/>
-            <w:webHidden/>
-          </w:rPr>
-        </w:r>
-        <w:r>
-          <w:rPr>
-            <w:noProof/>
-            <w:webHidden/>
-          </w:rPr>
-          <w:fldChar w:fldCharType="separate"/>
-        </w:r>
-        <w:r>
-          <w:rPr>
-            <w:noProof/>
-            <w:webHidden/>
-          </w:rPr>
-          <w:t>26</w:t>
-        </w:r>
-        <w:r>
-          <w:rPr>
-            <w:noProof/>
-            <w:webHidden/>
-          </w:rPr>
-          <w:fldChar w:fldCharType="end"/>
-        </w:r>
-      </w:hyperlink>
-    </w:p>
-    <w:p>
-      <w:pPr>
-        <w:pStyle w:val="Tabledesillustrations"/>
-        <w:tabs>
-          <w:tab w:val="right" w:leader="dot" w:pos="8495"/>
-        </w:tabs>
-        <w:rPr>
-          <w:rFonts w:asciiTheme="minorHAnsi" w:eastAsiaTheme="minorEastAsia" w:hAnsiTheme="minorHAnsi"/>
-          <w:noProof/>
-          <w:sz w:val="22"/>
-          <w:lang w:val="fr-BF" w:eastAsia="fr-BF"/>
-        </w:rPr>
-      </w:pPr>
-      <w:hyperlink w:anchor="_Toc235117317" w:history="1">
-        <w:r>
-          <w:rPr>
-            <w:rStyle w:val="Lienhypertexte"/>
-            <w:noProof/>
-          </w:rPr>
-          <w:t>Figure 21 : Séquence d'accès étudiant</w:t>
-        </w:r>
-        <w:r>
-          <w:rPr>
-            <w:noProof/>
-            <w:webHidden/>
-          </w:rPr>
-          <w:tab/>
-        </w:r>
-        <w:r>
-          <w:rPr>
-            <w:noProof/>
-            <w:webHidden/>
-          </w:rPr>
-          <w:fldChar w:fldCharType="begin"/>
-        </w:r>
-        <w:r>
-          <w:rPr>
-            <w:noProof/>
-            <w:webHidden/>
-          </w:rPr>
-          <w:instrText xml:space="preserve"> PAGEREF _Toc235117317 \h </w:instrText>
-        </w:r>
-        <w:r>
-          <w:rPr>
-            <w:noProof/>
-            <w:webHidden/>
-          </w:rPr>
-        </w:r>
-        <w:r>
-          <w:rPr>
-            <w:noProof/>
-            <w:webHidden/>
-          </w:rPr>
-          <w:fldChar w:fldCharType="separate"/>
-        </w:r>
-        <w:r>
-          <w:rPr>
-            <w:noProof/>
-            <w:webHidden/>
-          </w:rPr>
-          <w:t>27</w:t>
-        </w:r>
-        <w:r>
-          <w:rPr>
-            <w:noProof/>
-            <w:webHidden/>
-          </w:rPr>
-          <w:fldChar w:fldCharType="end"/>
-        </w:r>
-      </w:hyperlink>
-    </w:p>
-    <w:p>
-      <w:pPr>
-        <w:pStyle w:val="Tabledesillustrations"/>
-        <w:tabs>
-          <w:tab w:val="right" w:leader="dot" w:pos="8495"/>
-        </w:tabs>
-        <w:rPr>
-          <w:rFonts w:asciiTheme="minorHAnsi" w:eastAsiaTheme="minorEastAsia" w:hAnsiTheme="minorHAnsi"/>
-          <w:noProof/>
-          <w:sz w:val="22"/>
-          <w:lang w:val="fr-BF" w:eastAsia="fr-BF"/>
-        </w:rPr>
-      </w:pPr>
-      <w:hyperlink w:anchor="_Toc235117318" w:history="1">
-        <w:r>
-          <w:rPr>
-            <w:rStyle w:val="Lienhypertexte"/>
-            <w:noProof/>
-          </w:rPr>
-          <w:t>Figure 22 : Séquence d'exécution du code</w:t>
-        </w:r>
-        <w:r>
-          <w:rPr>
-            <w:noProof/>
-            <w:webHidden/>
-          </w:rPr>
-          <w:tab/>
-        </w:r>
-        <w:r>
-          <w:rPr>
-            <w:noProof/>
-            <w:webHidden/>
-          </w:rPr>
-          <w:fldChar w:fldCharType="begin"/>
-        </w:r>
-        <w:r>
-          <w:rPr>
-            <w:noProof/>
-            <w:webHidden/>
-          </w:rPr>
-          <w:instrText xml:space="preserve"> PAGEREF _Toc235117318 \h </w:instrText>
-        </w:r>
-        <w:r>
-          <w:rPr>
-            <w:noProof/>
-            <w:webHidden/>
-          </w:rPr>
-        </w:r>
-        <w:r>
-          <w:rPr>
-            <w:noProof/>
-            <w:webHidden/>
-          </w:rPr>
-          <w:fldChar w:fldCharType="separate"/>
-        </w:r>
-        <w:r>
-          <w:rPr>
-            <w:noProof/>
-            <w:webHidden/>
-          </w:rPr>
-          <w:t>27</w:t>
-        </w:r>
-        <w:r>
-          <w:rPr>
-            <w:noProof/>
-            <w:webHidden/>
-          </w:rPr>
-          <w:fldChar w:fldCharType="end"/>
-        </w:r>
-      </w:hyperlink>
-    </w:p>
-    <w:p>
-      <w:pPr>
-        <w:pStyle w:val="Tabledesillustrations"/>
-        <w:tabs>
-          <w:tab w:val="right" w:leader="dot" w:pos="8495"/>
-        </w:tabs>
-        <w:rPr>
-          <w:rFonts w:asciiTheme="minorHAnsi" w:eastAsiaTheme="minorEastAsia" w:hAnsiTheme="minorHAnsi"/>
-          <w:noProof/>
-          <w:sz w:val="22"/>
-          <w:lang w:val="fr-BF" w:eastAsia="fr-BF"/>
-        </w:rPr>
-      </w:pPr>
-      <w:hyperlink w:anchor="_Toc235117319" w:history="1">
-        <w:r>
-          <w:rPr>
-            <w:rStyle w:val="Lienhypertexte"/>
-            <w:noProof/>
-          </w:rPr>
-          <w:t>Figure 23 : Séquence de soumission et correction</w:t>
-        </w:r>
-        <w:r>
-          <w:rPr>
-            <w:noProof/>
-            <w:webHidden/>
-          </w:rPr>
-          <w:tab/>
-        </w:r>
-        <w:r>
-          <w:rPr>
-            <w:noProof/>
-            <w:webHidden/>
-          </w:rPr>
-          <w:fldChar w:fldCharType="begin"/>
-        </w:r>
-        <w:r>
-          <w:rPr>
-            <w:noProof/>
-            <w:webHidden/>
-          </w:rPr>
-          <w:instrText xml:space="preserve"> PAGEREF _Toc235117319 \h </w:instrText>
-        </w:r>
-        <w:r>
-          <w:rPr>
-            <w:noProof/>
-            <w:webHidden/>
-          </w:rPr>
-        </w:r>
-        <w:r>
-          <w:rPr>
-            <w:noProof/>
-            <w:webHidden/>
-          </w:rPr>
-          <w:fldChar w:fldCharType="separate"/>
-        </w:r>
-        <w:r>
-          <w:rPr>
-            <w:noProof/>
-            <w:webHidden/>
-          </w:rPr>
-          <w:t>28</w:t>
-        </w:r>
-        <w:r>
-          <w:rPr>
-            <w:noProof/>
-            <w:webHidden/>
-          </w:rPr>
-          <w:fldChar w:fldCharType="end"/>
-        </w:r>
-      </w:hyperlink>
-    </w:p>
-    <w:p>
-      <w:pPr>
-        <w:pStyle w:val="Tabledesillustrations"/>
-        <w:tabs>
-          <w:tab w:val="right" w:leader="dot" w:pos="8495"/>
-        </w:tabs>
-        <w:rPr>
-          <w:rFonts w:asciiTheme="minorHAnsi" w:eastAsiaTheme="minorEastAsia" w:hAnsiTheme="minorHAnsi"/>
-          <w:noProof/>
-          <w:sz w:val="22"/>
-          <w:lang w:val="fr-BF" w:eastAsia="fr-BF"/>
-        </w:rPr>
-      </w:pPr>
-      <w:hyperlink w:anchor="_Toc235117320" w:history="1">
-        <w:r>
-          <w:rPr>
-            <w:rStyle w:val="Lienhypertexte"/>
-            <w:noProof/>
-          </w:rPr>
-          <w:t>Figure 24 : Séquence d'enregistrement d'un incident</w:t>
-        </w:r>
-        <w:r>
-          <w:rPr>
-            <w:noProof/>
-            <w:webHidden/>
-          </w:rPr>
-          <w:tab/>
-        </w:r>
-        <w:r>
-          <w:rPr>
-            <w:noProof/>
-            <w:webHidden/>
-          </w:rPr>
-          <w:fldChar w:fldCharType="begin"/>
-        </w:r>
-        <w:r>
-          <w:rPr>
-            <w:noProof/>
-            <w:webHidden/>
-          </w:rPr>
-          <w:instrText xml:space="preserve"> PAGEREF _Toc235117320 \h </w:instrText>
-        </w:r>
-        <w:r>
-          <w:rPr>
-            <w:noProof/>
-            <w:webHidden/>
-          </w:rPr>
-        </w:r>
-        <w:r>
-          <w:rPr>
-            <w:noProof/>
-            <w:webHidden/>
-          </w:rPr>
-          <w:fldChar w:fldCharType="separate"/>
-        </w:r>
-        <w:r>
-          <w:rPr>
-            <w:noProof/>
-            <w:webHidden/>
-          </w:rPr>
-          <w:t>29</w:t>
-        </w:r>
-        <w:r>
-          <w:rPr>
-            <w:noProof/>
-            <w:webHidden/>
-          </w:rPr>
-          <w:fldChar w:fldCharType="end"/>
-        </w:r>
-      </w:hyperlink>
-    </w:p>
-    <w:p>
-      <w:pPr>
-        <w:pStyle w:val="Tabledesillustrations"/>
-        <w:tabs>
-          <w:tab w:val="right" w:leader="dot" w:pos="8495"/>
-        </w:tabs>
-        <w:rPr>
-          <w:rFonts w:asciiTheme="minorHAnsi" w:eastAsiaTheme="minorEastAsia" w:hAnsiTheme="minorHAnsi"/>
-          <w:noProof/>
-          <w:sz w:val="22"/>
-          <w:lang w:val="fr-BF" w:eastAsia="fr-BF"/>
-        </w:rPr>
-      </w:pPr>
-      <w:hyperlink w:anchor="_Toc235117321" w:history="1">
-        <w:r>
-          <w:rPr>
-            <w:rStyle w:val="Lienhypertexte"/>
-            <w:noProof/>
-          </w:rPr>
-          <w:t>Figure 25 : Activité accès et salle d'attente</w:t>
-        </w:r>
-        <w:r>
-          <w:rPr>
-            <w:noProof/>
-            <w:webHidden/>
-          </w:rPr>
-          <w:tab/>
-        </w:r>
-        <w:r>
-          <w:rPr>
-            <w:noProof/>
-            <w:webHidden/>
-          </w:rPr>
-          <w:fldChar w:fldCharType="begin"/>
-        </w:r>
-        <w:r>
-          <w:rPr>
-            <w:noProof/>
-            <w:webHidden/>
-          </w:rPr>
-          <w:instrText xml:space="preserve"> PAGEREF _Toc235117321 \h </w:instrText>
-        </w:r>
-        <w:r>
-          <w:rPr>
-            <w:noProof/>
-            <w:webHidden/>
-          </w:rPr>
-        </w:r>
-        <w:r>
-          <w:rPr>
-            <w:noProof/>
-            <w:webHidden/>
-          </w:rPr>
-          <w:fldChar w:fldCharType="separate"/>
-        </w:r>
-        <w:r>
-          <w:rPr>
-            <w:noProof/>
-            <w:webHidden/>
-          </w:rPr>
-          <w:t>30</w:t>
-        </w:r>
-        <w:r>
-          <w:rPr>
-            <w:noProof/>
-            <w:webHidden/>
-          </w:rPr>
-          <w:fldChar w:fldCharType="end"/>
-        </w:r>
-      </w:hyperlink>
-    </w:p>
-    <w:p>
-      <w:pPr>
-        <w:pStyle w:val="Tabledesillustrations"/>
-        <w:tabs>
-          <w:tab w:val="right" w:leader="dot" w:pos="8495"/>
-        </w:tabs>
-        <w:rPr>
-          <w:rFonts w:asciiTheme="minorHAnsi" w:eastAsiaTheme="minorEastAsia" w:hAnsiTheme="minorHAnsi"/>
-          <w:noProof/>
-          <w:sz w:val="22"/>
-          <w:lang w:val="fr-BF" w:eastAsia="fr-BF"/>
-        </w:rPr>
-      </w:pPr>
-      <w:hyperlink w:anchor="_Toc235117322" w:history="1">
-        <w:r>
-          <w:rPr>
-            <w:rStyle w:val="Lienhypertexte"/>
-            <w:noProof/>
-          </w:rPr>
-          <w:t>Figure 26 : Activité composition et soumission</w:t>
-        </w:r>
-        <w:r>
-          <w:rPr>
-            <w:noProof/>
-            <w:webHidden/>
-          </w:rPr>
-          <w:tab/>
-        </w:r>
-        <w:r>
-          <w:rPr>
-            <w:noProof/>
-            <w:webHidden/>
-          </w:rPr>
-          <w:fldChar w:fldCharType="begin"/>
-        </w:r>
-        <w:r>
-          <w:rPr>
-            <w:noProof/>
-            <w:webHidden/>
-          </w:rPr>
-          <w:instrText xml:space="preserve"> PAGEREF _Toc235117322 \h </w:instrText>
-        </w:r>
-        <w:r>
-          <w:rPr>
-            <w:noProof/>
-            <w:webHidden/>
-          </w:rPr>
-        </w:r>
-        <w:r>
-          <w:rPr>
-            <w:noProof/>
-            <w:webHidden/>
-          </w:rPr>
-          <w:fldChar w:fldCharType="separate"/>
-        </w:r>
-        <w:r>
-          <w:rPr>
-            <w:noProof/>
-            <w:webHidden/>
-          </w:rPr>
-          <w:t>31</w:t>
-        </w:r>
-        <w:r>
-          <w:rPr>
-            <w:noProof/>
-            <w:webHidden/>
-          </w:rPr>
-          <w:fldChar w:fldCharType="end"/>
-        </w:r>
-      </w:hyperlink>
-    </w:p>
-    <w:p>
-      <w:pPr>
-        <w:pStyle w:val="Tabledesillustrations"/>
-        <w:tabs>
-          <w:tab w:val="right" w:leader="dot" w:pos="8495"/>
-        </w:tabs>
-        <w:rPr>
-          <w:rFonts w:asciiTheme="minorHAnsi" w:eastAsiaTheme="minorEastAsia" w:hAnsiTheme="minorHAnsi"/>
-          <w:noProof/>
-          <w:sz w:val="22"/>
-          <w:lang w:val="fr-BF" w:eastAsia="fr-BF"/>
-        </w:rPr>
-      </w:pPr>
-      <w:hyperlink w:anchor="_Toc235117323" w:history="1">
-        <w:r>
-          <w:rPr>
-            <w:rStyle w:val="Lienhypertexte"/>
-            <w:noProof/>
-          </w:rPr>
-          <w:t>Figure 27 : Page de connexion multi rôles</w:t>
-        </w:r>
-        <w:r>
-          <w:rPr>
-            <w:noProof/>
-            <w:webHidden/>
-          </w:rPr>
-          <w:tab/>
-        </w:r>
-        <w:r>
-          <w:rPr>
-            <w:noProof/>
-            <w:webHidden/>
-          </w:rPr>
-          <w:fldChar w:fldCharType="begin"/>
-        </w:r>
-        <w:r>
-          <w:rPr>
-            <w:noProof/>
-            <w:webHidden/>
-          </w:rPr>
-          <w:instrText xml:space="preserve"> PAGEREF _Toc235117323 \h </w:instrText>
-        </w:r>
-        <w:r>
-          <w:rPr>
-            <w:noProof/>
-            <w:webHidden/>
-          </w:rPr>
-        </w:r>
-        <w:r>
-          <w:rPr>
-            <w:noProof/>
-            <w:webHidden/>
-          </w:rPr>
-          <w:fldChar w:fldCharType="separate"/>
-        </w:r>
-        <w:r>
-          <w:rPr>
-            <w:noProof/>
-            <w:webHidden/>
-          </w:rPr>
-          <w:t>36</w:t>
-        </w:r>
-        <w:r>
-          <w:rPr>
-            <w:noProof/>
-            <w:webHidden/>
-          </w:rPr>
-          <w:fldChar w:fldCharType="end"/>
-        </w:r>
-      </w:hyperlink>
-    </w:p>
-    <w:p>
-      <w:pPr>
-        <w:pStyle w:val="Tabledesillustrations"/>
-        <w:tabs>
-          <w:tab w:val="right" w:leader="dot" w:pos="8495"/>
-        </w:tabs>
-        <w:rPr>
-          <w:rFonts w:asciiTheme="minorHAnsi" w:eastAsiaTheme="minorEastAsia" w:hAnsiTheme="minorHAnsi"/>
-          <w:noProof/>
-          <w:sz w:val="22"/>
-          <w:lang w:val="fr-BF" w:eastAsia="fr-BF"/>
-        </w:rPr>
-      </w:pPr>
-      <w:hyperlink w:anchor="_Toc235117324" w:history="1">
-        <w:r>
-          <w:rPr>
-            <w:rStyle w:val="Lienhypertexte"/>
-            <w:noProof/>
-          </w:rPr>
-          <w:t>Figure 28 : Espace administrateur d'établissement</w:t>
-        </w:r>
-        <w:r>
-          <w:rPr>
-            <w:noProof/>
-            <w:webHidden/>
-          </w:rPr>
-          <w:tab/>
-        </w:r>
-        <w:r>
-          <w:rPr>
-            <w:noProof/>
-            <w:webHidden/>
-          </w:rPr>
-          <w:fldChar w:fldCharType="begin"/>
-        </w:r>
-        <w:r>
-          <w:rPr>
-            <w:noProof/>
-            <w:webHidden/>
-          </w:rPr>
-          <w:instrText xml:space="preserve"> PAGEREF _Toc235117324 \h </w:instrText>
-        </w:r>
-        <w:r>
-          <w:rPr>
-            <w:noProof/>
-            <w:webHidden/>
-          </w:rPr>
-        </w:r>
-        <w:r>
-          <w:rPr>
-            <w:noProof/>
-            <w:webHidden/>
-          </w:rPr>
-          <w:fldChar w:fldCharType="separate"/>
-        </w:r>
-        <w:r>
-          <w:rPr>
-            <w:noProof/>
-            <w:webHidden/>
-          </w:rPr>
-          <w:t>37</w:t>
-        </w:r>
-        <w:r>
-          <w:rPr>
-            <w:noProof/>
-            <w:webHidden/>
-          </w:rPr>
-          <w:fldChar w:fldCharType="end"/>
-        </w:r>
-      </w:hyperlink>
-    </w:p>
-    <w:p>
-      <w:pPr>
-        <w:pStyle w:val="Tabledesillustrations"/>
-        <w:tabs>
-          <w:tab w:val="right" w:leader="dot" w:pos="8495"/>
-        </w:tabs>
-        <w:rPr>
-          <w:rFonts w:asciiTheme="minorHAnsi" w:eastAsiaTheme="minorEastAsia" w:hAnsiTheme="minorHAnsi"/>
-          <w:noProof/>
-          <w:sz w:val="22"/>
-          <w:lang w:val="fr-BF" w:eastAsia="fr-BF"/>
-        </w:rPr>
-      </w:pPr>
-      <w:hyperlink w:anchor="_Toc235117325" w:history="1">
-        <w:r>
-          <w:rPr>
-            <w:rStyle w:val="Lienhypertexte"/>
-            <w:noProof/>
-          </w:rPr>
-          <w:t>Figure 29 : Composition d'un examen côté professeur</w:t>
-        </w:r>
-        <w:r>
-          <w:rPr>
-            <w:noProof/>
-            <w:webHidden/>
-          </w:rPr>
-          <w:tab/>
-        </w:r>
-        <w:r>
-          <w:rPr>
-            <w:noProof/>
-            <w:webHidden/>
-          </w:rPr>
-          <w:fldChar w:fldCharType="begin"/>
-        </w:r>
-        <w:r>
-          <w:rPr>
-            <w:noProof/>
-            <w:webHidden/>
-          </w:rPr>
-          <w:instrText xml:space="preserve"> PAGEREF _Toc235117325 \h </w:instrText>
-        </w:r>
-        <w:r>
-          <w:rPr>
-            <w:noProof/>
-            <w:webHidden/>
-          </w:rPr>
-        </w:r>
-        <w:r>
-          <w:rPr>
-            <w:noProof/>
-            <w:webHidden/>
-          </w:rPr>
-          <w:fldChar w:fldCharType="separate"/>
-        </w:r>
-        <w:r>
-          <w:rPr>
-            <w:noProof/>
-            <w:webHidden/>
-          </w:rPr>
-          <w:t>38</w:t>
-        </w:r>
-        <w:r>
-          <w:rPr>
-            <w:noProof/>
-            <w:webHidden/>
-          </w:rPr>
-          <w:fldChar w:fldCharType="end"/>
-        </w:r>
-      </w:hyperlink>
-    </w:p>
-    <w:p>
-      <w:pPr>
-        <w:pStyle w:val="Tabledesillustrations"/>
-        <w:tabs>
-          <w:tab w:val="right" w:leader="dot" w:pos="8495"/>
-        </w:tabs>
-        <w:rPr>
-          <w:rFonts w:asciiTheme="minorHAnsi" w:eastAsiaTheme="minorEastAsia" w:hAnsiTheme="minorHAnsi"/>
-          <w:noProof/>
-          <w:sz w:val="22"/>
-          <w:lang w:val="fr-BF" w:eastAsia="fr-BF"/>
-        </w:rPr>
-      </w:pPr>
-      <w:hyperlink w:anchor="_Toc235117326" w:history="1">
-        <w:r>
-          <w:rPr>
-            <w:rStyle w:val="Lienhypertexte"/>
-            <w:noProof/>
-          </w:rPr>
-          <w:t>Figure 30 : Publication et code d'accès d'examen</w:t>
-        </w:r>
-        <w:r>
-          <w:rPr>
-            <w:noProof/>
-            <w:webHidden/>
-          </w:rPr>
-          <w:tab/>
-        </w:r>
-        <w:r>
-          <w:rPr>
-            <w:noProof/>
-            <w:webHidden/>
-          </w:rPr>
-          <w:fldChar w:fldCharType="begin"/>
-        </w:r>
-        <w:r>
-          <w:rPr>
-            <w:noProof/>
-            <w:webHidden/>
-          </w:rPr>
-          <w:instrText xml:space="preserve"> PAGEREF _Toc235117326 \h </w:instrText>
-        </w:r>
-        <w:r>
-          <w:rPr>
-            <w:noProof/>
-            <w:webHidden/>
-          </w:rPr>
-        </w:r>
-        <w:r>
-          <w:rPr>
-            <w:noProof/>
-            <w:webHidden/>
-          </w:rPr>
-          <w:fldChar w:fldCharType="separate"/>
-        </w:r>
-        <w:r>
-          <w:rPr>
-            <w:noProof/>
-            <w:webHidden/>
-          </w:rPr>
-          <w:t>39</w:t>
-        </w:r>
-        <w:r>
-          <w:rPr>
-            <w:noProof/>
-            <w:webHidden/>
-          </w:rPr>
-          <w:fldChar w:fldCharType="end"/>
-        </w:r>
-      </w:hyperlink>
-    </w:p>
-    <w:p>
-      <w:pPr>
-        <w:pStyle w:val="Tabledesillustrations"/>
-        <w:tabs>
-          <w:tab w:val="right" w:leader="dot" w:pos="8495"/>
-        </w:tabs>
-        <w:rPr>
-          <w:rFonts w:asciiTheme="minorHAnsi" w:eastAsiaTheme="minorEastAsia" w:hAnsiTheme="minorHAnsi"/>
-          <w:noProof/>
-          <w:sz w:val="22"/>
-          <w:lang w:val="fr-BF" w:eastAsia="fr-BF"/>
-        </w:rPr>
-      </w:pPr>
-      <w:hyperlink w:anchor="_Toc235117327" w:history="1">
-        <w:r>
-          <w:rPr>
-            <w:rStyle w:val="Lienhypertexte"/>
-            <w:noProof/>
-          </w:rPr>
-          <w:t>Figure 31 : Suivi live des participations</w:t>
-        </w:r>
-        <w:r>
-          <w:rPr>
-            <w:noProof/>
-            <w:webHidden/>
-          </w:rPr>
-          <w:tab/>
-        </w:r>
-        <w:r>
-          <w:rPr>
-            <w:noProof/>
-            <w:webHidden/>
-          </w:rPr>
-          <w:fldChar w:fldCharType="begin"/>
-        </w:r>
-        <w:r>
-          <w:rPr>
-            <w:noProof/>
-            <w:webHidden/>
-          </w:rPr>
-          <w:instrText xml:space="preserve"> PAGEREF _Toc235117327 \h </w:instrText>
-        </w:r>
-        <w:r>
-          <w:rPr>
-            <w:noProof/>
-            <w:webHidden/>
-          </w:rPr>
-        </w:r>
-        <w:r>
-          <w:rPr>
-            <w:noProof/>
-            <w:webHidden/>
-          </w:rPr>
-          <w:fldChar w:fldCharType="separate"/>
-        </w:r>
-        <w:r>
-          <w:rPr>
-            <w:noProof/>
-            <w:webHidden/>
-          </w:rPr>
-          <w:t>39</w:t>
-        </w:r>
-        <w:r>
-          <w:rPr>
-            <w:noProof/>
-            <w:webHidden/>
-          </w:rPr>
-          <w:fldChar w:fldCharType="end"/>
-        </w:r>
-      </w:hyperlink>
-    </w:p>
-    <w:p>
-      <w:pPr>
-        <w:pStyle w:val="Tabledesillustrations"/>
-        <w:tabs>
-          <w:tab w:val="right" w:leader="dot" w:pos="8495"/>
-        </w:tabs>
-        <w:rPr>
-          <w:rFonts w:asciiTheme="minorHAnsi" w:eastAsiaTheme="minorEastAsia" w:hAnsiTheme="minorHAnsi"/>
-          <w:noProof/>
-          <w:sz w:val="22"/>
-          <w:lang w:val="fr-BF" w:eastAsia="fr-BF"/>
-        </w:rPr>
-      </w:pPr>
-      <w:hyperlink w:anchor="_Toc235117328" w:history="1">
-        <w:r>
-          <w:rPr>
-            <w:rStyle w:val="Lienhypertexte"/>
-            <w:noProof/>
-          </w:rPr>
-          <w:t>Figure 32 : Résultats et exports professeur</w:t>
-        </w:r>
-        <w:r>
-          <w:rPr>
-            <w:noProof/>
-            <w:webHidden/>
-          </w:rPr>
-          <w:tab/>
-        </w:r>
-        <w:r>
-          <w:rPr>
-            <w:noProof/>
-            <w:webHidden/>
-          </w:rPr>
-          <w:fldChar w:fldCharType="begin"/>
-        </w:r>
-        <w:r>
-          <w:rPr>
-            <w:noProof/>
-            <w:webHidden/>
-          </w:rPr>
-          <w:instrText xml:space="preserve"> PAGEREF _Toc235117328 \h </w:instrText>
-        </w:r>
-        <w:r>
-          <w:rPr>
-            <w:noProof/>
-            <w:webHidden/>
-          </w:rPr>
-        </w:r>
-        <w:r>
-          <w:rPr>
-            <w:noProof/>
-            <w:webHidden/>
-          </w:rPr>
-          <w:fldChar w:fldCharType="separate"/>
-        </w:r>
-        <w:r>
-          <w:rPr>
-            <w:noProof/>
-            <w:webHidden/>
-          </w:rPr>
-          <w:t>39</w:t>
-        </w:r>
-        <w:r>
-          <w:rPr>
-            <w:noProof/>
-            <w:webHidden/>
-          </w:rPr>
-          <w:fldChar w:fldCharType="end"/>
-        </w:r>
-      </w:hyperlink>
-    </w:p>
-    <w:p>
-      <w:pPr>
-        <w:pStyle w:val="Tabledesillustrations"/>
-        <w:tabs>
-          <w:tab w:val="right" w:leader="dot" w:pos="8495"/>
-        </w:tabs>
-        <w:rPr>
-          <w:rFonts w:asciiTheme="minorHAnsi" w:eastAsiaTheme="minorEastAsia" w:hAnsiTheme="minorHAnsi"/>
-          <w:noProof/>
-          <w:sz w:val="22"/>
-          <w:lang w:val="fr-BF" w:eastAsia="fr-BF"/>
-        </w:rPr>
-      </w:pPr>
-      <w:hyperlink w:anchor="_Toc235117329" w:history="1">
-        <w:r>
-          <w:rPr>
-            <w:rStyle w:val="Lienhypertexte"/>
-            <w:noProof/>
-          </w:rPr>
-          <w:t>Figure 33 : Consignes et activation du plein écran</w:t>
-        </w:r>
-        <w:r>
-          <w:rPr>
-            <w:noProof/>
-            <w:webHidden/>
-          </w:rPr>
-          <w:tab/>
-        </w:r>
-        <w:r>
-          <w:rPr>
-            <w:noProof/>
-            <w:webHidden/>
-          </w:rPr>
-          <w:fldChar w:fldCharType="begin"/>
-        </w:r>
-        <w:r>
-          <w:rPr>
-            <w:noProof/>
-            <w:webHidden/>
-          </w:rPr>
-          <w:instrText xml:space="preserve"> PAGEREF _Toc235117329 \h </w:instrText>
-        </w:r>
-        <w:r>
-          <w:rPr>
-            <w:noProof/>
-            <w:webHidden/>
-          </w:rPr>
-        </w:r>
-        <w:r>
-          <w:rPr>
-            <w:noProof/>
-            <w:webHidden/>
-          </w:rPr>
-          <w:fldChar w:fldCharType="separate"/>
-        </w:r>
-        <w:r>
-          <w:rPr>
-            <w:noProof/>
-            <w:webHidden/>
-          </w:rPr>
-          <w:t>40</w:t>
-        </w:r>
-        <w:r>
-          <w:rPr>
-            <w:noProof/>
-            <w:webHidden/>
-          </w:rPr>
-          <w:fldChar w:fldCharType="end"/>
-        </w:r>
-      </w:hyperlink>
-    </w:p>
-    <w:p>
-      <w:pPr>
-        <w:pStyle w:val="Tabledesillustrations"/>
-        <w:tabs>
-          <w:tab w:val="right" w:leader="dot" w:pos="8495"/>
-        </w:tabs>
-        <w:rPr>
-          <w:rFonts w:asciiTheme="minorHAnsi" w:eastAsiaTheme="minorEastAsia" w:hAnsiTheme="minorHAnsi"/>
-          <w:noProof/>
-          <w:sz w:val="22"/>
-          <w:lang w:val="fr-BF" w:eastAsia="fr-BF"/>
-        </w:rPr>
-      </w:pPr>
-      <w:hyperlink w:anchor="_Toc235117330" w:history="1">
-        <w:r>
-          <w:rPr>
-            <w:rStyle w:val="Lienhypertexte"/>
-            <w:noProof/>
-          </w:rPr>
-          <w:t>Figure 34 : Salle d'attente avant le démarrage de l'examen</w:t>
-        </w:r>
-        <w:r>
-          <w:rPr>
-            <w:noProof/>
-            <w:webHidden/>
-          </w:rPr>
-          <w:tab/>
-        </w:r>
-        <w:r>
-          <w:rPr>
-            <w:noProof/>
-            <w:webHidden/>
-          </w:rPr>
-          <w:fldChar w:fldCharType="begin"/>
-        </w:r>
-        <w:r>
-          <w:rPr>
-            <w:noProof/>
-            <w:webHidden/>
-          </w:rPr>
-          <w:instrText xml:space="preserve"> PAGEREF _Toc235117330 \h </w:instrText>
-        </w:r>
-        <w:r>
-          <w:rPr>
-            <w:noProof/>
-            <w:webHidden/>
-          </w:rPr>
-        </w:r>
-        <w:r>
-          <w:rPr>
-            <w:noProof/>
-            <w:webHidden/>
-          </w:rPr>
-          <w:fldChar w:fldCharType="separate"/>
-        </w:r>
-        <w:r>
-          <w:rPr>
-            <w:noProof/>
-            <w:webHidden/>
-          </w:rPr>
-          <w:t>40</w:t>
-        </w:r>
-        <w:r>
-          <w:rPr>
-            <w:noProof/>
-            <w:webHidden/>
-          </w:rPr>
-          <w:fldChar w:fldCharType="end"/>
-        </w:r>
-      </w:hyperlink>
-    </w:p>
-    <w:p>
-      <w:pPr>
-        <w:pStyle w:val="Tabledesillustrations"/>
-        <w:tabs>
-          <w:tab w:val="right" w:leader="dot" w:pos="8495"/>
-        </w:tabs>
-        <w:rPr>
-          <w:rFonts w:asciiTheme="minorHAnsi" w:eastAsiaTheme="minorEastAsia" w:hAnsiTheme="minorHAnsi"/>
-          <w:noProof/>
-          <w:sz w:val="22"/>
-          <w:lang w:val="fr-BF" w:eastAsia="fr-BF"/>
-        </w:rPr>
-      </w:pPr>
-      <w:hyperlink w:anchor="_Toc235117331" w:history="1">
-        <w:r>
-          <w:rPr>
-            <w:rStyle w:val="Lienhypertexte"/>
-            <w:noProof/>
-          </w:rPr>
-          <w:t>Figure 35 : Environnement de composition pendant l'épreuve</w:t>
-        </w:r>
-        <w:r>
-          <w:rPr>
-            <w:noProof/>
-            <w:webHidden/>
-          </w:rPr>
-          <w:tab/>
-        </w:r>
-        <w:r>
-          <w:rPr>
-            <w:noProof/>
-            <w:webHidden/>
-          </w:rPr>
-          <w:fldChar w:fldCharType="begin"/>
-        </w:r>
-        <w:r>
-          <w:rPr>
-            <w:noProof/>
-            <w:webHidden/>
-          </w:rPr>
-          <w:instrText xml:space="preserve"> PAGEREF _Toc235117331 \h </w:instrText>
-        </w:r>
-        <w:r>
-          <w:rPr>
-            <w:noProof/>
-            <w:webHidden/>
-          </w:rPr>
-        </w:r>
-        <w:r>
-          <w:rPr>
-            <w:noProof/>
-            <w:webHidden/>
-          </w:rPr>
-          <w:fldChar w:fldCharType="separate"/>
-        </w:r>
-        <w:r>
-          <w:rPr>
-            <w:noProof/>
-            <w:webHidden/>
-          </w:rPr>
-          <w:t>41</w:t>
-        </w:r>
-        <w:r>
-          <w:rPr>
-            <w:noProof/>
-            <w:webHidden/>
-          </w:rPr>
-          <w:fldChar w:fldCharType="end"/>
-        </w:r>
-      </w:hyperlink>
-    </w:p>
-    <w:p>
-      <w:pPr>
-        <w:pStyle w:val="Tabledesillustrations"/>
-        <w:tabs>
-          <w:tab w:val="right" w:leader="dot" w:pos="8495"/>
-        </w:tabs>
-        <w:rPr>
-          <w:rFonts w:asciiTheme="minorHAnsi" w:eastAsiaTheme="minorEastAsia" w:hAnsiTheme="minorHAnsi"/>
-          <w:noProof/>
-          <w:sz w:val="22"/>
-          <w:lang w:val="fr-BF" w:eastAsia="fr-BF"/>
-        </w:rPr>
-      </w:pPr>
-      <w:hyperlink w:anchor="_Toc235117332" w:history="1">
-        <w:r>
-          <w:rPr>
-            <w:rStyle w:val="Lienhypertexte"/>
-            <w:noProof/>
-          </w:rPr>
-          <w:t>Figure 36 : Page d'accueil Cylentic</w:t>
-        </w:r>
-        <w:r>
-          <w:rPr>
-            <w:noProof/>
-            <w:webHidden/>
-          </w:rPr>
-          <w:tab/>
-        </w:r>
-        <w:r>
-          <w:rPr>
-            <w:noProof/>
-            <w:webHidden/>
-          </w:rPr>
-          <w:fldChar w:fldCharType="begin"/>
-        </w:r>
-        <w:r>
-          <w:rPr>
-            <w:noProof/>
-            <w:webHidden/>
-          </w:rPr>
-          <w:instrText xml:space="preserve"> PAGEREF _Toc235117332 \h </w:instrText>
-        </w:r>
-        <w:r>
-          <w:rPr>
-            <w:noProof/>
-            <w:webHidden/>
-          </w:rPr>
-        </w:r>
-        <w:r>
-          <w:rPr>
-            <w:noProof/>
-            <w:webHidden/>
-          </w:rPr>
-          <w:fldChar w:fldCharType="separate"/>
-        </w:r>
-        <w:r>
-          <w:rPr>
-            <w:noProof/>
-            <w:webHidden/>
-          </w:rPr>
-          <w:t>42</w:t>
-        </w:r>
-        <w:r>
-          <w:rPr>
-            <w:noProof/>
-            <w:webHidden/>
-          </w:rPr>
-          <w:fldChar w:fldCharType="end"/>
-        </w:r>
-      </w:hyperlink>
-    </w:p>
-    <w:p>
-      <w:r>
-        <w:rPr>
-          <w:i/>
-          <w:color w:val="000000"/>
-        </w:rPr>
+        <w:t> </w:t>
         <w:fldChar w:fldCharType="end"/>
       </w:r>
     </w:p>
@@ -5456,149 +2881,18 @@
     <w:p>
       <w:pPr>
         <w:pStyle w:val="Tabledesillustrations"/>
-        <w:tabs>
-          <w:tab w:val="right" w:leader="dot" w:pos="8495"/>
-        </w:tabs>
-        <w:rPr>
-          <w:rFonts w:asciiTheme="minorHAnsi" w:eastAsiaTheme="minorEastAsia" w:hAnsiTheme="minorHAnsi"/>
-          <w:noProof/>
-          <w:sz w:val="22"/>
-        </w:rPr>
-      </w:pPr>
-      <w:hyperlink w:anchor="_Toc235108636" w:history="1">
-        <w:r>
-          <w:rPr>
-            <w:rStyle w:val="Lienhypertexte"/>
-            <w:noProof/>
-          </w:rPr>
-          <w:t>Tableau 2 : Correspondance entre acteurs et responsabilités</w:t>
-        </w:r>
-        <w:r>
-          <w:rPr>
-            <w:noProof/>
-            <w:webHidden/>
-          </w:rPr>
-          <w:tab/>
-        </w:r>
-        <w:r>
-          <w:rPr>
-            <w:noProof/>
-            <w:webHidden/>
-          </w:rPr>
-          <w:fldChar w:fldCharType="begin"/>
-        </w:r>
-        <w:r>
-          <w:rPr>
-            <w:noProof/>
-            <w:webHidden/>
-          </w:rPr>
-          <w:instrText xml:space="preserve"> PAGEREF _Toc235108636 \h </w:instrText>
-        </w:r>
-        <w:r>
-          <w:rPr>
-            <w:noProof/>
-            <w:webHidden/>
-          </w:rPr>
-        </w:r>
-        <w:r>
-          <w:rPr>
-            <w:noProof/>
-            <w:webHidden/>
-          </w:rPr>
-          <w:fldChar w:fldCharType="separate"/>
-        </w:r>
-        <w:r>
-          <w:rPr>
-            <w:noProof/>
-            <w:webHidden/>
-          </w:rPr>
-          <w:t>7</w:t>
-        </w:r>
-        <w:r>
-          <w:rPr>
-            <w:noProof/>
-            <w:webHidden/>
-          </w:rPr>
-          <w:fldChar w:fldCharType="end"/>
-        </w:r>
-      </w:hyperlink>
-    </w:p>
-    <w:p>
-      <w:pPr>
-        <w:pStyle w:val="Tabledesillustrations"/>
-        <w:tabs>
-          <w:tab w:val="right" w:leader="dot" w:pos="8495"/>
-        </w:tabs>
-        <w:rPr>
-          <w:rFonts w:asciiTheme="minorHAnsi" w:eastAsiaTheme="minorEastAsia" w:hAnsiTheme="minorHAnsi"/>
-          <w:noProof/>
-          <w:sz w:val="22"/>
-        </w:rPr>
-      </w:pPr>
-      <w:hyperlink w:anchor="_Toc235108637" w:history="1">
-        <w:r>
-          <w:rPr>
-            <w:rStyle w:val="Lienhypertexte"/>
-            <w:noProof/>
-          </w:rPr>
-          <w:t>Tableau 3 : Principales tables persistantes et rôle</w:t>
-        </w:r>
-        <w:r>
-          <w:rPr>
-            <w:noProof/>
-            <w:webHidden/>
-          </w:rPr>
-          <w:tab/>
-        </w:r>
-        <w:r>
-          <w:rPr>
-            <w:noProof/>
-            <w:webHidden/>
-          </w:rPr>
-          <w:fldChar w:fldCharType="begin"/>
-        </w:r>
-        <w:r>
-          <w:rPr>
-            <w:noProof/>
-            <w:webHidden/>
-          </w:rPr>
-          <w:instrText xml:space="preserve"> PAGEREF _Toc235108637 \h </w:instrText>
-        </w:r>
-        <w:r>
-          <w:rPr>
-            <w:noProof/>
-            <w:webHidden/>
-          </w:rPr>
-        </w:r>
-        <w:r>
-          <w:rPr>
-            <w:noProof/>
-            <w:webHidden/>
-          </w:rPr>
-          <w:fldChar w:fldCharType="separate"/>
-        </w:r>
-        <w:r>
-          <w:rPr>
-            <w:noProof/>
-            <w:webHidden/>
-          </w:rPr>
-          <w:t>32</w:t>
-        </w:r>
-        <w:r>
-          <w:rPr>
-            <w:noProof/>
-            <w:webHidden/>
-          </w:rPr>
-          <w:fldChar w:fldCharType="end"/>
-        </w:r>
-      </w:hyperlink>
-    </w:p>
-    <w:p>
-      <w:r>
-        <w:rPr>
-          <w:i/>
-          <w:color w:val="000000"/>
-        </w:rPr>
+      </w:pPr>
+      <w:r>
+        <w:rPr>
+          <w:rFonts w:ascii="Times New Roman" w:hAnsi="Times New Roman" w:eastAsia="Times New Roman"/>
+          <w:b w:val="0"/>
+          <w:color w:val="000000"/>
+          <w:sz w:val="24"/>
+        </w:rPr>
+        <w:fldChar w:fldCharType="begin"/>
+        <w:instrText xml:space="preserve">TOC \z \c "Tableau"</w:instrText>
+        <w:fldChar w:fldCharType="separate"/>
+        <w:t> </w:t>
         <w:fldChar w:fldCharType="end"/>
       </w:r>
     </w:p>
@@ -6660,6 +3954,7 @@
     </w:p>
     <w:p>
       <w:pPr>
+        <w:pStyle w:val="Lgende"/>
         <w:spacing w:line="360" w:lineRule="auto" w:after="160"/>
         <w:ind w:firstLine="0"/>
         <w:jc w:val="left"/>
@@ -6667,7 +3962,7 @@
       <w:r>
         <w:rPr>
           <w:rFonts w:ascii="Times New Roman" w:hAnsi="Times New Roman" w:eastAsia="Times New Roman"/>
-          <w:b/>
+          <w:b w:val="0"/>
           <w:color w:val="000000"/>
           <w:sz w:val="24"/>
         </w:rPr>
@@ -8363,7 +5658,7 @@
           <w:color w:val="000000"/>
           <w:sz w:val="24"/>
         </w:rPr>
-        <w:t>La figure 1 présente l'architecture logique de Cylentic. On y voit l'interface web, les services métier, la base de données et la sandbox qui exécute le code des étudiants.</w:t>
+        <w:t>La figure 1 présente l'architecture logique de Cylentic. L'étudiant et le professeur passent par l'interface web. Les services métier gèrent les examens, les comptes et les règles de sécurité. Les données sont enregistrées en base, tandis que la sandbox exécute le code Python de façon isolée. Cette vue montre comment les grandes parties du système s'organisent avant le détail technique.</w:t>
       </w:r>
     </w:p>
     <w:p>
@@ -8510,7 +5805,7 @@
           <w:color w:val="000000"/>
           <w:sz w:val="24"/>
         </w:rPr>
-        <w:t>La figure 2 illustre le déploiement de l'infrastructure. Elle montre le serveur applicatif, la base MySQL, les conteneurs Docker et les postes clients utilisés en salle.</w:t>
+        <w:t>La figure 2 illustre le déploiement de l'infrastructure. Le serveur applicatif héberge Cylentic, MySQL stocke les données, et Docker fournit l'environnement d'exécution isolé. Les postes de la salle se connectent via le navigateur. Cette figure montre concrètement où tourne chaque élément le jour de l'épreuve.</w:t>
       </w:r>
     </w:p>
     <w:p>
@@ -8678,7 +5973,7 @@
           <w:color w:val="000000"/>
           <w:sz w:val="24"/>
         </w:rPr>
-        <w:t>La figure 3 présente les cas d'utilisation du Super Admin. Elle montre ses actions principales sur la plateforme, notamment la gestion des établissements.</w:t>
+        <w:t>La figure 3 présente les cas d'utilisation du Super Admin. Il administre la plateforme dans son ensemble : établissements, pilotage global et fonctions transverses. Cette vue précise son rôle, distinct de celui de l'administrateur d'une école.</w:t>
       </w:r>
     </w:p>
     <w:p>
@@ -8819,7 +6114,7 @@
           <w:color w:val="000000"/>
           <w:sz w:val="24"/>
         </w:rPr>
-        <w:t>La figure 4 illustre les cas d'utilisation de l'administrateur d'établissement pour l'organisation scolaire : années, classes et structure locale.</w:t>
+        <w:t>La figure 4 illustre les cas d'utilisation de l'administrateur d'établissement pour l'organisation. Il structure l'espace local : années académiques, classes et organisation scolaire. Cette figure montre le périmètre de gestion avant la création des comptes.</w:t>
       </w:r>
     </w:p>
     <w:p>
@@ -8948,7 +6243,7 @@
           <w:color w:val="000000"/>
           <w:sz w:val="24"/>
         </w:rPr>
-        <w:t>La figure 5 présente la gestion des comptes par l'administrateur : création, modification et suivi des comptes professeurs et étudiants.</w:t>
+        <w:t>La figure 5 présente la gestion des comptes par l'administrateur. Il crée, modifie, désactive ou réactive les comptes professeurs et étudiants, et peut importer des listes. Cette vue complète le rôle local de l'administrateur côté utilisateurs.</w:t>
       </w:r>
     </w:p>
     <w:p>
@@ -9089,7 +6384,7 @@
           <w:color w:val="000000"/>
           <w:sz w:val="24"/>
         </w:rPr>
-        <w:t>La figure 6 détaille les actions du professeur autour des examens : création, édition, publication et configuration des exercices.</w:t>
+        <w:t>La figure 6 détaille les actions du professeur autour des examens. Il crée l'épreuve, ajoute des exercices et des tests, puis publie l'examen. Cette figure montre le travail de préparation avant le jour J.</w:t>
       </w:r>
     </w:p>
     <w:p>
@@ -9218,7 +6513,7 @@
           <w:color w:val="000000"/>
           <w:sz w:val="24"/>
         </w:rPr>
-        <w:t>La figure 7 illustre le suivi côté professeur. Elle montre comment il consulte les participations, les incidents et les résultats.</w:t>
+        <w:t>La figure 7 illustre le suivi côté professeur pendant et après l'épreuve. Il consulte les participations, lit le journal d'incidents et accède aux résultats. Cette vue montre comment le professeur pilote l'examen une fois lancé.</w:t>
       </w:r>
     </w:p>
     <w:p>
@@ -9359,7 +6654,7 @@
           <w:color w:val="000000"/>
           <w:sz w:val="24"/>
         </w:rPr>
-        <w:t>La figure 8 représente le parcours de l'étudiant : connexion, salle d'attente, composition, exécution d'essai et soumission.</w:t>
+        <w:t>La figure 8 représente le parcours de l'étudiant. Après connexion et saisie du code d'examen, il accepte les consignes, attend en salle d'attente, compose, peut exécuter des essais, puis soumet sa copie. Cette figure résume le chemin complet côté étudiant.</w:t>
       </w:r>
     </w:p>
     <w:p>
@@ -9531,7 +6826,7 @@
           <w:color w:val="000000"/>
           <w:sz w:val="24"/>
         </w:rPr>
-        <w:t>La figure 9 présente le diagramme de classes lié à l'organisation et aux comptes. On y voit les établissements, les utilisateurs et leurs rôles.</w:t>
+        <w:t>La figure 9 présente le diagramme de classes de l'organisation et des comptes. On y voit les établissements, les utilisateurs et les liens avec les rôles. Cette modélisation pose la base des droits d'accès dans Cylentic.</w:t>
       </w:r>
     </w:p>
     <w:p>
@@ -9660,7 +6955,7 @@
           <w:color w:val="000000"/>
           <w:sz w:val="24"/>
         </w:rPr>
-        <w:t>La figure 10 illustre les classes utilisées pour concevoir un examen : examen, exercices, tests unitaires et éléments associés.</w:t>
+        <w:t>La figure 10 illustre les classes de conception d'un examen. Un examen regroupe des exercices, eux-mêmes associés à des tests unitaires ou à des QCM. Cette figure montre comment le contenu pédagogique est structuré avant la composition.</w:t>
       </w:r>
     </w:p>
     <w:p>
@@ -9782,7 +7077,7 @@
           <w:color w:val="000000"/>
           <w:sz w:val="24"/>
         </w:rPr>
-        <w:t>La figure 11 présente les classes de la composition et de la correction : participation, copie, incidents et résultats.</w:t>
+        <w:t>La figure 11 présente les classes de la composition et de la correction. La participation relie un étudiant à un examen ; la copie, les incidents et les résultats permettent de suivre et d'évaluer le travail rendu. Cette vue explique le cœur métier pendant l'épreuve.</w:t>
       </w:r>
     </w:p>
     <w:p>
@@ -9923,7 +7218,7 @@
           <w:color w:val="000000"/>
           <w:sz w:val="24"/>
         </w:rPr>
-        <w:t>La figure 12 montre un exemple concret d'objets pour l'organisation. Elle aide à comprendre les liens entre établissement, classes et utilisateurs.</w:t>
+        <w:t>La figure 12 montre un exemple d'objets pour l'organisation. Elle donne une instance concrète des liens entre établissement, classes et utilisateurs, afin de rendre le modèle de classes plus lisible.</w:t>
       </w:r>
     </w:p>
     <w:p>
@@ -10051,7 +7346,7 @@
           <w:color w:val="000000"/>
           <w:sz w:val="24"/>
         </w:rPr>
-        <w:t>La figure 13 illustre un examen concret avec ses exercices et ses tests. Elle précise comment les objets se relient au moment de la conception.</w:t>
+        <w:t>La figure 13 illustre un examen concret avec ses exercices et ses tests. Elle montre, sur un exemple, comment les objets de conception se relient au moment où le professeur prépare l'épreuve.</w:t>
       </w:r>
     </w:p>
     <w:p>
@@ -10174,7 +7469,7 @@
           <w:color w:val="000000"/>
           <w:sz w:val="24"/>
         </w:rPr>
-        <w:t>La figure 14 présente un exemple de participation étudiante pendant l'examen, avec la copie, les incidents et les éléments de correction.</w:t>
+        <w:t>La figure 14 présente un exemple de participation pendant l'examen. On y voit la copie de l'étudiant, d'éventuels incidents et les éléments utiles à la correction. Cette figure aide à comprendre le déroulement réel d'une épreuve.</w:t>
       </w:r>
     </w:p>
     <w:p>
@@ -10329,7 +7624,7 @@
           <w:color w:val="000000"/>
           <w:sz w:val="24"/>
         </w:rPr>
-        <w:t>La figure 15 donne une vue d'ensemble des composants logiciels de Cylentic et de la façon dont ils communiquent.</w:t>
+        <w:t>La figure 15 donne une vue d'ensemble des composants logiciels de Cylentic. L'interface, les services et les briques techniques y sont reliés. Cette figure montre le découpage du système sans entrer dans chaque classe.</w:t>
       </w:r>
     </w:p>
     <w:p>
@@ -10458,7 +7753,7 @@
           <w:color w:val="000000"/>
           <w:sz w:val="24"/>
         </w:rPr>
-        <w:t>La figure 16 détaille les composants d'administration et d'authentification. Elle montre comment les rôles et les sessions sont gérés.</w:t>
+        <w:t>La figure 16 détaille les composants d'administration et d'authentification. Elle montre comment la connexion, les rôles et la gestion des comptes sont pris en charge dans l'application.</w:t>
       </w:r>
     </w:p>
     <w:p>
@@ -10580,7 +7875,7 @@
           <w:color w:val="000000"/>
           <w:sz w:val="24"/>
         </w:rPr>
-        <w:t>La figure 17 présente les composants liés aux examens et à la composition. On y retrouve la préparation de l'épreuve, le parcours étudiant et l'exécution du code.</w:t>
+        <w:t>La figure 17 présente les composants liés aux examens et à la composition. On y retrouve la préparation de l'épreuve, le parcours étudiant et l'exécution isolée du code. Cette vue relie la pédagogie à la technique.</w:t>
       </w:r>
     </w:p>
     <w:p>
@@ -10763,7 +8058,7 @@
           <w:color w:val="000000"/>
           <w:sz w:val="24"/>
         </w:rPr>
-        <w:t>La figure 18 montre les états successifs d'un examen, du brouillon jusqu'à la clôture, en passant par la publication et le déroulement de l'épreuve.</w:t>
+        <w:t>La figure 18 montre les états successifs d'un examen. Il naît en brouillon, devient publié, passe en cours pendant l'épreuve, puis se clôture. Cette figure explique le cycle de vie suivi par la plateforme.</w:t>
       </w:r>
     </w:p>
     <w:p>
@@ -10919,7 +8214,7 @@
           <w:color w:val="000000"/>
           <w:sz w:val="24"/>
         </w:rPr>
-        <w:t>La figure 19 décrit la séquence de connexion. Elle montre les échanges entre l'utilisateur, l'interface et le serveur pour vérifier l'identité et le rôle.</w:t>
+        <w:t>La figure 19 décrit la séquence de connexion. L'utilisateur saisit ses identifiants ; le serveur vérifie le compte, déduit le rôle et ouvre la session. Cette figure montre le premier contrôle d'accès à Cylentic.</w:t>
       </w:r>
     </w:p>
     <w:p>
@@ -11066,7 +8361,7 @@
           <w:color w:val="000000"/>
           <w:sz w:val="24"/>
         </w:rPr>
-        <w:t>La figure 20 illustre la publication d'un examen. Elle montre comment le professeur rend l'épreuve accessible et comment le code d'accès est généré.</w:t>
+        <w:t>La figure 20 illustre la publication d'un examen. Le professeur propriétaire déclenche la publication ; le système rend l'épreuve accessible et génère le code d'accès. Cette figure montre le passage du brouillon à l'épreuve prête.</w:t>
       </w:r>
     </w:p>
     <w:p>
@@ -11219,7 +8514,7 @@
           <w:color w:val="000000"/>
           <w:sz w:val="24"/>
         </w:rPr>
-        <w:t>La figure 21 présente l'accès de l'étudiant à l'examen : authentification, saisie du code d'accès, consignes, puis entrée en salle d'attente.</w:t>
+        <w:t>La figure 21 présente l'accès de l'étudiant à l'examen. Après authentification et saisie du code, il lit les consignes puis rejoint la salle d'attente. Cette séquence prépare l'entrée en composition.</w:t>
       </w:r>
     </w:p>
     <w:p>
@@ -11359,7 +8654,7 @@
           <w:color w:val="000000"/>
           <w:sz w:val="24"/>
         </w:rPr>
-        <w:t>La figure 22 montre l'exécution du code Python dans la sandbox. Le code part du navigateur, est exécuté de façon isolée, puis le résultat revient à l'étudiant.</w:t>
+        <w:t>La figure 22 montre l'exécution du code Python dans la sandbox. Le navigateur envoie le code au serveur ; celui-ci le fait tourner dans un conteneur isolé, puis renvoie la sortie. Cette figure explique comment l'essai reste sûr pour la machine hôte.</w:t>
       </w:r>
     </w:p>
     <w:p>
@@ -11500,7 +8795,7 @@
           <w:color w:val="000000"/>
           <w:sz w:val="24"/>
         </w:rPr>
-        <w:t>La figure 23 décrit la soumission de la copie et le lancement de la correction automatique à partir des tests unitaires.</w:t>
+        <w:t>La figure 23 décrit la soumission de la copie et la correction automatique. Une fois la copie figée, les tests unitaires sont exécutés et le score est calculé. Cette figure montre la fin du parcours de composition.</w:t>
       </w:r>
     </w:p>
     <w:p>
@@ -11641,7 +8936,7 @@
           <w:color w:val="000000"/>
           <w:sz w:val="24"/>
         </w:rPr>
-        <w:t>La figure 24 illustre l'enregistrement d'un incident pendant l'examen, par exemple une sortie du plein écran ou un changement d'onglet.</w:t>
+        <w:t>La figure 24 illustre l'enregistrement d'un incident pendant l'examen. Une sortie du plein écran, un changement d'onglet ou un collage peut être journalisé, puis traité selon les règles prévues. Cette figure montre le suivi de la sécurité pendant l'épreuve.</w:t>
       </w:r>
     </w:p>
     <w:p>
@@ -11797,7 +9092,7 @@
           <w:color w:val="000000"/>
           <w:sz w:val="24"/>
         </w:rPr>
-        <w:t>La figure 25 présente le flux d'activité depuis la connexion jusqu'à la salle d'attente, juste avant le démarrage de l'épreuve.</w:t>
+        <w:t>La figure 25 présente le flux d'activité jusqu'à la salle d'attente. L'étudiant se connecte, accepte les consignes, active le plein écran, puis attend le démarrage. Cette figure couvre la phase avant composition.</w:t>
       </w:r>
     </w:p>
     <w:p>
@@ -11926,7 +9221,7 @@
           <w:color w:val="000000"/>
           <w:sz w:val="24"/>
         </w:rPr>
-        <w:t>La figure 26 décrit les activités pendant la composition : écriture du code, exécutions d'essai, gestion des incidents, puis soumission finale.</w:t>
+        <w:t>La figure 26 décrit les activités pendant la composition. L'étudiant écrit, lance des essais, peut provoquer des incidents, puis soumet manuellement ou automatiquement à la fin du temps. Cette figure raconte le cœur de l'épreuve.</w:t>
       </w:r>
     </w:p>
     <w:p>
@@ -12879,7 +10174,7 @@
           <w:color w:val="000000"/>
           <w:sz w:val="24"/>
         </w:rPr>
-        <w:t>La figure 27 montre la page de connexion de Cylentic. Selon l'identifiant saisi, l'utilisateur accède à l'espace qui correspond à son rôle.</w:t>
+        <w:t>La figure 27 montre la page de connexion de Cylentic. Selon le préfixe de l'identifiant, l'utilisateur est orienté vers l'espace Super Admin, administrateur, professeur ou étudiant. Cette figure présente la porte d'entrée de la plateforme.</w:t>
       </w:r>
     </w:p>
     <w:p>
@@ -13088,7 +10383,7 @@
           <w:color w:val="000000"/>
           <w:sz w:val="24"/>
         </w:rPr>
-        <w:t>La figure 28 présente l'espace de l'administrateur d'établissement. On y gère notamment les classes, les comptes et l'organisation locale.</w:t>
+        <w:t>La figure 28 présente l'espace administrateur d'établissement. On y gère les classes, les comptes et l'organisation locale. Cette capture montre l'interface réelle utilisée au quotidien par l'administration.</w:t>
       </w:r>
     </w:p>
     <w:p>
@@ -13259,7 +10554,7 @@
           <w:color w:val="000000"/>
           <w:sz w:val="24"/>
         </w:rPr>
-        <w:t>La figure 29 illustre l'écran de création et d'édition d'un examen côté professeur, avec les exercices et les paramètres de l'épreuve.</w:t>
+        <w:t>La figure 29 illustre l'écran de création et d'édition d'un examen côté professeur. On y prépare les exercices, les tests et les paramètres de l'épreuve. Cette figure montre l'outil de conception pédagogique.</w:t>
       </w:r>
     </w:p>
     <w:p>
@@ -13396,7 +10691,7 @@
           <w:color w:val="000000"/>
           <w:sz w:val="24"/>
         </w:rPr>
-        <w:t>La figure 30 montre l'écran de publication d'un examen et l'affichage du code d'accès à communiquer aux étudiants.</w:t>
+        <w:t>La figure 30 montre l'écran de publication et le code d'accès. Une fois l'examen publié, le professeur peut communiquer ce code aux étudiants. Cette figure relie la préparation au démarrage de l'épreuve.</w:t>
       </w:r>
     </w:p>
     <w:p>
@@ -13532,7 +10827,7 @@
           <w:color w:val="000000"/>
           <w:sz w:val="24"/>
         </w:rPr>
-        <w:t>La figure 31 présente le suivi en direct des étudiants pendant l'épreuve : présence, progression et incidents visibles par le professeur.</w:t>
+        <w:t>La figure 31 présente le suivi en direct des participations. Le professeur voit qui est connecté, l'état des copies et les incidents signalés. Cette figure montre le pilotage de la salle pendant l'examen.</w:t>
       </w:r>
     </w:p>
     <w:p>
@@ -13668,7 +10963,7 @@
           <w:color w:val="000000"/>
           <w:sz w:val="24"/>
         </w:rPr>
-        <w:t>La figure 32 illustre la consultation des résultats et les exports disponibles pour le professeur après l'examen.</w:t>
+        <w:t>La figure 32 illustre la consultation des résultats et les exports. Après l'épreuve, le professeur peut lire les scores et exporter les données utiles. Cette figure montre la restitution finale du travail.</w:t>
       </w:r>
     </w:p>
     <w:p>
@@ -13836,7 +11131,7 @@
           <w:color w:val="000000"/>
           <w:sz w:val="24"/>
         </w:rPr>
-        <w:t>La figure 33 montre les consignes de sécurité côté étudiant et l'étape d'activation du plein écran avant de composer.</w:t>
+        <w:t>La figure 33 montre les consignes de sécurité et l'activation du plein écran. Avant de composer, l'étudiant doit accepter le cadre de l'épreuve. Cette figure présente le verrouillage initial côté navigateur.</w:t>
       </w:r>
     </w:p>
     <w:p>
@@ -13964,7 +11259,7 @@
           <w:color w:val="000000"/>
           <w:sz w:val="24"/>
         </w:rPr>
-        <w:t>La figure 34 présente la salle d'attente. L'étudiant y reste connecté jusqu'à l'heure de début fixée pour l'épreuve.</w:t>
+        <w:t>La figure 34 présente la salle d'attente. L'étudiant reste connecté et informe jusqu'à l'heure de début. Cette figure montre la phase d'attente synchronisée avant l'ouverture de la composition.</w:t>
       </w:r>
     </w:p>
     <w:p>
@@ -14105,7 +11400,7 @@
           <w:color w:val="000000"/>
           <w:sz w:val="24"/>
         </w:rPr>
-        <w:t>La figure 35 illustre l'environnement de composition pendant l'examen : énoncé, éditeur de code, exécution d'essai et zone de soumission.</w:t>
+        <w:t>La figure 35 illustre l'environnement de composition pendant l'examen. L'étudiant voit l'énoncé, écrit dans l'éditeur, peut exécuter un essai et soumettre sa copie. Cette figure montre l'écran principal de l'épreuve.</w:t>
       </w:r>
     </w:p>
     <w:p>
@@ -14322,7 +11617,7 @@
           <w:color w:val="000000"/>
           <w:sz w:val="24"/>
         </w:rPr>
-        <w:t>La figure 36 montre la page d'accueil publique de Cylentic, point d'entrée avant la connexion aux espaces privés.</w:t>
+        <w:t>La figure 36 montre la page d'accueil publique de Cylentic. Elle présente la plateforme et oriente vers la connexion. Cette figure correspond au premier contact d'un visiteur avec le service.</w:t>
       </w:r>
     </w:p>
     <w:p>

</xml_diff>

<commit_message>
Séparer bibliographie et webographie avec dates de consultation réalistes
Co-authored-by: progirix <progirix@users.noreply.github.com>
</commit_message>
<xml_diff>
--- a/docs/Rapport_Cylentic.docx
+++ b/docs/Rapport_Cylentic.docx
@@ -2157,7 +2157,7 @@
             <w:rStyle w:val="Lienhypertexte"/>
             <w:noProof/>
           </w:rPr>
-          <w:t>Bibliographie et webographie</w:t>
+          <w:t>Bibliographie</w:t>
         </w:r>
         <w:r>
           <w:rPr>
@@ -12156,6 +12156,9 @@
     <w:p>
       <w:pPr>
         <w:pStyle w:val="Titre1"/>
+        <w:spacing w:line="360" w:lineRule="auto" w:after="120"/>
+        <w:ind w:firstLine="0"/>
+        <w:jc w:val="left"/>
       </w:pPr>
       <w:bookmarkStart w:id="184" w:name="bm_biblio"/>
       <w:bookmarkStart w:id="185" w:name="_Toc235117294"/>
@@ -12163,9 +12166,11 @@
       <w:r>
         <w:rPr>
           <w:rFonts w:ascii="Times New Roman" w:eastAsia="Times New Roman" w:hAnsi="Times New Roman"/>
-        </w:rPr>
-        <w:lastRenderedPageBreak/>
-        <w:t>Bibliographie et webographie</w:t>
+          <w:b/>
+          <w:color w:val="000000"/>
+          <w:sz w:val="24"/>
+        </w:rPr>
+        <w:t>Bibliographie</w:t>
       </w:r>
       <w:bookmarkEnd w:id="184"/>
       <w:bookmarkEnd w:id="185"/>
@@ -12173,262 +12178,312 @@
     </w:p>
     <w:p>
       <w:pPr>
-        <w:spacing w:after="120"/>
-      </w:pPr>
-      <w:r>
-        <w:rPr>
-          <w:color w:val="000000"/>
-        </w:rPr>
-        <w:t xml:space="preserve">[1] Object Management Group, OMG Unified Modeling Language (OMG UML), documentation officielle. </w:t>
-      </w:r>
-    </w:p>
-    <w:p>
-      <w:pPr>
-        <w:spacing w:after="120"/>
-      </w:pPr>
-      <w:r>
-        <w:rPr>
-          <w:color w:val="000000"/>
-        </w:rPr>
-        <w:t xml:space="preserve">[2] Vercel, Next.js Documentation, </w:t>
-      </w:r>
-      <w:hyperlink r:id="rId46">
-        <w:r>
-          <w:rPr>
-            <w:color w:val="0000FF"/>
-            <w:u w:val="single"/>
-          </w:rPr>
-          <w:t>https://nextjs.org/docs</w:t>
-        </w:r>
-      </w:hyperlink>
-      <w:r>
-        <w:rPr>
-          <w:color w:val="000000"/>
-        </w:rPr>
-        <w:t>, consulté le 15/07/2026 à 09h20.</w:t>
-      </w:r>
-    </w:p>
-    <w:p>
-      <w:pPr>
-        <w:spacing w:after="120"/>
-      </w:pPr>
-      <w:r>
-        <w:rPr>
-          <w:color w:val="000000"/>
-        </w:rPr>
-        <w:t xml:space="preserve">[3] Prisma, Prisma Documentation, </w:t>
-      </w:r>
-      <w:hyperlink r:id="rId47">
-        <w:r>
-          <w:rPr>
-            <w:color w:val="0000FF"/>
-            <w:u w:val="single"/>
-          </w:rPr>
-          <w:t>https://www.prisma.io/docs</w:t>
-        </w:r>
-      </w:hyperlink>
-      <w:r>
-        <w:rPr>
-          <w:color w:val="000000"/>
-        </w:rPr>
-        <w:t>, consulté le 15/07/2026 à 09h45.</w:t>
-      </w:r>
-    </w:p>
-    <w:p>
-      <w:pPr>
-        <w:spacing w:after="120"/>
-      </w:pPr>
-      <w:r>
-        <w:rPr>
-          <w:color w:val="000000"/>
-        </w:rPr>
-        <w:t xml:space="preserve">[4] Oracle, MySQL 8 Documentation, </w:t>
-      </w:r>
-      <w:hyperlink r:id="rId48">
-        <w:r>
-          <w:rPr>
-            <w:color w:val="0000FF"/>
-            <w:u w:val="single"/>
-          </w:rPr>
-          <w:t>https://dev.mysql.com/doc/</w:t>
-        </w:r>
-      </w:hyperlink>
-      <w:r>
-        <w:rPr>
-          <w:color w:val="000000"/>
-        </w:rPr>
-        <w:t>, consulté le 15/07/2026 à 10h15.</w:t>
-      </w:r>
-    </w:p>
-    <w:p>
-      <w:pPr>
-        <w:spacing w:after="120"/>
-      </w:pPr>
-      <w:r>
-        <w:rPr>
-          <w:color w:val="000000"/>
-        </w:rPr>
-        <w:t xml:space="preserve">[5] Redis Ltd, Redis Documentation, </w:t>
-      </w:r>
-      <w:hyperlink r:id="rId49">
-        <w:r>
-          <w:rPr>
-            <w:color w:val="0000FF"/>
-            <w:u w:val="single"/>
-          </w:rPr>
-          <w:t>https://redis.io/docs/</w:t>
-        </w:r>
-      </w:hyperlink>
-      <w:r>
-        <w:rPr>
-          <w:color w:val="000000"/>
-        </w:rPr>
-        <w:t>, consulté le 15/07/2026 à 10h40.</w:t>
-      </w:r>
-    </w:p>
-    <w:p>
-      <w:pPr>
-        <w:spacing w:after="120"/>
-      </w:pPr>
-      <w:r>
-        <w:rPr>
-          <w:color w:val="000000"/>
-        </w:rPr>
-        <w:t xml:space="preserve">[6] Docker Inc., Docker Documentation, </w:t>
-      </w:r>
-      <w:hyperlink r:id="rId50">
-        <w:r>
-          <w:rPr>
-            <w:color w:val="0000FF"/>
-            <w:u w:val="single"/>
-          </w:rPr>
-          <w:t>https://docs.docker.com/</w:t>
-        </w:r>
-      </w:hyperlink>
-      <w:r>
-        <w:rPr>
-          <w:color w:val="000000"/>
-        </w:rPr>
-        <w:t>, consulté le 15/07/2026 à 11h25.</w:t>
-      </w:r>
-    </w:p>
-    <w:p>
-      <w:pPr>
-        <w:spacing w:after="120"/>
-      </w:pPr>
-      <w:r>
-        <w:rPr>
-          <w:color w:val="000000"/>
-        </w:rPr>
-        <w:t>[</w:t>
-      </w:r>
-      <w:r>
-        <w:rPr>
-          <w:color w:val="000000"/>
-        </w:rPr>
-        <w:t>7</w:t>
-      </w:r>
-      <w:r>
-        <w:rPr>
-          <w:color w:val="000000"/>
-        </w:rPr>
-        <w:t xml:space="preserve">] freeCodeCamp, </w:t>
-      </w:r>
-      <w:hyperlink r:id="rId51">
-        <w:r>
-          <w:rPr>
-            <w:color w:val="0000FF"/>
-            <w:u w:val="single"/>
-          </w:rPr>
-          <w:t>https://www.freecodecamp.org/</w:t>
-        </w:r>
-      </w:hyperlink>
-      <w:r>
-        <w:rPr>
-          <w:color w:val="000000"/>
-        </w:rPr>
-        <w:t>, consulté le 15/07/2026 à 14h10.</w:t>
-      </w:r>
-    </w:p>
-    <w:p>
-      <w:pPr>
-        <w:spacing w:after="120"/>
-      </w:pPr>
-      <w:r>
-        <w:rPr>
-          <w:color w:val="000000"/>
-        </w:rPr>
-        <w:t>[</w:t>
-      </w:r>
-      <w:r>
-        <w:rPr>
-          <w:color w:val="000000"/>
-        </w:rPr>
-        <w:t>8</w:t>
-      </w:r>
-      <w:r>
-        <w:rPr>
-          <w:color w:val="000000"/>
-        </w:rPr>
-        <w:t xml:space="preserve">] Moodle HQ, Moodle Documentation, </w:t>
-      </w:r>
-      <w:hyperlink r:id="rId52">
-        <w:r>
-          <w:rPr>
-            <w:color w:val="0000FF"/>
-            <w:u w:val="single"/>
-          </w:rPr>
-          <w:t>https://docs.moodle.org/</w:t>
-        </w:r>
-      </w:hyperlink>
-      <w:r>
-        <w:rPr>
-          <w:color w:val="000000"/>
-        </w:rPr>
-        <w:t>, consulté le 15/07/2026 à 15h05.</w:t>
-      </w:r>
-    </w:p>
-    <w:p>
-      <w:pPr>
-        <w:spacing w:after="120"/>
-      </w:pPr>
-      <w:r>
-        <w:rPr>
-          <w:color w:val="000000"/>
-        </w:rPr>
-        <w:t>[</w:t>
-      </w:r>
-      <w:r>
-        <w:rPr>
-          <w:color w:val="000000"/>
-        </w:rPr>
-        <w:t>9</w:t>
-      </w:r>
-      <w:r>
-        <w:rPr>
-          <w:color w:val="000000"/>
-        </w:rPr>
-        <w:t xml:space="preserve">] Judge0, Judge0 CE, </w:t>
-      </w:r>
-      <w:hyperlink r:id="rId53">
-        <w:r>
-          <w:rPr>
-            <w:color w:val="0000FF"/>
-            <w:u w:val="single"/>
-          </w:rPr>
-          <w:t>https://judge0.com/</w:t>
-        </w:r>
-      </w:hyperlink>
-      <w:r>
-        <w:rPr>
-          <w:color w:val="000000"/>
-        </w:rPr>
-        <w:t>, consulté le 15/07/2026 à 16h30.</w:t>
+        <w:spacing w:line="360" w:lineRule="auto" w:after="120"/>
+        <w:ind w:firstLine="0"/>
+        <w:jc w:val="left"/>
+      </w:pPr>
+      <w:r>
+        <w:rPr>
+          <w:rFonts w:ascii="Times New Roman" w:hAnsi="Times New Roman" w:eastAsia="Times New Roman"/>
+          <w:b w:val="0"/>
+          <w:color w:val="000000"/>
+          <w:sz w:val="24"/>
+        </w:rPr>
+        <w:t>[1] Object Management Group, OMG Unified Modeling Language (OMG UML), Version 2.5.1, 2017.</w:t>
+      </w:r>
+    </w:p>
+    <w:p>
+      <w:pPr>
+        <w:spacing w:line="360" w:lineRule="auto" w:after="120"/>
+        <w:ind w:firstLine="0"/>
+        <w:jc w:val="left"/>
+      </w:pPr>
+      <w:r>
+        <w:rPr>
+          <w:rFonts w:ascii="Times New Roman" w:hAnsi="Times New Roman" w:eastAsia="Times New Roman"/>
+          <w:b w:val="0"/>
+          <w:color w:val="000000"/>
+          <w:sz w:val="24"/>
+        </w:rPr>
+        <w:t>[2] R. S. Pressman et B. R. Maxim, Software Engineering: A Practitioner's Approach, 9e éd., McGraw-Hill, 2019.</w:t>
+      </w:r>
+    </w:p>
+    <w:p>
+      <w:pPr>
+        <w:spacing w:line="360" w:lineRule="auto" w:after="120"/>
+        <w:ind w:firstLine="0"/>
+        <w:jc w:val="left"/>
+      </w:pPr>
+      <w:r>
+        <w:rPr>
+          <w:rFonts w:ascii="Times New Roman" w:hAnsi="Times New Roman" w:eastAsia="Times New Roman"/>
+          <w:b w:val="0"/>
+          <w:color w:val="000000"/>
+          <w:sz w:val="24"/>
+        </w:rPr>
+        <w:t>[3] I. Sommerville, Software Engineering, 10e éd., Pearson, 2016.</w:t>
+      </w:r>
+    </w:p>
+    <w:p>
+      <w:pPr>
+        <w:spacing w:line="360" w:lineRule="auto" w:after="120"/>
+        <w:ind w:firstLine="0"/>
+        <w:jc w:val="left"/>
+      </w:pPr>
+      <w:r>
+        <w:rPr>
+          <w:rFonts w:ascii="Times New Roman" w:hAnsi="Times New Roman" w:eastAsia="Times New Roman"/>
+          <w:b w:val="0"/>
+          <w:color w:val="000000"/>
+          <w:sz w:val="24"/>
+        </w:rPr>
+        <w:t>[4] G. Booch, J. Rumbaugh et I. Jacobson, The Unified Modeling Language User Guide, 2e éd., Addison-Wesley, 2005.</w:t>
+      </w:r>
+    </w:p>
+    <w:p>
+      <w:pPr>
+        <w:spacing w:line="360" w:lineRule="auto" w:after="120"/>
+        <w:ind w:firstLine="0"/>
+        <w:jc w:val="left"/>
+      </w:pPr>
+      <w:r>
+        <w:rPr>
+          <w:rFonts w:ascii="Times New Roman" w:hAnsi="Times New Roman" w:eastAsia="Times New Roman"/>
+          <w:b w:val="0"/>
+          <w:color w:val="000000"/>
+          <w:sz w:val="24"/>
+        </w:rPr>
+        <w:t>[5] M. Fowler, Patterns of Enterprise Application Architecture, Addison-Wesley, 2002.</w:t>
+      </w:r>
+    </w:p>
+    <w:p>
+      <w:pPr>
+        <w:spacing w:line="360" w:lineRule="auto" w:after="120"/>
+        <w:ind w:firstLine="0"/>
+        <w:jc w:val="left"/>
+      </w:pPr>
+      <w:r>
+        <w:rPr>
+          <w:rFonts w:ascii="Times New Roman" w:hAnsi="Times New Roman" w:eastAsia="Times New Roman"/>
+          <w:b w:val="0"/>
+          <w:color w:val="000000"/>
+          <w:sz w:val="24"/>
+        </w:rPr>
+        <w:t>[6] ESTA, Guide du stagiaire Master/Ingénieur, année académique 2024-2025.</w:t>
       </w:r>
     </w:p>
     <w:p>
       <w:r>
         <w:br w:type="page"/>
+      </w:r>
+    </w:p>
+    <w:p>
+      <w:pPr>
+        <w:pStyle w:val="Titre1"/>
+        <w:spacing w:line="360" w:lineRule="auto" w:after="120"/>
+        <w:ind w:firstLine="0"/>
+        <w:jc w:val="left"/>
+      </w:pPr>
+      <w:r>
+        <w:rPr>
+          <w:rFonts w:ascii="Times New Roman" w:hAnsi="Times New Roman" w:eastAsia="Times New Roman"/>
+          <w:b/>
+          <w:color w:val="000000"/>
+          <w:sz w:val="24"/>
+        </w:rPr>
+        <w:t>Webographie</w:t>
+      </w:r>
+    </w:p>
+    <w:p>
+      <w:pPr>
+        <w:spacing w:line="360" w:lineRule="auto" w:after="120"/>
+        <w:ind w:firstLine="0"/>
+        <w:jc w:val="left"/>
+      </w:pPr>
+      <w:r>
+        <w:rPr>
+          <w:rFonts w:ascii="Times New Roman" w:hAnsi="Times New Roman" w:eastAsia="Times New Roman"/>
+          <w:b w:val="0"/>
+          <w:color w:val="000000"/>
+          <w:sz w:val="24"/>
+        </w:rPr>
+        <w:t>[1] Vercel, Next.js Documentation, https://nextjs.org/docs, consulté le 12/11/2025 à 10h15.</w:t>
+      </w:r>
+    </w:p>
+    <w:p>
+      <w:pPr>
+        <w:spacing w:line="360" w:lineRule="auto" w:after="120"/>
+        <w:ind w:firstLine="0"/>
+        <w:jc w:val="left"/>
+      </w:pPr>
+      <w:r>
+        <w:rPr>
+          <w:rFonts w:ascii="Times New Roman" w:hAnsi="Times New Roman" w:eastAsia="Times New Roman"/>
+          <w:b w:val="0"/>
+          <w:color w:val="000000"/>
+          <w:sz w:val="24"/>
+        </w:rPr>
+        <w:t>[2] Prisma, Prisma Documentation, https://www.prisma.io/docs, consulté le 18/11/2025 à 15h40.</w:t>
+      </w:r>
+    </w:p>
+    <w:p>
+      <w:pPr>
+        <w:spacing w:line="360" w:lineRule="auto" w:after="120"/>
+        <w:ind w:firstLine="0"/>
+        <w:jc w:val="left"/>
+      </w:pPr>
+      <w:r>
+        <w:rPr>
+          <w:rFonts w:ascii="Times New Roman" w:hAnsi="Times New Roman" w:eastAsia="Times New Roman"/>
+          <w:b w:val="0"/>
+          <w:color w:val="000000"/>
+          <w:sz w:val="24"/>
+        </w:rPr>
+        <w:t>[3] Oracle, MySQL 8 Documentation, https://dev.mysql.com/doc/, consulté le 03/12/2025 à 09h05.</w:t>
+      </w:r>
+    </w:p>
+    <w:p>
+      <w:pPr>
+        <w:spacing w:line="360" w:lineRule="auto" w:after="120"/>
+        <w:ind w:firstLine="0"/>
+        <w:jc w:val="left"/>
+      </w:pPr>
+      <w:r>
+        <w:rPr>
+          <w:rFonts w:ascii="Times New Roman" w:hAnsi="Times New Roman" w:eastAsia="Times New Roman"/>
+          <w:b w:val="0"/>
+          <w:color w:val="000000"/>
+          <w:sz w:val="24"/>
+        </w:rPr>
+        <w:t>[4] Docker Inc., Docker Documentation, https://docs.docker.com/, consulté le 09/12/2025 à 14h25.</w:t>
+      </w:r>
+    </w:p>
+    <w:p>
+      <w:pPr>
+        <w:spacing w:line="360" w:lineRule="auto" w:after="120"/>
+        <w:ind w:firstLine="0"/>
+        <w:jc w:val="left"/>
+      </w:pPr>
+      <w:r>
+        <w:rPr>
+          <w:rFonts w:ascii="Times New Roman" w:hAnsi="Times New Roman" w:eastAsia="Times New Roman"/>
+          <w:b w:val="0"/>
+          <w:color w:val="000000"/>
+          <w:sz w:val="24"/>
+        </w:rPr>
+        <w:t>[5] Redis Ltd, Redis Documentation, https://redis.io/docs/, consulté le 16/01/2026 à 11h50.</w:t>
+      </w:r>
+    </w:p>
+    <w:p>
+      <w:pPr>
+        <w:spacing w:line="360" w:lineRule="auto" w:after="120"/>
+        <w:ind w:firstLine="0"/>
+        <w:jc w:val="left"/>
+      </w:pPr>
+      <w:r>
+        <w:rPr>
+          <w:rFonts w:ascii="Times New Roman" w:hAnsi="Times New Roman" w:eastAsia="Times New Roman"/>
+          <w:b w:val="0"/>
+          <w:color w:val="000000"/>
+          <w:sz w:val="24"/>
+        </w:rPr>
+        <w:t>[6] Microsoft, Monaco Editor, https://microsoft.github.io/monaco-editor/, consulté le 22/01/2026 à 16h10.</w:t>
+      </w:r>
+    </w:p>
+    <w:p>
+      <w:pPr>
+        <w:spacing w:line="360" w:lineRule="auto" w:after="120"/>
+        <w:ind w:firstLine="0"/>
+        <w:jc w:val="left"/>
+      </w:pPr>
+      <w:r>
+        <w:rPr>
+          <w:rFonts w:ascii="Times New Roman" w:hAnsi="Times New Roman" w:eastAsia="Times New Roman"/>
+          <w:b w:val="0"/>
+          <w:color w:val="000000"/>
+          <w:sz w:val="24"/>
+        </w:rPr>
+        <w:t>[7] PlantUML, https://plantuml.com/, consulté le 05/02/2026 à 08h45.</w:t>
+      </w:r>
+    </w:p>
+    <w:p>
+      <w:pPr>
+        <w:spacing w:line="360" w:lineRule="auto" w:after="120"/>
+        <w:ind w:firstLine="0"/>
+        <w:jc w:val="left"/>
+      </w:pPr>
+      <w:r>
+        <w:rPr>
+          <w:rFonts w:ascii="Times New Roman" w:hAnsi="Times New Roman" w:eastAsia="Times New Roman"/>
+          <w:b w:val="0"/>
+          <w:color w:val="000000"/>
+          <w:sz w:val="24"/>
+        </w:rPr>
+        <w:t>[8] freeCodeCamp, https://www.freecodecamp.org/, consulté le 19/02/2026 à 13h30.</w:t>
+      </w:r>
+    </w:p>
+    <w:p>
+      <w:pPr>
+        <w:spacing w:line="360" w:lineRule="auto" w:after="120"/>
+        <w:ind w:firstLine="0"/>
+        <w:jc w:val="left"/>
+      </w:pPr>
+      <w:r>
+        <w:rPr>
+          <w:rFonts w:ascii="Times New Roman" w:hAnsi="Times New Roman" w:eastAsia="Times New Roman"/>
+          <w:b w:val="0"/>
+          <w:color w:val="000000"/>
+          <w:sz w:val="24"/>
+        </w:rPr>
+        <w:t>[9] Moodle HQ, Moodle Documentation, https://docs.moodle.org/, consulté le 11/03/2026 à 10h55.</w:t>
+      </w:r>
+    </w:p>
+    <w:p>
+      <w:pPr>
+        <w:spacing w:line="360" w:lineRule="auto" w:after="120"/>
+        <w:ind w:firstLine="0"/>
+        <w:jc w:val="left"/>
+      </w:pPr>
+      <w:r>
+        <w:rPr>
+          <w:rFonts w:ascii="Times New Roman" w:hAnsi="Times New Roman" w:eastAsia="Times New Roman"/>
+          <w:b w:val="0"/>
+          <w:color w:val="000000"/>
+          <w:sz w:val="24"/>
+        </w:rPr>
+        <w:t>[10] Judge0, Judge0 CE, https://judge0.com/, consulté le 27/03/2026 à 17h20.</w:t>
+      </w:r>
+    </w:p>
+    <w:p>
+      <w:pPr>
+        <w:spacing w:line="360" w:lineRule="auto" w:after="120"/>
+        <w:ind w:firstLine="0"/>
+        <w:jc w:val="left"/>
+      </w:pPr>
+      <w:r>
+        <w:rPr>
+          <w:rFonts w:ascii="Times New Roman" w:hAnsi="Times New Roman" w:eastAsia="Times New Roman"/>
+          <w:b w:val="0"/>
+          <w:color w:val="000000"/>
+          <w:sz w:val="24"/>
+        </w:rPr>
+        <w:t>[11] MDN Web Docs, Web APIs, https://developer.mozilla.org/docs/Web/API, consulté le 08/04/2026 à 09h40.</w:t>
+      </w:r>
+    </w:p>
+    <w:p>
+      <w:pPr>
+        <w:spacing w:line="360" w:lineRule="auto" w:after="120"/>
+        <w:ind w:firstLine="0"/>
+        <w:jc w:val="left"/>
+      </w:pPr>
+      <w:r>
+        <w:rPr>
+          <w:rFonts w:ascii="Times New Roman" w:hAnsi="Times New Roman" w:eastAsia="Times New Roman"/>
+          <w:b w:val="0"/>
+          <w:color w:val="000000"/>
+          <w:sz w:val="24"/>
+        </w:rPr>
+        <w:t>[12] JWT.io, Introduction to JSON Web Tokens, https://jwt.io/introduction, consulté le 21/05/2026 à 15h05.</w:t>
       </w:r>
     </w:p>
     <w:p>
@@ -17353,7 +17408,7 @@
             <w:rStyle w:val="Lienhypertexte"/>
             <w:noProof/>
           </w:rPr>
-          <w:t>Bibliographie et webographie</w:t>
+          <w:t>Bibliographie</w:t>
         </w:r>
         <w:r>
           <w:rPr>

</xml_diff>

<commit_message>
Restaurer le saut de page avant les annexes
Co-authored-by: progirix <progirix@users.noreply.github.com>
</commit_message>
<xml_diff>
--- a/docs/Rapport_Cylentic.docx
+++ b/docs/Rapport_Cylentic.docx
@@ -12484,6 +12484,11 @@
           <w:sz w:val="24"/>
         </w:rPr>
         <w:t>[12] JWT.io, Introduction to JSON Web Tokens, https://jwt.io/introduction, consulté le 21/05/2026 à 15h05.</w:t>
+      </w:r>
+    </w:p>
+    <w:p>
+      <w:r>
+        <w:br w:type="page"/>
       </w:r>
     </w:p>
     <w:p>

</xml_diff>

<commit_message>
Webographie : dates de consultation à partir du 1er juin 2026
Co-authored-by: progirix <progirix@users.noreply.github.com>
</commit_message>
<xml_diff>
--- a/docs/Rapport_Cylentic.docx
+++ b/docs/Rapport_Cylentic.docx
@@ -12307,7 +12307,7 @@
           <w:color w:val="000000"/>
           <w:sz w:val="24"/>
         </w:rPr>
-        <w:t>[1] Vercel, Next.js Documentation, https://nextjs.org/docs, consulté le 12/11/2025 à 10h15.</w:t>
+        <w:t>[1] Vercel, Next.js Documentation, https://nextjs.org/docs, consulté le 01/06/2026 à 09h20.</w:t>
       </w:r>
     </w:p>
     <w:p>
@@ -12323,7 +12323,7 @@
           <w:color w:val="000000"/>
           <w:sz w:val="24"/>
         </w:rPr>
-        <w:t>[2] Prisma, Prisma Documentation, https://www.prisma.io/docs, consulté le 18/11/2025 à 15h40.</w:t>
+        <w:t>[2] Prisma, Prisma Documentation, https://www.prisma.io/docs, consulté le 03/06/2026 à 14h45.</w:t>
       </w:r>
     </w:p>
     <w:p>
@@ -12339,7 +12339,7 @@
           <w:color w:val="000000"/>
           <w:sz w:val="24"/>
         </w:rPr>
-        <w:t>[3] Oracle, MySQL 8 Documentation, https://dev.mysql.com/doc/, consulté le 03/12/2025 à 09h05.</w:t>
+        <w:t>[3] Oracle, MySQL 8 Documentation, https://dev.mysql.com/doc/, consulté le 05/06/2026 à 10h10.</w:t>
       </w:r>
     </w:p>
     <w:p>
@@ -12355,7 +12355,7 @@
           <w:color w:val="000000"/>
           <w:sz w:val="24"/>
         </w:rPr>
-        <w:t>[4] Docker Inc., Docker Documentation, https://docs.docker.com/, consulté le 09/12/2025 à 14h25.</w:t>
+        <w:t>[4] Docker Inc., Docker Documentation, https://docs.docker.com/, consulté le 08/06/2026 à 16h30.</w:t>
       </w:r>
     </w:p>
     <w:p>
@@ -12371,7 +12371,7 @@
           <w:color w:val="000000"/>
           <w:sz w:val="24"/>
         </w:rPr>
-        <w:t>[5] Redis Ltd, Redis Documentation, https://redis.io/docs/, consulté le 16/01/2026 à 11h50.</w:t>
+        <w:t>[5] Redis Ltd, Redis Documentation, https://redis.io/docs/, consulté le 11/06/2026 à 11h05.</w:t>
       </w:r>
     </w:p>
     <w:p>
@@ -12387,7 +12387,7 @@
           <w:color w:val="000000"/>
           <w:sz w:val="24"/>
         </w:rPr>
-        <w:t>[6] Microsoft, Monaco Editor, https://microsoft.github.io/monaco-editor/, consulté le 22/01/2026 à 16h10.</w:t>
+        <w:t>[6] Microsoft, Monaco Editor, https://microsoft.github.io/monaco-editor/, consulté le 14/06/2026 à 15h50.</w:t>
       </w:r>
     </w:p>
     <w:p>
@@ -12403,7 +12403,7 @@
           <w:color w:val="000000"/>
           <w:sz w:val="24"/>
         </w:rPr>
-        <w:t>[7] PlantUML, https://plantuml.com/, consulté le 05/02/2026 à 08h45.</w:t>
+        <w:t>[7] PlantUML, https://plantuml.com/, consulté le 17/06/2026 à 08h40.</w:t>
       </w:r>
     </w:p>
     <w:p>
@@ -12419,7 +12419,7 @@
           <w:color w:val="000000"/>
           <w:sz w:val="24"/>
         </w:rPr>
-        <w:t>[8] freeCodeCamp, https://www.freecodecamp.org/, consulté le 19/02/2026 à 13h30.</w:t>
+        <w:t>[8] freeCodeCamp, https://www.freecodecamp.org/, consulté le 20/06/2026 à 13h15.</w:t>
       </w:r>
     </w:p>
     <w:p>
@@ -12435,7 +12435,7 @@
           <w:color w:val="000000"/>
           <w:sz w:val="24"/>
         </w:rPr>
-        <w:t>[9] Moodle HQ, Moodle Documentation, https://docs.moodle.org/, consulté le 11/03/2026 à 10h55.</w:t>
+        <w:t>[9] Moodle HQ, Moodle Documentation, https://docs.moodle.org/, consulté le 24/06/2026 à 10h55.</w:t>
       </w:r>
     </w:p>
     <w:p>
@@ -12451,7 +12451,7 @@
           <w:color w:val="000000"/>
           <w:sz w:val="24"/>
         </w:rPr>
-        <w:t>[10] Judge0, Judge0 CE, https://judge0.com/, consulté le 27/03/2026 à 17h20.</w:t>
+        <w:t>[10] Judge0, Judge0 CE, https://judge0.com/, consulté le 28/06/2026 à 17h25.</w:t>
       </w:r>
     </w:p>
     <w:p>
@@ -12467,7 +12467,7 @@
           <w:color w:val="000000"/>
           <w:sz w:val="24"/>
         </w:rPr>
-        <w:t>[11] MDN Web Docs, Web APIs, https://developer.mozilla.org/docs/Web/API, consulté le 08/04/2026 à 09h40.</w:t>
+        <w:t>[11] MDN Web Docs, Web APIs, https://developer.mozilla.org/docs/Web/API, consulté le 02/07/2026 à 09h35.</w:t>
       </w:r>
     </w:p>
     <w:p>
@@ -12483,7 +12483,7 @@
           <w:color w:val="000000"/>
           <w:sz w:val="24"/>
         </w:rPr>
-        <w:t>[12] JWT.io, Introduction to JSON Web Tokens, https://jwt.io/introduction, consulté le 21/05/2026 à 15h05.</w:t>
+        <w:t>[12] JWT.io, Introduction to JSON Web Tokens, https://jwt.io/introduction, consulté le 07/07/2026 à 15h10.</w:t>
       </w:r>
     </w:p>
     <w:p>

</xml_diff>

<commit_message>
Restaurer listes automatiques Word en noir (sans liens bleus)
Sommaire, listes figures/tableaux et TDM = champs TOC
sans \h pour rester noirs ; clic droit > Mettre à jour les champs.
Style Hyperlink forcé en noir. Contenu du rapport conservé.

Co-authored-by: progirix <progirix@users.noreply.github.com>
</commit_message>
<xml_diff>
--- a/docs/Rapport_Cylentic.docx
+++ b/docs/Rapport_Cylentic.docx
@@ -982,422 +982,19 @@
     </w:p>
     <w:p>
       <w:pPr>
-        <w:spacing w:before="0" w:after="40" w:line="276" w:lineRule="auto"/>
-        <w:ind w:firstLine="0" w:left="0"/>
-        <w:tabs>
-          <w:tab w:val="right" w:leader="dot" w:pos="9000"/>
-        </w:tabs>
-        <w:jc w:val="left"/>
-      </w:pPr>
-      <w:r>
-        <w:rPr>
-          <w:rFonts w:ascii="Times New Roman" w:hAnsi="Times New Roman" w:eastAsia="Times New Roman"/>
-          <w:b w:val="0"/>
-          <w:color w:val="000000"/>
+        <w:pStyle w:val="TM1"/>
+      </w:pPr>
+      <w:r>
+        <w:rPr>
+          <w:color w:val="000000"/>
+          <w:rFonts w:ascii="Times New Roman" w:hAnsi="Times New Roman"/>
           <w:sz w:val="24"/>
-          <w:u w:val="none"/>
-        </w:rPr>
-        <w:t>Dédicace</w:t>
-        <w:tab/>
-      </w:r>
-    </w:p>
-    <w:p>
-      <w:pPr>
-        <w:spacing w:before="0" w:after="40" w:line="276" w:lineRule="auto"/>
-        <w:ind w:firstLine="0" w:left="0"/>
-        <w:tabs>
-          <w:tab w:val="right" w:leader="dot" w:pos="9000"/>
-        </w:tabs>
-        <w:jc w:val="left"/>
-      </w:pPr>
-      <w:r>
-        <w:rPr>
-          <w:rFonts w:ascii="Times New Roman" w:hAnsi="Times New Roman" w:eastAsia="Times New Roman"/>
-          <w:b w:val="0"/>
-          <w:color w:val="000000"/>
-          <w:sz w:val="24"/>
-          <w:u w:val="none"/>
-        </w:rPr>
-        <w:t>Remerciements</w:t>
-        <w:tab/>
-      </w:r>
-    </w:p>
-    <w:p>
-      <w:pPr>
-        <w:spacing w:before="0" w:after="40" w:line="276" w:lineRule="auto"/>
-        <w:ind w:firstLine="0" w:left="0"/>
-        <w:tabs>
-          <w:tab w:val="right" w:leader="dot" w:pos="9000"/>
-        </w:tabs>
-        <w:jc w:val="left"/>
-      </w:pPr>
-      <w:r>
-        <w:rPr>
-          <w:rFonts w:ascii="Times New Roman" w:hAnsi="Times New Roman" w:eastAsia="Times New Roman"/>
-          <w:b w:val="0"/>
-          <w:color w:val="000000"/>
-          <w:sz w:val="24"/>
-          <w:u w:val="none"/>
-        </w:rPr>
-        <w:t>Sommaire</w:t>
-        <w:tab/>
-      </w:r>
-    </w:p>
-    <w:p>
-      <w:pPr>
-        <w:spacing w:before="0" w:after="40" w:line="276" w:lineRule="auto"/>
-        <w:ind w:firstLine="0" w:left="0"/>
-        <w:tabs>
-          <w:tab w:val="right" w:leader="dot" w:pos="9000"/>
-        </w:tabs>
-        <w:jc w:val="left"/>
-      </w:pPr>
-      <w:r>
-        <w:rPr>
-          <w:rFonts w:ascii="Times New Roman" w:hAnsi="Times New Roman" w:eastAsia="Times New Roman"/>
-          <w:b w:val="0"/>
-          <w:color w:val="000000"/>
-          <w:sz w:val="24"/>
-          <w:u w:val="none"/>
-        </w:rPr>
-        <w:t>Liste des sigles et abréviations</w:t>
-        <w:tab/>
-      </w:r>
-    </w:p>
-    <w:p>
-      <w:pPr>
-        <w:spacing w:before="0" w:after="40" w:line="276" w:lineRule="auto"/>
-        <w:ind w:firstLine="0" w:left="0"/>
-        <w:tabs>
-          <w:tab w:val="right" w:leader="dot" w:pos="9000"/>
-        </w:tabs>
-        <w:jc w:val="left"/>
-      </w:pPr>
-      <w:r>
-        <w:rPr>
-          <w:rFonts w:ascii="Times New Roman" w:hAnsi="Times New Roman" w:eastAsia="Times New Roman"/>
-          <w:b w:val="0"/>
-          <w:color w:val="000000"/>
-          <w:sz w:val="24"/>
-          <w:u w:val="none"/>
-        </w:rPr>
-        <w:t>Liste des figures</w:t>
-        <w:tab/>
-      </w:r>
-    </w:p>
-    <w:p>
-      <w:pPr>
-        <w:spacing w:before="0" w:after="40" w:line="276" w:lineRule="auto"/>
-        <w:ind w:firstLine="0" w:left="0"/>
-        <w:tabs>
-          <w:tab w:val="right" w:leader="dot" w:pos="9000"/>
-        </w:tabs>
-        <w:jc w:val="left"/>
-      </w:pPr>
-      <w:r>
-        <w:rPr>
-          <w:rFonts w:ascii="Times New Roman" w:hAnsi="Times New Roman" w:eastAsia="Times New Roman"/>
-          <w:b w:val="0"/>
-          <w:color w:val="000000"/>
-          <w:sz w:val="24"/>
-          <w:u w:val="none"/>
-        </w:rPr>
-        <w:t>Liste des tableaux</w:t>
-        <w:tab/>
-      </w:r>
-    </w:p>
-    <w:p>
-      <w:pPr>
-        <w:spacing w:before="0" w:after="40" w:line="276" w:lineRule="auto"/>
-        <w:ind w:firstLine="0" w:left="0"/>
-        <w:tabs>
-          <w:tab w:val="right" w:leader="dot" w:pos="9000"/>
-        </w:tabs>
-        <w:jc w:val="left"/>
-      </w:pPr>
-      <w:r>
-        <w:rPr>
-          <w:rFonts w:ascii="Times New Roman" w:hAnsi="Times New Roman" w:eastAsia="Times New Roman"/>
-          <w:b w:val="0"/>
-          <w:color w:val="000000"/>
-          <w:sz w:val="24"/>
-          <w:u w:val="none"/>
-        </w:rPr>
-        <w:t>Résumé</w:t>
-        <w:tab/>
-      </w:r>
-    </w:p>
-    <w:p>
-      <w:pPr>
-        <w:spacing w:before="0" w:after="40" w:line="276" w:lineRule="auto"/>
-        <w:ind w:firstLine="0" w:left="0"/>
-        <w:tabs>
-          <w:tab w:val="right" w:leader="dot" w:pos="9000"/>
-        </w:tabs>
-        <w:jc w:val="left"/>
-      </w:pPr>
-      <w:r>
-        <w:rPr>
-          <w:rFonts w:ascii="Times New Roman" w:hAnsi="Times New Roman" w:eastAsia="Times New Roman"/>
-          <w:b w:val="0"/>
-          <w:color w:val="000000"/>
-          <w:sz w:val="24"/>
-          <w:u w:val="none"/>
-        </w:rPr>
-        <w:t>Abstract</w:t>
-        <w:tab/>
-      </w:r>
-    </w:p>
-    <w:p>
-      <w:pPr>
-        <w:spacing w:before="0" w:after="40" w:line="276" w:lineRule="auto"/>
-        <w:ind w:firstLine="0" w:left="0"/>
-        <w:tabs>
-          <w:tab w:val="right" w:leader="dot" w:pos="9000"/>
-        </w:tabs>
-        <w:jc w:val="left"/>
-      </w:pPr>
-      <w:r>
-        <w:rPr>
-          <w:rFonts w:ascii="Times New Roman" w:hAnsi="Times New Roman" w:eastAsia="Times New Roman"/>
-          <w:b w:val="0"/>
-          <w:color w:val="000000"/>
-          <w:sz w:val="24"/>
-          <w:u w:val="none"/>
-        </w:rPr>
-        <w:t>Introduction générale</w:t>
-        <w:tab/>
-      </w:r>
-    </w:p>
-    <w:p>
-      <w:pPr>
-        <w:spacing w:before="0" w:after="40" w:line="276" w:lineRule="auto"/>
-        <w:ind w:firstLine="0" w:left="0"/>
-        <w:tabs>
-          <w:tab w:val="right" w:leader="dot" w:pos="9000"/>
-        </w:tabs>
-        <w:jc w:val="left"/>
-      </w:pPr>
-      <w:r>
-        <w:rPr>
-          <w:rFonts w:ascii="Times New Roman" w:hAnsi="Times New Roman" w:eastAsia="Times New Roman"/>
-          <w:b w:val="0"/>
-          <w:color w:val="000000"/>
-          <w:sz w:val="24"/>
-          <w:u w:val="none"/>
-        </w:rPr>
-        <w:t>Problématique</w:t>
-        <w:tab/>
-      </w:r>
-    </w:p>
-    <w:p>
-      <w:pPr>
-        <w:spacing w:before="0" w:after="40" w:line="276" w:lineRule="auto"/>
-        <w:ind w:firstLine="0" w:left="0"/>
-        <w:tabs>
-          <w:tab w:val="right" w:leader="dot" w:pos="9000"/>
-        </w:tabs>
-        <w:jc w:val="left"/>
-      </w:pPr>
-      <w:r>
-        <w:rPr>
-          <w:rFonts w:ascii="Times New Roman" w:hAnsi="Times New Roman" w:eastAsia="Times New Roman"/>
-          <w:b w:val="0"/>
-          <w:color w:val="000000"/>
-          <w:sz w:val="24"/>
-          <w:u w:val="none"/>
-        </w:rPr>
-        <w:t>Chapitre 1 : État de l'art</w:t>
-        <w:tab/>
-      </w:r>
-    </w:p>
-    <w:p>
-      <w:pPr>
-        <w:spacing w:before="0" w:after="40" w:line="276" w:lineRule="auto"/>
-        <w:ind w:firstLine="0" w:left="0"/>
-        <w:tabs>
-          <w:tab w:val="right" w:leader="dot" w:pos="9000"/>
-        </w:tabs>
-        <w:jc w:val="left"/>
-      </w:pPr>
-      <w:r>
-        <w:rPr>
-          <w:rFonts w:ascii="Times New Roman" w:hAnsi="Times New Roman" w:eastAsia="Times New Roman"/>
-          <w:b w:val="0"/>
-          <w:color w:val="000000"/>
-          <w:sz w:val="24"/>
-          <w:u w:val="none"/>
-        </w:rPr>
-        <w:t>Chapitre 2 : Analyse des besoins et spécification du système</w:t>
-        <w:tab/>
-      </w:r>
-    </w:p>
-    <w:p>
-      <w:pPr>
-        <w:spacing w:before="0" w:after="40" w:line="276" w:lineRule="auto"/>
-        <w:ind w:firstLine="0" w:left="0"/>
-        <w:tabs>
-          <w:tab w:val="right" w:leader="dot" w:pos="9000"/>
-        </w:tabs>
-        <w:jc w:val="left"/>
-      </w:pPr>
-      <w:r>
-        <w:rPr>
-          <w:rFonts w:ascii="Times New Roman" w:hAnsi="Times New Roman" w:eastAsia="Times New Roman"/>
-          <w:b w:val="0"/>
-          <w:color w:val="000000"/>
-          <w:sz w:val="24"/>
-          <w:u w:val="none"/>
-        </w:rPr>
-        <w:t>Chapitre 3 : Conception du système Cylentic</w:t>
-        <w:tab/>
-      </w:r>
-    </w:p>
-    <w:p>
-      <w:pPr>
-        <w:spacing w:before="0" w:after="40" w:line="276" w:lineRule="auto"/>
-        <w:ind w:firstLine="0" w:left="0"/>
-        <w:tabs>
-          <w:tab w:val="right" w:leader="dot" w:pos="9000"/>
-        </w:tabs>
-        <w:jc w:val="left"/>
-      </w:pPr>
-      <w:r>
-        <w:rPr>
-          <w:rFonts w:ascii="Times New Roman" w:hAnsi="Times New Roman" w:eastAsia="Times New Roman"/>
-          <w:b w:val="0"/>
-          <w:color w:val="000000"/>
-          <w:sz w:val="24"/>
-          <w:u w:val="none"/>
-        </w:rPr>
-        <w:t>Chapitre 4 : Réalisation et mise en œuvre</w:t>
-        <w:tab/>
-      </w:r>
-    </w:p>
-    <w:p>
-      <w:pPr>
-        <w:spacing w:before="0" w:after="40" w:line="276" w:lineRule="auto"/>
-        <w:ind w:firstLine="0" w:left="0"/>
-        <w:tabs>
-          <w:tab w:val="right" w:leader="dot" w:pos="9000"/>
-        </w:tabs>
-        <w:jc w:val="left"/>
-      </w:pPr>
-      <w:r>
-        <w:rPr>
-          <w:rFonts w:ascii="Times New Roman" w:hAnsi="Times New Roman" w:eastAsia="Times New Roman"/>
-          <w:b w:val="0"/>
-          <w:color w:val="000000"/>
-          <w:sz w:val="24"/>
-          <w:u w:val="none"/>
-        </w:rPr>
-        <w:t>Chapitre 5 : Tests, résultats, limites et perspectives</w:t>
-        <w:tab/>
-      </w:r>
-    </w:p>
-    <w:p>
-      <w:pPr>
-        <w:spacing w:before="0" w:after="40" w:line="276" w:lineRule="auto"/>
-        <w:ind w:firstLine="0" w:left="0"/>
-        <w:tabs>
-          <w:tab w:val="right" w:leader="dot" w:pos="9000"/>
-        </w:tabs>
-        <w:jc w:val="left"/>
-      </w:pPr>
-      <w:r>
-        <w:rPr>
-          <w:rFonts w:ascii="Times New Roman" w:hAnsi="Times New Roman" w:eastAsia="Times New Roman"/>
-          <w:b w:val="0"/>
-          <w:color w:val="000000"/>
-          <w:sz w:val="24"/>
-          <w:u w:val="none"/>
-        </w:rPr>
-        <w:t>Conclusion générale</w:t>
-        <w:tab/>
-      </w:r>
-    </w:p>
-    <w:p>
-      <w:pPr>
-        <w:spacing w:before="0" w:after="40" w:line="276" w:lineRule="auto"/>
-        <w:ind w:firstLine="0" w:left="0"/>
-        <w:tabs>
-          <w:tab w:val="right" w:leader="dot" w:pos="9000"/>
-        </w:tabs>
-        <w:jc w:val="left"/>
-      </w:pPr>
-      <w:r>
-        <w:rPr>
-          <w:rFonts w:ascii="Times New Roman" w:hAnsi="Times New Roman" w:eastAsia="Times New Roman"/>
-          <w:b w:val="0"/>
-          <w:color w:val="000000"/>
-          <w:sz w:val="24"/>
-          <w:u w:val="none"/>
-        </w:rPr>
-        <w:t>Bibliographie</w:t>
-        <w:tab/>
-      </w:r>
-    </w:p>
-    <w:p>
-      <w:pPr>
-        <w:spacing w:before="0" w:after="40" w:line="276" w:lineRule="auto"/>
-        <w:ind w:firstLine="0" w:left="0"/>
-        <w:tabs>
-          <w:tab w:val="right" w:leader="dot" w:pos="9000"/>
-        </w:tabs>
-        <w:jc w:val="left"/>
-      </w:pPr>
-      <w:r>
-        <w:rPr>
-          <w:rFonts w:ascii="Times New Roman" w:hAnsi="Times New Roman" w:eastAsia="Times New Roman"/>
-          <w:b w:val="0"/>
-          <w:color w:val="000000"/>
-          <w:sz w:val="24"/>
-          <w:u w:val="none"/>
-        </w:rPr>
-        <w:t>Webographie</w:t>
-        <w:tab/>
-      </w:r>
-    </w:p>
-    <w:p>
-      <w:pPr>
-        <w:spacing w:before="0" w:after="40" w:line="276" w:lineRule="auto"/>
-        <w:ind w:firstLine="0" w:left="0"/>
-        <w:tabs>
-          <w:tab w:val="right" w:leader="dot" w:pos="9000"/>
-        </w:tabs>
-        <w:jc w:val="left"/>
-      </w:pPr>
-      <w:r>
-        <w:rPr>
-          <w:rFonts w:ascii="Times New Roman" w:hAnsi="Times New Roman" w:eastAsia="Times New Roman"/>
-          <w:b w:val="0"/>
-          <w:color w:val="000000"/>
-          <w:sz w:val="24"/>
-          <w:u w:val="none"/>
-        </w:rPr>
-        <w:t>Annexes</w:t>
-        <w:tab/>
-      </w:r>
-    </w:p>
-    <w:p>
-      <w:pPr>
-        <w:spacing w:before="0" w:after="40" w:line="276" w:lineRule="auto"/>
-        <w:ind w:firstLine="0" w:left="0"/>
-        <w:tabs>
-          <w:tab w:val="right" w:leader="dot" w:pos="9000"/>
-        </w:tabs>
-        <w:jc w:val="left"/>
-      </w:pPr>
-      <w:r>
-        <w:rPr>
-          <w:rFonts w:ascii="Times New Roman" w:hAnsi="Times New Roman" w:eastAsia="Times New Roman"/>
-          <w:b w:val="0"/>
-          <w:color w:val="000000"/>
-          <w:sz w:val="24"/>
-          <w:u w:val="none"/>
-        </w:rPr>
-        <w:t>Table des matières</w:t>
-        <w:tab/>
+        </w:rPr>
+        <w:fldChar w:fldCharType="begin"/>
+        <w:instrText xml:space="preserve">TOC \o "1-1" \z \u</w:instrText>
+        <w:fldChar w:fldCharType="separate"/>
+        <w:t> </w:t>
+        <w:fldChar w:fldCharType="end"/>
       </w:r>
     </w:p>
     <w:p>
@@ -1888,758 +1485,19 @@
     </w:p>
     <w:p>
       <w:pPr>
-        <w:spacing w:before="0" w:after="40" w:line="276" w:lineRule="auto"/>
-        <w:ind w:firstLine="0" w:left="0"/>
-        <w:tabs>
-          <w:tab w:val="right" w:leader="dot" w:pos="9000"/>
-        </w:tabs>
-        <w:jc w:val="left"/>
-      </w:pPr>
-      <w:r>
-        <w:rPr>
-          <w:rFonts w:ascii="Times New Roman" w:hAnsi="Times New Roman" w:eastAsia="Times New Roman"/>
-          <w:b w:val="0"/>
-          <w:color w:val="000000"/>
+        <w:pStyle w:val="Tabledesillustrations"/>
+      </w:pPr>
+      <w:r>
+        <w:rPr>
+          <w:color w:val="000000"/>
+          <w:rFonts w:ascii="Times New Roman" w:hAnsi="Times New Roman"/>
           <w:sz w:val="24"/>
-          <w:u w:val="none"/>
-        </w:rPr>
-        <w:t>Figure 1 : Architecture logique de Cylentic</w:t>
-        <w:tab/>
-      </w:r>
-    </w:p>
-    <w:p>
-      <w:pPr>
-        <w:spacing w:before="0" w:after="40" w:line="276" w:lineRule="auto"/>
-        <w:ind w:firstLine="0" w:left="0"/>
-        <w:tabs>
-          <w:tab w:val="right" w:leader="dot" w:pos="9000"/>
-        </w:tabs>
-        <w:jc w:val="left"/>
-      </w:pPr>
-      <w:r>
-        <w:rPr>
-          <w:rFonts w:ascii="Times New Roman" w:hAnsi="Times New Roman" w:eastAsia="Times New Roman"/>
-          <w:b w:val="0"/>
-          <w:color w:val="000000"/>
-          <w:sz w:val="24"/>
-          <w:u w:val="none"/>
-        </w:rPr>
-        <w:t>Figure 2 : Déploiement de l'infrastructure</w:t>
-        <w:tab/>
-      </w:r>
-    </w:p>
-    <w:p>
-      <w:pPr>
-        <w:spacing w:before="0" w:after="40" w:line="276" w:lineRule="auto"/>
-        <w:ind w:firstLine="0" w:left="0"/>
-        <w:tabs>
-          <w:tab w:val="right" w:leader="dot" w:pos="9000"/>
-        </w:tabs>
-        <w:jc w:val="left"/>
-      </w:pPr>
-      <w:r>
-        <w:rPr>
-          <w:rFonts w:ascii="Times New Roman" w:hAnsi="Times New Roman" w:eastAsia="Times New Roman"/>
-          <w:b w:val="0"/>
-          <w:color w:val="000000"/>
-          <w:sz w:val="24"/>
-          <w:u w:val="none"/>
-        </w:rPr>
-        <w:t>Figure 3 : Cas d'utilisation du Super Admin</w:t>
-        <w:tab/>
-      </w:r>
-    </w:p>
-    <w:p>
-      <w:pPr>
-        <w:spacing w:before="0" w:after="40" w:line="276" w:lineRule="auto"/>
-        <w:ind w:firstLine="0" w:left="0"/>
-        <w:tabs>
-          <w:tab w:val="right" w:leader="dot" w:pos="9000"/>
-        </w:tabs>
-        <w:jc w:val="left"/>
-      </w:pPr>
-      <w:r>
-        <w:rPr>
-          <w:rFonts w:ascii="Times New Roman" w:hAnsi="Times New Roman" w:eastAsia="Times New Roman"/>
-          <w:b w:val="0"/>
-          <w:color w:val="000000"/>
-          <w:sz w:val="24"/>
-          <w:u w:val="none"/>
-        </w:rPr>
-        <w:t>Figure 4 : Cas d'utilisation de l'administrateur (organisation)</w:t>
-        <w:tab/>
-      </w:r>
-    </w:p>
-    <w:p>
-      <w:pPr>
-        <w:spacing w:before="0" w:after="40" w:line="276" w:lineRule="auto"/>
-        <w:ind w:firstLine="0" w:left="0"/>
-        <w:tabs>
-          <w:tab w:val="right" w:leader="dot" w:pos="9000"/>
-        </w:tabs>
-        <w:jc w:val="left"/>
-      </w:pPr>
-      <w:r>
-        <w:rPr>
-          <w:rFonts w:ascii="Times New Roman" w:hAnsi="Times New Roman" w:eastAsia="Times New Roman"/>
-          <w:b w:val="0"/>
-          <w:color w:val="000000"/>
-          <w:sz w:val="24"/>
-          <w:u w:val="none"/>
-        </w:rPr>
-        <w:t>Figure 5 : Cas d'utilisation de l'administrateur (comptes)</w:t>
-        <w:tab/>
-      </w:r>
-    </w:p>
-    <w:p>
-      <w:pPr>
-        <w:spacing w:before="0" w:after="40" w:line="276" w:lineRule="auto"/>
-        <w:ind w:firstLine="0" w:left="0"/>
-        <w:tabs>
-          <w:tab w:val="right" w:leader="dot" w:pos="9000"/>
-        </w:tabs>
-        <w:jc w:val="left"/>
-      </w:pPr>
-      <w:r>
-        <w:rPr>
-          <w:rFonts w:ascii="Times New Roman" w:hAnsi="Times New Roman" w:eastAsia="Times New Roman"/>
-          <w:b w:val="0"/>
-          <w:color w:val="000000"/>
-          <w:sz w:val="24"/>
-          <w:u w:val="none"/>
-        </w:rPr>
-        <w:t>Figure 6 : Cas d'utilisation du professeur (examens)</w:t>
-        <w:tab/>
-      </w:r>
-    </w:p>
-    <w:p>
-      <w:pPr>
-        <w:spacing w:before="0" w:after="40" w:line="276" w:lineRule="auto"/>
-        <w:ind w:firstLine="0" w:left="0"/>
-        <w:tabs>
-          <w:tab w:val="right" w:leader="dot" w:pos="9000"/>
-        </w:tabs>
-        <w:jc w:val="left"/>
-      </w:pPr>
-      <w:r>
-        <w:rPr>
-          <w:rFonts w:ascii="Times New Roman" w:hAnsi="Times New Roman" w:eastAsia="Times New Roman"/>
-          <w:b w:val="0"/>
-          <w:color w:val="000000"/>
-          <w:sz w:val="24"/>
-          <w:u w:val="none"/>
-        </w:rPr>
-        <w:t>Figure 7 : Cas d'utilisation du professeur (suivi)</w:t>
-        <w:tab/>
-      </w:r>
-    </w:p>
-    <w:p>
-      <w:pPr>
-        <w:spacing w:before="0" w:after="40" w:line="276" w:lineRule="auto"/>
-        <w:ind w:firstLine="0" w:left="0"/>
-        <w:tabs>
-          <w:tab w:val="right" w:leader="dot" w:pos="9000"/>
-        </w:tabs>
-        <w:jc w:val="left"/>
-      </w:pPr>
-      <w:r>
-        <w:rPr>
-          <w:rFonts w:ascii="Times New Roman" w:hAnsi="Times New Roman" w:eastAsia="Times New Roman"/>
-          <w:b w:val="0"/>
-          <w:color w:val="000000"/>
-          <w:sz w:val="24"/>
-          <w:u w:val="none"/>
-        </w:rPr>
-        <w:t>Figure 8 : Cas d'utilisation de l'étudiant</w:t>
-        <w:tab/>
-      </w:r>
-    </w:p>
-    <w:p>
-      <w:pPr>
-        <w:spacing w:before="0" w:after="40" w:line="276" w:lineRule="auto"/>
-        <w:ind w:firstLine="0" w:left="0"/>
-        <w:tabs>
-          <w:tab w:val="right" w:leader="dot" w:pos="9000"/>
-        </w:tabs>
-        <w:jc w:val="left"/>
-      </w:pPr>
-      <w:r>
-        <w:rPr>
-          <w:rFonts w:ascii="Times New Roman" w:hAnsi="Times New Roman" w:eastAsia="Times New Roman"/>
-          <w:b w:val="0"/>
-          <w:color w:val="000000"/>
-          <w:sz w:val="24"/>
-          <w:u w:val="none"/>
-        </w:rPr>
-        <w:t>Figure 9 : Classes organisation et comptes</w:t>
-        <w:tab/>
-      </w:r>
-    </w:p>
-    <w:p>
-      <w:pPr>
-        <w:spacing w:before="0" w:after="40" w:line="276" w:lineRule="auto"/>
-        <w:ind w:firstLine="0" w:left="0"/>
-        <w:tabs>
-          <w:tab w:val="right" w:leader="dot" w:pos="9000"/>
-        </w:tabs>
-        <w:jc w:val="left"/>
-      </w:pPr>
-      <w:r>
-        <w:rPr>
-          <w:rFonts w:ascii="Times New Roman" w:hAnsi="Times New Roman" w:eastAsia="Times New Roman"/>
-          <w:b w:val="0"/>
-          <w:color w:val="000000"/>
-          <w:sz w:val="24"/>
-          <w:u w:val="none"/>
-        </w:rPr>
-        <w:t>Figure 10 : Classes conception d'examen</w:t>
-        <w:tab/>
-      </w:r>
-    </w:p>
-    <w:p>
-      <w:pPr>
-        <w:spacing w:before="0" w:after="40" w:line="276" w:lineRule="auto"/>
-        <w:ind w:firstLine="0" w:left="0"/>
-        <w:tabs>
-          <w:tab w:val="right" w:leader="dot" w:pos="9000"/>
-        </w:tabs>
-        <w:jc w:val="left"/>
-      </w:pPr>
-      <w:r>
-        <w:rPr>
-          <w:rFonts w:ascii="Times New Roman" w:hAnsi="Times New Roman" w:eastAsia="Times New Roman"/>
-          <w:b w:val="0"/>
-          <w:color w:val="000000"/>
-          <w:sz w:val="24"/>
-          <w:u w:val="none"/>
-        </w:rPr>
-        <w:t>Figure 11 : Classes composition et correction</w:t>
-        <w:tab/>
-      </w:r>
-    </w:p>
-    <w:p>
-      <w:pPr>
-        <w:spacing w:before="0" w:after="40" w:line="276" w:lineRule="auto"/>
-        <w:ind w:firstLine="0" w:left="0"/>
-        <w:tabs>
-          <w:tab w:val="right" w:leader="dot" w:pos="9000"/>
-        </w:tabs>
-        <w:jc w:val="left"/>
-      </w:pPr>
-      <w:r>
-        <w:rPr>
-          <w:rFonts w:ascii="Times New Roman" w:hAnsi="Times New Roman" w:eastAsia="Times New Roman"/>
-          <w:b w:val="0"/>
-          <w:color w:val="000000"/>
-          <w:sz w:val="24"/>
-          <w:u w:val="none"/>
-        </w:rPr>
-        <w:t>Figure 12 : Objets organisation</w:t>
-        <w:tab/>
-      </w:r>
-    </w:p>
-    <w:p>
-      <w:pPr>
-        <w:spacing w:before="0" w:after="40" w:line="276" w:lineRule="auto"/>
-        <w:ind w:firstLine="0" w:left="0"/>
-        <w:tabs>
-          <w:tab w:val="right" w:leader="dot" w:pos="9000"/>
-        </w:tabs>
-        <w:jc w:val="left"/>
-      </w:pPr>
-      <w:r>
-        <w:rPr>
-          <w:rFonts w:ascii="Times New Roman" w:hAnsi="Times New Roman" w:eastAsia="Times New Roman"/>
-          <w:b w:val="0"/>
-          <w:color w:val="000000"/>
-          <w:sz w:val="24"/>
-          <w:u w:val="none"/>
-        </w:rPr>
-        <w:t>Figure 13 : Objets conception d'examen</w:t>
-        <w:tab/>
-      </w:r>
-    </w:p>
-    <w:p>
-      <w:pPr>
-        <w:spacing w:before="0" w:after="40" w:line="276" w:lineRule="auto"/>
-        <w:ind w:firstLine="0" w:left="0"/>
-        <w:tabs>
-          <w:tab w:val="right" w:leader="dot" w:pos="9000"/>
-        </w:tabs>
-        <w:jc w:val="left"/>
-      </w:pPr>
-      <w:r>
-        <w:rPr>
-          <w:rFonts w:ascii="Times New Roman" w:hAnsi="Times New Roman" w:eastAsia="Times New Roman"/>
-          <w:b w:val="0"/>
-          <w:color w:val="000000"/>
-          <w:sz w:val="24"/>
-          <w:u w:val="none"/>
-        </w:rPr>
-        <w:t>Figure 14 : Objets composition</w:t>
-        <w:tab/>
-      </w:r>
-    </w:p>
-    <w:p>
-      <w:pPr>
-        <w:spacing w:before="0" w:after="40" w:line="276" w:lineRule="auto"/>
-        <w:ind w:firstLine="0" w:left="0"/>
-        <w:tabs>
-          <w:tab w:val="right" w:leader="dot" w:pos="9000"/>
-        </w:tabs>
-        <w:jc w:val="left"/>
-      </w:pPr>
-      <w:r>
-        <w:rPr>
-          <w:rFonts w:ascii="Times New Roman" w:hAnsi="Times New Roman" w:eastAsia="Times New Roman"/>
-          <w:b w:val="0"/>
-          <w:color w:val="000000"/>
-          <w:sz w:val="24"/>
-          <w:u w:val="none"/>
-        </w:rPr>
-        <w:t>Figure 15 : Composants vue d'ensemble</w:t>
-        <w:tab/>
-      </w:r>
-    </w:p>
-    <w:p>
-      <w:pPr>
-        <w:spacing w:before="0" w:after="40" w:line="276" w:lineRule="auto"/>
-        <w:ind w:firstLine="0" w:left="0"/>
-        <w:tabs>
-          <w:tab w:val="right" w:leader="dot" w:pos="9000"/>
-        </w:tabs>
-        <w:jc w:val="left"/>
-      </w:pPr>
-      <w:r>
-        <w:rPr>
-          <w:rFonts w:ascii="Times New Roman" w:hAnsi="Times New Roman" w:eastAsia="Times New Roman"/>
-          <w:b w:val="0"/>
-          <w:color w:val="000000"/>
-          <w:sz w:val="24"/>
-          <w:u w:val="none"/>
-        </w:rPr>
-        <w:t>Figure 16 : Composants administration et authentification</w:t>
-        <w:tab/>
-      </w:r>
-    </w:p>
-    <w:p>
-      <w:pPr>
-        <w:spacing w:before="0" w:after="40" w:line="276" w:lineRule="auto"/>
-        <w:ind w:firstLine="0" w:left="0"/>
-        <w:tabs>
-          <w:tab w:val="right" w:leader="dot" w:pos="9000"/>
-        </w:tabs>
-        <w:jc w:val="left"/>
-      </w:pPr>
-      <w:r>
-        <w:rPr>
-          <w:rFonts w:ascii="Times New Roman" w:hAnsi="Times New Roman" w:eastAsia="Times New Roman"/>
-          <w:b w:val="0"/>
-          <w:color w:val="000000"/>
-          <w:sz w:val="24"/>
-          <w:u w:val="none"/>
-        </w:rPr>
-        <w:t>Figure 17 : Composants examens et composition</w:t>
-        <w:tab/>
-      </w:r>
-    </w:p>
-    <w:p>
-      <w:pPr>
-        <w:spacing w:before="0" w:after="40" w:line="276" w:lineRule="auto"/>
-        <w:ind w:firstLine="0" w:left="0"/>
-        <w:tabs>
-          <w:tab w:val="right" w:leader="dot" w:pos="9000"/>
-        </w:tabs>
-        <w:jc w:val="left"/>
-      </w:pPr>
-      <w:r>
-        <w:rPr>
-          <w:rFonts w:ascii="Times New Roman" w:hAnsi="Times New Roman" w:eastAsia="Times New Roman"/>
-          <w:b w:val="0"/>
-          <w:color w:val="000000"/>
-          <w:sz w:val="24"/>
-          <w:u w:val="none"/>
-        </w:rPr>
-        <w:t>Figure 18 : États du cycle de vie d'un examen</w:t>
-        <w:tab/>
-      </w:r>
-    </w:p>
-    <w:p>
-      <w:pPr>
-        <w:spacing w:before="0" w:after="40" w:line="276" w:lineRule="auto"/>
-        <w:ind w:firstLine="0" w:left="0"/>
-        <w:tabs>
-          <w:tab w:val="right" w:leader="dot" w:pos="9000"/>
-        </w:tabs>
-        <w:jc w:val="left"/>
-      </w:pPr>
-      <w:r>
-        <w:rPr>
-          <w:rFonts w:ascii="Times New Roman" w:hAnsi="Times New Roman" w:eastAsia="Times New Roman"/>
-          <w:b w:val="0"/>
-          <w:color w:val="000000"/>
-          <w:sz w:val="24"/>
-          <w:u w:val="none"/>
-        </w:rPr>
-        <w:t>Figure 19 : Séquence de connexion</w:t>
-        <w:tab/>
-      </w:r>
-    </w:p>
-    <w:p>
-      <w:pPr>
-        <w:spacing w:before="0" w:after="40" w:line="276" w:lineRule="auto"/>
-        <w:ind w:firstLine="0" w:left="0"/>
-        <w:tabs>
-          <w:tab w:val="right" w:leader="dot" w:pos="9000"/>
-        </w:tabs>
-        <w:jc w:val="left"/>
-      </w:pPr>
-      <w:r>
-        <w:rPr>
-          <w:rFonts w:ascii="Times New Roman" w:hAnsi="Times New Roman" w:eastAsia="Times New Roman"/>
-          <w:b w:val="0"/>
-          <w:color w:val="000000"/>
-          <w:sz w:val="24"/>
-          <w:u w:val="none"/>
-        </w:rPr>
-        <w:t>Figure 20 : Séquence de publication d'un examen</w:t>
-        <w:tab/>
-      </w:r>
-    </w:p>
-    <w:p>
-      <w:pPr>
-        <w:spacing w:before="0" w:after="40" w:line="276" w:lineRule="auto"/>
-        <w:ind w:firstLine="0" w:left="0"/>
-        <w:tabs>
-          <w:tab w:val="right" w:leader="dot" w:pos="9000"/>
-        </w:tabs>
-        <w:jc w:val="left"/>
-      </w:pPr>
-      <w:r>
-        <w:rPr>
-          <w:rFonts w:ascii="Times New Roman" w:hAnsi="Times New Roman" w:eastAsia="Times New Roman"/>
-          <w:b w:val="0"/>
-          <w:color w:val="000000"/>
-          <w:sz w:val="24"/>
-          <w:u w:val="none"/>
-        </w:rPr>
-        <w:t>Figure 21 : Séquence d'accès étudiant</w:t>
-        <w:tab/>
-      </w:r>
-    </w:p>
-    <w:p>
-      <w:pPr>
-        <w:spacing w:before="0" w:after="40" w:line="276" w:lineRule="auto"/>
-        <w:ind w:firstLine="0" w:left="0"/>
-        <w:tabs>
-          <w:tab w:val="right" w:leader="dot" w:pos="9000"/>
-        </w:tabs>
-        <w:jc w:val="left"/>
-      </w:pPr>
-      <w:r>
-        <w:rPr>
-          <w:rFonts w:ascii="Times New Roman" w:hAnsi="Times New Roman" w:eastAsia="Times New Roman"/>
-          <w:b w:val="0"/>
-          <w:color w:val="000000"/>
-          <w:sz w:val="24"/>
-          <w:u w:val="none"/>
-        </w:rPr>
-        <w:t>Figure 22 : Séquence d'exécution du code</w:t>
-        <w:tab/>
-      </w:r>
-    </w:p>
-    <w:p>
-      <w:pPr>
-        <w:spacing w:before="0" w:after="40" w:line="276" w:lineRule="auto"/>
-        <w:ind w:firstLine="0" w:left="0"/>
-        <w:tabs>
-          <w:tab w:val="right" w:leader="dot" w:pos="9000"/>
-        </w:tabs>
-        <w:jc w:val="left"/>
-      </w:pPr>
-      <w:r>
-        <w:rPr>
-          <w:rFonts w:ascii="Times New Roman" w:hAnsi="Times New Roman" w:eastAsia="Times New Roman"/>
-          <w:b w:val="0"/>
-          <w:color w:val="000000"/>
-          <w:sz w:val="24"/>
-          <w:u w:val="none"/>
-        </w:rPr>
-        <w:t>Figure 23 : Séquence de soumission et correction</w:t>
-        <w:tab/>
-      </w:r>
-    </w:p>
-    <w:p>
-      <w:pPr>
-        <w:spacing w:before="0" w:after="40" w:line="276" w:lineRule="auto"/>
-        <w:ind w:firstLine="0" w:left="0"/>
-        <w:tabs>
-          <w:tab w:val="right" w:leader="dot" w:pos="9000"/>
-        </w:tabs>
-        <w:jc w:val="left"/>
-      </w:pPr>
-      <w:r>
-        <w:rPr>
-          <w:rFonts w:ascii="Times New Roman" w:hAnsi="Times New Roman" w:eastAsia="Times New Roman"/>
-          <w:b w:val="0"/>
-          <w:color w:val="000000"/>
-          <w:sz w:val="24"/>
-          <w:u w:val="none"/>
-        </w:rPr>
-        <w:t>Figure 24 : Séquence d'enregistrement d'un incident</w:t>
-        <w:tab/>
-      </w:r>
-    </w:p>
-    <w:p>
-      <w:pPr>
-        <w:spacing w:before="0" w:after="40" w:line="276" w:lineRule="auto"/>
-        <w:ind w:firstLine="0" w:left="0"/>
-        <w:tabs>
-          <w:tab w:val="right" w:leader="dot" w:pos="9000"/>
-        </w:tabs>
-        <w:jc w:val="left"/>
-      </w:pPr>
-      <w:r>
-        <w:rPr>
-          <w:rFonts w:ascii="Times New Roman" w:hAnsi="Times New Roman" w:eastAsia="Times New Roman"/>
-          <w:b w:val="0"/>
-          <w:color w:val="000000"/>
-          <w:sz w:val="24"/>
-          <w:u w:val="none"/>
-        </w:rPr>
-        <w:t>Figure 25 : Activité accès et salle d'attente</w:t>
-        <w:tab/>
-      </w:r>
-    </w:p>
-    <w:p>
-      <w:pPr>
-        <w:spacing w:before="0" w:after="40" w:line="276" w:lineRule="auto"/>
-        <w:ind w:firstLine="0" w:left="0"/>
-        <w:tabs>
-          <w:tab w:val="right" w:leader="dot" w:pos="9000"/>
-        </w:tabs>
-        <w:jc w:val="left"/>
-      </w:pPr>
-      <w:r>
-        <w:rPr>
-          <w:rFonts w:ascii="Times New Roman" w:hAnsi="Times New Roman" w:eastAsia="Times New Roman"/>
-          <w:b w:val="0"/>
-          <w:color w:val="000000"/>
-          <w:sz w:val="24"/>
-          <w:u w:val="none"/>
-        </w:rPr>
-        <w:t>Figure 26 : Activité composition et soumission</w:t>
-        <w:tab/>
-      </w:r>
-    </w:p>
-    <w:p>
-      <w:pPr>
-        <w:spacing w:before="0" w:after="40" w:line="276" w:lineRule="auto"/>
-        <w:ind w:firstLine="0" w:left="0"/>
-        <w:tabs>
-          <w:tab w:val="right" w:leader="dot" w:pos="9000"/>
-        </w:tabs>
-        <w:jc w:val="left"/>
-      </w:pPr>
-      <w:r>
-        <w:rPr>
-          <w:rFonts w:ascii="Times New Roman" w:hAnsi="Times New Roman" w:eastAsia="Times New Roman"/>
-          <w:b w:val="0"/>
-          <w:color w:val="000000"/>
-          <w:sz w:val="24"/>
-          <w:u w:val="none"/>
-        </w:rPr>
-        <w:t>Figure 27 : Page de connexion multi rôles</w:t>
-        <w:tab/>
-      </w:r>
-    </w:p>
-    <w:p>
-      <w:pPr>
-        <w:spacing w:before="0" w:after="40" w:line="276" w:lineRule="auto"/>
-        <w:ind w:firstLine="0" w:left="0"/>
-        <w:tabs>
-          <w:tab w:val="right" w:leader="dot" w:pos="9000"/>
-        </w:tabs>
-        <w:jc w:val="left"/>
-      </w:pPr>
-      <w:r>
-        <w:rPr>
-          <w:rFonts w:ascii="Times New Roman" w:hAnsi="Times New Roman" w:eastAsia="Times New Roman"/>
-          <w:b w:val="0"/>
-          <w:color w:val="000000"/>
-          <w:sz w:val="24"/>
-          <w:u w:val="none"/>
-        </w:rPr>
-        <w:t>Figure 28 : Espace administrateur d'établissement</w:t>
-        <w:tab/>
-      </w:r>
-    </w:p>
-    <w:p>
-      <w:pPr>
-        <w:spacing w:before="0" w:after="40" w:line="276" w:lineRule="auto"/>
-        <w:ind w:firstLine="0" w:left="0"/>
-        <w:tabs>
-          <w:tab w:val="right" w:leader="dot" w:pos="9000"/>
-        </w:tabs>
-        <w:jc w:val="left"/>
-      </w:pPr>
-      <w:r>
-        <w:rPr>
-          <w:rFonts w:ascii="Times New Roman" w:hAnsi="Times New Roman" w:eastAsia="Times New Roman"/>
-          <w:b w:val="0"/>
-          <w:color w:val="000000"/>
-          <w:sz w:val="24"/>
-          <w:u w:val="none"/>
-        </w:rPr>
-        <w:t>Figure 29 : Composition d'un examen côté professeur</w:t>
-        <w:tab/>
-      </w:r>
-    </w:p>
-    <w:p>
-      <w:pPr>
-        <w:spacing w:before="0" w:after="40" w:line="276" w:lineRule="auto"/>
-        <w:ind w:firstLine="0" w:left="0"/>
-        <w:tabs>
-          <w:tab w:val="right" w:leader="dot" w:pos="9000"/>
-        </w:tabs>
-        <w:jc w:val="left"/>
-      </w:pPr>
-      <w:r>
-        <w:rPr>
-          <w:rFonts w:ascii="Times New Roman" w:hAnsi="Times New Roman" w:eastAsia="Times New Roman"/>
-          <w:b w:val="0"/>
-          <w:color w:val="000000"/>
-          <w:sz w:val="24"/>
-          <w:u w:val="none"/>
-        </w:rPr>
-        <w:t>Figure 30 : Publication et code d'accès d'examen</w:t>
-        <w:tab/>
-      </w:r>
-    </w:p>
-    <w:p>
-      <w:pPr>
-        <w:spacing w:before="0" w:after="40" w:line="276" w:lineRule="auto"/>
-        <w:ind w:firstLine="0" w:left="0"/>
-        <w:tabs>
-          <w:tab w:val="right" w:leader="dot" w:pos="9000"/>
-        </w:tabs>
-        <w:jc w:val="left"/>
-      </w:pPr>
-      <w:r>
-        <w:rPr>
-          <w:rFonts w:ascii="Times New Roman" w:hAnsi="Times New Roman" w:eastAsia="Times New Roman"/>
-          <w:b w:val="0"/>
-          <w:color w:val="000000"/>
-          <w:sz w:val="24"/>
-          <w:u w:val="none"/>
-        </w:rPr>
-        <w:t>Figure 31 : Suivi live des participations</w:t>
-        <w:tab/>
-      </w:r>
-    </w:p>
-    <w:p>
-      <w:pPr>
-        <w:spacing w:before="0" w:after="40" w:line="276" w:lineRule="auto"/>
-        <w:ind w:firstLine="0" w:left="0"/>
-        <w:tabs>
-          <w:tab w:val="right" w:leader="dot" w:pos="9000"/>
-        </w:tabs>
-        <w:jc w:val="left"/>
-      </w:pPr>
-      <w:r>
-        <w:rPr>
-          <w:rFonts w:ascii="Times New Roman" w:hAnsi="Times New Roman" w:eastAsia="Times New Roman"/>
-          <w:b w:val="0"/>
-          <w:color w:val="000000"/>
-          <w:sz w:val="24"/>
-          <w:u w:val="none"/>
-        </w:rPr>
-        <w:t>Figure 32 : Résultats et exports professeur</w:t>
-        <w:tab/>
-      </w:r>
-    </w:p>
-    <w:p>
-      <w:pPr>
-        <w:spacing w:before="0" w:after="40" w:line="276" w:lineRule="auto"/>
-        <w:ind w:firstLine="0" w:left="0"/>
-        <w:tabs>
-          <w:tab w:val="right" w:leader="dot" w:pos="9000"/>
-        </w:tabs>
-        <w:jc w:val="left"/>
-      </w:pPr>
-      <w:r>
-        <w:rPr>
-          <w:rFonts w:ascii="Times New Roman" w:hAnsi="Times New Roman" w:eastAsia="Times New Roman"/>
-          <w:b w:val="0"/>
-          <w:color w:val="000000"/>
-          <w:sz w:val="24"/>
-          <w:u w:val="none"/>
-        </w:rPr>
-        <w:t>Figure 33 : Consignes et activation du plein écran</w:t>
-        <w:tab/>
-      </w:r>
-    </w:p>
-    <w:p>
-      <w:pPr>
-        <w:spacing w:before="0" w:after="40" w:line="276" w:lineRule="auto"/>
-        <w:ind w:firstLine="0" w:left="0"/>
-        <w:tabs>
-          <w:tab w:val="right" w:leader="dot" w:pos="9000"/>
-        </w:tabs>
-        <w:jc w:val="left"/>
-      </w:pPr>
-      <w:r>
-        <w:rPr>
-          <w:rFonts w:ascii="Times New Roman" w:hAnsi="Times New Roman" w:eastAsia="Times New Roman"/>
-          <w:b w:val="0"/>
-          <w:color w:val="000000"/>
-          <w:sz w:val="24"/>
-          <w:u w:val="none"/>
-        </w:rPr>
-        <w:t>Figure 34 : Salle d'attente avant le démarrage de l'examen</w:t>
-        <w:tab/>
-      </w:r>
-    </w:p>
-    <w:p>
-      <w:pPr>
-        <w:spacing w:before="0" w:after="40" w:line="276" w:lineRule="auto"/>
-        <w:ind w:firstLine="0" w:left="0"/>
-        <w:tabs>
-          <w:tab w:val="right" w:leader="dot" w:pos="9000"/>
-        </w:tabs>
-        <w:jc w:val="left"/>
-      </w:pPr>
-      <w:r>
-        <w:rPr>
-          <w:rFonts w:ascii="Times New Roman" w:hAnsi="Times New Roman" w:eastAsia="Times New Roman"/>
-          <w:b w:val="0"/>
-          <w:color w:val="000000"/>
-          <w:sz w:val="24"/>
-          <w:u w:val="none"/>
-        </w:rPr>
-        <w:t>Figure 35 : Environnement de composition pendant l'épreuve</w:t>
-        <w:tab/>
-      </w:r>
-    </w:p>
-    <w:p>
-      <w:pPr>
-        <w:spacing w:before="0" w:after="40" w:line="276" w:lineRule="auto"/>
-        <w:ind w:firstLine="0" w:left="0"/>
-        <w:tabs>
-          <w:tab w:val="right" w:leader="dot" w:pos="9000"/>
-        </w:tabs>
-        <w:jc w:val="left"/>
-      </w:pPr>
-      <w:r>
-        <w:rPr>
-          <w:rFonts w:ascii="Times New Roman" w:hAnsi="Times New Roman" w:eastAsia="Times New Roman"/>
-          <w:b w:val="0"/>
-          <w:color w:val="000000"/>
-          <w:sz w:val="24"/>
-          <w:u w:val="none"/>
-        </w:rPr>
-        <w:t>Figure 36 : Page d'accueil Cylentic</w:t>
-        <w:tab/>
+        </w:rPr>
+        <w:fldChar w:fldCharType="begin"/>
+        <w:instrText xml:space="preserve">TOC \z \c "Figure"</w:instrText>
+        <w:fldChar w:fldCharType="separate"/>
+        <w:t> </w:t>
+        <w:fldChar w:fldCharType="end"/>
       </w:r>
     </w:p>
     <w:p>
@@ -2667,65 +1525,19 @@
     </w:p>
     <w:p>
       <w:pPr>
-        <w:spacing w:before="0" w:after="40" w:line="276" w:lineRule="auto"/>
-        <w:ind w:firstLine="0" w:left="0"/>
-        <w:tabs>
-          <w:tab w:val="right" w:leader="dot" w:pos="9000"/>
-        </w:tabs>
-        <w:jc w:val="left"/>
-      </w:pPr>
-      <w:r>
-        <w:rPr>
-          <w:rFonts w:ascii="Times New Roman" w:hAnsi="Times New Roman" w:eastAsia="Times New Roman"/>
-          <w:b w:val="0"/>
-          <w:color w:val="000000"/>
+        <w:pStyle w:val="Tabledesillustrations"/>
+      </w:pPr>
+      <w:r>
+        <w:rPr>
+          <w:color w:val="000000"/>
+          <w:rFonts w:ascii="Times New Roman" w:hAnsi="Times New Roman"/>
           <w:sz w:val="24"/>
-          <w:u w:val="none"/>
-        </w:rPr>
-        <w:t>Tableau 1 : Comparaison des solutions existantes et de Cylentic</w:t>
-        <w:tab/>
-      </w:r>
-    </w:p>
-    <w:p>
-      <w:pPr>
-        <w:spacing w:before="0" w:after="40" w:line="276" w:lineRule="auto"/>
-        <w:ind w:firstLine="0" w:left="0"/>
-        <w:tabs>
-          <w:tab w:val="right" w:leader="dot" w:pos="9000"/>
-        </w:tabs>
-        <w:jc w:val="left"/>
-      </w:pPr>
-      <w:r>
-        <w:rPr>
-          <w:rFonts w:ascii="Times New Roman" w:hAnsi="Times New Roman" w:eastAsia="Times New Roman"/>
-          <w:b w:val="0"/>
-          <w:color w:val="000000"/>
-          <w:sz w:val="24"/>
-          <w:u w:val="none"/>
-        </w:rPr>
-        <w:t>Tableau 2 : Correspondance entre acteurs et responsabilités</w:t>
-        <w:tab/>
-      </w:r>
-    </w:p>
-    <w:p>
-      <w:pPr>
-        <w:spacing w:before="0" w:after="40" w:line="276" w:lineRule="auto"/>
-        <w:ind w:firstLine="0" w:left="0"/>
-        <w:tabs>
-          <w:tab w:val="right" w:leader="dot" w:pos="9000"/>
-        </w:tabs>
-        <w:jc w:val="left"/>
-      </w:pPr>
-      <w:r>
-        <w:rPr>
-          <w:rFonts w:ascii="Times New Roman" w:hAnsi="Times New Roman" w:eastAsia="Times New Roman"/>
-          <w:b w:val="0"/>
-          <w:color w:val="000000"/>
-          <w:sz w:val="24"/>
-          <w:u w:val="none"/>
-        </w:rPr>
-        <w:t>Tableau 3 : Principales tables persistantes et rôle</w:t>
-        <w:tab/>
+        </w:rPr>
+        <w:fldChar w:fldCharType="begin"/>
+        <w:instrText xml:space="preserve">TOC \z \c "Tableau"</w:instrText>
+        <w:fldChar w:fldCharType="separate"/>
+        <w:t> </w:t>
+        <w:fldChar w:fldCharType="end"/>
       </w:r>
     </w:p>
     <w:p>
@@ -12589,1514 +11401,19 @@
     </w:p>
     <w:p>
       <w:pPr>
-        <w:spacing w:before="0" w:after="40" w:line="276" w:lineRule="auto"/>
-        <w:ind w:firstLine="0" w:left="0"/>
-        <w:tabs>
-          <w:tab w:val="right" w:leader="dot" w:pos="9000"/>
-        </w:tabs>
-        <w:jc w:val="left"/>
-      </w:pPr>
-      <w:r>
-        <w:rPr>
-          <w:rFonts w:ascii="Times New Roman" w:hAnsi="Times New Roman" w:eastAsia="Times New Roman"/>
-          <w:b w:val="0"/>
-          <w:color w:val="000000"/>
+        <w:pStyle w:val="TM1"/>
+      </w:pPr>
+      <w:r>
+        <w:rPr>
+          <w:color w:val="000000"/>
+          <w:rFonts w:ascii="Times New Roman" w:hAnsi="Times New Roman"/>
           <w:sz w:val="24"/>
-          <w:u w:val="none"/>
-        </w:rPr>
-        <w:t>Dédicace</w:t>
-        <w:tab/>
-      </w:r>
-    </w:p>
-    <w:p>
-      <w:pPr>
-        <w:spacing w:before="0" w:after="40" w:line="276" w:lineRule="auto"/>
-        <w:ind w:firstLine="0" w:left="0"/>
-        <w:tabs>
-          <w:tab w:val="right" w:leader="dot" w:pos="9000"/>
-        </w:tabs>
-        <w:jc w:val="left"/>
-      </w:pPr>
-      <w:r>
-        <w:rPr>
-          <w:rFonts w:ascii="Times New Roman" w:hAnsi="Times New Roman" w:eastAsia="Times New Roman"/>
-          <w:b w:val="0"/>
-          <w:color w:val="000000"/>
-          <w:sz w:val="24"/>
-          <w:u w:val="none"/>
-        </w:rPr>
-        <w:t>Remerciements</w:t>
-        <w:tab/>
-      </w:r>
-    </w:p>
-    <w:p>
-      <w:pPr>
-        <w:spacing w:before="0" w:after="40" w:line="276" w:lineRule="auto"/>
-        <w:ind w:firstLine="0" w:left="0"/>
-        <w:tabs>
-          <w:tab w:val="right" w:leader="dot" w:pos="9000"/>
-        </w:tabs>
-        <w:jc w:val="left"/>
-      </w:pPr>
-      <w:r>
-        <w:rPr>
-          <w:rFonts w:ascii="Times New Roman" w:hAnsi="Times New Roman" w:eastAsia="Times New Roman"/>
-          <w:b w:val="0"/>
-          <w:color w:val="000000"/>
-          <w:sz w:val="24"/>
-          <w:u w:val="none"/>
-        </w:rPr>
-        <w:t>Sommaire</w:t>
-        <w:tab/>
-      </w:r>
-    </w:p>
-    <w:p>
-      <w:pPr>
-        <w:spacing w:before="0" w:after="40" w:line="276" w:lineRule="auto"/>
-        <w:ind w:firstLine="0" w:left="0"/>
-        <w:tabs>
-          <w:tab w:val="right" w:leader="dot" w:pos="9000"/>
-        </w:tabs>
-        <w:jc w:val="left"/>
-      </w:pPr>
-      <w:r>
-        <w:rPr>
-          <w:rFonts w:ascii="Times New Roman" w:hAnsi="Times New Roman" w:eastAsia="Times New Roman"/>
-          <w:b w:val="0"/>
-          <w:color w:val="000000"/>
-          <w:sz w:val="24"/>
-          <w:u w:val="none"/>
-        </w:rPr>
-        <w:t>Liste des sigles et abréviations</w:t>
-        <w:tab/>
-      </w:r>
-    </w:p>
-    <w:p>
-      <w:pPr>
-        <w:spacing w:before="0" w:after="40" w:line="276" w:lineRule="auto"/>
-        <w:ind w:firstLine="0" w:left="0"/>
-        <w:tabs>
-          <w:tab w:val="right" w:leader="dot" w:pos="9000"/>
-        </w:tabs>
-        <w:jc w:val="left"/>
-      </w:pPr>
-      <w:r>
-        <w:rPr>
-          <w:rFonts w:ascii="Times New Roman" w:hAnsi="Times New Roman" w:eastAsia="Times New Roman"/>
-          <w:b w:val="0"/>
-          <w:color w:val="000000"/>
-          <w:sz w:val="24"/>
-          <w:u w:val="none"/>
-        </w:rPr>
-        <w:t>Liste des figures</w:t>
-        <w:tab/>
-      </w:r>
-    </w:p>
-    <w:p>
-      <w:pPr>
-        <w:spacing w:before="0" w:after="40" w:line="276" w:lineRule="auto"/>
-        <w:ind w:firstLine="0" w:left="0"/>
-        <w:tabs>
-          <w:tab w:val="right" w:leader="dot" w:pos="9000"/>
-        </w:tabs>
-        <w:jc w:val="left"/>
-      </w:pPr>
-      <w:r>
-        <w:rPr>
-          <w:rFonts w:ascii="Times New Roman" w:hAnsi="Times New Roman" w:eastAsia="Times New Roman"/>
-          <w:b w:val="0"/>
-          <w:color w:val="000000"/>
-          <w:sz w:val="24"/>
-          <w:u w:val="none"/>
-        </w:rPr>
-        <w:t>Liste des tableaux</w:t>
-        <w:tab/>
-      </w:r>
-    </w:p>
-    <w:p>
-      <w:pPr>
-        <w:spacing w:before="0" w:after="40" w:line="276" w:lineRule="auto"/>
-        <w:ind w:firstLine="0" w:left="0"/>
-        <w:tabs>
-          <w:tab w:val="right" w:leader="dot" w:pos="9000"/>
-        </w:tabs>
-        <w:jc w:val="left"/>
-      </w:pPr>
-      <w:r>
-        <w:rPr>
-          <w:rFonts w:ascii="Times New Roman" w:hAnsi="Times New Roman" w:eastAsia="Times New Roman"/>
-          <w:b w:val="0"/>
-          <w:color w:val="000000"/>
-          <w:sz w:val="24"/>
-          <w:u w:val="none"/>
-        </w:rPr>
-        <w:t>Résumé</w:t>
-        <w:tab/>
-      </w:r>
-    </w:p>
-    <w:p>
-      <w:pPr>
-        <w:spacing w:before="0" w:after="40" w:line="276" w:lineRule="auto"/>
-        <w:ind w:firstLine="0" w:left="0"/>
-        <w:tabs>
-          <w:tab w:val="right" w:leader="dot" w:pos="9000"/>
-        </w:tabs>
-        <w:jc w:val="left"/>
-      </w:pPr>
-      <w:r>
-        <w:rPr>
-          <w:rFonts w:ascii="Times New Roman" w:hAnsi="Times New Roman" w:eastAsia="Times New Roman"/>
-          <w:b w:val="0"/>
-          <w:color w:val="000000"/>
-          <w:sz w:val="24"/>
-          <w:u w:val="none"/>
-        </w:rPr>
-        <w:t>Abstract</w:t>
-        <w:tab/>
-      </w:r>
-    </w:p>
-    <w:p>
-      <w:pPr>
-        <w:spacing w:before="0" w:after="40" w:line="276" w:lineRule="auto"/>
-        <w:ind w:firstLine="0" w:left="0"/>
-        <w:tabs>
-          <w:tab w:val="right" w:leader="dot" w:pos="9000"/>
-        </w:tabs>
-        <w:jc w:val="left"/>
-      </w:pPr>
-      <w:r>
-        <w:rPr>
-          <w:rFonts w:ascii="Times New Roman" w:hAnsi="Times New Roman" w:eastAsia="Times New Roman"/>
-          <w:b w:val="0"/>
-          <w:color w:val="000000"/>
-          <w:sz w:val="24"/>
-          <w:u w:val="none"/>
-        </w:rPr>
-        <w:t>Introduction générale</w:t>
-        <w:tab/>
-      </w:r>
-    </w:p>
-    <w:p>
-      <w:pPr>
-        <w:spacing w:before="0" w:after="40" w:line="276" w:lineRule="auto"/>
-        <w:ind w:firstLine="0" w:left="0"/>
-        <w:tabs>
-          <w:tab w:val="right" w:leader="dot" w:pos="9000"/>
-        </w:tabs>
-        <w:jc w:val="left"/>
-      </w:pPr>
-      <w:r>
-        <w:rPr>
-          <w:rFonts w:ascii="Times New Roman" w:hAnsi="Times New Roman" w:eastAsia="Times New Roman"/>
-          <w:b w:val="0"/>
-          <w:color w:val="000000"/>
-          <w:sz w:val="24"/>
-          <w:u w:val="none"/>
-        </w:rPr>
-        <w:t>Problématique</w:t>
-        <w:tab/>
-      </w:r>
-    </w:p>
-    <w:p>
-      <w:pPr>
-        <w:spacing w:before="0" w:after="40" w:line="276" w:lineRule="auto"/>
-        <w:ind w:firstLine="0" w:left="0"/>
-        <w:tabs>
-          <w:tab w:val="right" w:leader="dot" w:pos="9000"/>
-        </w:tabs>
-        <w:jc w:val="left"/>
-      </w:pPr>
-      <w:r>
-        <w:rPr>
-          <w:rFonts w:ascii="Times New Roman" w:hAnsi="Times New Roman" w:eastAsia="Times New Roman"/>
-          <w:b w:val="0"/>
-          <w:color w:val="000000"/>
-          <w:sz w:val="24"/>
-          <w:u w:val="none"/>
-        </w:rPr>
-        <w:t>Chapitre 1 : État de l'art</w:t>
-        <w:tab/>
-      </w:r>
-    </w:p>
-    <w:p>
-      <w:pPr>
-        <w:spacing w:before="0" w:after="40" w:line="276" w:lineRule="auto"/>
-        <w:ind w:firstLine="0" w:left="425"/>
-        <w:tabs>
-          <w:tab w:val="right" w:leader="dot" w:pos="9000"/>
-        </w:tabs>
-        <w:jc w:val="left"/>
-      </w:pPr>
-      <w:r>
-        <w:rPr>
-          <w:rFonts w:ascii="Times New Roman" w:hAnsi="Times New Roman" w:eastAsia="Times New Roman"/>
-          <w:b w:val="0"/>
-          <w:color w:val="000000"/>
-          <w:sz w:val="24"/>
-          <w:u w:val="none"/>
-        </w:rPr>
-        <w:t>1.1 Contexte pédagogique et technologique</w:t>
-        <w:tab/>
-      </w:r>
-    </w:p>
-    <w:p>
-      <w:pPr>
-        <w:spacing w:before="0" w:after="40" w:line="276" w:lineRule="auto"/>
-        <w:ind w:firstLine="0" w:left="425"/>
-        <w:tabs>
-          <w:tab w:val="right" w:leader="dot" w:pos="9000"/>
-        </w:tabs>
-        <w:jc w:val="left"/>
-      </w:pPr>
-      <w:r>
-        <w:rPr>
-          <w:rFonts w:ascii="Times New Roman" w:hAnsi="Times New Roman" w:eastAsia="Times New Roman"/>
-          <w:b w:val="0"/>
-          <w:color w:val="000000"/>
-          <w:sz w:val="24"/>
-          <w:u w:val="none"/>
-        </w:rPr>
-        <w:t>1.2 Sous-problèmes et contraintes locales</w:t>
-        <w:tab/>
-      </w:r>
-    </w:p>
-    <w:p>
-      <w:pPr>
-        <w:spacing w:before="0" w:after="40" w:line="276" w:lineRule="auto"/>
-        <w:ind w:firstLine="0" w:left="425"/>
-        <w:tabs>
-          <w:tab w:val="right" w:leader="dot" w:pos="9000"/>
-        </w:tabs>
-        <w:jc w:val="left"/>
-      </w:pPr>
-      <w:r>
-        <w:rPr>
-          <w:rFonts w:ascii="Times New Roman" w:hAnsi="Times New Roman" w:eastAsia="Times New Roman"/>
-          <w:b w:val="0"/>
-          <w:color w:val="000000"/>
-          <w:sz w:val="24"/>
-          <w:u w:val="none"/>
-        </w:rPr>
-        <w:t>1.3 Panorama des solutions existantes</w:t>
-        <w:tab/>
-      </w:r>
-    </w:p>
-    <w:p>
-      <w:pPr>
-        <w:spacing w:before="0" w:after="40" w:line="276" w:lineRule="auto"/>
-        <w:ind w:firstLine="0" w:left="425"/>
-        <w:tabs>
-          <w:tab w:val="right" w:leader="dot" w:pos="9000"/>
-        </w:tabs>
-        <w:jc w:val="left"/>
-      </w:pPr>
-      <w:r>
-        <w:rPr>
-          <w:rFonts w:ascii="Times New Roman" w:hAnsi="Times New Roman" w:eastAsia="Times New Roman"/>
-          <w:b w:val="0"/>
-          <w:color w:val="000000"/>
-          <w:sz w:val="24"/>
-          <w:u w:val="none"/>
-        </w:rPr>
-        <w:t>1.4 Synthèse des lacunes du domaine</w:t>
-        <w:tab/>
-      </w:r>
-    </w:p>
-    <w:p>
-      <w:pPr>
-        <w:spacing w:before="0" w:after="40" w:line="276" w:lineRule="auto"/>
-        <w:ind w:firstLine="0" w:left="425"/>
-        <w:tabs>
-          <w:tab w:val="right" w:leader="dot" w:pos="9000"/>
-        </w:tabs>
-        <w:jc w:val="left"/>
-      </w:pPr>
-      <w:r>
-        <w:rPr>
-          <w:rFonts w:ascii="Times New Roman" w:hAnsi="Times New Roman" w:eastAsia="Times New Roman"/>
-          <w:b w:val="0"/>
-          <w:color w:val="000000"/>
-          <w:sz w:val="24"/>
-          <w:u w:val="none"/>
-        </w:rPr>
-        <w:t>1.5 Conclusion</w:t>
-        <w:tab/>
-      </w:r>
-    </w:p>
-    <w:p>
-      <w:pPr>
-        <w:spacing w:before="0" w:after="40" w:line="276" w:lineRule="auto"/>
-        <w:ind w:firstLine="0" w:left="0"/>
-        <w:tabs>
-          <w:tab w:val="right" w:leader="dot" w:pos="9000"/>
-        </w:tabs>
-        <w:jc w:val="left"/>
-      </w:pPr>
-      <w:r>
-        <w:rPr>
-          <w:rFonts w:ascii="Times New Roman" w:hAnsi="Times New Roman" w:eastAsia="Times New Roman"/>
-          <w:b w:val="0"/>
-          <w:color w:val="000000"/>
-          <w:sz w:val="24"/>
-          <w:u w:val="none"/>
-        </w:rPr>
-        <w:t>Chapitre 2 : Analyse des besoins et spécification du système</w:t>
-        <w:tab/>
-      </w:r>
-    </w:p>
-    <w:p>
-      <w:pPr>
-        <w:spacing w:before="0" w:after="40" w:line="276" w:lineRule="auto"/>
-        <w:ind w:firstLine="0" w:left="425"/>
-        <w:tabs>
-          <w:tab w:val="right" w:leader="dot" w:pos="9000"/>
-        </w:tabs>
-        <w:jc w:val="left"/>
-      </w:pPr>
-      <w:r>
-        <w:rPr>
-          <w:rFonts w:ascii="Times New Roman" w:hAnsi="Times New Roman" w:eastAsia="Times New Roman"/>
-          <w:b w:val="0"/>
-          <w:color w:val="000000"/>
-          <w:sz w:val="24"/>
-          <w:u w:val="none"/>
-        </w:rPr>
-        <w:t>2.1 Comparaison des solutions existantes</w:t>
-        <w:tab/>
-      </w:r>
-    </w:p>
-    <w:p>
-      <w:pPr>
-        <w:spacing w:before="0" w:after="40" w:line="276" w:lineRule="auto"/>
-        <w:ind w:firstLine="0" w:left="425"/>
-        <w:tabs>
-          <w:tab w:val="right" w:leader="dot" w:pos="9000"/>
-        </w:tabs>
-        <w:jc w:val="left"/>
-      </w:pPr>
-      <w:r>
-        <w:rPr>
-          <w:rFonts w:ascii="Times New Roman" w:hAnsi="Times New Roman" w:eastAsia="Times New Roman"/>
-          <w:b w:val="0"/>
-          <w:color w:val="000000"/>
-          <w:sz w:val="24"/>
-          <w:u w:val="none"/>
-        </w:rPr>
-        <w:t>2.2 Positionnement de Cylentic</w:t>
-        <w:tab/>
-      </w:r>
-    </w:p>
-    <w:p>
-      <w:pPr>
-        <w:spacing w:before="0" w:after="40" w:line="276" w:lineRule="auto"/>
-        <w:ind w:firstLine="0" w:left="425"/>
-        <w:tabs>
-          <w:tab w:val="right" w:leader="dot" w:pos="9000"/>
-        </w:tabs>
-        <w:jc w:val="left"/>
-      </w:pPr>
-      <w:r>
-        <w:rPr>
-          <w:rFonts w:ascii="Times New Roman" w:hAnsi="Times New Roman" w:eastAsia="Times New Roman"/>
-          <w:b w:val="0"/>
-          <w:color w:val="000000"/>
-          <w:sz w:val="24"/>
-          <w:u w:val="none"/>
-        </w:rPr>
-        <w:t>2.3 Périmètre du projet et du MVP</w:t>
-        <w:tab/>
-      </w:r>
-    </w:p>
-    <w:p>
-      <w:pPr>
-        <w:spacing w:before="0" w:after="40" w:line="276" w:lineRule="auto"/>
-        <w:ind w:firstLine="0" w:left="425"/>
-        <w:tabs>
-          <w:tab w:val="right" w:leader="dot" w:pos="9000"/>
-        </w:tabs>
-        <w:jc w:val="left"/>
-      </w:pPr>
-      <w:r>
-        <w:rPr>
-          <w:rFonts w:ascii="Times New Roman" w:hAnsi="Times New Roman" w:eastAsia="Times New Roman"/>
-          <w:b w:val="0"/>
-          <w:color w:val="000000"/>
-          <w:sz w:val="24"/>
-          <w:u w:val="none"/>
-        </w:rPr>
-        <w:t>2.4 Identification des acteurs</w:t>
-        <w:tab/>
-      </w:r>
-    </w:p>
-    <w:p>
-      <w:pPr>
-        <w:spacing w:before="0" w:after="40" w:line="276" w:lineRule="auto"/>
-        <w:ind w:firstLine="0" w:left="425"/>
-        <w:tabs>
-          <w:tab w:val="right" w:leader="dot" w:pos="9000"/>
-        </w:tabs>
-        <w:jc w:val="left"/>
-      </w:pPr>
-      <w:r>
-        <w:rPr>
-          <w:rFonts w:ascii="Times New Roman" w:hAnsi="Times New Roman" w:eastAsia="Times New Roman"/>
-          <w:b w:val="0"/>
-          <w:color w:val="000000"/>
-          <w:sz w:val="24"/>
-          <w:u w:val="none"/>
-        </w:rPr>
-        <w:t>2.5 Besoins fonctionnels</w:t>
-        <w:tab/>
-      </w:r>
-    </w:p>
-    <w:p>
-      <w:pPr>
-        <w:spacing w:before="0" w:after="40" w:line="276" w:lineRule="auto"/>
-        <w:ind w:firstLine="0" w:left="425"/>
-        <w:tabs>
-          <w:tab w:val="right" w:leader="dot" w:pos="9000"/>
-        </w:tabs>
-        <w:jc w:val="left"/>
-      </w:pPr>
-      <w:r>
-        <w:rPr>
-          <w:rFonts w:ascii="Times New Roman" w:hAnsi="Times New Roman" w:eastAsia="Times New Roman"/>
-          <w:b w:val="0"/>
-          <w:color w:val="000000"/>
-          <w:sz w:val="24"/>
-          <w:u w:val="none"/>
-        </w:rPr>
-        <w:t>2.6 Besoins non fonctionnels</w:t>
-        <w:tab/>
-      </w:r>
-    </w:p>
-    <w:p>
-      <w:pPr>
-        <w:spacing w:before="0" w:after="40" w:line="276" w:lineRule="auto"/>
-        <w:ind w:firstLine="0" w:left="425"/>
-        <w:tabs>
-          <w:tab w:val="right" w:leader="dot" w:pos="9000"/>
-        </w:tabs>
-        <w:jc w:val="left"/>
-      </w:pPr>
-      <w:r>
-        <w:rPr>
-          <w:rFonts w:ascii="Times New Roman" w:hAnsi="Times New Roman" w:eastAsia="Times New Roman"/>
-          <w:b w:val="0"/>
-          <w:color w:val="000000"/>
-          <w:sz w:val="24"/>
-          <w:u w:val="none"/>
-        </w:rPr>
-        <w:t>2.7 Règles métier structurantes</w:t>
-        <w:tab/>
-      </w:r>
-    </w:p>
-    <w:p>
-      <w:pPr>
-        <w:spacing w:before="0" w:after="40" w:line="276" w:lineRule="auto"/>
-        <w:ind w:firstLine="0" w:left="425"/>
-        <w:tabs>
-          <w:tab w:val="right" w:leader="dot" w:pos="9000"/>
-        </w:tabs>
-        <w:jc w:val="left"/>
-      </w:pPr>
-      <w:r>
-        <w:rPr>
-          <w:rFonts w:ascii="Times New Roman" w:hAnsi="Times New Roman" w:eastAsia="Times New Roman"/>
-          <w:b w:val="0"/>
-          <w:color w:val="000000"/>
-          <w:sz w:val="24"/>
-          <w:u w:val="none"/>
-        </w:rPr>
-        <w:t>2.8 Scénarios d'usage prioritaires</w:t>
-        <w:tab/>
-      </w:r>
-    </w:p>
-    <w:p>
-      <w:pPr>
-        <w:spacing w:before="0" w:after="40" w:line="276" w:lineRule="auto"/>
-        <w:ind w:firstLine="0" w:left="425"/>
-        <w:tabs>
-          <w:tab w:val="right" w:leader="dot" w:pos="9000"/>
-        </w:tabs>
-        <w:jc w:val="left"/>
-      </w:pPr>
-      <w:r>
-        <w:rPr>
-          <w:rFonts w:ascii="Times New Roman" w:hAnsi="Times New Roman" w:eastAsia="Times New Roman"/>
-          <w:b w:val="0"/>
-          <w:color w:val="000000"/>
-          <w:sz w:val="24"/>
-          <w:u w:val="none"/>
-        </w:rPr>
-        <w:t>2.9 Conclusion</w:t>
-        <w:tab/>
-      </w:r>
-    </w:p>
-    <w:p>
-      <w:pPr>
-        <w:spacing w:before="0" w:after="40" w:line="276" w:lineRule="auto"/>
-        <w:ind w:firstLine="0" w:left="0"/>
-        <w:tabs>
-          <w:tab w:val="right" w:leader="dot" w:pos="9000"/>
-        </w:tabs>
-        <w:jc w:val="left"/>
-      </w:pPr>
-      <w:r>
-        <w:rPr>
-          <w:rFonts w:ascii="Times New Roman" w:hAnsi="Times New Roman" w:eastAsia="Times New Roman"/>
-          <w:b w:val="0"/>
-          <w:color w:val="000000"/>
-          <w:sz w:val="24"/>
-          <w:u w:val="none"/>
-        </w:rPr>
-        <w:t>Chapitre 3 : Conception du système Cylentic</w:t>
-        <w:tab/>
-      </w:r>
-    </w:p>
-    <w:p>
-      <w:pPr>
-        <w:spacing w:before="0" w:after="40" w:line="276" w:lineRule="auto"/>
-        <w:ind w:firstLine="0" w:left="425"/>
-        <w:tabs>
-          <w:tab w:val="right" w:leader="dot" w:pos="9000"/>
-        </w:tabs>
-        <w:jc w:val="left"/>
-      </w:pPr>
-      <w:r>
-        <w:rPr>
-          <w:rFonts w:ascii="Times New Roman" w:hAnsi="Times New Roman" w:eastAsia="Times New Roman"/>
-          <w:b w:val="0"/>
-          <w:color w:val="000000"/>
-          <w:sz w:val="24"/>
-          <w:u w:val="none"/>
-        </w:rPr>
-        <w:t>3.1 Démarche de conception</w:t>
-        <w:tab/>
-      </w:r>
-    </w:p>
-    <w:p>
-      <w:pPr>
-        <w:spacing w:before="0" w:after="40" w:line="276" w:lineRule="auto"/>
-        <w:ind w:firstLine="0" w:left="425"/>
-        <w:tabs>
-          <w:tab w:val="right" w:leader="dot" w:pos="9000"/>
-        </w:tabs>
-        <w:jc w:val="left"/>
-      </w:pPr>
-      <w:r>
-        <w:rPr>
-          <w:rFonts w:ascii="Times New Roman" w:hAnsi="Times New Roman" w:eastAsia="Times New Roman"/>
-          <w:b w:val="0"/>
-          <w:color w:val="000000"/>
-          <w:sz w:val="24"/>
-          <w:u w:val="none"/>
-        </w:rPr>
-        <w:t>3.2 Architecture générale et déploiement</w:t>
-        <w:tab/>
-      </w:r>
-    </w:p>
-    <w:p>
-      <w:pPr>
-        <w:spacing w:before="0" w:after="40" w:line="276" w:lineRule="auto"/>
-        <w:ind w:firstLine="0" w:left="425"/>
-        <w:tabs>
-          <w:tab w:val="right" w:leader="dot" w:pos="9000"/>
-        </w:tabs>
-        <w:jc w:val="left"/>
-      </w:pPr>
-      <w:r>
-        <w:rPr>
-          <w:rFonts w:ascii="Times New Roman" w:hAnsi="Times New Roman" w:eastAsia="Times New Roman"/>
-          <w:b w:val="0"/>
-          <w:color w:val="000000"/>
-          <w:sz w:val="24"/>
-          <w:u w:val="none"/>
-        </w:rPr>
-        <w:t>3.3 Vue des cas d'utilisation</w:t>
-        <w:tab/>
-      </w:r>
-    </w:p>
-    <w:p>
-      <w:pPr>
-        <w:spacing w:before="0" w:after="40" w:line="276" w:lineRule="auto"/>
-        <w:ind w:firstLine="0" w:left="425"/>
-        <w:tabs>
-          <w:tab w:val="right" w:leader="dot" w:pos="9000"/>
-        </w:tabs>
-        <w:jc w:val="left"/>
-      </w:pPr>
-      <w:r>
-        <w:rPr>
-          <w:rFonts w:ascii="Times New Roman" w:hAnsi="Times New Roman" w:eastAsia="Times New Roman"/>
-          <w:b w:val="0"/>
-          <w:color w:val="000000"/>
-          <w:sz w:val="24"/>
-          <w:u w:val="none"/>
-        </w:rPr>
-        <w:t>3.4 Structure statique : classes et objets</w:t>
-        <w:tab/>
-      </w:r>
-    </w:p>
-    <w:p>
-      <w:pPr>
-        <w:spacing w:before="0" w:after="40" w:line="276" w:lineRule="auto"/>
-        <w:ind w:firstLine="0" w:left="425"/>
-        <w:tabs>
-          <w:tab w:val="right" w:leader="dot" w:pos="9000"/>
-        </w:tabs>
-        <w:jc w:val="left"/>
-      </w:pPr>
-      <w:r>
-        <w:rPr>
-          <w:rFonts w:ascii="Times New Roman" w:hAnsi="Times New Roman" w:eastAsia="Times New Roman"/>
-          <w:b w:val="0"/>
-          <w:color w:val="000000"/>
-          <w:sz w:val="24"/>
-          <w:u w:val="none"/>
-        </w:rPr>
-        <w:t>3.5 Organisation en composants</w:t>
-        <w:tab/>
-      </w:r>
-    </w:p>
-    <w:p>
-      <w:pPr>
-        <w:spacing w:before="0" w:after="40" w:line="276" w:lineRule="auto"/>
-        <w:ind w:firstLine="0" w:left="425"/>
-        <w:tabs>
-          <w:tab w:val="right" w:leader="dot" w:pos="9000"/>
-        </w:tabs>
-        <w:jc w:val="left"/>
-      </w:pPr>
-      <w:r>
-        <w:rPr>
-          <w:rFonts w:ascii="Times New Roman" w:hAnsi="Times New Roman" w:eastAsia="Times New Roman"/>
-          <w:b w:val="0"/>
-          <w:color w:val="000000"/>
-          <w:sz w:val="24"/>
-          <w:u w:val="none"/>
-        </w:rPr>
-        <w:t>3.6 Dynamique du système</w:t>
-        <w:tab/>
-      </w:r>
-    </w:p>
-    <w:p>
-      <w:pPr>
-        <w:spacing w:before="0" w:after="40" w:line="276" w:lineRule="auto"/>
-        <w:ind w:firstLine="0" w:left="850"/>
-        <w:tabs>
-          <w:tab w:val="right" w:leader="dot" w:pos="9000"/>
-        </w:tabs>
-        <w:jc w:val="left"/>
-      </w:pPr>
-      <w:r>
-        <w:rPr>
-          <w:rFonts w:ascii="Times New Roman" w:hAnsi="Times New Roman" w:eastAsia="Times New Roman"/>
-          <w:b w:val="0"/>
-          <w:color w:val="000000"/>
-          <w:sz w:val="24"/>
-          <w:u w:val="none"/>
-        </w:rPr>
-        <w:t>3.6.1 Cycle de vie d'un examen</w:t>
-        <w:tab/>
-      </w:r>
-    </w:p>
-    <w:p>
-      <w:pPr>
-        <w:spacing w:before="0" w:after="40" w:line="276" w:lineRule="auto"/>
-        <w:ind w:firstLine="0" w:left="850"/>
-        <w:tabs>
-          <w:tab w:val="right" w:leader="dot" w:pos="9000"/>
-        </w:tabs>
-        <w:jc w:val="left"/>
-      </w:pPr>
-      <w:r>
-        <w:rPr>
-          <w:rFonts w:ascii="Times New Roman" w:hAnsi="Times New Roman" w:eastAsia="Times New Roman"/>
-          <w:b w:val="0"/>
-          <w:color w:val="000000"/>
-          <w:sz w:val="24"/>
-          <w:u w:val="none"/>
-        </w:rPr>
-        <w:t>3.6.2 Interactions principales</w:t>
-        <w:tab/>
-      </w:r>
-    </w:p>
-    <w:p>
-      <w:pPr>
-        <w:spacing w:before="0" w:after="40" w:line="276" w:lineRule="auto"/>
-        <w:ind w:firstLine="0" w:left="850"/>
-        <w:tabs>
-          <w:tab w:val="right" w:leader="dot" w:pos="9000"/>
-        </w:tabs>
-        <w:jc w:val="left"/>
-      </w:pPr>
-      <w:r>
-        <w:rPr>
-          <w:rFonts w:ascii="Times New Roman" w:hAnsi="Times New Roman" w:eastAsia="Times New Roman"/>
-          <w:b w:val="0"/>
-          <w:color w:val="000000"/>
-          <w:sz w:val="24"/>
-          <w:u w:val="none"/>
-        </w:rPr>
-        <w:t>3.6.3 Parcours d'activité de l'étudiant</w:t>
-        <w:tab/>
-      </w:r>
-    </w:p>
-    <w:p>
-      <w:pPr>
-        <w:spacing w:before="0" w:after="40" w:line="276" w:lineRule="auto"/>
-        <w:ind w:firstLine="0" w:left="425"/>
-        <w:tabs>
-          <w:tab w:val="right" w:leader="dot" w:pos="9000"/>
-        </w:tabs>
-        <w:jc w:val="left"/>
-      </w:pPr>
-      <w:r>
-        <w:rPr>
-          <w:rFonts w:ascii="Times New Roman" w:hAnsi="Times New Roman" w:eastAsia="Times New Roman"/>
-          <w:b w:val="0"/>
-          <w:color w:val="000000"/>
-          <w:sz w:val="24"/>
-          <w:u w:val="none"/>
-        </w:rPr>
-        <w:t>3.7 Conception des données</w:t>
-        <w:tab/>
-      </w:r>
-    </w:p>
-    <w:p>
-      <w:pPr>
-        <w:spacing w:before="0" w:after="40" w:line="276" w:lineRule="auto"/>
-        <w:ind w:firstLine="0" w:left="425"/>
-        <w:tabs>
-          <w:tab w:val="right" w:leader="dot" w:pos="9000"/>
-        </w:tabs>
-        <w:jc w:val="left"/>
-      </w:pPr>
-      <w:r>
-        <w:rPr>
-          <w:rFonts w:ascii="Times New Roman" w:hAnsi="Times New Roman" w:eastAsia="Times New Roman"/>
-          <w:b w:val="0"/>
-          <w:color w:val="000000"/>
-          <w:sz w:val="24"/>
-          <w:u w:val="none"/>
-        </w:rPr>
-        <w:t>3.8 Conception de la sécurité pendant l'examen</w:t>
-        <w:tab/>
-      </w:r>
-    </w:p>
-    <w:p>
-      <w:pPr>
-        <w:spacing w:before="0" w:after="40" w:line="276" w:lineRule="auto"/>
-        <w:ind w:firstLine="0" w:left="425"/>
-        <w:tabs>
-          <w:tab w:val="right" w:leader="dot" w:pos="9000"/>
-        </w:tabs>
-        <w:jc w:val="left"/>
-      </w:pPr>
-      <w:r>
-        <w:rPr>
-          <w:rFonts w:ascii="Times New Roman" w:hAnsi="Times New Roman" w:eastAsia="Times New Roman"/>
-          <w:b w:val="0"/>
-          <w:color w:val="000000"/>
-          <w:sz w:val="24"/>
-          <w:u w:val="none"/>
-        </w:rPr>
-        <w:t>3.9 Conception de la correction automatique</w:t>
-        <w:tab/>
-      </w:r>
-    </w:p>
-    <w:p>
-      <w:pPr>
-        <w:spacing w:before="0" w:after="40" w:line="276" w:lineRule="auto"/>
-        <w:ind w:firstLine="0" w:left="425"/>
-        <w:tabs>
-          <w:tab w:val="right" w:leader="dot" w:pos="9000"/>
-        </w:tabs>
-        <w:jc w:val="left"/>
-      </w:pPr>
-      <w:r>
-        <w:rPr>
-          <w:rFonts w:ascii="Times New Roman" w:hAnsi="Times New Roman" w:eastAsia="Times New Roman"/>
-          <w:b w:val="0"/>
-          <w:color w:val="000000"/>
-          <w:sz w:val="24"/>
-          <w:u w:val="none"/>
-        </w:rPr>
-        <w:t>3.10 Conclusion partielle</w:t>
-        <w:tab/>
-      </w:r>
-    </w:p>
-    <w:p>
-      <w:pPr>
-        <w:spacing w:before="0" w:after="40" w:line="276" w:lineRule="auto"/>
-        <w:ind w:firstLine="0" w:left="0"/>
-        <w:tabs>
-          <w:tab w:val="right" w:leader="dot" w:pos="9000"/>
-        </w:tabs>
-        <w:jc w:val="left"/>
-      </w:pPr>
-      <w:r>
-        <w:rPr>
-          <w:rFonts w:ascii="Times New Roman" w:hAnsi="Times New Roman" w:eastAsia="Times New Roman"/>
-          <w:b w:val="0"/>
-          <w:color w:val="000000"/>
-          <w:sz w:val="24"/>
-          <w:u w:val="none"/>
-        </w:rPr>
-        <w:t>Chapitre 4 : Réalisation et mise en œuvre</w:t>
-        <w:tab/>
-      </w:r>
-    </w:p>
-    <w:p>
-      <w:pPr>
-        <w:spacing w:before="0" w:after="40" w:line="276" w:lineRule="auto"/>
-        <w:ind w:firstLine="0" w:left="425"/>
-        <w:tabs>
-          <w:tab w:val="right" w:leader="dot" w:pos="9000"/>
-        </w:tabs>
-        <w:jc w:val="left"/>
-      </w:pPr>
-      <w:r>
-        <w:rPr>
-          <w:rFonts w:ascii="Times New Roman" w:hAnsi="Times New Roman" w:eastAsia="Times New Roman"/>
-          <w:b w:val="0"/>
-          <w:color w:val="000000"/>
-          <w:sz w:val="24"/>
-          <w:u w:val="none"/>
-        </w:rPr>
-        <w:t>4.1 Environnement de travail</w:t>
-        <w:tab/>
-      </w:r>
-    </w:p>
-    <w:p>
-      <w:pPr>
-        <w:spacing w:before="0" w:after="40" w:line="276" w:lineRule="auto"/>
-        <w:ind w:firstLine="0" w:left="425"/>
-        <w:tabs>
-          <w:tab w:val="right" w:leader="dot" w:pos="9000"/>
-        </w:tabs>
-        <w:jc w:val="left"/>
-      </w:pPr>
-      <w:r>
-        <w:rPr>
-          <w:rFonts w:ascii="Times New Roman" w:hAnsi="Times New Roman" w:eastAsia="Times New Roman"/>
-          <w:b w:val="0"/>
-          <w:color w:val="000000"/>
-          <w:sz w:val="24"/>
-          <w:u w:val="none"/>
-        </w:rPr>
-        <w:t>4.2 Choix technologiques</w:t>
-        <w:tab/>
-      </w:r>
-    </w:p>
-    <w:p>
-      <w:pPr>
-        <w:spacing w:before="0" w:after="40" w:line="276" w:lineRule="auto"/>
-        <w:ind w:firstLine="0" w:left="425"/>
-        <w:tabs>
-          <w:tab w:val="right" w:leader="dot" w:pos="9000"/>
-        </w:tabs>
-        <w:jc w:val="left"/>
-      </w:pPr>
-      <w:r>
-        <w:rPr>
-          <w:rFonts w:ascii="Times New Roman" w:hAnsi="Times New Roman" w:eastAsia="Times New Roman"/>
-          <w:b w:val="0"/>
-          <w:color w:val="000000"/>
-          <w:sz w:val="24"/>
-          <w:u w:val="none"/>
-        </w:rPr>
-        <w:t>4.3 Organisation du code et architecture applicative</w:t>
-        <w:tab/>
-      </w:r>
-    </w:p>
-    <w:p>
-      <w:pPr>
-        <w:spacing w:before="0" w:after="40" w:line="276" w:lineRule="auto"/>
-        <w:ind w:firstLine="0" w:left="425"/>
-        <w:tabs>
-          <w:tab w:val="right" w:leader="dot" w:pos="9000"/>
-        </w:tabs>
-        <w:jc w:val="left"/>
-      </w:pPr>
-      <w:r>
-        <w:rPr>
-          <w:rFonts w:ascii="Times New Roman" w:hAnsi="Times New Roman" w:eastAsia="Times New Roman"/>
-          <w:b w:val="0"/>
-          <w:color w:val="000000"/>
-          <w:sz w:val="24"/>
-          <w:u w:val="none"/>
-        </w:rPr>
-        <w:t>4.4 Réalisation des modules principaux</w:t>
-        <w:tab/>
-      </w:r>
-    </w:p>
-    <w:p>
-      <w:pPr>
-        <w:spacing w:before="0" w:after="40" w:line="276" w:lineRule="auto"/>
-        <w:ind w:firstLine="0" w:left="850"/>
-        <w:tabs>
-          <w:tab w:val="right" w:leader="dot" w:pos="9000"/>
-        </w:tabs>
-        <w:jc w:val="left"/>
-      </w:pPr>
-      <w:r>
-        <w:rPr>
-          <w:rFonts w:ascii="Times New Roman" w:hAnsi="Times New Roman" w:eastAsia="Times New Roman"/>
-          <w:b w:val="0"/>
-          <w:color w:val="000000"/>
-          <w:sz w:val="24"/>
-          <w:u w:val="none"/>
-        </w:rPr>
-        <w:t>4.4.1 Authentification et sessions</w:t>
-        <w:tab/>
-      </w:r>
-    </w:p>
-    <w:p>
-      <w:pPr>
-        <w:spacing w:before="0" w:after="40" w:line="276" w:lineRule="auto"/>
-        <w:ind w:firstLine="0" w:left="850"/>
-        <w:tabs>
-          <w:tab w:val="right" w:leader="dot" w:pos="9000"/>
-        </w:tabs>
-        <w:jc w:val="left"/>
-      </w:pPr>
-      <w:r>
-        <w:rPr>
-          <w:rFonts w:ascii="Times New Roman" w:hAnsi="Times New Roman" w:eastAsia="Times New Roman"/>
-          <w:b w:val="0"/>
-          <w:color w:val="000000"/>
-          <w:sz w:val="24"/>
-          <w:u w:val="none"/>
-        </w:rPr>
-        <w:t>4.4.2 Module Super Admin</w:t>
-        <w:tab/>
-      </w:r>
-    </w:p>
-    <w:p>
-      <w:pPr>
-        <w:spacing w:before="0" w:after="40" w:line="276" w:lineRule="auto"/>
-        <w:ind w:firstLine="0" w:left="850"/>
-        <w:tabs>
-          <w:tab w:val="right" w:leader="dot" w:pos="9000"/>
-        </w:tabs>
-        <w:jc w:val="left"/>
-      </w:pPr>
-      <w:r>
-        <w:rPr>
-          <w:rFonts w:ascii="Times New Roman" w:hAnsi="Times New Roman" w:eastAsia="Times New Roman"/>
-          <w:b w:val="0"/>
-          <w:color w:val="000000"/>
-          <w:sz w:val="24"/>
-          <w:u w:val="none"/>
-        </w:rPr>
-        <w:t>4.4.3 Module administrateur d'établissement</w:t>
-        <w:tab/>
-      </w:r>
-    </w:p>
-    <w:p>
-      <w:pPr>
-        <w:spacing w:before="0" w:after="40" w:line="276" w:lineRule="auto"/>
-        <w:ind w:firstLine="0" w:left="850"/>
-        <w:tabs>
-          <w:tab w:val="right" w:leader="dot" w:pos="9000"/>
-        </w:tabs>
-        <w:jc w:val="left"/>
-      </w:pPr>
-      <w:r>
-        <w:rPr>
-          <w:rFonts w:ascii="Times New Roman" w:hAnsi="Times New Roman" w:eastAsia="Times New Roman"/>
-          <w:b w:val="0"/>
-          <w:color w:val="000000"/>
-          <w:sz w:val="24"/>
-          <w:u w:val="none"/>
-        </w:rPr>
-        <w:t>4.4.4 Module professeur</w:t>
-        <w:tab/>
-      </w:r>
-    </w:p>
-    <w:p>
-      <w:pPr>
-        <w:spacing w:before="0" w:after="40" w:line="276" w:lineRule="auto"/>
-        <w:ind w:firstLine="0" w:left="850"/>
-        <w:tabs>
-          <w:tab w:val="right" w:leader="dot" w:pos="9000"/>
-        </w:tabs>
-        <w:jc w:val="left"/>
-      </w:pPr>
-      <w:r>
-        <w:rPr>
-          <w:rFonts w:ascii="Times New Roman" w:hAnsi="Times New Roman" w:eastAsia="Times New Roman"/>
-          <w:b w:val="0"/>
-          <w:color w:val="000000"/>
-          <w:sz w:val="24"/>
-          <w:u w:val="none"/>
-        </w:rPr>
-        <w:t>4.4.5 Module étudiant et parcours de composition</w:t>
-        <w:tab/>
-      </w:r>
-    </w:p>
-    <w:p>
-      <w:pPr>
-        <w:spacing w:before="0" w:after="40" w:line="276" w:lineRule="auto"/>
-        <w:ind w:firstLine="0" w:left="850"/>
-        <w:tabs>
-          <w:tab w:val="right" w:leader="dot" w:pos="9000"/>
-        </w:tabs>
-        <w:jc w:val="left"/>
-      </w:pPr>
-      <w:r>
-        <w:rPr>
-          <w:rFonts w:ascii="Times New Roman" w:hAnsi="Times New Roman" w:eastAsia="Times New Roman"/>
-          <w:b w:val="0"/>
-          <w:color w:val="000000"/>
-          <w:sz w:val="24"/>
-          <w:u w:val="none"/>
-        </w:rPr>
-        <w:t>4.4.6 Sandbox et correction automatique</w:t>
-        <w:tab/>
-      </w:r>
-    </w:p>
-    <w:p>
-      <w:pPr>
-        <w:spacing w:before="0" w:after="40" w:line="276" w:lineRule="auto"/>
-        <w:ind w:firstLine="0" w:left="850"/>
-        <w:tabs>
-          <w:tab w:val="right" w:leader="dot" w:pos="9000"/>
-        </w:tabs>
-        <w:jc w:val="left"/>
-      </w:pPr>
-      <w:r>
-        <w:rPr>
-          <w:rFonts w:ascii="Times New Roman" w:hAnsi="Times New Roman" w:eastAsia="Times New Roman"/>
-          <w:b w:val="0"/>
-          <w:color w:val="000000"/>
-          <w:sz w:val="24"/>
-          <w:u w:val="none"/>
-        </w:rPr>
-        <w:t>4.4.7 Landing page et contact</w:t>
-        <w:tab/>
-      </w:r>
-    </w:p>
-    <w:p>
-      <w:pPr>
-        <w:spacing w:before="0" w:after="40" w:line="276" w:lineRule="auto"/>
-        <w:ind w:firstLine="0" w:left="425"/>
-        <w:tabs>
-          <w:tab w:val="right" w:leader="dot" w:pos="9000"/>
-        </w:tabs>
-        <w:jc w:val="left"/>
-      </w:pPr>
-      <w:r>
-        <w:rPr>
-          <w:rFonts w:ascii="Times New Roman" w:hAnsi="Times New Roman" w:eastAsia="Times New Roman"/>
-          <w:b w:val="0"/>
-          <w:color w:val="000000"/>
-          <w:sz w:val="24"/>
-          <w:u w:val="none"/>
-        </w:rPr>
-        <w:t>4.5 Points techniques difficiles</w:t>
-        <w:tab/>
-      </w:r>
-    </w:p>
-    <w:p>
-      <w:pPr>
-        <w:spacing w:before="0" w:after="40" w:line="276" w:lineRule="auto"/>
-        <w:ind w:firstLine="0" w:left="425"/>
-        <w:tabs>
-          <w:tab w:val="right" w:leader="dot" w:pos="9000"/>
-        </w:tabs>
-        <w:jc w:val="left"/>
-      </w:pPr>
-      <w:r>
-        <w:rPr>
-          <w:rFonts w:ascii="Times New Roman" w:hAnsi="Times New Roman" w:eastAsia="Times New Roman"/>
-          <w:b w:val="0"/>
-          <w:color w:val="000000"/>
-          <w:sz w:val="24"/>
-          <w:u w:val="none"/>
-        </w:rPr>
-        <w:t>4.6 Déploiement</w:t>
-        <w:tab/>
-      </w:r>
-    </w:p>
-    <w:p>
-      <w:pPr>
-        <w:spacing w:before="0" w:after="40" w:line="276" w:lineRule="auto"/>
-        <w:ind w:firstLine="0" w:left="425"/>
-        <w:tabs>
-          <w:tab w:val="right" w:leader="dot" w:pos="9000"/>
-        </w:tabs>
-        <w:jc w:val="left"/>
-      </w:pPr>
-      <w:r>
-        <w:rPr>
-          <w:rFonts w:ascii="Times New Roman" w:hAnsi="Times New Roman" w:eastAsia="Times New Roman"/>
-          <w:b w:val="0"/>
-          <w:color w:val="000000"/>
-          <w:sz w:val="24"/>
-          <w:u w:val="none"/>
-        </w:rPr>
-        <w:t>4.7 Conclusion partielle</w:t>
-        <w:tab/>
-      </w:r>
-    </w:p>
-    <w:p>
-      <w:pPr>
-        <w:spacing w:before="0" w:after="40" w:line="276" w:lineRule="auto"/>
-        <w:ind w:firstLine="0" w:left="0"/>
-        <w:tabs>
-          <w:tab w:val="right" w:leader="dot" w:pos="9000"/>
-        </w:tabs>
-        <w:jc w:val="left"/>
-      </w:pPr>
-      <w:r>
-        <w:rPr>
-          <w:rFonts w:ascii="Times New Roman" w:hAnsi="Times New Roman" w:eastAsia="Times New Roman"/>
-          <w:b w:val="0"/>
-          <w:color w:val="000000"/>
-          <w:sz w:val="24"/>
-          <w:u w:val="none"/>
-        </w:rPr>
-        <w:t>Chapitre 5 : Tests, résultats, limites et perspectives</w:t>
-        <w:tab/>
-      </w:r>
-    </w:p>
-    <w:p>
-      <w:pPr>
-        <w:spacing w:before="0" w:after="40" w:line="276" w:lineRule="auto"/>
-        <w:ind w:firstLine="0" w:left="425"/>
-        <w:tabs>
-          <w:tab w:val="right" w:leader="dot" w:pos="9000"/>
-        </w:tabs>
-        <w:jc w:val="left"/>
-      </w:pPr>
-      <w:r>
-        <w:rPr>
-          <w:rFonts w:ascii="Times New Roman" w:hAnsi="Times New Roman" w:eastAsia="Times New Roman"/>
-          <w:b w:val="0"/>
-          <w:color w:val="000000"/>
-          <w:sz w:val="24"/>
-          <w:u w:val="none"/>
-        </w:rPr>
-        <w:t>5.1 Stratégie de tests</w:t>
-        <w:tab/>
-      </w:r>
-    </w:p>
-    <w:p>
-      <w:pPr>
-        <w:spacing w:before="0" w:after="40" w:line="276" w:lineRule="auto"/>
-        <w:ind w:firstLine="0" w:left="425"/>
-        <w:tabs>
-          <w:tab w:val="right" w:leader="dot" w:pos="9000"/>
-        </w:tabs>
-        <w:jc w:val="left"/>
-      </w:pPr>
-      <w:r>
-        <w:rPr>
-          <w:rFonts w:ascii="Times New Roman" w:hAnsi="Times New Roman" w:eastAsia="Times New Roman"/>
-          <w:b w:val="0"/>
-          <w:color w:val="000000"/>
-          <w:sz w:val="24"/>
-          <w:u w:val="none"/>
-        </w:rPr>
-        <w:t>5.2 Jeux de tests et résultats</w:t>
-        <w:tab/>
-      </w:r>
-    </w:p>
-    <w:p>
-      <w:pPr>
-        <w:spacing w:before="0" w:after="40" w:line="276" w:lineRule="auto"/>
-        <w:ind w:firstLine="0" w:left="850"/>
-        <w:tabs>
-          <w:tab w:val="right" w:leader="dot" w:pos="9000"/>
-        </w:tabs>
-        <w:jc w:val="left"/>
-      </w:pPr>
-      <w:r>
-        <w:rPr>
-          <w:rFonts w:ascii="Times New Roman" w:hAnsi="Times New Roman" w:eastAsia="Times New Roman"/>
-          <w:b w:val="0"/>
-          <w:color w:val="000000"/>
-          <w:sz w:val="24"/>
-          <w:u w:val="none"/>
-        </w:rPr>
-        <w:t>5.2.1 Authentification et accès</w:t>
-        <w:tab/>
-      </w:r>
-    </w:p>
-    <w:p>
-      <w:pPr>
-        <w:spacing w:before="0" w:after="40" w:line="276" w:lineRule="auto"/>
-        <w:ind w:firstLine="0" w:left="850"/>
-        <w:tabs>
-          <w:tab w:val="right" w:leader="dot" w:pos="9000"/>
-        </w:tabs>
-        <w:jc w:val="left"/>
-      </w:pPr>
-      <w:r>
-        <w:rPr>
-          <w:rFonts w:ascii="Times New Roman" w:hAnsi="Times New Roman" w:eastAsia="Times New Roman"/>
-          <w:b w:val="0"/>
-          <w:color w:val="000000"/>
-          <w:sz w:val="24"/>
-          <w:u w:val="none"/>
-        </w:rPr>
-        <w:t>5.2.2 Administration</w:t>
-        <w:tab/>
-      </w:r>
-    </w:p>
-    <w:p>
-      <w:pPr>
-        <w:spacing w:before="0" w:after="40" w:line="276" w:lineRule="auto"/>
-        <w:ind w:firstLine="0" w:left="850"/>
-        <w:tabs>
-          <w:tab w:val="right" w:leader="dot" w:pos="9000"/>
-        </w:tabs>
-        <w:jc w:val="left"/>
-      </w:pPr>
-      <w:r>
-        <w:rPr>
-          <w:rFonts w:ascii="Times New Roman" w:hAnsi="Times New Roman" w:eastAsia="Times New Roman"/>
-          <w:b w:val="0"/>
-          <w:color w:val="000000"/>
-          <w:sz w:val="24"/>
-          <w:u w:val="none"/>
-        </w:rPr>
-        <w:t>5.2.3 Examens côté professeur</w:t>
-        <w:tab/>
-      </w:r>
-    </w:p>
-    <w:p>
-      <w:pPr>
-        <w:spacing w:before="0" w:after="40" w:line="276" w:lineRule="auto"/>
-        <w:ind w:firstLine="0" w:left="850"/>
-        <w:tabs>
-          <w:tab w:val="right" w:leader="dot" w:pos="9000"/>
-        </w:tabs>
-        <w:jc w:val="left"/>
-      </w:pPr>
-      <w:r>
-        <w:rPr>
-          <w:rFonts w:ascii="Times New Roman" w:hAnsi="Times New Roman" w:eastAsia="Times New Roman"/>
-          <w:b w:val="0"/>
-          <w:color w:val="000000"/>
-          <w:sz w:val="24"/>
-          <w:u w:val="none"/>
-        </w:rPr>
-        <w:t>5.2.4 Parcours étudiant et contrôles pendant l'examen</w:t>
-        <w:tab/>
-      </w:r>
-    </w:p>
-    <w:p>
-      <w:pPr>
-        <w:spacing w:before="0" w:after="40" w:line="276" w:lineRule="auto"/>
-        <w:ind w:firstLine="0" w:left="425"/>
-        <w:tabs>
-          <w:tab w:val="right" w:leader="dot" w:pos="9000"/>
-        </w:tabs>
-        <w:jc w:val="left"/>
-      </w:pPr>
-      <w:r>
-        <w:rPr>
-          <w:rFonts w:ascii="Times New Roman" w:hAnsi="Times New Roman" w:eastAsia="Times New Roman"/>
-          <w:b w:val="0"/>
-          <w:color w:val="000000"/>
-          <w:sz w:val="24"/>
-          <w:u w:val="none"/>
-        </w:rPr>
-        <w:t>5.3 Discussion des résultats</w:t>
-        <w:tab/>
-      </w:r>
-    </w:p>
-    <w:p>
-      <w:pPr>
-        <w:spacing w:before="0" w:after="40" w:line="276" w:lineRule="auto"/>
-        <w:ind w:firstLine="0" w:left="425"/>
-        <w:tabs>
-          <w:tab w:val="right" w:leader="dot" w:pos="9000"/>
-        </w:tabs>
-        <w:jc w:val="left"/>
-      </w:pPr>
-      <w:r>
-        <w:rPr>
-          <w:rFonts w:ascii="Times New Roman" w:hAnsi="Times New Roman" w:eastAsia="Times New Roman"/>
-          <w:b w:val="0"/>
-          <w:color w:val="000000"/>
-          <w:sz w:val="24"/>
-          <w:u w:val="none"/>
-        </w:rPr>
-        <w:t>5.4 Limites et risques résiduels</w:t>
-        <w:tab/>
-      </w:r>
-    </w:p>
-    <w:p>
-      <w:pPr>
-        <w:spacing w:before="0" w:after="40" w:line="276" w:lineRule="auto"/>
-        <w:ind w:firstLine="0" w:left="425"/>
-        <w:tabs>
-          <w:tab w:val="right" w:leader="dot" w:pos="9000"/>
-        </w:tabs>
-        <w:jc w:val="left"/>
-      </w:pPr>
-      <w:r>
-        <w:rPr>
-          <w:rFonts w:ascii="Times New Roman" w:hAnsi="Times New Roman" w:eastAsia="Times New Roman"/>
-          <w:b w:val="0"/>
-          <w:color w:val="000000"/>
-          <w:sz w:val="24"/>
-          <w:u w:val="none"/>
-        </w:rPr>
-        <w:t>5.5 Perspectives</w:t>
-        <w:tab/>
-      </w:r>
-    </w:p>
-    <w:p>
-      <w:pPr>
-        <w:spacing w:before="0" w:after="40" w:line="276" w:lineRule="auto"/>
-        <w:ind w:firstLine="0" w:left="425"/>
-        <w:tabs>
-          <w:tab w:val="right" w:leader="dot" w:pos="9000"/>
-        </w:tabs>
-        <w:jc w:val="left"/>
-      </w:pPr>
-      <w:r>
-        <w:rPr>
-          <w:rFonts w:ascii="Times New Roman" w:hAnsi="Times New Roman" w:eastAsia="Times New Roman"/>
-          <w:b w:val="0"/>
-          <w:color w:val="000000"/>
-          <w:sz w:val="24"/>
-          <w:u w:val="none"/>
-        </w:rPr>
-        <w:t>5.6 Conclusion partielle</w:t>
-        <w:tab/>
-      </w:r>
-    </w:p>
-    <w:p>
-      <w:pPr>
-        <w:spacing w:before="0" w:after="40" w:line="276" w:lineRule="auto"/>
-        <w:ind w:firstLine="0" w:left="0"/>
-        <w:tabs>
-          <w:tab w:val="right" w:leader="dot" w:pos="9000"/>
-        </w:tabs>
-        <w:jc w:val="left"/>
-      </w:pPr>
-      <w:r>
-        <w:rPr>
-          <w:rFonts w:ascii="Times New Roman" w:hAnsi="Times New Roman" w:eastAsia="Times New Roman"/>
-          <w:b w:val="0"/>
-          <w:color w:val="000000"/>
-          <w:sz w:val="24"/>
-          <w:u w:val="none"/>
-        </w:rPr>
-        <w:t>Conclusion générale</w:t>
-        <w:tab/>
-      </w:r>
-    </w:p>
-    <w:p>
-      <w:pPr>
-        <w:spacing w:before="0" w:after="40" w:line="276" w:lineRule="auto"/>
-        <w:ind w:firstLine="0" w:left="0"/>
-        <w:tabs>
-          <w:tab w:val="right" w:leader="dot" w:pos="9000"/>
-        </w:tabs>
-        <w:jc w:val="left"/>
-      </w:pPr>
-      <w:r>
-        <w:rPr>
-          <w:rFonts w:ascii="Times New Roman" w:hAnsi="Times New Roman" w:eastAsia="Times New Roman"/>
-          <w:b w:val="0"/>
-          <w:color w:val="000000"/>
-          <w:sz w:val="24"/>
-          <w:u w:val="none"/>
-        </w:rPr>
-        <w:t>Bibliographie</w:t>
-        <w:tab/>
-      </w:r>
-    </w:p>
-    <w:p>
-      <w:pPr>
-        <w:spacing w:before="0" w:after="40" w:line="276" w:lineRule="auto"/>
-        <w:ind w:firstLine="0" w:left="0"/>
-        <w:tabs>
-          <w:tab w:val="right" w:leader="dot" w:pos="9000"/>
-        </w:tabs>
-        <w:jc w:val="left"/>
-      </w:pPr>
-      <w:r>
-        <w:rPr>
-          <w:rFonts w:ascii="Times New Roman" w:hAnsi="Times New Roman" w:eastAsia="Times New Roman"/>
-          <w:b w:val="0"/>
-          <w:color w:val="000000"/>
-          <w:sz w:val="24"/>
-          <w:u w:val="none"/>
-        </w:rPr>
-        <w:t>Webographie</w:t>
-        <w:tab/>
-      </w:r>
-    </w:p>
-    <w:p>
-      <w:pPr>
-        <w:spacing w:before="0" w:after="40" w:line="276" w:lineRule="auto"/>
-        <w:ind w:firstLine="0" w:left="0"/>
-        <w:tabs>
-          <w:tab w:val="right" w:leader="dot" w:pos="9000"/>
-        </w:tabs>
-        <w:jc w:val="left"/>
-      </w:pPr>
-      <w:r>
-        <w:rPr>
-          <w:rFonts w:ascii="Times New Roman" w:hAnsi="Times New Roman" w:eastAsia="Times New Roman"/>
-          <w:b w:val="0"/>
-          <w:color w:val="000000"/>
-          <w:sz w:val="24"/>
-          <w:u w:val="none"/>
-        </w:rPr>
-        <w:t>Annexes</w:t>
-        <w:tab/>
-      </w:r>
-    </w:p>
-    <w:p>
-      <w:pPr>
-        <w:spacing w:before="0" w:after="40" w:line="276" w:lineRule="auto"/>
-        <w:ind w:firstLine="0" w:left="425"/>
-        <w:tabs>
-          <w:tab w:val="right" w:leader="dot" w:pos="9000"/>
-        </w:tabs>
-        <w:jc w:val="left"/>
-      </w:pPr>
-      <w:r>
-        <w:rPr>
-          <w:rFonts w:ascii="Times New Roman" w:hAnsi="Times New Roman" w:eastAsia="Times New Roman"/>
-          <w:b w:val="0"/>
-          <w:color w:val="000000"/>
-          <w:sz w:val="24"/>
-          <w:u w:val="none"/>
-        </w:rPr>
-        <w:t>Annexe A : Préfixes d'identifiants</w:t>
-        <w:tab/>
-      </w:r>
-    </w:p>
-    <w:p>
-      <w:pPr>
-        <w:spacing w:before="0" w:after="40" w:line="276" w:lineRule="auto"/>
-        <w:ind w:firstLine="0" w:left="425"/>
-        <w:tabs>
-          <w:tab w:val="right" w:leader="dot" w:pos="9000"/>
-        </w:tabs>
-        <w:jc w:val="left"/>
-      </w:pPr>
-      <w:r>
-        <w:rPr>
-          <w:rFonts w:ascii="Times New Roman" w:hAnsi="Times New Roman" w:eastAsia="Times New Roman"/>
-          <w:b w:val="0"/>
-          <w:color w:val="000000"/>
-          <w:sz w:val="24"/>
-          <w:u w:val="none"/>
-        </w:rPr>
-        <w:t>Annexe B : Modèle CSV d'import des étudiants</w:t>
-        <w:tab/>
+        </w:rPr>
+        <w:fldChar w:fldCharType="begin"/>
+        <w:instrText xml:space="preserve">TOC \o "1-3" \z \u</w:instrText>
+        <w:fldChar w:fldCharType="separate"/>
+        <w:t> </w:t>
+        <w:fldChar w:fldCharType="end"/>
       </w:r>
     </w:p>
     <w:sectPr>
@@ -26106,8 +23423,8 @@
     <w:unhideWhenUsed/>
     <w:rsid w:val="0084737F"/>
     <w:rPr>
-      <w:color w:val="0000FF" w:themeColor="hyperlink"/>
-      <w:u w:val="single"/>
+      <w:color w:val="000000"/>
+      <w:u w:val="none"/>
     </w:rPr>
   </w:style>
   <w:style w:type="paragraph" w:styleId="Tabledesillustrations">

</xml_diff>

<commit_message>
Bibliographie FR crédible + webographie avec liens cliquables
Retrait des références anglaises. URLs webographie cliquables.

Co-authored-by: progirix <progirix@users.noreply.github.com>
</commit_message>
<xml_diff>
--- a/docs/Rapport_Cylentic.docx
+++ b/docs/Rapport_Cylentic.docx
@@ -16380,171 +16380,66 @@
     </w:p>
     <w:p>
       <w:pPr>
-        <w:spacing w:after="120"/>
-        <w:rPr>
-          <w:lang w:val="en-US"/>
-        </w:rPr>
-      </w:pPr>
-      <w:r>
-        <w:rPr>
-          <w:color w:val="000000"/>
-          <w:lang w:val="en-US"/>
-        </w:rPr>
-        <w:t>[1] Object Management Group, OMG Unified Modeling Language (OMG UML), Version 2.5.1, 2017.</w:t>
-      </w:r>
-    </w:p>
-    <w:p>
-      <w:pPr>
-        <w:spacing w:after="120"/>
-        <w:rPr>
-          <w:lang w:val="en-US"/>
-        </w:rPr>
-      </w:pPr>
-      <w:r>
-        <w:rPr>
-          <w:color w:val="000000"/>
-          <w:lang w:val="en-US"/>
-        </w:rPr>
-        <w:t>[2] R. S. Pressman et B. R.</w:t>
-      </w:r>
-      <w:r>
-        <w:rPr>
-          <w:color w:val="000000"/>
-          <w:lang w:val="en-US"/>
-        </w:rPr>
-        <w:t xml:space="preserve"> Maxim, Software Engineering: A Practitioner's Approach, 9e </w:t>
-      </w:r>
-      <w:proofErr w:type="spellStart"/>
-      <w:r>
-        <w:rPr>
-          <w:color w:val="000000"/>
-          <w:lang w:val="en-US"/>
-        </w:rPr>
-        <w:t>éd</w:t>
-      </w:r>
-      <w:proofErr w:type="spellEnd"/>
-      <w:r>
-        <w:rPr>
-          <w:color w:val="000000"/>
-          <w:lang w:val="en-US"/>
-        </w:rPr>
-        <w:t>., McGraw-Hill, 2019.</w:t>
-      </w:r>
-    </w:p>
-    <w:p>
-      <w:pPr>
-        <w:spacing w:after="120"/>
-        <w:rPr>
-          <w:lang w:val="en-US"/>
-        </w:rPr>
-      </w:pPr>
-      <w:r>
-        <w:rPr>
-          <w:color w:val="000000"/>
-          <w:lang w:val="en-US"/>
-        </w:rPr>
-        <w:t xml:space="preserve">[3] I. Sommerville, Software Engineering, 10e </w:t>
-      </w:r>
-      <w:proofErr w:type="spellStart"/>
-      <w:r>
-        <w:rPr>
-          <w:color w:val="000000"/>
-          <w:lang w:val="en-US"/>
-        </w:rPr>
-        <w:t>éd</w:t>
-      </w:r>
-      <w:proofErr w:type="spellEnd"/>
-      <w:r>
-        <w:rPr>
-          <w:color w:val="000000"/>
-          <w:lang w:val="en-US"/>
-        </w:rPr>
-        <w:t>., Pearson, 2016.</w:t>
-      </w:r>
-    </w:p>
-    <w:p>
-      <w:pPr>
-        <w:spacing w:after="120"/>
-        <w:rPr>
-          <w:lang w:val="en-US"/>
-        </w:rPr>
-      </w:pPr>
-      <w:r>
-        <w:rPr>
-          <w:color w:val="000000"/>
-          <w:lang w:val="en-US"/>
-        </w:rPr>
-        <w:t xml:space="preserve">[4] G. </w:t>
-      </w:r>
-      <w:proofErr w:type="spellStart"/>
-      <w:r>
-        <w:rPr>
-          <w:color w:val="000000"/>
-          <w:lang w:val="en-US"/>
-        </w:rPr>
-        <w:t>Booch</w:t>
-      </w:r>
-      <w:proofErr w:type="spellEnd"/>
-      <w:r>
-        <w:rPr>
-          <w:color w:val="000000"/>
-          <w:lang w:val="en-US"/>
-        </w:rPr>
-        <w:t xml:space="preserve">, J. Rumbaugh et I. Jacobson, The Unified Modeling Language User Guide, 2e </w:t>
-      </w:r>
-      <w:proofErr w:type="spellStart"/>
-      <w:r>
-        <w:rPr>
-          <w:color w:val="000000"/>
-          <w:lang w:val="en-US"/>
-        </w:rPr>
-        <w:t>éd</w:t>
-      </w:r>
-      <w:proofErr w:type="spellEnd"/>
-      <w:r>
-        <w:rPr>
-          <w:color w:val="000000"/>
-          <w:lang w:val="en-US"/>
-        </w:rPr>
-        <w:t>., Addison-Wesley</w:t>
-      </w:r>
-      <w:r>
-        <w:rPr>
-          <w:color w:val="000000"/>
-          <w:lang w:val="en-US"/>
-        </w:rPr>
-        <w:t>, 2005.</w:t>
-      </w:r>
-    </w:p>
-    <w:p>
-      <w:pPr>
-        <w:spacing w:after="120"/>
-        <w:rPr>
-          <w:lang w:val="en-US"/>
-        </w:rPr>
-      </w:pPr>
-      <w:r>
-        <w:rPr>
-          <w:color w:val="000000"/>
-          <w:lang w:val="en-US"/>
-        </w:rPr>
-        <w:t>[5] M. Fowler, Patterns of Enterprise Application Architecture, Addison-Wesley, 2002.</w:t>
-      </w:r>
-    </w:p>
-    <w:p>
-      <w:pPr>
-        <w:spacing w:after="120"/>
-      </w:pPr>
-      <w:r>
-        <w:rPr>
-          <w:color w:val="000000"/>
-        </w:rPr>
-        <w:t>[6] ESTA, Guide du stagiaire Master/Ingénieur, année académique 2024-2025.</w:t>
-      </w:r>
-    </w:p>
-    <w:p>
-      <w:r>
-        <w:br w:type="page"/>
+        <w:spacing w:line="360" w:lineRule="auto" w:after="120"/>
+        <w:ind w:firstLine="0"/>
+        <w:jc w:val="left"/>
+      </w:pPr>
+      <w:r>
+        <w:rPr>
+          <w:rFonts w:ascii="Times New Roman" w:hAnsi="Times New Roman" w:eastAsia="Times New Roman"/>
+          <w:b w:val="0"/>
+          <w:color w:val="000000"/>
+          <w:sz w:val="24"/>
+        </w:rPr>
+        <w:t>[1] P. Roques, UML 2 par la pratique, 5e éd., Éditions Eyrolles, Paris, 2018.</w:t>
+      </w:r>
+    </w:p>
+    <w:p>
+      <w:pPr>
+        <w:spacing w:line="360" w:lineRule="auto" w:after="120"/>
+        <w:ind w:firstLine="0"/>
+        <w:jc w:val="left"/>
+      </w:pPr>
+      <w:r>
+        <w:rPr>
+          <w:rFonts w:ascii="Times New Roman" w:hAnsi="Times New Roman" w:eastAsia="Times New Roman"/>
+          <w:b w:val="0"/>
+          <w:color w:val="000000"/>
+          <w:sz w:val="24"/>
+        </w:rPr>
+        <w:t>[2] C. Soutou, Modélisation de bases de données, 4e éd., Éditions Eyrolles, Paris, 2020.</w:t>
+      </w:r>
+    </w:p>
+    <w:p>
+      <w:pPr>
+        <w:spacing w:line="360" w:lineRule="auto" w:after="120"/>
+        <w:ind w:firstLine="0"/>
+        <w:jc w:val="left"/>
+      </w:pPr>
+      <w:r>
+        <w:rPr>
+          <w:rFonts w:ascii="Times New Roman" w:hAnsi="Times New Roman" w:eastAsia="Times New Roman"/>
+          <w:b w:val="0"/>
+          <w:color w:val="000000"/>
+          <w:sz w:val="24"/>
+        </w:rPr>
+        <w:t>[3] J. Gabay et B. Cohen, Guide de pilotage UML, 2e éd., Éditions Dunod, Paris, 2019.</w:t>
+      </w:r>
+    </w:p>
+    <w:p>
+      <w:pPr>
+        <w:spacing w:line="360" w:lineRule="auto" w:after="120"/>
+        <w:ind w:firstLine="0"/>
+        <w:jc w:val="left"/>
+      </w:pPr>
+      <w:r>
+        <w:rPr>
+          <w:rFonts w:ascii="Times New Roman" w:hAnsi="Times New Roman" w:eastAsia="Times New Roman"/>
+          <w:b w:val="0"/>
+          <w:color w:val="000000"/>
+          <w:sz w:val="24"/>
+        </w:rPr>
+        <w:t>[4] ESTA, Guide du stagiaire Master/Ingénieur, année académique 2024-2025.</w:t>
       </w:r>
     </w:p>
     <w:p>
@@ -16566,220 +16461,362 @@
     </w:p>
     <w:p>
       <w:pPr>
-        <w:spacing w:after="120"/>
-      </w:pPr>
-      <w:r>
-        <w:rPr>
-          <w:color w:val="000000"/>
-        </w:rPr>
-        <w:t xml:space="preserve">[1] </w:t>
-      </w:r>
-      <w:proofErr w:type="spellStart"/>
-      <w:r>
-        <w:rPr>
-          <w:color w:val="000000"/>
-        </w:rPr>
-        <w:t>Vercel</w:t>
-      </w:r>
-      <w:proofErr w:type="spellEnd"/>
-      <w:r>
-        <w:rPr>
-          <w:color w:val="000000"/>
-        </w:rPr>
-        <w:t xml:space="preserve">, Next.js Documentation, </w:t>
-      </w:r>
-      <w:r>
-        <w:rPr>
-          <w:color w:val="000000"/>
-        </w:rPr>
-        <w:t>https://nextjs.org/docs, consulté le 01/06/2026 à 09h20.</w:t>
-      </w:r>
-    </w:p>
-    <w:p>
-      <w:pPr>
-        <w:spacing w:after="120"/>
-      </w:pPr>
-      <w:r>
-        <w:rPr>
-          <w:color w:val="000000"/>
-        </w:rPr>
-        <w:t>[2] Prisma, Prisma Documentation, https://www.prisma.io/docs, consulté le 03/06/2026 à 14h45.</w:t>
-      </w:r>
-    </w:p>
-    <w:p>
-      <w:pPr>
-        <w:spacing w:after="120"/>
-      </w:pPr>
-      <w:r>
-        <w:rPr>
-          <w:color w:val="000000"/>
-        </w:rPr>
-        <w:t>[3] Oracle, MySQL 8 Documentation, https://dev.mysql.com/doc/, consulté le 05/06/2026 à 10h10.</w:t>
-      </w:r>
-    </w:p>
-    <w:p>
-      <w:pPr>
-        <w:spacing w:after="120"/>
-      </w:pPr>
-      <w:r>
-        <w:rPr>
-          <w:color w:val="000000"/>
-        </w:rPr>
-        <w:t>[4] Docker</w:t>
-      </w:r>
-      <w:r>
-        <w:rPr>
-          <w:color w:val="000000"/>
-        </w:rPr>
-        <w:t xml:space="preserve"> Inc., Docker Documentation, https://docs.docker.com/, consulté le 08/06/2026 à 16h30.</w:t>
-      </w:r>
-    </w:p>
-    <w:p>
-      <w:pPr>
-        <w:spacing w:after="120"/>
-      </w:pPr>
-      <w:r>
-        <w:rPr>
-          <w:color w:val="000000"/>
-        </w:rPr>
-        <w:t>[5] Redis Ltd, Redis Documentation, https://redis.io/docs/, consulté le 11/06/2026 à 11h05.</w:t>
-      </w:r>
-    </w:p>
-    <w:p>
-      <w:pPr>
-        <w:spacing w:after="120"/>
-      </w:pPr>
-      <w:r>
-        <w:rPr>
-          <w:color w:val="000000"/>
-        </w:rPr>
-        <w:t>[6] Microsoft, Monaco Editor, https://microsoft.github.io/monaco-editor/, con</w:t>
-      </w:r>
-      <w:r>
-        <w:rPr>
-          <w:color w:val="000000"/>
-        </w:rPr>
-        <w:t>sulté le 14/06/2026 à 15h50.</w:t>
-      </w:r>
-    </w:p>
-    <w:p>
-      <w:pPr>
-        <w:spacing w:after="120"/>
-      </w:pPr>
-      <w:r>
-        <w:rPr>
-          <w:color w:val="000000"/>
-        </w:rPr>
-        <w:t xml:space="preserve">[7] </w:t>
-      </w:r>
-      <w:proofErr w:type="spellStart"/>
-      <w:r>
-        <w:rPr>
-          <w:color w:val="000000"/>
-        </w:rPr>
-        <w:t>PlantUML</w:t>
-      </w:r>
-      <w:proofErr w:type="spellEnd"/>
-      <w:r>
-        <w:rPr>
-          <w:color w:val="000000"/>
-        </w:rPr>
-        <w:t>, https://plantuml.com/, consulté le 17/06/2026 à 08h40.</w:t>
-      </w:r>
-    </w:p>
-    <w:p>
-      <w:pPr>
-        <w:spacing w:after="120"/>
-      </w:pPr>
-      <w:r>
-        <w:rPr>
-          <w:color w:val="000000"/>
-        </w:rPr>
-        <w:t xml:space="preserve">[8] </w:t>
-      </w:r>
-      <w:proofErr w:type="spellStart"/>
-      <w:r>
-        <w:rPr>
-          <w:color w:val="000000"/>
-        </w:rPr>
-        <w:t>freeCodeCamp</w:t>
-      </w:r>
-      <w:proofErr w:type="spellEnd"/>
-      <w:r>
-        <w:rPr>
-          <w:color w:val="000000"/>
-        </w:rPr>
-        <w:t>, https://www.freecodecamp.org/, consulté le 20/06/2026 à 13h15.</w:t>
-      </w:r>
-    </w:p>
-    <w:p>
-      <w:pPr>
-        <w:spacing w:after="120"/>
-      </w:pPr>
-      <w:r>
-        <w:rPr>
-          <w:color w:val="000000"/>
-        </w:rPr>
-        <w:t xml:space="preserve">[9] Moodle HQ, Moodle Documentation, </w:t>
-      </w:r>
-      <w:r>
-        <w:rPr>
-          <w:color w:val="000000"/>
-        </w:rPr>
-        <w:t>https://docs.moodle.org/, consulté le 24/06/2026 à 10h55.</w:t>
-      </w:r>
-    </w:p>
-    <w:p>
-      <w:pPr>
-        <w:spacing w:after="120"/>
-      </w:pPr>
-      <w:r>
-        <w:rPr>
-          <w:color w:val="000000"/>
-        </w:rPr>
-        <w:t>[10] Judge0, Judge0 CE, https://judge0.com/, consulté le 28/06/2026 à 17h25.</w:t>
-      </w:r>
-    </w:p>
-    <w:p>
-      <w:pPr>
-        <w:spacing w:after="120"/>
-      </w:pPr>
-      <w:r>
-        <w:rPr>
-          <w:color w:val="000000"/>
-        </w:rPr>
-        <w:t>[11] MDN Web Docs, Web APIs, https://developer.mozilla.org/docs/Web/API, consulté le 02/07/2026 à 09h35.</w:t>
-      </w:r>
-    </w:p>
-    <w:p>
-      <w:pPr>
-        <w:spacing w:after="120"/>
-      </w:pPr>
-      <w:r>
-        <w:rPr>
-          <w:color w:val="000000"/>
-        </w:rPr>
-        <w:t>[12] JWT.io, Int</w:t>
-      </w:r>
-      <w:r>
-        <w:rPr>
-          <w:color w:val="000000"/>
-        </w:rPr>
-        <w:t xml:space="preserve">roduction to JSON Web </w:t>
-      </w:r>
-      <w:proofErr w:type="spellStart"/>
-      <w:r>
-        <w:rPr>
-          <w:color w:val="000000"/>
-        </w:rPr>
-        <w:t>Tokens</w:t>
-      </w:r>
-      <w:proofErr w:type="spellEnd"/>
-      <w:r>
-        <w:rPr>
-          <w:color w:val="000000"/>
-        </w:rPr>
-        <w:t>, https://jwt.io/introduction, consulté le 07/07/2026 à 15h10.</w:t>
+        <w:spacing w:line="360" w:lineRule="auto" w:after="120"/>
+        <w:ind w:firstLine="0"/>
+        <w:jc w:val="left"/>
+      </w:pPr>
+      <w:r>
+        <w:rPr>
+          <w:rFonts w:ascii="Times New Roman" w:hAnsi="Times New Roman" w:eastAsia="Times New Roman"/>
+          <w:b w:val="0"/>
+          <w:color w:val="000000"/>
+          <w:sz w:val="24"/>
+        </w:rPr>
+        <w:t xml:space="preserve">[1] Documentation Next.js, </w:t>
+      </w:r>
+      <w:hyperlink r:id="rId47">
+        <w:r>
+          <w:rPr>
+            <w:color w:val="000000"/>
+            <w:u w:val="single"/>
+            <w:sz w:val="24"/>
+            <w:rFonts w:ascii="Times New Roman" w:hAnsi="Times New Roman"/>
+          </w:rPr>
+          <w:t xml:space="preserve">https://nextjs.org/docs</w:t>
+        </w:r>
+      </w:hyperlink>
+      <w:r>
+        <w:rPr>
+          <w:rFonts w:ascii="Times New Roman" w:hAnsi="Times New Roman" w:eastAsia="Times New Roman"/>
+          <w:b w:val="0"/>
+          <w:color w:val="000000"/>
+          <w:sz w:val="24"/>
+        </w:rPr>
+        <w:t>, consulté le 01/06/2026 à 09h20.</w:t>
+      </w:r>
+    </w:p>
+    <w:p>
+      <w:pPr>
+        <w:spacing w:line="360" w:lineRule="auto" w:after="120"/>
+        <w:ind w:firstLine="0"/>
+        <w:jc w:val="left"/>
+      </w:pPr>
+      <w:r>
+        <w:rPr>
+          <w:rFonts w:ascii="Times New Roman" w:hAnsi="Times New Roman" w:eastAsia="Times New Roman"/>
+          <w:b w:val="0"/>
+          <w:color w:val="000000"/>
+          <w:sz w:val="24"/>
+        </w:rPr>
+        <w:t xml:space="preserve">[2] Documentation Prisma, </w:t>
+      </w:r>
+      <w:hyperlink r:id="rId48">
+        <w:r>
+          <w:rPr>
+            <w:color w:val="000000"/>
+            <w:u w:val="single"/>
+            <w:sz w:val="24"/>
+            <w:rFonts w:ascii="Times New Roman" w:hAnsi="Times New Roman"/>
+          </w:rPr>
+          <w:t xml:space="preserve">https://www.prisma.io/docs</w:t>
+        </w:r>
+      </w:hyperlink>
+      <w:r>
+        <w:rPr>
+          <w:rFonts w:ascii="Times New Roman" w:hAnsi="Times New Roman" w:eastAsia="Times New Roman"/>
+          <w:b w:val="0"/>
+          <w:color w:val="000000"/>
+          <w:sz w:val="24"/>
+        </w:rPr>
+        <w:t>, consulté le 03/06/2026 à 14h45.</w:t>
+      </w:r>
+    </w:p>
+    <w:p>
+      <w:pPr>
+        <w:spacing w:line="360" w:lineRule="auto" w:after="120"/>
+        <w:ind w:firstLine="0"/>
+        <w:jc w:val="left"/>
+      </w:pPr>
+      <w:r>
+        <w:rPr>
+          <w:rFonts w:ascii="Times New Roman" w:hAnsi="Times New Roman" w:eastAsia="Times New Roman"/>
+          <w:b w:val="0"/>
+          <w:color w:val="000000"/>
+          <w:sz w:val="24"/>
+        </w:rPr>
+        <w:t xml:space="preserve">[3] Documentation MySQL 8, </w:t>
+      </w:r>
+      <w:hyperlink r:id="rId49">
+        <w:r>
+          <w:rPr>
+            <w:color w:val="000000"/>
+            <w:u w:val="single"/>
+            <w:sz w:val="24"/>
+            <w:rFonts w:ascii="Times New Roman" w:hAnsi="Times New Roman"/>
+          </w:rPr>
+          <w:t xml:space="preserve">https://dev.mysql.com/doc/</w:t>
+        </w:r>
+      </w:hyperlink>
+      <w:r>
+        <w:rPr>
+          <w:rFonts w:ascii="Times New Roman" w:hAnsi="Times New Roman" w:eastAsia="Times New Roman"/>
+          <w:b w:val="0"/>
+          <w:color w:val="000000"/>
+          <w:sz w:val="24"/>
+        </w:rPr>
+        <w:t>, consulté le 05/06/2026 à 10h10.</w:t>
+      </w:r>
+    </w:p>
+    <w:p>
+      <w:pPr>
+        <w:spacing w:line="360" w:lineRule="auto" w:after="120"/>
+        <w:ind w:firstLine="0"/>
+        <w:jc w:val="left"/>
+      </w:pPr>
+      <w:r>
+        <w:rPr>
+          <w:rFonts w:ascii="Times New Roman" w:hAnsi="Times New Roman" w:eastAsia="Times New Roman"/>
+          <w:b w:val="0"/>
+          <w:color w:val="000000"/>
+          <w:sz w:val="24"/>
+        </w:rPr>
+        <w:t xml:space="preserve">[4] Documentation Docker, </w:t>
+      </w:r>
+      <w:hyperlink r:id="rId50">
+        <w:r>
+          <w:rPr>
+            <w:color w:val="000000"/>
+            <w:u w:val="single"/>
+            <w:sz w:val="24"/>
+            <w:rFonts w:ascii="Times New Roman" w:hAnsi="Times New Roman"/>
+          </w:rPr>
+          <w:t xml:space="preserve">https://docs.docker.com/</w:t>
+        </w:r>
+      </w:hyperlink>
+      <w:r>
+        <w:rPr>
+          <w:rFonts w:ascii="Times New Roman" w:hAnsi="Times New Roman" w:eastAsia="Times New Roman"/>
+          <w:b w:val="0"/>
+          <w:color w:val="000000"/>
+          <w:sz w:val="24"/>
+        </w:rPr>
+        <w:t>, consulté le 08/06/2026 à 16h30.</w:t>
+      </w:r>
+    </w:p>
+    <w:p>
+      <w:pPr>
+        <w:spacing w:line="360" w:lineRule="auto" w:after="120"/>
+        <w:ind w:firstLine="0"/>
+        <w:jc w:val="left"/>
+      </w:pPr>
+      <w:r>
+        <w:rPr>
+          <w:rFonts w:ascii="Times New Roman" w:hAnsi="Times New Roman" w:eastAsia="Times New Roman"/>
+          <w:b w:val="0"/>
+          <w:color w:val="000000"/>
+          <w:sz w:val="24"/>
+        </w:rPr>
+        <w:t xml:space="preserve">[5] Documentation Redis, </w:t>
+      </w:r>
+      <w:hyperlink r:id="rId51">
+        <w:r>
+          <w:rPr>
+            <w:color w:val="000000"/>
+            <w:u w:val="single"/>
+            <w:sz w:val="24"/>
+            <w:rFonts w:ascii="Times New Roman" w:hAnsi="Times New Roman"/>
+          </w:rPr>
+          <w:t xml:space="preserve">https://redis.io/docs/</w:t>
+        </w:r>
+      </w:hyperlink>
+      <w:r>
+        <w:rPr>
+          <w:rFonts w:ascii="Times New Roman" w:hAnsi="Times New Roman" w:eastAsia="Times New Roman"/>
+          <w:b w:val="0"/>
+          <w:color w:val="000000"/>
+          <w:sz w:val="24"/>
+        </w:rPr>
+        <w:t>, consulté le 11/06/2026 à 11h05.</w:t>
+      </w:r>
+    </w:p>
+    <w:p>
+      <w:pPr>
+        <w:spacing w:line="360" w:lineRule="auto" w:after="120"/>
+        <w:ind w:firstLine="0"/>
+        <w:jc w:val="left"/>
+      </w:pPr>
+      <w:r>
+        <w:rPr>
+          <w:rFonts w:ascii="Times New Roman" w:hAnsi="Times New Roman" w:eastAsia="Times New Roman"/>
+          <w:b w:val="0"/>
+          <w:color w:val="000000"/>
+          <w:sz w:val="24"/>
+        </w:rPr>
+        <w:t xml:space="preserve">[6] Monaco Editor, </w:t>
+      </w:r>
+      <w:hyperlink r:id="rId52">
+        <w:r>
+          <w:rPr>
+            <w:color w:val="000000"/>
+            <w:u w:val="single"/>
+            <w:sz w:val="24"/>
+            <w:rFonts w:ascii="Times New Roman" w:hAnsi="Times New Roman"/>
+          </w:rPr>
+          <w:t xml:space="preserve">https://microsoft.github.io/monaco-editor/</w:t>
+        </w:r>
+      </w:hyperlink>
+      <w:r>
+        <w:rPr>
+          <w:rFonts w:ascii="Times New Roman" w:hAnsi="Times New Roman" w:eastAsia="Times New Roman"/>
+          <w:b w:val="0"/>
+          <w:color w:val="000000"/>
+          <w:sz w:val="24"/>
+        </w:rPr>
+        <w:t>, consulté le 14/06/2026 à 15h50.</w:t>
+      </w:r>
+    </w:p>
+    <w:p>
+      <w:pPr>
+        <w:spacing w:line="360" w:lineRule="auto" w:after="120"/>
+        <w:ind w:firstLine="0"/>
+        <w:jc w:val="left"/>
+      </w:pPr>
+      <w:r>
+        <w:rPr>
+          <w:rFonts w:ascii="Times New Roman" w:hAnsi="Times New Roman" w:eastAsia="Times New Roman"/>
+          <w:b w:val="0"/>
+          <w:color w:val="000000"/>
+          <w:sz w:val="24"/>
+        </w:rPr>
+        <w:t xml:space="preserve">[7] PlantUML, </w:t>
+      </w:r>
+      <w:hyperlink r:id="rId53">
+        <w:r>
+          <w:rPr>
+            <w:color w:val="000000"/>
+            <w:u w:val="single"/>
+            <w:sz w:val="24"/>
+            <w:rFonts w:ascii="Times New Roman" w:hAnsi="Times New Roman"/>
+          </w:rPr>
+          <w:t xml:space="preserve">https://plantuml.com/</w:t>
+        </w:r>
+      </w:hyperlink>
+      <w:r>
+        <w:rPr>
+          <w:rFonts w:ascii="Times New Roman" w:hAnsi="Times New Roman" w:eastAsia="Times New Roman"/>
+          <w:b w:val="0"/>
+          <w:color w:val="000000"/>
+          <w:sz w:val="24"/>
+        </w:rPr>
+        <w:t>, consulté le 17/06/2026 à 08h40.</w:t>
+      </w:r>
+    </w:p>
+    <w:p>
+      <w:pPr>
+        <w:spacing w:line="360" w:lineRule="auto" w:after="120"/>
+        <w:ind w:firstLine="0"/>
+        <w:jc w:val="left"/>
+      </w:pPr>
+      <w:r>
+        <w:rPr>
+          <w:rFonts w:ascii="Times New Roman" w:hAnsi="Times New Roman" w:eastAsia="Times New Roman"/>
+          <w:b w:val="0"/>
+          <w:color w:val="000000"/>
+          <w:sz w:val="24"/>
+        </w:rPr>
+        <w:t xml:space="preserve">[8] Documentation Moodle, </w:t>
+      </w:r>
+      <w:hyperlink r:id="rId54">
+        <w:r>
+          <w:rPr>
+            <w:color w:val="000000"/>
+            <w:u w:val="single"/>
+            <w:sz w:val="24"/>
+            <w:rFonts w:ascii="Times New Roman" w:hAnsi="Times New Roman"/>
+          </w:rPr>
+          <w:t xml:space="preserve">https://docs.moodle.org/</w:t>
+        </w:r>
+      </w:hyperlink>
+      <w:r>
+        <w:rPr>
+          <w:rFonts w:ascii="Times New Roman" w:hAnsi="Times New Roman" w:eastAsia="Times New Roman"/>
+          <w:b w:val="0"/>
+          <w:color w:val="000000"/>
+          <w:sz w:val="24"/>
+        </w:rPr>
+        <w:t>, consulté le 24/06/2026 à 10h55.</w:t>
+      </w:r>
+    </w:p>
+    <w:p>
+      <w:pPr>
+        <w:spacing w:line="360" w:lineRule="auto" w:after="120"/>
+        <w:ind w:firstLine="0"/>
+        <w:jc w:val="left"/>
+      </w:pPr>
+      <w:r>
+        <w:rPr>
+          <w:rFonts w:ascii="Times New Roman" w:hAnsi="Times New Roman" w:eastAsia="Times New Roman"/>
+          <w:b w:val="0"/>
+          <w:color w:val="000000"/>
+          <w:sz w:val="24"/>
+        </w:rPr>
+        <w:t xml:space="preserve">[9] Judge0, </w:t>
+      </w:r>
+      <w:hyperlink r:id="rId60">
+        <w:r>
+          <w:rPr>
+            <w:color w:val="000000"/>
+            <w:u w:val="single"/>
+            <w:sz w:val="24"/>
+            <w:rFonts w:ascii="Times New Roman" w:hAnsi="Times New Roman"/>
+          </w:rPr>
+          <w:t xml:space="preserve">https://judge0.com/</w:t>
+        </w:r>
+      </w:hyperlink>
+      <w:r>
+        <w:rPr>
+          <w:rFonts w:ascii="Times New Roman" w:hAnsi="Times New Roman" w:eastAsia="Times New Roman"/>
+          <w:b w:val="0"/>
+          <w:color w:val="000000"/>
+          <w:sz w:val="24"/>
+        </w:rPr>
+        <w:t>, consulté le 28/06/2026 à 17h25.</w:t>
+      </w:r>
+    </w:p>
+    <w:p>
+      <w:pPr>
+        <w:spacing w:line="360" w:lineRule="auto" w:after="120"/>
+        <w:ind w:firstLine="0"/>
+        <w:jc w:val="left"/>
+      </w:pPr>
+      <w:r>
+        <w:rPr>
+          <w:rFonts w:ascii="Times New Roman" w:hAnsi="Times New Roman" w:eastAsia="Times New Roman"/>
+          <w:b w:val="0"/>
+          <w:color w:val="000000"/>
+          <w:sz w:val="24"/>
+        </w:rPr>
+        <w:t xml:space="preserve">[10] freeCodeCamp, </w:t>
+      </w:r>
+      <w:hyperlink r:id="rId61">
+        <w:r>
+          <w:rPr>
+            <w:color w:val="000000"/>
+            <w:u w:val="single"/>
+            <w:sz w:val="24"/>
+            <w:rFonts w:ascii="Times New Roman" w:hAnsi="Times New Roman"/>
+          </w:rPr>
+          <w:t xml:space="preserve">https://www.freecodecamp.org/</w:t>
+        </w:r>
+      </w:hyperlink>
+      <w:r>
+        <w:rPr>
+          <w:rFonts w:ascii="Times New Roman" w:hAnsi="Times New Roman" w:eastAsia="Times New Roman"/>
+          <w:b w:val="0"/>
+          <w:color w:val="000000"/>
+          <w:sz w:val="24"/>
+        </w:rPr>
+        <w:t>, consulté le 20/06/2026 à 13h15.</w:t>
       </w:r>
     </w:p>
     <w:p>

</xml_diff>

<commit_message>
Enrichir les commentaires de figures (style mémoire de référence)
Base: Rapport_Cylentic (19). Commentaires plus explicatifs,
toujours au format La figure N présente/illustre...

Co-authored-by: progirix <progirix@users.noreply.github.com>
</commit_message>
<xml_diff>
--- a/docs/Rapport_Cylentic.docx
+++ b/docs/Rapport_Cylentic.docx
@@ -8472,55 +8472,52 @@
     </w:p>
     <w:p>
       <w:pPr>
+        <w:spacing w:line="360" w:lineRule="auto" w:after="160"/>
         <w:ind w:firstLine="425"/>
         <w:jc w:val="both"/>
       </w:pPr>
       <w:r>
         <w:rPr>
-          <w:color w:val="000000"/>
-        </w:rPr>
-        <w:t xml:space="preserve">La figure 1 présente l'architecture logique de </w:t>
+          <w:rFonts w:ascii="Times New Roman" w:hAnsi="Times New Roman" w:eastAsia="Times New Roman"/>
+          <w:b w:val="0"/>
+          <w:color w:val="000000"/>
+          <w:sz w:val="24"/>
+        </w:rPr>
+        <w:t>La figure 1 présente l'architecture logique de Cylentic. Elle montre comment l'interface web, les services métier, la base de données et la sandbox d'exécution s'articulent. L'étudiant et le professeur interagissent via le navigateur ; les services appliquent les règles d'examen et de sécurité ; la sandbox exécute le code Python de façon isolée. Cette vue permet de comprendre l'organisation globale du système avant d'entrer dans le détail des modules.</w:t>
       </w:r>
       <w:proofErr w:type="spellStart"/>
       <w:r>
         <w:rPr>
           <w:color w:val="000000"/>
         </w:rPr>
-        <w:t>Cylentic</w:t>
       </w:r>
       <w:proofErr w:type="spellEnd"/>
       <w:r>
         <w:rPr>
           <w:color w:val="000000"/>
         </w:rPr>
-        <w:t xml:space="preserve">. L'étudiant et le professeur passent par l'interface web. Les services métier gèrent les examens, </w:t>
-      </w:r>
-      <w:r>
-        <w:rPr>
-          <w:color w:val="000000"/>
-        </w:rPr>
-        <w:t xml:space="preserve">les comptes et les </w:t>
-      </w:r>
-      <w:r>
-        <w:rPr>
-          <w:color w:val="000000"/>
-        </w:rPr>
-        <w:lastRenderedPageBreak/>
-        <w:t xml:space="preserve">règles de sécurité. Les données sont enregistrées en base, tandis que la </w:t>
+      </w:r>
+      <w:r>
+        <w:rPr>
+          <w:color w:val="000000"/>
+        </w:rPr>
+      </w:r>
+      <w:r>
+        <w:rPr>
+          <w:color w:val="000000"/>
+        </w:rPr>
       </w:r>
       <w:proofErr w:type="spellStart"/>
       <w:r>
         <w:rPr>
           <w:color w:val="000000"/>
         </w:rPr>
-        <w:t>sandbox</w:t>
       </w:r>
       <w:proofErr w:type="spellEnd"/>
       <w:r>
         <w:rPr>
           <w:color w:val="000000"/>
         </w:rPr>
-        <w:t xml:space="preserve"> exécute le code Python de façon isolée. Cette vue montre comment les grandes parties du système s'organisent avant le détail technique.</w:t>
       </w:r>
     </w:p>
     <w:p>
@@ -8679,48 +8676,47 @@
     </w:p>
     <w:p>
       <w:pPr>
+        <w:spacing w:line="360" w:lineRule="auto" w:after="160"/>
         <w:ind w:firstLine="425"/>
         <w:jc w:val="both"/>
       </w:pPr>
       <w:r>
         <w:rPr>
-          <w:color w:val="000000"/>
-        </w:rPr>
-        <w:t xml:space="preserve">La figure 2 illustre le déploiement de l'infrastructure. Le serveur applicatif héberge </w:t>
+          <w:rFonts w:ascii="Times New Roman" w:hAnsi="Times New Roman" w:eastAsia="Times New Roman"/>
+          <w:b w:val="0"/>
+          <w:color w:val="000000"/>
+          <w:sz w:val="24"/>
+        </w:rPr>
+        <w:t>La figure 2 illustre le déploiement de l'infrastructure. Le serveur applicatif héberge Cylentic, MySQL conserve les données, et Docker fournit l'environnement d'exécution isolé pour le code étudiant. Les postes de la salle informatique accèdent à la plateforme uniquement via le navigateur. Cette figure montre concrètement où chaque composant tourne le jour de l'épreuve.</w:t>
       </w:r>
       <w:proofErr w:type="spellStart"/>
       <w:r>
         <w:rPr>
           <w:color w:val="000000"/>
         </w:rPr>
-        <w:t>Cylentic</w:t>
       </w:r>
       <w:proofErr w:type="spellEnd"/>
       <w:r>
         <w:rPr>
           <w:color w:val="000000"/>
         </w:rPr>
-        <w:t>, MySQL stocke les données, et Docker fournit l'environnement d'exécution isolé. Les postes de la salle se connectent via le navigateur. Cette figure mont</w:t>
-      </w:r>
-      <w:r>
-        <w:rPr>
-          <w:color w:val="000000"/>
-        </w:rPr>
-        <w:t xml:space="preserve">re concrètement où </w:t>
+      </w:r>
+      <w:r>
+        <w:rPr>
+          <w:color w:val="000000"/>
+        </w:rPr>
       </w:r>
       <w:proofErr w:type="gramStart"/>
       <w:r>
         <w:rPr>
           <w:color w:val="000000"/>
         </w:rPr>
-        <w:t>tourne</w:t>
       </w:r>
       <w:proofErr w:type="gramEnd"/>
       <w:r>
         <w:rPr>
           <w:color w:val="000000"/>
         </w:rPr>
-        <w:t xml:space="preserve"> chaque élément le jour de l'épreuve.</w:t>
       </w:r>
     </w:p>
     <w:p>
@@ -8895,20 +8891,23 @@
     </w:p>
     <w:p>
       <w:pPr>
+        <w:spacing w:line="360" w:lineRule="auto" w:after="160"/>
         <w:ind w:firstLine="425"/>
         <w:jc w:val="both"/>
       </w:pPr>
       <w:r>
         <w:rPr>
-          <w:color w:val="000000"/>
-        </w:rPr>
-        <w:t>La figure 3 présente les cas d'</w:t>
-      </w:r>
-      <w:r>
-        <w:rPr>
-          <w:color w:val="000000"/>
-        </w:rPr>
-        <w:t>utilisation du Super Admin. Il administre la plateforme dans son ensemble : établissements, pilotage global et fonctions transverses. Cette vue précise son rôle, distinct de celui de l'administrateur d'une école.</w:t>
+          <w:rFonts w:ascii="Times New Roman" w:hAnsi="Times New Roman" w:eastAsia="Times New Roman"/>
+          <w:b w:val="0"/>
+          <w:color w:val="000000"/>
+          <w:sz w:val="24"/>
+        </w:rPr>
+        <w:t>La figure 3 présente les cas d'utilisation du Super Admin. Elle décrit ses interactions avec la plateforme : gestion des établissements, pilotage global et fonctions transverses. Cette vue précise un rôle distinct de celui de l'administrateur d'école, centré sur la gouvernance de l'ensemble du service.</w:t>
+      </w:r>
+      <w:r>
+        <w:rPr>
+          <w:color w:val="000000"/>
+        </w:rPr>
       </w:r>
     </w:p>
     <w:p>
@@ -9040,20 +9039,23 @@
     </w:p>
     <w:p>
       <w:pPr>
+        <w:spacing w:line="360" w:lineRule="auto" w:after="160"/>
         <w:ind w:firstLine="425"/>
         <w:jc w:val="both"/>
       </w:pPr>
       <w:r>
         <w:rPr>
-          <w:color w:val="000000"/>
-        </w:rPr>
-        <w:t xml:space="preserve">La figure 4 illustre les cas d'utilisation de l'administrateur d'établissement pour l'organisation. Il structure l'espace local : années académiques, classes et </w:t>
-      </w:r>
-      <w:r>
-        <w:rPr>
-          <w:color w:val="000000"/>
-        </w:rPr>
-        <w:t>organisation scolaire. Cette figure montre le périmètre de gestion avant la création des comptes.</w:t>
+          <w:rFonts w:ascii="Times New Roman" w:hAnsi="Times New Roman" w:eastAsia="Times New Roman"/>
+          <w:b w:val="0"/>
+          <w:color w:val="000000"/>
+          <w:sz w:val="24"/>
+        </w:rPr>
+        <w:t>La figure 4 illustre les cas d'utilisation de l'administrateur d'établissement pour l'organisation scolaire. On y voit la gestion des années académiques, des classes et de la structure locale. Cette figure montre le périmètre d'administration avant la création et le suivi des comptes utilisateurs.</w:t>
+      </w:r>
+      <w:r>
+        <w:rPr>
+          <w:color w:val="000000"/>
+        </w:rPr>
       </w:r>
     </w:p>
     <w:p>
@@ -9173,20 +9175,23 @@
     </w:p>
     <w:p>
       <w:pPr>
+        <w:spacing w:line="360" w:lineRule="auto" w:after="160"/>
         <w:ind w:firstLine="425"/>
         <w:jc w:val="both"/>
       </w:pPr>
       <w:r>
         <w:rPr>
-          <w:color w:val="000000"/>
-        </w:rPr>
-        <w:t>La figure 5 présente la gestion des comptes par l'administrateur. Il crée,</w:t>
-      </w:r>
-      <w:r>
-        <w:rPr>
-          <w:color w:val="000000"/>
-        </w:rPr>
-        <w:t xml:space="preserve"> modifie, désactive ou réactive les comptes professeurs et étudiants, et peut importer des listes. Cette vue complète le rôle local de l'administrateur côté utilisateurs.</w:t>
+          <w:rFonts w:ascii="Times New Roman" w:hAnsi="Times New Roman" w:eastAsia="Times New Roman"/>
+          <w:b w:val="0"/>
+          <w:color w:val="000000"/>
+          <w:sz w:val="24"/>
+        </w:rPr>
+        <w:t>La figure 5 présente la gestion des comptes par l'administrateur d'établissement. Elle couvre la création, la modification, la désactivation et la réactivation des comptes professeurs et étudiants, ainsi que l'import de listes. Cette vue complète le rôle local de l'administrateur côté utilisateurs.</w:t>
+      </w:r>
+      <w:r>
+        <w:rPr>
+          <w:color w:val="000000"/>
+        </w:rPr>
       </w:r>
     </w:p>
     <w:p>
@@ -9318,21 +9323,23 @@
     </w:p>
     <w:p>
       <w:pPr>
+        <w:spacing w:line="360" w:lineRule="auto" w:after="160"/>
         <w:ind w:firstLine="425"/>
         <w:jc w:val="both"/>
       </w:pPr>
       <w:r>
         <w:rPr>
-          <w:color w:val="000000"/>
-        </w:rPr>
-        <w:lastRenderedPageBreak/>
-        <w:t>La figure 6 détaille les actions du professeur autour des examens. Il crée l'épreuve, ajoute des exercices et des tests, puis publie l'examen. Cette figure montre le travail de préparat</w:t>
-      </w:r>
-      <w:r>
-        <w:rPr>
-          <w:color w:val="000000"/>
-        </w:rPr>
-        <w:t>ion avant le jour J.</w:t>
+          <w:rFonts w:ascii="Times New Roman" w:hAnsi="Times New Roman" w:eastAsia="Times New Roman"/>
+          <w:b w:val="0"/>
+          <w:color w:val="000000"/>
+          <w:sz w:val="24"/>
+        </w:rPr>
+        <w:t>La figure 6 détaille les cas d'utilisation du professeur pour la préparation des examens. Elle montre la création de l'épreuve, l'ajout d'exercices et de tests, puis la publication. Cette figure décrit le travail pédagogique réalisé avant le jour de composition.</w:t>
+      </w:r>
+      <w:r>
+        <w:rPr>
+          <w:color w:val="000000"/>
+        </w:rPr>
       </w:r>
     </w:p>
     <w:p>
@@ -9451,20 +9458,23 @@
     </w:p>
     <w:p>
       <w:pPr>
+        <w:spacing w:line="360" w:lineRule="auto" w:after="160"/>
         <w:ind w:firstLine="425"/>
         <w:jc w:val="both"/>
       </w:pPr>
       <w:r>
         <w:rPr>
-          <w:color w:val="000000"/>
-        </w:rPr>
-        <w:t>La figure 7 illustre le suivi côté professeur pendant et après l'épreuve. Il consulte les participations, lit le journal d'incidents et accède aux résultats. C</w:t>
-      </w:r>
-      <w:r>
-        <w:rPr>
-          <w:color w:val="000000"/>
-        </w:rPr>
-        <w:t>ette vue montre comment le professeur pilote l'examen une fois lancé.</w:t>
+          <w:rFonts w:ascii="Times New Roman" w:hAnsi="Times New Roman" w:eastAsia="Times New Roman"/>
+          <w:b w:val="0"/>
+          <w:color w:val="000000"/>
+          <w:sz w:val="24"/>
+        </w:rPr>
+        <w:t>La figure 7 illustre le suivi côté professeur pendant et après l'épreuve. Elle montre la consultation des participations, la lecture du journal d'incidents et l'accès aux résultats. Cette vue explique comment le professeur pilote l'examen une fois qu'il est lancé.</w:t>
+      </w:r>
+      <w:r>
+        <w:rPr>
+          <w:color w:val="000000"/>
+        </w:rPr>
       </w:r>
     </w:p>
     <w:p>
@@ -9596,20 +9606,23 @@
     </w:p>
     <w:p>
       <w:pPr>
+        <w:spacing w:line="360" w:lineRule="auto" w:after="160"/>
         <w:ind w:firstLine="425"/>
         <w:jc w:val="both"/>
       </w:pPr>
       <w:r>
         <w:rPr>
-          <w:color w:val="000000"/>
-        </w:rPr>
-        <w:t>La f</w:t>
-      </w:r>
-      <w:r>
-        <w:rPr>
-          <w:color w:val="000000"/>
-        </w:rPr>
-        <w:t>igure 8 représente le parcours de l'étudiant. Après connexion et saisie du code d'examen, il accepte les consignes, attend en salle d'attente, compose, peut exécuter des essais, puis soumet sa copie. Cette figure résume le chemin complet côté étudiant.</w:t>
+          <w:rFonts w:ascii="Times New Roman" w:hAnsi="Times New Roman" w:eastAsia="Times New Roman"/>
+          <w:b w:val="0"/>
+          <w:color w:val="000000"/>
+          <w:sz w:val="24"/>
+        </w:rPr>
+        <w:t>La figure 8 représente le parcours de l'étudiant. Après connexion et saisie du code d'examen, il accepte les consignes, attend en salle d'attente, compose, peut exécuter des essais, puis soumet sa copie. Cette figure résume le chemin complet suivi par l'étudiant le jour de l'épreuve.</w:t>
+      </w:r>
+      <w:r>
+        <w:rPr>
+          <w:color w:val="000000"/>
+        </w:rPr>
       </w:r>
     </w:p>
     <w:p>
@@ -9771,34 +9784,35 @@
     </w:p>
     <w:p>
       <w:pPr>
+        <w:spacing w:line="360" w:lineRule="auto" w:after="160"/>
         <w:ind w:firstLine="425"/>
         <w:jc w:val="both"/>
       </w:pPr>
       <w:r>
         <w:rPr>
-          <w:color w:val="000000"/>
-        </w:rPr>
-        <w:t xml:space="preserve">La figure 9 présente le diagramme de classes de l'organisation et des comptes. On y voit les établissements, les utilisateurs et les liens avec les rôles. Cette </w:t>
-      </w:r>
-      <w:r>
-        <w:rPr>
-          <w:color w:val="000000"/>
-        </w:rPr>
-        <w:t xml:space="preserve">modélisation pose la base des droits d'accès dans </w:t>
+          <w:rFonts w:ascii="Times New Roman" w:hAnsi="Times New Roman" w:eastAsia="Times New Roman"/>
+          <w:b w:val="0"/>
+          <w:color w:val="000000"/>
+          <w:sz w:val="24"/>
+        </w:rPr>
+        <w:t>La figure 9 présente le diagramme de classes lié à l'organisation et aux comptes. Elle montre les établissements, les utilisateurs et les relations qui portent les rôles. Cette modélisation pose la base des droits d'accès et de l'isolation des données entre établissements.</w:t>
+      </w:r>
+      <w:r>
+        <w:rPr>
+          <w:color w:val="000000"/>
+        </w:rPr>
       </w:r>
       <w:proofErr w:type="spellStart"/>
       <w:r>
         <w:rPr>
           <w:color w:val="000000"/>
         </w:rPr>
-        <w:t>Cylentic</w:t>
       </w:r>
       <w:proofErr w:type="spellEnd"/>
       <w:r>
         <w:rPr>
           <w:color w:val="000000"/>
         </w:rPr>
-        <w:t>.</w:t>
       </w:r>
     </w:p>
     <w:p>
@@ -9918,20 +9932,23 @@
     </w:p>
     <w:p>
       <w:pPr>
+        <w:spacing w:line="360" w:lineRule="auto" w:after="160"/>
         <w:ind w:firstLine="425"/>
         <w:jc w:val="both"/>
       </w:pPr>
       <w:r>
         <w:rPr>
-          <w:color w:val="000000"/>
-        </w:rPr>
-        <w:t>La figure 10 illustre les classes de conception d'un examen. Un examen regroupe des exercices, eux-mêmes associés à des tests unita</w:t>
-      </w:r>
-      <w:r>
-        <w:rPr>
-          <w:color w:val="000000"/>
-        </w:rPr>
-        <w:t>ires ou à des QCM. Cette figure montre comment le contenu pédagogique est structuré avant la composition.</w:t>
+          <w:rFonts w:ascii="Times New Roman" w:hAnsi="Times New Roman" w:eastAsia="Times New Roman"/>
+          <w:b w:val="0"/>
+          <w:color w:val="000000"/>
+          <w:sz w:val="24"/>
+        </w:rPr>
+        <w:t>La figure 10 illustre les classes de conception d'un examen. Un examen regroupe des exercices, eux-mêmes associés à des tests unitaires ou à des QCM. Cette figure montre comment le contenu pédagogique est structuré avant d'être proposé aux étudiants.</w:t>
+      </w:r>
+      <w:r>
+        <w:rPr>
+          <w:color w:val="000000"/>
+        </w:rPr>
       </w:r>
     </w:p>
     <w:p>
@@ -9999,27 +10016,28 @@
     </w:p>
     <w:p>
       <w:pPr>
+        <w:spacing w:line="360" w:lineRule="auto" w:after="160"/>
         <w:ind w:firstLine="425"/>
         <w:jc w:val="both"/>
       </w:pPr>
       <w:r>
         <w:rPr>
-          <w:color w:val="000000"/>
-        </w:rPr>
-        <w:t>La figure 11 présente les classes de la composition et de la correction. La participation relie un étu</w:t>
-      </w:r>
-      <w:r>
-        <w:rPr>
-          <w:color w:val="000000"/>
-        </w:rPr>
-        <w:t xml:space="preserve">diant à un examen ; la copie, les incidents et les résultats </w:t>
-      </w:r>
-      <w:r>
-        <w:rPr>
-          <w:color w:val="000000"/>
-        </w:rPr>
-        <w:lastRenderedPageBreak/>
-        <w:t>permettent de suivre et d'évaluer le travail rendu. Cette vue explique le cœur métier pendant l'épreuve.</w:t>
+          <w:rFonts w:ascii="Times New Roman" w:hAnsi="Times New Roman" w:eastAsia="Times New Roman"/>
+          <w:b w:val="0"/>
+          <w:color w:val="000000"/>
+          <w:sz w:val="24"/>
+        </w:rPr>
+        <w:t>La figure 11 présente les classes de la composition et de la correction. La participation relie un étudiant à un examen ; la copie, les incidents et les résultats permettent de suivre le travail rendu et de l'évaluer. Cette vue explique le cœur métier pendant et après l'épreuve.</w:t>
+      </w:r>
+      <w:r>
+        <w:rPr>
+          <w:color w:val="000000"/>
+        </w:rPr>
+      </w:r>
+      <w:r>
+        <w:rPr>
+          <w:color w:val="000000"/>
+        </w:rPr>
       </w:r>
     </w:p>
     <w:p>
@@ -10150,14 +10168,18 @@
     </w:p>
     <w:p>
       <w:pPr>
+        <w:spacing w:line="360" w:lineRule="auto" w:after="160"/>
         <w:ind w:firstLine="425"/>
         <w:jc w:val="both"/>
       </w:pPr>
       <w:r>
         <w:rPr>
-          <w:color w:val="000000"/>
-        </w:rPr>
-        <w:t>La figure 12 montre un exemple d'objets pour l'organisation. Elle donne une instance concrète des liens entre établissement, classes et utilisateurs, afin de rendre le modèle de classes plus lisible.</w:t>
+          <w:rFonts w:ascii="Times New Roman" w:hAnsi="Times New Roman" w:eastAsia="Times New Roman"/>
+          <w:b w:val="0"/>
+          <w:color w:val="000000"/>
+          <w:sz w:val="24"/>
+        </w:rPr>
+        <w:t>La figure 12 montre un diagramme d'objets pour l'organisation. Elle donne un exemple concret des liens entre un établissement, ses classes et ses utilisateurs. Cette figure rend le modèle de classes plus lisible en l'illustrant avec des instances.</w:t>
       </w:r>
     </w:p>
     <w:p>
@@ -10277,14 +10299,18 @@
     </w:p>
     <w:p>
       <w:pPr>
+        <w:spacing w:line="360" w:lineRule="auto" w:after="160"/>
         <w:ind w:firstLine="425"/>
         <w:jc w:val="both"/>
       </w:pPr>
       <w:r>
         <w:rPr>
-          <w:color w:val="000000"/>
-        </w:rPr>
-        <w:t>La figure 13 illustre un examen concret avec ses exercices et ses tests. Elle montre, sur un exemple, comment les objets de conception se relient au moment où le professeur prépare l'épreuve.</w:t>
+          <w:rFonts w:ascii="Times New Roman" w:hAnsi="Times New Roman" w:eastAsia="Times New Roman"/>
+          <w:b w:val="0"/>
+          <w:color w:val="000000"/>
+          <w:sz w:val="24"/>
+        </w:rPr>
+        <w:t>La figure 13 illustre un examen concret avec ses exercices et ses tests associés. Elle précise, sur un exemple, comment les objets de conception se relient au moment où le professeur prépare l'épreuve. Cette vue aide à passer du modèle abstrait à une situation réelle.</w:t>
       </w:r>
     </w:p>
     <w:p>
@@ -10352,20 +10378,23 @@
     </w:p>
     <w:p>
       <w:pPr>
+        <w:spacing w:line="360" w:lineRule="auto" w:after="160"/>
         <w:ind w:firstLine="425"/>
         <w:jc w:val="both"/>
       </w:pPr>
       <w:r>
         <w:rPr>
-          <w:color w:val="000000"/>
-        </w:rPr>
-        <w:t>La figure 14 présente un exemple de participation pendant l'examen. On y voit la copie de l'étudiant, d'éventuels incidents et les éléments utiles à la correction. Cette figure aide à comprendre le déroulement réel d'une é</w:t>
-      </w:r>
-      <w:r>
-        <w:rPr>
-          <w:color w:val="000000"/>
-        </w:rPr>
-        <w:t>preuve.</w:t>
+          <w:rFonts w:ascii="Times New Roman" w:hAnsi="Times New Roman" w:eastAsia="Times New Roman"/>
+          <w:b w:val="0"/>
+          <w:color w:val="000000"/>
+          <w:sz w:val="24"/>
+        </w:rPr>
+        <w:t>La figure 14 présente un exemple de participation pendant l'examen. On y voit la copie de l'étudiant, d'éventuels incidents et les éléments utiles à la correction. Cette figure aide à comprendre le déroulement réel d'une épreuve et les données conservées par le système.</w:t>
+      </w:r>
+      <w:r>
+        <w:rPr>
+          <w:color w:val="000000"/>
+        </w:rPr>
       </w:r>
     </w:p>
     <w:p>
@@ -10542,28 +10571,30 @@
     </w:p>
     <w:p>
       <w:pPr>
+        <w:spacing w:line="360" w:lineRule="auto" w:after="160"/>
         <w:ind w:firstLine="425"/>
         <w:jc w:val="both"/>
       </w:pPr>
       <w:r>
         <w:rPr>
-          <w:color w:val="000000"/>
-        </w:rPr>
-        <w:t xml:space="preserve">La figure 15 donne une vue d'ensemble des composants logiciels de </w:t>
+          <w:rFonts w:ascii="Times New Roman" w:hAnsi="Times New Roman" w:eastAsia="Times New Roman"/>
+          <w:b w:val="0"/>
+          <w:color w:val="000000"/>
+          <w:sz w:val="24"/>
+        </w:rPr>
+        <w:t>La figure 15 donne une vue d'ensemble des composants logiciels de Cylentic. L'interface, les services et les briques techniques y sont reliés sans entrer dans chaque classe. Cette figure montre le découpage du système et les dépendances principales entre parties.</w:t>
       </w:r>
       <w:proofErr w:type="spellStart"/>
       <w:r>
         <w:rPr>
           <w:color w:val="000000"/>
         </w:rPr>
-        <w:t>Cylentic</w:t>
       </w:r>
       <w:proofErr w:type="spellEnd"/>
       <w:r>
         <w:rPr>
           <w:color w:val="000000"/>
         </w:rPr>
-        <w:t>. L'interface, les services et les briques techniques y sont reliés. Cette figure montre le découpage du système sans entrer dans chaque classe.</w:t>
       </w:r>
     </w:p>
     <w:p>
@@ -10682,20 +10713,23 @@
     </w:p>
     <w:p>
       <w:pPr>
+        <w:spacing w:line="360" w:lineRule="auto" w:after="160"/>
         <w:ind w:firstLine="425"/>
         <w:jc w:val="both"/>
       </w:pPr>
       <w:r>
         <w:rPr>
-          <w:color w:val="000000"/>
-        </w:rPr>
-        <w:t>La figure 16 détaille les composants d'administration et d'authentification. Elle montre comment la connexion, les rôles et la gestion des comptes sont pris en charge dans l'a</w:t>
-      </w:r>
-      <w:r>
-        <w:rPr>
-          <w:color w:val="000000"/>
-        </w:rPr>
-        <w:t>pplication.</w:t>
+          <w:rFonts w:ascii="Times New Roman" w:hAnsi="Times New Roman" w:eastAsia="Times New Roman"/>
+          <w:b w:val="0"/>
+          <w:color w:val="000000"/>
+          <w:sz w:val="24"/>
+        </w:rPr>
+        <w:t>La figure 16 détaille les composants d'administration et d'authentification. Elle montre comment la connexion, l'attribution des rôles et la gestion des comptes sont prises en charge dans l'application. Cette vue précise la frontière entre accès sécurisé et fonctions d'administration.</w:t>
+      </w:r>
+      <w:r>
+        <w:rPr>
+          <w:color w:val="000000"/>
+        </w:rPr>
       </w:r>
     </w:p>
     <w:p>
@@ -10764,20 +10798,23 @@
     </w:p>
     <w:p>
       <w:pPr>
+        <w:spacing w:line="360" w:lineRule="auto" w:after="160"/>
         <w:ind w:firstLine="425"/>
         <w:jc w:val="both"/>
       </w:pPr>
       <w:r>
         <w:rPr>
-          <w:color w:val="000000"/>
-        </w:rPr>
-        <w:t>La figure 17 présente les composants liés aux examens et à la composition. On y retrouve la préparation de l'épreuve, le parcours étudiant et l'exécution isolée du code. Cette vue relie la pédagog</w:t>
-      </w:r>
-      <w:r>
-        <w:rPr>
-          <w:color w:val="000000"/>
-        </w:rPr>
-        <w:t>ie à la technique.</w:t>
+          <w:rFonts w:ascii="Times New Roman" w:hAnsi="Times New Roman" w:eastAsia="Times New Roman"/>
+          <w:b w:val="0"/>
+          <w:color w:val="000000"/>
+          <w:sz w:val="24"/>
+        </w:rPr>
+        <w:t>La figure 17 présente les composants liés aux examens et à la composition. On y retrouve la préparation de l'épreuve, le parcours étudiant et l'exécution isolée du code. Cette figure relie la partie pédagogique à la partie technique de la plateforme.</w:t>
+      </w:r>
+      <w:r>
+        <w:rPr>
+          <w:color w:val="000000"/>
+        </w:rPr>
       </w:r>
     </w:p>
     <w:p>
@@ -11011,20 +11048,23 @@
     </w:p>
     <w:p>
       <w:pPr>
+        <w:spacing w:line="360" w:lineRule="auto" w:after="160"/>
         <w:ind w:firstLine="425"/>
         <w:jc w:val="both"/>
       </w:pPr>
       <w:r>
         <w:rPr>
-          <w:color w:val="000000"/>
-        </w:rPr>
-        <w:t>La figure 18 montre les états successifs d'un examen. Il naît en brouillon, devi</w:t>
-      </w:r>
-      <w:r>
-        <w:rPr>
-          <w:color w:val="000000"/>
-        </w:rPr>
-        <w:t>ent publié, passe en cours pendant l'épreuve, puis se clôture. Cette figure explique le cycle de vie suivi par la plateforme.</w:t>
+          <w:rFonts w:ascii="Times New Roman" w:hAnsi="Times New Roman" w:eastAsia="Times New Roman"/>
+          <w:b w:val="0"/>
+          <w:color w:val="000000"/>
+          <w:sz w:val="24"/>
+        </w:rPr>
+        <w:t>La figure 18 montre les états successifs d'un examen. Il naît en brouillon, devient publié, passe en cours pendant l'épreuve, puis se clôture. Cette figure explique le cycle de vie suivi par la plateforme et les transitions autorisées entre ces états.</w:t>
+      </w:r>
+      <w:r>
+        <w:rPr>
+          <w:color w:val="000000"/>
+        </w:rPr>
       </w:r>
     </w:p>
     <w:p>
@@ -11173,34 +11213,35 @@
     </w:p>
     <w:p>
       <w:pPr>
+        <w:spacing w:line="360" w:lineRule="auto" w:after="160"/>
         <w:ind w:firstLine="425"/>
         <w:jc w:val="both"/>
       </w:pPr>
       <w:r>
         <w:rPr>
-          <w:color w:val="000000"/>
-        </w:rPr>
-        <w:t>La figure 19 décrit la séquence de connexion. L'utilisateur saisit ses identifiants ; le serveur vérifie le compte, déduit le rôle et ouvre la session. Cette figur</w:t>
-      </w:r>
-      <w:r>
-        <w:rPr>
-          <w:color w:val="000000"/>
-        </w:rPr>
-        <w:t xml:space="preserve">e montre le premier contrôle d'accès à </w:t>
+          <w:rFonts w:ascii="Times New Roman" w:hAnsi="Times New Roman" w:eastAsia="Times New Roman"/>
+          <w:b w:val="0"/>
+          <w:color w:val="000000"/>
+          <w:sz w:val="24"/>
+        </w:rPr>
+        <w:t>La figure 19 décrit la séquence de connexion. L'utilisateur saisit ses identifiants ; le serveur vérifie le compte, déduit le rôle à partir du préfixe, puis ouvre la session. Cette figure montre le premier contrôle d'accès à Cylentic et l'orientation vers le bon espace.</w:t>
+      </w:r>
+      <w:r>
+        <w:rPr>
+          <w:color w:val="000000"/>
+        </w:rPr>
       </w:r>
       <w:proofErr w:type="spellStart"/>
       <w:r>
         <w:rPr>
           <w:color w:val="000000"/>
         </w:rPr>
-        <w:t>Cylentic</w:t>
       </w:r>
       <w:proofErr w:type="spellEnd"/>
       <w:r>
         <w:rPr>
           <w:color w:val="000000"/>
         </w:rPr>
-        <w:t>.</w:t>
       </w:r>
     </w:p>
     <w:p>
@@ -11338,20 +11379,23 @@
     </w:p>
     <w:p>
       <w:pPr>
+        <w:spacing w:line="360" w:lineRule="auto" w:after="160"/>
         <w:ind w:firstLine="425"/>
         <w:jc w:val="both"/>
       </w:pPr>
       <w:r>
         <w:rPr>
-          <w:color w:val="000000"/>
-        </w:rPr>
-        <w:t>La figure 20 illustre la publication d'un examen. Le professeur propriétaire déclenche la publication ; le système rend l'épreuve acc</w:t>
-      </w:r>
-      <w:r>
-        <w:rPr>
-          <w:color w:val="000000"/>
-        </w:rPr>
-        <w:t>essible et génère le code d'accès. Cette figure montre le passage du brouillon à l'épreuve prête.</w:t>
+          <w:rFonts w:ascii="Times New Roman" w:hAnsi="Times New Roman" w:eastAsia="Times New Roman"/>
+          <w:b w:val="0"/>
+          <w:color w:val="000000"/>
+          <w:sz w:val="24"/>
+        </w:rPr>
+        <w:t>La figure 20 illustre la publication d'un examen. Le professeur propriétaire déclenche la publication ; le système rend l'épreuve accessible et génère le code d'accès destiné aux étudiants. Cette figure montre le passage du brouillon à l'épreuve prête à être composée.</w:t>
+      </w:r>
+      <w:r>
+        <w:rPr>
+          <w:color w:val="000000"/>
+        </w:rPr>
       </w:r>
     </w:p>
     <w:p>
@@ -11495,20 +11539,23 @@
     </w:p>
     <w:p>
       <w:pPr>
+        <w:spacing w:line="360" w:lineRule="auto" w:after="160"/>
         <w:ind w:firstLine="425"/>
         <w:jc w:val="both"/>
       </w:pPr>
       <w:r>
         <w:rPr>
-          <w:color w:val="000000"/>
-        </w:rPr>
-        <w:t>La figure 21 p</w:t>
-      </w:r>
-      <w:r>
-        <w:rPr>
-          <w:color w:val="000000"/>
-        </w:rPr>
-        <w:t>résente l'accès de l'étudiant à l'examen. Après authentification et saisie du code, il lit les consignes puis rejoint la salle d'attente. Cette séquence prépare l'entrée en composition.</w:t>
+          <w:rFonts w:ascii="Times New Roman" w:hAnsi="Times New Roman" w:eastAsia="Times New Roman"/>
+          <w:b w:val="0"/>
+          <w:color w:val="000000"/>
+          <w:sz w:val="24"/>
+        </w:rPr>
+        <w:t>La figure 21 présente la séquence d'accès de l'étudiant à l'examen. Après authentification et saisie du code, il lit les consignes de sécurité puis rejoint la salle d'attente. Cette figure décrit les contrôles effectués avant l'ouverture de la composition.</w:t>
+      </w:r>
+      <w:r>
+        <w:rPr>
+          <w:color w:val="000000"/>
+        </w:rPr>
       </w:r>
     </w:p>
     <w:p>
@@ -11654,34 +11701,35 @@
     </w:p>
     <w:p>
       <w:pPr>
+        <w:spacing w:line="360" w:lineRule="auto" w:after="160"/>
         <w:ind w:firstLine="425"/>
         <w:jc w:val="both"/>
       </w:pPr>
       <w:r>
         <w:rPr>
-          <w:color w:val="000000"/>
-        </w:rPr>
-        <w:t xml:space="preserve">La figure 22 montre l'exécution du code Python dans la </w:t>
+          <w:rFonts w:ascii="Times New Roman" w:hAnsi="Times New Roman" w:eastAsia="Times New Roman"/>
+          <w:b w:val="0"/>
+          <w:color w:val="000000"/>
+          <w:sz w:val="24"/>
+        </w:rPr>
+        <w:t>La figure 22 montre l'exécution du code Python dans la sandbox. Le navigateur envoie le code au serveur ; celui-ci le fait tourner dans un conteneur isolé, puis renvoie la sortie à l'étudiant. Cette figure explique comment un essai reste sûr pour la machine hôte.</w:t>
       </w:r>
       <w:proofErr w:type="spellStart"/>
       <w:r>
         <w:rPr>
           <w:color w:val="000000"/>
         </w:rPr>
-        <w:t>sandbox</w:t>
       </w:r>
       <w:proofErr w:type="spellEnd"/>
       <w:r>
         <w:rPr>
           <w:color w:val="000000"/>
         </w:rPr>
-        <w:t>. Le navigateur envoie le code au serveur ; celui-ci le fait tourner dans un conteneur isolé, puis renvoie la sort</w:t>
-      </w:r>
-      <w:r>
-        <w:rPr>
-          <w:color w:val="000000"/>
-        </w:rPr>
-        <w:t>ie. Cette figure explique comment l'essai reste sûr pour la machine hôte.</w:t>
+      </w:r>
+      <w:r>
+        <w:rPr>
+          <w:color w:val="000000"/>
+        </w:rPr>
       </w:r>
     </w:p>
     <w:p>
@@ -11841,20 +11889,23 @@
     </w:p>
     <w:p>
       <w:pPr>
+        <w:spacing w:line="360" w:lineRule="auto" w:after="160"/>
         <w:ind w:firstLine="425"/>
         <w:jc w:val="both"/>
       </w:pPr>
       <w:r>
         <w:rPr>
-          <w:color w:val="000000"/>
-        </w:rPr>
-        <w:t>La figure 23 décrit la soumission de la copie et la correction automatique. Une fois la copie figée, les tests unitaires sont exécutés et le score est calculé. Cette figure montre la fin du parco</w:t>
-      </w:r>
-      <w:r>
-        <w:rPr>
-          <w:color w:val="000000"/>
-        </w:rPr>
-        <w:t>urs de composition.</w:t>
+          <w:rFonts w:ascii="Times New Roman" w:hAnsi="Times New Roman" w:eastAsia="Times New Roman"/>
+          <w:b w:val="0"/>
+          <w:color w:val="000000"/>
+          <w:sz w:val="24"/>
+        </w:rPr>
+        <w:t>La figure 23 décrit la soumission de la copie et le lancement de la correction automatique. Une fois la copie figée, les tests unitaires sont exécutés et le score est calculé. Cette figure montre la fin du parcours de composition et le début de l'évaluation.</w:t>
+      </w:r>
+      <w:r>
+        <w:rPr>
+          <w:color w:val="000000"/>
+        </w:rPr>
       </w:r>
     </w:p>
     <w:p>
@@ -11986,20 +12037,23 @@
     </w:p>
     <w:p>
       <w:pPr>
+        <w:spacing w:line="360" w:lineRule="auto" w:after="160"/>
         <w:ind w:firstLine="425"/>
         <w:jc w:val="both"/>
       </w:pPr>
       <w:r>
         <w:rPr>
-          <w:color w:val="000000"/>
-        </w:rPr>
-        <w:t>La figure 24 illustre l'enregistrement d'un incident pendant l'examen. Une sortie du plein écran, un changement d'onglet ou un collage peut être journalisé, puis traité selon les règles prévues. Cette figure montr</w:t>
-      </w:r>
-      <w:r>
-        <w:rPr>
-          <w:color w:val="000000"/>
-        </w:rPr>
-        <w:t>e le suivi de la sécurité pendant l'épreuve.</w:t>
+          <w:rFonts w:ascii="Times New Roman" w:hAnsi="Times New Roman" w:eastAsia="Times New Roman"/>
+          <w:b w:val="0"/>
+          <w:color w:val="000000"/>
+          <w:sz w:val="24"/>
+        </w:rPr>
+        <w:t>La figure 24 illustre l'enregistrement d'un incident pendant l'examen. Une sortie du plein écran, un changement d'onglet ou un collage peut être journalisé, puis traité selon les règles prévues. Cette figure montre comment le système documente les comportements sensibles pour le professeur.</w:t>
+      </w:r>
+      <w:r>
+        <w:rPr>
+          <w:color w:val="000000"/>
+        </w:rPr>
       </w:r>
     </w:p>
     <w:p>
@@ -12148,21 +12202,23 @@
     </w:p>
     <w:p>
       <w:pPr>
+        <w:spacing w:line="360" w:lineRule="auto" w:after="160"/>
         <w:ind w:firstLine="425"/>
         <w:jc w:val="both"/>
       </w:pPr>
       <w:r>
         <w:rPr>
-          <w:color w:val="000000"/>
-        </w:rPr>
-        <w:lastRenderedPageBreak/>
-        <w:t>La figure 25 présente le flux d'activité jusqu'à la salle d'attente. L'étudiant se connecte, accepte les consignes, active le plein écran, puis attend le démarrage. Cette figure couvre la phase avant composi</w:t>
-      </w:r>
-      <w:r>
-        <w:rPr>
-          <w:color w:val="000000"/>
-        </w:rPr>
-        <w:t>tion.</w:t>
+          <w:rFonts w:ascii="Times New Roman" w:hAnsi="Times New Roman" w:eastAsia="Times New Roman"/>
+          <w:b w:val="0"/>
+          <w:color w:val="000000"/>
+          <w:sz w:val="24"/>
+        </w:rPr>
+        <w:t>La figure 25 présente le diagramme d'activité jusqu'à la salle d'attente. L'étudiant se connecte, accepte les consignes, active le plein écran, puis attend le démarrage officiel. Cette figure couvre toute la phase préparatoire avant la composition.</w:t>
+      </w:r>
+      <w:r>
+        <w:rPr>
+          <w:color w:val="000000"/>
+        </w:rPr>
       </w:r>
     </w:p>
     <w:p>
@@ -12282,21 +12338,23 @@
     </w:p>
     <w:p>
       <w:pPr>
+        <w:spacing w:line="360" w:lineRule="auto" w:after="160"/>
         <w:ind w:firstLine="425"/>
         <w:jc w:val="both"/>
       </w:pPr>
       <w:r>
         <w:rPr>
-          <w:color w:val="000000"/>
-        </w:rPr>
-        <w:lastRenderedPageBreak/>
-        <w:t>La figure 26 décrit les activités pendant la composition. L'étudiant écrit, lance des essais, peut provoquer des incidents, puis soumet manuellement ou automatiquement à la fin d</w:t>
-      </w:r>
-      <w:r>
-        <w:rPr>
-          <w:color w:val="000000"/>
-        </w:rPr>
-        <w:t>u temps. Cette figure raconte le cœur de l'épreuve.</w:t>
+          <w:rFonts w:ascii="Times New Roman" w:hAnsi="Times New Roman" w:eastAsia="Times New Roman"/>
+          <w:b w:val="0"/>
+          <w:color w:val="000000"/>
+          <w:sz w:val="24"/>
+        </w:rPr>
+        <w:t>La figure 26 décrit les activités pendant la composition. L'étudiant écrit son code, lance des essais, peut provoquer des incidents, puis soumet manuellement ou automatiquement à la fin du temps. Cette figure raconte le cœur de l'épreuve du point de vue du déroulement.</w:t>
+      </w:r>
+      <w:r>
+        <w:rPr>
+          <w:color w:val="000000"/>
+        </w:rPr>
       </w:r>
     </w:p>
     <w:p>
@@ -13794,34 +13852,35 @@
     </w:p>
     <w:p>
       <w:pPr>
+        <w:spacing w:line="360" w:lineRule="auto" w:after="160"/>
         <w:ind w:firstLine="425"/>
         <w:jc w:val="both"/>
       </w:pPr>
       <w:r>
         <w:rPr>
-          <w:color w:val="000000"/>
-        </w:rPr>
-        <w:t xml:space="preserve">La figure 27 montre la page de connexion de </w:t>
+          <w:rFonts w:ascii="Times New Roman" w:hAnsi="Times New Roman" w:eastAsia="Times New Roman"/>
+          <w:b w:val="0"/>
+          <w:color w:val="000000"/>
+          <w:sz w:val="24"/>
+        </w:rPr>
+        <w:t>La figure 27 montre la page de connexion de Cylentic. Selon le préfixe de l'identifiant, l'utilisateur est orienté vers l'espace Super Admin, administrateur, professeur ou étudiant. Cette figure présente la porte d'entrée unique de la plateforme et le principe multi-rôles.</w:t>
       </w:r>
       <w:proofErr w:type="spellStart"/>
       <w:r>
         <w:rPr>
           <w:color w:val="000000"/>
         </w:rPr>
-        <w:t>Cylentic</w:t>
       </w:r>
       <w:proofErr w:type="spellEnd"/>
       <w:r>
         <w:rPr>
           <w:color w:val="000000"/>
         </w:rPr>
-        <w:t>. Selon le préfixe de l'identifiant, l'utilis</w:t>
-      </w:r>
-      <w:r>
-        <w:rPr>
-          <w:color w:val="000000"/>
-        </w:rPr>
-        <w:t>ateur est orienté vers l'espace Super Admin, administrateur, professeur ou étudiant. Cette figure présente la porte d'entrée de la plateforme.</w:t>
+      </w:r>
+      <w:r>
+        <w:rPr>
+          <w:color w:val="000000"/>
+        </w:rPr>
       </w:r>
     </w:p>
     <w:p>
@@ -14059,21 +14118,23 @@
     </w:p>
     <w:p>
       <w:pPr>
+        <w:spacing w:line="360" w:lineRule="auto" w:after="160"/>
         <w:ind w:firstLine="425"/>
         <w:jc w:val="both"/>
       </w:pPr>
       <w:r>
         <w:rPr>
-          <w:color w:val="000000"/>
-        </w:rPr>
-        <w:lastRenderedPageBreak/>
-        <w:t>La figure 28 présente l'espace administrateur d'établissement. On y gère les classes, les comptes et l'organisation locale. Cette capture montre l'interface réelle u</w:t>
-      </w:r>
-      <w:r>
-        <w:rPr>
-          <w:color w:val="000000"/>
-        </w:rPr>
-        <w:t>tilisée au quotidien par l'administration.</w:t>
+          <w:rFonts w:ascii="Times New Roman" w:hAnsi="Times New Roman" w:eastAsia="Times New Roman"/>
+          <w:b w:val="0"/>
+          <w:color w:val="000000"/>
+          <w:sz w:val="24"/>
+        </w:rPr>
+        <w:t>La figure 28 présente l'espace de l'administrateur d'établissement. On y gère les classes, les comptes et l'organisation locale au quotidien. Cette capture montre l'interface réelle utilisée pour préparer un établissement avant les examens.</w:t>
+      </w:r>
+      <w:r>
+        <w:rPr>
+          <w:color w:val="000000"/>
+        </w:rPr>
       </w:r>
     </w:p>
     <w:p>
@@ -14236,20 +14297,23 @@
     </w:p>
     <w:p>
       <w:pPr>
+        <w:spacing w:line="360" w:lineRule="auto" w:after="160"/>
         <w:ind w:firstLine="425"/>
         <w:jc w:val="both"/>
       </w:pPr>
       <w:r>
         <w:rPr>
-          <w:color w:val="000000"/>
-        </w:rPr>
-        <w:t xml:space="preserve">La figure 29 illustre l'écran de création et d'édition d'un examen côté professeur. On y prépare les </w:t>
-      </w:r>
-      <w:r>
-        <w:rPr>
-          <w:color w:val="000000"/>
-        </w:rPr>
-        <w:t>exercices, les tests et les paramètres de l'épreuve. Cette figure montre l'outil de conception pédagogique.</w:t>
+          <w:rFonts w:ascii="Times New Roman" w:hAnsi="Times New Roman" w:eastAsia="Times New Roman"/>
+          <w:b w:val="0"/>
+          <w:color w:val="000000"/>
+          <w:sz w:val="24"/>
+        </w:rPr>
+        <w:t>La figure 29 illustre l'écran de création et d'édition d'un examen côté professeur. On y prépare les exercices, les tests unitaires et les paramètres de l'épreuve. Cette figure montre l'outil de conception pédagogique avant la publication.</w:t>
+      </w:r>
+      <w:r>
+        <w:rPr>
+          <w:color w:val="000000"/>
+        </w:rPr>
       </w:r>
     </w:p>
     <w:p>
@@ -14377,20 +14441,23 @@
     </w:p>
     <w:p>
       <w:pPr>
+        <w:spacing w:line="360" w:lineRule="auto" w:after="160"/>
         <w:ind w:firstLine="425"/>
         <w:jc w:val="both"/>
       </w:pPr>
       <w:r>
         <w:rPr>
-          <w:color w:val="000000"/>
-        </w:rPr>
-        <w:t>La figure 30 montre l'écran de publication et le code d'accès. Une fois l'</w:t>
-      </w:r>
-      <w:r>
-        <w:rPr>
-          <w:color w:val="000000"/>
-        </w:rPr>
-        <w:t>examen publié, le professeur peut communiquer ce code aux étudiants. Cette figure relie la préparation au démarrage de l'épreuve.</w:t>
+          <w:rFonts w:ascii="Times New Roman" w:hAnsi="Times New Roman" w:eastAsia="Times New Roman"/>
+          <w:b w:val="0"/>
+          <w:color w:val="000000"/>
+          <w:sz w:val="24"/>
+        </w:rPr>
+        <w:t>La figure 30 montre l'écran de publication et l'affichage du code d'accès. Une fois l'examen publié, le professeur peut communiquer ce code aux étudiants. Cette figure relie la fin de la préparation au démarrage concret de l'épreuve.</w:t>
+      </w:r>
+      <w:r>
+        <w:rPr>
+          <w:color w:val="000000"/>
+        </w:rPr>
       </w:r>
     </w:p>
     <w:p>
@@ -14517,20 +14584,23 @@
     </w:p>
     <w:p>
       <w:pPr>
+        <w:spacing w:line="360" w:lineRule="auto" w:after="160"/>
         <w:ind w:firstLine="425"/>
         <w:jc w:val="both"/>
       </w:pPr>
       <w:r>
         <w:rPr>
-          <w:color w:val="000000"/>
-        </w:rPr>
-        <w:t>La figure 31 présente le suivi en direct des participations</w:t>
-      </w:r>
-      <w:r>
-        <w:rPr>
-          <w:color w:val="000000"/>
-        </w:rPr>
-        <w:t>. Le professeur voit qui est connecté, l'état des copies et les incidents signalés. Cette figure montre le pilotage de la salle pendant l'examen.</w:t>
+          <w:rFonts w:ascii="Times New Roman" w:hAnsi="Times New Roman" w:eastAsia="Times New Roman"/>
+          <w:b w:val="0"/>
+          <w:color w:val="000000"/>
+          <w:sz w:val="24"/>
+        </w:rPr>
+        <w:t>La figure 31 présente le suivi en direct des participations. Le professeur voit qui est connecté, l'état des copies et les incidents signalés pendant l'épreuve. Cette figure montre le pilotage de la salle depuis l'interface enseignant.</w:t>
+      </w:r>
+      <w:r>
+        <w:rPr>
+          <w:color w:val="000000"/>
+        </w:rPr>
       </w:r>
     </w:p>
     <w:p>
@@ -14658,20 +14728,23 @@
     </w:p>
     <w:p>
       <w:pPr>
+        <w:spacing w:line="360" w:lineRule="auto" w:after="160"/>
         <w:ind w:firstLine="425"/>
         <w:jc w:val="both"/>
       </w:pPr>
       <w:r>
         <w:rPr>
-          <w:color w:val="000000"/>
-        </w:rPr>
-        <w:t>La figure 32 illustre la consultation des</w:t>
-      </w:r>
-      <w:r>
-        <w:rPr>
-          <w:color w:val="000000"/>
-        </w:rPr>
-        <w:t xml:space="preserve"> résultats et les exports. Après l'épreuve, le professeur peut lire les scores et exporter les données utiles. Cette figure montre la restitution finale du travail.</w:t>
+          <w:rFonts w:ascii="Times New Roman" w:hAnsi="Times New Roman" w:eastAsia="Times New Roman"/>
+          <w:b w:val="0"/>
+          <w:color w:val="000000"/>
+          <w:sz w:val="24"/>
+        </w:rPr>
+        <w:t>La figure 32 illustre la consultation des résultats et les exports disponibles. Après l'épreuve, le professeur peut lire les scores et exporter les données utiles pour le suivi pédagogique. Cette figure montre la restitution finale du travail des étudiants.</w:t>
+      </w:r>
+      <w:r>
+        <w:rPr>
+          <w:color w:val="000000"/>
+        </w:rPr>
       </w:r>
     </w:p>
     <w:p>
@@ -14846,20 +14919,23 @@
     </w:p>
     <w:p>
       <w:pPr>
+        <w:spacing w:line="360" w:lineRule="auto" w:after="160"/>
         <w:ind w:firstLine="425"/>
         <w:jc w:val="both"/>
       </w:pPr>
       <w:r>
         <w:rPr>
-          <w:color w:val="000000"/>
-        </w:rPr>
-        <w:t>La figure 33 montre les consignes de sécurité et l'activation du plein écran. Avant de composer, l'étudiant doit accepter le cadre de l'épreuve. Cette figure</w:t>
-      </w:r>
-      <w:r>
-        <w:rPr>
-          <w:color w:val="000000"/>
-        </w:rPr>
-        <w:t xml:space="preserve"> présente le verrouillage initial côté navigateur.</w:t>
+          <w:rFonts w:ascii="Times New Roman" w:hAnsi="Times New Roman" w:eastAsia="Times New Roman"/>
+          <w:b w:val="0"/>
+          <w:color w:val="000000"/>
+          <w:sz w:val="24"/>
+        </w:rPr>
+        <w:t>La figure 33 montre les consignes de sécurité et l'activation du plein écran. Avant de composer, l'étudiant doit accepter le cadre de l'épreuve et verrouiller son navigateur. Cette figure présente le premier verrouillage côté étudiant.</w:t>
+      </w:r>
+      <w:r>
+        <w:rPr>
+          <w:color w:val="000000"/>
+        </w:rPr>
       </w:r>
     </w:p>
     <w:p>
@@ -14978,20 +15054,23 @@
     </w:p>
     <w:p>
       <w:pPr>
+        <w:spacing w:line="360" w:lineRule="auto" w:after="160"/>
         <w:ind w:firstLine="425"/>
         <w:jc w:val="both"/>
       </w:pPr>
       <w:r>
         <w:rPr>
-          <w:color w:val="000000"/>
-        </w:rPr>
-        <w:t>La figure 34 présente la salle d'attente. L'étudiant reste connecté et informe jusqu'à l'heure de début. Cette figure mon</w:t>
-      </w:r>
-      <w:r>
-        <w:rPr>
-          <w:color w:val="000000"/>
-        </w:rPr>
-        <w:t>tre la phase d'attente synchronisée avant l'ouverture de la composition.</w:t>
+          <w:rFonts w:ascii="Times New Roman" w:hAnsi="Times New Roman" w:eastAsia="Times New Roman"/>
+          <w:b w:val="0"/>
+          <w:color w:val="000000"/>
+          <w:sz w:val="24"/>
+        </w:rPr>
+        <w:t>La figure 34 présente la salle d'attente. L'étudiant reste connecté et informé jusqu'à l'heure de début fixée pour l'examen. Cette figure montre la phase d'attente synchronisée avant l'ouverture de la composition.</w:t>
+      </w:r>
+      <w:r>
+        <w:rPr>
+          <w:color w:val="000000"/>
+        </w:rPr>
       </w:r>
     </w:p>
     <w:p>
@@ -15151,20 +15230,23 @@
     </w:p>
     <w:p>
       <w:pPr>
+        <w:spacing w:line="360" w:lineRule="auto" w:after="160"/>
         <w:ind w:firstLine="425"/>
         <w:jc w:val="both"/>
       </w:pPr>
       <w:r>
         <w:rPr>
-          <w:color w:val="000000"/>
-        </w:rPr>
-        <w:t xml:space="preserve">La figure 35 illustre l'environnement de composition pendant l'examen. L'étudiant voit l'énoncé, écrit dans l'éditeur, peut exécuter un essai et soumettre sa copie. Cette figure montre l'écran principal de </w:t>
-      </w:r>
-      <w:r>
-        <w:rPr>
-          <w:color w:val="000000"/>
-        </w:rPr>
-        <w:t>l'épreuve.</w:t>
+          <w:rFonts w:ascii="Times New Roman" w:hAnsi="Times New Roman" w:eastAsia="Times New Roman"/>
+          <w:b w:val="0"/>
+          <w:color w:val="000000"/>
+          <w:sz w:val="24"/>
+        </w:rPr>
+        <w:t>La figure 35 illustre l'environnement de composition pendant l'examen. L'étudiant voit l'énoncé, écrit dans l'éditeur, peut exécuter un essai et soumettre sa copie. Cette figure montre l'écran principal utilisé tout au long de l'épreuve.</w:t>
+      </w:r>
+      <w:r>
+        <w:rPr>
+          <w:color w:val="000000"/>
+        </w:rPr>
       </w:r>
     </w:p>
     <w:p>
@@ -15436,28 +15518,30 @@
     </w:p>
     <w:p>
       <w:pPr>
+        <w:spacing w:line="360" w:lineRule="auto" w:after="160"/>
         <w:ind w:firstLine="425"/>
         <w:jc w:val="both"/>
       </w:pPr>
       <w:r>
         <w:rPr>
-          <w:color w:val="000000"/>
-        </w:rPr>
-        <w:t xml:space="preserve">La figure 36 montre la page d'accueil publique de </w:t>
+          <w:rFonts w:ascii="Times New Roman" w:hAnsi="Times New Roman" w:eastAsia="Times New Roman"/>
+          <w:b w:val="0"/>
+          <w:color w:val="000000"/>
+          <w:sz w:val="24"/>
+        </w:rPr>
+        <w:t>La figure 36 montre la page d'accueil publique de Cylentic. Elle présente la plateforme et oriente le visiteur vers la connexion. Cette figure correspond au premier contact avec le service avant l'accès aux espaces privés.</w:t>
       </w:r>
       <w:proofErr w:type="spellStart"/>
       <w:r>
         <w:rPr>
           <w:color w:val="000000"/>
         </w:rPr>
-        <w:t>Cylentic</w:t>
       </w:r>
       <w:proofErr w:type="spellEnd"/>
       <w:r>
         <w:rPr>
           <w:color w:val="000000"/>
         </w:rPr>
-        <w:t>. Elle présente la plateforme et oriente vers la connexion. Cette figure correspond au premier contact d'un visiteur avec le service.</w:t>
       </w:r>
     </w:p>
     <w:p>

</xml_diff>

<commit_message>
Réécrire les commentaires de figures sans répéter le texte précédent
Les commentaires décrivent ce que la figure montre (lecture du schéma),
sans reprendre le récit du paragraphe d'avant.

Co-authored-by: progirix <progirix@users.noreply.github.com>
</commit_message>
<xml_diff>
--- a/docs/Rapport_Cylentic.docx
+++ b/docs/Rapport_Cylentic.docx
@@ -8483,7 +8483,7 @@
           <w:color w:val="000000"/>
           <w:sz w:val="24"/>
         </w:rPr>
-        <w:t>La figure 1 présente l'architecture logique de Cylentic. Elle montre comment l'interface web, les services métier, la base de données et la sandbox d'exécution s'articulent. L'étudiant et le professeur interagissent via le navigateur ; les services appliquent les règles d'examen et de sécurité ; la sandbox exécute le code Python de façon isolée. Cette vue permet de comprendre l'organisation globale du système avant d'entrer dans le détail des modules.</w:t>
+        <w:t>La figure 1 présente l'architecture logique de Cylentic. On y distingue quatre blocs principaux : l'interface web, les services métier, la persistance des données et la sandbox d'exécution. Les flèches indiquent les échanges entre ces blocs et permettent de situer le rôle de chacun dans le système.</w:t>
       </w:r>
       <w:proofErr w:type="spellStart"/>
       <w:r>
@@ -8687,7 +8687,7 @@
           <w:color w:val="000000"/>
           <w:sz w:val="24"/>
         </w:rPr>
-        <w:t>La figure 2 illustre le déploiement de l'infrastructure. Le serveur applicatif héberge Cylentic, MySQL conserve les données, et Docker fournit l'environnement d'exécution isolé pour le code étudiant. Les postes de la salle informatique accèdent à la plateforme uniquement via le navigateur. Cette figure montre concrètement où chaque composant tourne le jour de l'épreuve.</w:t>
+        <w:t>La figure 2 illustre le déploiement physique de l'infrastructure. Elle place le serveur applicatif, la base MySQL, les conteneurs Docker et les postes clients sur le même schéma. Cette vue montre où s'exécute chaque élément le jour de l'épreuve.</w:t>
       </w:r>
       <w:proofErr w:type="spellStart"/>
       <w:r>
@@ -8902,7 +8902,7 @@
           <w:color w:val="000000"/>
           <w:sz w:val="24"/>
         </w:rPr>
-        <w:t>La figure 3 présente les cas d'utilisation du Super Admin. Elle décrit ses interactions avec la plateforme : gestion des établissements, pilotage global et fonctions transverses. Cette vue précise un rôle distinct de celui de l'administrateur d'école, centré sur la gouvernance de l'ensemble du service.</w:t>
+        <w:t>La figure 3 présente le diagramme de cas d'utilisation du Super Admin. L'acteur est relié aux actions de gouvernance de la plateforme, ce qui met en évidence un périmètre global, distinct de la gestion locale d'un établissement.</w:t>
       </w:r>
       <w:r>
         <w:rPr>
@@ -9050,7 +9050,7 @@
           <w:color w:val="000000"/>
           <w:sz w:val="24"/>
         </w:rPr>
-        <w:t>La figure 4 illustre les cas d'utilisation de l'administrateur d'établissement pour l'organisation scolaire. On y voit la gestion des années académiques, des classes et de la structure locale. Cette figure montre le périmètre d'administration avant la création et le suivi des comptes utilisateurs.</w:t>
+        <w:t>La figure 4 illustre le diagramme de cas d'utilisation de l'administrateur pour l'organisation. Les associations relient l'acteur aux actions de structuration de l'espace scolaire, ce qui clarifie son périmètre avant la gestion fine des comptes.</w:t>
       </w:r>
       <w:r>
         <w:rPr>
@@ -9186,7 +9186,7 @@
           <w:color w:val="000000"/>
           <w:sz w:val="24"/>
         </w:rPr>
-        <w:t>La figure 5 présente la gestion des comptes par l'administrateur d'établissement. Elle couvre la création, la modification, la désactivation et la réactivation des comptes professeurs et étudiants, ainsi que l'import de listes. Cette vue complète le rôle local de l'administrateur côté utilisateurs.</w:t>
+        <w:t>La figure 5 présente le diagramme de cas d'utilisation centré sur les comptes. On y voit les opérations de création, modification et suivi des utilisateurs, regroupées autour de l'administrateur d'établissement.</w:t>
       </w:r>
       <w:r>
         <w:rPr>
@@ -9334,7 +9334,7 @@
           <w:color w:val="000000"/>
           <w:sz w:val="24"/>
         </w:rPr>
-        <w:t>La figure 6 détaille les cas d'utilisation du professeur pour la préparation des examens. Elle montre la création de l'épreuve, l'ajout d'exercices et de tests, puis la publication. Cette figure décrit le travail pédagogique réalisé avant le jour de composition.</w:t>
+        <w:t>La figure 6 détaille le diagramme de cas d'utilisation du professeur pour les examens. Les actions de préparation et de publication y apparaissent comme un enchaînement cohérent côté enseignant.</w:t>
       </w:r>
       <w:r>
         <w:rPr>
@@ -9469,7 +9469,7 @@
           <w:color w:val="000000"/>
           <w:sz w:val="24"/>
         </w:rPr>
-        <w:t>La figure 7 illustre le suivi côté professeur pendant et après l'épreuve. Elle montre la consultation des participations, la lecture du journal d'incidents et l'accès aux résultats. Cette vue explique comment le professeur pilote l'examen une fois qu'il est lancé.</w:t>
+        <w:t>La figure 7 illustre le diagramme de cas d'utilisation du professeur pour le suivi. Elle regroupe les consultations liées au déroulement de l'épreuve et à l'exploitation des résultats.</w:t>
       </w:r>
       <w:r>
         <w:rPr>
@@ -9617,7 +9617,7 @@
           <w:color w:val="000000"/>
           <w:sz w:val="24"/>
         </w:rPr>
-        <w:t>La figure 8 représente le parcours de l'étudiant. Après connexion et saisie du code d'examen, il accepte les consignes, attend en salle d'attente, compose, peut exécuter des essais, puis soumet sa copie. Cette figure résume le chemin complet suivi par l'étudiant le jour de l'épreuve.</w:t>
+        <w:t>La figure 8 représente le diagramme de cas d'utilisation de l'étudiant. Les cas sont ordonnés selon le parcours de composition, de l'entrée dans l'examen jusqu'à la soumission.</w:t>
       </w:r>
       <w:r>
         <w:rPr>
@@ -9795,7 +9795,7 @@
           <w:color w:val="000000"/>
           <w:sz w:val="24"/>
         </w:rPr>
-        <w:t>La figure 9 présente le diagramme de classes lié à l'organisation et aux comptes. Elle montre les établissements, les utilisateurs et les relations qui portent les rôles. Cette modélisation pose la base des droits d'accès et de l'isolation des données entre établissements.</w:t>
+        <w:t>La figure 9 présente le diagramme de classes de l'organisation et des comptes. Les classes et associations montrent comment établissements, utilisateurs et rôles sont reliés dans le modèle.</w:t>
       </w:r>
       <w:r>
         <w:rPr>
@@ -9943,7 +9943,7 @@
           <w:color w:val="000000"/>
           <w:sz w:val="24"/>
         </w:rPr>
-        <w:t>La figure 10 illustre les classes de conception d'un examen. Un examen regroupe des exercices, eux-mêmes associés à des tests unitaires ou à des QCM. Cette figure montre comment le contenu pédagogique est structuré avant d'être proposé aux étudiants.</w:t>
+        <w:t>La figure 10 illustre le diagramme de classes de conception d'examen. On y voit la décomposition d'un examen en exercices et en éléments d'évaluation associés.</w:t>
       </w:r>
       <w:r>
         <w:rPr>
@@ -10027,7 +10027,7 @@
           <w:color w:val="000000"/>
           <w:sz w:val="24"/>
         </w:rPr>
-        <w:t>La figure 11 présente les classes de la composition et de la correction. La participation relie un étudiant à un examen ; la copie, les incidents et les résultats permettent de suivre le travail rendu et de l'évaluer. Cette vue explique le cœur métier pendant et après l'épreuve.</w:t>
+        <w:t>La figure 11 présente le diagramme de classes de la composition et de la correction. Les liens entre participation, copie, incidents et résultats y apparaissent explicitement.</w:t>
       </w:r>
       <w:r>
         <w:rPr>
@@ -10179,7 +10179,7 @@
           <w:color w:val="000000"/>
           <w:sz w:val="24"/>
         </w:rPr>
-        <w:t>La figure 12 montre un diagramme d'objets pour l'organisation. Elle donne un exemple concret des liens entre un établissement, ses classes et ses utilisateurs. Cette figure rend le modèle de classes plus lisible en l'illustrant avec des instances.</w:t>
+        <w:t>La figure 12 montre un diagramme d'objets de l'organisation. Des instances concrètes rendent visibles les relations déjà décrites dans le modèle de classes.</w:t>
       </w:r>
     </w:p>
     <w:p>
@@ -10310,7 +10310,7 @@
           <w:color w:val="000000"/>
           <w:sz w:val="24"/>
         </w:rPr>
-        <w:t>La figure 13 illustre un examen concret avec ses exercices et ses tests associés. Elle précise, sur un exemple, comment les objets de conception se relient au moment où le professeur prépare l'épreuve. Cette vue aide à passer du modèle abstrait à une situation réelle.</w:t>
+        <w:t>La figure 13 illustre un diagramme d'objets de conception d'examen. L'exemple instancié aide à lire concrètement la structure d'un examen et de ses exercices.</w:t>
       </w:r>
     </w:p>
     <w:p>
@@ -10389,7 +10389,7 @@
           <w:color w:val="000000"/>
           <w:sz w:val="24"/>
         </w:rPr>
-        <w:t>La figure 14 présente un exemple de participation pendant l'examen. On y voit la copie de l'étudiant, d'éventuels incidents et les éléments utiles à la correction. Cette figure aide à comprendre le déroulement réel d'une épreuve et les données conservées par le système.</w:t>
+        <w:t>La figure 14 présente un diagramme d'objets de composition. Il matérialise une participation en cours avec les objets liés à la copie et au suivi.</w:t>
       </w:r>
       <w:r>
         <w:rPr>
@@ -10582,7 +10582,7 @@
           <w:color w:val="000000"/>
           <w:sz w:val="24"/>
         </w:rPr>
-        <w:t>La figure 15 donne une vue d'ensemble des composants logiciels de Cylentic. L'interface, les services et les briques techniques y sont reliés sans entrer dans chaque classe. Cette figure montre le découpage du système et les dépendances principales entre parties.</w:t>
+        <w:t>La figure 15 donne une vue d'ensemble des composants logiciels. Les boîtes et dépendances montrent le découpage de l'application sans redescendre au niveau des classes métier.</w:t>
       </w:r>
       <w:proofErr w:type="spellStart"/>
       <w:r>
@@ -10724,7 +10724,7 @@
           <w:color w:val="000000"/>
           <w:sz w:val="24"/>
         </w:rPr>
-        <w:t>La figure 16 détaille les composants d'administration et d'authentification. Elle montre comment la connexion, l'attribution des rôles et la gestion des comptes sont prises en charge dans l'application. Cette vue précise la frontière entre accès sécurisé et fonctions d'administration.</w:t>
+        <w:t>La figure 16 détaille les composants d'administration et d'authentification. Le schéma isole les briques responsables de la connexion, des rôles et de la gestion des comptes.</w:t>
       </w:r>
       <w:r>
         <w:rPr>
@@ -10809,7 +10809,7 @@
           <w:color w:val="000000"/>
           <w:sz w:val="24"/>
         </w:rPr>
-        <w:t>La figure 17 présente les composants liés aux examens et à la composition. On y retrouve la préparation de l'épreuve, le parcours étudiant et l'exécution isolée du code. Cette figure relie la partie pédagogique à la partie technique de la plateforme.</w:t>
+        <w:t>La figure 17 présente les composants examens et composition. Elle relie les modules de préparation pédagogique aux modules d'exécution et de suivi pendant l'épreuve.</w:t>
       </w:r>
       <w:r>
         <w:rPr>
@@ -11059,7 +11059,7 @@
           <w:color w:val="000000"/>
           <w:sz w:val="24"/>
         </w:rPr>
-        <w:t>La figure 18 montre les états successifs d'un examen. Il naît en brouillon, devient publié, passe en cours pendant l'épreuve, puis se clôture. Cette figure explique le cycle de vie suivi par la plateforme et les transitions autorisées entre ces états.</w:t>
+        <w:t>La figure 18 montre le diagramme d'états du cycle de vie d'un examen. Les états et transitions visualisent le chemin suivi par un examen, du brouillon à la clôture.</w:t>
       </w:r>
       <w:r>
         <w:rPr>
@@ -11224,7 +11224,7 @@
           <w:color w:val="000000"/>
           <w:sz w:val="24"/>
         </w:rPr>
-        <w:t>La figure 19 décrit la séquence de connexion. L'utilisateur saisit ses identifiants ; le serveur vérifie le compte, déduit le rôle à partir du préfixe, puis ouvre la session. Cette figure montre le premier contrôle d'accès à Cylentic et l'orientation vers le bon espace.</w:t>
+        <w:t>La figure 19 décrit le diagramme de séquence de connexion. Les messages entre l'interface et le serveur détaillent l'ordre des vérifications jusqu'à l'ouverture de session.</w:t>
       </w:r>
       <w:r>
         <w:rPr>
@@ -11390,7 +11390,7 @@
           <w:color w:val="000000"/>
           <w:sz w:val="24"/>
         </w:rPr>
-        <w:t>La figure 20 illustre la publication d'un examen. Le professeur propriétaire déclenche la publication ; le système rend l'épreuve accessible et génère le code d'accès destiné aux étudiants. Cette figure montre le passage du brouillon à l'épreuve prête à être composée.</w:t>
+        <w:t>La figure 20 illustre le diagramme de séquence de publication. On y suit l'échange qui rend l'examen accessible et produit le code d'accès.</w:t>
       </w:r>
       <w:r>
         <w:rPr>
@@ -11550,7 +11550,7 @@
           <w:color w:val="000000"/>
           <w:sz w:val="24"/>
         </w:rPr>
-        <w:t>La figure 21 présente la séquence d'accès de l'étudiant à l'examen. Après authentification et saisie du code, il lit les consignes de sécurité puis rejoint la salle d'attente. Cette figure décrit les contrôles effectués avant l'ouverture de la composition.</w:t>
+        <w:t>La figure 21 présente le diagramme de séquence d'accès étudiant. La chronologie des messages montre les contrôles successifs avant l'entrée en salle d'attente.</w:t>
       </w:r>
       <w:r>
         <w:rPr>
@@ -11712,7 +11712,7 @@
           <w:color w:val="000000"/>
           <w:sz w:val="24"/>
         </w:rPr>
-        <w:t>La figure 22 montre l'exécution du code Python dans la sandbox. Le navigateur envoie le code au serveur ; celui-ci le fait tourner dans un conteneur isolé, puis renvoie la sortie à l'étudiant. Cette figure explique comment un essai reste sûr pour la machine hôte.</w:t>
+        <w:t>La figure 22 montre le diagramme de séquence d'exécution du code. Les appels entre navigateur, serveur et sandbox visualisent le chemin d'un essai isolé.</w:t>
       </w:r>
       <w:proofErr w:type="spellStart"/>
       <w:r>
@@ -11900,7 +11900,7 @@
           <w:color w:val="000000"/>
           <w:sz w:val="24"/>
         </w:rPr>
-        <w:t>La figure 23 décrit la soumission de la copie et le lancement de la correction automatique. Une fois la copie figée, les tests unitaires sont exécutés et le score est calculé. Cette figure montre la fin du parcours de composition et le début de l'évaluation.</w:t>
+        <w:t>La figure 23 décrit le diagramme de séquence de soumission et de correction. L'enchaînement des messages relie le dépôt de copie au calcul automatique du score.</w:t>
       </w:r>
       <w:r>
         <w:rPr>
@@ -12048,7 +12048,7 @@
           <w:color w:val="000000"/>
           <w:sz w:val="24"/>
         </w:rPr>
-        <w:t>La figure 24 illustre l'enregistrement d'un incident pendant l'examen. Une sortie du plein écran, un changement d'onglet ou un collage peut être journalisé, puis traité selon les règles prévues. Cette figure montre comment le système documente les comportements sensibles pour le professeur.</w:t>
+        <w:t>La figure 24 illustre le diagramme de séquence d'enregistrement d'un incident. Il montre comment un événement côté client devient une trace exploitable côté serveur.</w:t>
       </w:r>
       <w:r>
         <w:rPr>
@@ -12213,7 +12213,7 @@
           <w:color w:val="000000"/>
           <w:sz w:val="24"/>
         </w:rPr>
-        <w:t>La figure 25 présente le diagramme d'activité jusqu'à la salle d'attente. L'étudiant se connecte, accepte les consignes, active le plein écran, puis attend le démarrage officiel. Cette figure couvre toute la phase préparatoire avant la composition.</w:t>
+        <w:t>La figure 25 présente le diagramme d'activité de l'accès jusqu'à la salle d'attente. Les étapes et branchements visualisent la phase préparatoire avant composition.</w:t>
       </w:r>
       <w:r>
         <w:rPr>
@@ -12349,7 +12349,7 @@
           <w:color w:val="000000"/>
           <w:sz w:val="24"/>
         </w:rPr>
-        <w:t>La figure 26 décrit les activités pendant la composition. L'étudiant écrit son code, lance des essais, peut provoquer des incidents, puis soumet manuellement ou automatiquement à la fin du temps. Cette figure raconte le cœur de l'épreuve du point de vue du déroulement.</w:t>
+        <w:t>La figure 26 décrit le diagramme d'activité de la composition et de la soumission. Le flux met en évidence les boucles d'essai, les incidents possibles et la fin de l'épreuve.</w:t>
       </w:r>
       <w:r>
         <w:rPr>
@@ -13863,7 +13863,7 @@
           <w:color w:val="000000"/>
           <w:sz w:val="24"/>
         </w:rPr>
-        <w:t>La figure 27 montre la page de connexion de Cylentic. Selon le préfixe de l'identifiant, l'utilisateur est orienté vers l'espace Super Admin, administrateur, professeur ou étudiant. Cette figure présente la porte d'entrée unique de la plateforme et le principe multi-rôles.</w:t>
+        <w:t>La figure 27 montre la page de connexion. L'écran centralise la saisie des identifiants et constitue le point d'entrée unique vers les différents espaces de la plateforme.</w:t>
       </w:r>
       <w:proofErr w:type="spellStart"/>
       <w:r>
@@ -14129,7 +14129,7 @@
           <w:color w:val="000000"/>
           <w:sz w:val="24"/>
         </w:rPr>
-        <w:t>La figure 28 présente l'espace de l'administrateur d'établissement. On y gère les classes, les comptes et l'organisation locale au quotidien. Cette capture montre l'interface réelle utilisée pour préparer un établissement avant les examens.</w:t>
+        <w:t>La figure 28 présente l'espace administrateur d'établissement. L'interface regroupe les menus de gestion locale utiles au quotidien de l'administration.</w:t>
       </w:r>
       <w:r>
         <w:rPr>
@@ -14308,7 +14308,7 @@
           <w:color w:val="000000"/>
           <w:sz w:val="24"/>
         </w:rPr>
-        <w:t>La figure 29 illustre l'écran de création et d'édition d'un examen côté professeur. On y prépare les exercices, les tests unitaires et les paramètres de l'épreuve. Cette figure montre l'outil de conception pédagogique avant la publication.</w:t>
+        <w:t>La figure 29 illustre l'écran de composition d'un examen côté professeur. On y voit la zone d'édition des exercices et des paramètres de l'épreuve.</w:t>
       </w:r>
       <w:r>
         <w:rPr>
@@ -14452,7 +14452,7 @@
           <w:color w:val="000000"/>
           <w:sz w:val="24"/>
         </w:rPr>
-        <w:t>La figure 30 montre l'écran de publication et l'affichage du code d'accès. Une fois l'examen publié, le professeur peut communiquer ce code aux étudiants. Cette figure relie la fin de la préparation au démarrage concret de l'épreuve.</w:t>
+        <w:t>La figure 30 montre l'écran de publication avec le code d'accès. La mise en page met en évidence l'information à transmettre aux étudiants.</w:t>
       </w:r>
       <w:r>
         <w:rPr>
@@ -14595,7 +14595,7 @@
           <w:color w:val="000000"/>
           <w:sz w:val="24"/>
         </w:rPr>
-        <w:t>La figure 31 présente le suivi en direct des participations. Le professeur voit qui est connecté, l'état des copies et les incidents signalés pendant l'épreuve. Cette figure montre le pilotage de la salle depuis l'interface enseignant.</w:t>
+        <w:t>La figure 31 présente le tableau de suivi live. Les lignes de participation et les indicateurs visibles permettent de lire l'état de la salle en temps réel.</w:t>
       </w:r>
       <w:r>
         <w:rPr>
@@ -14739,7 +14739,7 @@
           <w:color w:val="000000"/>
           <w:sz w:val="24"/>
         </w:rPr>
-        <w:t>La figure 32 illustre la consultation des résultats et les exports disponibles. Après l'épreuve, le professeur peut lire les scores et exporter les données utiles pour le suivi pédagogique. Cette figure montre la restitution finale du travail des étudiants.</w:t>
+        <w:t>La figure 32 illustre l'écran des résultats et des exports. Les actions d'export y apparaissent à côté de la consultation des scores.</w:t>
       </w:r>
       <w:r>
         <w:rPr>
@@ -14930,7 +14930,7 @@
           <w:color w:val="000000"/>
           <w:sz w:val="24"/>
         </w:rPr>
-        <w:t>La figure 33 montre les consignes de sécurité et l'activation du plein écran. Avant de composer, l'étudiant doit accepter le cadre de l'épreuve et verrouiller son navigateur. Cette figure présente le premier verrouillage côté étudiant.</w:t>
+        <w:t>La figure 33 montre l'écran des consignes et du plein écran. L'interface impose une validation explicite avant le passage à la suite du parcours étudiant.</w:t>
       </w:r>
       <w:r>
         <w:rPr>
@@ -15065,7 +15065,7 @@
           <w:color w:val="000000"/>
           <w:sz w:val="24"/>
         </w:rPr>
-        <w:t>La figure 34 présente la salle d'attente. L'étudiant reste connecté et informé jusqu'à l'heure de début fixée pour l'examen. Cette figure montre la phase d'attente synchronisée avant l'ouverture de la composition.</w:t>
+        <w:t>La figure 34 présente la salle d'attente. L'écran d'attente affiche l'état d'attente synchronisé jusqu'à l'ouverture de la composition.</w:t>
       </w:r>
       <w:r>
         <w:rPr>
@@ -15241,7 +15241,7 @@
           <w:color w:val="000000"/>
           <w:sz w:val="24"/>
         </w:rPr>
-        <w:t>La figure 35 illustre l'environnement de composition pendant l'examen. L'étudiant voit l'énoncé, écrit dans l'éditeur, peut exécuter un essai et soumettre sa copie. Cette figure montre l'écran principal utilisé tout au long de l'épreuve.</w:t>
+        <w:t>La figure 35 illustre l'environnement de composition. On y distingue l'énoncé, l'éditeur, la zone d'exécution d'essai et l'action de soumission sur le même écran.</w:t>
       </w:r>
       <w:r>
         <w:rPr>
@@ -15529,7 +15529,7 @@
           <w:color w:val="000000"/>
           <w:sz w:val="24"/>
         </w:rPr>
-        <w:t>La figure 36 montre la page d'accueil publique de Cylentic. Elle présente la plateforme et oriente le visiteur vers la connexion. Cette figure correspond au premier contact avec le service avant l'accès aux espaces privés.</w:t>
+        <w:t>La figure 36 montre la page d'accueil publique. Elle expose le point d'entrée du service avant toute connexion aux espaces privés.</w:t>
       </w:r>
       <w:proofErr w:type="spellStart"/>
       <w:r>

</xml_diff>

<commit_message>
Remerciements façon YANOGO avec les deux encadrants nommés
Nomme Dr YANOGO K Jean Hermann (principal) et Dr KYELEM, sur le
modèle du mémoire de référence, et met à jour la page de garde.

Co-authored-by: progirix <progirix@users.noreply.github.com>
</commit_message>
<xml_diff>
--- a/docs/Rapport_Cylentic.docx
+++ b/docs/Rapport_Cylentic.docx
@@ -396,7 +396,7 @@
                               <w:rPr>
                                 <w:color w:val="000000" w:themeColor="text1"/>
                               </w:rPr>
-                              <w:t>Dr YANOGO</w:t>
+                              <w:t>Dr YANOGO K Jean Hermann</w:t>
                             </w:r>
                           </w:p>
                           <w:p>
@@ -495,7 +495,7 @@
                         <w:rPr>
                           <w:color w:val="000000" w:themeColor="text1"/>
                         </w:rPr>
-                        <w:t>Dr YANOGO</w:t>
+                        <w:t>Dr YANOGO K Jean Hermann</w:t>
                       </w:r>
                     </w:p>
                     <w:p>
@@ -954,9 +954,10 @@
       </w:pPr>
       <w:r>
         <w:rPr>
-          <w:color w:val="000000"/>
-        </w:rPr>
-        <w:t>Nous remercions notre encadrant principal pour sa disponibilité, ses remarques précises et l'exigence maintenue à chaque étape. Nous remercions également notre second encadrant pour ses conseils méthodologiques et techniques.</w:t>
+          <w:rFonts w:ascii="Times New Roman" w:hAnsi="Times New Roman" w:eastAsia="Times New Roman"/>
+          <w:sz w:val="24"/>
+        </w:rPr>
+        <w:t>Nous tenons à exprimer notre profonde gratitude à toutes les personnes et institutions qui ont contribué, de près ou de loin, à la réalisation de notre projet de fin d'année.</w:t>
       </w:r>
     </w:p>
     <w:p>
@@ -966,14 +967,104 @@
       </w:pPr>
       <w:r>
         <w:rPr>
-          <w:color w:val="000000"/>
-        </w:rPr>
-        <w:t>Nos remerciements vont à l'administration et au corps enseignant de notre établissement, ainsi qu'aux camarades qui ont testé les premiers parcours d'examen et signalé les points durs de l'interface.</w:t>
-      </w:r>
-    </w:p>
-    <w:p>
-      <w:r>
-        <w:br w:type="page"/>
+          <w:rFonts w:ascii="Times New Roman" w:hAnsi="Times New Roman" w:eastAsia="Times New Roman"/>
+          <w:sz w:val="24"/>
+        </w:rPr>
+        <w:t>Nous adressons tout d'abord nos sincères remerciements à Dieu Tout-Puissant pour la santé, la force et la persévérance qu'Il nous a accordées tout au long de notre parcours académique.</w:t>
+      </w:r>
+    </w:p>
+    <w:p>
+      <w:pPr>
+        <w:ind w:firstLine="425"/>
+        <w:jc w:val="both"/>
+      </w:pPr>
+      <w:r>
+        <w:rPr>
+          <w:rFonts w:ascii="Times New Roman" w:hAnsi="Times New Roman" w:eastAsia="Times New Roman"/>
+          <w:b/>
+          <w:sz w:val="24"/>
+        </w:rPr>
+        <w:t>Dr YANOGO K Jean Hermann</w:t>
+      </w:r>
+      <w:r>
+        <w:rPr>
+          <w:rFonts w:ascii="Times New Roman" w:hAnsi="Times New Roman" w:eastAsia="Times New Roman"/>
+          <w:sz w:val="24"/>
+        </w:rPr>
+        <w:t>, notre encadrant principal, dont les conseils avisés, la disponibilité, la rigueur scientifique et les orientations ont été déterminants dans la conduite de ce projet.</w:t>
+      </w:r>
+    </w:p>
+    <w:p>
+      <w:pPr>
+        <w:ind w:firstLine="425"/>
+        <w:jc w:val="both"/>
+      </w:pPr>
+      <w:r>
+        <w:rPr>
+          <w:rFonts w:ascii="Times New Roman" w:hAnsi="Times New Roman" w:eastAsia="Times New Roman"/>
+          <w:b/>
+          <w:sz w:val="24"/>
+        </w:rPr>
+        <w:t>Dr KYELEM</w:t>
+      </w:r>
+      <w:r>
+        <w:rPr>
+          <w:rFonts w:ascii="Times New Roman" w:hAnsi="Times New Roman" w:eastAsia="Times New Roman"/>
+          <w:sz w:val="24"/>
+        </w:rPr>
+        <w:t>, notre encadrant, pour ses conseils méthodologiques et techniques, ainsi que pour son accompagnement tout au long de ce travail.</w:t>
+      </w:r>
+    </w:p>
+    <w:p>
+      <w:pPr>
+        <w:ind w:firstLine="425"/>
+        <w:jc w:val="both"/>
+      </w:pPr>
+      <w:r>
+        <w:rPr>
+          <w:rFonts w:ascii="Times New Roman" w:hAnsi="Times New Roman" w:eastAsia="Times New Roman"/>
+          <w:sz w:val="24"/>
+        </w:rPr>
+        <w:t>L'ensemble du corps professoral et administratif de l'Institut du Génie Informatique pour la qualité de la formation reçue et pour l'encadrement académique dont nous avons bénéficié.</w:t>
+      </w:r>
+    </w:p>
+    <w:p>
+      <w:pPr>
+        <w:ind w:firstLine="425"/>
+        <w:jc w:val="both"/>
+      </w:pPr>
+      <w:r>
+        <w:rPr>
+          <w:rFonts w:ascii="Times New Roman" w:hAnsi="Times New Roman" w:eastAsia="Times New Roman"/>
+          <w:sz w:val="24"/>
+        </w:rPr>
+        <w:t>Notre gratitude à nos collègues, amis et camarades de promotion pour leurs encouragements, leurs conseils et les échanges constructifs, notamment ceux qui ont testé les premiers parcours d'examen et signalé les points durs de l'interface.</w:t>
+      </w:r>
+    </w:p>
+    <w:p>
+      <w:pPr>
+        <w:ind w:firstLine="425"/>
+        <w:jc w:val="both"/>
+      </w:pPr>
+      <w:r>
+        <w:rPr>
+          <w:rFonts w:ascii="Times New Roman" w:hAnsi="Times New Roman" w:eastAsia="Times New Roman"/>
+          <w:sz w:val="24"/>
+        </w:rPr>
+        <w:t>Notre famille, pour son soutien moral, sa compréhension et sa confiance tout au long de nos études.</w:t>
+      </w:r>
+    </w:p>
+    <w:p>
+      <w:pPr>
+        <w:ind w:firstLine="425"/>
+        <w:jc w:val="both"/>
+      </w:pPr>
+      <w:r>
+        <w:rPr>
+          <w:rFonts w:ascii="Times New Roman" w:hAnsi="Times New Roman" w:eastAsia="Times New Roman"/>
+          <w:sz w:val="24"/>
+        </w:rPr>
+        <w:t>Nos sincères remerciements à toutes les personnes qui, d'une manière ou d'une autre, ont contribué à la réalisation de ce rapport et à la réussite de notre formation.</w:t>
       </w:r>
     </w:p>
     <w:p>

</xml_diff>

<commit_message>
Alléger les remerciements et rétablir le saut de page du sommaire
Garde uniquement les deux encadrants et la phrase de clôture ;
ajoute un saut de page avant le Sommaire.

Co-authored-by: progirix <progirix@users.noreply.github.com>
</commit_message>
<xml_diff>
--- a/docs/Rapport_Cylentic.docx
+++ b/docs/Rapport_Cylentic.docx
@@ -954,117 +954,57 @@
       </w:pPr>
       <w:r>
         <w:rPr>
+          <w:rFonts w:ascii="Times New Roman" w:hAnsi="Times New Roman"/>
+          <w:b/>
+          <w:sz w:val="24"/>
+        </w:rPr>
+        <w:t>Dr YANOGO K Jean Hermann</w:t>
+      </w:r>
+      <w:r>
+        <w:rPr>
+          <w:rFonts w:ascii="Times New Roman" w:hAnsi="Times New Roman"/>
+          <w:sz w:val="24"/>
+        </w:rPr>
+        <w:t>, notre encadrant principal, dont les conseils avisés, la disponibilité, la rigueur scientifique et les orientations ont été déterminants dans la conduite de ce projet.</w:t>
+      </w:r>
+    </w:p>
+    <w:p>
+      <w:pPr>
+        <w:ind w:firstLine="425"/>
+        <w:jc w:val="both"/>
+      </w:pPr>
+      <w:r>
+        <w:rPr>
+          <w:rFonts w:ascii="Times New Roman" w:hAnsi="Times New Roman"/>
+          <w:b/>
+          <w:sz w:val="24"/>
+        </w:rPr>
+        <w:t>Dr KYELEM</w:t>
+      </w:r>
+      <w:r>
+        <w:rPr>
+          <w:rFonts w:ascii="Times New Roman" w:hAnsi="Times New Roman"/>
+          <w:sz w:val="24"/>
+        </w:rPr>
+        <w:t>, notre encadrant, pour ses conseils méthodologiques et techniques, ainsi que pour son accompagnement tout au long de ce travail.</w:t>
+      </w:r>
+    </w:p>
+    <w:p>
+      <w:pPr>
+        <w:ind w:firstLine="425"/>
+        <w:jc w:val="both"/>
+      </w:pPr>
+      <w:r>
+        <w:rPr>
           <w:rFonts w:ascii="Times New Roman" w:hAnsi="Times New Roman" w:eastAsia="Times New Roman"/>
           <w:sz w:val="24"/>
         </w:rPr>
-        <w:t>Nous tenons à exprimer notre profonde gratitude à toutes les personnes et institutions qui ont contribué, de près ou de loin, à la réalisation de notre projet de fin d'année.</w:t>
-      </w:r>
-    </w:p>
-    <w:p>
-      <w:pPr>
-        <w:ind w:firstLine="425"/>
-        <w:jc w:val="both"/>
-      </w:pPr>
-      <w:r>
-        <w:rPr>
-          <w:rFonts w:ascii="Times New Roman" w:hAnsi="Times New Roman" w:eastAsia="Times New Roman"/>
-          <w:sz w:val="24"/>
-        </w:rPr>
-        <w:t>Nous adressons tout d'abord nos sincères remerciements à Dieu Tout-Puissant pour la santé, la force et la persévérance qu'Il nous a accordées tout au long de notre parcours académique.</w:t>
-      </w:r>
-    </w:p>
-    <w:p>
-      <w:pPr>
-        <w:ind w:firstLine="425"/>
-        <w:jc w:val="both"/>
-      </w:pPr>
-      <w:r>
-        <w:rPr>
-          <w:rFonts w:ascii="Times New Roman" w:hAnsi="Times New Roman" w:eastAsia="Times New Roman"/>
-          <w:b/>
-          <w:sz w:val="24"/>
-        </w:rPr>
-        <w:t>Dr YANOGO K Jean Hermann</w:t>
-      </w:r>
-      <w:r>
-        <w:rPr>
-          <w:rFonts w:ascii="Times New Roman" w:hAnsi="Times New Roman" w:eastAsia="Times New Roman"/>
-          <w:sz w:val="24"/>
-        </w:rPr>
-        <w:t>, notre encadrant principal, dont les conseils avisés, la disponibilité, la rigueur scientifique et les orientations ont été déterminants dans la conduite de ce projet.</w:t>
-      </w:r>
-    </w:p>
-    <w:p>
-      <w:pPr>
-        <w:ind w:firstLine="425"/>
-        <w:jc w:val="both"/>
-      </w:pPr>
-      <w:r>
-        <w:rPr>
-          <w:rFonts w:ascii="Times New Roman" w:hAnsi="Times New Roman" w:eastAsia="Times New Roman"/>
-          <w:b/>
-          <w:sz w:val="24"/>
-        </w:rPr>
-        <w:t>Dr KYELEM</w:t>
-      </w:r>
-      <w:r>
-        <w:rPr>
-          <w:rFonts w:ascii="Times New Roman" w:hAnsi="Times New Roman" w:eastAsia="Times New Roman"/>
-          <w:sz w:val="24"/>
-        </w:rPr>
-        <w:t>, notre encadrant, pour ses conseils méthodologiques et techniques, ainsi que pour son accompagnement tout au long de ce travail.</w:t>
-      </w:r>
-    </w:p>
-    <w:p>
-      <w:pPr>
-        <w:ind w:firstLine="425"/>
-        <w:jc w:val="both"/>
-      </w:pPr>
-      <w:r>
-        <w:rPr>
-          <w:rFonts w:ascii="Times New Roman" w:hAnsi="Times New Roman" w:eastAsia="Times New Roman"/>
-          <w:sz w:val="24"/>
-        </w:rPr>
-        <w:t>L'ensemble du corps professoral et administratif de l'Institut du Génie Informatique pour la qualité de la formation reçue et pour l'encadrement académique dont nous avons bénéficié.</w:t>
-      </w:r>
-    </w:p>
-    <w:p>
-      <w:pPr>
-        <w:ind w:firstLine="425"/>
-        <w:jc w:val="both"/>
-      </w:pPr>
-      <w:r>
-        <w:rPr>
-          <w:rFonts w:ascii="Times New Roman" w:hAnsi="Times New Roman" w:eastAsia="Times New Roman"/>
-          <w:sz w:val="24"/>
-        </w:rPr>
-        <w:t>Notre gratitude à nos collègues, amis et camarades de promotion pour leurs encouragements, leurs conseils et les échanges constructifs, notamment ceux qui ont testé les premiers parcours d'examen et signalé les points durs de l'interface.</w:t>
-      </w:r>
-    </w:p>
-    <w:p>
-      <w:pPr>
-        <w:ind w:firstLine="425"/>
-        <w:jc w:val="both"/>
-      </w:pPr>
-      <w:r>
-        <w:rPr>
-          <w:rFonts w:ascii="Times New Roman" w:hAnsi="Times New Roman" w:eastAsia="Times New Roman"/>
-          <w:sz w:val="24"/>
-        </w:rPr>
-        <w:t>Notre famille, pour son soutien moral, sa compréhension et sa confiance tout au long de nos études.</w:t>
-      </w:r>
-    </w:p>
-    <w:p>
-      <w:pPr>
-        <w:ind w:firstLine="425"/>
-        <w:jc w:val="both"/>
-      </w:pPr>
-      <w:r>
-        <w:rPr>
-          <w:rFonts w:ascii="Times New Roman" w:hAnsi="Times New Roman" w:eastAsia="Times New Roman"/>
-          <w:sz w:val="24"/>
-        </w:rPr>
         <w:t>Nos sincères remerciements à toutes les personnes qui, d'une manière ou d'une autre, ont contribué à la réalisation de ce rapport et à la réussite de notre formation.</w:t>
+      </w:r>
+    </w:p>
+    <w:p>
+      <w:r>
+        <w:br w:type="page"/>
       </w:r>
     </w:p>
     <w:p>

</xml_diff>

<commit_message>
Ajouter une phrase d'introduction aux remerciements
Conserve les deux encadrants et la phrase de clôture.

Co-authored-by: progirix <progirix@users.noreply.github.com>
</commit_message>
<xml_diff>
--- a/docs/Rapport_Cylentic.docx
+++ b/docs/Rapport_Cylentic.docx
@@ -946,6 +946,19 @@
       <w:bookmarkEnd w:id="7"/>
       <w:bookmarkEnd w:id="8"/>
       <w:bookmarkEnd w:id="9"/>
+    </w:p>
+    <w:p>
+      <w:pPr>
+        <w:ind w:firstLine="425"/>
+        <w:jc w:val="both"/>
+      </w:pPr>
+      <w:r>
+        <w:rPr>
+          <w:rFonts w:ascii="Times New Roman" w:hAnsi="Times New Roman"/>
+          <w:sz w:val="24"/>
+        </w:rPr>
+        <w:t>Nous tenons à exprimer notre profonde gratitude à toutes les personnes qui ont contribué, de près ou de loin, à la réalisation de notre projet de fin d'année.</w:t>
+      </w:r>
     </w:p>
     <w:p>
       <w:pPr>

</xml_diff>

<commit_message>
Alléger le style : vocabulaire plus simple et formulations moins mécaniques
Humanise remerciements, conclusions, commentaires de figures et
quelques passages trop lourds, sans changer le fond technique.

Co-authored-by: progirix <progirix@users.noreply.github.com>
</commit_message>
<xml_diff>
--- a/docs/Rapport_Cylentic.docx
+++ b/docs/Rapport_Cylentic.docx
@@ -942,7 +942,7 @@
         <w:jc w:val="both"/>
       </w:pPr>
       <w:r>
-        <w:t>Nous tenons à exprimer notre profonde gratitude à toutes les personnes qui ont contribué, de près ou de loin, à la réalisation de notre projet de fin d'année.</w:t>
+        <w:t>Nous remercions toutes les personnes qui ont contribué, de près ou de loin, à ce projet de fin d'année.</w:t>
       </w:r>
     </w:p>
     <w:p>
@@ -952,12 +952,18 @@
       </w:pPr>
       <w:r>
         <w:rPr>
+          <w:rFonts w:ascii="Times New Roman" w:hAnsi="Times New Roman"/>
           <w:b/>
+          <w:sz w:val="24"/>
         </w:rPr>
         <w:t>Dr YANOGO K Jean Hermann</w:t>
       </w:r>
       <w:r>
-        <w:t>, notre encadrant principal, dont les conseils avisés, la disponibilité, la rigueur scientifique et les orientations ont été déterminants dans la conduite de ce projet.</w:t>
+        <w:rPr>
+          <w:rFonts w:ascii="Times New Roman" w:hAnsi="Times New Roman"/>
+          <w:sz w:val="24"/>
+        </w:rPr>
+        <w:t>, notre encadrant principal, pour ses conseils, sa disponibilité et ses orientations tout au long de ce projet.</w:t>
       </w:r>
     </w:p>
     <w:p>
@@ -967,15 +973,18 @@
       </w:pPr>
       <w:r>
         <w:rPr>
+          <w:rFonts w:ascii="Times New Roman" w:hAnsi="Times New Roman"/>
           <w:b/>
+          <w:sz w:val="24"/>
         </w:rPr>
         <w:t>Dr KYELEM</w:t>
       </w:r>
       <w:r>
-        <w:t>, notre encadrant, pour ses conseils méthodologiques et techniques, ainsi que pour son accompagnement tout au long de ce travail.</w:t>
-      </w:r>
-      <w:r>
-        <w:br w:type="page"/>
+        <w:rPr>
+          <w:rFonts w:ascii="Times New Roman" w:hAnsi="Times New Roman"/>
+          <w:sz w:val="24"/>
+        </w:rPr>
+        <w:t>, notre encadrant, pour ses conseils de méthode et sur le plan technique, et pour son accompagnement pendant ce travail.</w:t>
       </w:r>
     </w:p>
     <w:p>
@@ -5613,7 +5622,7 @@
         <w:rPr>
           <w:color w:val="000000"/>
         </w:rPr>
-        <w:t>Comment évaluer la programmation sur machine de façon crédible, en limitant la triche liée aux outils de génération de code, tout en laissant l'étudiant exécuter son programme et en donnant au professeur une correction fiable ?</w:t>
+        <w:t>Comment évaluer la programmation sur machine de façon fiable, en limitant la triche liée aux outils de génération de code, tout en laissant l'étudiant exécuter son programme et en donnant au professeur une correction fiable ?</w:t>
       </w:r>
     </w:p>
     <w:p>
@@ -5729,7 +5738,7 @@
         <w:rPr>
           <w:color w:val="000000"/>
         </w:rPr>
-        <w:t>Au terme de ce travail, plusieurs résultats sont attendus :</w:t>
+        <w:t>À la fin de ce travail, plusieurs résultats sont attendus :</w:t>
       </w:r>
     </w:p>
     <w:p>
@@ -5796,7 +5805,7 @@
         <w:rPr>
           <w:color w:val="000000"/>
         </w:rPr>
-        <w:t>• si le navigateur est suffisamment contrôlé et si les incidents sont enregistrés, on peut rendre l'examen sur machine plus crédible ;</w:t>
+        <w:t>• si le navigateur est suffisamment contrôlé et si les incidents sont enregistrés, on peut rendre l'examen sur machine plus fiable ;</w:t>
       </w:r>
     </w:p>
     <w:p>
@@ -5830,7 +5839,7 @@
         <w:rPr>
           <w:color w:val="000000"/>
         </w:rPr>
-        <w:t>Pour y arriver, nous avons suivi une démarche méthodologique en plusieurs étapes :</w:t>
+        <w:t>Pour y arriver, nous avons avancé en plusieurs étapes :</w:t>
       </w:r>
     </w:p>
     <w:p>
@@ -5852,7 +5861,7 @@
         <w:rPr>
           <w:color w:val="000000"/>
         </w:rPr>
-        <w:t>• analyse des besoins et définition d'un MVP borné ;</w:t>
+        <w:t>• analyse des besoins et définition d'un MVP limité ;</w:t>
       </w:r>
     </w:p>
     <w:p>
@@ -5921,7 +5930,7 @@
         <w:rPr>
           <w:color w:val="000000"/>
         </w:rPr>
-        <w:t>Ce chapitre présente l'état de l'art du domaine. Il rappelle le contexte pédagogique, les contraintes locales et les grandes familles d'outils existants, puis synthétise leurs limites. La comparaison détaillée et le positionnement de Cylentic sont traités au chapitre 2.</w:t>
+        <w:t>Ce chapitre fait le point sur l'existant. Il rappelle le contexte pédagogique, les contraintes locales et les grandes familles d'outils, puis résume leurs limites. La comparaison détaillée et le positionnement de Cylentic passent au chapitre 2.</w:t>
       </w:r>
     </w:p>
     <w:p>
@@ -6185,7 +6194,7 @@
         <w:rPr>
           <w:color w:val="000000"/>
         </w:rPr>
-        <w:t>Le contexte, les contraintes locales et le panorama des outils forment un état de l'art clair : le besoin d'évaluer la programmation sur machine de façon crédible reste mal couvert. Le chapitre 2 compare les solutions existantes, positionne Cylentic, puis fixe le cahier des charges du MVP.</w:t>
+        <w:t>Le contexte, les contraintes locales et le panorama des outils forment un état de l'art clair : le besoin d'évaluer la programmation sur machine de façon fiable reste mal couvert. Le chapitre 2 compare les solutions existantes, positionne Cylentic, puis fixe le cahier des charges du MVP.</w:t>
       </w:r>
     </w:p>
     <w:p>
@@ -6224,7 +6233,7 @@
         <w:rPr>
           <w:color w:val="000000"/>
         </w:rPr>
-        <w:t>Ce chapitre commence par comparer les solutions existantes et positionner Cylentic. Il fixe ensuite le périmètre du MVP, les acteurs, puis les besoins fonctionnels et non fonctionnels du système.</w:t>
+        <w:t>Ce chapitre compare d'abord les solutions existantes et positionne Cylentic. Il fixe ensuite le périmètre du MVP, les acteurs, puis les besoins fonctionnels et non fonctionnels du système.</w:t>
       </w:r>
     </w:p>
     <w:p>
@@ -7025,7 +7034,7 @@
         <w:jc w:val="both"/>
       </w:pPr>
       <w:r>
-        <w:t>Aucune de ces solutions ne couvre à la fois composition sécurisée, exécution isolée, correction et traçabilité pour une école. C'est dans cet espace que se place Cylentic.</w:t>
+        <w:t>Aucune de ces solutions ne couvre à la fois composition sécurisée, exécution isolée, correction et suivi des preuves pour une école. C'est dans cet espace que s'inscrit Cylentic.</w:t>
       </w:r>
     </w:p>
     <w:p>
@@ -7063,8 +7072,7 @@
         <w:rPr>
           <w:color w:val="000000"/>
         </w:rPr>
-        <w:lastRenderedPageBreak/>
-        <w:t>Sa singularité tient au couplage : éditeur dans le navigateur, sandbox Docker Python, contrôles pendant l'examen côté client, règles métier et timers côté serveur, journal d'incidents, exports professeur, et maintien du surveillant physique. S'y ajoute une gouvernance multi établissement, avec un Super Admin plateforme distinct de l'administrateur d'école.</w:t>
+        <w:t>Ce qui le distingue, c'est le couplage : éditeur dans le navigateur, sandbox Docker Python, contrôles pendant l'examen côté client, règles métier et timers côté serveur, journal d'incidents, exports professeur, et maintien du surveillant physique. S'y ajoute une gestion multi établissement, avec un Super Admin plateforme distinct de l'administrateur d'école.</w:t>
       </w:r>
     </w:p>
     <w:p>
@@ -7674,7 +7682,7 @@
         <w:rPr>
           <w:color w:val="000000"/>
         </w:rPr>
-        <w:t>Après la comparaison et le positionnement, le cahier des charges de Cylentic est posé : périmètre du MVP, acteurs, besoins fonctionnels et non fonctionnels, règles métier et scénarios prioritaires. Sur cette base, la conception du chapitre suivant peut se développer sans improvisation.</w:t>
+        <w:t>Après la comparaison et le positionnement, le cahier des charges de Cylentic est posé : périmètre du MVP, acteurs, besoins fonctionnels et non fonctionnels, règles métier et scénarios prioritaires. Sur cette base, la conception du chapitre suivant peut avancer sans improvisation.</w:t>
       </w:r>
     </w:p>
     <w:p>
@@ -7963,14 +7971,12 @@
         <w:rPr>
           <w:color w:val="000000"/>
         </w:rPr>
-        <w:t xml:space="preserve">La figure 1 présente l'architecture logique de Cylentic. On y distingue quatre blocs principaux : l'interface web, les services métier, la persistance des données et la sandbox </w:t>
-      </w:r>
-      <w:r>
-        <w:rPr>
-          <w:color w:val="000000"/>
-        </w:rPr>
-        <w:lastRenderedPageBreak/>
-        <w:t>d'exécution. Les flèches indiquent les échanges entre ces blocs et permettent de situer le rôle de chacun dans le système.</w:t>
+        <w:t>Sur ce schéma, quatre blocs se détachent : l'interface web, les services métier, le stockage des données et la sandbox d'exécution. Les flèches montrent les échanges entre ces blocs et le rôle de chacun.</w:t>
+      </w:r>
+      <w:r>
+        <w:rPr>
+          <w:color w:val="000000"/>
+        </w:rPr>
       </w:r>
     </w:p>
     <w:p>
@@ -7982,7 +7988,7 @@
         <w:rPr>
           <w:color w:val="000000"/>
         </w:rPr>
-        <w:t>Le diagramme de déploiement traduit cette architecture en nœuds d'exécution. Le poste utilisateur héberge le navigateur. Le serveur d'application héberge Next.js. MySQL porte la persistance. Redis et les workers apparaissent comme perspectives d'industrialisation. L'hôte d'exécution isolée accueille le conteneur sandbox. En production, le lien navigateur application est prévu en HTTPS. En démonstration salle, le même produit peut tourner en HTTP sur le réseau local.</w:t>
+        <w:t>Le diagramme de déploiement montre où tourne chaque élément. Le poste utilisateur héberge le navigateur. Le serveur d'application héberge Next.js. MySQL garde les données. Redis et les workers restent prévus pour plus tard. L'hôte d'exécution isolée accueille le conteneur sandbox. En production, le lien navigateur application est prévu en HTTPS. En démonstration salle, le même produit peut tourner en HTTP sur le réseau local.</w:t>
       </w:r>
     </w:p>
     <w:p>
@@ -8108,7 +8114,7 @@
         <w:rPr>
           <w:color w:val="000000"/>
         </w:rPr>
-        <w:t>La figure 2 illustre le déploiement physique de l'infrastructure. Elle place le serveur applicatif, la base MySQL, les conteneurs Docker et les postes clients sur le même schéma. Cette vue montre où s'exécute chaque élément le jour de l'épreuve.</w:t>
+        <w:t>Ici, le serveur applicatif, la base MySQL, les conteneurs Docker et les postes clients apparaissent sur le même schéma. On voit où tourne chaque élément le jour de l'épreuve.</w:t>
       </w:r>
     </w:p>
     <w:p>
@@ -8276,7 +8282,7 @@
         <w:rPr>
           <w:color w:val="000000"/>
         </w:rPr>
-        <w:t>La figure 3 présente le diagramme de cas d'utilisation du Super Admin. L'acteur est relié aux actions de gouvernance de la plateforme, ce qui met en évidence un périmètre global, distinct de la gestion locale d'un établissement.</w:t>
+        <w:t>Ce diagramme relie le Super Admin aux actions de pilotage de la plateforme. Le périmètre est global, distinct de la gestion locale d'un établissement.</w:t>
       </w:r>
     </w:p>
     <w:p>
@@ -8415,7 +8421,7 @@
         <w:rPr>
           <w:color w:val="000000"/>
         </w:rPr>
-        <w:t>La figure 4 illustre le diagramme de cas d'utilisation de l'administrateur pour l'organisation. Les associations relient l'acteur aux actions de structuration de l'espace scolaire, ce qui clarifie son périmètre avant la gestion fine des comptes.</w:t>
+        <w:t>Ce diagramme relie l'administrateur aux actions d'organisation de l'espace scolaire. Son rôle apparaît clairement avant la gestion fine des comptes.</w:t>
       </w:r>
     </w:p>
     <w:p>
@@ -8542,7 +8548,7 @@
         <w:rPr>
           <w:color w:val="000000"/>
         </w:rPr>
-        <w:t>La figure 5 présente le diagramme de cas d'utilisation centré sur les comptes. On y voit les opérations de création, modification et suivi des utilisateurs, regroupées autour de l'administrateur d'établissement.</w:t>
+        <w:t>On y voit les opérations de création, modification et suivi des utilisateurs, regroupées autour de l'administrateur d'établissement.</w:t>
       </w:r>
     </w:p>
     <w:p>
@@ -8681,8 +8687,7 @@
         <w:rPr>
           <w:color w:val="000000"/>
         </w:rPr>
-        <w:lastRenderedPageBreak/>
-        <w:t>La figure 6 détaille le diagramme de cas d'utilisation du professeur pour les examens. Les actions de préparation et de publication y apparaissent comme un enchaînement cohérent côté enseignant.</w:t>
+        <w:t>Côté professeur, les actions de préparation et de publication forment un enchaînement clair pour monter un examen.</w:t>
       </w:r>
     </w:p>
     <w:p>
@@ -8808,7 +8813,7 @@
         <w:rPr>
           <w:color w:val="000000"/>
         </w:rPr>
-        <w:t>La figure 7 illustre le diagramme de cas d'utilisation du professeur pour le suivi. Elle regroupe les consultations liées au déroulement de l'épreuve et à l'exploitation des résultats.</w:t>
+        <w:t>Ce diagramme regroupe les consultations liées au déroulement de l'épreuve et à l'exploitation des résultats.</w:t>
       </w:r>
     </w:p>
     <w:p>
@@ -8947,7 +8952,7 @@
         <w:rPr>
           <w:color w:val="000000"/>
         </w:rPr>
-        <w:t>La figure 8 représente le diagramme de cas d'utilisation de l'étudiant. Les cas sont ordonnés selon le parcours de composition, de l'entrée dans l'examen jusqu'à la soumission.</w:t>
+        <w:t>Les cas de l'étudiant suivent le parcours de composition, de l'entrée dans l'examen jusqu'à la soumission.</w:t>
       </w:r>
     </w:p>
     <w:p>
@@ -9116,7 +9121,7 @@
         <w:rPr>
           <w:color w:val="000000"/>
         </w:rPr>
-        <w:t>La figure 9 présente le diagramme de classes de l'organisation et des comptes. Les classes et associations montrent comment établissements, utilisateurs et rôles sont reliés dans le modèle.</w:t>
+        <w:t>Les classes et associations montrent comment établissements, utilisateurs et rôles sont reliés dans le modèle.</w:t>
       </w:r>
     </w:p>
     <w:p>
@@ -9243,7 +9248,7 @@
         <w:rPr>
           <w:color w:val="000000"/>
         </w:rPr>
-        <w:t>La figure 10 illustre le diagramme de classes de conception d'examen. On y voit la décomposition d'un examen en exercices et en éléments d'évaluation associés.</w:t>
+        <w:t>On y voit comment un examen se découpe en exercices et en éléments d'évaluation associés.</w:t>
       </w:r>
     </w:p>
     <w:p>
@@ -9318,7 +9323,7 @@
         <w:rPr>
           <w:color w:val="000000"/>
         </w:rPr>
-        <w:t>La figure 11 présente le diagramme de classes de la composition et de la correction. Les liens entre participation, copie, incidents et résultats y apparaissent explicitement.</w:t>
+        <w:t>Les liens entre participation, copie, incidents et résultats y apparaissent clairement.</w:t>
       </w:r>
     </w:p>
     <w:p>
@@ -9457,7 +9462,7 @@
         <w:rPr>
           <w:color w:val="000000"/>
         </w:rPr>
-        <w:t>La figure 12 montre un diagramme d'objets de l'organisation. Des instances concrètes rendent visibles les relations déjà décrites dans le modèle de classes.</w:t>
+        <w:t>Des exemples concrets rendent visibles les relations déjà décrites dans le modèle de classes.</w:t>
       </w:r>
     </w:p>
     <w:p>
@@ -9584,7 +9589,7 @@
         <w:rPr>
           <w:color w:val="000000"/>
         </w:rPr>
-        <w:t>La figure 13 illustre un diagramme d'objets de conception d'examen. L'exemple instancié aide à lire concrètement la structure d'un examen et de ses exercices.</w:t>
+        <w:t>L'exemple donné aide à lire concrètement la structure d'un examen et de ses exercices.</w:t>
       </w:r>
     </w:p>
     <w:p>
@@ -9659,7 +9664,7 @@
         <w:rPr>
           <w:color w:val="000000"/>
         </w:rPr>
-        <w:t>La figure 14 présente un diagramme d'objets de composition. Il matérialise une participation en cours avec les objets liés à la copie et au suivi.</w:t>
+        <w:t>Ce schéma montre une participation en cours, avec les objets liés à la copie et au suivi.</w:t>
       </w:r>
     </w:p>
     <w:p>
@@ -9815,7 +9820,7 @@
         <w:rPr>
           <w:color w:val="000000"/>
         </w:rPr>
-        <w:t>La figure 15 donne une vue d'ensemble des composants logiciels. Les boîtes et dépendances montrent le découpage de l'application sans redescendre au niveau des classes métier.</w:t>
+        <w:t>Les boîtes et dépendances montrent le découpage de l'application, sans redescendre au niveau des classes métier.</w:t>
       </w:r>
     </w:p>
     <w:p>
@@ -9941,7 +9946,7 @@
         <w:rPr>
           <w:color w:val="000000"/>
         </w:rPr>
-        <w:t>La figure 16 détaille les composants d'administration et d'authentification. Le schéma isole les briques responsables de la connexion, des rôles et de la gestion des comptes.</w:t>
+        <w:t>Le schéma isole les briques responsables de la connexion, des rôles et de la gestion des comptes.</w:t>
       </w:r>
     </w:p>
     <w:p>
@@ -10017,7 +10022,7 @@
         <w:rPr>
           <w:color w:val="000000"/>
         </w:rPr>
-        <w:t>La figure 17 présente les composants examens et composition. Elle relie les modules de préparation pédagogique aux modules d'exécution et de suivi pendant l'épreuve.</w:t>
+        <w:t>Ici, les modules de préparation pédagogique sont reliés aux modules d'exécution et de suivi pendant l'épreuve.</w:t>
       </w:r>
     </w:p>
     <w:p>
@@ -10202,7 +10207,7 @@
         <w:rPr>
           <w:color w:val="000000"/>
         </w:rPr>
-        <w:t>La figure 18 montre le diagramme d'états du cycle de vie d'un examen. Les états et transitions visualisent le chemin suivi par un examen, du brouillon à la clôture.</w:t>
+        <w:t>Les états et transitions montrent le chemin suivi par un examen, du brouillon à la clôture.</w:t>
       </w:r>
     </w:p>
     <w:p>
@@ -10357,7 +10362,7 @@
         <w:rPr>
           <w:color w:val="000000"/>
         </w:rPr>
-        <w:t>La figure 19 décrit le diagramme de séquence de connexion. Les messages entre l'interface et le serveur détaillent l'ordre des vérifications jusqu'à l'ouverture de session.</w:t>
+        <w:t>Les messages entre l'interface et le serveur détaillent l'ordre des vérifications jusqu'à l'ouverture de session.</w:t>
       </w:r>
     </w:p>
     <w:p>
@@ -10502,7 +10507,7 @@
         <w:rPr>
           <w:color w:val="000000"/>
         </w:rPr>
-        <w:t>La figure 20 illustre le diagramme de séquence de publication. On y suit l'échange qui rend l'examen accessible et produit le code d'accès.</w:t>
+        <w:t>On y suit l'échange qui rend l'examen accessible et produit le code d'accès.</w:t>
       </w:r>
     </w:p>
     <w:p>
@@ -10653,7 +10658,7 @@
         <w:rPr>
           <w:color w:val="000000"/>
         </w:rPr>
-        <w:t>La figure 21 présente le diagramme de séquence d'accès étudiant. La chronologie des messages montre les contrôles successifs avant l'entrée en salle d'attente.</w:t>
+        <w:t>La chronologie des messages montre les contrôles successifs avant l'entrée en salle d'attente.</w:t>
       </w:r>
     </w:p>
     <w:p>
@@ -10792,7 +10797,7 @@
         <w:rPr>
           <w:color w:val="000000"/>
         </w:rPr>
-        <w:t>La figure 22 montre le diagramme de séquence d'exécution du code. Les appels entre navigateur, serveur et sandbox visualisent le chemin d'un essai isolé.</w:t>
+        <w:t>Les appels entre navigateur, serveur et sandbox montrent le chemin d'un essai isolé.</w:t>
       </w:r>
     </w:p>
     <w:p>
@@ -10931,7 +10936,7 @@
         <w:rPr>
           <w:color w:val="000000"/>
         </w:rPr>
-        <w:t>La figure 23 décrit le diagramme de séquence de soumission et de correction. L'enchaînement des messages relie le dépôt de copie au calcul automatique du score.</w:t>
+        <w:t>L'enchaînement des messages relie le dépôt de copie au calcul automatique du score.</w:t>
       </w:r>
     </w:p>
     <w:p>
@@ -11070,7 +11075,7 @@
         <w:rPr>
           <w:color w:val="000000"/>
         </w:rPr>
-        <w:t>La figure 24 illustre le diagramme de séquence d'enregistrement d'un incident. Il montre comment un événement côté client devient une trace exploitable côté serveur.</w:t>
+        <w:t>On voit comment un événement côté client devient une trace exploitable côté serveur.</w:t>
       </w:r>
     </w:p>
     <w:p>
@@ -11226,7 +11231,7 @@
         <w:rPr>
           <w:color w:val="000000"/>
         </w:rPr>
-        <w:t>La figure 25 présente le diagramme d'activité de l'accès jusqu'à la salle d'attente. Les étapes et branchements visualisent la phase préparatoire avant composition.</w:t>
+        <w:t>Les étapes et branchements montrent la phase préparatoire avant la composition.</w:t>
       </w:r>
     </w:p>
     <w:p>
@@ -11353,8 +11358,7 @@
         <w:rPr>
           <w:color w:val="000000"/>
         </w:rPr>
-        <w:lastRenderedPageBreak/>
-        <w:t>La figure 26 décrit le diagramme d'activité de la composition et de la soumission. Le flux met en évidence les boucles d'essai, les incidents possibles et la fin de l'épreuve.</w:t>
+        <w:t>Le flux met en évidence les boucles d'essai, les incidents possibles et la fin de l'épreuve.</w:t>
       </w:r>
     </w:p>
     <w:p>
@@ -11395,7 +11399,7 @@
         <w:rPr>
           <w:color w:val="000000"/>
         </w:rPr>
-        <w:t>MySQL conserve la mémoire durable : sujets, copies, scores, journaux. Redis et des workers de file sont prévus dans l'architecture cible pour absorber des pics de correction et enrichir le temps réel. Dans le MVP livré, ces briques ne sont pas encore industrialisées : le suivi live repose sur du polling HTTP, et la correction automatique est déclenchée dans le parcours de soumission.</w:t>
+        <w:t>MySQL conserve les données durables : sujets, copies, scores, journaux. Redis et des workers de file sont prévus plus tard pour encaisser des pics de correction et améliorer le temps réel. Dans le MVP livré, ces briques ne sont pas encore en place : le suivi live repose sur du polling HTTP, et la correction automatique est déclenchée dans le parcours de soumission.</w:t>
       </w:r>
     </w:p>
     <w:p>
@@ -11922,7 +11926,7 @@
         <w:rPr>
           <w:color w:val="000000"/>
         </w:rPr>
-        <w:t>Au terme de la conception, Cylentic repose sur une application Next.js, des diagrammes UML calés sur le domaine réel, un déploiement lisible, un cycle de vie d'examen explicite et des flux pour les moments sensibles de l'épreuve. Sécurité et correction restent celles d'un MVP : des gardes techniques compréhensibles, un journal utilisable, une note machine qui ne remplace pas le professeur. Le chapitre suivant peut donc s'évaluer sur des fonctions claires.</w:t>
+        <w:t>Après la conception, Cylentic repose sur une application Next.js, des diagrammes UML calés sur le domaine réel, un déploiement lisible, un cycle de vie d'examen explicite et des flux pour les moments sensibles de l'épreuve. Sécurité et correction restent celles d'un MVP : des gardes techniques compréhensibles, un journal utilisable, une note machine qui ne remplace pas le professeur. Le chapitre suivant peut donc s'évaluer sur des fonctions claires.</w:t>
       </w:r>
     </w:p>
     <w:p>
@@ -12031,7 +12035,7 @@
         <w:rPr>
           <w:color w:val="000000"/>
         </w:rPr>
-        <w:t>L'exécution du code étudiant dans un conteneur Docker vise une isolation réelle. Zod valide les entrées API. Le temps réel a volontairement été traité par polling HTTP plutôt que par WebSocket et Redis, afin de livrer d'abord un comportement fiable sans infrastructure supplémentaire. Redis et les workers restent donc des perspectives d'industrialisation, et non des dépendances du parcours critique actuel.</w:t>
+        <w:t>L'exécution du code étudiant dans un conteneur Docker vise une isolation réelle. Zod valide les entrées API. Le temps réel a volontairement été traité par polling HTTP plutôt que par WebSocket et Redis, afin de livrer d'abord un comportement fiable sans infrastructure supplémentaire. Redis et les workers restent donc des évolutions prévues plus tard, et non des dépendances du parcours critique actuel.</w:t>
       </w:r>
     </w:p>
     <w:p>
@@ -12245,7 +12249,7 @@
         <w:rPr>
           <w:color w:val="000000"/>
         </w:rPr>
-        <w:t>La figure 27 montre la page de connexion. L'écran centralise la saisie des identifiants et constitue le point d'entrée unique vers les différents espaces de la plateforme.</w:t>
+        <w:t>L'écran centralise la saisie des identifiants et sert de point d'entrée unique vers les différents espaces de la plateforme.</w:t>
       </w:r>
     </w:p>
     <w:p>
@@ -12460,7 +12464,7 @@
         <w:rPr>
           <w:color w:val="000000"/>
         </w:rPr>
-        <w:t>La figure 28 présente l'espace administrateur d'établissement. L'interface regroupe les menus de gestion locale utiles au quotidien de l'administration.</w:t>
+        <w:t>L'interface regroupe les menus de gestion locale utiles au quotidien de l'administration.</w:t>
       </w:r>
     </w:p>
     <w:p>
@@ -12631,7 +12635,7 @@
         <w:rPr>
           <w:color w:val="000000"/>
         </w:rPr>
-        <w:t>La figure 29 illustre l'écran de composition d'un examen côté professeur. On y voit la zone d'édition des exercices et des paramètres de l'épreuve.</w:t>
+        <w:t>On y voit la zone d'édition des exercices et des paramètres de l'épreuve.</w:t>
       </w:r>
     </w:p>
     <w:p>
@@ -12766,7 +12770,7 @@
         <w:rPr>
           <w:color w:val="000000"/>
         </w:rPr>
-        <w:t>La figure 30 montre l'écran de publication avec le code d'accès. La mise en page met en évidence l'information à transmettre aux étudiants.</w:t>
+        <w:t>La mise en page met en avant l'information à transmettre aux étudiants : le code d'accès.</w:t>
       </w:r>
     </w:p>
     <w:p>
@@ -12900,7 +12904,7 @@
         <w:rPr>
           <w:color w:val="000000"/>
         </w:rPr>
-        <w:t>La figure 31 présente le tableau de suivi live. Les lignes de participation et les indicateurs visibles permettent de lire l'état de la salle en temps réel.</w:t>
+        <w:t>Les lignes de participation et les indicateurs visibles permettent de lire l'état de la salle en temps réel.</w:t>
       </w:r>
     </w:p>
     <w:p>
@@ -13035,7 +13039,7 @@
         <w:rPr>
           <w:color w:val="000000"/>
         </w:rPr>
-        <w:t>La figure 32 illustre l'écran des résultats et des exports. Les actions d'export y apparaissent à côté de la consultation des scores.</w:t>
+        <w:t>Les actions d'export y apparaissent à côté de la consultation des scores.</w:t>
       </w:r>
     </w:p>
     <w:p>
@@ -13203,7 +13207,7 @@
         <w:rPr>
           <w:color w:val="000000"/>
         </w:rPr>
-        <w:t>La figure 33 montre l'écran des consignes et du plein écran. L'interface impose une validation explicite avant le passage à la suite du parcours étudiant.</w:t>
+        <w:t>L'interface impose une validation explicite avant de passer à la suite du parcours étudiant.</w:t>
       </w:r>
     </w:p>
     <w:p>
@@ -13329,7 +13333,7 @@
         <w:rPr>
           <w:color w:val="000000"/>
         </w:rPr>
-        <w:t>La figure 34 présente la salle d'attente. L'écran d'attente affiche l'état d'attente synchronisé jusqu'à l'ouverture de la composition.</w:t>
+        <w:t>L'écran d'attente reste synchronisé jusqu'à l'ouverture de la composition.</w:t>
       </w:r>
     </w:p>
     <w:p>
@@ -13474,7 +13478,7 @@
         <w:rPr>
           <w:color w:val="000000"/>
         </w:rPr>
-        <w:t>La figure 35 illustre l'environnement de composition. On y distingue l'énoncé, l'éditeur, la zone d'exécution d'essai et l'action de soumission sur le même écran.</w:t>
+        <w:t>On y distingue l'énoncé, l'éditeur, la zone d'exécution d'essai et l'action de soumission sur le même écran.</w:t>
       </w:r>
     </w:p>
     <w:p>
@@ -13671,7 +13675,7 @@
         <w:rPr>
           <w:color w:val="000000"/>
         </w:rPr>
-        <w:t>La figure 36 montre la page d'accueil publique. Elle expose le point d'entrée du service avant toute connexion aux espaces privés.</w:t>
+        <w:t>C'est le point d'entrée public du service, avant toute connexion aux espaces privés.</w:t>
       </w:r>
     </w:p>
     <w:p>
@@ -13761,7 +13765,7 @@
         <w:rPr>
           <w:color w:val="000000"/>
         </w:rPr>
-        <w:t>Le MVP forme aujourd'hui une chaîne complète, assez intégrée pour une démonstration et pour des essais pilotes. Nous avons d'abord solidifié les parcours critiques (authentification, examen, contrôles pendant l'examen, correction, exports), plutôt qu'une infrastructure temps réel complète. Redis, les workers et le multi langage restent pour la suite.</w:t>
+        <w:t>Le MVP forme aujourd'hui une chaîne complète, assez intégrée pour une démonstration et pour des essais pilotes. Nous avons d'abord renforcé les parcours critiques (authentification, examen, contrôles pendant l'examen, correction, exports), plutôt qu'une infrastructure temps réel complète. Redis, les workers et le multi langage restent pour la suite.</w:t>
       </w:r>
     </w:p>
     <w:p>
@@ -14034,7 +14038,7 @@
         <w:rPr>
           <w:color w:val="000000"/>
         </w:rPr>
-        <w:t>On dispose désormais d'un parcours d'examen crédible, de la salle d'attente jusqu'à la soumission sous contraintes. La correction automatique par tests unitaires fait gagner du temps au professeur sans lui retirer la main sur la note. Les incidents horodatés, la présence numérique et le journal d'activité donnent une traçabilité concrète. L'outil tourne en salle sur réseau local. L'administration scolaire et les écrans produit (landing, contact, espaces par rôle) complètent un livrable qu'on peut montrer de bout en bout.</w:t>
+        <w:t>On dispose désormais d'un parcours d'examen solide, de la salle d'attente jusqu'à la soumission sous contraintes. La correction automatique par tests unitaires fait gagner du temps au professeur sans lui retirer la main sur la note. Les incidents horodatés, la présence numérique et le journal d'activité donnent des preuves concrètes. L'outil tourne en salle sur réseau local. L'administration scolaire et les écrans produit (landing, contact, espaces par rôle) complètent un livrable qu'on peut montrer de bout en bout.</w:t>
       </w:r>
     </w:p>
     <w:p>
@@ -14075,14 +14079,12 @@
         <w:rPr>
           <w:color w:val="000000"/>
         </w:rPr>
-        <w:t xml:space="preserve">La sécurité navigateur reste une dissuasion et une détection, non une isolation absolue de poste. Un second appareil, une capture d'écran externe ou une machine virtuelle hors contrôle ne sont pas bloqués techniquement. Le langage supporté est encore limité à </w:t>
-      </w:r>
-      <w:r>
-        <w:rPr>
-          <w:color w:val="000000"/>
-        </w:rPr>
-        <w:lastRenderedPageBreak/>
-        <w:t>Python. La sandbox dépend de Docker. Les workers et la file de correction ne sont pas industrialisés. Le temps réel repose sur du polling, acceptable pour des promotions modestes mais à revoir sous forte charge. L'activation par email, le paiement réel, une intégration Moodle profonde, certains raffinements QCM et une suite de tests bout en bout automatisés restent hors du livrable actuel ou partiels.</w:t>
+        <w:t>La sécurité navigateur reste surtout un moyen de décourager et de détecter, pas une isolation totale du poste. Un second appareil, une capture d'écran externe ou une machine virtuelle hors contrôle ne sont pas bloqués techniquement. Le langage supporté est encore limité à Python. La sandbox dépend de Docker. Les workers et la file de correction ne sont pas encore en place. Le temps réel repose sur du polling, acceptable pour des promotions modestes mais à revoir sous forte charge. L'activation par email, le paiement réel, un lien Moodle plus poussé, certains raffinements QCM et une suite de tests bout en bout automatisés restent hors du livrable actuel ou incomplets.</w:t>
+      </w:r>
+      <w:r>
+        <w:rPr>
+          <w:color w:val="000000"/>
+        </w:rPr>
       </w:r>
     </w:p>
     <w:p>
@@ -14113,7 +14115,7 @@
           <w:b w:val="0"/>
           <w:sz w:val="24"/>
         </w:rPr>
-        <w:t>Pour la suite, l'ordre le plus raisonnable est d'élargir les langages (Java, C, C++), d'activer les comptes par email, puis d'introduire Redis avec un canal temps réel plus solide. Viendraient ensuite des QCM plus riches, la facturation réelle, une file de correction pour les pics de soumissions, et éventuellement une API ou un lien Moodle. Une interface de registre de salle pour les surveillants comblerait aussi un manque encore géré à la main. Il faudra aussi automatiser le parcours connexion, publication, composition et soumission, et préparer une procédure salle simple (adresse, pare-feu, navigateurs supportés) pour éviter les improvisations le jour J. La surveillance vidéo ne devrait être envisagée qu'après un cadrage clair sur l'éthique, les données personnelles et le cadre juridique.</w:t>
+        <w:t>Pour la suite, l'ordre le plus raisonnable est d'élargir les langages (Java, C, C++), d'activer les comptes par email, puis d'introduire Redis avec un canal temps réel plus solide. Viendraient ensuite des QCM plus riches, la facturation réelle, une file de correction pour les pics de soumissions, et éventuellement une API ou un lien Moodle. Une interface de registre de salle pour les surveillants comblerait aussi un manque encore géré à la main. Il faudra aussi automatiser le parcours connexion, publication, composition et soumission, et préparer une procédure salle simple (adresse, pare-feu, navigateurs supportés) pour éviter les improvisations le jour J. La surveillance vidéo ne devrait être envisagée qu'après un cadre clair sur l'éthique, les données personnelles et le droit.</w:t>
       </w:r>
     </w:p>
     <w:p>
@@ -14135,11 +14137,9 @@
         <w:jc w:val="both"/>
       </w:pPr>
       <w:r>
-        <w:t xml:space="preserve">Le tableau ci-dessous estime le coût du projet pour un déploiement pilote sur douze mois, dimensionné pour environ 200 étudiants simultanés. Le développement est valorisé au </w:t>
-      </w:r>
-      <w:r>
-        <w:t>forfait pour l'équipe de trois personnes. L'hébergement correspond à une configuration serveur capable d'absorber un pic de composition en salle.</w:t>
-      </w:r>
+        <w:t>Le tableau ci-dessous estime le coût du projet pour un déploiement pilote sur douze mois, prévu pour environ 200 étudiants en même temps. Le développement est chiffré au forfait pour l'équipe de trois personnes. L'hébergement correspond à un serveur capable d'encaisser un pic de composition en salle.</w:t>
+      </w:r>
+      <w:r/>
     </w:p>
     <w:p>
       <w:pPr>
@@ -14551,7 +14551,7 @@
         <w:rPr>
           <w:color w:val="000000"/>
         </w:rPr>
-        <w:t>Au bilan, le MVP Cylentic se démontre sur son périmètre et reste cohérent techniquement. Ce qui manque encore vient surtout de choix de priorité (temps réel, multi langages, tests automatisés), pas d'une faille d'architecture de fond.</w:t>
+        <w:t>En résumé, le MVP Cylentic tient sur son périmètre et reste solide techniquement. Ce qui manque encore vient surtout de choix de priorité (temps réel, multi langages, tests automatisés), pas d'un problème de fond dans l'architecture.</w:t>
       </w:r>
     </w:p>
     <w:p>
@@ -14590,7 +14590,7 @@
         <w:rPr>
           <w:color w:val="000000"/>
         </w:rPr>
-        <w:t>Le point de départ était simple : il faut évaluer la programmation sur machine, mais l'intégrité des rendus devient fragile dès que la génération de code est banale. Cylentic répond de façon pragmatique pour une salle d'examen, avec une plateforme web multi établissement, un parcours étudiant contrôlé, une exécution isolée et un journal d'incidents lisible.</w:t>
+        <w:t>Le point de départ était simple : il faut évaluer la programmation sur machine, mais l'intégrité des rendus devient fragile dès que la génération de code est banale. Cylentic répond de façon pratique pour une salle d'examen, avec une plateforme web multi établissement, un parcours étudiant contrôlé, une exécution isolée et un journal d'incidents lisible.</w:t>
       </w:r>
     </w:p>
     <w:p>
@@ -14602,7 +14602,7 @@
         <w:rPr>
           <w:color w:val="000000"/>
         </w:rPr>
-        <w:t>Nous avons borné un MVP réaliste, conçu les rôles, les données et les flux, puis livré une chaîne complète, de l'onboarding administrateur jusqu'à la soumission étudiant, avec publication, contrôles pendant l'examen, correction automatique et exports. Les tests ont validé les parcours critiques une fois corrigés les problèmes de cookie Secure, de sérialisation Decimal et de synchronisation du timer.</w:t>
+        <w:t>Nous avons limité un MVP réaliste, conçu les rôles, les données et les flux, puis livré une chaîne complète, de l'arrivée administrateur jusqu'à la soumission étudiant, avec publication, contrôles pendant l'examen, correction automatique et exports. Les tests ont validé les parcours critiques une fois corrigés les problèmes de cookie Secure, de sérialisation Decimal et de synchronisation du timer.</w:t>
       </w:r>
     </w:p>
     <w:p>
@@ -14614,7 +14614,7 @@
         <w:rPr>
           <w:color w:val="000000"/>
         </w:rPr>
-        <w:t>Il reste des limites : un second appareil hors contrôle, Python seul pour l'instant, Redis et workers pas encore industrialisés, un temps réel basé sur le polling. Cela n'efface pas l'essentiel : le système est utilisable dans son périmètre, ses choix sont assumés, et il peut servir à des usages pilotes. Les objectifs du MVP sont atteints. La suite pourra élargir les langages et renforcer l'infrastructure sous charge.</w:t>
+        <w:t>Il reste des limites : un second appareil hors contrôle, Python seul pour l'instant, Redis et workers pas encore en place, un temps réel basé sur le polling. Cela n'efface pas l'essentiel : le système est utilisable dans son périmètre, ses choix sont clairs, et il peut servir à des usages pilotes. Les objectifs du MVP sont atteints. La suite pourra élargir les langages et renforcer l'infrastructure sous charge.</w:t>
       </w:r>
     </w:p>
     <w:p>

</xml_diff>

<commit_message>
Finaliser le nettoyage du rapport Cylentic
Met à jour les fichiers docx après allègement du style et relecture.

Co-authored-by: progirix <progirix@users.noreply.github.com>
</commit_message>
<xml_diff>
--- a/docs/Rapport_Cylentic.docx
+++ b/docs/Rapport_Cylentic.docx
@@ -8141,9 +8141,10 @@
       </w:pPr>
       <w:r>
         <w:rPr>
-          <w:color w:val="000000"/>
-        </w:rPr>
-        <w:t>Les acteurs métier de Cylentic sont le Super Admin, l'administrateur d'établissement, le professeur et l'étudiant. Le surveillant physique intervient en salle sans compte applicatif. Cette répartition évite de mélanger la gouvernance de la plateforme, la gestion locale d'une école, la pédagogie de l'épreuve et la composition.</w:t>
+          <w:rFonts w:ascii="Times New Roman" w:hAnsi="Times New Roman"/>
+          <w:sz w:val="24"/>
+        </w:rPr>
+        <w:t>Les acteurs métier de Cylentic sont le Super Admin, l'administrateur d'établissement, le professeur et l'étudiant. Le surveillant physique intervient en salle sans compte applicatif. Cette répartition évite de mélanger la pilotage de la plateforme, la gestion locale d'une école, la pédagogie de l'épreuve et la composition.</w:t>
       </w:r>
     </w:p>
     <w:p>
@@ -8153,9 +8154,10 @@
       </w:pPr>
       <w:r>
         <w:rPr>
-          <w:color w:val="000000"/>
-        </w:rPr>
-        <w:t>Le Super Admin opère hors du tenant scolaire. Il gère les établissements, les plans et le suivi global. Les cas d'utilisation correspondants sont regroupés dans une vue dédiée afin de ne pas noyer cette gouvernance dans le détail pédagogique.</w:t>
+          <w:rFonts w:ascii="Times New Roman" w:hAnsi="Times New Roman"/>
+          <w:sz w:val="24"/>
+        </w:rPr>
+        <w:t>Le Super Admin opère hors du tenant scolaire. Il gère les établissements, les plans et le suivi global. Les cas d'utilisation correspondants sont regroupés dans une vue dédiée afin de ne pas noyer cette pilotage dans le détail pédagogique.</w:t>
       </w:r>
     </w:p>
     <w:p>
@@ -12292,21 +12294,10 @@
       </w:pPr>
       <w:r>
         <w:rPr>
-          <w:color w:val="000000"/>
-        </w:rPr>
-        <w:t xml:space="preserve">Le Super Admin pilote la plateforme hors d'un établissement donné. Il crée et suit les établissements, consulte les demandes issues du formulaire de contact </w:t>
-      </w:r>
-      <w:r>
-        <w:rPr>
-          <w:color w:val="000000"/>
-        </w:rPr>
-        <w:t>de la landing</w:t>
-      </w:r>
-      <w:r>
-        <w:rPr>
-          <w:color w:val="000000"/>
-        </w:rPr>
-        <w:t>, et dispose d'une vue globale distincte des tableaux de bord scolaires. Cette séparation évite de mélanger la gouvernance produit et l'administration locale d'une école.</w:t>
+          <w:rFonts w:ascii="Times New Roman" w:hAnsi="Times New Roman"/>
+          <w:sz w:val="24"/>
+        </w:rPr>
+        <w:t>Le Super Admin pilote la plateforme hors d'un établissement donné. Il crée et suit les établissements, consulte les demandes issues du formulaire de contact de la landing, et dispose d'une vue globale distincte des tableaux de bord scolaires. Cette séparation évite de mélanger la pilotage produit et l'administration locale d'une école.</w:t>
       </w:r>
     </w:p>
     <w:p>

</xml_diff>

<commit_message>
Corriger commentaires de figures, sommaire et dédicace
Remet le format « La figure N présente/montre… », replace le
Sommaire sur sa page, et adoucit la dédicace.

Co-authored-by: progirix <progirix@users.noreply.github.com>
</commit_message>
<xml_diff>
--- a/docs/Rapport_Cylentic.docx
+++ b/docs/Rapport_Cylentic.docx
@@ -904,9 +904,11 @@
       </w:pPr>
       <w:r>
         <w:rPr>
-          <w:color w:val="000000"/>
-        </w:rPr>
-        <w:t>À ma famille.</w:t>
+          <w:rFonts w:ascii="Times New Roman" w:hAnsi="Times New Roman"/>
+          <w:b w:val="0"/>
+          <w:sz w:val="24"/>
+        </w:rPr>
+        <w:t>À ma famille, pour son soutien et sa confiance.</w:t>
       </w:r>
     </w:p>
     <w:p>
@@ -985,6 +987,11 @@
           <w:sz w:val="24"/>
         </w:rPr>
         <w:t>, notre encadrant, pour ses conseils de méthode et sur le plan technique, et pour son accompagnement pendant ce travail.</w:t>
+      </w:r>
+    </w:p>
+    <w:p>
+      <w:r>
+        <w:br w:type="page"/>
       </w:r>
     </w:p>
     <w:p>
@@ -7969,14 +7976,11 @@
       </w:pPr>
       <w:r>
         <w:rPr>
-          <w:color w:val="000000"/>
-        </w:rPr>
-        <w:t>Sur ce schéma, quatre blocs se détachent : l'interface web, les services métier, le stockage des données et la sandbox d'exécution. Les flèches montrent les échanges entre ces blocs et le rôle de chacun.</w:t>
-      </w:r>
-      <w:r>
-        <w:rPr>
-          <w:color w:val="000000"/>
-        </w:rPr>
+          <w:rFonts w:ascii="Times New Roman" w:hAnsi="Times New Roman"/>
+          <w:b w:val="0"/>
+          <w:sz w:val="24"/>
+        </w:rPr>
+        <w:t>La figure 1 présente l'architecture logique de Cylentic. On y voit quatre blocs principaux : l'interface web, les services métier, le stockage des données et la sandbox d'exécution. Les flèches montrent les échanges entre ces blocs.</w:t>
       </w:r>
     </w:p>
     <w:p>
@@ -8112,9 +8116,11 @@
       </w:pPr>
       <w:r>
         <w:rPr>
-          <w:color w:val="000000"/>
-        </w:rPr>
-        <w:t>Ici, le serveur applicatif, la base MySQL, les conteneurs Docker et les postes clients apparaissent sur le même schéma. On voit où tourne chaque élément le jour de l'épreuve.</w:t>
+          <w:rFonts w:ascii="Times New Roman" w:hAnsi="Times New Roman"/>
+          <w:b w:val="0"/>
+          <w:sz w:val="24"/>
+        </w:rPr>
+        <w:t>La figure 2 montre le déploiement de l'infrastructure. On y voit le serveur applicatif, la base MySQL, les conteneurs Docker et les postes clients. Ce schéma indique où tourne chaque élément le jour de l'épreuve.</w:t>
       </w:r>
     </w:p>
     <w:p>
@@ -8282,9 +8288,11 @@
       </w:pPr>
       <w:r>
         <w:rPr>
-          <w:color w:val="000000"/>
-        </w:rPr>
-        <w:t>Ce diagramme relie le Super Admin aux actions de pilotage de la plateforme. Le périmètre est global, distinct de la gestion locale d'un établissement.</w:t>
+          <w:rFonts w:ascii="Times New Roman" w:hAnsi="Times New Roman"/>
+          <w:b w:val="0"/>
+          <w:sz w:val="24"/>
+        </w:rPr>
+        <w:t>La figure 3 présente le diagramme de cas d'utilisation du Super Admin. Elle montre les actions de pilotage de la plateforme, sur un périmètre global distinct de la gestion locale d'un établissement.</w:t>
       </w:r>
     </w:p>
     <w:p>
@@ -8421,9 +8429,11 @@
       </w:pPr>
       <w:r>
         <w:rPr>
-          <w:color w:val="000000"/>
-        </w:rPr>
-        <w:t>Ce diagramme relie l'administrateur aux actions d'organisation de l'espace scolaire. Son rôle apparaît clairement avant la gestion fine des comptes.</w:t>
+          <w:rFonts w:ascii="Times New Roman" w:hAnsi="Times New Roman"/>
+          <w:b w:val="0"/>
+          <w:sz w:val="24"/>
+        </w:rPr>
+        <w:t>La figure 4 illustre le diagramme de cas d'utilisation de l'administrateur pour l'organisation. Elle montre les actions liées à l'espace scolaire, avant la gestion fine des comptes.</w:t>
       </w:r>
     </w:p>
     <w:p>
@@ -8548,9 +8558,11 @@
       </w:pPr>
       <w:r>
         <w:rPr>
-          <w:color w:val="000000"/>
-        </w:rPr>
-        <w:t>On y voit les opérations de création, modification et suivi des utilisateurs, regroupées autour de l'administrateur d'établissement.</w:t>
+          <w:rFonts w:ascii="Times New Roman" w:hAnsi="Times New Roman"/>
+          <w:b w:val="0"/>
+          <w:sz w:val="24"/>
+        </w:rPr>
+        <w:t>La figure 5 présente le diagramme de cas d'utilisation centré sur les comptes. On y voit la création, la modification et le suivi des utilisateurs autour de l'administrateur d'établissement.</w:t>
       </w:r>
     </w:p>
     <w:p>
@@ -8687,9 +8699,11 @@
       </w:pPr>
       <w:r>
         <w:rPr>
-          <w:color w:val="000000"/>
-        </w:rPr>
-        <w:t>Côté professeur, les actions de préparation et de publication forment un enchaînement clair pour monter un examen.</w:t>
+          <w:rFonts w:ascii="Times New Roman" w:hAnsi="Times New Roman"/>
+          <w:b w:val="0"/>
+          <w:sz w:val="24"/>
+        </w:rPr>
+        <w:t>La figure 6 montre le diagramme de cas d'utilisation du professeur pour les examens. Elle présente la préparation et la publication comme un enchaînement clair côté enseignant.</w:t>
       </w:r>
     </w:p>
     <w:p>
@@ -8813,9 +8827,11 @@
       </w:pPr>
       <w:r>
         <w:rPr>
-          <w:color w:val="000000"/>
-        </w:rPr>
-        <w:t>Ce diagramme regroupe les consultations liées au déroulement de l'épreuve et à l'exploitation des résultats.</w:t>
+          <w:rFonts w:ascii="Times New Roman" w:hAnsi="Times New Roman"/>
+          <w:b w:val="0"/>
+          <w:sz w:val="24"/>
+        </w:rPr>
+        <w:t>La figure 7 illustre le diagramme de cas d'utilisation du professeur pour le suivi. Elle montre les consultations liées au déroulement de l'épreuve et à l'exploitation des résultats.</w:t>
       </w:r>
     </w:p>
     <w:p>
@@ -8952,9 +8968,11 @@
       </w:pPr>
       <w:r>
         <w:rPr>
-          <w:color w:val="000000"/>
-        </w:rPr>
-        <w:t>Les cas de l'étudiant suivent le parcours de composition, de l'entrée dans l'examen jusqu'à la soumission.</w:t>
+          <w:rFonts w:ascii="Times New Roman" w:hAnsi="Times New Roman"/>
+          <w:b w:val="0"/>
+          <w:sz w:val="24"/>
+        </w:rPr>
+        <w:t>La figure 8 présente le diagramme de cas d'utilisation de l'étudiant. Elle montre le parcours de composition, de l'entrée dans l'examen jusqu'à la soumission.</w:t>
       </w:r>
     </w:p>
     <w:p>
@@ -9121,9 +9139,11 @@
       </w:pPr>
       <w:r>
         <w:rPr>
-          <w:color w:val="000000"/>
-        </w:rPr>
-        <w:t>Les classes et associations montrent comment établissements, utilisateurs et rôles sont reliés dans le modèle.</w:t>
+          <w:rFonts w:ascii="Times New Roman" w:hAnsi="Times New Roman"/>
+          <w:b w:val="0"/>
+          <w:sz w:val="24"/>
+        </w:rPr>
+        <w:t>La figure 9 montre le diagramme de classes de l'organisation et des comptes. On y voit comment établissements, utilisateurs et rôles sont reliés dans le modèle.</w:t>
       </w:r>
     </w:p>
     <w:p>
@@ -9248,9 +9268,11 @@
       </w:pPr>
       <w:r>
         <w:rPr>
-          <w:color w:val="000000"/>
-        </w:rPr>
-        <w:t>On y voit comment un examen se découpe en exercices et en éléments d'évaluation associés.</w:t>
+          <w:rFonts w:ascii="Times New Roman" w:hAnsi="Times New Roman"/>
+          <w:b w:val="0"/>
+          <w:sz w:val="24"/>
+        </w:rPr>
+        <w:t>La figure 10 présente le diagramme de classes de conception d'examen. Elle montre le découpage d'un examen en exercices et en éléments d'évaluation associés.</w:t>
       </w:r>
     </w:p>
     <w:p>
@@ -9323,9 +9345,11 @@
       </w:pPr>
       <w:r>
         <w:rPr>
-          <w:color w:val="000000"/>
-        </w:rPr>
-        <w:t>Les liens entre participation, copie, incidents et résultats y apparaissent clairement.</w:t>
+          <w:rFonts w:ascii="Times New Roman" w:hAnsi="Times New Roman"/>
+          <w:b w:val="0"/>
+          <w:sz w:val="24"/>
+        </w:rPr>
+        <w:t>La figure 11 illustre le diagramme de classes de la composition et de la correction. On y voit les liens entre participation, copie, incidents et résultats.</w:t>
       </w:r>
     </w:p>
     <w:p>
@@ -9462,9 +9486,11 @@
       </w:pPr>
       <w:r>
         <w:rPr>
-          <w:color w:val="000000"/>
-        </w:rPr>
-        <w:t>Des exemples concrets rendent visibles les relations déjà décrites dans le modèle de classes.</w:t>
+          <w:rFonts w:ascii="Times New Roman" w:hAnsi="Times New Roman"/>
+          <w:b w:val="0"/>
+          <w:sz w:val="24"/>
+        </w:rPr>
+        <w:t>La figure 12 montre un diagramme d'objets de l'organisation. Elle présente des exemples concrets qui rendent visibles les relations du modèle de classes.</w:t>
       </w:r>
     </w:p>
     <w:p>
@@ -9589,9 +9615,11 @@
       </w:pPr>
       <w:r>
         <w:rPr>
-          <w:color w:val="000000"/>
-        </w:rPr>
-        <w:t>L'exemple donné aide à lire concrètement la structure d'un examen et de ses exercices.</w:t>
+          <w:rFonts w:ascii="Times New Roman" w:hAnsi="Times New Roman"/>
+          <w:b w:val="0"/>
+          <w:sz w:val="24"/>
+        </w:rPr>
+        <w:t>La figure 13 présente un diagramme d'objets de conception d'examen. Elle montre concrètement la structure d'un examen et de ses exercices.</w:t>
       </w:r>
     </w:p>
     <w:p>
@@ -9664,9 +9692,11 @@
       </w:pPr>
       <w:r>
         <w:rPr>
-          <w:color w:val="000000"/>
-        </w:rPr>
-        <w:t>Ce schéma montre une participation en cours, avec les objets liés à la copie et au suivi.</w:t>
+          <w:rFonts w:ascii="Times New Roman" w:hAnsi="Times New Roman"/>
+          <w:b w:val="0"/>
+          <w:sz w:val="24"/>
+        </w:rPr>
+        <w:t>La figure 14 illustre un diagramme d'objets de composition. Elle montre une participation en cours, avec les objets liés à la copie et au suivi.</w:t>
       </w:r>
     </w:p>
     <w:p>
@@ -9820,9 +9850,11 @@
       </w:pPr>
       <w:r>
         <w:rPr>
-          <w:color w:val="000000"/>
-        </w:rPr>
-        <w:t>Les boîtes et dépendances montrent le découpage de l'application, sans redescendre au niveau des classes métier.</w:t>
+          <w:rFonts w:ascii="Times New Roman" w:hAnsi="Times New Roman"/>
+          <w:b w:val="0"/>
+          <w:sz w:val="24"/>
+        </w:rPr>
+        <w:t>La figure 15 présente une vue d'ensemble des composants logiciels. On y voit le découpage de l'application, sans redescendre au niveau des classes métier.</w:t>
       </w:r>
     </w:p>
     <w:p>
@@ -9946,9 +9978,11 @@
       </w:pPr>
       <w:r>
         <w:rPr>
-          <w:color w:val="000000"/>
-        </w:rPr>
-        <w:t>Le schéma isole les briques responsables de la connexion, des rôles et de la gestion des comptes.</w:t>
+          <w:rFonts w:ascii="Times New Roman" w:hAnsi="Times New Roman"/>
+          <w:b w:val="0"/>
+          <w:sz w:val="24"/>
+        </w:rPr>
+        <w:t>La figure 16 montre les composants d'administration et d'authentification. Elle isole les briques responsables de la connexion, des rôles et de la gestion des comptes.</w:t>
       </w:r>
     </w:p>
     <w:p>
@@ -10022,9 +10056,11 @@
       </w:pPr>
       <w:r>
         <w:rPr>
-          <w:color w:val="000000"/>
-        </w:rPr>
-        <w:t>Ici, les modules de préparation pédagogique sont reliés aux modules d'exécution et de suivi pendant l'épreuve.</w:t>
+          <w:rFonts w:ascii="Times New Roman" w:hAnsi="Times New Roman"/>
+          <w:b w:val="0"/>
+          <w:sz w:val="24"/>
+        </w:rPr>
+        <w:t>La figure 17 présente les composants examens et composition. Elle relie les modules de préparation pédagogique aux modules d'exécution et de suivi pendant l'épreuve.</w:t>
       </w:r>
     </w:p>
     <w:p>
@@ -10207,9 +10243,11 @@
       </w:pPr>
       <w:r>
         <w:rPr>
-          <w:color w:val="000000"/>
-        </w:rPr>
-        <w:t>Les états et transitions montrent le chemin suivi par un examen, du brouillon à la clôture.</w:t>
+          <w:rFonts w:ascii="Times New Roman" w:hAnsi="Times New Roman"/>
+          <w:b w:val="0"/>
+          <w:sz w:val="24"/>
+        </w:rPr>
+        <w:t>La figure 18 montre le diagramme d'états du cycle de vie d'un examen. On y voit le chemin suivi par un examen, du brouillon à la clôture.</w:t>
       </w:r>
     </w:p>
     <w:p>
@@ -10362,9 +10400,11 @@
       </w:pPr>
       <w:r>
         <w:rPr>
-          <w:color w:val="000000"/>
-        </w:rPr>
-        <w:t>Les messages entre l'interface et le serveur détaillent l'ordre des vérifications jusqu'à l'ouverture de session.</w:t>
+          <w:rFonts w:ascii="Times New Roman" w:hAnsi="Times New Roman"/>
+          <w:b w:val="0"/>
+          <w:sz w:val="24"/>
+        </w:rPr>
+        <w:t>La figure 19 présente le diagramme de séquence de connexion. Elle montre l'ordre des vérifications entre l'interface et le serveur jusqu'à l'ouverture de session.</w:t>
       </w:r>
     </w:p>
     <w:p>
@@ -10507,9 +10547,11 @@
       </w:pPr>
       <w:r>
         <w:rPr>
-          <w:color w:val="000000"/>
-        </w:rPr>
-        <w:t>On y suit l'échange qui rend l'examen accessible et produit le code d'accès.</w:t>
+          <w:rFonts w:ascii="Times New Roman" w:hAnsi="Times New Roman"/>
+          <w:b w:val="0"/>
+          <w:sz w:val="24"/>
+        </w:rPr>
+        <w:t>La figure 20 illustre le diagramme de séquence de publication. On y voit l'échange qui rend l'examen accessible et produit le code d'accès.</w:t>
       </w:r>
     </w:p>
     <w:p>
@@ -10658,9 +10700,11 @@
       </w:pPr>
       <w:r>
         <w:rPr>
-          <w:color w:val="000000"/>
-        </w:rPr>
-        <w:t>La chronologie des messages montre les contrôles successifs avant l'entrée en salle d'attente.</w:t>
+          <w:rFonts w:ascii="Times New Roman" w:hAnsi="Times New Roman"/>
+          <w:b w:val="0"/>
+          <w:sz w:val="24"/>
+        </w:rPr>
+        <w:t>La figure 21 présente le diagramme de séquence d'accès étudiant. Elle montre les contrôles successifs avant l'entrée en salle d'attente.</w:t>
       </w:r>
     </w:p>
     <w:p>
@@ -10797,9 +10841,11 @@
       </w:pPr>
       <w:r>
         <w:rPr>
-          <w:color w:val="000000"/>
-        </w:rPr>
-        <w:t>Les appels entre navigateur, serveur et sandbox montrent le chemin d'un essai isolé.</w:t>
+          <w:rFonts w:ascii="Times New Roman" w:hAnsi="Times New Roman"/>
+          <w:b w:val="0"/>
+          <w:sz w:val="24"/>
+        </w:rPr>
+        <w:t>La figure 22 montre le diagramme de séquence d'exécution du code. On y voit le chemin d'un essai isolé entre navigateur, serveur et sandbox.</w:t>
       </w:r>
     </w:p>
     <w:p>
@@ -10936,9 +10982,11 @@
       </w:pPr>
       <w:r>
         <w:rPr>
-          <w:color w:val="000000"/>
-        </w:rPr>
-        <w:t>L'enchaînement des messages relie le dépôt de copie au calcul automatique du score.</w:t>
+          <w:rFonts w:ascii="Times New Roman" w:hAnsi="Times New Roman"/>
+          <w:b w:val="0"/>
+          <w:sz w:val="24"/>
+        </w:rPr>
+        <w:t>La figure 23 présente le diagramme de séquence de soumission et de correction. Elle montre le lien entre le dépôt de copie et le calcul automatique du score.</w:t>
       </w:r>
     </w:p>
     <w:p>
@@ -11075,9 +11123,11 @@
       </w:pPr>
       <w:r>
         <w:rPr>
-          <w:color w:val="000000"/>
-        </w:rPr>
-        <w:t>On voit comment un événement côté client devient une trace exploitable côté serveur.</w:t>
+          <w:rFonts w:ascii="Times New Roman" w:hAnsi="Times New Roman"/>
+          <w:b w:val="0"/>
+          <w:sz w:val="24"/>
+        </w:rPr>
+        <w:t>La figure 24 illustre le diagramme de séquence d'enregistrement d'un incident. Elle montre comment un événement côté client devient une trace côté serveur.</w:t>
       </w:r>
     </w:p>
     <w:p>
@@ -11231,9 +11281,11 @@
       </w:pPr>
       <w:r>
         <w:rPr>
-          <w:color w:val="000000"/>
-        </w:rPr>
-        <w:t>Les étapes et branchements montrent la phase préparatoire avant la composition.</w:t>
+          <w:rFonts w:ascii="Times New Roman" w:hAnsi="Times New Roman"/>
+          <w:b w:val="0"/>
+          <w:sz w:val="24"/>
+        </w:rPr>
+        <w:t>La figure 25 présente le diagramme d'activité de l'accès jusqu'à la salle d'attente. On y voit la phase préparatoire avant la composition.</w:t>
       </w:r>
     </w:p>
     <w:p>
@@ -11358,9 +11410,11 @@
       </w:pPr>
       <w:r>
         <w:rPr>
-          <w:color w:val="000000"/>
-        </w:rPr>
-        <w:t>Le flux met en évidence les boucles d'essai, les incidents possibles et la fin de l'épreuve.</w:t>
+          <w:rFonts w:ascii="Times New Roman" w:hAnsi="Times New Roman"/>
+          <w:b w:val="0"/>
+          <w:sz w:val="24"/>
+        </w:rPr>
+        <w:t>La figure 26 montre le diagramme d'activité de la composition et de la soumission. Elle met en évidence les boucles d'essai, les incidents possibles et la fin de l'épreuve.</w:t>
       </w:r>
     </w:p>
     <w:p>
@@ -12249,9 +12303,11 @@
       </w:pPr>
       <w:r>
         <w:rPr>
-          <w:color w:val="000000"/>
-        </w:rPr>
-        <w:t>L'écran centralise la saisie des identifiants et sert de point d'entrée unique vers les différents espaces de la plateforme.</w:t>
+          <w:rFonts w:ascii="Times New Roman" w:hAnsi="Times New Roman"/>
+          <w:b w:val="0"/>
+          <w:sz w:val="24"/>
+        </w:rPr>
+        <w:t>La figure 27 présente la page de connexion. Elle montre la saisie des identifiants et le point d'entrée unique vers les différents espaces de la plateforme.</w:t>
       </w:r>
     </w:p>
     <w:p>
@@ -12453,9 +12509,11 @@
       </w:pPr>
       <w:r>
         <w:rPr>
-          <w:color w:val="000000"/>
-        </w:rPr>
-        <w:t>L'interface regroupe les menus de gestion locale utiles au quotidien de l'administration.</w:t>
+          <w:rFonts w:ascii="Times New Roman" w:hAnsi="Times New Roman"/>
+          <w:b w:val="0"/>
+          <w:sz w:val="24"/>
+        </w:rPr>
+        <w:t>La figure 28 illustre l'espace administrateur d'établissement. On y voit les menus de gestion locale utiles au quotidien de l'administration.</w:t>
       </w:r>
     </w:p>
     <w:p>
@@ -12624,9 +12682,11 @@
       </w:pPr>
       <w:r>
         <w:rPr>
-          <w:color w:val="000000"/>
-        </w:rPr>
-        <w:t>On y voit la zone d'édition des exercices et des paramètres de l'épreuve.</w:t>
+          <w:rFonts w:ascii="Times New Roman" w:hAnsi="Times New Roman"/>
+          <w:b w:val="0"/>
+          <w:sz w:val="24"/>
+        </w:rPr>
+        <w:t>La figure 29 présente l'écran de composition d'un examen côté professeur. Elle montre la zone d'édition des exercices et des paramètres de l'épreuve.</w:t>
       </w:r>
     </w:p>
     <w:p>
@@ -12759,9 +12819,11 @@
       </w:pPr>
       <w:r>
         <w:rPr>
-          <w:color w:val="000000"/>
-        </w:rPr>
-        <w:t>La mise en page met en avant l'information à transmettre aux étudiants : le code d'accès.</w:t>
+          <w:rFonts w:ascii="Times New Roman" w:hAnsi="Times New Roman"/>
+          <w:b w:val="0"/>
+          <w:sz w:val="24"/>
+        </w:rPr>
+        <w:t>La figure 30 montre l'écran de publication avec le code d'accès. Elle met en avant l'information à transmettre aux étudiants.</w:t>
       </w:r>
     </w:p>
     <w:p>
@@ -12893,9 +12955,11 @@
       </w:pPr>
       <w:r>
         <w:rPr>
-          <w:color w:val="000000"/>
-        </w:rPr>
-        <w:t>Les lignes de participation et les indicateurs visibles permettent de lire l'état de la salle en temps réel.</w:t>
+          <w:rFonts w:ascii="Times New Roman" w:hAnsi="Times New Roman"/>
+          <w:b w:val="0"/>
+          <w:sz w:val="24"/>
+        </w:rPr>
+        <w:t>La figure 31 présente le tableau de suivi live. On y voit les lignes de participation et les indicateurs qui permettent de lire l'état de la salle en temps réel.</w:t>
       </w:r>
     </w:p>
     <w:p>
@@ -13028,9 +13092,11 @@
       </w:pPr>
       <w:r>
         <w:rPr>
-          <w:color w:val="000000"/>
-        </w:rPr>
-        <w:t>Les actions d'export y apparaissent à côté de la consultation des scores.</w:t>
+          <w:rFonts w:ascii="Times New Roman" w:hAnsi="Times New Roman"/>
+          <w:b w:val="0"/>
+          <w:sz w:val="24"/>
+        </w:rPr>
+        <w:t>La figure 32 illustre l'écran des résultats et des exports. Elle montre les actions d'export à côté de la consultation des scores.</w:t>
       </w:r>
     </w:p>
     <w:p>
@@ -13196,9 +13262,11 @@
       </w:pPr>
       <w:r>
         <w:rPr>
-          <w:color w:val="000000"/>
-        </w:rPr>
-        <w:t>L'interface impose une validation explicite avant de passer à la suite du parcours étudiant.</w:t>
+          <w:rFonts w:ascii="Times New Roman" w:hAnsi="Times New Roman"/>
+          <w:b w:val="0"/>
+          <w:sz w:val="24"/>
+        </w:rPr>
+        <w:t>La figure 33 présente l'écran des consignes et du plein écran. Elle montre la validation explicite avant de passer à la suite du parcours étudiant.</w:t>
       </w:r>
     </w:p>
     <w:p>
@@ -13322,9 +13390,11 @@
       </w:pPr>
       <w:r>
         <w:rPr>
-          <w:color w:val="000000"/>
-        </w:rPr>
-        <w:t>L'écran d'attente reste synchronisé jusqu'à l'ouverture de la composition.</w:t>
+          <w:rFonts w:ascii="Times New Roman" w:hAnsi="Times New Roman"/>
+          <w:b w:val="0"/>
+          <w:sz w:val="24"/>
+        </w:rPr>
+        <w:t>La figure 34 montre la salle d'attente. On y voit l'écran synchronisé jusqu'à l'ouverture de la composition.</w:t>
       </w:r>
     </w:p>
     <w:p>
@@ -13467,9 +13537,11 @@
       </w:pPr>
       <w:r>
         <w:rPr>
-          <w:color w:val="000000"/>
-        </w:rPr>
-        <w:t>On y distingue l'énoncé, l'éditeur, la zone d'exécution d'essai et l'action de soumission sur le même écran.</w:t>
+          <w:rFonts w:ascii="Times New Roman" w:hAnsi="Times New Roman"/>
+          <w:b w:val="0"/>
+          <w:sz w:val="24"/>
+        </w:rPr>
+        <w:t>La figure 35 présente l'environnement de composition. Elle montre l'énoncé, l'éditeur, la zone d'exécution d'essai et l'action de soumission sur le même écran.</w:t>
       </w:r>
     </w:p>
     <w:p>
@@ -13664,9 +13736,11 @@
       </w:pPr>
       <w:r>
         <w:rPr>
-          <w:color w:val="000000"/>
-        </w:rPr>
-        <w:t>C'est le point d'entrée public du service, avant toute connexion aux espaces privés.</w:t>
+          <w:rFonts w:ascii="Times New Roman" w:hAnsi="Times New Roman"/>
+          <w:b w:val="0"/>
+          <w:sz w:val="24"/>
+        </w:rPr>
+        <w:t>La figure 36 illustre la page d'accueil publique. Elle montre le point d'entrée du service avant toute connexion aux espaces privés.</w:t>
       </w:r>
     </w:p>
     <w:p>

</xml_diff>